<commit_message>
Se codifica el modurlo de calificacion de actividades
</commit_message>
<xml_diff>
--- a/requerimientos.docx
+++ b/requerimientos.docx
@@ -40,7 +40,6 @@
           <w:lang w:val="es-ES"/>
         </w:rPr>
       </w:pPr>
-      <w:bookmarkStart w:id="0" w:name="_GoBack"/>
       <w:r>
         <w:rPr>
           <w:b/>
@@ -165,226 +164,288 @@
         </w:rPr>
         <w:t xml:space="preserve"> y elegir el 1, 2 y 3 subtema, la fecha de inicio como esta y la fecha de entrega como esta, asignarle el curso y la descripción como esta. La parte de la modalidad también como esta.</w:t>
       </w:r>
+    </w:p>
+    <w:p>
+      <w:pPr>
+        <w:rPr>
+          <w:b/>
+          <w:lang w:val="es-ES"/>
+        </w:rPr>
+      </w:pPr>
+      <w:r>
+        <w:rPr>
+          <w:b/>
+          <w:lang w:val="es-ES"/>
+        </w:rPr>
+        <w:t>Necesito que la opción Asignar actividad del menú Actividad áulica, se renombre a Actividades asignadas.</w:t>
+      </w:r>
+      <w:r>
+        <w:rPr>
+          <w:b/>
+          <w:lang w:val="es-ES"/>
+        </w:rPr>
+        <w:t xml:space="preserve"> El </w:t>
+      </w:r>
+      <w:proofErr w:type="spellStart"/>
+      <w:r>
+        <w:rPr>
+          <w:b/>
+          <w:lang w:val="es-ES"/>
+        </w:rPr>
+        <w:t>titulo</w:t>
+      </w:r>
+      <w:proofErr w:type="spellEnd"/>
+      <w:r>
+        <w:rPr>
+          <w:b/>
+          <w:lang w:val="es-ES"/>
+        </w:rPr>
+        <w:t xml:space="preserve"> de la vista se renombre a Actividades asignadas, que siga manteniendo la selección de materia como esta y el curso como esta, y siguiente. En la otra vista que me muestre las actividades asignadas, renombrame el </w:t>
+      </w:r>
+      <w:r>
+        <w:rPr>
+          <w:b/>
+          <w:lang w:val="es-ES"/>
+        </w:rPr>
+        <w:t>título</w:t>
+      </w:r>
+      <w:r>
+        <w:rPr>
+          <w:b/>
+          <w:lang w:val="es-ES"/>
+        </w:rPr>
+        <w:t xml:space="preserve"> de la vista a actividades asignadas, sácame las opciones de nueva en la card actividades y el botón nueva actividad de la vista, en la card material </w:t>
+      </w:r>
+      <w:r>
+        <w:rPr>
+          <w:b/>
+          <w:lang w:val="es-ES"/>
+        </w:rPr>
+        <w:t>teórico</w:t>
+      </w:r>
+      <w:r>
+        <w:rPr>
+          <w:b/>
+          <w:lang w:val="es-ES"/>
+        </w:rPr>
+        <w:t xml:space="preserve"> </w:t>
+      </w:r>
+      <w:proofErr w:type="spellStart"/>
+      <w:r>
+        <w:rPr>
+          <w:b/>
+          <w:lang w:val="es-ES"/>
+        </w:rPr>
+        <w:t>agregame</w:t>
+      </w:r>
+      <w:proofErr w:type="spellEnd"/>
+      <w:r>
+        <w:rPr>
+          <w:b/>
+          <w:lang w:val="es-ES"/>
+        </w:rPr>
+        <w:t xml:space="preserve"> un </w:t>
+      </w:r>
+      <w:proofErr w:type="spellStart"/>
+      <w:r>
+        <w:rPr>
+          <w:b/>
+          <w:lang w:val="es-ES"/>
+        </w:rPr>
+        <w:t>label</w:t>
+      </w:r>
+      <w:proofErr w:type="spellEnd"/>
+      <w:r>
+        <w:rPr>
+          <w:b/>
+          <w:lang w:val="es-ES"/>
+        </w:rPr>
+        <w:t xml:space="preserve"> con el tema asignado, en la actividad y una lista de archivos que están en la tabla de material </w:t>
+      </w:r>
+      <w:proofErr w:type="spellStart"/>
+      <w:r>
+        <w:rPr>
+          <w:b/>
+          <w:lang w:val="es-ES"/>
+        </w:rPr>
+        <w:t>teorico</w:t>
+      </w:r>
+      <w:proofErr w:type="spellEnd"/>
+      <w:r>
+        <w:rPr>
+          <w:b/>
+          <w:lang w:val="es-ES"/>
+        </w:rPr>
+        <w:t xml:space="preserve"> y un botón que los asigne.</w:t>
+      </w:r>
+    </w:p>
+    <w:p>
+      <w:pPr>
+        <w:rPr>
+          <w:lang w:val="es-ES"/>
+        </w:rPr>
+      </w:pPr>
+      <w:r>
+        <w:rPr>
+          <w:lang w:val="es-ES"/>
+        </w:rPr>
+        <w:t xml:space="preserve">Necesito que al elegir del menú actividad áulica la opción calificar me muestre dos desplegables, uno con la lista de las materias registradas y otro con el o los cursos de esa materia, siguiente, que me despliegue la lista de alumnos y me </w:t>
+      </w:r>
+      <w:r>
+        <w:rPr>
+          <w:lang w:val="es-ES"/>
+        </w:rPr>
+        <w:t>dé</w:t>
+      </w:r>
+      <w:r>
+        <w:rPr>
+          <w:lang w:val="es-ES"/>
+        </w:rPr>
+        <w:t xml:space="preserve"> por alumno, la lista de actividades asignadas, el estado tomando como fecha de inicio, la fecha de asignación al curso</w:t>
+      </w:r>
+      <w:r>
+        <w:rPr>
+          <w:lang w:val="es-ES"/>
+        </w:rPr>
+        <w:t xml:space="preserve">, y como fecha final, la fecha de finalización, se debe poder registrar 4 estados, en proceso, finalizado y que si </w:t>
+      </w:r>
+      <w:r>
+        <w:rPr>
+          <w:lang w:val="es-ES"/>
+        </w:rPr>
+        <w:t>elige</w:t>
+      </w:r>
+      <w:r>
+        <w:rPr>
+          <w:lang w:val="es-ES"/>
+        </w:rPr>
+        <w:t xml:space="preserve"> esa se registre la fecha de finalización, entrega vencida, con su fecha de entrega, y entrega incompleta con su fecha de entrega, y en cada caso la posibilidad de registrar una nota. Al presionar el botón historial que me muestre un historial de las calificaciones por alumno y de actividades con su estado. Que me conserves el card que me permite registrar notas como hasta ahora para luego procesar los registros</w:t>
+      </w:r>
+    </w:p>
+    <w:p>
+      <w:pPr>
+        <w:rPr>
+          <w:lang w:val="es-ES"/>
+        </w:rPr>
+      </w:pPr>
+      <w:r>
+        <w:rPr>
+          <w:lang w:val="es-ES"/>
+        </w:rPr>
+        <w:t>Necesito que en el dashboard me ponga a la altura del saludo</w:t>
+      </w:r>
+      <w:r>
+        <w:rPr>
+          <w:lang w:val="es-ES"/>
+        </w:rPr>
+        <w:t xml:space="preserve"> con el nombre del docente, y la etiqueta del panel principal a la altura del reloj, una leyenda que diga </w:t>
+      </w:r>
+      <w:r>
+        <w:rPr>
+          <w:lang w:val="es-ES"/>
+        </w:rPr>
+        <w:t>Ud.</w:t>
+      </w:r>
+      <w:r>
+        <w:rPr>
+          <w:lang w:val="es-ES"/>
+        </w:rPr>
+        <w:t xml:space="preserve"> se encuentra en el establecimiento: y el nombre de la escuela donde </w:t>
+      </w:r>
+      <w:r>
+        <w:rPr>
+          <w:lang w:val="es-ES"/>
+        </w:rPr>
+        <w:t>está</w:t>
+      </w:r>
+      <w:r>
+        <w:rPr>
+          <w:lang w:val="es-ES"/>
+        </w:rPr>
+        <w:t xml:space="preserve"> en el momento de entrar al sistema, En la materia: y el nombre de la materia, y el Año: y </w:t>
+      </w:r>
+      <w:r>
+        <w:rPr>
+          <w:lang w:val="es-ES"/>
+        </w:rPr>
+        <w:t>División</w:t>
+      </w:r>
+      <w:r>
+        <w:rPr>
+          <w:lang w:val="es-ES"/>
+        </w:rPr>
+        <w:t xml:space="preserve">: lo debe tomar del horario que se </w:t>
+      </w:r>
+      <w:r>
+        <w:rPr>
+          <w:lang w:val="es-ES"/>
+        </w:rPr>
+        <w:t>registró</w:t>
+      </w:r>
+      <w:bookmarkStart w:id="0" w:name="_GoBack"/>
       <w:bookmarkEnd w:id="0"/>
-    </w:p>
-    <w:p>
-      <w:pPr>
-        <w:rPr>
-          <w:lang w:val="es-ES"/>
-        </w:rPr>
-      </w:pPr>
-      <w:r>
-        <w:rPr>
-          <w:lang w:val="es-ES"/>
-        </w:rPr>
-        <w:t>Necesito que la opción Asignar actividad del menú Actividad áulica, se renombre a Actividades asignadas.</w:t>
-      </w:r>
-      <w:r>
-        <w:rPr>
-          <w:lang w:val="es-ES"/>
-        </w:rPr>
-        <w:t xml:space="preserve"> El </w:t>
-      </w:r>
-      <w:proofErr w:type="spellStart"/>
-      <w:r>
-        <w:rPr>
-          <w:lang w:val="es-ES"/>
-        </w:rPr>
-        <w:t>titulo</w:t>
-      </w:r>
-      <w:proofErr w:type="spellEnd"/>
-      <w:r>
-        <w:rPr>
-          <w:lang w:val="es-ES"/>
-        </w:rPr>
-        <w:t xml:space="preserve"> de la vista se renombre a Actividades asignadas, que siga manteniendo la selección de materia como esta y el curso como esta, y siguiente. En la otra vista que me muestre las actividades asignadas, </w:t>
-      </w:r>
-      <w:proofErr w:type="spellStart"/>
-      <w:r>
-        <w:rPr>
-          <w:lang w:val="es-ES"/>
-        </w:rPr>
-        <w:t>renombrame</w:t>
-      </w:r>
-      <w:proofErr w:type="spellEnd"/>
-      <w:r>
-        <w:rPr>
-          <w:lang w:val="es-ES"/>
-        </w:rPr>
-        <w:t xml:space="preserve"> el </w:t>
-      </w:r>
-      <w:proofErr w:type="spellStart"/>
-      <w:r>
-        <w:rPr>
-          <w:lang w:val="es-ES"/>
-        </w:rPr>
-        <w:t>titulo</w:t>
-      </w:r>
-      <w:proofErr w:type="spellEnd"/>
-      <w:r>
-        <w:rPr>
-          <w:lang w:val="es-ES"/>
-        </w:rPr>
-        <w:t xml:space="preserve"> de la vista a actividades asignadas, sácame las opciones de nueva en la </w:t>
-      </w:r>
-      <w:proofErr w:type="spellStart"/>
-      <w:r>
-        <w:rPr>
-          <w:lang w:val="es-ES"/>
-        </w:rPr>
-        <w:t>card</w:t>
-      </w:r>
-      <w:proofErr w:type="spellEnd"/>
-      <w:r>
-        <w:rPr>
-          <w:lang w:val="es-ES"/>
-        </w:rPr>
-        <w:t xml:space="preserve"> actividades y el botón nueva actividad de la vista, en la </w:t>
-      </w:r>
-      <w:proofErr w:type="spellStart"/>
-      <w:r>
-        <w:rPr>
-          <w:lang w:val="es-ES"/>
-        </w:rPr>
-        <w:t>card</w:t>
-      </w:r>
-      <w:proofErr w:type="spellEnd"/>
-      <w:r>
-        <w:rPr>
-          <w:lang w:val="es-ES"/>
-        </w:rPr>
-        <w:t xml:space="preserve"> material </w:t>
-      </w:r>
-      <w:proofErr w:type="spellStart"/>
-      <w:r>
-        <w:rPr>
-          <w:lang w:val="es-ES"/>
-        </w:rPr>
-        <w:t>teorico</w:t>
-      </w:r>
-      <w:proofErr w:type="spellEnd"/>
-      <w:r>
-        <w:rPr>
-          <w:lang w:val="es-ES"/>
-        </w:rPr>
-        <w:t xml:space="preserve"> </w:t>
-      </w:r>
-      <w:proofErr w:type="spellStart"/>
-      <w:r>
-        <w:rPr>
-          <w:lang w:val="es-ES"/>
-        </w:rPr>
-        <w:t>agregame</w:t>
-      </w:r>
-      <w:proofErr w:type="spellEnd"/>
-      <w:r>
-        <w:rPr>
-          <w:lang w:val="es-ES"/>
-        </w:rPr>
-        <w:t xml:space="preserve"> un </w:t>
-      </w:r>
-      <w:proofErr w:type="spellStart"/>
-      <w:r>
-        <w:rPr>
-          <w:lang w:val="es-ES"/>
-        </w:rPr>
-        <w:t>label</w:t>
-      </w:r>
-      <w:proofErr w:type="spellEnd"/>
-      <w:r>
-        <w:rPr>
-          <w:lang w:val="es-ES"/>
-        </w:rPr>
-        <w:t xml:space="preserve"> con el tema asignado, en la actividad y una lista de archivos que están en la tabla de material </w:t>
-      </w:r>
-      <w:proofErr w:type="spellStart"/>
-      <w:r>
-        <w:rPr>
-          <w:lang w:val="es-ES"/>
-        </w:rPr>
-        <w:t>teorico</w:t>
-      </w:r>
-      <w:proofErr w:type="spellEnd"/>
-      <w:r>
-        <w:rPr>
-          <w:lang w:val="es-ES"/>
-        </w:rPr>
-        <w:t xml:space="preserve"> y un botón que los asigne.</w:t>
-      </w:r>
-    </w:p>
-    <w:p>
-      <w:pPr>
-        <w:rPr>
-          <w:lang w:val="es-ES"/>
-        </w:rPr>
-      </w:pPr>
-      <w:r>
-        <w:rPr>
-          <w:lang w:val="es-ES"/>
-        </w:rPr>
-        <w:t xml:space="preserve">Necesito que al elegir del menú actividad áulica la opción calificar me muestre dos desplegables, uno con la lista de las materias registradas y otro con el o los cursos de esa materia, siguiente, que me despliegue la lista de alumnos y me </w:t>
-      </w:r>
-      <w:proofErr w:type="spellStart"/>
-      <w:r>
-        <w:rPr>
-          <w:lang w:val="es-ES"/>
-        </w:rPr>
-        <w:t>de</w:t>
-      </w:r>
-      <w:proofErr w:type="spellEnd"/>
-      <w:r>
-        <w:rPr>
-          <w:lang w:val="es-ES"/>
-        </w:rPr>
-        <w:t xml:space="preserve"> por alumno, la lista de actividades asignadas, el estado tomando como fecha de inicio, la fecha de asignación al curso</w:t>
-      </w:r>
-      <w:r>
-        <w:rPr>
-          <w:lang w:val="es-ES"/>
-        </w:rPr>
-        <w:t xml:space="preserve">, y como fecha final, la fecha de finalización, se debe poder registrar 4 estados, en proceso, finalizado y que si </w:t>
-      </w:r>
-      <w:proofErr w:type="spellStart"/>
-      <w:r>
-        <w:rPr>
-          <w:lang w:val="es-ES"/>
-        </w:rPr>
-        <w:t>elije</w:t>
-      </w:r>
-      <w:proofErr w:type="spellEnd"/>
-      <w:r>
-        <w:rPr>
-          <w:lang w:val="es-ES"/>
-        </w:rPr>
-        <w:t xml:space="preserve"> esa se registre la fecha de finalización, entrega vencida, con su fecha de entrega, y entrega incompleta con su fecha de entrega, y en cada caso la posibilidad de registrar una nota. Al presionar el botón historial que me muestre un historial de las calificaciones por alumno y de actividades con su estado. Que me conserves el </w:t>
-      </w:r>
-      <w:proofErr w:type="spellStart"/>
-      <w:r>
-        <w:rPr>
-          <w:lang w:val="es-ES"/>
-        </w:rPr>
-        <w:t>card</w:t>
-      </w:r>
-      <w:proofErr w:type="spellEnd"/>
-      <w:r>
-        <w:rPr>
-          <w:lang w:val="es-ES"/>
-        </w:rPr>
-        <w:t xml:space="preserve"> que me permite registrar notas como hasta ahora para luego procesar los registros</w:t>
-      </w:r>
-    </w:p>
-    <w:p>
-      <w:pPr>
-        <w:rPr>
-          <w:lang w:val="es-ES"/>
-        </w:rPr>
-      </w:pPr>
-      <w:r>
-        <w:rPr>
-          <w:lang w:val="es-ES"/>
-        </w:rPr>
+      <w:r>
+        <w:rPr>
+          <w:lang w:val="es-ES"/>
+        </w:rPr>
+        <w:t xml:space="preserve"> para esa materia en el apartado de horarios.</w:t>
+      </w:r>
+    </w:p>
+    <w:p>
+      <w:pPr>
+        <w:rPr>
+          <w:lang w:val="es-ES"/>
+        </w:rPr>
+      </w:pPr>
+    </w:p>
+    <w:p>
+      <w:pPr>
+        <w:rPr>
+          <w:lang w:val="es-ES"/>
+        </w:rPr>
+      </w:pPr>
+    </w:p>
+    <w:p>
+      <w:pPr>
+        <w:rPr>
+          <w:lang w:val="es-ES"/>
+        </w:rPr>
+      </w:pPr>
+    </w:p>
+    <w:p>
+      <w:pPr>
+        <w:rPr>
+          <w:lang w:val="es-ES"/>
+        </w:rPr>
+      </w:pPr>
+    </w:p>
+    <w:p>
+      <w:pPr>
+        <w:rPr>
+          <w:lang w:val="es-ES"/>
+        </w:rPr>
+      </w:pPr>
+      <w:r>
+        <w:rPr>
+          <w:lang w:val="es-ES"/>
+        </w:rPr>
+        <w:lastRenderedPageBreak/>
         <w:t>Necesito Generar Prenotas</w:t>
       </w:r>
+    </w:p>
+    <w:p>
+      <w:pPr>
+        <w:rPr>
+          <w:lang w:val="es-ES"/>
+        </w:rPr>
+      </w:pPr>
+    </w:p>
+    <w:p>
+      <w:pPr>
+        <w:rPr>
+          <w:lang w:val="es-ES"/>
+        </w:rPr>
+      </w:pPr>
     </w:p>
     <w:p>
       <w:pPr>

</xml_diff>

<commit_message>
Se agregan modulos de gestion de valoraciones, ceses y calificacion de aactividades
</commit_message>
<xml_diff>
--- a/requerimientos.docx
+++ b/requerimientos.docx
@@ -282,41 +282,48 @@
     <w:p>
       <w:pPr>
         <w:rPr>
-          <w:lang w:val="es-ES"/>
-        </w:rPr>
-      </w:pPr>
-      <w:r>
-        <w:rPr>
+          <w:b/>
+          <w:lang w:val="es-ES"/>
+        </w:rPr>
+      </w:pPr>
+      <w:r>
+        <w:rPr>
+          <w:b/>
           <w:lang w:val="es-ES"/>
         </w:rPr>
         <w:t xml:space="preserve">Necesito que al elegir del menú actividad áulica la opción calificar me muestre dos desplegables, uno con la lista de las materias registradas y otro con el o los cursos de esa materia, siguiente, que me despliegue la lista de alumnos y me </w:t>
       </w:r>
       <w:r>
         <w:rPr>
+          <w:b/>
           <w:lang w:val="es-ES"/>
         </w:rPr>
         <w:t>dé</w:t>
       </w:r>
       <w:r>
         <w:rPr>
+          <w:b/>
           <w:lang w:val="es-ES"/>
         </w:rPr>
         <w:t xml:space="preserve"> por alumno, la lista de actividades asignadas, el estado tomando como fecha de inicio, la fecha de asignación al curso</w:t>
       </w:r>
       <w:r>
         <w:rPr>
+          <w:b/>
           <w:lang w:val="es-ES"/>
         </w:rPr>
         <w:t xml:space="preserve">, y como fecha final, la fecha de finalización, se debe poder registrar 4 estados, en proceso, finalizado y que si </w:t>
       </w:r>
       <w:r>
         <w:rPr>
+          <w:b/>
           <w:lang w:val="es-ES"/>
         </w:rPr>
         <w:t>elige</w:t>
       </w:r>
       <w:r>
         <w:rPr>
+          <w:b/>
           <w:lang w:val="es-ES"/>
         </w:rPr>
         <w:t xml:space="preserve"> esa se registre la fecha de finalización, entrega vencida, con su fecha de entrega, y entrega incompleta con su fecha de entrega, y en cada caso la posibilidad de registrar una nota. Al presionar el botón historial que me muestre un historial de las calificaciones por alumno y de actividades con su estado. Que me conserves el card que me permite registrar notas como hasta ahora para luego procesar los registros</w:t>
@@ -325,120 +332,297 @@
     <w:p>
       <w:pPr>
         <w:rPr>
-          <w:lang w:val="es-ES"/>
-        </w:rPr>
-      </w:pPr>
-      <w:r>
-        <w:rPr>
+          <w:b/>
+          <w:lang w:val="es-ES"/>
+        </w:rPr>
+      </w:pPr>
+      <w:r>
+        <w:rPr>
+          <w:b/>
           <w:lang w:val="es-ES"/>
         </w:rPr>
         <w:t>Necesito que en el dashboard me ponga a la altura del saludo</w:t>
       </w:r>
       <w:r>
         <w:rPr>
+          <w:b/>
           <w:lang w:val="es-ES"/>
         </w:rPr>
         <w:t xml:space="preserve"> con el nombre del docente, y la etiqueta del panel principal a la altura del reloj, una leyenda que diga </w:t>
       </w:r>
       <w:r>
         <w:rPr>
+          <w:b/>
           <w:lang w:val="es-ES"/>
         </w:rPr>
         <w:t>Ud.</w:t>
       </w:r>
       <w:r>
         <w:rPr>
+          <w:b/>
           <w:lang w:val="es-ES"/>
         </w:rPr>
         <w:t xml:space="preserve"> se encuentra en el establecimiento: y el nombre de la escuela donde </w:t>
       </w:r>
       <w:r>
         <w:rPr>
+          <w:b/>
           <w:lang w:val="es-ES"/>
         </w:rPr>
         <w:t>está</w:t>
       </w:r>
       <w:r>
         <w:rPr>
+          <w:b/>
           <w:lang w:val="es-ES"/>
         </w:rPr>
         <w:t xml:space="preserve"> en el momento de entrar al sistema, En la materia: y el nombre de la materia, y el Año: y </w:t>
       </w:r>
       <w:r>
         <w:rPr>
+          <w:b/>
           <w:lang w:val="es-ES"/>
         </w:rPr>
         <w:t>División</w:t>
       </w:r>
       <w:r>
         <w:rPr>
+          <w:b/>
           <w:lang w:val="es-ES"/>
         </w:rPr>
         <w:t xml:space="preserve">: lo debe tomar del horario que se </w:t>
       </w:r>
       <w:r>
         <w:rPr>
+          <w:b/>
           <w:lang w:val="es-ES"/>
         </w:rPr>
         <w:t>registró</w:t>
       </w:r>
+      <w:r>
+        <w:rPr>
+          <w:b/>
+          <w:lang w:val="es-ES"/>
+        </w:rPr>
+        <w:t xml:space="preserve"> para esa materia en el apartado de horarios.</w:t>
+      </w:r>
+    </w:p>
+    <w:p>
+      <w:pPr>
+        <w:rPr>
+          <w:b/>
+          <w:lang w:val="es-ES"/>
+        </w:rPr>
+      </w:pPr>
+      <w:r>
+        <w:rPr>
+          <w:b/>
+          <w:lang w:val="es-ES"/>
+        </w:rPr>
+        <w:t xml:space="preserve">Necesito agregar al menú </w:t>
+      </w:r>
+      <w:r>
+        <w:rPr>
+          <w:b/>
+          <w:lang w:val="es-ES"/>
+        </w:rPr>
+        <w:t>Administración</w:t>
+      </w:r>
+      <w:r>
+        <w:rPr>
+          <w:b/>
+          <w:lang w:val="es-ES"/>
+        </w:rPr>
+        <w:t xml:space="preserve"> al apartado académico, la opción de cargar ceses, el mismo debe cargarse con las siguientes datos, Materia, fecha de toma de </w:t>
+      </w:r>
+      <w:proofErr w:type="spellStart"/>
+      <w:r>
+        <w:rPr>
+          <w:b/>
+          <w:lang w:val="es-ES"/>
+        </w:rPr>
+        <w:t>posecion</w:t>
+      </w:r>
+      <w:proofErr w:type="spellEnd"/>
+      <w:r>
+        <w:rPr>
+          <w:b/>
+          <w:lang w:val="es-ES"/>
+        </w:rPr>
+        <w:t xml:space="preserve">, establecimiento, </w:t>
+      </w:r>
+      <w:proofErr w:type="gramStart"/>
+      <w:r>
+        <w:rPr>
+          <w:b/>
+          <w:lang w:val="es-ES"/>
+        </w:rPr>
+        <w:t>horario ,</w:t>
+      </w:r>
+      <w:proofErr w:type="gramEnd"/>
+      <w:r>
+        <w:rPr>
+          <w:b/>
+          <w:lang w:val="es-ES"/>
+        </w:rPr>
+        <w:t xml:space="preserve"> numero de secuencia, fecha de cese. Al registrar el cese debe borrarse de la lista de horarios y dejar ese horario disponible.</w:t>
+      </w:r>
+    </w:p>
+    <w:p>
+      <w:pPr>
+        <w:rPr>
+          <w:lang w:val="es-ES"/>
+        </w:rPr>
+      </w:pPr>
+    </w:p>
+    <w:p>
+      <w:pPr>
+        <w:rPr>
+          <w:b/>
+          <w:lang w:val="es-ES"/>
+        </w:rPr>
+      </w:pPr>
+      <w:r>
+        <w:rPr>
+          <w:b/>
+          <w:lang w:val="es-ES"/>
+        </w:rPr>
+        <w:lastRenderedPageBreak/>
+        <w:t xml:space="preserve">Necesito  que el sistema filtre y en la vista de Calificar actividades solo me muestre las actividades que están pendientes de calificar, las que ya fueron calificadas con el estado finalizado, o entrega vencida o entrega incompleta, que no me las muestre en la vista, que me agregue en esa vista arriba al lado de historial y ver, un botón que me lleve a una vista donde me muestre las que ya fueron calificadas, con el estado entrega incompleta y que solo me permita modificar a la opción entrega vencida. </w:t>
+      </w:r>
+      <w:proofErr w:type="spellStart"/>
+      <w:r>
+        <w:rPr>
+          <w:b/>
+          <w:lang w:val="es-ES"/>
+        </w:rPr>
+        <w:t>Tambien</w:t>
+      </w:r>
+      <w:proofErr w:type="spellEnd"/>
+      <w:r>
+        <w:rPr>
+          <w:b/>
+          <w:lang w:val="es-ES"/>
+        </w:rPr>
+        <w:t xml:space="preserve"> necesito una vista de Actividades calificadas con un botón de ver los datos de la actividad, y otro que me permita modificar los datos de la actividad calificada </w:t>
+      </w:r>
+    </w:p>
+    <w:p>
+      <w:pPr>
+        <w:rPr>
+          <w:b/>
+          <w:lang w:val="es-ES"/>
+        </w:rPr>
+      </w:pPr>
       <w:bookmarkStart w:id="0" w:name="_GoBack"/>
-      <w:bookmarkEnd w:id="0"/>
-      <w:r>
-        <w:rPr>
-          <w:lang w:val="es-ES"/>
-        </w:rPr>
-        <w:t xml:space="preserve"> para esa materia en el apartado de horarios.</w:t>
-      </w:r>
-    </w:p>
-    <w:p>
-      <w:pPr>
-        <w:rPr>
-          <w:lang w:val="es-ES"/>
-        </w:rPr>
-      </w:pPr>
-    </w:p>
-    <w:p>
-      <w:pPr>
-        <w:rPr>
-          <w:lang w:val="es-ES"/>
-        </w:rPr>
-      </w:pPr>
-    </w:p>
-    <w:p>
-      <w:pPr>
-        <w:rPr>
-          <w:lang w:val="es-ES"/>
-        </w:rPr>
-      </w:pPr>
-    </w:p>
-    <w:p>
-      <w:pPr>
-        <w:rPr>
-          <w:lang w:val="es-ES"/>
-        </w:rPr>
-      </w:pPr>
-    </w:p>
-    <w:p>
-      <w:pPr>
-        <w:rPr>
-          <w:lang w:val="es-ES"/>
-        </w:rPr>
-      </w:pPr>
-      <w:r>
-        <w:rPr>
-          <w:lang w:val="es-ES"/>
-        </w:rPr>
-        <w:lastRenderedPageBreak/>
+      <w:r>
+        <w:rPr>
+          <w:b/>
+          <w:lang w:val="es-ES"/>
+        </w:rPr>
+        <w:t xml:space="preserve">Necesito poder gestionar en el menú </w:t>
+      </w:r>
+      <w:proofErr w:type="spellStart"/>
+      <w:r>
+        <w:rPr>
+          <w:b/>
+          <w:lang w:val="es-ES"/>
+        </w:rPr>
+        <w:t>Administracion</w:t>
+      </w:r>
+      <w:proofErr w:type="spellEnd"/>
+      <w:r>
+        <w:rPr>
+          <w:b/>
+          <w:lang w:val="es-ES"/>
+        </w:rPr>
+        <w:t xml:space="preserve"> en el apartado </w:t>
+      </w:r>
+      <w:proofErr w:type="spellStart"/>
+      <w:r>
+        <w:rPr>
+          <w:b/>
+          <w:lang w:val="es-ES"/>
+        </w:rPr>
+        <w:t>Evaluacion</w:t>
+      </w:r>
+      <w:proofErr w:type="spellEnd"/>
+      <w:r>
+        <w:rPr>
+          <w:b/>
+          <w:lang w:val="es-ES"/>
+        </w:rPr>
+        <w:t xml:space="preserve">, Los tipos de Valoraciones mediante un </w:t>
+      </w:r>
+      <w:proofErr w:type="spellStart"/>
+      <w:r>
+        <w:rPr>
+          <w:b/>
+          <w:lang w:val="es-ES"/>
+        </w:rPr>
+        <w:t>crud</w:t>
+      </w:r>
+      <w:proofErr w:type="spellEnd"/>
+      <w:r>
+        <w:rPr>
+          <w:b/>
+          <w:lang w:val="es-ES"/>
+        </w:rPr>
+        <w:t xml:space="preserve">, donde yo pueda agregar, modificar, eliminar, una valoración, necesito manejar los siguientes datos </w:t>
+      </w:r>
+      <w:proofErr w:type="spellStart"/>
+      <w:r>
+        <w:rPr>
+          <w:b/>
+          <w:lang w:val="es-ES"/>
+        </w:rPr>
+        <w:t>Denominacion</w:t>
+      </w:r>
+      <w:proofErr w:type="spellEnd"/>
+      <w:r>
+        <w:rPr>
+          <w:b/>
+          <w:lang w:val="es-ES"/>
+        </w:rPr>
+        <w:t xml:space="preserve">, Nota </w:t>
+      </w:r>
+      <w:proofErr w:type="spellStart"/>
+      <w:r>
+        <w:rPr>
+          <w:b/>
+          <w:lang w:val="es-ES"/>
+        </w:rPr>
+        <w:t>Limite</w:t>
+      </w:r>
+      <w:proofErr w:type="spellEnd"/>
+      <w:r>
+        <w:rPr>
+          <w:b/>
+          <w:lang w:val="es-ES"/>
+        </w:rPr>
+        <w:t xml:space="preserve"> inferior, Nota Limite Superior</w:t>
+      </w:r>
+    </w:p>
+    <w:bookmarkEnd w:id="0"/>
+    <w:p>
+      <w:pPr>
+        <w:rPr>
+          <w:lang w:val="es-ES"/>
+        </w:rPr>
+      </w:pPr>
+    </w:p>
+    <w:p>
+      <w:pPr>
+        <w:rPr>
+          <w:lang w:val="es-ES"/>
+        </w:rPr>
+      </w:pPr>
+      <w:r>
+        <w:rPr>
+          <w:lang w:val="es-ES"/>
+        </w:rPr>
         <w:t>Necesito Generar Prenotas</w:t>
       </w:r>
-    </w:p>
-    <w:p>
-      <w:pPr>
-        <w:rPr>
-          <w:lang w:val="es-ES"/>
-        </w:rPr>
-      </w:pPr>
     </w:p>
     <w:p>
       <w:pPr>

</xml_diff>

<commit_message>
se modifica modulo de toma de asistencias desde dasboard, se modifica modulo de creacion de actividades
</commit_message>
<xml_diff>
--- a/requerimientos.docx
+++ b/requerimientos.docx
@@ -6152,245 +6152,565 @@
           <w:lang w:val="es-ES"/>
         </w:rPr>
       </w:pPr>
+      <w:r>
+        <w:rPr>
+          <w:b/>
+          <w:lang w:val="es-ES"/>
+        </w:rPr>
+        <w:t xml:space="preserve">Necesito me agregues un campo en el </w:t>
+      </w:r>
+      <w:proofErr w:type="spellStart"/>
+      <w:r>
+        <w:rPr>
+          <w:b/>
+          <w:lang w:val="es-ES"/>
+        </w:rPr>
+        <w:t>modulo</w:t>
+      </w:r>
+      <w:proofErr w:type="spellEnd"/>
+      <w:r>
+        <w:rPr>
+          <w:b/>
+          <w:lang w:val="es-ES"/>
+        </w:rPr>
+        <w:t xml:space="preserve"> Calendario escolar, que me muestre el </w:t>
+      </w:r>
+      <w:proofErr w:type="spellStart"/>
+      <w:r>
+        <w:rPr>
+          <w:b/>
+          <w:lang w:val="es-ES"/>
+        </w:rPr>
+        <w:t>dia</w:t>
+      </w:r>
+      <w:proofErr w:type="spellEnd"/>
+      <w:r>
+        <w:rPr>
+          <w:b/>
+          <w:lang w:val="es-ES"/>
+        </w:rPr>
+        <w:t xml:space="preserve"> de la semana en la que cae la fecha de inicio del evento.</w:t>
+      </w:r>
+    </w:p>
+    <w:p>
+      <w:pPr>
+        <w:rPr>
+          <w:b/>
+          <w:lang w:val="es-ES"/>
+        </w:rPr>
+      </w:pPr>
+      <w:r>
+        <w:rPr>
+          <w:b/>
+          <w:lang w:val="es-ES"/>
+        </w:rPr>
+        <w:t xml:space="preserve">Y necesito corregir que la leyenda que te </w:t>
+      </w:r>
+      <w:proofErr w:type="spellStart"/>
+      <w:r>
+        <w:rPr>
+          <w:b/>
+          <w:lang w:val="es-ES"/>
+        </w:rPr>
+        <w:t>pedi</w:t>
+      </w:r>
+      <w:proofErr w:type="spellEnd"/>
+      <w:r>
+        <w:rPr>
+          <w:b/>
+          <w:lang w:val="es-ES"/>
+        </w:rPr>
+        <w:t xml:space="preserve"> que salga en </w:t>
+      </w:r>
+      <w:r>
+        <w:rPr>
+          <w:b/>
+          <w:lang w:val="es-ES"/>
+        </w:rPr>
+        <w:t xml:space="preserve">el </w:t>
+      </w:r>
+      <w:proofErr w:type="spellStart"/>
+      <w:r>
+        <w:rPr>
+          <w:b/>
+          <w:lang w:val="es-ES"/>
+        </w:rPr>
+        <w:t>dasboard</w:t>
+      </w:r>
+      <w:proofErr w:type="spellEnd"/>
+      <w:r>
+        <w:rPr>
+          <w:b/>
+          <w:lang w:val="es-ES"/>
+        </w:rPr>
+        <w:t xml:space="preserve"> poniendo el establecimiento, la Materia y el curso en el que </w:t>
+      </w:r>
+      <w:proofErr w:type="gramStart"/>
+      <w:r>
+        <w:rPr>
+          <w:b/>
+          <w:lang w:val="es-ES"/>
+        </w:rPr>
+        <w:t>estoy ,</w:t>
+      </w:r>
+      <w:proofErr w:type="gramEnd"/>
+      <w:r>
+        <w:rPr>
+          <w:b/>
+          <w:lang w:val="es-ES"/>
+        </w:rPr>
+        <w:t xml:space="preserve"> apareció una sola vez y luego no apareció nunca mas</w:t>
+      </w:r>
+    </w:p>
+    <w:p>
+      <w:pPr>
+        <w:rPr>
+          <w:b/>
+          <w:lang w:val="es-ES"/>
+        </w:rPr>
+      </w:pPr>
+      <w:r>
+        <w:rPr>
+          <w:b/>
+          <w:lang w:val="es-ES"/>
+        </w:rPr>
+        <w:t xml:space="preserve">Necesito que en el historial de </w:t>
+      </w:r>
+      <w:proofErr w:type="spellStart"/>
+      <w:r>
+        <w:rPr>
+          <w:b/>
+          <w:lang w:val="es-ES"/>
+        </w:rPr>
+        <w:t>calficiaciones</w:t>
+      </w:r>
+      <w:proofErr w:type="spellEnd"/>
+      <w:r>
+        <w:rPr>
+          <w:b/>
+          <w:lang w:val="es-ES"/>
+        </w:rPr>
+        <w:t xml:space="preserve"> se vean las notas de cada estudiantes agrupadas por estudiante sin importar el origen de la calificación, me tiene que mostrar </w:t>
+      </w:r>
+      <w:r>
+        <w:rPr>
+          <w:b/>
+          <w:lang w:val="es-ES"/>
+        </w:rPr>
+        <w:t xml:space="preserve">la materia, </w:t>
+      </w:r>
+      <w:r>
+        <w:rPr>
+          <w:b/>
+          <w:lang w:val="es-ES"/>
+        </w:rPr>
+        <w:t xml:space="preserve">el alumno, el </w:t>
+      </w:r>
+      <w:proofErr w:type="gramStart"/>
+      <w:r>
+        <w:rPr>
+          <w:b/>
+          <w:lang w:val="es-ES"/>
+        </w:rPr>
+        <w:t>año ,</w:t>
+      </w:r>
+      <w:proofErr w:type="gramEnd"/>
+      <w:r>
+        <w:rPr>
+          <w:b/>
+          <w:lang w:val="es-ES"/>
+        </w:rPr>
+        <w:t xml:space="preserve"> la división, y grupo al que concurre, el periodo al que corresponde la nota</w:t>
+      </w:r>
+      <w:r>
+        <w:rPr>
+          <w:b/>
+          <w:lang w:val="es-ES"/>
+        </w:rPr>
+        <w:t xml:space="preserve"> el trabajo o tipo de evaluación por el cual se </w:t>
+      </w:r>
+      <w:proofErr w:type="spellStart"/>
+      <w:r>
+        <w:rPr>
+          <w:b/>
+          <w:lang w:val="es-ES"/>
+        </w:rPr>
+        <w:t>asigno</w:t>
+      </w:r>
+      <w:proofErr w:type="spellEnd"/>
+      <w:r>
+        <w:rPr>
+          <w:b/>
+          <w:lang w:val="es-ES"/>
+        </w:rPr>
+        <w:t xml:space="preserve"> la nota</w:t>
+      </w:r>
+      <w:r>
+        <w:rPr>
+          <w:b/>
+          <w:lang w:val="es-ES"/>
+        </w:rPr>
+        <w:t xml:space="preserve">, el tipo de nota, la nota obtenida, alguna observación si la hay, y </w:t>
+      </w:r>
+      <w:proofErr w:type="spellStart"/>
+      <w:r>
+        <w:rPr>
+          <w:b/>
+          <w:lang w:val="es-ES"/>
+        </w:rPr>
+        <w:t>cual</w:t>
+      </w:r>
+      <w:proofErr w:type="spellEnd"/>
+      <w:r>
+        <w:rPr>
+          <w:b/>
+          <w:lang w:val="es-ES"/>
+        </w:rPr>
+        <w:t xml:space="preserve"> fue su docente</w:t>
+      </w:r>
+      <w:r>
+        <w:rPr>
+          <w:b/>
+          <w:lang w:val="es-ES"/>
+        </w:rPr>
+        <w:t xml:space="preserve">. </w:t>
+      </w:r>
+    </w:p>
+    <w:p>
+      <w:pPr>
+        <w:rPr>
+          <w:b/>
+          <w:lang w:val="es-ES"/>
+        </w:rPr>
+      </w:pPr>
+      <w:r>
+        <w:rPr>
+          <w:b/>
+        </w:rPr>
+        <w:t xml:space="preserve">Necesito que cada </w:t>
+      </w:r>
+      <w:proofErr w:type="spellStart"/>
+      <w:r>
+        <w:rPr>
+          <w:b/>
+        </w:rPr>
+        <w:t>ves</w:t>
+      </w:r>
+      <w:proofErr w:type="spellEnd"/>
+      <w:r>
+        <w:rPr>
+          <w:b/>
+        </w:rPr>
+        <w:t xml:space="preserve"> que se guarden datos, se actualicen, se borren me muestre un </w:t>
+      </w:r>
+      <w:proofErr w:type="spellStart"/>
+      <w:r>
+        <w:rPr>
+          <w:b/>
+        </w:rPr>
+        <w:t>spinner</w:t>
+      </w:r>
+      <w:proofErr w:type="spellEnd"/>
+      <w:r>
+        <w:rPr>
+          <w:b/>
+        </w:rPr>
+        <w:t xml:space="preserve"> o indicador de progreso</w:t>
+      </w:r>
+    </w:p>
+    <w:p>
+      <w:pPr>
+        <w:rPr>
+          <w:lang w:val="es-ES"/>
+        </w:rPr>
+      </w:pPr>
+      <w:r>
+        <w:rPr>
+          <w:lang w:val="es-ES"/>
+        </w:rPr>
+        <w:t xml:space="preserve">Necesito que cuando presione el botón ir al </w:t>
+      </w:r>
+      <w:proofErr w:type="spellStart"/>
+      <w:r>
+        <w:rPr>
+          <w:lang w:val="es-ES"/>
+        </w:rPr>
+        <w:t>modulo</w:t>
+      </w:r>
+      <w:proofErr w:type="spellEnd"/>
+      <w:r>
+        <w:rPr>
+          <w:lang w:val="es-ES"/>
+        </w:rPr>
+        <w:t xml:space="preserve"> en la card de Asistencias, me tome la materia y curso actual del horario y que solo el sistema me lleve a la vista de asistencia en la cual se registra la asistencia de ese curso, eso debe suceder si estoy en el horario de alguna materia, sino que me muestre un modal diciendo que no hay cursos activos según mi horario para registrar asistencia, y que si deseo hacer un registro fuera de horario que me dirija al menú de Actividad áulica, opción tomar asistencia.</w:t>
+      </w:r>
+    </w:p>
+    <w:p>
+      <w:pPr>
+        <w:rPr>
+          <w:lang w:val="es-ES"/>
+        </w:rPr>
+      </w:pPr>
+      <w:r>
+        <w:rPr>
+          <w:lang w:val="es-ES"/>
+        </w:rPr>
+        <w:t>Necesito</w:t>
+      </w:r>
+      <w:r>
+        <w:rPr>
+          <w:lang w:val="es-ES"/>
+        </w:rPr>
+        <w:t xml:space="preserve"> reformar el </w:t>
+      </w:r>
+      <w:proofErr w:type="spellStart"/>
+      <w:r>
+        <w:rPr>
+          <w:lang w:val="es-ES"/>
+        </w:rPr>
+        <w:t>modulo</w:t>
+      </w:r>
+      <w:proofErr w:type="spellEnd"/>
+      <w:r>
+        <w:rPr>
+          <w:lang w:val="es-ES"/>
+        </w:rPr>
+        <w:t xml:space="preserve"> de Actividades del menú Material </w:t>
+      </w:r>
+      <w:proofErr w:type="spellStart"/>
+      <w:r>
+        <w:rPr>
+          <w:lang w:val="es-ES"/>
+        </w:rPr>
+        <w:t>Pedagogico</w:t>
+      </w:r>
+      <w:proofErr w:type="spellEnd"/>
+      <w:r>
+        <w:rPr>
+          <w:lang w:val="es-ES"/>
+        </w:rPr>
+        <w:t xml:space="preserve">, quiero que cuando le hago </w:t>
+      </w:r>
+      <w:proofErr w:type="spellStart"/>
+      <w:r>
+        <w:rPr>
+          <w:lang w:val="es-ES"/>
+        </w:rPr>
+        <w:t>click</w:t>
+      </w:r>
+      <w:proofErr w:type="spellEnd"/>
+      <w:r>
+        <w:rPr>
+          <w:lang w:val="es-ES"/>
+        </w:rPr>
+        <w:t xml:space="preserve"> a Actividades, </w:t>
+      </w:r>
+      <w:r>
+        <w:rPr>
+          <w:lang w:val="es-ES"/>
+        </w:rPr>
+        <w:t xml:space="preserve"> </w:t>
+      </w:r>
+      <w:r>
+        <w:rPr>
+          <w:lang w:val="es-ES"/>
+        </w:rPr>
+        <w:t>me p</w:t>
+      </w:r>
+      <w:r>
+        <w:rPr>
+          <w:lang w:val="es-ES"/>
+        </w:rPr>
+        <w:t xml:space="preserve">ermita </w:t>
+      </w:r>
+      <w:r>
+        <w:rPr>
+          <w:lang w:val="es-ES"/>
+        </w:rPr>
+        <w:t>Seleccionar la Materia</w:t>
+      </w:r>
+      <w:r>
+        <w:rPr>
+          <w:lang w:val="es-ES"/>
+        </w:rPr>
+        <w:t xml:space="preserve"> para filtrar las actividades por todas, o por materia y me las muestre automáticamente en la lista como ahora pero de esa </w:t>
+      </w:r>
+      <w:r>
+        <w:rPr>
+          <w:lang w:val="es-ES"/>
+        </w:rPr>
+        <w:lastRenderedPageBreak/>
+        <w:t>materia filtrada</w:t>
+      </w:r>
+      <w:r>
+        <w:rPr>
+          <w:lang w:val="es-ES"/>
+        </w:rPr>
+        <w:t>. Que se mantenga el botón nueva actividad , y que al presionarlo</w:t>
+      </w:r>
+      <w:r>
+        <w:rPr>
+          <w:lang w:val="es-ES"/>
+        </w:rPr>
+        <w:t xml:space="preserve"> haga lo mismo que hasta ahora,</w:t>
+      </w:r>
+      <w:r>
+        <w:rPr>
+          <w:lang w:val="es-ES"/>
+        </w:rPr>
+        <w:t xml:space="preserve"> que </w:t>
+      </w:r>
+      <w:r>
+        <w:rPr>
+          <w:lang w:val="es-ES"/>
+        </w:rPr>
+        <w:t xml:space="preserve">me modifiques la vista </w:t>
+      </w:r>
+      <w:r>
+        <w:rPr>
+          <w:lang w:val="es-ES"/>
+        </w:rPr>
+        <w:t xml:space="preserve">, Primero que aparezca Numero de Unidad, (requerido), luego el Tema, que se elija de los contenidos como ahora, también (requerido), , luego el Tipo de actividad (Requerido), que me permita ingresar el Numero de Actividad, y elegir un sub tema de los subtemas disponibles, a continuación que me permita ingresar un numero de </w:t>
+      </w:r>
+      <w:proofErr w:type="spellStart"/>
+      <w:r>
+        <w:rPr>
+          <w:lang w:val="es-ES"/>
+        </w:rPr>
+        <w:t>Item</w:t>
+      </w:r>
+      <w:proofErr w:type="spellEnd"/>
+      <w:r>
+        <w:rPr>
+          <w:lang w:val="es-ES"/>
+        </w:rPr>
+        <w:t xml:space="preserve"> (pregunta), y su texto correspondiente, y que me los valla completando en una tabla de preguntas, debajo de la tabla que me muestre los botones uno que me permita agregar otra consigna, y otro que me permita guardar la información. Mantenemos la fecha de </w:t>
+      </w:r>
+      <w:proofErr w:type="spellStart"/>
+      <w:r>
+        <w:rPr>
+          <w:lang w:val="es-ES"/>
+        </w:rPr>
+        <w:t>cracion</w:t>
+      </w:r>
+      <w:proofErr w:type="spellEnd"/>
+      <w:r>
+        <w:rPr>
+          <w:lang w:val="es-ES"/>
+        </w:rPr>
+        <w:t xml:space="preserve"> de la actividad, sacamos de esta tabla la fecha de inicio, y la fecha de entrega</w:t>
+      </w:r>
+      <w:r>
+        <w:rPr>
+          <w:lang w:val="es-ES"/>
+        </w:rPr>
+        <w:t xml:space="preserve"> / finalización de la actividad, sacamos también la asignación del curso, y mantenemos las Observaciones (opcionales).</w:t>
+      </w:r>
+    </w:p>
+    <w:p>
+      <w:pPr>
+        <w:rPr>
+          <w:lang w:val="es-ES"/>
+        </w:rPr>
+      </w:pPr>
+      <w:r>
+        <w:rPr>
+          <w:lang w:val="es-ES"/>
+        </w:rPr>
+        <w:t xml:space="preserve">Sacamos de este </w:t>
+      </w:r>
+      <w:proofErr w:type="spellStart"/>
+      <w:r>
+        <w:rPr>
+          <w:lang w:val="es-ES"/>
+        </w:rPr>
+        <w:t>modulo</w:t>
+      </w:r>
+      <w:proofErr w:type="spellEnd"/>
+      <w:r>
+        <w:rPr>
+          <w:lang w:val="es-ES"/>
+        </w:rPr>
+        <w:t xml:space="preserve"> la asignación de modalidad individual/grupal y la pasamos al </w:t>
+      </w:r>
+      <w:proofErr w:type="spellStart"/>
+      <w:r>
+        <w:rPr>
+          <w:lang w:val="es-ES"/>
+        </w:rPr>
+        <w:t>modulo</w:t>
+      </w:r>
+      <w:proofErr w:type="spellEnd"/>
+      <w:r>
+        <w:rPr>
+          <w:lang w:val="es-ES"/>
+        </w:rPr>
+        <w:t xml:space="preserve"> de asignación de actividades, junto a la fecha de inicio de la actividad y a la fecha de </w:t>
+      </w:r>
+      <w:proofErr w:type="spellStart"/>
+      <w:r>
+        <w:rPr>
+          <w:lang w:val="es-ES"/>
+        </w:rPr>
+        <w:t>finalizacion</w:t>
+      </w:r>
+      <w:proofErr w:type="spellEnd"/>
+      <w:r>
+        <w:rPr>
+          <w:lang w:val="es-ES"/>
+        </w:rPr>
+        <w:t xml:space="preserve">. Necesito me crees en el </w:t>
+      </w:r>
+      <w:proofErr w:type="spellStart"/>
+      <w:r>
+        <w:rPr>
+          <w:lang w:val="es-ES"/>
+        </w:rPr>
+        <w:t>menu</w:t>
+      </w:r>
+      <w:proofErr w:type="spellEnd"/>
+      <w:r>
+        <w:rPr>
+          <w:lang w:val="es-ES"/>
+        </w:rPr>
+        <w:t xml:space="preserve"> de Material </w:t>
+      </w:r>
+      <w:proofErr w:type="spellStart"/>
+      <w:r>
+        <w:rPr>
+          <w:lang w:val="es-ES"/>
+        </w:rPr>
+        <w:t>Pedagogico</w:t>
+      </w:r>
+      <w:proofErr w:type="spellEnd"/>
+      <w:r>
+        <w:rPr>
+          <w:lang w:val="es-ES"/>
+        </w:rPr>
+        <w:t xml:space="preserve">, una opción que me permita Asignar actividades, que al hacerle </w:t>
+      </w:r>
+      <w:proofErr w:type="spellStart"/>
+      <w:r>
+        <w:rPr>
+          <w:lang w:val="es-ES"/>
+        </w:rPr>
+        <w:t>click</w:t>
+      </w:r>
+      <w:proofErr w:type="spellEnd"/>
+      <w:r>
+        <w:rPr>
+          <w:lang w:val="es-ES"/>
+        </w:rPr>
+        <w:t xml:space="preserve"> me pida seleccionar el Año y el curso de listas, y la Materia, que al seleccionar la materia, me despliegue una tabla con las Actividades cargadas en el sistema y que me habilite un botón asignar actividad, que al presionarlo me guarde toda la información de la asignación de la actividad.</w:t>
+      </w:r>
+      <w:r>
+        <w:rPr>
+          <w:lang w:val="es-ES"/>
+        </w:rPr>
+        <w:t xml:space="preserve"> Para después mostrarla en actividades asignadas como hasta ahora.</w:t>
+      </w:r>
       <w:bookmarkStart w:id="0" w:name="_GoBack"/>
-      <w:r>
-        <w:rPr>
-          <w:b/>
-          <w:lang w:val="es-ES"/>
-        </w:rPr>
-        <w:t xml:space="preserve">Necesito me agregues un campo en el </w:t>
-      </w:r>
-      <w:proofErr w:type="spellStart"/>
-      <w:r>
-        <w:rPr>
-          <w:b/>
-          <w:lang w:val="es-ES"/>
-        </w:rPr>
-        <w:t>modulo</w:t>
-      </w:r>
-      <w:proofErr w:type="spellEnd"/>
-      <w:r>
-        <w:rPr>
-          <w:b/>
-          <w:lang w:val="es-ES"/>
-        </w:rPr>
-        <w:t xml:space="preserve"> Calendario escolar, que me muestre el </w:t>
-      </w:r>
-      <w:proofErr w:type="spellStart"/>
-      <w:r>
-        <w:rPr>
-          <w:b/>
-          <w:lang w:val="es-ES"/>
-        </w:rPr>
-        <w:t>dia</w:t>
-      </w:r>
-      <w:proofErr w:type="spellEnd"/>
-      <w:r>
-        <w:rPr>
-          <w:b/>
-          <w:lang w:val="es-ES"/>
-        </w:rPr>
-        <w:t xml:space="preserve"> de la semana en la que cae la fecha de inicio del evento.</w:t>
-      </w:r>
-    </w:p>
-    <w:p>
-      <w:pPr>
-        <w:rPr>
-          <w:b/>
-          <w:lang w:val="es-ES"/>
-        </w:rPr>
-      </w:pPr>
-      <w:r>
-        <w:rPr>
-          <w:b/>
-          <w:lang w:val="es-ES"/>
-        </w:rPr>
-        <w:t xml:space="preserve">Y necesito corregir que la leyenda que te </w:t>
-      </w:r>
-      <w:proofErr w:type="spellStart"/>
-      <w:r>
-        <w:rPr>
-          <w:b/>
-          <w:lang w:val="es-ES"/>
-        </w:rPr>
-        <w:t>pedi</w:t>
-      </w:r>
-      <w:proofErr w:type="spellEnd"/>
-      <w:r>
-        <w:rPr>
-          <w:b/>
-          <w:lang w:val="es-ES"/>
-        </w:rPr>
-        <w:t xml:space="preserve"> que salga en </w:t>
-      </w:r>
-      <w:r>
-        <w:rPr>
-          <w:b/>
-          <w:lang w:val="es-ES"/>
-        </w:rPr>
-        <w:t xml:space="preserve">el </w:t>
-      </w:r>
-      <w:proofErr w:type="spellStart"/>
-      <w:r>
-        <w:rPr>
-          <w:b/>
-          <w:lang w:val="es-ES"/>
-        </w:rPr>
-        <w:t>dasboard</w:t>
-      </w:r>
-      <w:proofErr w:type="spellEnd"/>
-      <w:r>
-        <w:rPr>
-          <w:b/>
-          <w:lang w:val="es-ES"/>
-        </w:rPr>
-        <w:t xml:space="preserve"> poniendo el establecimiento, la Materia y el curso en el que </w:t>
-      </w:r>
-      <w:proofErr w:type="gramStart"/>
-      <w:r>
-        <w:rPr>
-          <w:b/>
-          <w:lang w:val="es-ES"/>
-        </w:rPr>
-        <w:t>estoy ,</w:t>
-      </w:r>
-      <w:proofErr w:type="gramEnd"/>
-      <w:r>
-        <w:rPr>
-          <w:b/>
-          <w:lang w:val="es-ES"/>
-        </w:rPr>
-        <w:t xml:space="preserve"> apareció una sola vez y luego no apareció nunca mas</w:t>
-      </w:r>
-    </w:p>
-    <w:bookmarkEnd w:id="0"/>
-    <w:p>
-      <w:pPr>
-        <w:rPr>
-          <w:b/>
-          <w:lang w:val="es-ES"/>
-        </w:rPr>
-      </w:pPr>
-      <w:r>
-        <w:rPr>
-          <w:b/>
-          <w:lang w:val="es-ES"/>
-        </w:rPr>
-        <w:t xml:space="preserve">Necesito que en el historial de </w:t>
-      </w:r>
-      <w:proofErr w:type="spellStart"/>
-      <w:r>
-        <w:rPr>
-          <w:b/>
-          <w:lang w:val="es-ES"/>
-        </w:rPr>
-        <w:t>calficiaciones</w:t>
-      </w:r>
-      <w:proofErr w:type="spellEnd"/>
-      <w:r>
-        <w:rPr>
-          <w:b/>
-          <w:lang w:val="es-ES"/>
-        </w:rPr>
-        <w:t xml:space="preserve"> se vean las notas de cada estudiantes agrupadas por estudiante sin importar el origen de la calificación, me tiene que mostrar </w:t>
-      </w:r>
-      <w:r>
-        <w:rPr>
-          <w:b/>
-          <w:lang w:val="es-ES"/>
-        </w:rPr>
-        <w:t xml:space="preserve">la materia, </w:t>
-      </w:r>
-      <w:r>
-        <w:rPr>
-          <w:b/>
-          <w:lang w:val="es-ES"/>
-        </w:rPr>
-        <w:t xml:space="preserve">el alumno, el </w:t>
-      </w:r>
-      <w:proofErr w:type="gramStart"/>
-      <w:r>
-        <w:rPr>
-          <w:b/>
-          <w:lang w:val="es-ES"/>
-        </w:rPr>
-        <w:t>año ,</w:t>
-      </w:r>
-      <w:proofErr w:type="gramEnd"/>
-      <w:r>
-        <w:rPr>
-          <w:b/>
-          <w:lang w:val="es-ES"/>
-        </w:rPr>
-        <w:t xml:space="preserve"> la división, y grupo al que concurre, el periodo al que corresponde la nota</w:t>
-      </w:r>
-      <w:r>
-        <w:rPr>
-          <w:b/>
-          <w:lang w:val="es-ES"/>
-        </w:rPr>
-        <w:t xml:space="preserve"> el trabajo o tipo de evaluación por el cual se </w:t>
-      </w:r>
-      <w:proofErr w:type="spellStart"/>
-      <w:r>
-        <w:rPr>
-          <w:b/>
-          <w:lang w:val="es-ES"/>
-        </w:rPr>
-        <w:t>asigno</w:t>
-      </w:r>
-      <w:proofErr w:type="spellEnd"/>
-      <w:r>
-        <w:rPr>
-          <w:b/>
-          <w:lang w:val="es-ES"/>
-        </w:rPr>
-        <w:t xml:space="preserve"> la nota</w:t>
-      </w:r>
-      <w:r>
-        <w:rPr>
-          <w:b/>
-          <w:lang w:val="es-ES"/>
-        </w:rPr>
-        <w:t xml:space="preserve">, el tipo de nota, la nota obtenida, alguna observación si la hay, y </w:t>
-      </w:r>
-      <w:proofErr w:type="spellStart"/>
-      <w:r>
-        <w:rPr>
-          <w:b/>
-          <w:lang w:val="es-ES"/>
-        </w:rPr>
-        <w:t>cual</w:t>
-      </w:r>
-      <w:proofErr w:type="spellEnd"/>
-      <w:r>
-        <w:rPr>
-          <w:b/>
-          <w:lang w:val="es-ES"/>
-        </w:rPr>
-        <w:t xml:space="preserve"> fue su docente</w:t>
-      </w:r>
-      <w:r>
-        <w:rPr>
-          <w:b/>
-          <w:lang w:val="es-ES"/>
-        </w:rPr>
-        <w:t xml:space="preserve">. </w:t>
-      </w:r>
-    </w:p>
-    <w:p>
-      <w:pPr>
-        <w:rPr>
-          <w:lang w:val="es-ES"/>
-        </w:rPr>
-      </w:pPr>
-    </w:p>
-    <w:p>
-      <w:pPr>
-        <w:rPr>
-          <w:lang w:val="es-ES"/>
-        </w:rPr>
-      </w:pPr>
+      <w:bookmarkEnd w:id="0"/>
     </w:p>
     <w:p>
       <w:pPr>
@@ -10309,7 +10629,7 @@
 </file>
 
 <file path=customXml/itemProps1.xml><?xml version="1.0" encoding="utf-8"?>
-<ds:datastoreItem xmlns:ds="http://schemas.openxmlformats.org/officeDocument/2006/customXml" ds:itemID="{051968E9-B076-4F77-A8E0-760D38DB47E3}">
+<ds:datastoreItem xmlns:ds="http://schemas.openxmlformats.org/officeDocument/2006/customXml" ds:itemID="{C3BA27FE-02F8-4E9D-B5AE-6106D10B4400}">
   <ds:schemaRefs>
     <ds:schemaRef ds:uri="http://schemas.openxmlformats.org/officeDocument/2006/bibliography"/>
   </ds:schemaRefs>

</xml_diff>

<commit_message>
Se modifica toma de asistencia desde el card del dashboard, se modifica modulo de creacion de actividades, y se crea modulo de asignacion de actividades
</commit_message>
<xml_diff>
--- a/requerimientos.docx
+++ b/requerimientos.docx
@@ -6426,6 +6426,7 @@
       </w:pPr>
       <w:r>
         <w:rPr>
+          <w:b/>
           <w:lang w:val="es-ES"/>
         </w:rPr>
         <w:t xml:space="preserve">Necesito que cuando presione el botón ir al </w:t>
@@ -6433,6 +6434,7 @@
       <w:proofErr w:type="spellStart"/>
       <w:r>
         <w:rPr>
+          <w:b/>
           <w:lang w:val="es-ES"/>
         </w:rPr>
         <w:t>modulo</w:t>
@@ -6440,25 +6442,35 @@
       <w:proofErr w:type="spellEnd"/>
       <w:r>
         <w:rPr>
-          <w:lang w:val="es-ES"/>
-        </w:rPr>
-        <w:t xml:space="preserve"> en la card de Asistencias, me tome la materia y curso actual del horario y que solo el sistema me lleve a la vista de asistencia en la cual se registra la asistencia de ese curso, eso debe suceder si estoy en el horario de alguna materia, sino que me muestre un modal diciendo que no hay cursos activos según mi horario para registrar asistencia, y que si deseo hacer un registro fuera de horario que me dirija al menú de Actividad áulica, opción tomar asistencia.</w:t>
-      </w:r>
-    </w:p>
-    <w:p>
-      <w:pPr>
-        <w:rPr>
-          <w:lang w:val="es-ES"/>
-        </w:rPr>
-      </w:pPr>
-      <w:r>
-        <w:rPr>
+          <w:b/>
+          <w:lang w:val="es-ES"/>
+        </w:rPr>
+        <w:t xml:space="preserve"> en la card de Asistencias, me tome la materia y curso actual del horario y que solo el sistema me lleve a la vista de asistencia en la cual se registra la asistencia de ese curso, eso debe suceder si estoy en el horario de alguna materia</w:t>
+      </w:r>
+      <w:r>
+        <w:rPr>
+          <w:lang w:val="es-ES"/>
+        </w:rPr>
+        <w:t>, sino que me muestre un modal diciendo que no hay cursos activos según mi horario para registrar asistencia, y que si deseo hacer un registro fuera de horario que me dirija al menú de Actividad áulica, opción tomar asistencia.</w:t>
+      </w:r>
+    </w:p>
+    <w:p>
+      <w:pPr>
+        <w:rPr>
+          <w:b/>
+          <w:lang w:val="es-ES"/>
+        </w:rPr>
+      </w:pPr>
+      <w:r>
+        <w:rPr>
+          <w:b/>
           <w:lang w:val="es-ES"/>
         </w:rPr>
         <w:t>Necesito</w:t>
       </w:r>
       <w:r>
         <w:rPr>
+          <w:b/>
           <w:lang w:val="es-ES"/>
         </w:rPr>
         <w:t xml:space="preserve"> reformar el </w:t>
@@ -6466,6 +6478,7 @@
       <w:proofErr w:type="spellStart"/>
       <w:r>
         <w:rPr>
+          <w:b/>
           <w:lang w:val="es-ES"/>
         </w:rPr>
         <w:t>modulo</w:t>
@@ -6473,6 +6486,7 @@
       <w:proofErr w:type="spellEnd"/>
       <w:r>
         <w:rPr>
+          <w:b/>
           <w:lang w:val="es-ES"/>
         </w:rPr>
         <w:t xml:space="preserve"> de Actividades del menú Material </w:t>
@@ -6480,6 +6494,7 @@
       <w:proofErr w:type="spellStart"/>
       <w:r>
         <w:rPr>
+          <w:b/>
           <w:lang w:val="es-ES"/>
         </w:rPr>
         <w:t>Pedagogico</w:t>
@@ -6487,6 +6502,7 @@
       <w:proofErr w:type="spellEnd"/>
       <w:r>
         <w:rPr>
+          <w:b/>
           <w:lang w:val="es-ES"/>
         </w:rPr>
         <w:t xml:space="preserve">, quiero que cuando le hago </w:t>
@@ -6494,6 +6510,7 @@
       <w:proofErr w:type="spellStart"/>
       <w:r>
         <w:rPr>
+          <w:b/>
           <w:lang w:val="es-ES"/>
         </w:rPr>
         <w:t>click</w:t>
@@ -6501,73 +6518,85 @@
       <w:proofErr w:type="spellEnd"/>
       <w:r>
         <w:rPr>
+          <w:b/>
           <w:lang w:val="es-ES"/>
         </w:rPr>
         <w:t xml:space="preserve"> a Actividades, </w:t>
       </w:r>
       <w:r>
         <w:rPr>
+          <w:b/>
           <w:lang w:val="es-ES"/>
         </w:rPr>
         <w:t xml:space="preserve"> </w:t>
       </w:r>
       <w:r>
         <w:rPr>
+          <w:b/>
           <w:lang w:val="es-ES"/>
         </w:rPr>
         <w:t>me p</w:t>
       </w:r>
       <w:r>
         <w:rPr>
+          <w:b/>
           <w:lang w:val="es-ES"/>
         </w:rPr>
         <w:t xml:space="preserve">ermita </w:t>
       </w:r>
       <w:r>
         <w:rPr>
+          <w:b/>
           <w:lang w:val="es-ES"/>
         </w:rPr>
         <w:t>Seleccionar la Materia</w:t>
       </w:r>
       <w:r>
         <w:rPr>
-          <w:lang w:val="es-ES"/>
-        </w:rPr>
-        <w:t xml:space="preserve"> para filtrar las actividades por todas, o por materia y me las muestre automáticamente en la lista como ahora pero de esa </w:t>
-      </w:r>
-      <w:r>
-        <w:rPr>
+          <w:b/>
+          <w:lang w:val="es-ES"/>
+        </w:rPr>
+        <w:t xml:space="preserve"> para filtrar las actividades por todas, o por materia y me las muestre automáticamente en la lista como </w:t>
+      </w:r>
+      <w:r>
+        <w:rPr>
+          <w:b/>
           <w:lang w:val="es-ES"/>
         </w:rPr>
         <w:lastRenderedPageBreak/>
-        <w:t>materia filtrada</w:t>
-      </w:r>
-      <w:r>
-        <w:rPr>
+        <w:t>ahora pero de esa materia filtrada</w:t>
+      </w:r>
+      <w:r>
+        <w:rPr>
+          <w:b/>
           <w:lang w:val="es-ES"/>
         </w:rPr>
         <w:t>. Que se mantenga el botón nueva actividad , y que al presionarlo</w:t>
       </w:r>
       <w:r>
         <w:rPr>
+          <w:b/>
           <w:lang w:val="es-ES"/>
         </w:rPr>
         <w:t xml:space="preserve"> haga lo mismo que hasta ahora,</w:t>
       </w:r>
       <w:r>
         <w:rPr>
+          <w:b/>
           <w:lang w:val="es-ES"/>
         </w:rPr>
         <w:t xml:space="preserve"> que </w:t>
       </w:r>
       <w:r>
         <w:rPr>
+          <w:b/>
           <w:lang w:val="es-ES"/>
         </w:rPr>
         <w:t xml:space="preserve">me modifiques la vista </w:t>
       </w:r>
       <w:r>
         <w:rPr>
+          <w:b/>
           <w:lang w:val="es-ES"/>
         </w:rPr>
         <w:t xml:space="preserve">, Primero que aparezca Numero de Unidad, (requerido), luego el Tema, que se elija de los contenidos como ahora, también (requerido), , luego el Tipo de actividad (Requerido), que me permita ingresar el Numero de Actividad, y elegir un sub tema de los subtemas disponibles, a continuación que me permita ingresar un numero de </w:t>
@@ -6575,6 +6604,7 @@
       <w:proofErr w:type="spellStart"/>
       <w:r>
         <w:rPr>
+          <w:b/>
           <w:lang w:val="es-ES"/>
         </w:rPr>
         <w:t>Item</w:t>
@@ -6582,6 +6612,7 @@
       <w:proofErr w:type="spellEnd"/>
       <w:r>
         <w:rPr>
+          <w:b/>
           <w:lang w:val="es-ES"/>
         </w:rPr>
         <w:t xml:space="preserve"> (pregunta), y su texto correspondiente, y que me los valla completando en una tabla de preguntas, debajo de la tabla que me muestre los botones uno que me permita agregar otra consigna, y otro que me permita guardar la información. Mantenemos la fecha de </w:t>
@@ -6589,6 +6620,7 @@
       <w:proofErr w:type="spellStart"/>
       <w:r>
         <w:rPr>
+          <w:b/>
           <w:lang w:val="es-ES"/>
         </w:rPr>
         <w:t>cracion</w:t>
@@ -6596,12 +6628,14 @@
       <w:proofErr w:type="spellEnd"/>
       <w:r>
         <w:rPr>
+          <w:b/>
           <w:lang w:val="es-ES"/>
         </w:rPr>
         <w:t xml:space="preserve"> de la actividad, sacamos de esta tabla la fecha de inicio, y la fecha de entrega</w:t>
       </w:r>
       <w:r>
         <w:rPr>
+          <w:b/>
           <w:lang w:val="es-ES"/>
         </w:rPr>
         <w:t xml:space="preserve"> / finalización de la actividad, sacamos también la asignación del curso, y mantenemos las Observaciones (opcionales).</w:t>
@@ -6613,8 +6647,10 @@
           <w:lang w:val="es-ES"/>
         </w:rPr>
       </w:pPr>
-      <w:r>
-        <w:rPr>
+      <w:bookmarkStart w:id="0" w:name="_GoBack"/>
+      <w:r>
+        <w:rPr>
+          <w:b/>
           <w:lang w:val="es-ES"/>
         </w:rPr>
         <w:t xml:space="preserve">Sacamos de este </w:t>
@@ -6622,6 +6658,7 @@
       <w:proofErr w:type="spellStart"/>
       <w:r>
         <w:rPr>
+          <w:b/>
           <w:lang w:val="es-ES"/>
         </w:rPr>
         <w:t>modulo</w:t>
@@ -6629,6 +6666,7 @@
       <w:proofErr w:type="spellEnd"/>
       <w:r>
         <w:rPr>
+          <w:b/>
           <w:lang w:val="es-ES"/>
         </w:rPr>
         <w:t xml:space="preserve"> la asignación de modalidad individual/grupal y la pasamos al </w:t>
@@ -6636,6 +6674,7 @@
       <w:proofErr w:type="spellStart"/>
       <w:r>
         <w:rPr>
+          <w:b/>
           <w:lang w:val="es-ES"/>
         </w:rPr>
         <w:t>modulo</w:t>
@@ -6643,6 +6682,7 @@
       <w:proofErr w:type="spellEnd"/>
       <w:r>
         <w:rPr>
+          <w:b/>
           <w:lang w:val="es-ES"/>
         </w:rPr>
         <w:t xml:space="preserve"> de asignación de actividades, junto a la fecha de inicio de la actividad y a la fecha de </w:t>
@@ -6650,6 +6690,7 @@
       <w:proofErr w:type="spellStart"/>
       <w:r>
         <w:rPr>
+          <w:b/>
           <w:lang w:val="es-ES"/>
         </w:rPr>
         <w:t>finalizacion</w:t>
@@ -6657,6 +6698,7 @@
       <w:proofErr w:type="spellEnd"/>
       <w:r>
         <w:rPr>
+          <w:b/>
           <w:lang w:val="es-ES"/>
         </w:rPr>
         <w:t xml:space="preserve">. Necesito me crees en el </w:t>
@@ -6664,6 +6706,7 @@
       <w:proofErr w:type="spellStart"/>
       <w:r>
         <w:rPr>
+          <w:b/>
           <w:lang w:val="es-ES"/>
         </w:rPr>
         <w:t>menu</w:t>
@@ -6671,6 +6714,7 @@
       <w:proofErr w:type="spellEnd"/>
       <w:r>
         <w:rPr>
+          <w:b/>
           <w:lang w:val="es-ES"/>
         </w:rPr>
         <w:t xml:space="preserve"> de Material </w:t>
@@ -6678,6 +6722,7 @@
       <w:proofErr w:type="spellStart"/>
       <w:r>
         <w:rPr>
+          <w:b/>
           <w:lang w:val="es-ES"/>
         </w:rPr>
         <w:t>Pedagogico</w:t>
@@ -6685,6 +6730,7 @@
       <w:proofErr w:type="spellEnd"/>
       <w:r>
         <w:rPr>
+          <w:b/>
           <w:lang w:val="es-ES"/>
         </w:rPr>
         <w:t xml:space="preserve">, una opción que me permita Asignar actividades, que al hacerle </w:t>
@@ -6692,6 +6738,7 @@
       <w:proofErr w:type="spellStart"/>
       <w:r>
         <w:rPr>
+          <w:b/>
           <w:lang w:val="es-ES"/>
         </w:rPr>
         <w:t>click</w:t>
@@ -6699,6 +6746,7 @@
       <w:proofErr w:type="spellEnd"/>
       <w:r>
         <w:rPr>
+          <w:b/>
           <w:lang w:val="es-ES"/>
         </w:rPr>
         <w:t xml:space="preserve"> me pida seleccionar el Año y el curso de listas, y la Materia, que al seleccionar la materia, me despliegue una tabla con las Actividades cargadas en el sistema y que me habilite un botón asignar actividad, que al presionarlo me guarde toda la información de la asignación de la actividad.</w:t>
@@ -6707,10 +6755,159 @@
         <w:rPr>
           <w:lang w:val="es-ES"/>
         </w:rPr>
-        <w:t xml:space="preserve"> Para después mostrarla en actividades asignadas como hasta ahora.</w:t>
-      </w:r>
-      <w:bookmarkStart w:id="0" w:name="_GoBack"/>
+        <w:t xml:space="preserve"> </w:t>
+      </w:r>
       <w:bookmarkEnd w:id="0"/>
+      <w:r>
+        <w:rPr>
+          <w:lang w:val="es-ES"/>
+        </w:rPr>
+        <w:t>Para después mostrarla en actividades asignadas como hasta ahora.</w:t>
+      </w:r>
+    </w:p>
+    <w:p>
+      <w:pPr>
+        <w:rPr>
+          <w:lang w:val="es-ES"/>
+        </w:rPr>
+      </w:pPr>
+      <w:r>
+        <w:rPr>
+          <w:lang w:val="es-ES"/>
+        </w:rPr>
+        <w:t xml:space="preserve">Ahora necesito que cuando </w:t>
+      </w:r>
+      <w:r>
+        <w:rPr>
+          <w:lang w:val="es-ES"/>
+        </w:rPr>
+        <w:t xml:space="preserve">entro al menú actividad áulica, opción Actividades asignadas, elijo materia como hasta ahora, elijo curso, doy siguiente y me muestre en los </w:t>
+      </w:r>
+      <w:proofErr w:type="spellStart"/>
+      <w:r>
+        <w:rPr>
+          <w:lang w:val="es-ES"/>
+        </w:rPr>
+        <w:t>cards</w:t>
+      </w:r>
+      <w:proofErr w:type="spellEnd"/>
+      <w:r>
+        <w:rPr>
+          <w:lang w:val="es-ES"/>
+        </w:rPr>
+        <w:t xml:space="preserve"> los datos de las actividades asignadas, y si le hago </w:t>
+      </w:r>
+      <w:proofErr w:type="spellStart"/>
+      <w:r>
+        <w:rPr>
+          <w:lang w:val="es-ES"/>
+        </w:rPr>
+        <w:t>click</w:t>
+      </w:r>
+      <w:proofErr w:type="spellEnd"/>
+      <w:r>
+        <w:rPr>
+          <w:lang w:val="es-ES"/>
+        </w:rPr>
+        <w:t xml:space="preserve"> en el ítem que me habrá la actividad correspondiente con sus preguntas y demás datos de asignación correspondientes.</w:t>
+      </w:r>
+    </w:p>
+    <w:p>
+      <w:pPr>
+        <w:rPr>
+          <w:lang w:val="es-ES"/>
+        </w:rPr>
+      </w:pPr>
+      <w:r>
+        <w:rPr>
+          <w:lang w:val="es-ES"/>
+        </w:rPr>
+        <w:t xml:space="preserve">Necesito que en función de la cantidad de clases que se </w:t>
+      </w:r>
+      <w:proofErr w:type="spellStart"/>
+      <w:r>
+        <w:rPr>
+          <w:lang w:val="es-ES"/>
+        </w:rPr>
+        <w:t>calculo</w:t>
+      </w:r>
+      <w:proofErr w:type="spellEnd"/>
+      <w:r>
+        <w:rPr>
+          <w:lang w:val="es-ES"/>
+        </w:rPr>
+        <w:t xml:space="preserve"> y registro para cada materia en el momento de cargar la materia al sistema, cuando me muestre la vista del listado de asistencias, me calcule, muestre y </w:t>
+      </w:r>
+      <w:proofErr w:type="spellStart"/>
+      <w:r>
+        <w:rPr>
+          <w:lang w:val="es-ES"/>
+        </w:rPr>
+        <w:t>actualize</w:t>
+      </w:r>
+      <w:proofErr w:type="spellEnd"/>
+      <w:r>
+        <w:rPr>
+          <w:lang w:val="es-ES"/>
+        </w:rPr>
+        <w:t xml:space="preserve"> en el alumno el campo Porcentaje de Asistencia, para eso debemos agregar el campo a la tabla de asistencia, </w:t>
+      </w:r>
+      <w:proofErr w:type="spellStart"/>
+      <w:r>
+        <w:rPr>
+          <w:lang w:val="es-ES"/>
+        </w:rPr>
+        <w:t>tene</w:t>
+      </w:r>
+      <w:proofErr w:type="spellEnd"/>
+      <w:r>
+        <w:rPr>
+          <w:lang w:val="es-ES"/>
+        </w:rPr>
+        <w:t xml:space="preserve"> en cuenta que a medida que voy registrando nuevas asistencias, el valor del porcentaje tiene que cambiar actualizando su valor. Cuando el sistema me muestre el listado de estudiantes, necesito que el mismo verifique el porcentaje que tiene guardado en el estudiante, contra un porcentaje determinado en la materia, si es superior a ese porcentaje que me muestre el estudiante pintado en blanco como ahora, si </w:t>
+      </w:r>
+      <w:proofErr w:type="spellStart"/>
+      <w:r>
+        <w:rPr>
+          <w:lang w:val="es-ES"/>
+        </w:rPr>
+        <w:t>esta</w:t>
+      </w:r>
+      <w:proofErr w:type="spellEnd"/>
+      <w:r>
+        <w:rPr>
+          <w:lang w:val="es-ES"/>
+        </w:rPr>
+        <w:t xml:space="preserve"> cerca de </w:t>
+      </w:r>
+      <w:proofErr w:type="spellStart"/>
+      <w:r>
+        <w:rPr>
+          <w:lang w:val="es-ES"/>
+        </w:rPr>
+        <w:t>pasarce</w:t>
+      </w:r>
+      <w:proofErr w:type="spellEnd"/>
+      <w:r>
+        <w:rPr>
+          <w:lang w:val="es-ES"/>
+        </w:rPr>
+        <w:t xml:space="preserve"> del porcentaje por 1 o dos faltas que se ponga amarillo, si le queda una falta, naranja y si se </w:t>
+      </w:r>
+      <w:proofErr w:type="spellStart"/>
+      <w:r>
+        <w:rPr>
+          <w:lang w:val="es-ES"/>
+        </w:rPr>
+        <w:t>paso</w:t>
+      </w:r>
+      <w:proofErr w:type="spellEnd"/>
+      <w:r>
+        <w:rPr>
+          <w:lang w:val="es-ES"/>
+        </w:rPr>
+        <w:t xml:space="preserve"> que me lo muestre en rojo.</w:t>
+      </w:r>
     </w:p>
     <w:p>
       <w:pPr>
@@ -10629,7 +10826,7 @@
 </file>
 
 <file path=customXml/itemProps1.xml><?xml version="1.0" encoding="utf-8"?>
-<ds:datastoreItem xmlns:ds="http://schemas.openxmlformats.org/officeDocument/2006/customXml" ds:itemID="{C3BA27FE-02F8-4E9D-B5AE-6106D10B4400}">
+<ds:datastoreItem xmlns:ds="http://schemas.openxmlformats.org/officeDocument/2006/customXml" ds:itemID="{2F4ED029-C5E3-4E12-8664-241EC1FBE695}">
   <ds:schemaRefs>
     <ds:schemaRef ds:uri="http://schemas.openxmlformats.org/officeDocument/2006/bibliography"/>
   </ds:schemaRefs>

</xml_diff>

<commit_message>
Se agrega porcentaje de asistencias, y asignacion de actividades al curso y materia
</commit_message>
<xml_diff>
--- a/requerimientos.docx
+++ b/requerimientos.docx
@@ -6647,280 +6647,309 @@
           <w:lang w:val="es-ES"/>
         </w:rPr>
       </w:pPr>
+      <w:r>
+        <w:rPr>
+          <w:b/>
+          <w:lang w:val="es-ES"/>
+        </w:rPr>
+        <w:t xml:space="preserve">Sacamos de este </w:t>
+      </w:r>
+      <w:proofErr w:type="spellStart"/>
+      <w:r>
+        <w:rPr>
+          <w:b/>
+          <w:lang w:val="es-ES"/>
+        </w:rPr>
+        <w:t>modulo</w:t>
+      </w:r>
+      <w:proofErr w:type="spellEnd"/>
+      <w:r>
+        <w:rPr>
+          <w:b/>
+          <w:lang w:val="es-ES"/>
+        </w:rPr>
+        <w:t xml:space="preserve"> la asignación de modalidad individual/grupal y la pasamos al </w:t>
+      </w:r>
+      <w:proofErr w:type="spellStart"/>
+      <w:r>
+        <w:rPr>
+          <w:b/>
+          <w:lang w:val="es-ES"/>
+        </w:rPr>
+        <w:t>modulo</w:t>
+      </w:r>
+      <w:proofErr w:type="spellEnd"/>
+      <w:r>
+        <w:rPr>
+          <w:b/>
+          <w:lang w:val="es-ES"/>
+        </w:rPr>
+        <w:t xml:space="preserve"> de asignación de actividades, junto a la fecha de inicio de la actividad y a la fecha de </w:t>
+      </w:r>
+      <w:proofErr w:type="spellStart"/>
+      <w:r>
+        <w:rPr>
+          <w:b/>
+          <w:lang w:val="es-ES"/>
+        </w:rPr>
+        <w:t>finalizacion</w:t>
+      </w:r>
+      <w:proofErr w:type="spellEnd"/>
+      <w:r>
+        <w:rPr>
+          <w:b/>
+          <w:lang w:val="es-ES"/>
+        </w:rPr>
+        <w:t xml:space="preserve">. Necesito me crees en el </w:t>
+      </w:r>
+      <w:proofErr w:type="spellStart"/>
+      <w:r>
+        <w:rPr>
+          <w:b/>
+          <w:lang w:val="es-ES"/>
+        </w:rPr>
+        <w:t>menu</w:t>
+      </w:r>
+      <w:proofErr w:type="spellEnd"/>
+      <w:r>
+        <w:rPr>
+          <w:b/>
+          <w:lang w:val="es-ES"/>
+        </w:rPr>
+        <w:t xml:space="preserve"> de Material </w:t>
+      </w:r>
+      <w:proofErr w:type="spellStart"/>
+      <w:r>
+        <w:rPr>
+          <w:b/>
+          <w:lang w:val="es-ES"/>
+        </w:rPr>
+        <w:t>Pedagogico</w:t>
+      </w:r>
+      <w:proofErr w:type="spellEnd"/>
+      <w:r>
+        <w:rPr>
+          <w:b/>
+          <w:lang w:val="es-ES"/>
+        </w:rPr>
+        <w:t xml:space="preserve">, una opción que me permita Asignar actividades, que al hacerle </w:t>
+      </w:r>
+      <w:proofErr w:type="spellStart"/>
+      <w:r>
+        <w:rPr>
+          <w:b/>
+          <w:lang w:val="es-ES"/>
+        </w:rPr>
+        <w:t>click</w:t>
+      </w:r>
+      <w:proofErr w:type="spellEnd"/>
+      <w:r>
+        <w:rPr>
+          <w:b/>
+          <w:lang w:val="es-ES"/>
+        </w:rPr>
+        <w:t xml:space="preserve"> me pida seleccionar el Año y el curso de listas, y la Materia, que al seleccionar la materia, me despliegue una tabla con las Actividades cargadas en el sistema y que me habilite un botón asignar actividad, que al presionarlo me guarde toda la información de la asignación de la actividad.</w:t>
+      </w:r>
+      <w:r>
+        <w:rPr>
+          <w:lang w:val="es-ES"/>
+        </w:rPr>
+        <w:t xml:space="preserve"> Para después mostrarla en actividades asignadas como hasta ahora.</w:t>
+      </w:r>
+    </w:p>
+    <w:p>
+      <w:pPr>
+        <w:rPr>
+          <w:b/>
+          <w:lang w:val="es-ES"/>
+        </w:rPr>
+      </w:pPr>
+      <w:r>
+        <w:rPr>
+          <w:b/>
+          <w:lang w:val="es-ES"/>
+        </w:rPr>
+        <w:t xml:space="preserve">Ahora necesito que cuando </w:t>
+      </w:r>
+      <w:r>
+        <w:rPr>
+          <w:b/>
+          <w:lang w:val="es-ES"/>
+        </w:rPr>
+        <w:t xml:space="preserve">entro al menú actividad áulica, opción Actividades asignadas, elijo materia como hasta ahora, elijo curso, doy siguiente y me muestre en los </w:t>
+      </w:r>
+      <w:proofErr w:type="spellStart"/>
+      <w:r>
+        <w:rPr>
+          <w:b/>
+          <w:lang w:val="es-ES"/>
+        </w:rPr>
+        <w:t>cards</w:t>
+      </w:r>
+      <w:proofErr w:type="spellEnd"/>
+      <w:r>
+        <w:rPr>
+          <w:b/>
+          <w:lang w:val="es-ES"/>
+        </w:rPr>
+        <w:t xml:space="preserve"> los datos de las actividades asignadas, y si le hago </w:t>
+      </w:r>
+      <w:proofErr w:type="spellStart"/>
+      <w:r>
+        <w:rPr>
+          <w:b/>
+          <w:lang w:val="es-ES"/>
+        </w:rPr>
+        <w:t>click</w:t>
+      </w:r>
+      <w:proofErr w:type="spellEnd"/>
+      <w:r>
+        <w:rPr>
+          <w:b/>
+          <w:lang w:val="es-ES"/>
+        </w:rPr>
+        <w:t xml:space="preserve"> en el ítem que me habrá la actividad correspondiente con sus preguntas y demás datos de asignación correspondientes.</w:t>
+      </w:r>
+    </w:p>
+    <w:p>
+      <w:pPr>
+        <w:rPr>
+          <w:b/>
+          <w:lang w:val="es-ES"/>
+        </w:rPr>
+      </w:pPr>
+      <w:r>
+        <w:rPr>
+          <w:b/>
+          <w:lang w:val="es-ES"/>
+        </w:rPr>
+        <w:t xml:space="preserve">Necesito que en función de la cantidad de clases que se </w:t>
+      </w:r>
+      <w:proofErr w:type="spellStart"/>
+      <w:r>
+        <w:rPr>
+          <w:b/>
+          <w:lang w:val="es-ES"/>
+        </w:rPr>
+        <w:t>calculo</w:t>
+      </w:r>
+      <w:proofErr w:type="spellEnd"/>
+      <w:r>
+        <w:rPr>
+          <w:b/>
+          <w:lang w:val="es-ES"/>
+        </w:rPr>
+        <w:t xml:space="preserve"> y registro para cada materia en el momento de cargar la materia al sistema, cuando me muestre la vista del listado de asistencias, me calcule, muestre y </w:t>
+      </w:r>
+      <w:proofErr w:type="spellStart"/>
+      <w:r>
+        <w:rPr>
+          <w:b/>
+          <w:lang w:val="es-ES"/>
+        </w:rPr>
+        <w:t>actualize</w:t>
+      </w:r>
+      <w:proofErr w:type="spellEnd"/>
+      <w:r>
+        <w:rPr>
+          <w:b/>
+          <w:lang w:val="es-ES"/>
+        </w:rPr>
+        <w:t xml:space="preserve"> en el alumno el campo Porcentaje de Asistencia, para eso debemos agregar el campo a la tabla de asistencia, </w:t>
+      </w:r>
+      <w:proofErr w:type="spellStart"/>
+      <w:r>
+        <w:rPr>
+          <w:b/>
+          <w:lang w:val="es-ES"/>
+        </w:rPr>
+        <w:t>tene</w:t>
+      </w:r>
+      <w:proofErr w:type="spellEnd"/>
+      <w:r>
+        <w:rPr>
+          <w:b/>
+          <w:lang w:val="es-ES"/>
+        </w:rPr>
+        <w:t xml:space="preserve"> en cuenta que a medida que voy registrando nuevas asistencias, el valor del porcentaje tiene que cambiar actualizando su valor. Cuando el sistema me muestre el listado de estudiantes, necesito que el mismo verifique el porcentaje que tiene guardado en el estudiante, contra un porcentaje determinado en la materia, si es superior a ese porcentaje que me muestre el estudiante pintado en blanco como ahora, </w:t>
+      </w:r>
+      <w:r>
+        <w:rPr>
+          <w:lang w:val="es-ES"/>
+        </w:rPr>
+        <w:t xml:space="preserve">si </w:t>
+      </w:r>
+      <w:proofErr w:type="spellStart"/>
+      <w:r>
+        <w:rPr>
+          <w:lang w:val="es-ES"/>
+        </w:rPr>
+        <w:t>esta</w:t>
+      </w:r>
+      <w:proofErr w:type="spellEnd"/>
+      <w:r>
+        <w:rPr>
+          <w:lang w:val="es-ES"/>
+        </w:rPr>
+        <w:t xml:space="preserve"> cerca de </w:t>
+      </w:r>
+      <w:r>
+        <w:rPr>
+          <w:lang w:val="es-ES"/>
+        </w:rPr>
+        <w:t>pasarse</w:t>
+      </w:r>
+      <w:r>
+        <w:rPr>
+          <w:lang w:val="es-ES"/>
+        </w:rPr>
+        <w:t xml:space="preserve"> del porcentaje por 1 o dos faltas que se ponga amarillo, si le queda una falta, naranja y</w:t>
+      </w:r>
+      <w:r>
+        <w:rPr>
+          <w:b/>
+          <w:lang w:val="es-ES"/>
+        </w:rPr>
+        <w:t xml:space="preserve"> si se </w:t>
+      </w:r>
+      <w:proofErr w:type="spellStart"/>
+      <w:r>
+        <w:rPr>
+          <w:b/>
+          <w:lang w:val="es-ES"/>
+        </w:rPr>
+        <w:t>paso</w:t>
+      </w:r>
+      <w:proofErr w:type="spellEnd"/>
+      <w:r>
+        <w:rPr>
+          <w:b/>
+          <w:lang w:val="es-ES"/>
+        </w:rPr>
+        <w:t xml:space="preserve"> que me lo muestre en rojo.</w:t>
+      </w:r>
+    </w:p>
+    <w:p>
+      <w:pPr>
+        <w:rPr>
+          <w:lang w:val="es-ES"/>
+        </w:rPr>
+      </w:pPr>
+    </w:p>
+    <w:p>
+      <w:pPr>
+        <w:rPr>
+          <w:lang w:val="es-ES"/>
+        </w:rPr>
+      </w:pPr>
+      <w:r>
+        <w:rPr>
+          <w:lang w:val="es-ES"/>
+        </w:rPr>
+        <w:t>Necesito Generar Prenotas</w:t>
+      </w:r>
       <w:bookmarkStart w:id="0" w:name="_GoBack"/>
-      <w:r>
-        <w:rPr>
-          <w:b/>
-          <w:lang w:val="es-ES"/>
-        </w:rPr>
-        <w:t xml:space="preserve">Sacamos de este </w:t>
-      </w:r>
-      <w:proofErr w:type="spellStart"/>
-      <w:r>
-        <w:rPr>
-          <w:b/>
-          <w:lang w:val="es-ES"/>
-        </w:rPr>
-        <w:t>modulo</w:t>
-      </w:r>
-      <w:proofErr w:type="spellEnd"/>
-      <w:r>
-        <w:rPr>
-          <w:b/>
-          <w:lang w:val="es-ES"/>
-        </w:rPr>
-        <w:t xml:space="preserve"> la asignación de modalidad individual/grupal y la pasamos al </w:t>
-      </w:r>
-      <w:proofErr w:type="spellStart"/>
-      <w:r>
-        <w:rPr>
-          <w:b/>
-          <w:lang w:val="es-ES"/>
-        </w:rPr>
-        <w:t>modulo</w:t>
-      </w:r>
-      <w:proofErr w:type="spellEnd"/>
-      <w:r>
-        <w:rPr>
-          <w:b/>
-          <w:lang w:val="es-ES"/>
-        </w:rPr>
-        <w:t xml:space="preserve"> de asignación de actividades, junto a la fecha de inicio de la actividad y a la fecha de </w:t>
-      </w:r>
-      <w:proofErr w:type="spellStart"/>
-      <w:r>
-        <w:rPr>
-          <w:b/>
-          <w:lang w:val="es-ES"/>
-        </w:rPr>
-        <w:t>finalizacion</w:t>
-      </w:r>
-      <w:proofErr w:type="spellEnd"/>
-      <w:r>
-        <w:rPr>
-          <w:b/>
-          <w:lang w:val="es-ES"/>
-        </w:rPr>
-        <w:t xml:space="preserve">. Necesito me crees en el </w:t>
-      </w:r>
-      <w:proofErr w:type="spellStart"/>
-      <w:r>
-        <w:rPr>
-          <w:b/>
-          <w:lang w:val="es-ES"/>
-        </w:rPr>
-        <w:t>menu</w:t>
-      </w:r>
-      <w:proofErr w:type="spellEnd"/>
-      <w:r>
-        <w:rPr>
-          <w:b/>
-          <w:lang w:val="es-ES"/>
-        </w:rPr>
-        <w:t xml:space="preserve"> de Material </w:t>
-      </w:r>
-      <w:proofErr w:type="spellStart"/>
-      <w:r>
-        <w:rPr>
-          <w:b/>
-          <w:lang w:val="es-ES"/>
-        </w:rPr>
-        <w:t>Pedagogico</w:t>
-      </w:r>
-      <w:proofErr w:type="spellEnd"/>
-      <w:r>
-        <w:rPr>
-          <w:b/>
-          <w:lang w:val="es-ES"/>
-        </w:rPr>
-        <w:t xml:space="preserve">, una opción que me permita Asignar actividades, que al hacerle </w:t>
-      </w:r>
-      <w:proofErr w:type="spellStart"/>
-      <w:r>
-        <w:rPr>
-          <w:b/>
-          <w:lang w:val="es-ES"/>
-        </w:rPr>
-        <w:t>click</w:t>
-      </w:r>
-      <w:proofErr w:type="spellEnd"/>
-      <w:r>
-        <w:rPr>
-          <w:b/>
-          <w:lang w:val="es-ES"/>
-        </w:rPr>
-        <w:t xml:space="preserve"> me pida seleccionar el Año y el curso de listas, y la Materia, que al seleccionar la materia, me despliegue una tabla con las Actividades cargadas en el sistema y que me habilite un botón asignar actividad, que al presionarlo me guarde toda la información de la asignación de la actividad.</w:t>
-      </w:r>
-      <w:r>
-        <w:rPr>
-          <w:lang w:val="es-ES"/>
-        </w:rPr>
-        <w:t xml:space="preserve"> </w:t>
-      </w:r>
       <w:bookmarkEnd w:id="0"/>
-      <w:r>
-        <w:rPr>
-          <w:lang w:val="es-ES"/>
-        </w:rPr>
-        <w:t>Para después mostrarla en actividades asignadas como hasta ahora.</w:t>
-      </w:r>
-    </w:p>
-    <w:p>
-      <w:pPr>
-        <w:rPr>
-          <w:lang w:val="es-ES"/>
-        </w:rPr>
-      </w:pPr>
-      <w:r>
-        <w:rPr>
-          <w:lang w:val="es-ES"/>
-        </w:rPr>
-        <w:t xml:space="preserve">Ahora necesito que cuando </w:t>
-      </w:r>
-      <w:r>
-        <w:rPr>
-          <w:lang w:val="es-ES"/>
-        </w:rPr>
-        <w:t xml:space="preserve">entro al menú actividad áulica, opción Actividades asignadas, elijo materia como hasta ahora, elijo curso, doy siguiente y me muestre en los </w:t>
-      </w:r>
-      <w:proofErr w:type="spellStart"/>
-      <w:r>
-        <w:rPr>
-          <w:lang w:val="es-ES"/>
-        </w:rPr>
-        <w:t>cards</w:t>
-      </w:r>
-      <w:proofErr w:type="spellEnd"/>
-      <w:r>
-        <w:rPr>
-          <w:lang w:val="es-ES"/>
-        </w:rPr>
-        <w:t xml:space="preserve"> los datos de las actividades asignadas, y si le hago </w:t>
-      </w:r>
-      <w:proofErr w:type="spellStart"/>
-      <w:r>
-        <w:rPr>
-          <w:lang w:val="es-ES"/>
-        </w:rPr>
-        <w:t>click</w:t>
-      </w:r>
-      <w:proofErr w:type="spellEnd"/>
-      <w:r>
-        <w:rPr>
-          <w:lang w:val="es-ES"/>
-        </w:rPr>
-        <w:t xml:space="preserve"> en el ítem que me habrá la actividad correspondiente con sus preguntas y demás datos de asignación correspondientes.</w:t>
-      </w:r>
-    </w:p>
-    <w:p>
-      <w:pPr>
-        <w:rPr>
-          <w:lang w:val="es-ES"/>
-        </w:rPr>
-      </w:pPr>
-      <w:r>
-        <w:rPr>
-          <w:lang w:val="es-ES"/>
-        </w:rPr>
-        <w:t xml:space="preserve">Necesito que en función de la cantidad de clases que se </w:t>
-      </w:r>
-      <w:proofErr w:type="spellStart"/>
-      <w:r>
-        <w:rPr>
-          <w:lang w:val="es-ES"/>
-        </w:rPr>
-        <w:t>calculo</w:t>
-      </w:r>
-      <w:proofErr w:type="spellEnd"/>
-      <w:r>
-        <w:rPr>
-          <w:lang w:val="es-ES"/>
-        </w:rPr>
-        <w:t xml:space="preserve"> y registro para cada materia en el momento de cargar la materia al sistema, cuando me muestre la vista del listado de asistencias, me calcule, muestre y </w:t>
-      </w:r>
-      <w:proofErr w:type="spellStart"/>
-      <w:r>
-        <w:rPr>
-          <w:lang w:val="es-ES"/>
-        </w:rPr>
-        <w:t>actualize</w:t>
-      </w:r>
-      <w:proofErr w:type="spellEnd"/>
-      <w:r>
-        <w:rPr>
-          <w:lang w:val="es-ES"/>
-        </w:rPr>
-        <w:t xml:space="preserve"> en el alumno el campo Porcentaje de Asistencia, para eso debemos agregar el campo a la tabla de asistencia, </w:t>
-      </w:r>
-      <w:proofErr w:type="spellStart"/>
-      <w:r>
-        <w:rPr>
-          <w:lang w:val="es-ES"/>
-        </w:rPr>
-        <w:t>tene</w:t>
-      </w:r>
-      <w:proofErr w:type="spellEnd"/>
-      <w:r>
-        <w:rPr>
-          <w:lang w:val="es-ES"/>
-        </w:rPr>
-        <w:t xml:space="preserve"> en cuenta que a medida que voy registrando nuevas asistencias, el valor del porcentaje tiene que cambiar actualizando su valor. Cuando el sistema me muestre el listado de estudiantes, necesito que el mismo verifique el porcentaje que tiene guardado en el estudiante, contra un porcentaje determinado en la materia, si es superior a ese porcentaje que me muestre el estudiante pintado en blanco como ahora, si </w:t>
-      </w:r>
-      <w:proofErr w:type="spellStart"/>
-      <w:r>
-        <w:rPr>
-          <w:lang w:val="es-ES"/>
-        </w:rPr>
-        <w:t>esta</w:t>
-      </w:r>
-      <w:proofErr w:type="spellEnd"/>
-      <w:r>
-        <w:rPr>
-          <w:lang w:val="es-ES"/>
-        </w:rPr>
-        <w:t xml:space="preserve"> cerca de </w:t>
-      </w:r>
-      <w:proofErr w:type="spellStart"/>
-      <w:r>
-        <w:rPr>
-          <w:lang w:val="es-ES"/>
-        </w:rPr>
-        <w:t>pasarce</w:t>
-      </w:r>
-      <w:proofErr w:type="spellEnd"/>
-      <w:r>
-        <w:rPr>
-          <w:lang w:val="es-ES"/>
-        </w:rPr>
-        <w:t xml:space="preserve"> del porcentaje por 1 o dos faltas que se ponga amarillo, si le queda una falta, naranja y si se </w:t>
-      </w:r>
-      <w:proofErr w:type="spellStart"/>
-      <w:r>
-        <w:rPr>
-          <w:lang w:val="es-ES"/>
-        </w:rPr>
-        <w:t>paso</w:t>
-      </w:r>
-      <w:proofErr w:type="spellEnd"/>
-      <w:r>
-        <w:rPr>
-          <w:lang w:val="es-ES"/>
-        </w:rPr>
-        <w:t xml:space="preserve"> que me lo muestre en rojo.</w:t>
-      </w:r>
-    </w:p>
-    <w:p>
-      <w:pPr>
-        <w:rPr>
-          <w:lang w:val="es-ES"/>
-        </w:rPr>
-      </w:pPr>
-      <w:r>
-        <w:rPr>
-          <w:lang w:val="es-ES"/>
-        </w:rPr>
-        <w:t>Necesito Generar Prenotas</w:t>
-      </w:r>
     </w:p>
     <w:p>
       <w:pPr>
@@ -10826,7 +10855,7 @@
 </file>
 
 <file path=customXml/itemProps1.xml><?xml version="1.0" encoding="utf-8"?>
-<ds:datastoreItem xmlns:ds="http://schemas.openxmlformats.org/officeDocument/2006/customXml" ds:itemID="{2F4ED029-C5E3-4E12-8664-241EC1FBE695}">
+<ds:datastoreItem xmlns:ds="http://schemas.openxmlformats.org/officeDocument/2006/customXml" ds:itemID="{6B03DDBE-038F-433A-B252-46540A3ADD3B}">
   <ds:schemaRefs>
     <ds:schemaRef ds:uri="http://schemas.openxmlformats.org/officeDocument/2006/bibliography"/>
   </ds:schemaRefs>

</xml_diff>

<commit_message>
Se agrega funcionalidad de calificacion de tareas asignadasa un curso
</commit_message>
<xml_diff>
--- a/requerimientos.docx
+++ b/requerimientos.docx
@@ -6601,13 +6601,311 @@
         </w:rPr>
         <w:t xml:space="preserve">, Primero que aparezca Numero de Unidad, (requerido), luego el Tema, que se elija de los contenidos como ahora, también (requerido), , luego el Tipo de actividad (Requerido), que me permita ingresar el Numero de Actividad, y elegir un sub tema de los subtemas disponibles, a continuación que me permita ingresar un numero de </w:t>
       </w:r>
+      <w:r>
+        <w:rPr>
+          <w:b/>
+          <w:lang w:val="es-ES"/>
+        </w:rPr>
+        <w:t>Ítem</w:t>
+      </w:r>
+      <w:r>
+        <w:rPr>
+          <w:b/>
+          <w:lang w:val="es-ES"/>
+        </w:rPr>
+        <w:t xml:space="preserve"> (pregunta), y su texto correspondiente, y que me los valla completando en una tabla de preguntas, debajo de la tabla que me muestre los botones uno que me permita agregar otra consigna, y otro que me permita guardar la información. Mantenemos la fecha de </w:t>
+      </w:r>
+      <w:r>
+        <w:rPr>
+          <w:b/>
+          <w:lang w:val="es-ES"/>
+        </w:rPr>
+        <w:t>creación</w:t>
+      </w:r>
+      <w:r>
+        <w:rPr>
+          <w:b/>
+          <w:lang w:val="es-ES"/>
+        </w:rPr>
+        <w:t xml:space="preserve"> de la actividad, sacamos de esta tabla la fecha de inicio, y la fecha de entrega</w:t>
+      </w:r>
+      <w:r>
+        <w:rPr>
+          <w:b/>
+          <w:lang w:val="es-ES"/>
+        </w:rPr>
+        <w:t xml:space="preserve"> / finalización de la actividad, sacamos también la asignación del curso, y mantenemos las Observaciones (opcionales).</w:t>
+      </w:r>
+    </w:p>
+    <w:p>
+      <w:pPr>
+        <w:rPr>
+          <w:lang w:val="es-ES"/>
+        </w:rPr>
+      </w:pPr>
+      <w:r>
+        <w:rPr>
+          <w:b/>
+          <w:lang w:val="es-ES"/>
+        </w:rPr>
+        <w:t xml:space="preserve">Sacamos de este </w:t>
+      </w:r>
+      <w:r>
+        <w:rPr>
+          <w:b/>
+          <w:lang w:val="es-ES"/>
+        </w:rPr>
+        <w:t>módulo</w:t>
+      </w:r>
+      <w:r>
+        <w:rPr>
+          <w:b/>
+          <w:lang w:val="es-ES"/>
+        </w:rPr>
+        <w:t xml:space="preserve"> la asignación de modalidad individual/grupal y la pasamos al </w:t>
+      </w:r>
+      <w:r>
+        <w:rPr>
+          <w:b/>
+          <w:lang w:val="es-ES"/>
+        </w:rPr>
+        <w:t>módulo</w:t>
+      </w:r>
+      <w:r>
+        <w:rPr>
+          <w:b/>
+          <w:lang w:val="es-ES"/>
+        </w:rPr>
+        <w:t xml:space="preserve"> de asignación de actividades, junto a la fecha de inicio de la actividad y a la fecha de </w:t>
+      </w:r>
+      <w:r>
+        <w:rPr>
+          <w:b/>
+          <w:lang w:val="es-ES"/>
+        </w:rPr>
+        <w:t>finalización</w:t>
+      </w:r>
+      <w:r>
+        <w:rPr>
+          <w:b/>
+          <w:lang w:val="es-ES"/>
+        </w:rPr>
+        <w:t xml:space="preserve">. Necesito me crees en el </w:t>
+      </w:r>
+      <w:r>
+        <w:rPr>
+          <w:b/>
+          <w:lang w:val="es-ES"/>
+        </w:rPr>
+        <w:t>menú</w:t>
+      </w:r>
+      <w:r>
+        <w:rPr>
+          <w:b/>
+          <w:lang w:val="es-ES"/>
+        </w:rPr>
+        <w:t xml:space="preserve"> de Material </w:t>
+      </w:r>
+      <w:r>
+        <w:rPr>
+          <w:b/>
+          <w:lang w:val="es-ES"/>
+        </w:rPr>
+        <w:t>Pedagógico</w:t>
+      </w:r>
+      <w:r>
+        <w:rPr>
+          <w:b/>
+          <w:lang w:val="es-ES"/>
+        </w:rPr>
+        <w:t xml:space="preserve">, una opción que me permita Asignar actividades, que al hacerle </w:t>
+      </w:r>
+      <w:r>
+        <w:rPr>
+          <w:b/>
+          <w:lang w:val="es-ES"/>
+        </w:rPr>
+        <w:t>clic</w:t>
+      </w:r>
+      <w:r>
+        <w:rPr>
+          <w:b/>
+          <w:lang w:val="es-ES"/>
+        </w:rPr>
+        <w:t xml:space="preserve"> me pida seleccionar el Año y el curso de listas, y la Materia, que al seleccionar la materia, me despliegue una tabla con las Actividades cargadas en el sistema y que me habilite un botón asignar actividad, que al presionarlo me guarde toda la información de la asignación de la actividad.</w:t>
+      </w:r>
+      <w:r>
+        <w:rPr>
+          <w:lang w:val="es-ES"/>
+        </w:rPr>
+        <w:t xml:space="preserve"> Para después mostrarla en actividades asignadas como hasta ahora.</w:t>
+      </w:r>
+    </w:p>
+    <w:p>
+      <w:pPr>
+        <w:rPr>
+          <w:b/>
+          <w:lang w:val="es-ES"/>
+        </w:rPr>
+      </w:pPr>
+      <w:r>
+        <w:rPr>
+          <w:b/>
+          <w:lang w:val="es-ES"/>
+        </w:rPr>
+        <w:t xml:space="preserve">Ahora necesito que cuando </w:t>
+      </w:r>
+      <w:r>
+        <w:rPr>
+          <w:b/>
+          <w:lang w:val="es-ES"/>
+        </w:rPr>
+        <w:t xml:space="preserve">entro al menú actividad áulica, opción Actividades asignadas, elijo materia como hasta ahora, elijo curso, doy siguiente y me muestre en los cards los datos de las actividades asignadas, y si le hago </w:t>
+      </w:r>
+      <w:r>
+        <w:rPr>
+          <w:b/>
+          <w:lang w:val="es-ES"/>
+        </w:rPr>
+        <w:t>clic</w:t>
+      </w:r>
+      <w:r>
+        <w:rPr>
+          <w:b/>
+          <w:lang w:val="es-ES"/>
+        </w:rPr>
+        <w:t xml:space="preserve"> en el ítem que me habrá la actividad correspondiente con sus preguntas y demás datos de asignación correspondientes.</w:t>
+      </w:r>
+    </w:p>
+    <w:p>
+      <w:pPr>
+        <w:rPr>
+          <w:b/>
+          <w:lang w:val="es-ES"/>
+        </w:rPr>
+      </w:pPr>
+      <w:r>
+        <w:rPr>
+          <w:b/>
+          <w:lang w:val="es-ES"/>
+        </w:rPr>
+        <w:t xml:space="preserve">Necesito que en función de la cantidad de clases que se </w:t>
+      </w:r>
+      <w:r>
+        <w:rPr>
+          <w:b/>
+          <w:lang w:val="es-ES"/>
+        </w:rPr>
+        <w:t>calculó</w:t>
+      </w:r>
+      <w:r>
+        <w:rPr>
+          <w:b/>
+          <w:lang w:val="es-ES"/>
+        </w:rPr>
+        <w:t xml:space="preserve"> y registro para cada materia en el momento de cargar la materia al sistema, cuando me muestre la vista del listado de asistencias, me calcule, muestre y </w:t>
+      </w:r>
+      <w:r>
+        <w:rPr>
+          <w:b/>
+          <w:lang w:val="es-ES"/>
+        </w:rPr>
+        <w:t>actualice</w:t>
+      </w:r>
+      <w:r>
+        <w:rPr>
+          <w:b/>
+          <w:lang w:val="es-ES"/>
+        </w:rPr>
+        <w:t xml:space="preserve"> en el alumno el campo Porcentaje de Asistencia, para eso debemos agregar el campo a la tabla de asistencia, </w:t>
+      </w:r>
+      <w:r>
+        <w:rPr>
+          <w:b/>
+          <w:lang w:val="es-ES"/>
+        </w:rPr>
+        <w:t>tener</w:t>
+      </w:r>
+      <w:r>
+        <w:rPr>
+          <w:b/>
+          <w:lang w:val="es-ES"/>
+        </w:rPr>
+        <w:t xml:space="preserve"> en cuenta que a medida que voy registrando nuevas asistencias, el valor del porcentaje tiene que cambiar actualizando su valor. Cuando el sistema me muestre el listado de estudiantes, necesito que el mismo verifique el porcentaje que tiene guardado en el estudiante, contra un porcentaje determinado en la materia, si es superior a ese porcentaje que me muestre el estudiante pintado en blanco como ahora, </w:t>
+      </w:r>
+      <w:r>
+        <w:rPr>
+          <w:lang w:val="es-ES"/>
+        </w:rPr>
+        <w:t xml:space="preserve">si </w:t>
+      </w:r>
+      <w:r>
+        <w:rPr>
+          <w:lang w:val="es-ES"/>
+        </w:rPr>
+        <w:t>está</w:t>
+      </w:r>
+      <w:r>
+        <w:rPr>
+          <w:lang w:val="es-ES"/>
+        </w:rPr>
+        <w:t xml:space="preserve"> cerca de </w:t>
+      </w:r>
+      <w:r>
+        <w:rPr>
+          <w:lang w:val="es-ES"/>
+        </w:rPr>
+        <w:t>pasarse</w:t>
+      </w:r>
+      <w:r>
+        <w:rPr>
+          <w:lang w:val="es-ES"/>
+        </w:rPr>
+        <w:t xml:space="preserve"> del porcentaje por 1 o dos faltas que se ponga amarillo, si le queda una falta, naranja y</w:t>
+      </w:r>
+      <w:r>
+        <w:rPr>
+          <w:b/>
+          <w:lang w:val="es-ES"/>
+        </w:rPr>
+        <w:t xml:space="preserve"> si se </w:t>
+      </w:r>
+      <w:r>
+        <w:rPr>
+          <w:b/>
+          <w:lang w:val="es-ES"/>
+        </w:rPr>
+        <w:t>pasó</w:t>
+      </w:r>
+      <w:r>
+        <w:rPr>
+          <w:b/>
+          <w:lang w:val="es-ES"/>
+        </w:rPr>
+        <w:t xml:space="preserve"> que me lo muestre en rojo.</w:t>
+      </w:r>
+    </w:p>
+    <w:p>
+      <w:pPr>
+        <w:rPr>
+          <w:b/>
+          <w:lang w:val="es-ES"/>
+        </w:rPr>
+      </w:pPr>
+      <w:r>
+        <w:rPr>
+          <w:b/>
+          <w:lang w:val="es-ES"/>
+        </w:rPr>
+        <w:t xml:space="preserve">Necesito que cuando ingreso al menú actividad áulica, primero que la opción actividades asignadas tenga un iconito como los otros, y que al entrar a la opción Calificar actividades, me pida la materia, el curso, y siguiente, que se fije en la tabla de actividades asignadas y me muestre en un listado de alumnos, las actividades que tiene cada uno y en </w:t>
+      </w:r>
       <w:proofErr w:type="spellStart"/>
       <w:r>
         <w:rPr>
           <w:b/>
           <w:lang w:val="es-ES"/>
         </w:rPr>
-        <w:t>Item</w:t>
+        <w:t>que</w:t>
       </w:r>
       <w:proofErr w:type="spellEnd"/>
       <w:r>
@@ -6615,381 +6913,245 @@
           <w:b/>
           <w:lang w:val="es-ES"/>
         </w:rPr>
-        <w:t xml:space="preserve"> (pregunta), y su texto correspondiente, y que me los valla completando en una tabla de preguntas, debajo de la tabla que me muestre los botones uno que me permita agregar otra consigna, y otro que me permita guardar la información. Mantenemos la fecha de </w:t>
-      </w:r>
-      <w:proofErr w:type="spellStart"/>
-      <w:r>
-        <w:rPr>
-          <w:b/>
-          <w:lang w:val="es-ES"/>
-        </w:rPr>
-        <w:t>cracion</w:t>
-      </w:r>
-      <w:proofErr w:type="spellEnd"/>
-      <w:r>
-        <w:rPr>
-          <w:b/>
-          <w:lang w:val="es-ES"/>
-        </w:rPr>
-        <w:t xml:space="preserve"> de la actividad, sacamos de esta tabla la fecha de inicio, y la fecha de entrega</w:t>
-      </w:r>
-      <w:r>
-        <w:rPr>
-          <w:b/>
-          <w:lang w:val="es-ES"/>
-        </w:rPr>
-        <w:t xml:space="preserve"> / finalización de la actividad, sacamos también la asignación del curso, y mantenemos las Observaciones (opcionales).</w:t>
-      </w:r>
-    </w:p>
-    <w:p>
-      <w:pPr>
-        <w:rPr>
-          <w:lang w:val="es-ES"/>
-        </w:rPr>
-      </w:pPr>
-      <w:r>
-        <w:rPr>
-          <w:b/>
-          <w:lang w:val="es-ES"/>
-        </w:rPr>
-        <w:t xml:space="preserve">Sacamos de este </w:t>
-      </w:r>
-      <w:proofErr w:type="spellStart"/>
-      <w:r>
-        <w:rPr>
-          <w:b/>
-          <w:lang w:val="es-ES"/>
-        </w:rPr>
-        <w:t>modulo</w:t>
-      </w:r>
-      <w:proofErr w:type="spellEnd"/>
-      <w:r>
-        <w:rPr>
-          <w:b/>
-          <w:lang w:val="es-ES"/>
-        </w:rPr>
-        <w:t xml:space="preserve"> la asignación de modalidad individual/grupal y la pasamos al </w:t>
-      </w:r>
-      <w:proofErr w:type="spellStart"/>
-      <w:r>
-        <w:rPr>
-          <w:b/>
-          <w:lang w:val="es-ES"/>
-        </w:rPr>
-        <w:t>modulo</w:t>
-      </w:r>
-      <w:proofErr w:type="spellEnd"/>
-      <w:r>
-        <w:rPr>
-          <w:b/>
-          <w:lang w:val="es-ES"/>
-        </w:rPr>
-        <w:t xml:space="preserve"> de asignación de actividades, junto a la fecha de inicio de la actividad y a la fecha de </w:t>
-      </w:r>
-      <w:proofErr w:type="spellStart"/>
-      <w:r>
-        <w:rPr>
-          <w:b/>
-          <w:lang w:val="es-ES"/>
-        </w:rPr>
-        <w:t>finalizacion</w:t>
-      </w:r>
-      <w:proofErr w:type="spellEnd"/>
-      <w:r>
-        <w:rPr>
-          <w:b/>
-          <w:lang w:val="es-ES"/>
-        </w:rPr>
-        <w:t xml:space="preserve">. Necesito me crees en el </w:t>
-      </w:r>
-      <w:proofErr w:type="spellStart"/>
-      <w:r>
-        <w:rPr>
-          <w:b/>
-          <w:lang w:val="es-ES"/>
-        </w:rPr>
-        <w:t>menu</w:t>
-      </w:r>
-      <w:proofErr w:type="spellEnd"/>
-      <w:r>
-        <w:rPr>
-          <w:b/>
-          <w:lang w:val="es-ES"/>
-        </w:rPr>
-        <w:t xml:space="preserve"> de Material </w:t>
-      </w:r>
-      <w:proofErr w:type="spellStart"/>
-      <w:r>
-        <w:rPr>
-          <w:b/>
-          <w:lang w:val="es-ES"/>
-        </w:rPr>
-        <w:t>Pedagogico</w:t>
-      </w:r>
-      <w:proofErr w:type="spellEnd"/>
-      <w:r>
-        <w:rPr>
-          <w:b/>
-          <w:lang w:val="es-ES"/>
-        </w:rPr>
-        <w:t xml:space="preserve">, una opción que me permita Asignar actividades, que al hacerle </w:t>
-      </w:r>
-      <w:proofErr w:type="spellStart"/>
-      <w:r>
-        <w:rPr>
-          <w:b/>
-          <w:lang w:val="es-ES"/>
-        </w:rPr>
-        <w:t>click</w:t>
-      </w:r>
-      <w:proofErr w:type="spellEnd"/>
-      <w:r>
-        <w:rPr>
-          <w:b/>
-          <w:lang w:val="es-ES"/>
-        </w:rPr>
-        <w:t xml:space="preserve"> me pida seleccionar el Año y el curso de listas, y la Materia, que al seleccionar la materia, me despliegue una tabla con las Actividades cargadas en el sistema y que me habilite un botón asignar actividad, que al presionarlo me guarde toda la información de la asignación de la actividad.</w:t>
-      </w:r>
-      <w:r>
-        <w:rPr>
-          <w:lang w:val="es-ES"/>
-        </w:rPr>
-        <w:t xml:space="preserve"> Para después mostrarla en actividades asignadas como hasta ahora.</w:t>
-      </w:r>
-    </w:p>
-    <w:p>
-      <w:pPr>
-        <w:rPr>
-          <w:b/>
-          <w:lang w:val="es-ES"/>
-        </w:rPr>
-      </w:pPr>
-      <w:r>
-        <w:rPr>
-          <w:b/>
-          <w:lang w:val="es-ES"/>
-        </w:rPr>
-        <w:t xml:space="preserve">Ahora necesito que cuando </w:t>
-      </w:r>
-      <w:r>
-        <w:rPr>
-          <w:b/>
-          <w:lang w:val="es-ES"/>
-        </w:rPr>
-        <w:t xml:space="preserve">entro al menú actividad áulica, opción Actividades asignadas, elijo materia como hasta ahora, elijo curso, doy siguiente y me muestre en los </w:t>
-      </w:r>
-      <w:proofErr w:type="spellStart"/>
-      <w:r>
-        <w:rPr>
-          <w:b/>
-          <w:lang w:val="es-ES"/>
-        </w:rPr>
-        <w:t>cards</w:t>
-      </w:r>
-      <w:proofErr w:type="spellEnd"/>
-      <w:r>
-        <w:rPr>
-          <w:b/>
-          <w:lang w:val="es-ES"/>
-        </w:rPr>
-        <w:t xml:space="preserve"> los datos de las actividades asignadas, y si le hago </w:t>
-      </w:r>
-      <w:proofErr w:type="spellStart"/>
-      <w:r>
-        <w:rPr>
-          <w:b/>
-          <w:lang w:val="es-ES"/>
-        </w:rPr>
-        <w:t>click</w:t>
-      </w:r>
-      <w:proofErr w:type="spellEnd"/>
-      <w:r>
-        <w:rPr>
-          <w:b/>
-          <w:lang w:val="es-ES"/>
-        </w:rPr>
-        <w:t xml:space="preserve"> en el ítem que me habrá la actividad correspondiente con sus preguntas y demás datos de asignación correspondientes.</w:t>
-      </w:r>
-    </w:p>
-    <w:p>
-      <w:pPr>
-        <w:rPr>
-          <w:b/>
-          <w:lang w:val="es-ES"/>
-        </w:rPr>
-      </w:pPr>
-      <w:r>
-        <w:rPr>
-          <w:b/>
-          <w:lang w:val="es-ES"/>
-        </w:rPr>
-        <w:t xml:space="preserve">Necesito que en función de la cantidad de clases que se </w:t>
-      </w:r>
-      <w:proofErr w:type="spellStart"/>
-      <w:r>
-        <w:rPr>
-          <w:b/>
-          <w:lang w:val="es-ES"/>
-        </w:rPr>
-        <w:t>calculo</w:t>
-      </w:r>
-      <w:proofErr w:type="spellEnd"/>
-      <w:r>
-        <w:rPr>
-          <w:b/>
-          <w:lang w:val="es-ES"/>
-        </w:rPr>
-        <w:t xml:space="preserve"> y registro para cada materia en el momento de cargar la materia al sistema, cuando me muestre la vista del listado de asistencias, me calcule, muestre y </w:t>
-      </w:r>
-      <w:proofErr w:type="spellStart"/>
-      <w:r>
-        <w:rPr>
-          <w:b/>
-          <w:lang w:val="es-ES"/>
-        </w:rPr>
-        <w:t>actualize</w:t>
-      </w:r>
-      <w:proofErr w:type="spellEnd"/>
-      <w:r>
-        <w:rPr>
-          <w:b/>
-          <w:lang w:val="es-ES"/>
-        </w:rPr>
-        <w:t xml:space="preserve"> en el alumno el campo Porcentaje de Asistencia, para eso debemos agregar el campo a la tabla de asistencia, </w:t>
-      </w:r>
-      <w:proofErr w:type="spellStart"/>
-      <w:r>
-        <w:rPr>
-          <w:b/>
-          <w:lang w:val="es-ES"/>
-        </w:rPr>
-        <w:t>tene</w:t>
-      </w:r>
-      <w:proofErr w:type="spellEnd"/>
-      <w:r>
-        <w:rPr>
-          <w:b/>
-          <w:lang w:val="es-ES"/>
-        </w:rPr>
-        <w:t xml:space="preserve"> en cuenta que a medida que voy registrando nuevas asistencias, el valor del porcentaje tiene que cambiar actualizando su valor. Cuando el sistema me muestre el listado de estudiantes, necesito que el mismo verifique el porcentaje que tiene guardado en el estudiante, contra un porcentaje determinado en la materia, si es superior a ese porcentaje que me muestre el estudiante pintado en blanco como ahora, </w:t>
-      </w:r>
-      <w:r>
-        <w:rPr>
-          <w:lang w:val="es-ES"/>
-        </w:rPr>
-        <w:t xml:space="preserve">si </w:t>
-      </w:r>
-      <w:proofErr w:type="spellStart"/>
-      <w:r>
-        <w:rPr>
-          <w:lang w:val="es-ES"/>
-        </w:rPr>
-        <w:t>esta</w:t>
-      </w:r>
-      <w:proofErr w:type="spellEnd"/>
-      <w:r>
-        <w:rPr>
-          <w:lang w:val="es-ES"/>
-        </w:rPr>
-        <w:t xml:space="preserve"> cerca de </w:t>
-      </w:r>
-      <w:r>
-        <w:rPr>
-          <w:lang w:val="es-ES"/>
-        </w:rPr>
-        <w:t>pasarse</w:t>
-      </w:r>
-      <w:r>
-        <w:rPr>
-          <w:lang w:val="es-ES"/>
-        </w:rPr>
-        <w:t xml:space="preserve"> del porcentaje por 1 o dos faltas que se ponga amarillo, si le queda una falta, naranja y</w:t>
-      </w:r>
-      <w:r>
-        <w:rPr>
-          <w:b/>
-          <w:lang w:val="es-ES"/>
-        </w:rPr>
-        <w:t xml:space="preserve"> si se </w:t>
-      </w:r>
-      <w:proofErr w:type="spellStart"/>
-      <w:r>
-        <w:rPr>
-          <w:b/>
-          <w:lang w:val="es-ES"/>
-        </w:rPr>
-        <w:t>paso</w:t>
-      </w:r>
-      <w:proofErr w:type="spellEnd"/>
-      <w:r>
-        <w:rPr>
-          <w:b/>
-          <w:lang w:val="es-ES"/>
-        </w:rPr>
-        <w:t xml:space="preserve"> que me lo muestre en rojo.</w:t>
-      </w:r>
-    </w:p>
-    <w:p>
-      <w:pPr>
-        <w:rPr>
-          <w:lang w:val="es-ES"/>
-        </w:rPr>
-      </w:pPr>
-    </w:p>
-    <w:p>
-      <w:pPr>
-        <w:rPr>
-          <w:lang w:val="es-ES"/>
-        </w:rPr>
-      </w:pPr>
-      <w:r>
-        <w:rPr>
-          <w:lang w:val="es-ES"/>
-        </w:rPr>
-        <w:t>Necesito Generar Prenotas</w:t>
+        <w:t xml:space="preserve"> estado están según la fecha, y necesito que por actividad haya un botón de Calificar, y me permita colocar una nota que vaya del 1 al 10.</w:t>
+      </w:r>
+      <w:r>
+        <w:rPr>
+          <w:b/>
+          <w:lang w:val="es-ES"/>
+        </w:rPr>
+        <w:t xml:space="preserve"> Cuando la actividad sea un trabajo en grupo, el estudiante recibe dos notas, una por la actividad y una del grupo.</w:t>
+      </w:r>
+    </w:p>
+    <w:p>
+      <w:pPr>
+        <w:rPr>
+          <w:lang w:val="es-ES"/>
+        </w:rPr>
+      </w:pPr>
+    </w:p>
+    <w:p>
+      <w:pPr>
+        <w:rPr>
+          <w:lang w:val="es-ES"/>
+        </w:rPr>
+      </w:pPr>
+      <w:r>
+        <w:rPr>
+          <w:lang w:val="es-ES"/>
+        </w:rPr>
+        <w:lastRenderedPageBreak/>
+        <w:t>Basándote</w:t>
+      </w:r>
+      <w:r>
+        <w:rPr>
+          <w:lang w:val="es-ES"/>
+        </w:rPr>
+        <w:t xml:space="preserve"> en el calendario escolar, en el cual va a estar cargada la fecha de presentación de prenotas, el sistema me debe mostrar en el dashboard, a la altura de donde me muestra los de establecimiento, materia y curso arriba del reloj, en otra card en misma línea dividiendo en dos columnas la pantalla , una etiqueta que me indique la próxima fechas registrada en el calendario escolar, Por ejemplo 17/5/2026 – Cierre de Prenotas y </w:t>
+      </w:r>
+      <w:r>
+        <w:rPr>
+          <w:lang w:val="es-ES"/>
+        </w:rPr>
+        <w:t>así</w:t>
+      </w:r>
+      <w:r>
+        <w:rPr>
+          <w:lang w:val="es-ES"/>
+        </w:rPr>
+        <w:t xml:space="preserve"> sucesivamente que una </w:t>
+      </w:r>
+      <w:r>
+        <w:rPr>
+          <w:lang w:val="es-ES"/>
+        </w:rPr>
+        <w:t>vez</w:t>
       </w:r>
       <w:bookmarkStart w:id="0" w:name="_GoBack"/>
       <w:bookmarkEnd w:id="0"/>
-    </w:p>
-    <w:p>
-      <w:pPr>
-        <w:rPr>
-          <w:lang w:val="es-ES"/>
-        </w:rPr>
-      </w:pPr>
-    </w:p>
-    <w:p>
-      <w:pPr>
-        <w:rPr>
-          <w:lang w:val="es-ES"/>
-        </w:rPr>
-      </w:pPr>
-    </w:p>
-    <w:p>
-      <w:pPr>
-        <w:rPr>
-          <w:lang w:val="es-ES"/>
-        </w:rPr>
-      </w:pPr>
-      <w:r>
-        <w:rPr>
-          <w:lang w:val="es-ES"/>
-        </w:rPr>
-        <w:t xml:space="preserve">Necesito Realizar </w:t>
+      <w:r>
+        <w:rPr>
+          <w:lang w:val="es-ES"/>
+        </w:rPr>
+        <w:t xml:space="preserve"> pasada la fecha se actualice al próximo evento registrado.  </w:t>
+      </w:r>
+    </w:p>
+    <w:p>
+      <w:pPr>
+        <w:rPr>
+          <w:lang w:val="es-ES"/>
+        </w:rPr>
+      </w:pPr>
+      <w:r>
+        <w:rPr>
+          <w:lang w:val="es-ES"/>
+        </w:rPr>
+        <w:t>Necesito Generar Prenotas</w:t>
+      </w:r>
+      <w:r>
+        <w:rPr>
+          <w:lang w:val="es-ES"/>
+        </w:rPr>
+        <w:t xml:space="preserve">, las prenotas deben ser un promedio de las notas asignadas a todas las actividades que tenga asignadas y calificadas un alumno, </w:t>
+      </w:r>
+      <w:r>
+        <w:rPr>
+          <w:lang w:val="es-ES"/>
+        </w:rPr>
+        <w:t>así</w:t>
+      </w:r>
+      <w:r>
+        <w:rPr>
+          <w:lang w:val="es-ES"/>
+        </w:rPr>
+        <w:t xml:space="preserve"> como las calificaciones que se le hayan ido cargando por el menú calificaciones, eso me va a dar una nota promedio, el promedio me lo tiene que hacer en función de los registros de calificaciones del alumno, las calificaciones de las actividades y la cantidad de registros de ese alumno. También las asistencias deben ser tenidas en cuenta, si el estudiante tiene más del porcentaje mínimo registrado la nota será 7 en asistencia, si tiene menos del porcentaje debe ser 6 y si tiene más del 90% debe ser 10. </w:t>
+      </w:r>
+      <w:r>
+        <w:rPr>
+          <w:lang w:val="es-ES"/>
+        </w:rPr>
+        <w:t xml:space="preserve">Una vez calculada la calificación numérica se la debe comparar con los valores almacenados en la tabla </w:t>
       </w:r>
       <w:proofErr w:type="spellStart"/>
       <w:r>
         <w:rPr>
           <w:lang w:val="es-ES"/>
         </w:rPr>
-        <w:t>ciere</w:t>
+        <w:t>tipovaloraciones</w:t>
       </w:r>
       <w:proofErr w:type="spellEnd"/>
       <w:r>
         <w:rPr>
           <w:lang w:val="es-ES"/>
         </w:rPr>
-        <w:t xml:space="preserve"> de cuatrimestre</w:t>
+        <w:t xml:space="preserve">, con la columna </w:t>
+      </w:r>
+      <w:proofErr w:type="spellStart"/>
+      <w:r>
+        <w:rPr>
+          <w:lang w:val="es-ES"/>
+        </w:rPr>
+        <w:t>notainferior</w:t>
+      </w:r>
+      <w:proofErr w:type="spellEnd"/>
+      <w:r>
+        <w:rPr>
+          <w:lang w:val="es-ES"/>
+        </w:rPr>
+        <w:t xml:space="preserve"> y la columna </w:t>
+      </w:r>
+      <w:proofErr w:type="spellStart"/>
+      <w:r>
+        <w:rPr>
+          <w:lang w:val="es-ES"/>
+        </w:rPr>
+        <w:t>notasuperior</w:t>
+      </w:r>
+      <w:proofErr w:type="spellEnd"/>
+      <w:r>
+        <w:rPr>
+          <w:lang w:val="es-ES"/>
+        </w:rPr>
+        <w:t xml:space="preserve"> </w:t>
+      </w:r>
+      <w:r>
+        <w:rPr>
+          <w:lang w:val="es-ES"/>
+        </w:rPr>
+        <w:t xml:space="preserve"> </w:t>
+      </w:r>
+      <w:r>
+        <w:rPr>
+          <w:lang w:val="es-ES"/>
+        </w:rPr>
+        <w:t xml:space="preserve">y me debe devolver en 3 columnas o </w:t>
+      </w:r>
+      <w:r>
+        <w:rPr>
+          <w:lang w:val="es-ES"/>
+        </w:rPr>
+        <w:t>más</w:t>
+      </w:r>
+      <w:r>
+        <w:rPr>
+          <w:lang w:val="es-ES"/>
+        </w:rPr>
+        <w:t xml:space="preserve"> las denominaciones con las que encuadra la nota, por ejemplo si la nota es 4, me tiene que devolver TEP y Regular en dos columnas claramente visibles, y </w:t>
+      </w:r>
+      <w:proofErr w:type="spellStart"/>
+      <w:r>
+        <w:rPr>
+          <w:lang w:val="es-ES"/>
+        </w:rPr>
+        <w:t>asi</w:t>
+      </w:r>
+      <w:proofErr w:type="spellEnd"/>
+      <w:r>
+        <w:rPr>
+          <w:lang w:val="es-ES"/>
+        </w:rPr>
+        <w:t xml:space="preserve"> con cada estudiante, al final de la vista un botón de Guardar las Calificaciones, en una tabla de cierres de notas, donde se debe almacenar el </w:t>
+      </w:r>
+      <w:r>
+        <w:rPr>
+          <w:lang w:val="es-ES"/>
+        </w:rPr>
+        <w:t xml:space="preserve">alumno, </w:t>
+      </w:r>
+      <w:r>
+        <w:rPr>
+          <w:lang w:val="es-ES"/>
+        </w:rPr>
+        <w:t xml:space="preserve">tipo de cierre , la nota valorativa, y la nota numérica correspondiente, </w:t>
+      </w:r>
+      <w:r>
+        <w:rPr>
+          <w:lang w:val="es-ES"/>
+        </w:rPr>
+        <w:t>obviamente</w:t>
+      </w:r>
+      <w:r>
+        <w:rPr>
+          <w:lang w:val="es-ES"/>
+        </w:rPr>
+        <w:t xml:space="preserve"> con la fecha de registro de esos datos que debe ser la indicada por </w:t>
+      </w:r>
+      <w:r>
+        <w:rPr>
+          <w:lang w:val="es-ES"/>
+        </w:rPr>
+        <w:t>la fecha del sistema</w:t>
+      </w:r>
+      <w:r>
+        <w:rPr>
+          <w:lang w:val="es-ES"/>
+        </w:rPr>
+        <w:t>(actual).</w:t>
+      </w:r>
+    </w:p>
+    <w:p>
+      <w:pPr>
+        <w:rPr>
+          <w:lang w:val="es-ES"/>
+        </w:rPr>
+      </w:pPr>
+      <w:r>
+        <w:rPr>
+          <w:lang w:val="es-ES"/>
+        </w:rPr>
+        <w:t>Necesito Realizar cie</w:t>
+      </w:r>
+      <w:r>
+        <w:rPr>
+          <w:lang w:val="es-ES"/>
+        </w:rPr>
+        <w:t>r</w:t>
+      </w:r>
+      <w:r>
+        <w:rPr>
+          <w:lang w:val="es-ES"/>
+        </w:rPr>
+        <w:t>re de cuatrimestre</w:t>
       </w:r>
     </w:p>
     <w:sectPr>
@@ -10855,7 +11017,7 @@
 </file>
 
 <file path=customXml/itemProps1.xml><?xml version="1.0" encoding="utf-8"?>
-<ds:datastoreItem xmlns:ds="http://schemas.openxmlformats.org/officeDocument/2006/customXml" ds:itemID="{6B03DDBE-038F-433A-B252-46540A3ADD3B}">
+<ds:datastoreItem xmlns:ds="http://schemas.openxmlformats.org/officeDocument/2006/customXml" ds:itemID="{73632EAC-B84A-4D2E-9476-BBE79FB132D8}">
   <ds:schemaRefs>
     <ds:schemaRef ds:uri="http://schemas.openxmlformats.org/officeDocument/2006/bibliography"/>
   </ds:schemaRefs>

</xml_diff>

<commit_message>
Se agrega modulo de visualizacion de eventos de calendario al dasboard y modulo de generacion de cierre de notas
</commit_message>
<xml_diff>
--- a/requerimientos.docx
+++ b/requerimientos.docx
@@ -6640,12 +6640,14 @@
     <w:p>
       <w:pPr>
         <w:rPr>
-          <w:lang w:val="es-ES"/>
-        </w:rPr>
-      </w:pPr>
-      <w:r>
-        <w:rPr>
-          <w:b/>
+          <w:color w:val="FFC000"/>
+          <w:lang w:val="es-ES"/>
+        </w:rPr>
+      </w:pPr>
+      <w:r>
+        <w:rPr>
+          <w:b/>
+          <w:color w:val="FFC000"/>
           <w:lang w:val="es-ES"/>
         </w:rPr>
         <w:t xml:space="preserve">Sacamos de este </w:t>
@@ -6653,6 +6655,7 @@
       <w:r>
         <w:rPr>
           <w:b/>
+          <w:color w:val="FFC000"/>
           <w:lang w:val="es-ES"/>
         </w:rPr>
         <w:t>módulo</w:t>
@@ -6660,6 +6663,7 @@
       <w:r>
         <w:rPr>
           <w:b/>
+          <w:color w:val="FFC000"/>
           <w:lang w:val="es-ES"/>
         </w:rPr>
         <w:t xml:space="preserve"> la asignación de modalidad individual/grupal y la pasamos al </w:t>
@@ -6667,6 +6671,7 @@
       <w:r>
         <w:rPr>
           <w:b/>
+          <w:color w:val="FFC000"/>
           <w:lang w:val="es-ES"/>
         </w:rPr>
         <w:t>módulo</w:t>
@@ -6674,6 +6679,7 @@
       <w:r>
         <w:rPr>
           <w:b/>
+          <w:color w:val="FFC000"/>
           <w:lang w:val="es-ES"/>
         </w:rPr>
         <w:t xml:space="preserve"> de asignación de actividades, junto a la fecha de inicio de la actividad y a la fecha de </w:t>
@@ -6681,6 +6687,7 @@
       <w:r>
         <w:rPr>
           <w:b/>
+          <w:color w:val="FFC000"/>
           <w:lang w:val="es-ES"/>
         </w:rPr>
         <w:t>finalización</w:t>
@@ -6688,6 +6695,7 @@
       <w:r>
         <w:rPr>
           <w:b/>
+          <w:color w:val="FFC000"/>
           <w:lang w:val="es-ES"/>
         </w:rPr>
         <w:t xml:space="preserve">. Necesito me crees en el </w:t>
@@ -6695,6 +6703,7 @@
       <w:r>
         <w:rPr>
           <w:b/>
+          <w:color w:val="FFC000"/>
           <w:lang w:val="es-ES"/>
         </w:rPr>
         <w:t>menú</w:t>
@@ -6702,6 +6711,7 @@
       <w:r>
         <w:rPr>
           <w:b/>
+          <w:color w:val="FFC000"/>
           <w:lang w:val="es-ES"/>
         </w:rPr>
         <w:t xml:space="preserve"> de Material </w:t>
@@ -6709,6 +6719,7 @@
       <w:r>
         <w:rPr>
           <w:b/>
+          <w:color w:val="FFC000"/>
           <w:lang w:val="es-ES"/>
         </w:rPr>
         <w:t>Pedagógico</w:t>
@@ -6716,6 +6727,7 @@
       <w:r>
         <w:rPr>
           <w:b/>
+          <w:color w:val="FFC000"/>
           <w:lang w:val="es-ES"/>
         </w:rPr>
         <w:t xml:space="preserve">, una opción que me permita Asignar actividades, que al hacerle </w:t>
@@ -6723,6 +6735,7 @@
       <w:r>
         <w:rPr>
           <w:b/>
+          <w:color w:val="FFC000"/>
           <w:lang w:val="es-ES"/>
         </w:rPr>
         <w:t>clic</w:t>
@@ -6730,12 +6743,14 @@
       <w:r>
         <w:rPr>
           <w:b/>
+          <w:color w:val="FFC000"/>
           <w:lang w:val="es-ES"/>
         </w:rPr>
         <w:t xml:space="preserve"> me pida seleccionar el Año y el curso de listas, y la Materia, que al seleccionar la materia, me despliegue una tabla con las Actividades cargadas en el sistema y que me habilite un botón asignar actividad, que al presionarlo me guarde toda la información de la asignación de la actividad.</w:t>
       </w:r>
       <w:r>
         <w:rPr>
+          <w:color w:val="FFC000"/>
           <w:lang w:val="es-ES"/>
         </w:rPr>
         <w:t xml:space="preserve"> Para después mostrarla en actividades asignadas como hasta ahora.</w:t>
@@ -6784,6 +6799,7 @@
           <w:lang w:val="es-ES"/>
         </w:rPr>
       </w:pPr>
+      <w:bookmarkStart w:id="0" w:name="_GoBack"/>
       <w:r>
         <w:rPr>
           <w:b/>
@@ -6884,6 +6900,7 @@
         </w:rPr>
         <w:t xml:space="preserve"> que me lo muestre en rojo.</w:t>
       </w:r>
+      <w:bookmarkEnd w:id="0"/>
     </w:p>
     <w:p>
       <w:pPr>
@@ -6933,11 +6950,13 @@
     <w:p>
       <w:pPr>
         <w:rPr>
-          <w:lang w:val="es-ES"/>
-        </w:rPr>
-      </w:pPr>
-      <w:r>
-        <w:rPr>
+          <w:b/>
+          <w:lang w:val="es-ES"/>
+        </w:rPr>
+      </w:pPr>
+      <w:r>
+        <w:rPr>
+          <w:b/>
           <w:lang w:val="es-ES"/>
         </w:rPr>
         <w:lastRenderedPageBreak/>
@@ -6945,32 +6964,35 @@
       </w:r>
       <w:r>
         <w:rPr>
+          <w:b/>
           <w:lang w:val="es-ES"/>
         </w:rPr>
         <w:t xml:space="preserve"> en el calendario escolar, en el cual va a estar cargada la fecha de presentación de prenotas, el sistema me debe mostrar en el dashboard, a la altura de donde me muestra los de establecimiento, materia y curso arriba del reloj, en otra card en misma línea dividiendo en dos columnas la pantalla , una etiqueta que me indique la próxima fechas registrada en el calendario escolar, Por ejemplo 17/5/2026 – Cierre de Prenotas y </w:t>
       </w:r>
       <w:r>
         <w:rPr>
+          <w:b/>
           <w:lang w:val="es-ES"/>
         </w:rPr>
         <w:t>así</w:t>
       </w:r>
       <w:r>
         <w:rPr>
+          <w:b/>
           <w:lang w:val="es-ES"/>
         </w:rPr>
         <w:t xml:space="preserve"> sucesivamente que una </w:t>
       </w:r>
       <w:r>
         <w:rPr>
+          <w:b/>
           <w:lang w:val="es-ES"/>
         </w:rPr>
         <w:t>vez</w:t>
       </w:r>
-      <w:bookmarkStart w:id="0" w:name="_GoBack"/>
-      <w:bookmarkEnd w:id="0"/>
-      <w:r>
-        <w:rPr>
+      <w:r>
+        <w:rPr>
+          <w:b/>
           <w:lang w:val="es-ES"/>
         </w:rPr>
         <w:t xml:space="preserve"> pasada la fecha se actualice al próximo evento registrado.  </w:t>
@@ -6979,35 +7001,57 @@
     <w:p>
       <w:pPr>
         <w:rPr>
-          <w:lang w:val="es-ES"/>
-        </w:rPr>
-      </w:pPr>
-      <w:r>
-        <w:rPr>
+          <w:b/>
+          <w:lang w:val="es-ES"/>
+        </w:rPr>
+      </w:pPr>
+      <w:r>
+        <w:rPr>
+          <w:b/>
           <w:lang w:val="es-ES"/>
         </w:rPr>
         <w:t>Necesito Generar Prenotas</w:t>
       </w:r>
       <w:r>
         <w:rPr>
+          <w:b/>
           <w:lang w:val="es-ES"/>
         </w:rPr>
         <w:t xml:space="preserve">, las prenotas deben ser un promedio de las notas asignadas a todas las actividades que tenga asignadas y calificadas un alumno, </w:t>
       </w:r>
       <w:r>
         <w:rPr>
+          <w:b/>
           <w:lang w:val="es-ES"/>
         </w:rPr>
         <w:t>así</w:t>
       </w:r>
       <w:r>
         <w:rPr>
-          <w:lang w:val="es-ES"/>
-        </w:rPr>
-        <w:t xml:space="preserve"> como las calificaciones que se le hayan ido cargando por el menú calificaciones, eso me va a dar una nota promedio, el promedio me lo tiene que hacer en función de los registros de calificaciones del alumno, las calificaciones de las actividades y la cantidad de registros de ese alumno. También las asistencias deben ser tenidas en cuenta, si el estudiante tiene más del porcentaje mínimo registrado la nota será 7 en asistencia, si tiene menos del porcentaje debe ser 6 y si tiene más del 90% debe ser 10. </w:t>
-      </w:r>
-      <w:r>
-        <w:rPr>
+          <w:b/>
+          <w:lang w:val="es-ES"/>
+        </w:rPr>
+        <w:t xml:space="preserve"> como las calificaciones que se le hayan ido cargando por el menú calificaciones, eso me va a dar una nota promedio, </w:t>
+      </w:r>
+      <w:proofErr w:type="gramStart"/>
+      <w:r>
+        <w:rPr>
+          <w:b/>
+          <w:lang w:val="es-ES"/>
+        </w:rPr>
+        <w:t>el</w:t>
+      </w:r>
+      <w:proofErr w:type="gramEnd"/>
+      <w:r>
+        <w:rPr>
+          <w:b/>
+          <w:lang w:val="es-ES"/>
+        </w:rPr>
+        <w:t xml:space="preserve"> promedio me lo tiene que hacer en función de los registros de calificaciones del alumno, las calificaciones de las actividades y la cantidad de registros de ese alumno. También las asistencias deben ser tenidas en cuenta, si el estudiante tiene más del porcentaje mínimo registrado la nota será 7 en asistencia, si tiene menos del porcentaje debe ser 6 y si tiene más del 90% debe ser 10. </w:t>
+      </w:r>
+      <w:r>
+        <w:rPr>
+          <w:b/>
           <w:lang w:val="es-ES"/>
         </w:rPr>
         <w:t xml:space="preserve">Una vez calculada la calificación numérica se la debe comparar con los valores almacenados en la tabla </w:t>
@@ -7015,6 +7059,7 @@
       <w:proofErr w:type="spellStart"/>
       <w:r>
         <w:rPr>
+          <w:b/>
           <w:lang w:val="es-ES"/>
         </w:rPr>
         <w:t>tipovaloraciones</w:t>
@@ -7022,6 +7067,7 @@
       <w:proofErr w:type="spellEnd"/>
       <w:r>
         <w:rPr>
+          <w:b/>
           <w:lang w:val="es-ES"/>
         </w:rPr>
         <w:t xml:space="preserve">, con la columna </w:t>
@@ -7029,6 +7075,7 @@
       <w:proofErr w:type="spellStart"/>
       <w:r>
         <w:rPr>
+          <w:b/>
           <w:lang w:val="es-ES"/>
         </w:rPr>
         <w:t>notainferior</w:t>
@@ -7036,6 +7083,7 @@
       <w:proofErr w:type="spellEnd"/>
       <w:r>
         <w:rPr>
+          <w:b/>
           <w:lang w:val="es-ES"/>
         </w:rPr>
         <w:t xml:space="preserve"> y la columna </w:t>
@@ -7043,6 +7091,7 @@
       <w:proofErr w:type="spellStart"/>
       <w:r>
         <w:rPr>
+          <w:b/>
           <w:lang w:val="es-ES"/>
         </w:rPr>
         <w:t>notasuperior</w:t>
@@ -7050,30 +7099,35 @@
       <w:proofErr w:type="spellEnd"/>
       <w:r>
         <w:rPr>
+          <w:b/>
           <w:lang w:val="es-ES"/>
         </w:rPr>
         <w:t xml:space="preserve"> </w:t>
       </w:r>
       <w:r>
         <w:rPr>
+          <w:b/>
           <w:lang w:val="es-ES"/>
         </w:rPr>
         <w:t xml:space="preserve"> </w:t>
       </w:r>
       <w:r>
         <w:rPr>
+          <w:b/>
           <w:lang w:val="es-ES"/>
         </w:rPr>
         <w:t xml:space="preserve">y me debe devolver en 3 columnas o </w:t>
       </w:r>
       <w:r>
         <w:rPr>
+          <w:b/>
           <w:lang w:val="es-ES"/>
         </w:rPr>
         <w:t>más</w:t>
       </w:r>
       <w:r>
         <w:rPr>
+          <w:b/>
           <w:lang w:val="es-ES"/>
         </w:rPr>
         <w:t xml:space="preserve"> las denominaciones con las que encuadra la nota, por ejemplo si la nota es 4, me tiene que devolver TEP y Regular en dos columnas claramente visibles, y </w:t>
@@ -7081,6 +7135,7 @@
       <w:proofErr w:type="spellStart"/>
       <w:r>
         <w:rPr>
+          <w:b/>
           <w:lang w:val="es-ES"/>
         </w:rPr>
         <w:t>asi</w:t>
@@ -7088,42 +7143,49 @@
       <w:proofErr w:type="spellEnd"/>
       <w:r>
         <w:rPr>
+          <w:b/>
           <w:lang w:val="es-ES"/>
         </w:rPr>
         <w:t xml:space="preserve"> con cada estudiante, al final de la vista un botón de Guardar las Calificaciones, en una tabla de cierres de notas, donde se debe almacenar el </w:t>
       </w:r>
       <w:r>
         <w:rPr>
+          <w:b/>
           <w:lang w:val="es-ES"/>
         </w:rPr>
         <w:t xml:space="preserve">alumno, </w:t>
       </w:r>
       <w:r>
         <w:rPr>
+          <w:b/>
           <w:lang w:val="es-ES"/>
         </w:rPr>
         <w:t xml:space="preserve">tipo de cierre , la nota valorativa, y la nota numérica correspondiente, </w:t>
       </w:r>
       <w:r>
         <w:rPr>
+          <w:b/>
           <w:lang w:val="es-ES"/>
         </w:rPr>
         <w:t>obviamente</w:t>
       </w:r>
       <w:r>
         <w:rPr>
+          <w:b/>
           <w:lang w:val="es-ES"/>
         </w:rPr>
         <w:t xml:space="preserve"> con la fecha de registro de esos datos que debe ser la indicada por </w:t>
       </w:r>
       <w:r>
         <w:rPr>
+          <w:b/>
           <w:lang w:val="es-ES"/>
         </w:rPr>
         <w:t>la fecha del sistema</w:t>
       </w:r>
       <w:r>
         <w:rPr>
+          <w:b/>
           <w:lang w:val="es-ES"/>
         </w:rPr>
         <w:t>(actual).</w:t>
@@ -11017,7 +11079,7 @@
 </file>
 
 <file path=customXml/itemProps1.xml><?xml version="1.0" encoding="utf-8"?>
-<ds:datastoreItem xmlns:ds="http://schemas.openxmlformats.org/officeDocument/2006/customXml" ds:itemID="{73632EAC-B84A-4D2E-9476-BBE79FB132D8}">
+<ds:datastoreItem xmlns:ds="http://schemas.openxmlformats.org/officeDocument/2006/customXml" ds:itemID="{AB165D9F-7F74-4D06-97FE-72CA90BD53D9}">
   <ds:schemaRefs>
     <ds:schemaRef ds:uri="http://schemas.openxmlformats.org/officeDocument/2006/bibliography"/>
   </ds:schemaRefs>

</xml_diff>

<commit_message>
Se corrige error de actualizacion y agregado de numero de unidad
</commit_message>
<xml_diff>
--- a/requerimientos.docx
+++ b/requerimientos.docx
@@ -6004,23 +6004,7 @@
           <w:b/>
           <w:lang w:val="es-ES"/>
         </w:rPr>
-        <w:t xml:space="preserve">, Los tipos de Valoraciones mediante un </w:t>
-      </w:r>
-      <w:proofErr w:type="spellStart"/>
-      <w:r>
-        <w:rPr>
-          <w:b/>
-          <w:lang w:val="es-ES"/>
-        </w:rPr>
-        <w:t>crud</w:t>
-      </w:r>
-      <w:proofErr w:type="spellEnd"/>
-      <w:r>
-        <w:rPr>
-          <w:b/>
-          <w:lang w:val="es-ES"/>
-        </w:rPr>
-        <w:t xml:space="preserve">, donde yo pueda agregar, modificar, eliminar, una valoración, necesito manejar los siguientes datos </w:t>
+        <w:t xml:space="preserve">, Los tipos de Valoraciones mediante un crud, donde yo pueda agregar, modificar, eliminar, una valoración, necesito manejar los siguientes datos </w:t>
       </w:r>
       <w:proofErr w:type="spellStart"/>
       <w:r>
@@ -6796,13 +6780,14 @@
       <w:pPr>
         <w:rPr>
           <w:b/>
-          <w:lang w:val="es-ES"/>
-        </w:rPr>
-      </w:pPr>
-      <w:bookmarkStart w:id="0" w:name="_GoBack"/>
-      <w:r>
-        <w:rPr>
-          <w:b/>
+          <w:color w:val="FFC000"/>
+          <w:lang w:val="es-ES"/>
+        </w:rPr>
+      </w:pPr>
+      <w:r>
+        <w:rPr>
+          <w:b/>
+          <w:color w:val="FFC000"/>
           <w:lang w:val="es-ES"/>
         </w:rPr>
         <w:t xml:space="preserve">Necesito que en función de la cantidad de clases que se </w:t>
@@ -6810,6 +6795,7 @@
       <w:r>
         <w:rPr>
           <w:b/>
+          <w:color w:val="FFC000"/>
           <w:lang w:val="es-ES"/>
         </w:rPr>
         <w:t>calculó</w:t>
@@ -6817,6 +6803,7 @@
       <w:r>
         <w:rPr>
           <w:b/>
+          <w:color w:val="FFC000"/>
           <w:lang w:val="es-ES"/>
         </w:rPr>
         <w:t xml:space="preserve"> y registro para cada materia en el momento de cargar la materia al sistema, cuando me muestre la vista del listado de asistencias, me calcule, muestre y </w:t>
@@ -6824,6 +6811,7 @@
       <w:r>
         <w:rPr>
           <w:b/>
+          <w:color w:val="FFC000"/>
           <w:lang w:val="es-ES"/>
         </w:rPr>
         <w:t>actualice</w:t>
@@ -6831,6 +6819,7 @@
       <w:r>
         <w:rPr>
           <w:b/>
+          <w:color w:val="FFC000"/>
           <w:lang w:val="es-ES"/>
         </w:rPr>
         <w:t xml:space="preserve"> en el alumno el campo Porcentaje de Asistencia, para eso debemos agregar el campo a la tabla de asistencia, </w:t>
@@ -6838,6 +6827,7 @@
       <w:r>
         <w:rPr>
           <w:b/>
+          <w:color w:val="FFC000"/>
           <w:lang w:val="es-ES"/>
         </w:rPr>
         <w:t>tener</w:t>
@@ -6845,36 +6835,42 @@
       <w:r>
         <w:rPr>
           <w:b/>
+          <w:color w:val="FFC000"/>
           <w:lang w:val="es-ES"/>
         </w:rPr>
         <w:t xml:space="preserve"> en cuenta que a medida que voy registrando nuevas asistencias, el valor del porcentaje tiene que cambiar actualizando su valor. Cuando el sistema me muestre el listado de estudiantes, necesito que el mismo verifique el porcentaje que tiene guardado en el estudiante, contra un porcentaje determinado en la materia, si es superior a ese porcentaje que me muestre el estudiante pintado en blanco como ahora, </w:t>
       </w:r>
       <w:r>
         <w:rPr>
+          <w:color w:val="FFC000"/>
           <w:lang w:val="es-ES"/>
         </w:rPr>
         <w:t xml:space="preserve">si </w:t>
       </w:r>
       <w:r>
         <w:rPr>
+          <w:color w:val="FFC000"/>
           <w:lang w:val="es-ES"/>
         </w:rPr>
         <w:t>está</w:t>
       </w:r>
       <w:r>
         <w:rPr>
+          <w:color w:val="FFC000"/>
           <w:lang w:val="es-ES"/>
         </w:rPr>
         <w:t xml:space="preserve"> cerca de </w:t>
       </w:r>
       <w:r>
         <w:rPr>
+          <w:color w:val="FFC000"/>
           <w:lang w:val="es-ES"/>
         </w:rPr>
         <w:t>pasarse</w:t>
       </w:r>
       <w:r>
         <w:rPr>
+          <w:color w:val="FFC000"/>
           <w:lang w:val="es-ES"/>
         </w:rPr>
         <w:t xml:space="preserve"> del porcentaje por 1 o dos faltas que se ponga amarillo, si le queda una falta, naranja y</w:t>
@@ -6882,6 +6878,7 @@
       <w:r>
         <w:rPr>
           <w:b/>
+          <w:color w:val="FFC000"/>
           <w:lang w:val="es-ES"/>
         </w:rPr>
         <w:t xml:space="preserve"> si se </w:t>
@@ -6889,6 +6886,7 @@
       <w:r>
         <w:rPr>
           <w:b/>
+          <w:color w:val="FFC000"/>
           <w:lang w:val="es-ES"/>
         </w:rPr>
         <w:t>pasó</w:t>
@@ -6896,11 +6894,11 @@
       <w:r>
         <w:rPr>
           <w:b/>
+          <w:color w:val="FFC000"/>
           <w:lang w:val="es-ES"/>
         </w:rPr>
         <w:t xml:space="preserve"> que me lo muestre en rojo.</w:t>
       </w:r>
-      <w:bookmarkEnd w:id="0"/>
     </w:p>
     <w:p>
       <w:pPr>
@@ -7031,166 +7029,265 @@
           <w:b/>
           <w:lang w:val="es-ES"/>
         </w:rPr>
-        <w:t xml:space="preserve"> como las calificaciones que se le hayan ido cargando por el menú calificaciones, eso me va a dar una nota promedio, </w:t>
-      </w:r>
+        <w:t xml:space="preserve"> como las calificaciones que se le hayan ido cargando por el menú calificaciones, eso me va a dar una nota promedio, el promedio me lo tiene que hacer en función de los registros de calificaciones del alumno, las calificaciones de las actividades y la cantidad de registros de ese alumno. También las asistencias deben ser tenidas en cuenta, si el estudiante tiene más del porcentaje mínimo registrado la nota será 7 en asistencia, si tiene menos del porcentaje debe ser 6 y si tiene más del 90% debe ser 10. </w:t>
+      </w:r>
+      <w:r>
+        <w:rPr>
+          <w:b/>
+          <w:lang w:val="es-ES"/>
+        </w:rPr>
+        <w:t xml:space="preserve">Una vez calculada la calificación numérica se la debe comparar con los valores almacenados en la tabla </w:t>
+      </w:r>
+      <w:proofErr w:type="spellStart"/>
+      <w:r>
+        <w:rPr>
+          <w:b/>
+          <w:lang w:val="es-ES"/>
+        </w:rPr>
+        <w:t>tipovaloraciones</w:t>
+      </w:r>
+      <w:proofErr w:type="spellEnd"/>
+      <w:r>
+        <w:rPr>
+          <w:b/>
+          <w:lang w:val="es-ES"/>
+        </w:rPr>
+        <w:t xml:space="preserve">, con la columna </w:t>
+      </w:r>
+      <w:proofErr w:type="spellStart"/>
+      <w:r>
+        <w:rPr>
+          <w:b/>
+          <w:lang w:val="es-ES"/>
+        </w:rPr>
+        <w:t>notainferior</w:t>
+      </w:r>
+      <w:proofErr w:type="spellEnd"/>
+      <w:r>
+        <w:rPr>
+          <w:b/>
+          <w:lang w:val="es-ES"/>
+        </w:rPr>
+        <w:t xml:space="preserve"> y la columna </w:t>
+      </w:r>
+      <w:proofErr w:type="spellStart"/>
+      <w:r>
+        <w:rPr>
+          <w:b/>
+          <w:lang w:val="es-ES"/>
+        </w:rPr>
+        <w:t>notasuperior</w:t>
+      </w:r>
+      <w:proofErr w:type="spellEnd"/>
+      <w:r>
+        <w:rPr>
+          <w:b/>
+          <w:lang w:val="es-ES"/>
+        </w:rPr>
+        <w:t xml:space="preserve"> </w:t>
+      </w:r>
+      <w:r>
+        <w:rPr>
+          <w:b/>
+          <w:lang w:val="es-ES"/>
+        </w:rPr>
+        <w:t xml:space="preserve"> </w:t>
+      </w:r>
+      <w:r>
+        <w:rPr>
+          <w:b/>
+          <w:lang w:val="es-ES"/>
+        </w:rPr>
+        <w:t xml:space="preserve">y me debe devolver en 3 columnas o </w:t>
+      </w:r>
+      <w:r>
+        <w:rPr>
+          <w:b/>
+          <w:lang w:val="es-ES"/>
+        </w:rPr>
+        <w:t>más</w:t>
+      </w:r>
+      <w:r>
+        <w:rPr>
+          <w:b/>
+          <w:lang w:val="es-ES"/>
+        </w:rPr>
+        <w:t xml:space="preserve"> las denominaciones con las que encuadra la nota, por ejemplo si la nota es 4, me tiene que devolver TEP y Regular en dos columnas claramente visibles, y </w:t>
+      </w:r>
+      <w:proofErr w:type="spellStart"/>
+      <w:r>
+        <w:rPr>
+          <w:b/>
+          <w:lang w:val="es-ES"/>
+        </w:rPr>
+        <w:t>asi</w:t>
+      </w:r>
+      <w:proofErr w:type="spellEnd"/>
+      <w:r>
+        <w:rPr>
+          <w:b/>
+          <w:lang w:val="es-ES"/>
+        </w:rPr>
+        <w:t xml:space="preserve"> con cada estudiante, al final de la vista un botón de Guardar las Calificaciones, en una tabla de cierres de notas, donde se debe almacenar el </w:t>
+      </w:r>
+      <w:r>
+        <w:rPr>
+          <w:b/>
+          <w:lang w:val="es-ES"/>
+        </w:rPr>
+        <w:t xml:space="preserve">alumno, </w:t>
+      </w:r>
+      <w:r>
+        <w:rPr>
+          <w:b/>
+          <w:lang w:val="es-ES"/>
+        </w:rPr>
+        <w:t xml:space="preserve">tipo de cierre , la nota valorativa, y la nota numérica correspondiente, </w:t>
+      </w:r>
+      <w:r>
+        <w:rPr>
+          <w:b/>
+          <w:lang w:val="es-ES"/>
+        </w:rPr>
+        <w:t>obviamente</w:t>
+      </w:r>
+      <w:r>
+        <w:rPr>
+          <w:b/>
+          <w:lang w:val="es-ES"/>
+        </w:rPr>
+        <w:t xml:space="preserve"> con la fecha de registro de esos datos que debe ser la indicada por </w:t>
+      </w:r>
+      <w:r>
+        <w:rPr>
+          <w:b/>
+          <w:lang w:val="es-ES"/>
+        </w:rPr>
+        <w:t>la fecha del sistema</w:t>
+      </w:r>
+      <w:r>
+        <w:rPr>
+          <w:b/>
+          <w:lang w:val="es-ES"/>
+        </w:rPr>
+        <w:t>(actual).</w:t>
+      </w:r>
+    </w:p>
+    <w:p>
+      <w:pPr>
+        <w:rPr>
+          <w:color w:val="FFC000"/>
+          <w:lang w:val="es-ES"/>
+        </w:rPr>
+      </w:pPr>
+      <w:r>
+        <w:rPr>
+          <w:b/>
+          <w:lang w:val="es-ES"/>
+        </w:rPr>
+        <w:t xml:space="preserve">Necesito que me modifiques la vista de los contenidos para que me aparezca el </w:t>
+      </w:r>
+      <w:r>
+        <w:rPr>
+          <w:b/>
+          <w:lang w:val="es-ES"/>
+        </w:rPr>
+        <w:t>número</w:t>
+      </w:r>
+      <w:r>
+        <w:rPr>
+          <w:b/>
+          <w:lang w:val="es-ES"/>
+        </w:rPr>
+        <w:t xml:space="preserve"> de unidad almacenado en el espacio correspondiente porque ahora no lo muestra, lo mismo en la vista de detalle de contenido y que aparezca en su correspondiente lugar en la vista de edición de contenido, el dato almacenado</w:t>
+      </w:r>
+      <w:r>
+        <w:rPr>
+          <w:color w:val="FFC000"/>
+          <w:lang w:val="es-ES"/>
+        </w:rPr>
+        <w:t>.</w:t>
+      </w:r>
+    </w:p>
+    <w:p>
+      <w:pPr>
+        <w:rPr>
+          <w:b/>
+          <w:lang w:val="es-ES"/>
+        </w:rPr>
+      </w:pPr>
+      <w:r>
+        <w:rPr>
+          <w:b/>
+          <w:lang w:val="es-ES"/>
+        </w:rPr>
+        <w:t xml:space="preserve">Necesito que en las actividades, me aparezca en la vista actividades, ordenada por </w:t>
+      </w:r>
+      <w:proofErr w:type="spellStart"/>
       <w:proofErr w:type="gramStart"/>
       <w:r>
         <w:rPr>
           <w:b/>
           <w:lang w:val="es-ES"/>
         </w:rPr>
-        <w:t>el</w:t>
-      </w:r>
+        <w:t>numero</w:t>
+      </w:r>
+      <w:proofErr w:type="spellEnd"/>
       <w:proofErr w:type="gramEnd"/>
       <w:r>
         <w:rPr>
           <w:b/>
           <w:lang w:val="es-ES"/>
         </w:rPr>
-        <w:t xml:space="preserve"> promedio me lo tiene que hacer en función de los registros de calificaciones del alumno, las calificaciones de las actividades y la cantidad de registros de ese alumno. También las asistencias deben ser tenidas en cuenta, si el estudiante tiene más del porcentaje mínimo registrado la nota será 7 en asistencia, si tiene menos del porcentaje debe ser 6 y si tiene más del 90% debe ser 10. </w:t>
-      </w:r>
-      <w:r>
-        <w:rPr>
-          <w:b/>
-          <w:lang w:val="es-ES"/>
-        </w:rPr>
-        <w:t xml:space="preserve">Una vez calculada la calificación numérica se la debe comparar con los valores almacenados en la tabla </w:t>
-      </w:r>
-      <w:proofErr w:type="spellStart"/>
-      <w:r>
-        <w:rPr>
-          <w:b/>
-          <w:lang w:val="es-ES"/>
-        </w:rPr>
-        <w:t>tipovaloraciones</w:t>
-      </w:r>
-      <w:proofErr w:type="spellEnd"/>
-      <w:r>
-        <w:rPr>
-          <w:b/>
-          <w:lang w:val="es-ES"/>
-        </w:rPr>
-        <w:t xml:space="preserve">, con la columna </w:t>
-      </w:r>
-      <w:proofErr w:type="spellStart"/>
-      <w:r>
-        <w:rPr>
-          <w:b/>
-          <w:lang w:val="es-ES"/>
-        </w:rPr>
-        <w:t>notainferior</w:t>
-      </w:r>
-      <w:proofErr w:type="spellEnd"/>
-      <w:r>
-        <w:rPr>
-          <w:b/>
-          <w:lang w:val="es-ES"/>
-        </w:rPr>
-        <w:t xml:space="preserve"> y la columna </w:t>
-      </w:r>
-      <w:proofErr w:type="spellStart"/>
-      <w:r>
-        <w:rPr>
-          <w:b/>
-          <w:lang w:val="es-ES"/>
-        </w:rPr>
-        <w:t>notasuperior</w:t>
-      </w:r>
-      <w:proofErr w:type="spellEnd"/>
-      <w:r>
-        <w:rPr>
-          <w:b/>
-          <w:lang w:val="es-ES"/>
-        </w:rPr>
-        <w:t xml:space="preserve"> </w:t>
-      </w:r>
-      <w:r>
-        <w:rPr>
-          <w:b/>
-          <w:lang w:val="es-ES"/>
-        </w:rPr>
-        <w:t xml:space="preserve"> </w:t>
-      </w:r>
-      <w:r>
-        <w:rPr>
-          <w:b/>
-          <w:lang w:val="es-ES"/>
-        </w:rPr>
-        <w:t xml:space="preserve">y me debe devolver en 3 columnas o </w:t>
-      </w:r>
-      <w:r>
-        <w:rPr>
-          <w:b/>
-          <w:lang w:val="es-ES"/>
-        </w:rPr>
-        <w:t>más</w:t>
-      </w:r>
-      <w:r>
-        <w:rPr>
-          <w:b/>
-          <w:lang w:val="es-ES"/>
-        </w:rPr>
-        <w:t xml:space="preserve"> las denominaciones con las que encuadra la nota, por ejemplo si la nota es 4, me tiene que devolver TEP y Regular en dos columnas claramente visibles, y </w:t>
-      </w:r>
-      <w:proofErr w:type="spellStart"/>
-      <w:r>
-        <w:rPr>
-          <w:b/>
-          <w:lang w:val="es-ES"/>
-        </w:rPr>
-        <w:t>asi</w:t>
-      </w:r>
-      <w:proofErr w:type="spellEnd"/>
-      <w:r>
-        <w:rPr>
-          <w:b/>
-          <w:lang w:val="es-ES"/>
-        </w:rPr>
-        <w:t xml:space="preserve"> con cada estudiante, al final de la vista un botón de Guardar las Calificaciones, en una tabla de cierres de notas, donde se debe almacenar el </w:t>
-      </w:r>
-      <w:r>
-        <w:rPr>
-          <w:b/>
-          <w:lang w:val="es-ES"/>
-        </w:rPr>
-        <w:t xml:space="preserve">alumno, </w:t>
-      </w:r>
-      <w:r>
-        <w:rPr>
-          <w:b/>
-          <w:lang w:val="es-ES"/>
-        </w:rPr>
-        <w:t xml:space="preserve">tipo de cierre , la nota valorativa, y la nota numérica correspondiente, </w:t>
-      </w:r>
-      <w:r>
-        <w:rPr>
-          <w:b/>
-          <w:lang w:val="es-ES"/>
-        </w:rPr>
-        <w:t>obviamente</w:t>
-      </w:r>
-      <w:r>
-        <w:rPr>
-          <w:b/>
-          <w:lang w:val="es-ES"/>
-        </w:rPr>
-        <w:t xml:space="preserve"> con la fecha de registro de esos datos que debe ser la indicada por </w:t>
-      </w:r>
-      <w:r>
-        <w:rPr>
-          <w:b/>
-          <w:lang w:val="es-ES"/>
-        </w:rPr>
-        <w:t>la fecha del sistema</w:t>
-      </w:r>
-      <w:r>
-        <w:rPr>
-          <w:b/>
-          <w:lang w:val="es-ES"/>
-        </w:rPr>
-        <w:t>(actual).</w:t>
-      </w:r>
-    </w:p>
+        <w:t xml:space="preserve"> de actividad, y que entre la columna de Tema y la columna tipo me muestre la columna con el subtema al cual corresponde el trabajo practico.</w:t>
+      </w:r>
+    </w:p>
+    <w:p>
+      <w:pPr>
+        <w:rPr>
+          <w:b/>
+          <w:lang w:val="es-ES"/>
+        </w:rPr>
+      </w:pPr>
+      <w:r>
+        <w:rPr>
+          <w:b/>
+          <w:lang w:val="es-ES"/>
+        </w:rPr>
+        <w:t xml:space="preserve">Necesito me agregues a la tabla de Alumnos el Tipo Cursada, Regular, Libre, Recursa, Intensifica y que me </w:t>
+      </w:r>
+      <w:r>
+        <w:rPr>
+          <w:b/>
+          <w:lang w:val="es-ES"/>
+        </w:rPr>
+        <w:t>actualices</w:t>
+      </w:r>
+      <w:r>
+        <w:rPr>
+          <w:b/>
+          <w:lang w:val="es-ES"/>
+        </w:rPr>
+        <w:t xml:space="preserve"> todas las vistas del crud.</w:t>
+      </w:r>
+    </w:p>
+    <w:p>
+      <w:pPr>
+        <w:rPr>
+          <w:b/>
+          <w:lang w:val="es-ES"/>
+        </w:rPr>
+      </w:pPr>
+      <w:bookmarkStart w:id="0" w:name="_GoBack"/>
+      <w:r>
+        <w:rPr>
+          <w:b/>
+          <w:lang w:val="es-ES"/>
+        </w:rPr>
+        <w:t>Necesito que cuando en los contenidos seleccione la materia, presione el botón editar, al guardar la actualización vuelva a la vista de contenidos con la materia seleccionada previamente, “recordada” y en la vista de los contenidos con los datos actualizados “refrescados”.</w:t>
+      </w:r>
+    </w:p>
+    <w:bookmarkEnd w:id="0"/>
     <w:p>
       <w:pPr>
         <w:rPr>
@@ -11079,7 +11176,7 @@
 </file>
 
 <file path=customXml/itemProps1.xml><?xml version="1.0" encoding="utf-8"?>
-<ds:datastoreItem xmlns:ds="http://schemas.openxmlformats.org/officeDocument/2006/customXml" ds:itemID="{AB165D9F-7F74-4D06-97FE-72CA90BD53D9}">
+<ds:datastoreItem xmlns:ds="http://schemas.openxmlformats.org/officeDocument/2006/customXml" ds:itemID="{B8880946-3B20-42B5-BD1C-F0296E93E788}">
   <ds:schemaRefs>
     <ds:schemaRef ds:uri="http://schemas.openxmlformats.org/officeDocument/2006/bibliography"/>
   </ds:schemaRefs>

</xml_diff>

<commit_message>
Se modifica asignacion de datos personales de estudianttes en base de datos
</commit_message>
<xml_diff>
--- a/requerimientos.docx
+++ b/requerimientos.docx
@@ -7278,13 +7278,203 @@
           <w:lang w:val="es-ES"/>
         </w:rPr>
       </w:pPr>
+      <w:r>
+        <w:rPr>
+          <w:b/>
+          <w:lang w:val="es-ES"/>
+        </w:rPr>
+        <w:t>Necesito que cuando en los contenidos seleccione la materia, presione el botón editar, al guardar la actualización vuelva a la vista de contenidos con la materia seleccionada previamente, “recordada” y en la vista de los contenidos con los datos actualizados “refrescados”.</w:t>
+      </w:r>
+    </w:p>
+    <w:p>
+      <w:pPr>
+        <w:rPr>
+          <w:lang w:val="es-ES"/>
+        </w:rPr>
+      </w:pPr>
+      <w:r>
+        <w:rPr>
+          <w:b/>
+          <w:lang w:val="es-ES"/>
+        </w:rPr>
+        <w:t xml:space="preserve">Necesito que todos los </w:t>
+      </w:r>
+      <w:proofErr w:type="spellStart"/>
+      <w:proofErr w:type="gramStart"/>
+      <w:r>
+        <w:rPr>
+          <w:b/>
+          <w:lang w:val="es-ES"/>
+        </w:rPr>
+        <w:t>modulos</w:t>
+      </w:r>
+      <w:proofErr w:type="spellEnd"/>
+      <w:r>
+        <w:rPr>
+          <w:b/>
+          <w:lang w:val="es-ES"/>
+        </w:rPr>
+        <w:t xml:space="preserve"> ,</w:t>
+      </w:r>
+      <w:proofErr w:type="gramEnd"/>
+      <w:r>
+        <w:rPr>
+          <w:b/>
+          <w:lang w:val="es-ES"/>
+        </w:rPr>
+        <w:t xml:space="preserve"> salvo el de materias que ya </w:t>
+      </w:r>
+      <w:proofErr w:type="spellStart"/>
+      <w:r>
+        <w:rPr>
+          <w:b/>
+          <w:lang w:val="es-ES"/>
+        </w:rPr>
+        <w:t>esta</w:t>
+      </w:r>
+      <w:proofErr w:type="spellEnd"/>
+      <w:r>
+        <w:rPr>
+          <w:b/>
+          <w:lang w:val="es-ES"/>
+        </w:rPr>
+        <w:t xml:space="preserve"> solucionado, que tengan un botón de </w:t>
+      </w:r>
+      <w:r>
+        <w:rPr>
+          <w:b/>
+          <w:lang w:val="es-ES"/>
+        </w:rPr>
+        <w:t>editar datos, al actualizar regresen a la vista que los invoca recordando la selección que se había realizado en los filtros correspondientes</w:t>
+      </w:r>
+      <w:r>
+        <w:rPr>
+          <w:lang w:val="es-ES"/>
+        </w:rPr>
+        <w:t>.</w:t>
+      </w:r>
+      <w:r>
+        <w:rPr>
+          <w:lang w:val="es-ES"/>
+        </w:rPr>
+        <w:t xml:space="preserve"> </w:t>
+      </w:r>
+    </w:p>
+    <w:p>
+      <w:pPr>
+        <w:rPr>
+          <w:lang w:val="es-ES"/>
+        </w:rPr>
+      </w:pPr>
       <w:bookmarkStart w:id="0" w:name="_GoBack"/>
       <w:r>
         <w:rPr>
-          <w:b/>
-          <w:lang w:val="es-ES"/>
-        </w:rPr>
-        <w:t>Necesito que cuando en los contenidos seleccione la materia, presione el botón editar, al guardar la actualización vuelva a la vista de contenidos con la materia seleccionada previamente, “recordada” y en la vista de los contenidos con los datos actualizados “refrescados”.</w:t>
+          <w:lang w:val="es-ES"/>
+        </w:rPr>
+        <w:t xml:space="preserve">Necesito eliminar de los registros y vistas de los alumnos </w:t>
+      </w:r>
+      <w:proofErr w:type="spellStart"/>
+      <w:r>
+        <w:rPr>
+          <w:lang w:val="es-ES"/>
+        </w:rPr>
+        <w:t>asi</w:t>
+      </w:r>
+      <w:proofErr w:type="spellEnd"/>
+      <w:r>
+        <w:rPr>
+          <w:lang w:val="es-ES"/>
+        </w:rPr>
+        <w:t xml:space="preserve"> como de la estructura de la base de datos, el </w:t>
+      </w:r>
+      <w:proofErr w:type="spellStart"/>
+      <w:r>
+        <w:rPr>
+          <w:lang w:val="es-ES"/>
+        </w:rPr>
+        <w:t>dni</w:t>
+      </w:r>
+      <w:proofErr w:type="spellEnd"/>
+      <w:r>
+        <w:rPr>
+          <w:lang w:val="es-ES"/>
+        </w:rPr>
+        <w:t xml:space="preserve">, el teléfono, el email, necesito que me mantengas todos los otros datos y que </w:t>
+      </w:r>
+      <w:r>
+        <w:rPr>
+          <w:lang w:val="es-ES"/>
+        </w:rPr>
+        <w:lastRenderedPageBreak/>
+        <w:t xml:space="preserve">el sistema cuando doy de alta al alumno, me genere un </w:t>
+      </w:r>
+      <w:proofErr w:type="spellStart"/>
+      <w:r>
+        <w:rPr>
+          <w:lang w:val="es-ES"/>
+        </w:rPr>
+        <w:t>codigo</w:t>
+      </w:r>
+      <w:proofErr w:type="spellEnd"/>
+      <w:r>
+        <w:rPr>
+          <w:lang w:val="es-ES"/>
+        </w:rPr>
+        <w:t xml:space="preserve"> aleatorio, de 8 </w:t>
+      </w:r>
+      <w:proofErr w:type="spellStart"/>
+      <w:r>
+        <w:rPr>
+          <w:lang w:val="es-ES"/>
+        </w:rPr>
+        <w:t>digitos</w:t>
+      </w:r>
+      <w:proofErr w:type="spellEnd"/>
+      <w:r>
+        <w:rPr>
+          <w:lang w:val="es-ES"/>
+        </w:rPr>
+        <w:t xml:space="preserve">, que no se repita, para el alumno y lo asigne como </w:t>
+      </w:r>
+      <w:proofErr w:type="spellStart"/>
+      <w:r>
+        <w:rPr>
+          <w:lang w:val="es-ES"/>
+        </w:rPr>
+        <w:t>codigo</w:t>
+      </w:r>
+      <w:proofErr w:type="spellEnd"/>
+      <w:r>
+        <w:rPr>
+          <w:lang w:val="es-ES"/>
+        </w:rPr>
+        <w:t xml:space="preserve"> de </w:t>
+      </w:r>
+      <w:r>
+        <w:rPr>
+          <w:lang w:val="es-ES"/>
+        </w:rPr>
+        <w:t xml:space="preserve">alumno que todo lo demás quede como </w:t>
+      </w:r>
+      <w:proofErr w:type="spellStart"/>
+      <w:r>
+        <w:rPr>
+          <w:lang w:val="es-ES"/>
+        </w:rPr>
+        <w:t>esta</w:t>
+      </w:r>
+      <w:proofErr w:type="spellEnd"/>
+      <w:r>
+        <w:rPr>
+          <w:lang w:val="es-ES"/>
+        </w:rPr>
+        <w:t xml:space="preserve"> con respecto a los alumnos</w:t>
+      </w:r>
+      <w:r>
+        <w:rPr>
+          <w:lang w:val="es-ES"/>
+        </w:rPr>
+        <w:t>.</w:t>
       </w:r>
     </w:p>
     <w:bookmarkEnd w:id="0"/>
@@ -11176,7 +11366,7 @@
 </file>
 
 <file path=customXml/itemProps1.xml><?xml version="1.0" encoding="utf-8"?>
-<ds:datastoreItem xmlns:ds="http://schemas.openxmlformats.org/officeDocument/2006/customXml" ds:itemID="{B8880946-3B20-42B5-BD1C-F0296E93E788}">
+<ds:datastoreItem xmlns:ds="http://schemas.openxmlformats.org/officeDocument/2006/customXml" ds:itemID="{EEC6709D-97C0-4E0B-BCE4-5FD78170A3C7}">
   <ds:schemaRefs>
     <ds:schemaRef ds:uri="http://schemas.openxmlformats.org/officeDocument/2006/bibliography"/>
   </ds:schemaRefs>

</xml_diff>

<commit_message>
Se incorpora datos para confeccion de anexos para salidas educativas, estos los proporciona la escuela
</commit_message>
<xml_diff>
--- a/requerimientos.docx
+++ b/requerimientos.docx
@@ -7366,118 +7366,139 @@
           <w:lang w:val="es-ES"/>
         </w:rPr>
       </w:pPr>
+      <w:r>
+        <w:rPr>
+          <w:lang w:val="es-ES"/>
+        </w:rPr>
+        <w:lastRenderedPageBreak/>
+        <w:t xml:space="preserve">Necesito </w:t>
+      </w:r>
+      <w:r>
+        <w:rPr>
+          <w:lang w:val="es-ES"/>
+        </w:rPr>
+        <w:t>volver a agregar a</w:t>
+      </w:r>
+      <w:r>
+        <w:rPr>
+          <w:lang w:val="es-ES"/>
+        </w:rPr>
+        <w:t xml:space="preserve"> los registros y vistas de los alumnos </w:t>
+      </w:r>
+      <w:proofErr w:type="spellStart"/>
+      <w:r>
+        <w:rPr>
+          <w:lang w:val="es-ES"/>
+        </w:rPr>
+        <w:t>asi</w:t>
+      </w:r>
+      <w:proofErr w:type="spellEnd"/>
+      <w:r>
+        <w:rPr>
+          <w:lang w:val="es-ES"/>
+        </w:rPr>
+        <w:t xml:space="preserve"> como </w:t>
+      </w:r>
+      <w:r>
+        <w:rPr>
+          <w:lang w:val="es-ES"/>
+        </w:rPr>
+        <w:t>a</w:t>
+      </w:r>
+      <w:r>
+        <w:rPr>
+          <w:lang w:val="es-ES"/>
+        </w:rPr>
+        <w:t xml:space="preserve"> la estructura de la base de datos, el </w:t>
+      </w:r>
+      <w:proofErr w:type="spellStart"/>
+      <w:r>
+        <w:rPr>
+          <w:lang w:val="es-ES"/>
+        </w:rPr>
+        <w:t>dni</w:t>
+      </w:r>
+      <w:proofErr w:type="spellEnd"/>
+      <w:r>
+        <w:rPr>
+          <w:lang w:val="es-ES"/>
+        </w:rPr>
+        <w:t xml:space="preserve">, el teléfono, el email, necesito que me mantengas todos los otros datos y que </w:t>
+      </w:r>
+      <w:r>
+        <w:rPr>
+          <w:lang w:val="es-ES"/>
+        </w:rPr>
+        <w:t xml:space="preserve">elimines del </w:t>
+      </w:r>
+      <w:r>
+        <w:rPr>
+          <w:lang w:val="es-ES"/>
+        </w:rPr>
+        <w:t xml:space="preserve">sistema </w:t>
+      </w:r>
+      <w:r>
+        <w:rPr>
+          <w:lang w:val="es-ES"/>
+        </w:rPr>
+        <w:t xml:space="preserve">el campo </w:t>
+      </w:r>
+      <w:proofErr w:type="spellStart"/>
+      <w:r>
+        <w:rPr>
+          <w:lang w:val="es-ES"/>
+        </w:rPr>
+        <w:t>codigo</w:t>
+      </w:r>
+      <w:proofErr w:type="spellEnd"/>
+      <w:r>
+        <w:rPr>
+          <w:lang w:val="es-ES"/>
+        </w:rPr>
+        <w:t xml:space="preserve">, de 8 </w:t>
+      </w:r>
+      <w:proofErr w:type="spellStart"/>
+      <w:r>
+        <w:rPr>
+          <w:lang w:val="es-ES"/>
+        </w:rPr>
+        <w:t>digitos</w:t>
+      </w:r>
+      <w:proofErr w:type="spellEnd"/>
+      <w:r>
+        <w:rPr>
+          <w:lang w:val="es-ES"/>
+        </w:rPr>
+        <w:t xml:space="preserve">, </w:t>
+      </w:r>
+      <w:r>
+        <w:rPr>
+          <w:lang w:val="es-ES"/>
+        </w:rPr>
+        <w:t>de la base de datos, del alumno</w:t>
+      </w:r>
+      <w:r>
+        <w:rPr>
+          <w:lang w:val="es-ES"/>
+        </w:rPr>
+        <w:t>.</w:t>
+      </w:r>
+    </w:p>
+    <w:p>
+      <w:pPr>
+        <w:rPr>
+          <w:lang w:val="es-ES"/>
+        </w:rPr>
+      </w:pPr>
+      <w:r>
+        <w:rPr>
+          <w:lang w:val="es-ES"/>
+        </w:rPr>
+        <w:t>Necesito que cuando entre a contenidos y seleccione una materia, cada vez que cargue un nuevo contenido recuerde a que materia se lo estoy cargando y me muestre la vista con los datos de esa materia actualizados.</w:t>
+      </w:r>
       <w:bookmarkStart w:id="0" w:name="_GoBack"/>
-      <w:r>
-        <w:rPr>
-          <w:lang w:val="es-ES"/>
-        </w:rPr>
-        <w:t xml:space="preserve">Necesito eliminar de los registros y vistas de los alumnos </w:t>
-      </w:r>
-      <w:proofErr w:type="spellStart"/>
-      <w:r>
-        <w:rPr>
-          <w:lang w:val="es-ES"/>
-        </w:rPr>
-        <w:t>asi</w:t>
-      </w:r>
-      <w:proofErr w:type="spellEnd"/>
-      <w:r>
-        <w:rPr>
-          <w:lang w:val="es-ES"/>
-        </w:rPr>
-        <w:t xml:space="preserve"> como de la estructura de la base de datos, el </w:t>
-      </w:r>
-      <w:proofErr w:type="spellStart"/>
-      <w:r>
-        <w:rPr>
-          <w:lang w:val="es-ES"/>
-        </w:rPr>
-        <w:t>dni</w:t>
-      </w:r>
-      <w:proofErr w:type="spellEnd"/>
-      <w:r>
-        <w:rPr>
-          <w:lang w:val="es-ES"/>
-        </w:rPr>
-        <w:t xml:space="preserve">, el teléfono, el email, necesito que me mantengas todos los otros datos y que </w:t>
-      </w:r>
-      <w:r>
-        <w:rPr>
-          <w:lang w:val="es-ES"/>
-        </w:rPr>
-        <w:lastRenderedPageBreak/>
-        <w:t xml:space="preserve">el sistema cuando doy de alta al alumno, me genere un </w:t>
-      </w:r>
-      <w:proofErr w:type="spellStart"/>
-      <w:r>
-        <w:rPr>
-          <w:lang w:val="es-ES"/>
-        </w:rPr>
-        <w:t>codigo</w:t>
-      </w:r>
-      <w:proofErr w:type="spellEnd"/>
-      <w:r>
-        <w:rPr>
-          <w:lang w:val="es-ES"/>
-        </w:rPr>
-        <w:t xml:space="preserve"> aleatorio, de 8 </w:t>
-      </w:r>
-      <w:proofErr w:type="spellStart"/>
-      <w:r>
-        <w:rPr>
-          <w:lang w:val="es-ES"/>
-        </w:rPr>
-        <w:t>digitos</w:t>
-      </w:r>
-      <w:proofErr w:type="spellEnd"/>
-      <w:r>
-        <w:rPr>
-          <w:lang w:val="es-ES"/>
-        </w:rPr>
-        <w:t xml:space="preserve">, que no se repita, para el alumno y lo asigne como </w:t>
-      </w:r>
-      <w:proofErr w:type="spellStart"/>
-      <w:r>
-        <w:rPr>
-          <w:lang w:val="es-ES"/>
-        </w:rPr>
-        <w:t>codigo</w:t>
-      </w:r>
-      <w:proofErr w:type="spellEnd"/>
-      <w:r>
-        <w:rPr>
-          <w:lang w:val="es-ES"/>
-        </w:rPr>
-        <w:t xml:space="preserve"> de </w:t>
-      </w:r>
-      <w:r>
-        <w:rPr>
-          <w:lang w:val="es-ES"/>
-        </w:rPr>
-        <w:t xml:space="preserve">alumno que todo lo demás quede como </w:t>
-      </w:r>
-      <w:proofErr w:type="spellStart"/>
-      <w:r>
-        <w:rPr>
-          <w:lang w:val="es-ES"/>
-        </w:rPr>
-        <w:t>esta</w:t>
-      </w:r>
-      <w:proofErr w:type="spellEnd"/>
-      <w:r>
-        <w:rPr>
-          <w:lang w:val="es-ES"/>
-        </w:rPr>
-        <w:t xml:space="preserve"> con respecto a los alumnos</w:t>
-      </w:r>
-      <w:r>
-        <w:rPr>
-          <w:lang w:val="es-ES"/>
-        </w:rPr>
-        <w:t>.</w:t>
-      </w:r>
-    </w:p>
-    <w:bookmarkEnd w:id="0"/>
+      <w:bookmarkEnd w:id="0"/>
+    </w:p>
     <w:p>
       <w:pPr>
         <w:rPr>
@@ -11366,7 +11387,7 @@
 </file>
 
 <file path=customXml/itemProps1.xml><?xml version="1.0" encoding="utf-8"?>
-<ds:datastoreItem xmlns:ds="http://schemas.openxmlformats.org/officeDocument/2006/customXml" ds:itemID="{EEC6709D-97C0-4E0B-BCE4-5FD78170A3C7}">
+<ds:datastoreItem xmlns:ds="http://schemas.openxmlformats.org/officeDocument/2006/customXml" ds:itemID="{87E9DC83-E9D3-4FF0-A592-93A102A880D3}">
   <ds:schemaRefs>
     <ds:schemaRef ds:uri="http://schemas.openxmlformats.org/officeDocument/2006/bibliography"/>
   </ds:schemaRefs>

</xml_diff>

<commit_message>
se agrega funcionalidad al dashboard de proxima clase, y card de ubicacion en maps del establecimiento actual
</commit_message>
<xml_diff>
--- a/requerimientos.docx
+++ b/requerimientos.docx
@@ -7363,11 +7363,13 @@
     <w:p>
       <w:pPr>
         <w:rPr>
-          <w:lang w:val="es-ES"/>
-        </w:rPr>
-      </w:pPr>
-      <w:r>
-        <w:rPr>
+          <w:b/>
+          <w:lang w:val="es-ES"/>
+        </w:rPr>
+      </w:pPr>
+      <w:r>
+        <w:rPr>
+          <w:b/>
           <w:lang w:val="es-ES"/>
         </w:rPr>
         <w:lastRenderedPageBreak/>
@@ -7375,12 +7377,14 @@
       </w:r>
       <w:r>
         <w:rPr>
+          <w:b/>
           <w:lang w:val="es-ES"/>
         </w:rPr>
         <w:t>volver a agregar a</w:t>
       </w:r>
       <w:r>
         <w:rPr>
+          <w:b/>
           <w:lang w:val="es-ES"/>
         </w:rPr>
         <w:t xml:space="preserve"> los registros y vistas de los alumnos </w:t>
@@ -7388,6 +7392,7 @@
       <w:proofErr w:type="spellStart"/>
       <w:r>
         <w:rPr>
+          <w:b/>
           <w:lang w:val="es-ES"/>
         </w:rPr>
         <w:t>asi</w:t>
@@ -7395,18 +7400,21 @@
       <w:proofErr w:type="spellEnd"/>
       <w:r>
         <w:rPr>
+          <w:b/>
           <w:lang w:val="es-ES"/>
         </w:rPr>
         <w:t xml:space="preserve"> como </w:t>
       </w:r>
       <w:r>
         <w:rPr>
+          <w:b/>
           <w:lang w:val="es-ES"/>
         </w:rPr>
         <w:t>a</w:t>
       </w:r>
       <w:r>
         <w:rPr>
+          <w:b/>
           <w:lang w:val="es-ES"/>
         </w:rPr>
         <w:t xml:space="preserve"> la estructura de la base de datos, el </w:t>
@@ -7414,6 +7422,7 @@
       <w:proofErr w:type="spellStart"/>
       <w:r>
         <w:rPr>
+          <w:b/>
           <w:lang w:val="es-ES"/>
         </w:rPr>
         <w:t>dni</w:t>
@@ -7421,24 +7430,28 @@
       <w:proofErr w:type="spellEnd"/>
       <w:r>
         <w:rPr>
+          <w:b/>
           <w:lang w:val="es-ES"/>
         </w:rPr>
         <w:t xml:space="preserve">, el teléfono, el email, necesito que me mantengas todos los otros datos y que </w:t>
       </w:r>
       <w:r>
         <w:rPr>
+          <w:b/>
           <w:lang w:val="es-ES"/>
         </w:rPr>
         <w:t xml:space="preserve">elimines del </w:t>
       </w:r>
       <w:r>
         <w:rPr>
+          <w:b/>
           <w:lang w:val="es-ES"/>
         </w:rPr>
         <w:t xml:space="preserve">sistema </w:t>
       </w:r>
       <w:r>
         <w:rPr>
+          <w:b/>
           <w:lang w:val="es-ES"/>
         </w:rPr>
         <w:t xml:space="preserve">el campo </w:t>
@@ -7446,6 +7459,7 @@
       <w:proofErr w:type="spellStart"/>
       <w:r>
         <w:rPr>
+          <w:b/>
           <w:lang w:val="es-ES"/>
         </w:rPr>
         <w:t>codigo</w:t>
@@ -7453,6 +7467,7 @@
       <w:proofErr w:type="spellEnd"/>
       <w:r>
         <w:rPr>
+          <w:b/>
           <w:lang w:val="es-ES"/>
         </w:rPr>
         <w:t xml:space="preserve">, de 8 </w:t>
@@ -7460,6 +7475,7 @@
       <w:proofErr w:type="spellStart"/>
       <w:r>
         <w:rPr>
+          <w:b/>
           <w:lang w:val="es-ES"/>
         </w:rPr>
         <w:t>digitos</w:t>
@@ -7467,18 +7483,21 @@
       <w:proofErr w:type="spellEnd"/>
       <w:r>
         <w:rPr>
+          <w:b/>
           <w:lang w:val="es-ES"/>
         </w:rPr>
         <w:t xml:space="preserve">, </w:t>
       </w:r>
       <w:r>
         <w:rPr>
+          <w:b/>
           <w:lang w:val="es-ES"/>
         </w:rPr>
         <w:t>de la base de datos, del alumno</w:t>
       </w:r>
       <w:r>
         <w:rPr>
+          <w:b/>
           <w:lang w:val="es-ES"/>
         </w:rPr>
         <w:t>.</w:t>
@@ -7487,17 +7506,235 @@
     <w:p>
       <w:pPr>
         <w:rPr>
-          <w:lang w:val="es-ES"/>
-        </w:rPr>
-      </w:pPr>
-      <w:r>
-        <w:rPr>
+          <w:b/>
+          <w:lang w:val="es-ES"/>
+        </w:rPr>
+      </w:pPr>
+      <w:r>
+        <w:rPr>
+          <w:b/>
           <w:lang w:val="es-ES"/>
         </w:rPr>
         <w:t>Necesito que cuando entre a contenidos y seleccione una materia, cada vez que cargue un nuevo contenido recuerde a que materia se lo estoy cargando y me muestre la vista con los datos de esa materia actualizados.</w:t>
+      </w:r>
+    </w:p>
+    <w:p>
+      <w:pPr>
+        <w:rPr>
+          <w:lang w:val="es-ES"/>
+        </w:rPr>
+      </w:pPr>
+      <w:r>
+        <w:rPr>
+          <w:lang w:val="es-ES"/>
+        </w:rPr>
+        <w:t>Necesito q</w:t>
+      </w:r>
+      <w:r>
+        <w:rPr>
+          <w:lang w:val="es-ES"/>
+        </w:rPr>
+        <w:t xml:space="preserve">ue en el dashboard, al card que me muestra el establecimiento, la materia y el curso, le agregues la etiqueta a modo de </w:t>
+      </w:r>
+      <w:proofErr w:type="spellStart"/>
+      <w:r>
+        <w:rPr>
+          <w:lang w:val="es-ES"/>
+        </w:rPr>
+        <w:t>titlulo</w:t>
+      </w:r>
+      <w:proofErr w:type="spellEnd"/>
+      <w:r>
+        <w:rPr>
+          <w:lang w:val="es-ES"/>
+        </w:rPr>
+        <w:t xml:space="preserve">, Clase Actual: y dividiendo el </w:t>
+      </w:r>
+      <w:proofErr w:type="spellStart"/>
+      <w:r>
+        <w:rPr>
+          <w:lang w:val="es-ES"/>
+        </w:rPr>
+        <w:t>row</w:t>
+      </w:r>
+      <w:proofErr w:type="spellEnd"/>
+      <w:r>
+        <w:rPr>
+          <w:lang w:val="es-ES"/>
+        </w:rPr>
+        <w:t xml:space="preserve"> en dos card, me pongas al lado </w:t>
+      </w:r>
+      <w:proofErr w:type="spellStart"/>
+      <w:r>
+        <w:rPr>
+          <w:lang w:val="es-ES"/>
+        </w:rPr>
+        <w:t>lo</w:t>
+      </w:r>
+      <w:proofErr w:type="spellEnd"/>
+      <w:r>
+        <w:rPr>
+          <w:lang w:val="es-ES"/>
+        </w:rPr>
+        <w:t xml:space="preserve"> mismos datos en otro card, pero de mi próxima clase con el </w:t>
+      </w:r>
+      <w:proofErr w:type="spellStart"/>
+      <w:r>
+        <w:rPr>
+          <w:lang w:val="es-ES"/>
+        </w:rPr>
+        <w:t>titulo</w:t>
+      </w:r>
+      <w:proofErr w:type="spellEnd"/>
+      <w:r>
+        <w:rPr>
+          <w:lang w:val="es-ES"/>
+        </w:rPr>
+        <w:t xml:space="preserve"> </w:t>
+      </w:r>
+      <w:proofErr w:type="spellStart"/>
+      <w:r>
+        <w:rPr>
+          <w:lang w:val="es-ES"/>
+        </w:rPr>
+        <w:t>Proxima</w:t>
+      </w:r>
+      <w:proofErr w:type="spellEnd"/>
+      <w:r>
+        <w:rPr>
+          <w:lang w:val="es-ES"/>
+        </w:rPr>
+        <w:t xml:space="preserve"> Clase: establecimiento, materia y curso.</w:t>
+      </w:r>
+    </w:p>
+    <w:p>
+      <w:pPr>
+        <w:rPr>
+          <w:lang w:val="es-ES"/>
+        </w:rPr>
+      </w:pPr>
+      <w:r>
+        <w:rPr>
+          <w:lang w:val="es-ES"/>
+        </w:rPr>
+        <w:t xml:space="preserve">Necesito que me dividas </w:t>
+      </w:r>
+      <w:r>
+        <w:rPr>
+          <w:lang w:val="es-ES"/>
+        </w:rPr>
+        <w:t xml:space="preserve">la línea con </w:t>
+      </w:r>
+      <w:r>
+        <w:rPr>
+          <w:lang w:val="es-ES"/>
+        </w:rPr>
+        <w:t xml:space="preserve">los card donde </w:t>
+      </w:r>
+      <w:proofErr w:type="spellStart"/>
+      <w:r>
+        <w:rPr>
+          <w:lang w:val="es-ES"/>
+        </w:rPr>
+        <w:t>esta</w:t>
+      </w:r>
+      <w:proofErr w:type="spellEnd"/>
+      <w:r>
+        <w:rPr>
+          <w:lang w:val="es-ES"/>
+        </w:rPr>
+        <w:t xml:space="preserve"> el reloj en color azul, el calendario escolar y me agregues un card con el mapa de </w:t>
+      </w:r>
+      <w:proofErr w:type="spellStart"/>
+      <w:r>
+        <w:rPr>
+          <w:lang w:val="es-ES"/>
+        </w:rPr>
+        <w:t>google</w:t>
+      </w:r>
+      <w:proofErr w:type="spellEnd"/>
+      <w:r>
+        <w:rPr>
+          <w:lang w:val="es-ES"/>
+        </w:rPr>
+        <w:t xml:space="preserve"> </w:t>
+      </w:r>
+      <w:proofErr w:type="spellStart"/>
+      <w:r>
+        <w:rPr>
+          <w:lang w:val="es-ES"/>
+        </w:rPr>
+        <w:t>maps</w:t>
+      </w:r>
+      <w:proofErr w:type="spellEnd"/>
+      <w:r>
+        <w:rPr>
+          <w:lang w:val="es-ES"/>
+        </w:rPr>
+        <w:t xml:space="preserve"> donde </w:t>
+      </w:r>
+      <w:proofErr w:type="spellStart"/>
+      <w:r>
+        <w:rPr>
+          <w:lang w:val="es-ES"/>
+        </w:rPr>
+        <w:t>esta</w:t>
+      </w:r>
+      <w:proofErr w:type="spellEnd"/>
+      <w:r>
+        <w:rPr>
+          <w:lang w:val="es-ES"/>
+        </w:rPr>
+        <w:t xml:space="preserve"> el establecimiento, para ello debes tomar los datos de </w:t>
+      </w:r>
+      <w:r>
+        <w:rPr>
+          <w:lang w:val="es-ES"/>
+        </w:rPr>
+        <w:t xml:space="preserve">la </w:t>
+      </w:r>
+      <w:r>
+        <w:rPr>
+          <w:lang w:val="es-ES"/>
+        </w:rPr>
+        <w:t>tabla de establecimientos</w:t>
       </w:r>
       <w:bookmarkStart w:id="0" w:name="_GoBack"/>
       <w:bookmarkEnd w:id="0"/>
+      <w:r>
+        <w:rPr>
+          <w:lang w:val="es-ES"/>
+        </w:rPr>
+        <w:t xml:space="preserve">, done se guarda, </w:t>
+      </w:r>
+      <w:proofErr w:type="spellStart"/>
+      <w:r>
+        <w:rPr>
+          <w:lang w:val="es-ES"/>
+        </w:rPr>
+        <w:t>Denominacion</w:t>
+      </w:r>
+      <w:proofErr w:type="spellEnd"/>
+      <w:r>
+        <w:rPr>
+          <w:lang w:val="es-ES"/>
+        </w:rPr>
+        <w:t xml:space="preserve">, Nombre, Domicilio, </w:t>
+      </w:r>
+      <w:proofErr w:type="spellStart"/>
+      <w:r>
+        <w:rPr>
+          <w:lang w:val="es-ES"/>
+        </w:rPr>
+        <w:t>Telefono</w:t>
+      </w:r>
+      <w:proofErr w:type="spellEnd"/>
+      <w:r>
+        <w:rPr>
+          <w:lang w:val="es-ES"/>
+        </w:rPr>
+        <w:t xml:space="preserve">. </w:t>
+      </w:r>
     </w:p>
     <w:p>
       <w:pPr>
@@ -11387,7 +11624,7 @@
 </file>
 
 <file path=customXml/itemProps1.xml><?xml version="1.0" encoding="utf-8"?>
-<ds:datastoreItem xmlns:ds="http://schemas.openxmlformats.org/officeDocument/2006/customXml" ds:itemID="{87E9DC83-E9D3-4FF0-A592-93A102A880D3}">
+<ds:datastoreItem xmlns:ds="http://schemas.openxmlformats.org/officeDocument/2006/customXml" ds:itemID="{61F84AE3-900E-43BD-9F48-8970C0FF204B}">
   <ds:schemaRefs>
     <ds:schemaRef ds:uri="http://schemas.openxmlformats.org/officeDocument/2006/bibliography"/>
   </ds:schemaRefs>

</xml_diff>

<commit_message>
se corrigen problemas de mostrado de datos de un usuario a otro
</commit_message>
<xml_diff>
--- a/requerimientos.docx
+++ b/requerimientos.docx
@@ -7521,24 +7521,21 @@
     <w:p>
       <w:pPr>
         <w:rPr>
-          <w:lang w:val="es-ES"/>
-        </w:rPr>
-      </w:pPr>
-      <w:r>
-        <w:rPr>
-          <w:lang w:val="es-ES"/>
-        </w:rPr>
-        <w:t>Necesito q</w:t>
-      </w:r>
-      <w:r>
-        <w:rPr>
-          <w:lang w:val="es-ES"/>
-        </w:rPr>
-        <w:t xml:space="preserve">ue en el dashboard, al card que me muestra el establecimiento, la materia y el curso, le agregues la etiqueta a modo de </w:t>
+          <w:b/>
+          <w:lang w:val="es-ES"/>
+        </w:rPr>
+      </w:pPr>
+      <w:r>
+        <w:rPr>
+          <w:b/>
+          <w:lang w:val="es-ES"/>
+        </w:rPr>
+        <w:t xml:space="preserve">Necesito que en el dashboard, al card que me muestra el establecimiento, la materia y el curso, le agregues la etiqueta a modo de </w:t>
       </w:r>
       <w:proofErr w:type="spellStart"/>
       <w:r>
         <w:rPr>
+          <w:b/>
           <w:lang w:val="es-ES"/>
         </w:rPr>
         <w:t>titlulo</w:t>
@@ -7546,6 +7543,7 @@
       <w:proofErr w:type="spellEnd"/>
       <w:r>
         <w:rPr>
+          <w:b/>
           <w:lang w:val="es-ES"/>
         </w:rPr>
         <w:t xml:space="preserve">, Clase Actual: y dividiendo el </w:t>
@@ -7553,6 +7551,7 @@
       <w:proofErr w:type="spellStart"/>
       <w:r>
         <w:rPr>
+          <w:b/>
           <w:lang w:val="es-ES"/>
         </w:rPr>
         <w:t>row</w:t>
@@ -7560,6 +7559,7 @@
       <w:proofErr w:type="spellEnd"/>
       <w:r>
         <w:rPr>
+          <w:b/>
           <w:lang w:val="es-ES"/>
         </w:rPr>
         <w:t xml:space="preserve"> en dos card, me pongas al lado </w:t>
@@ -7567,6 +7567,7 @@
       <w:proofErr w:type="spellStart"/>
       <w:r>
         <w:rPr>
+          <w:b/>
           <w:lang w:val="es-ES"/>
         </w:rPr>
         <w:t>lo</w:t>
@@ -7574,6 +7575,7 @@
       <w:proofErr w:type="spellEnd"/>
       <w:r>
         <w:rPr>
+          <w:b/>
           <w:lang w:val="es-ES"/>
         </w:rPr>
         <w:t xml:space="preserve"> mismos datos en otro card, pero de mi próxima clase con el </w:t>
@@ -7581,6 +7583,7 @@
       <w:proofErr w:type="spellStart"/>
       <w:r>
         <w:rPr>
+          <w:b/>
           <w:lang w:val="es-ES"/>
         </w:rPr>
         <w:t>titulo</w:t>
@@ -7588,6 +7591,7 @@
       <w:proofErr w:type="spellEnd"/>
       <w:r>
         <w:rPr>
+          <w:b/>
           <w:lang w:val="es-ES"/>
         </w:rPr>
         <w:t xml:space="preserve"> </w:t>
@@ -7595,6 +7599,7 @@
       <w:proofErr w:type="spellStart"/>
       <w:r>
         <w:rPr>
+          <w:b/>
           <w:lang w:val="es-ES"/>
         </w:rPr>
         <w:t>Proxima</w:t>
@@ -7602,6 +7607,7 @@
       <w:proofErr w:type="spellEnd"/>
       <w:r>
         <w:rPr>
+          <w:b/>
           <w:lang w:val="es-ES"/>
         </w:rPr>
         <w:t xml:space="preserve"> Clase: establecimiento, materia y curso.</w:t>
@@ -7610,23 +7616,27 @@
     <w:p>
       <w:pPr>
         <w:rPr>
-          <w:lang w:val="es-ES"/>
-        </w:rPr>
-      </w:pPr>
-      <w:r>
-        <w:rPr>
+          <w:b/>
+          <w:lang w:val="es-ES"/>
+        </w:rPr>
+      </w:pPr>
+      <w:r>
+        <w:rPr>
+          <w:b/>
           <w:lang w:val="es-ES"/>
         </w:rPr>
         <w:t xml:space="preserve">Necesito que me dividas </w:t>
       </w:r>
       <w:r>
         <w:rPr>
+          <w:b/>
           <w:lang w:val="es-ES"/>
         </w:rPr>
         <w:t xml:space="preserve">la línea con </w:t>
       </w:r>
       <w:r>
         <w:rPr>
+          <w:b/>
           <w:lang w:val="es-ES"/>
         </w:rPr>
         <w:t xml:space="preserve">los card donde </w:t>
@@ -7634,6 +7644,7 @@
       <w:proofErr w:type="spellStart"/>
       <w:r>
         <w:rPr>
+          <w:b/>
           <w:lang w:val="es-ES"/>
         </w:rPr>
         <w:t>esta</w:t>
@@ -7641,6 +7652,7 @@
       <w:proofErr w:type="spellEnd"/>
       <w:r>
         <w:rPr>
+          <w:b/>
           <w:lang w:val="es-ES"/>
         </w:rPr>
         <w:t xml:space="preserve"> el reloj en color azul, el calendario escolar y me agregues un card con el mapa de </w:t>
@@ -7648,6 +7660,7 @@
       <w:proofErr w:type="spellStart"/>
       <w:r>
         <w:rPr>
+          <w:b/>
           <w:lang w:val="es-ES"/>
         </w:rPr>
         <w:t>google</w:t>
@@ -7655,6 +7668,7 @@
       <w:proofErr w:type="spellEnd"/>
       <w:r>
         <w:rPr>
+          <w:b/>
           <w:lang w:val="es-ES"/>
         </w:rPr>
         <w:t xml:space="preserve"> </w:t>
@@ -7662,6 +7676,7 @@
       <w:proofErr w:type="spellStart"/>
       <w:r>
         <w:rPr>
+          <w:b/>
           <w:lang w:val="es-ES"/>
         </w:rPr>
         <w:t>maps</w:t>
@@ -7669,6 +7684,7 @@
       <w:proofErr w:type="spellEnd"/>
       <w:r>
         <w:rPr>
+          <w:b/>
           <w:lang w:val="es-ES"/>
         </w:rPr>
         <w:t xml:space="preserve"> donde </w:t>
@@ -7676,6 +7692,7 @@
       <w:proofErr w:type="spellStart"/>
       <w:r>
         <w:rPr>
+          <w:b/>
           <w:lang w:val="es-ES"/>
         </w:rPr>
         <w:t>esta</w:t>
@@ -7683,59 +7700,298 @@
       <w:proofErr w:type="spellEnd"/>
       <w:r>
         <w:rPr>
+          <w:b/>
           <w:lang w:val="es-ES"/>
         </w:rPr>
         <w:t xml:space="preserve"> el establecimiento, para ello debes tomar los datos de </w:t>
       </w:r>
       <w:r>
         <w:rPr>
+          <w:b/>
           <w:lang w:val="es-ES"/>
         </w:rPr>
         <w:t xml:space="preserve">la </w:t>
       </w:r>
       <w:r>
         <w:rPr>
-          <w:lang w:val="es-ES"/>
-        </w:rPr>
-        <w:t>tabla de establecimientos</w:t>
-      </w:r>
+          <w:b/>
+          <w:lang w:val="es-ES"/>
+        </w:rPr>
+        <w:t xml:space="preserve">tabla de establecimientos, done se guarda, </w:t>
+      </w:r>
+      <w:proofErr w:type="spellStart"/>
+      <w:r>
+        <w:rPr>
+          <w:b/>
+          <w:lang w:val="es-ES"/>
+        </w:rPr>
+        <w:t>Denominacion</w:t>
+      </w:r>
+      <w:proofErr w:type="spellEnd"/>
+      <w:r>
+        <w:rPr>
+          <w:b/>
+          <w:lang w:val="es-ES"/>
+        </w:rPr>
+        <w:t xml:space="preserve">, Nombre, Domicilio, </w:t>
+      </w:r>
+      <w:proofErr w:type="spellStart"/>
+      <w:r>
+        <w:rPr>
+          <w:b/>
+          <w:lang w:val="es-ES"/>
+        </w:rPr>
+        <w:t>Telefono</w:t>
+      </w:r>
+      <w:proofErr w:type="spellEnd"/>
+      <w:r>
+        <w:rPr>
+          <w:b/>
+          <w:lang w:val="es-ES"/>
+        </w:rPr>
+        <w:t xml:space="preserve">. </w:t>
+      </w:r>
+    </w:p>
+    <w:p>
+      <w:pPr>
+        <w:rPr>
+          <w:b/>
+          <w:lang w:val="es-ES"/>
+        </w:rPr>
+      </w:pPr>
+      <w:r>
+        <w:rPr>
+          <w:b/>
+          <w:lang w:val="es-ES"/>
+        </w:rPr>
+        <w:t xml:space="preserve">Necesito que en la card </w:t>
+      </w:r>
+      <w:r>
+        <w:rPr>
+          <w:b/>
+          <w:lang w:val="es-ES"/>
+        </w:rPr>
+        <w:t>Próximo</w:t>
+      </w:r>
+      <w:r>
+        <w:rPr>
+          <w:b/>
+          <w:lang w:val="es-ES"/>
+        </w:rPr>
+        <w:t xml:space="preserve"> establecimiento: </w:t>
+      </w:r>
+      <w:r>
+        <w:rPr>
+          <w:b/>
+          <w:lang w:val="es-ES"/>
+        </w:rPr>
+        <w:t xml:space="preserve">me </w:t>
+      </w:r>
+      <w:r>
+        <w:rPr>
+          <w:b/>
+          <w:lang w:val="es-ES"/>
+        </w:rPr>
+        <w:t xml:space="preserve">muestre desde la base de datos </w:t>
+      </w:r>
+      <w:r>
+        <w:rPr>
+          <w:b/>
+          <w:lang w:val="es-ES"/>
+        </w:rPr>
+        <w:t xml:space="preserve">a que escuela y curso debo ir a </w:t>
+      </w:r>
+      <w:r>
+        <w:rPr>
+          <w:b/>
+          <w:lang w:val="es-ES"/>
+        </w:rPr>
+        <w:t>continuación</w:t>
+      </w:r>
+      <w:r>
+        <w:rPr>
+          <w:b/>
+          <w:lang w:val="es-ES"/>
+        </w:rPr>
+        <w:t>.</w:t>
+      </w:r>
+    </w:p>
+    <w:p>
+      <w:pPr>
+        <w:rPr>
+          <w:b/>
+          <w:lang w:val="es-ES"/>
+        </w:rPr>
+      </w:pPr>
+      <w:r>
+        <w:rPr>
+          <w:b/>
+          <w:lang w:val="es-ES"/>
+        </w:rPr>
+        <w:t xml:space="preserve">Necesito que de la card de listado de estudiantes </w:t>
+      </w:r>
+      <w:r>
+        <w:rPr>
+          <w:b/>
+          <w:lang w:val="es-ES"/>
+        </w:rPr>
+        <w:t xml:space="preserve">del dashboard </w:t>
+      </w:r>
+      <w:r>
+        <w:rPr>
+          <w:b/>
+          <w:lang w:val="es-ES"/>
+        </w:rPr>
+        <w:t xml:space="preserve">me saques el </w:t>
+      </w:r>
+      <w:proofErr w:type="spellStart"/>
+      <w:r>
+        <w:rPr>
+          <w:b/>
+          <w:lang w:val="es-ES"/>
+        </w:rPr>
+        <w:t>titulo</w:t>
+      </w:r>
+      <w:proofErr w:type="spellEnd"/>
+      <w:r>
+        <w:rPr>
+          <w:b/>
+          <w:lang w:val="es-ES"/>
+        </w:rPr>
+        <w:t xml:space="preserve"> de materia, </w:t>
+      </w:r>
+      <w:proofErr w:type="spellStart"/>
+      <w:r>
+        <w:rPr>
+          <w:b/>
+          <w:lang w:val="es-ES"/>
+        </w:rPr>
+        <w:t>cursohorario</w:t>
+      </w:r>
+      <w:proofErr w:type="spellEnd"/>
+      <w:r>
+        <w:rPr>
+          <w:b/>
+          <w:lang w:val="es-ES"/>
+        </w:rPr>
+        <w:t xml:space="preserve"> y establecimiento, que solo me muestre la lista de estudiantes, y que los botones de acción sean </w:t>
+      </w:r>
+      <w:proofErr w:type="spellStart"/>
+      <w:r>
+        <w:rPr>
+          <w:b/>
+          <w:lang w:val="es-ES"/>
+        </w:rPr>
+        <w:t>mas</w:t>
+      </w:r>
+      <w:proofErr w:type="spellEnd"/>
+      <w:r>
+        <w:rPr>
+          <w:b/>
+          <w:lang w:val="es-ES"/>
+        </w:rPr>
+        <w:t xml:space="preserve"> anchos</w:t>
+      </w:r>
+      <w:r>
+        <w:rPr>
+          <w:b/>
+          <w:lang w:val="es-ES"/>
+        </w:rPr>
+        <w:t xml:space="preserve"> </w:t>
+      </w:r>
+      <w:proofErr w:type="spellStart"/>
+      <w:r>
+        <w:rPr>
+          <w:b/>
+          <w:lang w:val="es-ES"/>
+        </w:rPr>
+        <w:t>aprox</w:t>
+      </w:r>
+      <w:proofErr w:type="spellEnd"/>
+      <w:r>
+        <w:rPr>
+          <w:b/>
+          <w:lang w:val="es-ES"/>
+        </w:rPr>
+        <w:t xml:space="preserve"> del ancho del </w:t>
+      </w:r>
+      <w:proofErr w:type="spellStart"/>
+      <w:r>
+        <w:rPr>
+          <w:b/>
+          <w:lang w:val="es-ES"/>
+        </w:rPr>
+        <w:t>titulo</w:t>
+      </w:r>
+      <w:proofErr w:type="spellEnd"/>
+      <w:r>
+        <w:rPr>
+          <w:b/>
+          <w:lang w:val="es-ES"/>
+        </w:rPr>
+        <w:t xml:space="preserve"> de la columna en la que se encuentran</w:t>
+      </w:r>
+      <w:r>
+        <w:rPr>
+          <w:b/>
+          <w:lang w:val="es-ES"/>
+        </w:rPr>
+        <w:t xml:space="preserve"> y con relleno de color, el icono en líneas blancas.</w:t>
+      </w:r>
+    </w:p>
+    <w:p>
+      <w:pPr>
+        <w:rPr>
+          <w:b/>
+          <w:lang w:val="es-ES"/>
+        </w:rPr>
+      </w:pPr>
+      <w:r>
+        <w:rPr>
+          <w:b/>
+          <w:lang w:val="es-ES"/>
+        </w:rPr>
+        <w:t>Necesito que los establecimientos</w:t>
+      </w:r>
+      <w:r>
+        <w:rPr>
+          <w:b/>
+          <w:lang w:val="es-ES"/>
+        </w:rPr>
+        <w:t xml:space="preserve"> que los cards de </w:t>
+      </w:r>
+      <w:proofErr w:type="spellStart"/>
+      <w:r>
+        <w:rPr>
+          <w:b/>
+          <w:lang w:val="es-ES"/>
+        </w:rPr>
+        <w:t>Proximo</w:t>
+      </w:r>
+      <w:proofErr w:type="spellEnd"/>
+      <w:r>
+        <w:rPr>
+          <w:b/>
+          <w:lang w:val="es-ES"/>
+        </w:rPr>
+        <w:t xml:space="preserve"> establecimiento y el de la ubicación me muestren la información de cada usuario. Y no la de otros usuarios, como el resto del sistema.</w:t>
+      </w:r>
+    </w:p>
+    <w:p>
+      <w:pPr>
+        <w:rPr>
+          <w:lang w:val="es-ES"/>
+        </w:rPr>
+      </w:pPr>
       <w:bookmarkStart w:id="0" w:name="_GoBack"/>
-      <w:bookmarkEnd w:id="0"/>
-      <w:r>
-        <w:rPr>
-          <w:lang w:val="es-ES"/>
-        </w:rPr>
-        <w:t xml:space="preserve">, done se guarda, </w:t>
-      </w:r>
-      <w:proofErr w:type="spellStart"/>
-      <w:r>
-        <w:rPr>
-          <w:lang w:val="es-ES"/>
-        </w:rPr>
-        <w:t>Denominacion</w:t>
-      </w:r>
-      <w:proofErr w:type="spellEnd"/>
-      <w:r>
-        <w:rPr>
-          <w:lang w:val="es-ES"/>
-        </w:rPr>
-        <w:t xml:space="preserve">, Nombre, Domicilio, </w:t>
-      </w:r>
-      <w:proofErr w:type="spellStart"/>
-      <w:r>
-        <w:rPr>
-          <w:lang w:val="es-ES"/>
-        </w:rPr>
-        <w:t>Telefono</w:t>
-      </w:r>
-      <w:proofErr w:type="spellEnd"/>
-      <w:r>
-        <w:rPr>
-          <w:lang w:val="es-ES"/>
-        </w:rPr>
-        <w:t xml:space="preserve">. </w:t>
-      </w:r>
-    </w:p>
+      <w:r>
+        <w:rPr>
+          <w:lang w:val="es-ES"/>
+        </w:rPr>
+        <w:t>Corregir error al intentar cargar niveles educativos</w:t>
+      </w:r>
+    </w:p>
+    <w:bookmarkEnd w:id="0"/>
     <w:p>
       <w:pPr>
         <w:rPr>
@@ -11624,7 +11880,7 @@
 </file>
 
 <file path=customXml/itemProps1.xml><?xml version="1.0" encoding="utf-8"?>
-<ds:datastoreItem xmlns:ds="http://schemas.openxmlformats.org/officeDocument/2006/customXml" ds:itemID="{61F84AE3-900E-43BD-9F48-8970C0FF204B}">
+<ds:datastoreItem xmlns:ds="http://schemas.openxmlformats.org/officeDocument/2006/customXml" ds:itemID="{4696AB7F-2809-431B-BFE0-F9BBFDD8AEF5}">
   <ds:schemaRefs>
     <ds:schemaRef ds:uri="http://schemas.openxmlformats.org/officeDocument/2006/bibliography"/>
   </ds:schemaRefs>

</xml_diff>

<commit_message>
se modifican menus e items de menus, se colocan divisores se re acomodan categorias
</commit_message>
<xml_diff>
--- a/requerimientos.docx
+++ b/requerimientos.docx
@@ -7980,18 +7980,153 @@
     <w:p>
       <w:pPr>
         <w:rPr>
+          <w:b/>
+          <w:lang w:val="es-ES"/>
+        </w:rPr>
+      </w:pPr>
+      <w:r>
+        <w:rPr>
+          <w:b/>
+          <w:lang w:val="es-ES"/>
+        </w:rPr>
+        <w:t>Corregir error al intentar cargar niveles educativos</w:t>
+      </w:r>
+    </w:p>
+    <w:p>
+      <w:pPr>
+        <w:rPr>
+          <w:lang w:val="es-ES"/>
+        </w:rPr>
+      </w:pPr>
+      <w:r>
+        <w:rPr>
+          <w:lang w:val="es-ES"/>
+        </w:rPr>
+        <w:t xml:space="preserve">Necesito que cuando registro la asistencia se acuerde de la materia y el curso, y me muestre el listado de estudiantes, con un pequeño resumen en la parte superior de presentes, ausentes, ausentes justificados, y tarde en el </w:t>
+      </w:r>
+      <w:proofErr w:type="spellStart"/>
+      <w:r>
+        <w:rPr>
+          <w:lang w:val="es-ES"/>
+        </w:rPr>
+        <w:t>dia</w:t>
+      </w:r>
+      <w:proofErr w:type="spellEnd"/>
+      <w:r>
+        <w:rPr>
+          <w:lang w:val="es-ES"/>
+        </w:rPr>
+        <w:t xml:space="preserve"> actual. </w:t>
+      </w:r>
+    </w:p>
+    <w:p>
+      <w:pPr>
+        <w:rPr>
+          <w:lang w:val="es-ES"/>
+        </w:rPr>
+      </w:pPr>
+      <w:r>
+        <w:rPr>
+          <w:lang w:val="es-ES"/>
+        </w:rPr>
+        <w:t>Necesito</w:t>
+      </w:r>
+      <w:r>
+        <w:rPr>
+          <w:lang w:val="es-ES"/>
+        </w:rPr>
+        <w:t xml:space="preserve"> que cuando le ponga volver en la vista de registro de asistencia, también se acuerde de la materia y curso seleccionada.</w:t>
+      </w:r>
+    </w:p>
+    <w:p>
+      <w:pPr>
+        <w:rPr>
+          <w:b/>
           <w:lang w:val="es-ES"/>
         </w:rPr>
       </w:pPr>
       <w:bookmarkStart w:id="0" w:name="_GoBack"/>
       <w:r>
         <w:rPr>
-          <w:lang w:val="es-ES"/>
-        </w:rPr>
-        <w:t>Corregir error al intentar cargar niveles educativos</w:t>
+          <w:b/>
+          <w:lang w:val="es-ES"/>
+        </w:rPr>
+        <w:t>Necesito que tomar asistencia del menú Actividad áulica se pase a llamar Asistencia.</w:t>
       </w:r>
     </w:p>
     <w:bookmarkEnd w:id="0"/>
+    <w:p>
+      <w:pPr>
+        <w:rPr>
+          <w:lang w:val="es-ES"/>
+        </w:rPr>
+      </w:pPr>
+      <w:r>
+        <w:rPr>
+          <w:lang w:val="es-ES"/>
+        </w:rPr>
+        <w:t xml:space="preserve">Necesito que en asistencia, al presionar Ver historial me pida el curso como hasta ahora y que me pida una fecha de inicio y una fecha de fin en el informe, y que me permita seleccionar todo el curso o un estudiante en particular. Que el informe incluya un resumen de asistencias, ausentes, ausentes justificados, y llegadas tardes con la </w:t>
+      </w:r>
+      <w:proofErr w:type="spellStart"/>
+      <w:r>
+        <w:rPr>
+          <w:lang w:val="es-ES"/>
+        </w:rPr>
+        <w:t>hs</w:t>
+      </w:r>
+      <w:proofErr w:type="spellEnd"/>
+      <w:r>
+        <w:rPr>
+          <w:lang w:val="es-ES"/>
+        </w:rPr>
+        <w:t xml:space="preserve"> de llegada,</w:t>
+      </w:r>
+      <w:r>
+        <w:rPr>
+          <w:lang w:val="es-ES"/>
+        </w:rPr>
+        <w:t xml:space="preserve"> tanto en el caso de ser un alumno en particular solicitado o el curso en total, </w:t>
+      </w:r>
+      <w:r>
+        <w:rPr>
+          <w:lang w:val="es-ES"/>
+        </w:rPr>
+        <w:t xml:space="preserve">Respetando los parámetros de fecha, que al </w:t>
+      </w:r>
+      <w:r>
+        <w:rPr>
+          <w:lang w:val="es-ES"/>
+        </w:rPr>
+        <w:t xml:space="preserve">presionar el botón </w:t>
+      </w:r>
+      <w:r>
+        <w:rPr>
+          <w:lang w:val="es-ES"/>
+        </w:rPr>
+        <w:t>volver del informe recuerde los parámetros seleccionados.</w:t>
+      </w:r>
+    </w:p>
+    <w:p>
+      <w:pPr>
+        <w:rPr>
+          <w:lang w:val="es-ES"/>
+        </w:rPr>
+      </w:pPr>
+      <w:r>
+        <w:rPr>
+          <w:lang w:val="es-ES"/>
+        </w:rPr>
+        <w:lastRenderedPageBreak/>
+        <w:t>Corregir el error al buscar de manera individual las asistencias por alumno. Y que al presionar el botón volver de asistencias por alumno que recuerde materia y curso.</w:t>
+      </w:r>
+    </w:p>
+    <w:p>
+      <w:pPr>
+        <w:rPr>
+          <w:lang w:val="es-ES"/>
+        </w:rPr>
+      </w:pPr>
+    </w:p>
     <w:p>
       <w:pPr>
         <w:rPr>
@@ -11880,7 +12015,7 @@
 </file>
 
 <file path=customXml/itemProps1.xml><?xml version="1.0" encoding="utf-8"?>
-<ds:datastoreItem xmlns:ds="http://schemas.openxmlformats.org/officeDocument/2006/customXml" ds:itemID="{4696AB7F-2809-431B-BFE0-F9BBFDD8AEF5}">
+<ds:datastoreItem xmlns:ds="http://schemas.openxmlformats.org/officeDocument/2006/customXml" ds:itemID="{D9FF5E23-8247-43B2-AB6B-09AEEA2D7E73}">
   <ds:schemaRefs>
     <ds:schemaRef ds:uri="http://schemas.openxmlformats.org/officeDocument/2006/bibliography"/>
   </ds:schemaRefs>

</xml_diff>

<commit_message>
se corrigen errores, se modifica dasboard con datos por estudiante y se agregan graficos de tendencia del curso actual
</commit_message>
<xml_diff>
--- a/requerimientos.docx
+++ b/requerimientos.docx
@@ -8045,7 +8045,6 @@
           <w:lang w:val="es-ES"/>
         </w:rPr>
       </w:pPr>
-      <w:bookmarkStart w:id="0" w:name="_GoBack"/>
       <w:r>
         <w:rPr>
           <w:b/>
@@ -8054,7 +8053,6 @@
         <w:t>Necesito que tomar asistencia del menú Actividad áulica se pase a llamar Asistencia.</w:t>
       </w:r>
     </w:p>
-    <w:bookmarkEnd w:id="0"/>
     <w:p>
       <w:pPr>
         <w:rPr>
@@ -8119,6 +8117,240 @@
         <w:lastRenderedPageBreak/>
         <w:t>Corregir el error al buscar de manera individual las asistencias por alumno. Y que al presionar el botón volver de asistencias por alumno que recuerde materia y curso.</w:t>
       </w:r>
+    </w:p>
+    <w:p>
+      <w:pPr>
+        <w:rPr>
+          <w:lang w:val="es-ES"/>
+        </w:rPr>
+      </w:pPr>
+      <w:r>
+        <w:rPr>
+          <w:lang w:val="es-ES"/>
+        </w:rPr>
+        <w:t>Necesito un crud que me permita guardar proyectos, fecha, hora, titulo</w:t>
+      </w:r>
+      <w:r>
+        <w:rPr>
+          <w:lang w:val="es-ES"/>
+        </w:rPr>
+        <w:t>, establecimiento donde se presenta, fecha presentación, observaciones.</w:t>
+      </w:r>
+    </w:p>
+    <w:p>
+      <w:pPr>
+        <w:rPr>
+          <w:lang w:val="es-ES"/>
+        </w:rPr>
+      </w:pPr>
+      <w:r>
+        <w:rPr>
+          <w:lang w:val="es-ES"/>
+        </w:rPr>
+        <w:t xml:space="preserve">Necesito que cuando se genere automáticamente una </w:t>
+      </w:r>
+      <w:proofErr w:type="spellStart"/>
+      <w:r>
+        <w:rPr>
+          <w:lang w:val="es-ES"/>
+        </w:rPr>
+        <w:t>activdad</w:t>
+      </w:r>
+      <w:proofErr w:type="spellEnd"/>
+      <w:r>
+        <w:rPr>
+          <w:lang w:val="es-ES"/>
+        </w:rPr>
+        <w:t xml:space="preserve"> por proyecto, automáticamente se inicie una carpeta de campo</w:t>
+      </w:r>
+    </w:p>
+    <w:p>
+      <w:pPr>
+        <w:rPr>
+          <w:lang w:val="es-ES"/>
+        </w:rPr>
+      </w:pPr>
+      <w:r>
+        <w:rPr>
+          <w:lang w:val="es-ES"/>
+        </w:rPr>
+        <w:t xml:space="preserve">Necesito que en el dashboard, el listado de estudiantes, en </w:t>
+      </w:r>
+      <w:proofErr w:type="spellStart"/>
+      <w:r>
+        <w:rPr>
+          <w:lang w:val="es-ES"/>
+        </w:rPr>
+        <w:t>ves</w:t>
+      </w:r>
+      <w:proofErr w:type="spellEnd"/>
+      <w:r>
+        <w:rPr>
+          <w:lang w:val="es-ES"/>
+        </w:rPr>
+        <w:t xml:space="preserve"> de los botones me muestre para cada estudiante, en su correspondiente renglón de la tabla, y con diferentes colores , la cantidad de presentes que tiene ese alumno, la cantidad de ausentes </w:t>
+      </w:r>
+      <w:r>
+        <w:rPr>
+          <w:lang w:val="es-ES"/>
+        </w:rPr>
+        <w:t>que tiene ese alumno</w:t>
+      </w:r>
+      <w:r>
+        <w:rPr>
+          <w:lang w:val="es-ES"/>
+        </w:rPr>
+        <w:t xml:space="preserve">, la cantidad de ausentes justificados </w:t>
+      </w:r>
+      <w:r>
+        <w:rPr>
+          <w:lang w:val="es-ES"/>
+        </w:rPr>
+        <w:t>que tiene ese alumno</w:t>
+      </w:r>
+      <w:r>
+        <w:rPr>
+          <w:lang w:val="es-ES"/>
+        </w:rPr>
+        <w:t xml:space="preserve">, la cantidad de actividades asignadas </w:t>
+      </w:r>
+      <w:r>
+        <w:rPr>
+          <w:lang w:val="es-ES"/>
+        </w:rPr>
+        <w:t>que tiene ese alumno</w:t>
+      </w:r>
+      <w:r>
+        <w:rPr>
+          <w:lang w:val="es-ES"/>
+        </w:rPr>
+        <w:t xml:space="preserve">, la cantidad de actividades entregadas a tiempo </w:t>
+      </w:r>
+      <w:r>
+        <w:rPr>
+          <w:lang w:val="es-ES"/>
+        </w:rPr>
+        <w:t>que tiene ese alumno</w:t>
+      </w:r>
+      <w:r>
+        <w:rPr>
+          <w:lang w:val="es-ES"/>
+        </w:rPr>
+        <w:t xml:space="preserve">  y la cantidad de las entregadas vencidas </w:t>
+      </w:r>
+      <w:r>
+        <w:rPr>
+          <w:lang w:val="es-ES"/>
+        </w:rPr>
+        <w:t>que tiene ese alumno</w:t>
+      </w:r>
+      <w:r>
+        <w:rPr>
+          <w:lang w:val="es-ES"/>
+        </w:rPr>
+        <w:t xml:space="preserve">, la </w:t>
+      </w:r>
+      <w:proofErr w:type="spellStart"/>
+      <w:r>
+        <w:rPr>
+          <w:lang w:val="es-ES"/>
+        </w:rPr>
+        <w:t>ultima</w:t>
+      </w:r>
+      <w:proofErr w:type="spellEnd"/>
+      <w:r>
+        <w:rPr>
+          <w:lang w:val="es-ES"/>
+        </w:rPr>
+        <w:t xml:space="preserve"> valoración de la trayectoria registrada </w:t>
+      </w:r>
+      <w:r>
+        <w:rPr>
+          <w:lang w:val="es-ES"/>
+        </w:rPr>
+        <w:t>que tiene ese alumno</w:t>
+      </w:r>
+      <w:r>
+        <w:rPr>
+          <w:lang w:val="es-ES"/>
+        </w:rPr>
+        <w:t xml:space="preserve">, el ultimo </w:t>
+      </w:r>
+      <w:proofErr w:type="spellStart"/>
+      <w:r>
+        <w:rPr>
+          <w:lang w:val="es-ES"/>
+        </w:rPr>
+        <w:t>calculo</w:t>
+      </w:r>
+      <w:proofErr w:type="spellEnd"/>
+      <w:r>
+        <w:rPr>
+          <w:lang w:val="es-ES"/>
+        </w:rPr>
+        <w:t xml:space="preserve"> de la calificación registrado </w:t>
+      </w:r>
+      <w:r>
+        <w:rPr>
+          <w:lang w:val="es-ES"/>
+        </w:rPr>
+        <w:t>que tiene ese alumno</w:t>
+      </w:r>
+      <w:r>
+        <w:rPr>
+          <w:lang w:val="es-ES"/>
+        </w:rPr>
+        <w:t>.</w:t>
+      </w:r>
+    </w:p>
+    <w:p>
+      <w:pPr>
+        <w:rPr>
+          <w:lang w:val="es-ES"/>
+        </w:rPr>
+      </w:pPr>
+      <w:r>
+        <w:rPr>
+          <w:lang w:val="es-ES"/>
+        </w:rPr>
+        <w:t xml:space="preserve">Necesito colocar abajo del listado </w:t>
+      </w:r>
+      <w:proofErr w:type="spellStart"/>
+      <w:r>
+        <w:rPr>
+          <w:lang w:val="es-ES"/>
+        </w:rPr>
+        <w:t>graficos</w:t>
+      </w:r>
+      <w:proofErr w:type="spellEnd"/>
+      <w:r>
+        <w:rPr>
+          <w:lang w:val="es-ES"/>
+        </w:rPr>
+        <w:t xml:space="preserve"> adecuados que me muestren </w:t>
+      </w:r>
+      <w:r>
+        <w:rPr>
+          <w:lang w:val="es-ES"/>
+        </w:rPr>
+        <w:t xml:space="preserve">del curso la distribución al </w:t>
+      </w:r>
+      <w:proofErr w:type="spellStart"/>
+      <w:r>
+        <w:rPr>
+          <w:lang w:val="es-ES"/>
+        </w:rPr>
+        <w:t>dia</w:t>
+      </w:r>
+      <w:proofErr w:type="spellEnd"/>
+      <w:r>
+        <w:rPr>
+          <w:lang w:val="es-ES"/>
+        </w:rPr>
+        <w:t xml:space="preserve"> de la fecha de la visualización, porcentajes de aprobados, una tendencia de asistencias del curso, una tendencia a la aprobación de la materia.</w:t>
+      </w:r>
+      <w:bookmarkStart w:id="0" w:name="_GoBack"/>
+      <w:bookmarkEnd w:id="0"/>
     </w:p>
     <w:p>
       <w:pPr>
@@ -12015,7 +12247,7 @@
 </file>
 
 <file path=customXml/itemProps1.xml><?xml version="1.0" encoding="utf-8"?>
-<ds:datastoreItem xmlns:ds="http://schemas.openxmlformats.org/officeDocument/2006/customXml" ds:itemID="{D9FF5E23-8247-43B2-AB6B-09AEEA2D7E73}">
+<ds:datastoreItem xmlns:ds="http://schemas.openxmlformats.org/officeDocument/2006/customXml" ds:itemID="{BFDB5899-C6EA-46A2-AC30-99A4A537A356}">
   <ds:schemaRefs>
     <ds:schemaRef ds:uri="http://schemas.openxmlformats.org/officeDocument/2006/bibliography"/>
   </ds:schemaRefs>

</xml_diff>

<commit_message>
se agregan funcionalidades de admin, pagos, abonos de servicio
</commit_message>
<xml_diff>
--- a/requerimientos.docx
+++ b/requerimientos.docx
@@ -8056,11 +8056,13 @@
     <w:p>
       <w:pPr>
         <w:rPr>
-          <w:lang w:val="es-ES"/>
-        </w:rPr>
-      </w:pPr>
-      <w:r>
-        <w:rPr>
+          <w:b/>
+          <w:lang w:val="es-ES"/>
+        </w:rPr>
+      </w:pPr>
+      <w:r>
+        <w:rPr>
+          <w:b/>
           <w:lang w:val="es-ES"/>
         </w:rPr>
         <w:t xml:space="preserve">Necesito que en asistencia, al presionar Ver historial me pida el curso como hasta ahora y que me pida una fecha de inicio y una fecha de fin en el informe, y que me permita seleccionar todo el curso o un estudiante en particular. Que el informe incluya un resumen de asistencias, ausentes, ausentes justificados, y llegadas tardes con la </w:t>
@@ -8068,6 +8070,7 @@
       <w:proofErr w:type="spellStart"/>
       <w:r>
         <w:rPr>
+          <w:b/>
           <w:lang w:val="es-ES"/>
         </w:rPr>
         <w:t>hs</w:t>
@@ -8075,30 +8078,35 @@
       <w:proofErr w:type="spellEnd"/>
       <w:r>
         <w:rPr>
+          <w:b/>
           <w:lang w:val="es-ES"/>
         </w:rPr>
         <w:t xml:space="preserve"> de llegada,</w:t>
       </w:r>
       <w:r>
         <w:rPr>
+          <w:b/>
           <w:lang w:val="es-ES"/>
         </w:rPr>
         <w:t xml:space="preserve"> tanto en el caso de ser un alumno en particular solicitado o el curso en total, </w:t>
       </w:r>
       <w:r>
         <w:rPr>
+          <w:b/>
           <w:lang w:val="es-ES"/>
         </w:rPr>
         <w:t xml:space="preserve">Respetando los parámetros de fecha, que al </w:t>
       </w:r>
       <w:r>
         <w:rPr>
+          <w:b/>
           <w:lang w:val="es-ES"/>
         </w:rPr>
         <w:t xml:space="preserve">presionar el botón </w:t>
       </w:r>
       <w:r>
         <w:rPr>
+          <w:b/>
           <w:lang w:val="es-ES"/>
         </w:rPr>
         <w:t>volver del informe recuerde los parámetros seleccionados.</w:t>
@@ -8121,17 +8129,20 @@
     <w:p>
       <w:pPr>
         <w:rPr>
-          <w:lang w:val="es-ES"/>
-        </w:rPr>
-      </w:pPr>
-      <w:r>
-        <w:rPr>
+          <w:b/>
+          <w:lang w:val="es-ES"/>
+        </w:rPr>
+      </w:pPr>
+      <w:r>
+        <w:rPr>
+          <w:b/>
           <w:lang w:val="es-ES"/>
         </w:rPr>
         <w:t>Necesito un crud que me permita guardar proyectos, fecha, hora, titulo</w:t>
       </w:r>
       <w:r>
         <w:rPr>
+          <w:b/>
           <w:lang w:val="es-ES"/>
         </w:rPr>
         <w:t>, establecimiento donde se presenta, fecha presentación, observaciones.</w:t>
@@ -8145,6 +8156,7 @@
       </w:pPr>
       <w:r>
         <w:rPr>
+          <w:b/>
           <w:lang w:val="es-ES"/>
         </w:rPr>
         <w:t xml:space="preserve">Necesito que cuando se genere automáticamente una </w:t>
@@ -8152,6 +8164,7 @@
       <w:proofErr w:type="spellStart"/>
       <w:r>
         <w:rPr>
+          <w:b/>
           <w:lang w:val="es-ES"/>
         </w:rPr>
         <w:t>activdad</w:t>
@@ -8159,6 +8172,7 @@
       <w:proofErr w:type="spellEnd"/>
       <w:r>
         <w:rPr>
+          <w:b/>
           <w:lang w:val="es-ES"/>
         </w:rPr>
         <w:t xml:space="preserve"> por proyecto, automáticamente se inicie una carpeta de campo</w:t>
@@ -8167,11 +8181,13 @@
     <w:p>
       <w:pPr>
         <w:rPr>
-          <w:lang w:val="es-ES"/>
-        </w:rPr>
-      </w:pPr>
-      <w:r>
-        <w:rPr>
+          <w:b/>
+          <w:lang w:val="es-ES"/>
+        </w:rPr>
+      </w:pPr>
+      <w:r>
+        <w:rPr>
+          <w:b/>
           <w:lang w:val="es-ES"/>
         </w:rPr>
         <w:t xml:space="preserve">Necesito que en el dashboard, el listado de estudiantes, en </w:t>
@@ -8179,6 +8195,7 @@
       <w:proofErr w:type="spellStart"/>
       <w:r>
         <w:rPr>
+          <w:b/>
           <w:lang w:val="es-ES"/>
         </w:rPr>
         <w:t>ves</w:t>
@@ -8186,73 +8203,15 @@
       <w:proofErr w:type="spellEnd"/>
       <w:r>
         <w:rPr>
-          <w:lang w:val="es-ES"/>
-        </w:rPr>
-        <w:t xml:space="preserve"> de los botones me muestre para cada estudiante, en su correspondiente renglón de la tabla, y con diferentes colores , la cantidad de presentes que tiene ese alumno, la cantidad de ausentes </w:t>
-      </w:r>
-      <w:r>
-        <w:rPr>
-          <w:lang w:val="es-ES"/>
-        </w:rPr>
-        <w:t>que tiene ese alumno</w:t>
-      </w:r>
-      <w:r>
-        <w:rPr>
-          <w:lang w:val="es-ES"/>
-        </w:rPr>
-        <w:t xml:space="preserve">, la cantidad de ausentes justificados </w:t>
-      </w:r>
-      <w:r>
-        <w:rPr>
-          <w:lang w:val="es-ES"/>
-        </w:rPr>
-        <w:t>que tiene ese alumno</w:t>
-      </w:r>
-      <w:r>
-        <w:rPr>
-          <w:lang w:val="es-ES"/>
-        </w:rPr>
-        <w:t xml:space="preserve">, la cantidad de actividades asignadas </w:t>
-      </w:r>
-      <w:r>
-        <w:rPr>
-          <w:lang w:val="es-ES"/>
-        </w:rPr>
-        <w:t>que tiene ese alumno</w:t>
-      </w:r>
-      <w:r>
-        <w:rPr>
-          <w:lang w:val="es-ES"/>
-        </w:rPr>
-        <w:t xml:space="preserve">, la cantidad de actividades entregadas a tiempo </w:t>
-      </w:r>
-      <w:r>
-        <w:rPr>
-          <w:lang w:val="es-ES"/>
-        </w:rPr>
-        <w:t>que tiene ese alumno</w:t>
-      </w:r>
-      <w:r>
-        <w:rPr>
-          <w:lang w:val="es-ES"/>
-        </w:rPr>
-        <w:t xml:space="preserve">  y la cantidad de las entregadas vencidas </w:t>
-      </w:r>
-      <w:r>
-        <w:rPr>
-          <w:lang w:val="es-ES"/>
-        </w:rPr>
-        <w:t>que tiene ese alumno</w:t>
-      </w:r>
-      <w:r>
-        <w:rPr>
-          <w:lang w:val="es-ES"/>
-        </w:rPr>
-        <w:t xml:space="preserve">, la </w:t>
+          <w:b/>
+          <w:lang w:val="es-ES"/>
+        </w:rPr>
+        <w:t xml:space="preserve"> de los botones me muestre para cada estudiante, en su correspondiente renglón de la tabla, y con diferentes colores , la cantidad de presentes que tiene ese alumno, la cantidad de ausentes que tiene ese alumno, la cantidad de ausentes justificados que tiene ese alumno, la cantidad de actividades asignadas que tiene ese alumno, la cantidad de actividades entregadas a tiempo que tiene ese alumno  y la cantidad de las entregadas vencidas que tiene ese alumno, la </w:t>
       </w:r>
       <w:proofErr w:type="spellStart"/>
       <w:r>
         <w:rPr>
+          <w:b/>
           <w:lang w:val="es-ES"/>
         </w:rPr>
         <w:t>ultima</w:t>
@@ -8260,25 +8219,15 @@
       <w:proofErr w:type="spellEnd"/>
       <w:r>
         <w:rPr>
-          <w:lang w:val="es-ES"/>
-        </w:rPr>
-        <w:t xml:space="preserve"> valoración de la trayectoria registrada </w:t>
-      </w:r>
-      <w:r>
-        <w:rPr>
-          <w:lang w:val="es-ES"/>
-        </w:rPr>
-        <w:t>que tiene ese alumno</w:t>
-      </w:r>
-      <w:r>
-        <w:rPr>
-          <w:lang w:val="es-ES"/>
-        </w:rPr>
-        <w:t xml:space="preserve">, el ultimo </w:t>
+          <w:b/>
+          <w:lang w:val="es-ES"/>
+        </w:rPr>
+        <w:t xml:space="preserve"> valoración de la trayectoria registrada que tiene ese alumno, el ultimo </w:t>
       </w:r>
       <w:proofErr w:type="spellStart"/>
       <w:r>
         <w:rPr>
+          <w:b/>
           <w:lang w:val="es-ES"/>
         </w:rPr>
         <w:t>calculo</w:t>
@@ -8286,31 +8235,21 @@
       <w:proofErr w:type="spellEnd"/>
       <w:r>
         <w:rPr>
-          <w:lang w:val="es-ES"/>
-        </w:rPr>
-        <w:t xml:space="preserve"> de la calificación registrado </w:t>
-      </w:r>
-      <w:r>
-        <w:rPr>
-          <w:lang w:val="es-ES"/>
-        </w:rPr>
-        <w:t>que tiene ese alumno</w:t>
-      </w:r>
-      <w:r>
-        <w:rPr>
-          <w:lang w:val="es-ES"/>
-        </w:rPr>
-        <w:t>.</w:t>
-      </w:r>
-    </w:p>
-    <w:p>
-      <w:pPr>
-        <w:rPr>
-          <w:lang w:val="es-ES"/>
-        </w:rPr>
-      </w:pPr>
-      <w:r>
-        <w:rPr>
+          <w:b/>
+          <w:lang w:val="es-ES"/>
+        </w:rPr>
+        <w:t xml:space="preserve"> de la calificación registrado que tiene ese alumno.</w:t>
+      </w:r>
+    </w:p>
+    <w:p>
+      <w:pPr>
+        <w:rPr>
+          <w:lang w:val="es-ES"/>
+        </w:rPr>
+      </w:pPr>
+      <w:r>
+        <w:rPr>
+          <w:b/>
           <w:lang w:val="es-ES"/>
         </w:rPr>
         <w:t xml:space="preserve">Necesito colocar abajo del listado </w:t>
@@ -8318,6 +8257,7 @@
       <w:proofErr w:type="spellStart"/>
       <w:r>
         <w:rPr>
+          <w:b/>
           <w:lang w:val="es-ES"/>
         </w:rPr>
         <w:t>graficos</w:t>
@@ -8325,12 +8265,14 @@
       <w:proofErr w:type="spellEnd"/>
       <w:r>
         <w:rPr>
+          <w:b/>
           <w:lang w:val="es-ES"/>
         </w:rPr>
         <w:t xml:space="preserve"> adecuados que me muestren </w:t>
       </w:r>
       <w:r>
         <w:rPr>
+          <w:b/>
           <w:lang w:val="es-ES"/>
         </w:rPr>
         <w:t xml:space="preserve">del curso la distribución al </w:t>
@@ -8338,6 +8280,7 @@
       <w:proofErr w:type="spellStart"/>
       <w:r>
         <w:rPr>
+          <w:b/>
           <w:lang w:val="es-ES"/>
         </w:rPr>
         <w:t>dia</w:t>
@@ -8345,19 +8288,312 @@
       <w:proofErr w:type="spellEnd"/>
       <w:r>
         <w:rPr>
+          <w:b/>
           <w:lang w:val="es-ES"/>
         </w:rPr>
         <w:t xml:space="preserve"> de la fecha de la visualización, porcentajes de aprobados, una tendencia de asistencias del curso, una tendencia a la aprobación de la materia.</w:t>
+      </w:r>
+    </w:p>
+    <w:p>
+      <w:pPr>
+        <w:rPr>
+          <w:b/>
+          <w:lang w:val="es-ES"/>
+        </w:rPr>
+      </w:pPr>
+      <w:r>
+        <w:rPr>
+          <w:b/>
+          <w:lang w:val="es-ES"/>
+        </w:rPr>
+        <w:t xml:space="preserve">Necesito crear un dashboard de administrador que me permita administrar cuentas de usuarios que se registren por el sistema </w:t>
+      </w:r>
+      <w:proofErr w:type="spellStart"/>
+      <w:r>
+        <w:rPr>
+          <w:b/>
+          <w:lang w:val="es-ES"/>
+        </w:rPr>
+        <w:t>GestionAula</w:t>
+      </w:r>
+      <w:proofErr w:type="spellEnd"/>
+      <w:r>
+        <w:rPr>
+          <w:b/>
+          <w:lang w:val="es-ES"/>
+        </w:rPr>
+        <w:t xml:space="preserve">, para poder cobrar mensualmente, poder activar o desactivar las cuentas, y asignar monto a cobrar, </w:t>
+      </w:r>
+      <w:proofErr w:type="spellStart"/>
+      <w:r>
+        <w:rPr>
+          <w:b/>
+          <w:lang w:val="es-ES"/>
+        </w:rPr>
+        <w:t>asi</w:t>
+      </w:r>
+      <w:proofErr w:type="spellEnd"/>
+      <w:r>
+        <w:rPr>
+          <w:b/>
+          <w:lang w:val="es-ES"/>
+        </w:rPr>
+        <w:t xml:space="preserve"> como gestionar su abono y cobro. </w:t>
+      </w:r>
+      <w:proofErr w:type="gramStart"/>
+      <w:r>
+        <w:rPr>
+          <w:b/>
+          <w:lang w:val="es-ES"/>
+        </w:rPr>
+        <w:t>cobrar</w:t>
+      </w:r>
+      <w:proofErr w:type="gramEnd"/>
+      <w:r>
+        <w:rPr>
+          <w:b/>
+          <w:lang w:val="es-ES"/>
+        </w:rPr>
+        <w:t xml:space="preserve"> por el servicio que ofrece mi sistema web </w:t>
+      </w:r>
+      <w:proofErr w:type="spellStart"/>
+      <w:r>
+        <w:rPr>
+          <w:b/>
+          <w:lang w:val="es-ES"/>
+        </w:rPr>
+        <w:t>GestionAula</w:t>
+      </w:r>
+      <w:proofErr w:type="spellEnd"/>
+      <w:r>
+        <w:rPr>
+          <w:b/>
+          <w:lang w:val="es-ES"/>
+        </w:rPr>
+        <w:t xml:space="preserve">, </w:t>
+      </w:r>
+    </w:p>
+    <w:p>
+      <w:pPr>
+        <w:rPr>
+          <w:lang w:val="es-ES"/>
+        </w:rPr>
+      </w:pPr>
+      <w:r>
+        <w:rPr>
+          <w:lang w:val="es-ES"/>
+        </w:rPr>
+        <w:t xml:space="preserve">Cuando </w:t>
+      </w:r>
+      <w:proofErr w:type="spellStart"/>
+      <w:r>
+        <w:rPr>
+          <w:lang w:val="es-ES"/>
+        </w:rPr>
+        <w:t>intento</w:t>
+      </w:r>
+      <w:proofErr w:type="spellEnd"/>
+      <w:r>
+        <w:rPr>
+          <w:lang w:val="es-ES"/>
+        </w:rPr>
+        <w:t xml:space="preserve"> ingresar con las credenciales </w:t>
+      </w:r>
+      <w:hyperlink r:id="rId7" w:history="1">
+        <w:r>
+          <w:rPr>
+            <w:rStyle w:val="Hipervnculo"/>
+            <w:lang w:val="es-ES"/>
+          </w:rPr>
+          <w:t>admin@gestionaula.com</w:t>
+        </w:r>
+      </w:hyperlink>
+      <w:r>
+        <w:rPr>
+          <w:lang w:val="es-ES"/>
+        </w:rPr>
+        <w:t xml:space="preserve">, y </w:t>
+      </w:r>
+      <w:proofErr w:type="spellStart"/>
+      <w:r>
+        <w:rPr>
+          <w:lang w:val="es-ES"/>
+        </w:rPr>
+        <w:t>password</w:t>
+      </w:r>
+      <w:proofErr w:type="spellEnd"/>
+      <w:r>
+        <w:rPr>
+          <w:lang w:val="es-ES"/>
+        </w:rPr>
+        <w:t xml:space="preserve"> admin1234, entra , se </w:t>
+      </w:r>
+      <w:proofErr w:type="spellStart"/>
+      <w:r>
+        <w:rPr>
+          <w:lang w:val="es-ES"/>
+        </w:rPr>
+        <w:t>logea</w:t>
+      </w:r>
+      <w:proofErr w:type="spellEnd"/>
+      <w:r>
+        <w:rPr>
+          <w:lang w:val="es-ES"/>
+        </w:rPr>
+        <w:t xml:space="preserve"> como administrador, pero no me </w:t>
+      </w:r>
+      <w:proofErr w:type="spellStart"/>
+      <w:r>
+        <w:rPr>
+          <w:lang w:val="es-ES"/>
+        </w:rPr>
+        <w:t>dirije</w:t>
+      </w:r>
+      <w:proofErr w:type="spellEnd"/>
+      <w:r>
+        <w:rPr>
+          <w:lang w:val="es-ES"/>
+        </w:rPr>
+        <w:t xml:space="preserve"> al dashboard de administrador, me manda al dashboard de los usuarios “docentes”, cuando coloco el /</w:t>
+      </w:r>
+      <w:proofErr w:type="spellStart"/>
+      <w:r>
+        <w:rPr>
+          <w:lang w:val="es-ES"/>
+        </w:rPr>
+        <w:t>admin</w:t>
+      </w:r>
+      <w:proofErr w:type="spellEnd"/>
+      <w:r>
+        <w:rPr>
+          <w:lang w:val="es-ES"/>
+        </w:rPr>
+        <w:t xml:space="preserve"> me pone el men</w:t>
       </w:r>
       <w:bookmarkStart w:id="0" w:name="_GoBack"/>
       <w:bookmarkEnd w:id="0"/>
-    </w:p>
-    <w:p>
-      <w:pPr>
-        <w:rPr>
-          <w:lang w:val="es-ES"/>
-        </w:rPr>
-      </w:pPr>
+      <w:r>
+        <w:rPr>
+          <w:lang w:val="es-ES"/>
+        </w:rPr>
+        <w:t xml:space="preserve">saje en </w:t>
+      </w:r>
+      <w:proofErr w:type="spellStart"/>
+      <w:r>
+        <w:rPr>
+          <w:lang w:val="es-ES"/>
+        </w:rPr>
+        <w:t>ingles</w:t>
+      </w:r>
+      <w:proofErr w:type="spellEnd"/>
+      <w:r>
+        <w:rPr>
+          <w:lang w:val="es-ES"/>
+        </w:rPr>
+        <w:t xml:space="preserve">, </w:t>
+      </w:r>
+      <w:r>
+        <w:rPr>
+          <w:lang w:val="es-ES"/>
+        </w:rPr>
+        <w:t>403</w:t>
+      </w:r>
+      <w:r>
+        <w:rPr>
+          <w:lang w:val="es-ES"/>
+        </w:rPr>
+        <w:t xml:space="preserve"> </w:t>
+      </w:r>
+      <w:proofErr w:type="spellStart"/>
+      <w:r>
+        <w:rPr>
+          <w:lang w:val="es-ES"/>
+        </w:rPr>
+        <w:t>User</w:t>
+      </w:r>
+      <w:proofErr w:type="spellEnd"/>
+      <w:r>
+        <w:rPr>
+          <w:lang w:val="es-ES"/>
+        </w:rPr>
+        <w:t xml:space="preserve"> </w:t>
+      </w:r>
+      <w:proofErr w:type="spellStart"/>
+      <w:r>
+        <w:rPr>
+          <w:lang w:val="es-ES"/>
+        </w:rPr>
+        <w:t>does</w:t>
+      </w:r>
+      <w:proofErr w:type="spellEnd"/>
+      <w:r>
+        <w:rPr>
+          <w:lang w:val="es-ES"/>
+        </w:rPr>
+        <w:t xml:space="preserve"> </w:t>
+      </w:r>
+      <w:proofErr w:type="spellStart"/>
+      <w:r>
+        <w:rPr>
+          <w:lang w:val="es-ES"/>
+        </w:rPr>
+        <w:t>not</w:t>
+      </w:r>
+      <w:proofErr w:type="spellEnd"/>
+      <w:r>
+        <w:rPr>
+          <w:lang w:val="es-ES"/>
+        </w:rPr>
+        <w:t xml:space="preserve"> </w:t>
+      </w:r>
+      <w:proofErr w:type="spellStart"/>
+      <w:r>
+        <w:rPr>
+          <w:lang w:val="es-ES"/>
+        </w:rPr>
+        <w:t>have</w:t>
+      </w:r>
+      <w:proofErr w:type="spellEnd"/>
+      <w:r>
+        <w:rPr>
+          <w:lang w:val="es-ES"/>
+        </w:rPr>
+        <w:t xml:space="preserve"> </w:t>
+      </w:r>
+      <w:proofErr w:type="spellStart"/>
+      <w:r>
+        <w:rPr>
+          <w:lang w:val="es-ES"/>
+        </w:rPr>
+        <w:t>the</w:t>
+      </w:r>
+      <w:proofErr w:type="spellEnd"/>
+      <w:r>
+        <w:rPr>
+          <w:lang w:val="es-ES"/>
+        </w:rPr>
+        <w:t xml:space="preserve"> </w:t>
+      </w:r>
+      <w:proofErr w:type="spellStart"/>
+      <w:r>
+        <w:rPr>
+          <w:lang w:val="es-ES"/>
+        </w:rPr>
+        <w:t>right</w:t>
+      </w:r>
+      <w:proofErr w:type="spellEnd"/>
+      <w:r>
+        <w:rPr>
+          <w:lang w:val="es-ES"/>
+        </w:rPr>
+        <w:t xml:space="preserve"> roles</w:t>
+      </w:r>
+      <w:r>
+        <w:rPr>
+          <w:lang w:val="es-ES"/>
+        </w:rPr>
+        <w:t>.</w:t>
+      </w:r>
     </w:p>
     <w:p>
       <w:pPr>
@@ -11753,6 +11989,17 @@
       <w:contextualSpacing/>
     </w:pPr>
   </w:style>
+  <w:style w:type="character" w:styleId="Hipervnculo">
+    <w:name w:val="Hyperlink"/>
+    <w:basedOn w:val="Fuentedeprrafopredeter"/>
+    <w:uiPriority w:val="99"/>
+    <w:unhideWhenUsed/>
+    <w:rsid w:val="00294FFD"/>
+    <w:rPr>
+      <w:color w:val="0000FF" w:themeColor="hyperlink"/>
+      <w:u w:val="single"/>
+    </w:rPr>
+  </w:style>
 </w:styles>
 </file>
 
@@ -11953,6 +12200,17 @@
       <w:ind w:left="720"/>
       <w:contextualSpacing/>
     </w:pPr>
+  </w:style>
+  <w:style w:type="character" w:styleId="Hipervnculo">
+    <w:name w:val="Hyperlink"/>
+    <w:basedOn w:val="Fuentedeprrafopredeter"/>
+    <w:uiPriority w:val="99"/>
+    <w:unhideWhenUsed/>
+    <w:rsid w:val="00294FFD"/>
+    <w:rPr>
+      <w:color w:val="0000FF" w:themeColor="hyperlink"/>
+      <w:u w:val="single"/>
+    </w:rPr>
   </w:style>
 </w:styles>
 </file>
@@ -12247,7 +12505,7 @@
 </file>
 
 <file path=customXml/itemProps1.xml><?xml version="1.0" encoding="utf-8"?>
-<ds:datastoreItem xmlns:ds="http://schemas.openxmlformats.org/officeDocument/2006/customXml" ds:itemID="{BFDB5899-C6EA-46A2-AC30-99A4A537A356}">
+<ds:datastoreItem xmlns:ds="http://schemas.openxmlformats.org/officeDocument/2006/customXml" ds:itemID="{D607DDE8-49E0-4F09-AC4B-4CB0466C19C8}">
   <ds:schemaRefs>
     <ds:schemaRef ds:uri="http://schemas.openxmlformats.org/officeDocument/2006/bibliography"/>
   </ds:schemaRefs>

</xml_diff>

<commit_message>
corregido problema de no muestra dash de admin
</commit_message>
<xml_diff>
--- a/requerimientos.docx
+++ b/requerimientos.docx
@@ -6806,7 +6806,23 @@
           <w:color w:val="FFC000"/>
           <w:lang w:val="es-ES"/>
         </w:rPr>
-        <w:t xml:space="preserve"> y registro para cada materia en el momento de cargar la materia al sistema, cuando me muestre la vista del listado de asistencias, me calcule, muestre y </w:t>
+        <w:t xml:space="preserve"> y registro</w:t>
+      </w:r>
+      <w:r>
+        <w:rPr>
+          <w:b/>
+          <w:color w:val="FFC000"/>
+          <w:lang w:val="es-ES"/>
+        </w:rPr>
+        <w:t>,</w:t>
+      </w:r>
+      <w:r>
+        <w:rPr>
+          <w:b/>
+          <w:color w:val="FFC000"/>
+          <w:lang w:val="es-ES"/>
+        </w:rPr>
+        <w:t xml:space="preserve"> para cada materia en el momento de cargar la materia al sistema, cuando me muestre la vista del listado de asistencias, me calcule, muestre y </w:t>
       </w:r>
       <w:r>
         <w:rPr>
@@ -7641,13 +7657,190 @@
         </w:rPr>
         <w:t xml:space="preserve">los card donde </w:t>
       </w:r>
+      <w:r>
+        <w:rPr>
+          <w:b/>
+          <w:lang w:val="es-ES"/>
+        </w:rPr>
+        <w:t>está</w:t>
+      </w:r>
+      <w:r>
+        <w:rPr>
+          <w:b/>
+          <w:lang w:val="es-ES"/>
+        </w:rPr>
+        <w:t xml:space="preserve"> el reloj en color azul, el calendario escolar y me agregues un card con el mapa de google maps donde </w:t>
+      </w:r>
+      <w:r>
+        <w:rPr>
+          <w:b/>
+          <w:lang w:val="es-ES"/>
+        </w:rPr>
+        <w:t>está</w:t>
+      </w:r>
+      <w:r>
+        <w:rPr>
+          <w:b/>
+          <w:lang w:val="es-ES"/>
+        </w:rPr>
+        <w:t xml:space="preserve"> el establecimiento, para ello debes tomar los datos de </w:t>
+      </w:r>
+      <w:r>
+        <w:rPr>
+          <w:b/>
+          <w:lang w:val="es-ES"/>
+        </w:rPr>
+        <w:t xml:space="preserve">la </w:t>
+      </w:r>
+      <w:r>
+        <w:rPr>
+          <w:b/>
+          <w:lang w:val="es-ES"/>
+        </w:rPr>
+        <w:t xml:space="preserve">tabla de establecimientos, done se guarda, </w:t>
+      </w:r>
+      <w:r>
+        <w:rPr>
+          <w:b/>
+          <w:lang w:val="es-ES"/>
+        </w:rPr>
+        <w:t>Denominación</w:t>
+      </w:r>
+      <w:r>
+        <w:rPr>
+          <w:b/>
+          <w:lang w:val="es-ES"/>
+        </w:rPr>
+        <w:t xml:space="preserve">, Nombre, Domicilio, </w:t>
+      </w:r>
+      <w:r>
+        <w:rPr>
+          <w:b/>
+          <w:lang w:val="es-ES"/>
+        </w:rPr>
+        <w:t>Teléfono</w:t>
+      </w:r>
+      <w:r>
+        <w:rPr>
+          <w:b/>
+          <w:lang w:val="es-ES"/>
+        </w:rPr>
+        <w:t xml:space="preserve">. </w:t>
+      </w:r>
+    </w:p>
+    <w:p>
+      <w:pPr>
+        <w:rPr>
+          <w:b/>
+          <w:lang w:val="es-ES"/>
+        </w:rPr>
+      </w:pPr>
+      <w:r>
+        <w:rPr>
+          <w:b/>
+          <w:lang w:val="es-ES"/>
+        </w:rPr>
+        <w:t xml:space="preserve">Necesito que en la card </w:t>
+      </w:r>
+      <w:r>
+        <w:rPr>
+          <w:b/>
+          <w:lang w:val="es-ES"/>
+        </w:rPr>
+        <w:t>Próximo</w:t>
+      </w:r>
+      <w:r>
+        <w:rPr>
+          <w:b/>
+          <w:lang w:val="es-ES"/>
+        </w:rPr>
+        <w:t xml:space="preserve"> establecimiento: </w:t>
+      </w:r>
+      <w:r>
+        <w:rPr>
+          <w:b/>
+          <w:lang w:val="es-ES"/>
+        </w:rPr>
+        <w:t xml:space="preserve">me </w:t>
+      </w:r>
+      <w:r>
+        <w:rPr>
+          <w:b/>
+          <w:lang w:val="es-ES"/>
+        </w:rPr>
+        <w:t xml:space="preserve">muestre desde la base de datos </w:t>
+      </w:r>
+      <w:r>
+        <w:rPr>
+          <w:b/>
+          <w:lang w:val="es-ES"/>
+        </w:rPr>
+        <w:t xml:space="preserve">a que escuela y curso debo ir a </w:t>
+      </w:r>
+      <w:r>
+        <w:rPr>
+          <w:b/>
+          <w:lang w:val="es-ES"/>
+        </w:rPr>
+        <w:t>continuación</w:t>
+      </w:r>
+      <w:r>
+        <w:rPr>
+          <w:b/>
+          <w:lang w:val="es-ES"/>
+        </w:rPr>
+        <w:t>.</w:t>
+      </w:r>
+    </w:p>
+    <w:p>
+      <w:pPr>
+        <w:rPr>
+          <w:b/>
+          <w:lang w:val="es-ES"/>
+        </w:rPr>
+      </w:pPr>
+      <w:r>
+        <w:rPr>
+          <w:b/>
+          <w:lang w:val="es-ES"/>
+        </w:rPr>
+        <w:t xml:space="preserve">Necesito que de la card de listado de estudiantes </w:t>
+      </w:r>
+      <w:r>
+        <w:rPr>
+          <w:b/>
+          <w:lang w:val="es-ES"/>
+        </w:rPr>
+        <w:t xml:space="preserve">del dashboard </w:t>
+      </w:r>
+      <w:r>
+        <w:rPr>
+          <w:b/>
+          <w:lang w:val="es-ES"/>
+        </w:rPr>
+        <w:t xml:space="preserve">me saques el </w:t>
+      </w:r>
+      <w:r>
+        <w:rPr>
+          <w:b/>
+          <w:lang w:val="es-ES"/>
+        </w:rPr>
+        <w:t>título</w:t>
+      </w:r>
+      <w:r>
+        <w:rPr>
+          <w:b/>
+          <w:lang w:val="es-ES"/>
+        </w:rPr>
+        <w:t xml:space="preserve"> de materia, </w:t>
+      </w:r>
       <w:proofErr w:type="spellStart"/>
       <w:r>
         <w:rPr>
           <w:b/>
           <w:lang w:val="es-ES"/>
         </w:rPr>
-        <w:t>esta</w:t>
+        <w:t>cursohorario</w:t>
       </w:r>
       <w:proofErr w:type="spellEnd"/>
       <w:r>
@@ -7655,7 +7848,28 @@
           <w:b/>
           <w:lang w:val="es-ES"/>
         </w:rPr>
-        <w:t xml:space="preserve"> el reloj en color azul, el calendario escolar y me agregues un card con el mapa de </w:t>
+        <w:t xml:space="preserve"> y establecimiento, que solo me muestre la lista de estudiantes, y que los botones de acción sean </w:t>
+      </w:r>
+      <w:r>
+        <w:rPr>
+          <w:b/>
+          <w:lang w:val="es-ES"/>
+        </w:rPr>
+        <w:t>más</w:t>
+      </w:r>
+      <w:r>
+        <w:rPr>
+          <w:b/>
+          <w:lang w:val="es-ES"/>
+        </w:rPr>
+        <w:t xml:space="preserve"> anchos</w:t>
+      </w:r>
+      <w:r>
+        <w:rPr>
+          <w:b/>
+          <w:lang w:val="es-ES"/>
+        </w:rPr>
+        <w:t xml:space="preserve"> aprox del ancho del </w:t>
       </w:r>
       <w:proofErr w:type="spellStart"/>
       <w:r>
@@ -7663,7 +7877,7 @@
           <w:b/>
           <w:lang w:val="es-ES"/>
         </w:rPr>
-        <w:t>google</w:t>
+        <w:t>titulo</w:t>
       </w:r>
       <w:proofErr w:type="spellEnd"/>
       <w:r>
@@ -7671,7 +7885,80 @@
           <w:b/>
           <w:lang w:val="es-ES"/>
         </w:rPr>
-        <w:t xml:space="preserve"> </w:t>
+        <w:t xml:space="preserve"> de la columna en la que se encuentran</w:t>
+      </w:r>
+      <w:r>
+        <w:rPr>
+          <w:b/>
+          <w:lang w:val="es-ES"/>
+        </w:rPr>
+        <w:t xml:space="preserve"> y con relleno de color, el icono en líneas blancas.</w:t>
+      </w:r>
+    </w:p>
+    <w:p>
+      <w:pPr>
+        <w:rPr>
+          <w:b/>
+          <w:lang w:val="es-ES"/>
+        </w:rPr>
+      </w:pPr>
+      <w:r>
+        <w:rPr>
+          <w:b/>
+          <w:lang w:val="es-ES"/>
+        </w:rPr>
+        <w:t>Necesito que los establecimientos</w:t>
+      </w:r>
+      <w:r>
+        <w:rPr>
+          <w:b/>
+          <w:lang w:val="es-ES"/>
+        </w:rPr>
+        <w:t xml:space="preserve"> que los cards de </w:t>
+      </w:r>
+      <w:r>
+        <w:rPr>
+          <w:b/>
+          <w:lang w:val="es-ES"/>
+        </w:rPr>
+        <w:t>Próximo</w:t>
+      </w:r>
+      <w:r>
+        <w:rPr>
+          <w:b/>
+          <w:lang w:val="es-ES"/>
+        </w:rPr>
+        <w:t xml:space="preserve"> establecimiento y el de la ubicación me muestren la información de cada usuario. Y no la de otros usuarios, como el resto del sistema.</w:t>
+      </w:r>
+    </w:p>
+    <w:p>
+      <w:pPr>
+        <w:rPr>
+          <w:b/>
+          <w:lang w:val="es-ES"/>
+        </w:rPr>
+      </w:pPr>
+      <w:r>
+        <w:rPr>
+          <w:b/>
+          <w:lang w:val="es-ES"/>
+        </w:rPr>
+        <w:t>Corregir error al intentar cargar niveles educativos</w:t>
+      </w:r>
+    </w:p>
+    <w:p>
+      <w:pPr>
+        <w:rPr>
+          <w:b/>
+          <w:lang w:val="es-ES"/>
+        </w:rPr>
+      </w:pPr>
+      <w:r>
+        <w:rPr>
+          <w:b/>
+          <w:lang w:val="es-ES"/>
+        </w:rPr>
+        <w:t xml:space="preserve">Necesito que cuando registro la asistencia se acuerde de la materia y el curso, y me muestre el listado de estudiantes, con un pequeño resumen en la parte superior de presentes, ausentes, ausentes justificados, y tarde en el </w:t>
       </w:r>
       <w:proofErr w:type="spellStart"/>
       <w:r>
@@ -7679,7 +7966,7 @@
           <w:b/>
           <w:lang w:val="es-ES"/>
         </w:rPr>
-        <w:t>maps</w:t>
+        <w:t>dia</w:t>
       </w:r>
       <w:proofErr w:type="spellEnd"/>
       <w:r>
@@ -7687,7 +7974,52 @@
           <w:b/>
           <w:lang w:val="es-ES"/>
         </w:rPr>
-        <w:t xml:space="preserve"> donde </w:t>
+        <w:t xml:space="preserve"> actual. </w:t>
+      </w:r>
+    </w:p>
+    <w:p>
+      <w:pPr>
+        <w:rPr>
+          <w:b/>
+          <w:lang w:val="es-ES"/>
+        </w:rPr>
+      </w:pPr>
+      <w:r>
+        <w:rPr>
+          <w:b/>
+          <w:lang w:val="es-ES"/>
+        </w:rPr>
+        <w:t>Necesito que cuando le ponga volver en la vista de registro de asistencia, también se acuerde de la materia y curso seleccionada.</w:t>
+      </w:r>
+    </w:p>
+    <w:p>
+      <w:pPr>
+        <w:rPr>
+          <w:b/>
+          <w:lang w:val="es-ES"/>
+        </w:rPr>
+      </w:pPr>
+      <w:r>
+        <w:rPr>
+          <w:b/>
+          <w:lang w:val="es-ES"/>
+        </w:rPr>
+        <w:t>Necesito que tomar asistencia del menú Actividad áulica se pase a llamar Asistencia.</w:t>
+      </w:r>
+    </w:p>
+    <w:p>
+      <w:pPr>
+        <w:rPr>
+          <w:b/>
+          <w:lang w:val="es-ES"/>
+        </w:rPr>
+      </w:pPr>
+      <w:r>
+        <w:rPr>
+          <w:b/>
+          <w:lang w:val="es-ES"/>
+        </w:rPr>
+        <w:t xml:space="preserve">Necesito que en asistencia, al presionar Ver historial me pida el curso como hasta ahora y que me pida una fecha de inicio y una fecha de fin en el informe, y que me permita seleccionar todo el curso o un estudiante en particular. Que el informe incluya un resumen de asistencias, ausentes, ausentes justificados, y llegadas tardes con la </w:t>
       </w:r>
       <w:proofErr w:type="spellStart"/>
       <w:r>
@@ -7695,7 +8027,7 @@
           <w:b/>
           <w:lang w:val="es-ES"/>
         </w:rPr>
-        <w:t>esta</w:t>
+        <w:t>hs</w:t>
       </w:r>
       <w:proofErr w:type="spellEnd"/>
       <w:r>
@@ -7703,384 +8035,6 @@
           <w:b/>
           <w:lang w:val="es-ES"/>
         </w:rPr>
-        <w:t xml:space="preserve"> el establecimiento, para ello debes tomar los datos de </w:t>
-      </w:r>
-      <w:r>
-        <w:rPr>
-          <w:b/>
-          <w:lang w:val="es-ES"/>
-        </w:rPr>
-        <w:t xml:space="preserve">la </w:t>
-      </w:r>
-      <w:r>
-        <w:rPr>
-          <w:b/>
-          <w:lang w:val="es-ES"/>
-        </w:rPr>
-        <w:t xml:space="preserve">tabla de establecimientos, done se guarda, </w:t>
-      </w:r>
-      <w:proofErr w:type="spellStart"/>
-      <w:r>
-        <w:rPr>
-          <w:b/>
-          <w:lang w:val="es-ES"/>
-        </w:rPr>
-        <w:t>Denominacion</w:t>
-      </w:r>
-      <w:proofErr w:type="spellEnd"/>
-      <w:r>
-        <w:rPr>
-          <w:b/>
-          <w:lang w:val="es-ES"/>
-        </w:rPr>
-        <w:t xml:space="preserve">, Nombre, Domicilio, </w:t>
-      </w:r>
-      <w:proofErr w:type="spellStart"/>
-      <w:r>
-        <w:rPr>
-          <w:b/>
-          <w:lang w:val="es-ES"/>
-        </w:rPr>
-        <w:t>Telefono</w:t>
-      </w:r>
-      <w:proofErr w:type="spellEnd"/>
-      <w:r>
-        <w:rPr>
-          <w:b/>
-          <w:lang w:val="es-ES"/>
-        </w:rPr>
-        <w:t xml:space="preserve">. </w:t>
-      </w:r>
-    </w:p>
-    <w:p>
-      <w:pPr>
-        <w:rPr>
-          <w:b/>
-          <w:lang w:val="es-ES"/>
-        </w:rPr>
-      </w:pPr>
-      <w:r>
-        <w:rPr>
-          <w:b/>
-          <w:lang w:val="es-ES"/>
-        </w:rPr>
-        <w:t xml:space="preserve">Necesito que en la card </w:t>
-      </w:r>
-      <w:r>
-        <w:rPr>
-          <w:b/>
-          <w:lang w:val="es-ES"/>
-        </w:rPr>
-        <w:t>Próximo</w:t>
-      </w:r>
-      <w:r>
-        <w:rPr>
-          <w:b/>
-          <w:lang w:val="es-ES"/>
-        </w:rPr>
-        <w:t xml:space="preserve"> establecimiento: </w:t>
-      </w:r>
-      <w:r>
-        <w:rPr>
-          <w:b/>
-          <w:lang w:val="es-ES"/>
-        </w:rPr>
-        <w:t xml:space="preserve">me </w:t>
-      </w:r>
-      <w:r>
-        <w:rPr>
-          <w:b/>
-          <w:lang w:val="es-ES"/>
-        </w:rPr>
-        <w:t xml:space="preserve">muestre desde la base de datos </w:t>
-      </w:r>
-      <w:r>
-        <w:rPr>
-          <w:b/>
-          <w:lang w:val="es-ES"/>
-        </w:rPr>
-        <w:t xml:space="preserve">a que escuela y curso debo ir a </w:t>
-      </w:r>
-      <w:r>
-        <w:rPr>
-          <w:b/>
-          <w:lang w:val="es-ES"/>
-        </w:rPr>
-        <w:t>continuación</w:t>
-      </w:r>
-      <w:r>
-        <w:rPr>
-          <w:b/>
-          <w:lang w:val="es-ES"/>
-        </w:rPr>
-        <w:t>.</w:t>
-      </w:r>
-    </w:p>
-    <w:p>
-      <w:pPr>
-        <w:rPr>
-          <w:b/>
-          <w:lang w:val="es-ES"/>
-        </w:rPr>
-      </w:pPr>
-      <w:r>
-        <w:rPr>
-          <w:b/>
-          <w:lang w:val="es-ES"/>
-        </w:rPr>
-        <w:t xml:space="preserve">Necesito que de la card de listado de estudiantes </w:t>
-      </w:r>
-      <w:r>
-        <w:rPr>
-          <w:b/>
-          <w:lang w:val="es-ES"/>
-        </w:rPr>
-        <w:t xml:space="preserve">del dashboard </w:t>
-      </w:r>
-      <w:r>
-        <w:rPr>
-          <w:b/>
-          <w:lang w:val="es-ES"/>
-        </w:rPr>
-        <w:t xml:space="preserve">me saques el </w:t>
-      </w:r>
-      <w:proofErr w:type="spellStart"/>
-      <w:r>
-        <w:rPr>
-          <w:b/>
-          <w:lang w:val="es-ES"/>
-        </w:rPr>
-        <w:t>titulo</w:t>
-      </w:r>
-      <w:proofErr w:type="spellEnd"/>
-      <w:r>
-        <w:rPr>
-          <w:b/>
-          <w:lang w:val="es-ES"/>
-        </w:rPr>
-        <w:t xml:space="preserve"> de materia, </w:t>
-      </w:r>
-      <w:proofErr w:type="spellStart"/>
-      <w:r>
-        <w:rPr>
-          <w:b/>
-          <w:lang w:val="es-ES"/>
-        </w:rPr>
-        <w:t>cursohorario</w:t>
-      </w:r>
-      <w:proofErr w:type="spellEnd"/>
-      <w:r>
-        <w:rPr>
-          <w:b/>
-          <w:lang w:val="es-ES"/>
-        </w:rPr>
-        <w:t xml:space="preserve"> y establecimiento, que solo me muestre la lista de estudiantes, y que los botones de acción sean </w:t>
-      </w:r>
-      <w:proofErr w:type="spellStart"/>
-      <w:r>
-        <w:rPr>
-          <w:b/>
-          <w:lang w:val="es-ES"/>
-        </w:rPr>
-        <w:t>mas</w:t>
-      </w:r>
-      <w:proofErr w:type="spellEnd"/>
-      <w:r>
-        <w:rPr>
-          <w:b/>
-          <w:lang w:val="es-ES"/>
-        </w:rPr>
-        <w:t xml:space="preserve"> anchos</w:t>
-      </w:r>
-      <w:r>
-        <w:rPr>
-          <w:b/>
-          <w:lang w:val="es-ES"/>
-        </w:rPr>
-        <w:t xml:space="preserve"> </w:t>
-      </w:r>
-      <w:proofErr w:type="spellStart"/>
-      <w:r>
-        <w:rPr>
-          <w:b/>
-          <w:lang w:val="es-ES"/>
-        </w:rPr>
-        <w:t>aprox</w:t>
-      </w:r>
-      <w:proofErr w:type="spellEnd"/>
-      <w:r>
-        <w:rPr>
-          <w:b/>
-          <w:lang w:val="es-ES"/>
-        </w:rPr>
-        <w:t xml:space="preserve"> del ancho del </w:t>
-      </w:r>
-      <w:proofErr w:type="spellStart"/>
-      <w:r>
-        <w:rPr>
-          <w:b/>
-          <w:lang w:val="es-ES"/>
-        </w:rPr>
-        <w:t>titulo</w:t>
-      </w:r>
-      <w:proofErr w:type="spellEnd"/>
-      <w:r>
-        <w:rPr>
-          <w:b/>
-          <w:lang w:val="es-ES"/>
-        </w:rPr>
-        <w:t xml:space="preserve"> de la columna en la que se encuentran</w:t>
-      </w:r>
-      <w:r>
-        <w:rPr>
-          <w:b/>
-          <w:lang w:val="es-ES"/>
-        </w:rPr>
-        <w:t xml:space="preserve"> y con relleno de color, el icono en líneas blancas.</w:t>
-      </w:r>
-    </w:p>
-    <w:p>
-      <w:pPr>
-        <w:rPr>
-          <w:b/>
-          <w:lang w:val="es-ES"/>
-        </w:rPr>
-      </w:pPr>
-      <w:r>
-        <w:rPr>
-          <w:b/>
-          <w:lang w:val="es-ES"/>
-        </w:rPr>
-        <w:t>Necesito que los establecimientos</w:t>
-      </w:r>
-      <w:r>
-        <w:rPr>
-          <w:b/>
-          <w:lang w:val="es-ES"/>
-        </w:rPr>
-        <w:t xml:space="preserve"> que los cards de </w:t>
-      </w:r>
-      <w:proofErr w:type="spellStart"/>
-      <w:r>
-        <w:rPr>
-          <w:b/>
-          <w:lang w:val="es-ES"/>
-        </w:rPr>
-        <w:t>Proximo</w:t>
-      </w:r>
-      <w:proofErr w:type="spellEnd"/>
-      <w:r>
-        <w:rPr>
-          <w:b/>
-          <w:lang w:val="es-ES"/>
-        </w:rPr>
-        <w:t xml:space="preserve"> establecimiento y el de la ubicación me muestren la información de cada usuario. Y no la de otros usuarios, como el resto del sistema.</w:t>
-      </w:r>
-    </w:p>
-    <w:p>
-      <w:pPr>
-        <w:rPr>
-          <w:b/>
-          <w:lang w:val="es-ES"/>
-        </w:rPr>
-      </w:pPr>
-      <w:r>
-        <w:rPr>
-          <w:b/>
-          <w:lang w:val="es-ES"/>
-        </w:rPr>
-        <w:t>Corregir error al intentar cargar niveles educativos</w:t>
-      </w:r>
-    </w:p>
-    <w:p>
-      <w:pPr>
-        <w:rPr>
-          <w:lang w:val="es-ES"/>
-        </w:rPr>
-      </w:pPr>
-      <w:r>
-        <w:rPr>
-          <w:lang w:val="es-ES"/>
-        </w:rPr>
-        <w:t xml:space="preserve">Necesito que cuando registro la asistencia se acuerde de la materia y el curso, y me muestre el listado de estudiantes, con un pequeño resumen en la parte superior de presentes, ausentes, ausentes justificados, y tarde en el </w:t>
-      </w:r>
-      <w:proofErr w:type="spellStart"/>
-      <w:r>
-        <w:rPr>
-          <w:lang w:val="es-ES"/>
-        </w:rPr>
-        <w:t>dia</w:t>
-      </w:r>
-      <w:proofErr w:type="spellEnd"/>
-      <w:r>
-        <w:rPr>
-          <w:lang w:val="es-ES"/>
-        </w:rPr>
-        <w:t xml:space="preserve"> actual. </w:t>
-      </w:r>
-    </w:p>
-    <w:p>
-      <w:pPr>
-        <w:rPr>
-          <w:lang w:val="es-ES"/>
-        </w:rPr>
-      </w:pPr>
-      <w:r>
-        <w:rPr>
-          <w:lang w:val="es-ES"/>
-        </w:rPr>
-        <w:t>Necesito</w:t>
-      </w:r>
-      <w:r>
-        <w:rPr>
-          <w:lang w:val="es-ES"/>
-        </w:rPr>
-        <w:t xml:space="preserve"> que cuando le ponga volver en la vista de registro de asistencia, también se acuerde de la materia y curso seleccionada.</w:t>
-      </w:r>
-    </w:p>
-    <w:p>
-      <w:pPr>
-        <w:rPr>
-          <w:b/>
-          <w:lang w:val="es-ES"/>
-        </w:rPr>
-      </w:pPr>
-      <w:r>
-        <w:rPr>
-          <w:b/>
-          <w:lang w:val="es-ES"/>
-        </w:rPr>
-        <w:t>Necesito que tomar asistencia del menú Actividad áulica se pase a llamar Asistencia.</w:t>
-      </w:r>
-    </w:p>
-    <w:p>
-      <w:pPr>
-        <w:rPr>
-          <w:b/>
-          <w:lang w:val="es-ES"/>
-        </w:rPr>
-      </w:pPr>
-      <w:r>
-        <w:rPr>
-          <w:b/>
-          <w:lang w:val="es-ES"/>
-        </w:rPr>
-        <w:t xml:space="preserve">Necesito que en asistencia, al presionar Ver historial me pida el curso como hasta ahora y que me pida una fecha de inicio y una fecha de fin en el informe, y que me permita seleccionar todo el curso o un estudiante en particular. Que el informe incluya un resumen de asistencias, ausentes, ausentes justificados, y llegadas tardes con la </w:t>
-      </w:r>
-      <w:proofErr w:type="spellStart"/>
-      <w:r>
-        <w:rPr>
-          <w:b/>
-          <w:lang w:val="es-ES"/>
-        </w:rPr>
-        <w:t>hs</w:t>
-      </w:r>
-      <w:proofErr w:type="spellEnd"/>
-      <w:r>
-        <w:rPr>
-          <w:b/>
-          <w:lang w:val="es-ES"/>
-        </w:rPr>
         <w:t xml:space="preserve"> de llegada,</w:t>
       </w:r>
       <w:r>
@@ -8115,11 +8069,15 @@
     <w:p>
       <w:pPr>
         <w:rPr>
-          <w:lang w:val="es-ES"/>
-        </w:rPr>
-      </w:pPr>
-      <w:r>
-        <w:rPr>
+          <w:b/>
+          <w:color w:val="FFC000"/>
+          <w:lang w:val="es-ES"/>
+        </w:rPr>
+      </w:pPr>
+      <w:r>
+        <w:rPr>
+          <w:b/>
+          <w:color w:val="FFC000"/>
           <w:lang w:val="es-ES"/>
         </w:rPr>
         <w:lastRenderedPageBreak/>
@@ -8381,6 +8339,8 @@
       </w:pPr>
       <w:r>
         <w:rPr>
+          <w:b/>
+          <w:color w:val="FFC000"/>
           <w:lang w:val="es-ES"/>
         </w:rPr>
         <w:t xml:space="preserve">Cuando </w:t>
@@ -8388,6 +8348,8 @@
       <w:proofErr w:type="spellStart"/>
       <w:r>
         <w:rPr>
+          <w:b/>
+          <w:color w:val="FFC000"/>
           <w:lang w:val="es-ES"/>
         </w:rPr>
         <w:t>intento</w:t>
@@ -8395,6 +8357,8 @@
       <w:proofErr w:type="spellEnd"/>
       <w:r>
         <w:rPr>
+          <w:b/>
+          <w:color w:val="FFC000"/>
           <w:lang w:val="es-ES"/>
         </w:rPr>
         <w:t xml:space="preserve"> ingresar con las credenciales </w:t>
@@ -8403,6 +8367,8 @@
         <w:r>
           <w:rPr>
             <w:rStyle w:val="Hipervnculo"/>
+            <w:b/>
+            <w:color w:val="FFC000"/>
             <w:lang w:val="es-ES"/>
           </w:rPr>
           <w:t>admin@gestionaula.com</w:t>
@@ -8410,6 +8376,8 @@
       </w:hyperlink>
       <w:r>
         <w:rPr>
+          <w:b/>
+          <w:color w:val="FFC000"/>
           <w:lang w:val="es-ES"/>
         </w:rPr>
         <w:t xml:space="preserve">, y </w:t>
@@ -8417,6 +8385,8 @@
       <w:proofErr w:type="spellStart"/>
       <w:r>
         <w:rPr>
+          <w:b/>
+          <w:color w:val="FFC000"/>
           <w:lang w:val="es-ES"/>
         </w:rPr>
         <w:t>password</w:t>
@@ -8424,13 +8394,35 @@
       <w:proofErr w:type="spellEnd"/>
       <w:r>
         <w:rPr>
-          <w:lang w:val="es-ES"/>
-        </w:rPr>
-        <w:t xml:space="preserve"> admin1234, entra , se </w:t>
+          <w:b/>
+          <w:color w:val="FFC000"/>
+          <w:lang w:val="es-ES"/>
+        </w:rPr>
+        <w:t xml:space="preserve"> admin1234, </w:t>
+      </w:r>
+      <w:proofErr w:type="gramStart"/>
+      <w:r>
+        <w:rPr>
+          <w:b/>
+          <w:color w:val="FFC000"/>
+          <w:lang w:val="es-ES"/>
+        </w:rPr>
+        <w:t>entra ,</w:t>
+      </w:r>
+      <w:proofErr w:type="gramEnd"/>
+      <w:r>
+        <w:rPr>
+          <w:b/>
+          <w:color w:val="FFC000"/>
+          <w:lang w:val="es-ES"/>
+        </w:rPr>
+        <w:t xml:space="preserve"> se </w:t>
       </w:r>
       <w:proofErr w:type="spellStart"/>
       <w:r>
         <w:rPr>
+          <w:b/>
+          <w:color w:val="FFC000"/>
           <w:lang w:val="es-ES"/>
         </w:rPr>
         <w:t>logea</w:t>
@@ -8438,6 +8430,8 @@
       <w:proofErr w:type="spellEnd"/>
       <w:r>
         <w:rPr>
+          <w:b/>
+          <w:color w:val="FFC000"/>
           <w:lang w:val="es-ES"/>
         </w:rPr>
         <w:t xml:space="preserve"> como administrador, pero no me </w:t>
@@ -8445,6 +8439,8 @@
       <w:proofErr w:type="spellStart"/>
       <w:r>
         <w:rPr>
+          <w:b/>
+          <w:color w:val="FFC000"/>
           <w:lang w:val="es-ES"/>
         </w:rPr>
         <w:t>dirije</w:t>
@@ -8452,6 +8448,8 @@
       <w:proofErr w:type="spellEnd"/>
       <w:r>
         <w:rPr>
+          <w:b/>
+          <w:color w:val="FFC000"/>
           <w:lang w:val="es-ES"/>
         </w:rPr>
         <w:t xml:space="preserve"> al dashboard de administrador, me manda al dashboard de los usuarios “docentes”, cuando coloco el /</w:t>
@@ -8459,6 +8457,8 @@
       <w:proofErr w:type="spellStart"/>
       <w:r>
         <w:rPr>
+          <w:b/>
+          <w:color w:val="FFC000"/>
           <w:lang w:val="es-ES"/>
         </w:rPr>
         <w:t>admin</w:t>
@@ -8466,134 +8466,284 @@
       <w:proofErr w:type="spellEnd"/>
       <w:r>
         <w:rPr>
-          <w:lang w:val="es-ES"/>
-        </w:rPr>
-        <w:t xml:space="preserve"> me pone el men</w:t>
-      </w:r>
+          <w:b/>
+          <w:color w:val="FFC000"/>
+          <w:lang w:val="es-ES"/>
+        </w:rPr>
+        <w:t xml:space="preserve"> me pone el mensaje en </w:t>
+      </w:r>
+      <w:proofErr w:type="spellStart"/>
+      <w:r>
+        <w:rPr>
+          <w:b/>
+          <w:color w:val="FFC000"/>
+          <w:lang w:val="es-ES"/>
+        </w:rPr>
+        <w:t>ingles</w:t>
+      </w:r>
+      <w:proofErr w:type="spellEnd"/>
+      <w:r>
+        <w:rPr>
+          <w:b/>
+          <w:color w:val="FFC000"/>
+          <w:lang w:val="es-ES"/>
+        </w:rPr>
+        <w:t xml:space="preserve">, 403 </w:t>
+      </w:r>
+      <w:proofErr w:type="spellStart"/>
+      <w:r>
+        <w:rPr>
+          <w:b/>
+          <w:color w:val="FFC000"/>
+          <w:lang w:val="es-ES"/>
+        </w:rPr>
+        <w:t>User</w:t>
+      </w:r>
+      <w:proofErr w:type="spellEnd"/>
+      <w:r>
+        <w:rPr>
+          <w:b/>
+          <w:color w:val="FFC000"/>
+          <w:lang w:val="es-ES"/>
+        </w:rPr>
+        <w:t xml:space="preserve"> </w:t>
+      </w:r>
+      <w:proofErr w:type="spellStart"/>
+      <w:r>
+        <w:rPr>
+          <w:b/>
+          <w:color w:val="FFC000"/>
+          <w:lang w:val="es-ES"/>
+        </w:rPr>
+        <w:t>does</w:t>
+      </w:r>
+      <w:proofErr w:type="spellEnd"/>
+      <w:r>
+        <w:rPr>
+          <w:b/>
+          <w:color w:val="FFC000"/>
+          <w:lang w:val="es-ES"/>
+        </w:rPr>
+        <w:t xml:space="preserve"> </w:t>
+      </w:r>
+      <w:proofErr w:type="spellStart"/>
+      <w:r>
+        <w:rPr>
+          <w:b/>
+          <w:color w:val="FFC000"/>
+          <w:lang w:val="es-ES"/>
+        </w:rPr>
+        <w:t>not</w:t>
+      </w:r>
+      <w:proofErr w:type="spellEnd"/>
+      <w:r>
+        <w:rPr>
+          <w:b/>
+          <w:color w:val="FFC000"/>
+          <w:lang w:val="es-ES"/>
+        </w:rPr>
+        <w:t xml:space="preserve"> </w:t>
+      </w:r>
+      <w:proofErr w:type="spellStart"/>
+      <w:r>
+        <w:rPr>
+          <w:b/>
+          <w:color w:val="FFC000"/>
+          <w:lang w:val="es-ES"/>
+        </w:rPr>
+        <w:t>have</w:t>
+      </w:r>
+      <w:proofErr w:type="spellEnd"/>
+      <w:r>
+        <w:rPr>
+          <w:b/>
+          <w:color w:val="FFC000"/>
+          <w:lang w:val="es-ES"/>
+        </w:rPr>
+        <w:t xml:space="preserve"> </w:t>
+      </w:r>
+      <w:proofErr w:type="spellStart"/>
+      <w:r>
+        <w:rPr>
+          <w:b/>
+          <w:color w:val="FFC000"/>
+          <w:lang w:val="es-ES"/>
+        </w:rPr>
+        <w:t>the</w:t>
+      </w:r>
+      <w:proofErr w:type="spellEnd"/>
+      <w:r>
+        <w:rPr>
+          <w:b/>
+          <w:color w:val="FFC000"/>
+          <w:lang w:val="es-ES"/>
+        </w:rPr>
+        <w:t xml:space="preserve"> </w:t>
+      </w:r>
+      <w:proofErr w:type="spellStart"/>
+      <w:r>
+        <w:rPr>
+          <w:b/>
+          <w:color w:val="FFC000"/>
+          <w:lang w:val="es-ES"/>
+        </w:rPr>
+        <w:t>right</w:t>
+      </w:r>
+      <w:proofErr w:type="spellEnd"/>
+      <w:r>
+        <w:rPr>
+          <w:b/>
+          <w:color w:val="FFC000"/>
+          <w:lang w:val="es-ES"/>
+        </w:rPr>
+        <w:t xml:space="preserve"> roles</w:t>
+      </w:r>
+      <w:r>
+        <w:rPr>
+          <w:lang w:val="es-ES"/>
+        </w:rPr>
+        <w:t>.</w:t>
+      </w:r>
+    </w:p>
+    <w:p>
+      <w:pPr>
+        <w:tabs>
+          <w:tab w:val="left" w:pos="1792"/>
+        </w:tabs>
+        <w:rPr>
+          <w:lang w:val="es-ES"/>
+        </w:rPr>
+      </w:pPr>
       <w:bookmarkStart w:id="0" w:name="_GoBack"/>
+      <w:r>
+        <w:rPr>
+          <w:lang w:val="es-ES"/>
+        </w:rPr>
+        <w:t xml:space="preserve">Sigo sin </w:t>
+      </w:r>
+      <w:r>
+        <w:rPr>
+          <w:lang w:val="es-ES"/>
+        </w:rPr>
+        <w:t xml:space="preserve">poder ver el dashboard de </w:t>
+      </w:r>
+      <w:proofErr w:type="spellStart"/>
+      <w:r>
+        <w:rPr>
+          <w:lang w:val="es-ES"/>
+        </w:rPr>
+        <w:t>admin</w:t>
+      </w:r>
+      <w:proofErr w:type="spellEnd"/>
+      <w:r>
+        <w:rPr>
+          <w:lang w:val="es-ES"/>
+        </w:rPr>
+        <w:t xml:space="preserve"> </w:t>
+      </w:r>
+      <w:proofErr w:type="spellStart"/>
+      <w:r>
+        <w:rPr>
+          <w:lang w:val="es-ES"/>
+        </w:rPr>
+        <w:t>logeado</w:t>
+      </w:r>
+      <w:proofErr w:type="spellEnd"/>
+      <w:r>
+        <w:rPr>
+          <w:lang w:val="es-ES"/>
+        </w:rPr>
+        <w:t xml:space="preserve"> como </w:t>
+      </w:r>
+      <w:proofErr w:type="spellStart"/>
+      <w:r>
+        <w:rPr>
+          <w:lang w:val="es-ES"/>
+        </w:rPr>
+        <w:t>admin</w:t>
+      </w:r>
+      <w:proofErr w:type="spellEnd"/>
+      <w:r>
+        <w:rPr>
+          <w:lang w:val="es-ES"/>
+        </w:rPr>
+        <w:t>.</w:t>
+      </w:r>
+    </w:p>
+    <w:p>
+      <w:pPr>
+        <w:tabs>
+          <w:tab w:val="left" w:pos="1792"/>
+        </w:tabs>
+        <w:rPr>
+          <w:lang w:val="es-ES"/>
+        </w:rPr>
+      </w:pPr>
+      <w:r>
+        <w:rPr>
+          <w:lang w:val="es-ES"/>
+        </w:rPr>
+        <w:t xml:space="preserve">Necesito agregar funcionalidad de manejo de roles y permisos a los usuarios, desde el dashboard de administración, y generar un usuario </w:t>
+      </w:r>
+      <w:proofErr w:type="spellStart"/>
+      <w:r>
+        <w:rPr>
+          <w:lang w:val="es-ES"/>
+        </w:rPr>
+        <w:t>superadmin</w:t>
+      </w:r>
+      <w:proofErr w:type="spellEnd"/>
+      <w:r>
+        <w:rPr>
+          <w:lang w:val="es-ES"/>
+        </w:rPr>
+        <w:t xml:space="preserve"> que pueda hacer todo</w:t>
+      </w:r>
+    </w:p>
+    <w:p>
+      <w:pPr>
+        <w:tabs>
+          <w:tab w:val="left" w:pos="1792"/>
+        </w:tabs>
+        <w:rPr>
+          <w:lang w:val="es-ES"/>
+        </w:rPr>
+      </w:pPr>
+      <w:r>
+        <w:rPr>
+          <w:lang w:val="es-ES"/>
+        </w:rPr>
+        <w:t xml:space="preserve">Necesito que los datos de los </w:t>
+      </w:r>
+      <w:proofErr w:type="spellStart"/>
+      <w:r>
+        <w:rPr>
+          <w:lang w:val="es-ES"/>
+        </w:rPr>
+        <w:t>graficos</w:t>
+      </w:r>
+      <w:proofErr w:type="spellEnd"/>
+      <w:r>
+        <w:rPr>
+          <w:lang w:val="es-ES"/>
+        </w:rPr>
+        <w:t xml:space="preserve"> solo se </w:t>
+      </w:r>
+      <w:proofErr w:type="spellStart"/>
+      <w:r>
+        <w:rPr>
+          <w:lang w:val="es-ES"/>
+        </w:rPr>
+        <w:t>actualizen</w:t>
+      </w:r>
+      <w:proofErr w:type="spellEnd"/>
+      <w:r>
+        <w:rPr>
+          <w:lang w:val="es-ES"/>
+        </w:rPr>
+        <w:t>, una vez al ingresar el docente, u otra vez al tomar asistencia, o al cambiar de hora y tomar los datos nuevos, del nuevo horario y curso y no constantemente o al actualizar el dashboard.</w:t>
+      </w:r>
       <w:bookmarkEnd w:id="0"/>
-      <w:r>
-        <w:rPr>
-          <w:lang w:val="es-ES"/>
-        </w:rPr>
-        <w:t xml:space="preserve">saje en </w:t>
-      </w:r>
-      <w:proofErr w:type="spellStart"/>
-      <w:r>
-        <w:rPr>
-          <w:lang w:val="es-ES"/>
-        </w:rPr>
-        <w:t>ingles</w:t>
-      </w:r>
-      <w:proofErr w:type="spellEnd"/>
-      <w:r>
-        <w:rPr>
-          <w:lang w:val="es-ES"/>
-        </w:rPr>
-        <w:t xml:space="preserve">, </w:t>
-      </w:r>
-      <w:r>
-        <w:rPr>
-          <w:lang w:val="es-ES"/>
-        </w:rPr>
-        <w:t>403</w:t>
-      </w:r>
-      <w:r>
-        <w:rPr>
-          <w:lang w:val="es-ES"/>
-        </w:rPr>
-        <w:t xml:space="preserve"> </w:t>
-      </w:r>
-      <w:proofErr w:type="spellStart"/>
-      <w:r>
-        <w:rPr>
-          <w:lang w:val="es-ES"/>
-        </w:rPr>
-        <w:t>User</w:t>
-      </w:r>
-      <w:proofErr w:type="spellEnd"/>
-      <w:r>
-        <w:rPr>
-          <w:lang w:val="es-ES"/>
-        </w:rPr>
-        <w:t xml:space="preserve"> </w:t>
-      </w:r>
-      <w:proofErr w:type="spellStart"/>
-      <w:r>
-        <w:rPr>
-          <w:lang w:val="es-ES"/>
-        </w:rPr>
-        <w:t>does</w:t>
-      </w:r>
-      <w:proofErr w:type="spellEnd"/>
-      <w:r>
-        <w:rPr>
-          <w:lang w:val="es-ES"/>
-        </w:rPr>
-        <w:t xml:space="preserve"> </w:t>
-      </w:r>
-      <w:proofErr w:type="spellStart"/>
-      <w:r>
-        <w:rPr>
-          <w:lang w:val="es-ES"/>
-        </w:rPr>
-        <w:t>not</w:t>
-      </w:r>
-      <w:proofErr w:type="spellEnd"/>
-      <w:r>
-        <w:rPr>
-          <w:lang w:val="es-ES"/>
-        </w:rPr>
-        <w:t xml:space="preserve"> </w:t>
-      </w:r>
-      <w:proofErr w:type="spellStart"/>
-      <w:r>
-        <w:rPr>
-          <w:lang w:val="es-ES"/>
-        </w:rPr>
-        <w:t>have</w:t>
-      </w:r>
-      <w:proofErr w:type="spellEnd"/>
-      <w:r>
-        <w:rPr>
-          <w:lang w:val="es-ES"/>
-        </w:rPr>
-        <w:t xml:space="preserve"> </w:t>
-      </w:r>
-      <w:proofErr w:type="spellStart"/>
-      <w:r>
-        <w:rPr>
-          <w:lang w:val="es-ES"/>
-        </w:rPr>
-        <w:t>the</w:t>
-      </w:r>
-      <w:proofErr w:type="spellEnd"/>
-      <w:r>
-        <w:rPr>
-          <w:lang w:val="es-ES"/>
-        </w:rPr>
-        <w:t xml:space="preserve"> </w:t>
-      </w:r>
-      <w:proofErr w:type="spellStart"/>
-      <w:r>
-        <w:rPr>
-          <w:lang w:val="es-ES"/>
-        </w:rPr>
-        <w:t>right</w:t>
-      </w:r>
-      <w:proofErr w:type="spellEnd"/>
-      <w:r>
-        <w:rPr>
-          <w:lang w:val="es-ES"/>
-        </w:rPr>
-        <w:t xml:space="preserve"> roles</w:t>
-      </w:r>
-      <w:r>
-        <w:rPr>
-          <w:lang w:val="es-ES"/>
-        </w:rPr>
-        <w:t>.</w:t>
-      </w:r>
     </w:p>
     <w:p>
       <w:pPr>
@@ -12505,7 +12655,7 @@
 </file>
 
 <file path=customXml/itemProps1.xml><?xml version="1.0" encoding="utf-8"?>
-<ds:datastoreItem xmlns:ds="http://schemas.openxmlformats.org/officeDocument/2006/customXml" ds:itemID="{D607DDE8-49E0-4F09-AC4B-4CB0466C19C8}">
+<ds:datastoreItem xmlns:ds="http://schemas.openxmlformats.org/officeDocument/2006/customXml" ds:itemID="{0ABB46EC-B2A3-4110-B612-F255FFF490AE}">
   <ds:schemaRefs>
     <ds:schemaRef ds:uri="http://schemas.openxmlformats.org/officeDocument/2006/bibliography"/>
   </ds:schemaRefs>

</xml_diff>

<commit_message>
incorporo funcionalidad de suscripcion de clientes y pasarela de pagos de mp y paypal
</commit_message>
<xml_diff>
--- a/requerimientos.docx
+++ b/requerimientos.docx
@@ -8334,13 +8334,13 @@
     <w:p>
       <w:pPr>
         <w:rPr>
-          <w:lang w:val="es-ES"/>
-        </w:rPr>
-      </w:pPr>
-      <w:r>
-        <w:rPr>
-          <w:b/>
-          <w:color w:val="FFC000"/>
+          <w:b/>
+          <w:lang w:val="es-ES"/>
+        </w:rPr>
+      </w:pPr>
+      <w:r>
+        <w:rPr>
+          <w:b/>
           <w:lang w:val="es-ES"/>
         </w:rPr>
         <w:t xml:space="preserve">Cuando </w:t>
@@ -8349,7 +8349,6 @@
       <w:r>
         <w:rPr>
           <w:b/>
-          <w:color w:val="FFC000"/>
           <w:lang w:val="es-ES"/>
         </w:rPr>
         <w:t>intento</w:t>
@@ -8358,7 +8357,6 @@
       <w:r>
         <w:rPr>
           <w:b/>
-          <w:color w:val="FFC000"/>
           <w:lang w:val="es-ES"/>
         </w:rPr>
         <w:t xml:space="preserve"> ingresar con las credenciales </w:t>
@@ -8368,7 +8366,7 @@
           <w:rPr>
             <w:rStyle w:val="Hipervnculo"/>
             <w:b/>
-            <w:color w:val="FFC000"/>
+            <w:color w:val="auto"/>
             <w:lang w:val="es-ES"/>
           </w:rPr>
           <w:t>admin@gestionaula.com</w:t>
@@ -8377,7 +8375,6 @@
       <w:r>
         <w:rPr>
           <w:b/>
-          <w:color w:val="FFC000"/>
           <w:lang w:val="es-ES"/>
         </w:rPr>
         <w:t xml:space="preserve">, y </w:t>
@@ -8386,7 +8383,6 @@
       <w:r>
         <w:rPr>
           <w:b/>
-          <w:color w:val="FFC000"/>
           <w:lang w:val="es-ES"/>
         </w:rPr>
         <w:t>password</w:t>
@@ -8395,7 +8391,6 @@
       <w:r>
         <w:rPr>
           <w:b/>
-          <w:color w:val="FFC000"/>
           <w:lang w:val="es-ES"/>
         </w:rPr>
         <w:t xml:space="preserve"> admin1234, </w:t>
@@ -8404,7 +8399,6 @@
       <w:r>
         <w:rPr>
           <w:b/>
-          <w:color w:val="FFC000"/>
           <w:lang w:val="es-ES"/>
         </w:rPr>
         <w:t>entra ,</w:t>
@@ -8413,7 +8407,6 @@
       <w:r>
         <w:rPr>
           <w:b/>
-          <w:color w:val="FFC000"/>
           <w:lang w:val="es-ES"/>
         </w:rPr>
         <w:t xml:space="preserve"> se </w:t>
@@ -8422,7 +8415,6 @@
       <w:r>
         <w:rPr>
           <w:b/>
-          <w:color w:val="FFC000"/>
           <w:lang w:val="es-ES"/>
         </w:rPr>
         <w:t>logea</w:t>
@@ -8431,7 +8423,6 @@
       <w:r>
         <w:rPr>
           <w:b/>
-          <w:color w:val="FFC000"/>
           <w:lang w:val="es-ES"/>
         </w:rPr>
         <w:t xml:space="preserve"> como administrador, pero no me </w:t>
@@ -8440,7 +8431,6 @@
       <w:r>
         <w:rPr>
           <w:b/>
-          <w:color w:val="FFC000"/>
           <w:lang w:val="es-ES"/>
         </w:rPr>
         <w:t>dirije</w:t>
@@ -8449,7 +8439,6 @@
       <w:r>
         <w:rPr>
           <w:b/>
-          <w:color w:val="FFC000"/>
           <w:lang w:val="es-ES"/>
         </w:rPr>
         <w:t xml:space="preserve"> al dashboard de administrador, me manda al dashboard de los usuarios “docentes”, cuando coloco el /</w:t>
@@ -8458,7 +8447,6 @@
       <w:r>
         <w:rPr>
           <w:b/>
-          <w:color w:val="FFC000"/>
           <w:lang w:val="es-ES"/>
         </w:rPr>
         <w:t>admin</w:t>
@@ -8467,7 +8455,6 @@
       <w:r>
         <w:rPr>
           <w:b/>
-          <w:color w:val="FFC000"/>
           <w:lang w:val="es-ES"/>
         </w:rPr>
         <w:t xml:space="preserve"> me pone el mensaje en </w:t>
@@ -8476,7 +8463,6 @@
       <w:r>
         <w:rPr>
           <w:b/>
-          <w:color w:val="FFC000"/>
           <w:lang w:val="es-ES"/>
         </w:rPr>
         <w:t>ingles</w:t>
@@ -8485,7 +8471,6 @@
       <w:r>
         <w:rPr>
           <w:b/>
-          <w:color w:val="FFC000"/>
           <w:lang w:val="es-ES"/>
         </w:rPr>
         <w:t xml:space="preserve">, 403 </w:t>
@@ -8494,7 +8479,6 @@
       <w:r>
         <w:rPr>
           <w:b/>
-          <w:color w:val="FFC000"/>
           <w:lang w:val="es-ES"/>
         </w:rPr>
         <w:t>User</w:t>
@@ -8503,7 +8487,6 @@
       <w:r>
         <w:rPr>
           <w:b/>
-          <w:color w:val="FFC000"/>
           <w:lang w:val="es-ES"/>
         </w:rPr>
         <w:t xml:space="preserve"> </w:t>
@@ -8512,7 +8495,6 @@
       <w:r>
         <w:rPr>
           <w:b/>
-          <w:color w:val="FFC000"/>
           <w:lang w:val="es-ES"/>
         </w:rPr>
         <w:t>does</w:t>
@@ -8521,7 +8503,6 @@
       <w:r>
         <w:rPr>
           <w:b/>
-          <w:color w:val="FFC000"/>
           <w:lang w:val="es-ES"/>
         </w:rPr>
         <w:t xml:space="preserve"> </w:t>
@@ -8530,7 +8511,6 @@
       <w:r>
         <w:rPr>
           <w:b/>
-          <w:color w:val="FFC000"/>
           <w:lang w:val="es-ES"/>
         </w:rPr>
         <w:t>not</w:t>
@@ -8539,7 +8519,6 @@
       <w:r>
         <w:rPr>
           <w:b/>
-          <w:color w:val="FFC000"/>
           <w:lang w:val="es-ES"/>
         </w:rPr>
         <w:t xml:space="preserve"> </w:t>
@@ -8548,7 +8527,6 @@
       <w:r>
         <w:rPr>
           <w:b/>
-          <w:color w:val="FFC000"/>
           <w:lang w:val="es-ES"/>
         </w:rPr>
         <w:t>have</w:t>
@@ -8557,7 +8535,6 @@
       <w:r>
         <w:rPr>
           <w:b/>
-          <w:color w:val="FFC000"/>
           <w:lang w:val="es-ES"/>
         </w:rPr>
         <w:t xml:space="preserve"> </w:t>
@@ -8566,7 +8543,6 @@
       <w:r>
         <w:rPr>
           <w:b/>
-          <w:color w:val="FFC000"/>
           <w:lang w:val="es-ES"/>
         </w:rPr>
         <w:t>the</w:t>
@@ -8575,7 +8551,6 @@
       <w:r>
         <w:rPr>
           <w:b/>
-          <w:color w:val="FFC000"/>
           <w:lang w:val="es-ES"/>
         </w:rPr>
         <w:t xml:space="preserve"> </w:t>
@@ -8584,7 +8559,6 @@
       <w:r>
         <w:rPr>
           <w:b/>
-          <w:color w:val="FFC000"/>
           <w:lang w:val="es-ES"/>
         </w:rPr>
         <w:t>right</w:t>
@@ -8593,13 +8567,79 @@
       <w:r>
         <w:rPr>
           <w:b/>
-          <w:color w:val="FFC000"/>
-          <w:lang w:val="es-ES"/>
-        </w:rPr>
-        <w:t xml:space="preserve"> roles</w:t>
-      </w:r>
-      <w:r>
-        <w:rPr>
+          <w:lang w:val="es-ES"/>
+        </w:rPr>
+        <w:t xml:space="preserve"> roles.</w:t>
+      </w:r>
+    </w:p>
+    <w:p>
+      <w:pPr>
+        <w:tabs>
+          <w:tab w:val="left" w:pos="1792"/>
+        </w:tabs>
+        <w:rPr>
+          <w:b/>
+          <w:lang w:val="es-ES"/>
+        </w:rPr>
+      </w:pPr>
+      <w:r>
+        <w:rPr>
+          <w:b/>
+          <w:lang w:val="es-ES"/>
+        </w:rPr>
+        <w:t xml:space="preserve">Sigo sin </w:t>
+      </w:r>
+      <w:r>
+        <w:rPr>
+          <w:b/>
+          <w:lang w:val="es-ES"/>
+        </w:rPr>
+        <w:t xml:space="preserve">poder ver el dashboard de </w:t>
+      </w:r>
+      <w:proofErr w:type="spellStart"/>
+      <w:r>
+        <w:rPr>
+          <w:b/>
+          <w:lang w:val="es-ES"/>
+        </w:rPr>
+        <w:t>admin</w:t>
+      </w:r>
+      <w:proofErr w:type="spellEnd"/>
+      <w:r>
+        <w:rPr>
+          <w:b/>
+          <w:lang w:val="es-ES"/>
+        </w:rPr>
+        <w:t xml:space="preserve"> </w:t>
+      </w:r>
+      <w:proofErr w:type="spellStart"/>
+      <w:r>
+        <w:rPr>
+          <w:b/>
+          <w:lang w:val="es-ES"/>
+        </w:rPr>
+        <w:t>logeado</w:t>
+      </w:r>
+      <w:proofErr w:type="spellEnd"/>
+      <w:r>
+        <w:rPr>
+          <w:b/>
+          <w:lang w:val="es-ES"/>
+        </w:rPr>
+        <w:t xml:space="preserve"> como </w:t>
+      </w:r>
+      <w:proofErr w:type="spellStart"/>
+      <w:r>
+        <w:rPr>
+          <w:b/>
+          <w:lang w:val="es-ES"/>
+        </w:rPr>
+        <w:t>admin</w:t>
+      </w:r>
+      <w:proofErr w:type="spellEnd"/>
+      <w:r>
+        <w:rPr>
+          <w:b/>
           <w:lang w:val="es-ES"/>
         </w:rPr>
         <w:t>.</w:t>
@@ -8614,135 +8654,131 @@
           <w:lang w:val="es-ES"/>
         </w:rPr>
       </w:pPr>
+      <w:r>
+        <w:rPr>
+          <w:lang w:val="es-ES"/>
+        </w:rPr>
+        <w:t xml:space="preserve">Necesito agregar funcionalidad de manejo de roles y permisos a los usuarios, desde el dashboard de administración, y generar un usuario </w:t>
+      </w:r>
+      <w:proofErr w:type="spellStart"/>
+      <w:r>
+        <w:rPr>
+          <w:lang w:val="es-ES"/>
+        </w:rPr>
+        <w:t>superadmin</w:t>
+      </w:r>
+      <w:proofErr w:type="spellEnd"/>
+      <w:r>
+        <w:rPr>
+          <w:lang w:val="es-ES"/>
+        </w:rPr>
+        <w:t xml:space="preserve"> que pueda hacer todo</w:t>
+      </w:r>
+    </w:p>
+    <w:p>
+      <w:pPr>
+        <w:tabs>
+          <w:tab w:val="left" w:pos="1792"/>
+        </w:tabs>
+        <w:rPr>
+          <w:lang w:val="es-ES"/>
+        </w:rPr>
+      </w:pPr>
+      <w:r>
+        <w:rPr>
+          <w:lang w:val="es-ES"/>
+        </w:rPr>
+        <w:t xml:space="preserve">Necesito que los datos de los </w:t>
+      </w:r>
+      <w:proofErr w:type="spellStart"/>
+      <w:r>
+        <w:rPr>
+          <w:lang w:val="es-ES"/>
+        </w:rPr>
+        <w:t>graficos</w:t>
+      </w:r>
+      <w:proofErr w:type="spellEnd"/>
+      <w:r>
+        <w:rPr>
+          <w:lang w:val="es-ES"/>
+        </w:rPr>
+        <w:t xml:space="preserve"> solo se </w:t>
+      </w:r>
+      <w:proofErr w:type="spellStart"/>
+      <w:r>
+        <w:rPr>
+          <w:lang w:val="es-ES"/>
+        </w:rPr>
+        <w:t>actualizen</w:t>
+      </w:r>
+      <w:proofErr w:type="spellEnd"/>
+      <w:r>
+        <w:rPr>
+          <w:lang w:val="es-ES"/>
+        </w:rPr>
+        <w:t>, una vez al ingresar el docente, u otra vez al tomar asistencia, o al cambiar de hora y tomar los datos nuevos, del nuevo horario y curso y no constantemente o al actualizar el dashboard.</w:t>
+      </w:r>
+    </w:p>
+    <w:p>
+      <w:pPr>
+        <w:tabs>
+          <w:tab w:val="left" w:pos="1792"/>
+        </w:tabs>
+        <w:rPr>
+          <w:lang w:val="es-ES"/>
+        </w:rPr>
+      </w:pPr>
+      <w:r>
+        <w:rPr>
+          <w:lang w:val="es-ES"/>
+        </w:rPr>
+        <w:t xml:space="preserve">Necesito que me crees una pasarela de pagos, para poder tomar pagos con mercado pago y </w:t>
+      </w:r>
+      <w:proofErr w:type="spellStart"/>
+      <w:r>
+        <w:rPr>
+          <w:lang w:val="es-ES"/>
+        </w:rPr>
+        <w:t>paypal</w:t>
+      </w:r>
+      <w:proofErr w:type="spellEnd"/>
+      <w:r>
+        <w:rPr>
+          <w:lang w:val="es-ES"/>
+        </w:rPr>
+        <w:t>.</w:t>
+      </w:r>
+    </w:p>
+    <w:p>
+      <w:pPr>
+        <w:tabs>
+          <w:tab w:val="left" w:pos="1792"/>
+        </w:tabs>
+        <w:rPr>
+          <w:lang w:val="es-ES"/>
+        </w:rPr>
+      </w:pPr>
+      <w:r>
+        <w:rPr>
+          <w:lang w:val="es-ES"/>
+        </w:rPr>
+        <w:t xml:space="preserve">Necesito agregar cuenta </w:t>
+      </w:r>
+      <w:proofErr w:type="spellStart"/>
+      <w:r>
+        <w:rPr>
+          <w:lang w:val="es-ES"/>
+        </w:rPr>
+        <w:t>dni</w:t>
+      </w:r>
+      <w:proofErr w:type="spellEnd"/>
+      <w:r>
+        <w:rPr>
+          <w:lang w:val="es-ES"/>
+        </w:rPr>
+        <w:t xml:space="preserve"> y modo.</w:t>
+      </w:r>
       <w:bookmarkStart w:id="0" w:name="_GoBack"/>
-      <w:r>
-        <w:rPr>
-          <w:lang w:val="es-ES"/>
-        </w:rPr>
-        <w:t xml:space="preserve">Sigo sin </w:t>
-      </w:r>
-      <w:r>
-        <w:rPr>
-          <w:lang w:val="es-ES"/>
-        </w:rPr>
-        <w:t xml:space="preserve">poder ver el dashboard de </w:t>
-      </w:r>
-      <w:proofErr w:type="spellStart"/>
-      <w:r>
-        <w:rPr>
-          <w:lang w:val="es-ES"/>
-        </w:rPr>
-        <w:t>admin</w:t>
-      </w:r>
-      <w:proofErr w:type="spellEnd"/>
-      <w:r>
-        <w:rPr>
-          <w:lang w:val="es-ES"/>
-        </w:rPr>
-        <w:t xml:space="preserve"> </w:t>
-      </w:r>
-      <w:proofErr w:type="spellStart"/>
-      <w:r>
-        <w:rPr>
-          <w:lang w:val="es-ES"/>
-        </w:rPr>
-        <w:t>logeado</w:t>
-      </w:r>
-      <w:proofErr w:type="spellEnd"/>
-      <w:r>
-        <w:rPr>
-          <w:lang w:val="es-ES"/>
-        </w:rPr>
-        <w:t xml:space="preserve"> como </w:t>
-      </w:r>
-      <w:proofErr w:type="spellStart"/>
-      <w:r>
-        <w:rPr>
-          <w:lang w:val="es-ES"/>
-        </w:rPr>
-        <w:t>admin</w:t>
-      </w:r>
-      <w:proofErr w:type="spellEnd"/>
-      <w:r>
-        <w:rPr>
-          <w:lang w:val="es-ES"/>
-        </w:rPr>
-        <w:t>.</w:t>
-      </w:r>
-    </w:p>
-    <w:p>
-      <w:pPr>
-        <w:tabs>
-          <w:tab w:val="left" w:pos="1792"/>
-        </w:tabs>
-        <w:rPr>
-          <w:lang w:val="es-ES"/>
-        </w:rPr>
-      </w:pPr>
-      <w:r>
-        <w:rPr>
-          <w:lang w:val="es-ES"/>
-        </w:rPr>
-        <w:t xml:space="preserve">Necesito agregar funcionalidad de manejo de roles y permisos a los usuarios, desde el dashboard de administración, y generar un usuario </w:t>
-      </w:r>
-      <w:proofErr w:type="spellStart"/>
-      <w:r>
-        <w:rPr>
-          <w:lang w:val="es-ES"/>
-        </w:rPr>
-        <w:t>superadmin</w:t>
-      </w:r>
-      <w:proofErr w:type="spellEnd"/>
-      <w:r>
-        <w:rPr>
-          <w:lang w:val="es-ES"/>
-        </w:rPr>
-        <w:t xml:space="preserve"> que pueda hacer todo</w:t>
-      </w:r>
-    </w:p>
-    <w:p>
-      <w:pPr>
-        <w:tabs>
-          <w:tab w:val="left" w:pos="1792"/>
-        </w:tabs>
-        <w:rPr>
-          <w:lang w:val="es-ES"/>
-        </w:rPr>
-      </w:pPr>
-      <w:r>
-        <w:rPr>
-          <w:lang w:val="es-ES"/>
-        </w:rPr>
-        <w:t xml:space="preserve">Necesito que los datos de los </w:t>
-      </w:r>
-      <w:proofErr w:type="spellStart"/>
-      <w:r>
-        <w:rPr>
-          <w:lang w:val="es-ES"/>
-        </w:rPr>
-        <w:t>graficos</w:t>
-      </w:r>
-      <w:proofErr w:type="spellEnd"/>
-      <w:r>
-        <w:rPr>
-          <w:lang w:val="es-ES"/>
-        </w:rPr>
-        <w:t xml:space="preserve"> solo se </w:t>
-      </w:r>
-      <w:proofErr w:type="spellStart"/>
-      <w:r>
-        <w:rPr>
-          <w:lang w:val="es-ES"/>
-        </w:rPr>
-        <w:t>actualizen</w:t>
-      </w:r>
-      <w:proofErr w:type="spellEnd"/>
-      <w:r>
-        <w:rPr>
-          <w:lang w:val="es-ES"/>
-        </w:rPr>
-        <w:t>, una vez al ingresar el docente, u otra vez al tomar asistencia, o al cambiar de hora y tomar los datos nuevos, del nuevo horario y curso y no constantemente o al actualizar el dashboard.</w:t>
-      </w:r>
       <w:bookmarkEnd w:id="0"/>
     </w:p>
     <w:p>
@@ -12655,7 +12691,7 @@
 </file>
 
 <file path=customXml/itemProps1.xml><?xml version="1.0" encoding="utf-8"?>
-<ds:datastoreItem xmlns:ds="http://schemas.openxmlformats.org/officeDocument/2006/customXml" ds:itemID="{0ABB46EC-B2A3-4110-B612-F255FFF490AE}">
+<ds:datastoreItem xmlns:ds="http://schemas.openxmlformats.org/officeDocument/2006/customXml" ds:itemID="{F190F214-B7DB-4040-9D1D-189BA5358A28}">
   <ds:schemaRefs>
     <ds:schemaRef ds:uri="http://schemas.openxmlformats.org/officeDocument/2006/bibliography"/>
   </ds:schemaRefs>

</xml_diff>

<commit_message>
se crea la landing page del sistema, con funcionalidad de registro
</commit_message>
<xml_diff>
--- a/requerimientos.docx
+++ b/requerimientos.docx
@@ -8681,11 +8681,13 @@
           <w:tab w:val="left" w:pos="1792"/>
         </w:tabs>
         <w:rPr>
-          <w:lang w:val="es-ES"/>
-        </w:rPr>
-      </w:pPr>
-      <w:r>
-        <w:rPr>
+          <w:b/>
+          <w:lang w:val="es-ES"/>
+        </w:rPr>
+      </w:pPr>
+      <w:r>
+        <w:rPr>
+          <w:b/>
           <w:lang w:val="es-ES"/>
         </w:rPr>
         <w:t xml:space="preserve">Necesito que los datos de los </w:t>
@@ -8693,6 +8695,7 @@
       <w:proofErr w:type="spellStart"/>
       <w:r>
         <w:rPr>
+          <w:b/>
           <w:lang w:val="es-ES"/>
         </w:rPr>
         <w:t>graficos</w:t>
@@ -8700,6 +8703,7 @@
       <w:proofErr w:type="spellEnd"/>
       <w:r>
         <w:rPr>
+          <w:b/>
           <w:lang w:val="es-ES"/>
         </w:rPr>
         <w:t xml:space="preserve"> solo se </w:t>
@@ -8707,6 +8711,7 @@
       <w:proofErr w:type="spellStart"/>
       <w:r>
         <w:rPr>
+          <w:b/>
           <w:lang w:val="es-ES"/>
         </w:rPr>
         <w:t>actualizen</w:t>
@@ -8714,72 +8719,652 @@
       <w:proofErr w:type="spellEnd"/>
       <w:r>
         <w:rPr>
-          <w:lang w:val="es-ES"/>
-        </w:rPr>
-        <w:t>, una vez al ingresar el docente, u otra vez al tomar asistencia, o al cambiar de hora y tomar los datos nuevos, del nuevo horario y curso y no constantemente o al actualizar el dashboard.</w:t>
-      </w:r>
-    </w:p>
-    <w:p>
-      <w:pPr>
-        <w:tabs>
-          <w:tab w:val="left" w:pos="1792"/>
-        </w:tabs>
-        <w:rPr>
-          <w:lang w:val="es-ES"/>
-        </w:rPr>
-      </w:pPr>
-      <w:r>
-        <w:rPr>
-          <w:lang w:val="es-ES"/>
-        </w:rPr>
-        <w:t xml:space="preserve">Necesito que me crees una pasarela de pagos, para poder tomar pagos con mercado pago y </w:t>
+          <w:b/>
+          <w:lang w:val="es-ES"/>
+        </w:rPr>
+        <w:t>, una vez al ingresar el docente, u otra vez al tomar asistencia, o al cambiar de hora y tomar los datos nuevos, del nuevo horario y curso</w:t>
+      </w:r>
+      <w:r>
+        <w:rPr>
+          <w:b/>
+          <w:lang w:val="es-ES"/>
+        </w:rPr>
+        <w:t xml:space="preserve"> </w:t>
+      </w:r>
+      <w:r>
+        <w:rPr>
+          <w:b/>
+          <w:lang w:val="es-ES"/>
+        </w:rPr>
+        <w:t>o al actualizar el dashboard</w:t>
+      </w:r>
+      <w:r>
+        <w:rPr>
+          <w:b/>
+          <w:lang w:val="es-ES"/>
+        </w:rPr>
+        <w:t xml:space="preserve"> y no constantemente o al actualizar el dashboard.</w:t>
+      </w:r>
+    </w:p>
+    <w:p>
+      <w:pPr>
+        <w:rPr>
+          <w:lang w:val="es-ES"/>
+        </w:rPr>
+      </w:pPr>
+      <w:r>
+        <w:rPr>
+          <w:lang w:val="es-ES"/>
+        </w:rPr>
+        <w:t xml:space="preserve">Me dejo de funcionar </w:t>
+      </w:r>
+      <w:r>
+        <w:rPr>
+          <w:lang w:val="es-ES"/>
+        </w:rPr>
+        <w:t xml:space="preserve">en el dashboard, el listado de estudiantes, </w:t>
+      </w:r>
+      <w:r>
+        <w:rPr>
+          <w:lang w:val="es-ES"/>
+        </w:rPr>
+        <w:t xml:space="preserve">que </w:t>
       </w:r>
       <w:proofErr w:type="spellStart"/>
       <w:r>
         <w:rPr>
           <w:lang w:val="es-ES"/>
         </w:rPr>
-        <w:t>paypal</w:t>
+        <w:t>aparecia</w:t>
       </w:r>
       <w:proofErr w:type="spellEnd"/>
       <w:r>
         <w:rPr>
           <w:lang w:val="es-ES"/>
         </w:rPr>
-        <w:t>.</w:t>
-      </w:r>
-    </w:p>
-    <w:p>
-      <w:pPr>
-        <w:tabs>
-          <w:tab w:val="left" w:pos="1792"/>
-        </w:tabs>
-        <w:rPr>
-          <w:lang w:val="es-ES"/>
-        </w:rPr>
-      </w:pPr>
-      <w:r>
-        <w:rPr>
-          <w:lang w:val="es-ES"/>
-        </w:rPr>
-        <w:t xml:space="preserve">Necesito agregar cuenta </w:t>
+        <w:t xml:space="preserve"> cuando me encontraba en el horario de la materia correspondiente y que </w:t>
+      </w:r>
+      <w:r>
+        <w:rPr>
+          <w:lang w:val="es-ES"/>
+        </w:rPr>
+        <w:t>me m</w:t>
+      </w:r>
+      <w:r>
+        <w:rPr>
+          <w:lang w:val="es-ES"/>
+        </w:rPr>
+        <w:t>ostraba</w:t>
+      </w:r>
+      <w:r>
+        <w:rPr>
+          <w:lang w:val="es-ES"/>
+        </w:rPr>
+        <w:t xml:space="preserve"> para cada estudiante</w:t>
+      </w:r>
+      <w:r>
+        <w:rPr>
+          <w:lang w:val="es-ES"/>
+        </w:rPr>
+        <w:t xml:space="preserve"> de ese curso</w:t>
+      </w:r>
+      <w:r>
+        <w:rPr>
+          <w:lang w:val="es-ES"/>
+        </w:rPr>
+        <w:t xml:space="preserve">, en su correspondiente renglón de la tabla, y con diferentes colores , la cantidad de presentes que tiene ese alumno, la cantidad de ausentes que tiene ese alumno, la cantidad de ausentes justificados que tiene ese alumno, la cantidad de actividades asignadas que tiene ese alumno, la cantidad de actividades entregadas a tiempo que tiene ese alumno  y </w:t>
+      </w:r>
+      <w:r>
+        <w:rPr>
+          <w:lang w:val="es-ES"/>
+        </w:rPr>
+        <w:lastRenderedPageBreak/>
+        <w:t xml:space="preserve">la cantidad de las entregadas vencidas que tiene ese alumno, la </w:t>
       </w:r>
       <w:proofErr w:type="spellStart"/>
       <w:r>
         <w:rPr>
           <w:lang w:val="es-ES"/>
         </w:rPr>
-        <w:t>dni</w:t>
+        <w:t>ultima</w:t>
       </w:r>
       <w:proofErr w:type="spellEnd"/>
       <w:r>
         <w:rPr>
           <w:lang w:val="es-ES"/>
         </w:rPr>
-        <w:t xml:space="preserve"> y modo.</w:t>
+        <w:t xml:space="preserve"> valoración de la trayectoria registrada que tiene ese alumno, el ultimo </w:t>
+      </w:r>
+      <w:proofErr w:type="spellStart"/>
+      <w:r>
+        <w:rPr>
+          <w:lang w:val="es-ES"/>
+        </w:rPr>
+        <w:t>calculo</w:t>
+      </w:r>
+      <w:proofErr w:type="spellEnd"/>
+      <w:r>
+        <w:rPr>
+          <w:lang w:val="es-ES"/>
+        </w:rPr>
+        <w:t xml:space="preserve"> de la calificación registrado que tiene es</w:t>
       </w:r>
       <w:bookmarkStart w:id="0" w:name="_GoBack"/>
       <w:bookmarkEnd w:id="0"/>
+      <w:r>
+        <w:rPr>
+          <w:lang w:val="es-ES"/>
+        </w:rPr>
+        <w:t>e alumno.</w:t>
+      </w:r>
+    </w:p>
+    <w:p>
+      <w:pPr>
+        <w:tabs>
+          <w:tab w:val="left" w:pos="1792"/>
+        </w:tabs>
+        <w:rPr>
+          <w:b/>
+          <w:lang w:val="es-ES"/>
+        </w:rPr>
+      </w:pPr>
+      <w:r>
+        <w:rPr>
+          <w:b/>
+          <w:lang w:val="es-ES"/>
+        </w:rPr>
+        <w:t xml:space="preserve">Necesito que me crees una pasarela de pagos, para poder tomar pagos con mercado pago y </w:t>
+      </w:r>
+      <w:proofErr w:type="spellStart"/>
+      <w:proofErr w:type="gramStart"/>
+      <w:r>
+        <w:rPr>
+          <w:b/>
+          <w:lang w:val="es-ES"/>
+        </w:rPr>
+        <w:t>paypal</w:t>
+      </w:r>
+      <w:proofErr w:type="spellEnd"/>
+      <w:proofErr w:type="gramEnd"/>
+      <w:r>
+        <w:rPr>
+          <w:b/>
+          <w:lang w:val="es-ES"/>
+        </w:rPr>
+        <w:t>.</w:t>
+      </w:r>
+    </w:p>
+    <w:p>
+      <w:pPr>
+        <w:tabs>
+          <w:tab w:val="left" w:pos="1792"/>
+        </w:tabs>
+        <w:rPr>
+          <w:lang w:val="es-ES"/>
+        </w:rPr>
+      </w:pPr>
+      <w:r>
+        <w:rPr>
+          <w:lang w:val="es-ES"/>
+        </w:rPr>
+        <w:t xml:space="preserve">Necesito que el sistema le mande automáticamente al cliente , un mail , si el abono se renueva automáticamente , en la fecha de </w:t>
+      </w:r>
+      <w:proofErr w:type="spellStart"/>
+      <w:r>
+        <w:rPr>
+          <w:lang w:val="es-ES"/>
+        </w:rPr>
+        <w:t>debito</w:t>
+      </w:r>
+      <w:proofErr w:type="spellEnd"/>
+      <w:r>
+        <w:rPr>
+          <w:lang w:val="es-ES"/>
+        </w:rPr>
+        <w:t xml:space="preserve"> </w:t>
+      </w:r>
+      <w:proofErr w:type="spellStart"/>
+      <w:r>
+        <w:rPr>
+          <w:lang w:val="es-ES"/>
+        </w:rPr>
+        <w:t>automatico</w:t>
+      </w:r>
+      <w:proofErr w:type="spellEnd"/>
+      <w:r>
+        <w:rPr>
+          <w:lang w:val="es-ES"/>
+        </w:rPr>
+        <w:t xml:space="preserve">,  del abono desde la cuenta de mercado pago, o </w:t>
+      </w:r>
+      <w:proofErr w:type="spellStart"/>
+      <w:r>
+        <w:rPr>
+          <w:lang w:val="es-ES"/>
+        </w:rPr>
+        <w:t>paypal</w:t>
+      </w:r>
+      <w:proofErr w:type="spellEnd"/>
+      <w:r>
+        <w:rPr>
+          <w:lang w:val="es-ES"/>
+        </w:rPr>
+        <w:t xml:space="preserve">,  si el cliente no hace debito </w:t>
+      </w:r>
+      <w:proofErr w:type="spellStart"/>
+      <w:r>
+        <w:rPr>
+          <w:lang w:val="es-ES"/>
+        </w:rPr>
+        <w:t>automatico</w:t>
+      </w:r>
+      <w:proofErr w:type="spellEnd"/>
+      <w:r>
+        <w:rPr>
+          <w:lang w:val="es-ES"/>
+        </w:rPr>
+        <w:t xml:space="preserve">, 7 </w:t>
+      </w:r>
+      <w:proofErr w:type="spellStart"/>
+      <w:r>
+        <w:rPr>
+          <w:lang w:val="es-ES"/>
+        </w:rPr>
+        <w:t>dias</w:t>
+      </w:r>
+      <w:proofErr w:type="spellEnd"/>
+      <w:r>
+        <w:rPr>
+          <w:lang w:val="es-ES"/>
+        </w:rPr>
+        <w:t xml:space="preserve"> antes un mail recordándole la fecha de vencimiento del abono, y un mail, una vez acreditado el pago, o una vez que el cliente pague el abono con la billetera de mercado pago o </w:t>
+      </w:r>
+      <w:proofErr w:type="spellStart"/>
+      <w:r>
+        <w:rPr>
+          <w:lang w:val="es-ES"/>
+        </w:rPr>
+        <w:t>paypal</w:t>
+      </w:r>
+      <w:proofErr w:type="spellEnd"/>
+      <w:r>
+        <w:rPr>
+          <w:lang w:val="es-ES"/>
+        </w:rPr>
+        <w:t>, en cada caso el mail debe contener la información de la transacción, y los datos del próximo vencimiento, teniendo en cuenta que el abono puede ser mensual, semestral o anual.</w:t>
+      </w:r>
+    </w:p>
+    <w:p>
+      <w:pPr>
+        <w:tabs>
+          <w:tab w:val="left" w:pos="1792"/>
+        </w:tabs>
+        <w:rPr>
+          <w:lang w:val="es-ES"/>
+        </w:rPr>
+      </w:pPr>
+      <w:r>
+        <w:rPr>
+          <w:lang w:val="es-ES"/>
+        </w:rPr>
+        <w:t xml:space="preserve">Necesito me desarrolles una </w:t>
+      </w:r>
+      <w:proofErr w:type="spellStart"/>
+      <w:r>
+        <w:rPr>
+          <w:lang w:val="es-ES"/>
+        </w:rPr>
+        <w:t>landing</w:t>
+      </w:r>
+      <w:proofErr w:type="spellEnd"/>
+      <w:r>
+        <w:rPr>
+          <w:lang w:val="es-ES"/>
+        </w:rPr>
+        <w:t xml:space="preserve"> page con diseño moderno, para explicar las bondades y </w:t>
+      </w:r>
+      <w:proofErr w:type="spellStart"/>
+      <w:r>
+        <w:rPr>
+          <w:lang w:val="es-ES"/>
+        </w:rPr>
+        <w:t>caracterisitcas</w:t>
+      </w:r>
+      <w:proofErr w:type="spellEnd"/>
+      <w:r>
+        <w:rPr>
+          <w:lang w:val="es-ES"/>
+        </w:rPr>
+        <w:t xml:space="preserve"> del software que estamos desarrollando, que tenga las opciones de Inicio, </w:t>
+      </w:r>
+      <w:r>
+        <w:rPr>
+          <w:lang w:val="es-ES"/>
+        </w:rPr>
+        <w:t xml:space="preserve">Producto, </w:t>
+      </w:r>
+      <w:r>
+        <w:rPr>
+          <w:lang w:val="es-ES"/>
+        </w:rPr>
+        <w:t xml:space="preserve">Contacto  </w:t>
+      </w:r>
+      <w:r>
+        <w:rPr>
+          <w:lang w:val="es-ES"/>
+        </w:rPr>
+        <w:t xml:space="preserve">Un formulario de contacto con: Apellido y nombre, teléfono, dirección de mail, y mensaje. Y que al enviar el contacto el cliente reciba en el mail declarado en el campo, una confirmación de </w:t>
+      </w:r>
+      <w:proofErr w:type="spellStart"/>
+      <w:r>
+        <w:rPr>
+          <w:lang w:val="es-ES"/>
+        </w:rPr>
+        <w:t>envio</w:t>
+      </w:r>
+      <w:proofErr w:type="spellEnd"/>
+      <w:r>
+        <w:rPr>
+          <w:lang w:val="es-ES"/>
+        </w:rPr>
+        <w:t xml:space="preserve"> del </w:t>
+      </w:r>
+      <w:proofErr w:type="spellStart"/>
+      <w:r>
+        <w:rPr>
+          <w:lang w:val="es-ES"/>
+        </w:rPr>
+        <w:t>msj</w:t>
+      </w:r>
+      <w:proofErr w:type="spellEnd"/>
+      <w:r>
+        <w:rPr>
+          <w:lang w:val="es-ES"/>
+        </w:rPr>
+        <w:t xml:space="preserve"> para contacto. Y el</w:t>
+      </w:r>
+      <w:r>
+        <w:rPr>
+          <w:lang w:val="es-ES"/>
+        </w:rPr>
+        <w:t xml:space="preserve"> </w:t>
+      </w:r>
+      <w:proofErr w:type="spellStart"/>
+      <w:r>
+        <w:rPr>
+          <w:lang w:val="es-ES"/>
+        </w:rPr>
+        <w:t>Login</w:t>
+      </w:r>
+      <w:proofErr w:type="gramStart"/>
+      <w:r>
+        <w:rPr>
+          <w:lang w:val="es-ES"/>
+        </w:rPr>
+        <w:t>,</w:t>
+      </w:r>
+      <w:r>
+        <w:rPr>
+          <w:lang w:val="es-ES"/>
+        </w:rPr>
+        <w:t>que</w:t>
+      </w:r>
+      <w:proofErr w:type="spellEnd"/>
+      <w:proofErr w:type="gramEnd"/>
+      <w:r>
+        <w:rPr>
+          <w:lang w:val="es-ES"/>
+        </w:rPr>
+        <w:t xml:space="preserve"> esta opción enlace la </w:t>
+      </w:r>
+      <w:proofErr w:type="spellStart"/>
+      <w:r>
+        <w:rPr>
+          <w:lang w:val="es-ES"/>
+        </w:rPr>
+        <w:t>landing</w:t>
+      </w:r>
+      <w:proofErr w:type="spellEnd"/>
+      <w:r>
+        <w:rPr>
+          <w:lang w:val="es-ES"/>
+        </w:rPr>
+        <w:t xml:space="preserve"> con el </w:t>
+      </w:r>
+      <w:proofErr w:type="spellStart"/>
+      <w:r>
+        <w:rPr>
+          <w:lang w:val="es-ES"/>
+        </w:rPr>
+        <w:t>login</w:t>
+      </w:r>
+      <w:proofErr w:type="spellEnd"/>
+      <w:r>
+        <w:rPr>
+          <w:lang w:val="es-ES"/>
+        </w:rPr>
+        <w:t xml:space="preserve"> de sistema, ya seas </w:t>
+      </w:r>
+      <w:proofErr w:type="spellStart"/>
+      <w:r>
+        <w:rPr>
+          <w:lang w:val="es-ES"/>
+        </w:rPr>
+        <w:t>admin</w:t>
+      </w:r>
+      <w:proofErr w:type="spellEnd"/>
+      <w:r>
+        <w:rPr>
+          <w:lang w:val="es-ES"/>
+        </w:rPr>
+        <w:t xml:space="preserve">, </w:t>
+      </w:r>
+      <w:proofErr w:type="spellStart"/>
+      <w:r>
+        <w:rPr>
+          <w:lang w:val="es-ES"/>
+        </w:rPr>
+        <w:t>super</w:t>
+      </w:r>
+      <w:proofErr w:type="spellEnd"/>
+      <w:r>
+        <w:rPr>
+          <w:lang w:val="es-ES"/>
+        </w:rPr>
+        <w:t xml:space="preserve"> </w:t>
+      </w:r>
+      <w:proofErr w:type="spellStart"/>
+      <w:r>
+        <w:rPr>
+          <w:lang w:val="es-ES"/>
+        </w:rPr>
+        <w:t>admin</w:t>
+      </w:r>
+      <w:proofErr w:type="spellEnd"/>
+      <w:r>
+        <w:rPr>
+          <w:lang w:val="es-ES"/>
+        </w:rPr>
+        <w:t xml:space="preserve"> o docente. Desde el menú </w:t>
+      </w:r>
+      <w:proofErr w:type="spellStart"/>
+      <w:r>
+        <w:rPr>
+          <w:lang w:val="es-ES"/>
+        </w:rPr>
+        <w:t>Producto,la</w:t>
+      </w:r>
+      <w:proofErr w:type="spellEnd"/>
+      <w:r>
+        <w:rPr>
+          <w:lang w:val="es-ES"/>
+        </w:rPr>
+        <w:t xml:space="preserve"> </w:t>
+      </w:r>
+      <w:r>
+        <w:rPr>
+          <w:lang w:val="es-ES"/>
+        </w:rPr>
+        <w:t xml:space="preserve">posibilidad de adquirir </w:t>
+      </w:r>
+      <w:r>
+        <w:rPr>
+          <w:lang w:val="es-ES"/>
+        </w:rPr>
+        <w:t xml:space="preserve">(Suscribirse) a </w:t>
+      </w:r>
+      <w:r>
+        <w:rPr>
+          <w:lang w:val="es-ES"/>
+        </w:rPr>
+        <w:t xml:space="preserve">el </w:t>
+      </w:r>
+      <w:r>
+        <w:rPr>
+          <w:lang w:val="es-ES"/>
+        </w:rPr>
+        <w:t>servicio</w:t>
+      </w:r>
+      <w:r>
+        <w:rPr>
+          <w:lang w:val="es-ES"/>
+        </w:rPr>
+        <w:t xml:space="preserve">, que al ingresar a la opción, me muestre la clásica vista donde me permite elegir entre las tres opciones de abono registradas </w:t>
+      </w:r>
+      <w:r>
+        <w:rPr>
+          <w:lang w:val="es-ES"/>
+        </w:rPr>
+        <w:t xml:space="preserve">(las que ya están en planes) </w:t>
+      </w:r>
+      <w:r>
+        <w:rPr>
+          <w:lang w:val="es-ES"/>
+        </w:rPr>
+        <w:t>en el sistema, tomando los datos de los planes desde el sistema, y que al seleccionar alguna de las tres opciones me mande directamente a un formulario de registro que me registre (si se puede</w:t>
+      </w:r>
+      <w:r>
+        <w:rPr>
+          <w:lang w:val="es-ES"/>
+        </w:rPr>
+        <w:t>,</w:t>
+      </w:r>
+      <w:r>
+        <w:rPr>
+          <w:lang w:val="es-ES"/>
+        </w:rPr>
+        <w:t xml:space="preserve"> reutilizar el de registro de usuario), que me complete los datos automáticamente del plan elegido, y al aceptar, me muestre un </w:t>
+      </w:r>
+      <w:r>
+        <w:rPr>
+          <w:lang w:val="es-ES"/>
+        </w:rPr>
+        <w:t xml:space="preserve">modal con la </w:t>
+      </w:r>
+      <w:proofErr w:type="spellStart"/>
+      <w:r>
+        <w:rPr>
+          <w:lang w:val="es-ES"/>
+        </w:rPr>
+        <w:t>info</w:t>
+      </w:r>
+      <w:proofErr w:type="spellEnd"/>
+      <w:r>
+        <w:rPr>
+          <w:lang w:val="es-ES"/>
+        </w:rPr>
+        <w:t xml:space="preserve"> resumida de</w:t>
+      </w:r>
+      <w:r>
+        <w:rPr>
+          <w:lang w:val="es-ES"/>
+        </w:rPr>
+        <w:t xml:space="preserve"> la transacción que </w:t>
+      </w:r>
+      <w:proofErr w:type="spellStart"/>
+      <w:r>
+        <w:rPr>
+          <w:lang w:val="es-ES"/>
+        </w:rPr>
+        <w:t>esta</w:t>
+      </w:r>
+      <w:proofErr w:type="spellEnd"/>
+      <w:r>
+        <w:rPr>
+          <w:lang w:val="es-ES"/>
+        </w:rPr>
+        <w:t xml:space="preserve"> a punto de confirmar, y que al aceptarla me mande un mail, con los datos del registro, y un link de activación de la cuenta, con las instrucciones de activación, y que al ir al link, se le </w:t>
+      </w:r>
+      <w:proofErr w:type="spellStart"/>
+      <w:r>
+        <w:rPr>
+          <w:lang w:val="es-ES"/>
+        </w:rPr>
+        <w:t>envie</w:t>
+      </w:r>
+      <w:proofErr w:type="spellEnd"/>
+      <w:r>
+        <w:rPr>
+          <w:lang w:val="es-ES"/>
+        </w:rPr>
+        <w:t xml:space="preserve"> al cliente un mail con la confirmación de la cuenta, y quede activada la misma para su utilización.</w:t>
+      </w:r>
+    </w:p>
+    <w:p>
+      <w:pPr>
+        <w:tabs>
+          <w:tab w:val="left" w:pos="1792"/>
+        </w:tabs>
+        <w:rPr>
+          <w:lang w:val="es-ES"/>
+        </w:rPr>
+      </w:pPr>
+    </w:p>
+    <w:p>
+      <w:pPr>
+        <w:tabs>
+          <w:tab w:val="left" w:pos="1792"/>
+        </w:tabs>
+        <w:rPr>
+          <w:lang w:val="es-ES"/>
+        </w:rPr>
+      </w:pPr>
+      <w:proofErr w:type="gramStart"/>
+      <w:r>
+        <w:rPr>
+          <w:lang w:val="es-ES"/>
+        </w:rPr>
+        <w:t>con</w:t>
+      </w:r>
+      <w:proofErr w:type="gramEnd"/>
+      <w:r>
+        <w:rPr>
+          <w:lang w:val="es-ES"/>
+        </w:rPr>
+        <w:t xml:space="preserve"> un recordatorio 10 </w:t>
+      </w:r>
+      <w:proofErr w:type="spellStart"/>
+      <w:r>
+        <w:rPr>
+          <w:lang w:val="es-ES"/>
+        </w:rPr>
+        <w:t>dias</w:t>
+      </w:r>
+      <w:proofErr w:type="spellEnd"/>
+      <w:r>
+        <w:rPr>
+          <w:lang w:val="es-ES"/>
+        </w:rPr>
+        <w:t xml:space="preserve"> antes del vencimiento del abono para que este renueve el abono, si el abono se renueva </w:t>
+      </w:r>
+      <w:proofErr w:type="spellStart"/>
+      <w:r>
+        <w:rPr>
+          <w:lang w:val="es-ES"/>
+        </w:rPr>
+        <w:t>automaticament</w:t>
+      </w:r>
+      <w:proofErr w:type="spellEnd"/>
     </w:p>
     <w:p>
       <w:pPr>
@@ -12691,7 +13276,7 @@
 </file>
 
 <file path=customXml/itemProps1.xml><?xml version="1.0" encoding="utf-8"?>
-<ds:datastoreItem xmlns:ds="http://schemas.openxmlformats.org/officeDocument/2006/customXml" ds:itemID="{F190F214-B7DB-4040-9D1D-189BA5358A28}">
+<ds:datastoreItem xmlns:ds="http://schemas.openxmlformats.org/officeDocument/2006/customXml" ds:itemID="{13471C47-1E86-41C6-A037-3B51DE3C1CE4}">
   <ds:schemaRefs>
     <ds:schemaRef ds:uri="http://schemas.openxmlformats.org/officeDocument/2006/bibliography"/>
   </ds:schemaRefs>

</xml_diff>

<commit_message>
se agrega modulo de designaciones de cargos docentes
</commit_message>
<xml_diff>
--- a/requerimientos.docx
+++ b/requerimientos.docx
@@ -8644,6 +8644,13 @@
         </w:rPr>
         <w:t>.</w:t>
       </w:r>
+      <w:r>
+        <w:rPr>
+          <w:b/>
+          <w:lang w:val="es-ES"/>
+        </w:rPr>
+        <w:t xml:space="preserve"> </w:t>
+      </w:r>
     </w:p>
     <w:p>
       <w:pPr>
@@ -8651,6 +8658,40 @@
           <w:tab w:val="left" w:pos="1792"/>
         </w:tabs>
         <w:rPr>
+          <w:b/>
+          <w:lang w:val="es-ES"/>
+        </w:rPr>
+      </w:pPr>
+      <w:r>
+        <w:rPr>
+          <w:b/>
+          <w:lang w:val="es-ES"/>
+        </w:rPr>
+        <w:t xml:space="preserve">Necesito que me crees una pasarela de pagos, para poder tomar pagos con mercado pago y </w:t>
+      </w:r>
+      <w:proofErr w:type="spellStart"/>
+      <w:r>
+        <w:rPr>
+          <w:b/>
+          <w:lang w:val="es-ES"/>
+        </w:rPr>
+        <w:t>paypal</w:t>
+      </w:r>
+      <w:proofErr w:type="spellEnd"/>
+      <w:r>
+        <w:rPr>
+          <w:b/>
+          <w:lang w:val="es-ES"/>
+        </w:rPr>
+        <w:t>.</w:t>
+      </w:r>
+    </w:p>
+    <w:p>
+      <w:pPr>
+        <w:tabs>
+          <w:tab w:val="left" w:pos="1792"/>
+        </w:tabs>
+        <w:rPr>
           <w:lang w:val="es-ES"/>
         </w:rPr>
       </w:pPr>
@@ -8749,30 +8790,21 @@
     <w:p>
       <w:pPr>
         <w:rPr>
-          <w:lang w:val="es-ES"/>
-        </w:rPr>
-      </w:pPr>
-      <w:r>
-        <w:rPr>
-          <w:lang w:val="es-ES"/>
-        </w:rPr>
-        <w:t xml:space="preserve">Me dejo de funcionar </w:t>
-      </w:r>
-      <w:r>
-        <w:rPr>
-          <w:lang w:val="es-ES"/>
-        </w:rPr>
-        <w:t xml:space="preserve">en el dashboard, el listado de estudiantes, </w:t>
-      </w:r>
-      <w:r>
-        <w:rPr>
-          <w:lang w:val="es-ES"/>
-        </w:rPr>
-        <w:t xml:space="preserve">que </w:t>
+          <w:b/>
+          <w:lang w:val="es-ES"/>
+        </w:rPr>
+      </w:pPr>
+      <w:r>
+        <w:rPr>
+          <w:b/>
+          <w:lang w:val="es-ES"/>
+        </w:rPr>
+        <w:t xml:space="preserve">Me dejo de funcionar en el dashboard, el listado de estudiantes, que </w:t>
       </w:r>
       <w:proofErr w:type="spellStart"/>
       <w:r>
         <w:rPr>
+          <w:b/>
           <w:lang w:val="es-ES"/>
         </w:rPr>
         <w:t>aparecia</w:t>
@@ -8780,50 +8812,23 @@
       <w:proofErr w:type="spellEnd"/>
       <w:r>
         <w:rPr>
-          <w:lang w:val="es-ES"/>
-        </w:rPr>
-        <w:t xml:space="preserve"> cuando me encontraba en el horario de la materia correspondiente y que </w:t>
-      </w:r>
-      <w:r>
-        <w:rPr>
-          <w:lang w:val="es-ES"/>
-        </w:rPr>
-        <w:t>me m</w:t>
-      </w:r>
-      <w:r>
-        <w:rPr>
-          <w:lang w:val="es-ES"/>
-        </w:rPr>
-        <w:t>ostraba</w:t>
-      </w:r>
-      <w:r>
-        <w:rPr>
-          <w:lang w:val="es-ES"/>
-        </w:rPr>
-        <w:t xml:space="preserve"> para cada estudiante</w:t>
-      </w:r>
-      <w:r>
-        <w:rPr>
-          <w:lang w:val="es-ES"/>
-        </w:rPr>
-        <w:t xml:space="preserve"> de ese curso</w:t>
-      </w:r>
-      <w:r>
-        <w:rPr>
-          <w:lang w:val="es-ES"/>
-        </w:rPr>
-        <w:t xml:space="preserve">, en su correspondiente renglón de la tabla, y con diferentes colores , la cantidad de presentes que tiene ese alumno, la cantidad de ausentes que tiene ese alumno, la cantidad de ausentes justificados que tiene ese alumno, la cantidad de actividades asignadas que tiene ese alumno, la cantidad de actividades entregadas a tiempo que tiene ese alumno  y </w:t>
-      </w:r>
-      <w:r>
-        <w:rPr>
+          <w:b/>
+          <w:lang w:val="es-ES"/>
+        </w:rPr>
+        <w:t xml:space="preserve"> cuando me encontraba en el horario de la materia correspondiente y que me mostraba para cada estudiante de ese curso, en su correspondiente renglón de la tabla, y con diferentes colores , la cantidad de presentes que tiene ese alumno, la cantidad de ausentes que tiene ese </w:t>
+      </w:r>
+      <w:r>
+        <w:rPr>
+          <w:b/>
           <w:lang w:val="es-ES"/>
         </w:rPr>
         <w:lastRenderedPageBreak/>
-        <w:t xml:space="preserve">la cantidad de las entregadas vencidas que tiene ese alumno, la </w:t>
+        <w:t xml:space="preserve">alumno, la cantidad de ausentes justificados que tiene ese alumno, la cantidad de actividades asignadas que tiene ese alumno, la cantidad de actividades entregadas a tiempo que tiene ese alumno  y la cantidad de las entregadas vencidas que tiene ese alumno, la </w:t>
       </w:r>
       <w:proofErr w:type="spellStart"/>
       <w:r>
         <w:rPr>
+          <w:b/>
           <w:lang w:val="es-ES"/>
         </w:rPr>
         <w:t>ultima</w:t>
@@ -8831,6 +8836,7 @@
       <w:proofErr w:type="spellEnd"/>
       <w:r>
         <w:rPr>
+          <w:b/>
           <w:lang w:val="es-ES"/>
         </w:rPr>
         <w:t xml:space="preserve"> valoración de la trayectoria registrada que tiene ese alumno, el ultimo </w:t>
@@ -8838,6 +8844,7 @@
       <w:proofErr w:type="spellStart"/>
       <w:r>
         <w:rPr>
+          <w:b/>
           <w:lang w:val="es-ES"/>
         </w:rPr>
         <w:t>calculo</w:t>
@@ -8845,17 +8852,10 @@
       <w:proofErr w:type="spellEnd"/>
       <w:r>
         <w:rPr>
-          <w:lang w:val="es-ES"/>
-        </w:rPr>
-        <w:t xml:space="preserve"> de la calificación registrado que tiene es</w:t>
-      </w:r>
-      <w:bookmarkStart w:id="0" w:name="_GoBack"/>
-      <w:bookmarkEnd w:id="0"/>
-      <w:r>
-        <w:rPr>
-          <w:lang w:val="es-ES"/>
-        </w:rPr>
-        <w:t>e alumno.</w:t>
+          <w:b/>
+          <w:lang w:val="es-ES"/>
+        </w:rPr>
+        <w:t xml:space="preserve"> de la calificación registrado que tiene ese alumno.</w:t>
       </w:r>
     </w:p>
     <w:p>
@@ -8868,21 +8868,252 @@
           <w:lang w:val="es-ES"/>
         </w:rPr>
       </w:pPr>
-      <w:r>
-        <w:rPr>
-          <w:b/>
-          <w:lang w:val="es-ES"/>
-        </w:rPr>
-        <w:t xml:space="preserve">Necesito que me crees una pasarela de pagos, para poder tomar pagos con mercado pago y </w:t>
+    </w:p>
+    <w:p>
+      <w:pPr>
+        <w:tabs>
+          <w:tab w:val="left" w:pos="1792"/>
+        </w:tabs>
+        <w:rPr>
+          <w:b/>
+          <w:lang w:val="es-ES"/>
+        </w:rPr>
+      </w:pPr>
+      <w:r>
+        <w:rPr>
+          <w:b/>
+          <w:lang w:val="es-ES"/>
+        </w:rPr>
+        <w:t xml:space="preserve">Necesito que el sistema le mande automáticamente al cliente , un mail , si el abono se renueva automáticamente , en la fecha de </w:t>
       </w:r>
       <w:proofErr w:type="spellStart"/>
+      <w:r>
+        <w:rPr>
+          <w:b/>
+          <w:lang w:val="es-ES"/>
+        </w:rPr>
+        <w:t>debito</w:t>
+      </w:r>
+      <w:proofErr w:type="spellEnd"/>
+      <w:r>
+        <w:rPr>
+          <w:b/>
+          <w:lang w:val="es-ES"/>
+        </w:rPr>
+        <w:t xml:space="preserve"> </w:t>
+      </w:r>
+      <w:proofErr w:type="spellStart"/>
+      <w:r>
+        <w:rPr>
+          <w:b/>
+          <w:lang w:val="es-ES"/>
+        </w:rPr>
+        <w:t>automatico</w:t>
+      </w:r>
+      <w:proofErr w:type="spellEnd"/>
+      <w:r>
+        <w:rPr>
+          <w:b/>
+          <w:lang w:val="es-ES"/>
+        </w:rPr>
+        <w:t xml:space="preserve">,  del abono desde la cuenta de mercado pago, o </w:t>
+      </w:r>
+      <w:proofErr w:type="spellStart"/>
+      <w:r>
+        <w:rPr>
+          <w:b/>
+          <w:lang w:val="es-ES"/>
+        </w:rPr>
+        <w:t>paypal</w:t>
+      </w:r>
+      <w:proofErr w:type="spellEnd"/>
+      <w:r>
+        <w:rPr>
+          <w:b/>
+          <w:lang w:val="es-ES"/>
+        </w:rPr>
+        <w:t xml:space="preserve">,  si el cliente no hace debito </w:t>
+      </w:r>
+      <w:proofErr w:type="spellStart"/>
+      <w:r>
+        <w:rPr>
+          <w:b/>
+          <w:lang w:val="es-ES"/>
+        </w:rPr>
+        <w:t>automatico</w:t>
+      </w:r>
+      <w:proofErr w:type="spellEnd"/>
+      <w:r>
+        <w:rPr>
+          <w:b/>
+          <w:lang w:val="es-ES"/>
+        </w:rPr>
+        <w:t xml:space="preserve">, 7 </w:t>
+      </w:r>
+      <w:proofErr w:type="spellStart"/>
+      <w:r>
+        <w:rPr>
+          <w:b/>
+          <w:lang w:val="es-ES"/>
+        </w:rPr>
+        <w:t>dias</w:t>
+      </w:r>
+      <w:proofErr w:type="spellEnd"/>
+      <w:r>
+        <w:rPr>
+          <w:b/>
+          <w:lang w:val="es-ES"/>
+        </w:rPr>
+        <w:t xml:space="preserve"> antes un mail recordándole la fecha de vencimiento del abono, y un mail, una vez acreditado el pago, o una vez que el cliente pague el abono con la billetera de mercado pago o </w:t>
+      </w:r>
+      <w:proofErr w:type="spellStart"/>
+      <w:r>
+        <w:rPr>
+          <w:b/>
+          <w:lang w:val="es-ES"/>
+        </w:rPr>
+        <w:t>paypal</w:t>
+      </w:r>
+      <w:proofErr w:type="spellEnd"/>
+      <w:r>
+        <w:rPr>
+          <w:b/>
+          <w:lang w:val="es-ES"/>
+        </w:rPr>
+        <w:t>, en cada caso el mail debe contener la información de la transacción, y los datos del próximo vencimiento, teniendo en cuenta que el abono puede ser mensual, semestral o anual.</w:t>
+      </w:r>
+    </w:p>
+    <w:p>
+      <w:pPr>
+        <w:tabs>
+          <w:tab w:val="left" w:pos="1792"/>
+        </w:tabs>
+        <w:rPr>
+          <w:b/>
+          <w:lang w:val="es-ES"/>
+        </w:rPr>
+      </w:pPr>
+      <w:r>
+        <w:rPr>
+          <w:b/>
+          <w:lang w:val="es-ES"/>
+        </w:rPr>
+        <w:t xml:space="preserve">Necesito me desarrolles una </w:t>
+      </w:r>
+      <w:proofErr w:type="spellStart"/>
+      <w:r>
+        <w:rPr>
+          <w:b/>
+          <w:lang w:val="es-ES"/>
+        </w:rPr>
+        <w:t>landing</w:t>
+      </w:r>
+      <w:proofErr w:type="spellEnd"/>
+      <w:r>
+        <w:rPr>
+          <w:b/>
+          <w:lang w:val="es-ES"/>
+        </w:rPr>
+        <w:t xml:space="preserve"> page con diseño moderno, para explicar las bondades y </w:t>
+      </w:r>
+      <w:proofErr w:type="spellStart"/>
+      <w:r>
+        <w:rPr>
+          <w:b/>
+          <w:lang w:val="es-ES"/>
+        </w:rPr>
+        <w:t>caracterisitcas</w:t>
+      </w:r>
+      <w:proofErr w:type="spellEnd"/>
+      <w:r>
+        <w:rPr>
+          <w:b/>
+          <w:lang w:val="es-ES"/>
+        </w:rPr>
+        <w:t xml:space="preserve"> del software que estamos desarrollando, que tenga las opciones de Inicio, </w:t>
+      </w:r>
+      <w:r>
+        <w:rPr>
+          <w:b/>
+          <w:lang w:val="es-ES"/>
+        </w:rPr>
+        <w:t xml:space="preserve">Producto, </w:t>
+      </w:r>
+      <w:r>
+        <w:rPr>
+          <w:b/>
+          <w:lang w:val="es-ES"/>
+        </w:rPr>
+        <w:t xml:space="preserve">Contacto  </w:t>
+      </w:r>
+      <w:r>
+        <w:rPr>
+          <w:b/>
+          <w:lang w:val="es-ES"/>
+        </w:rPr>
+        <w:t xml:space="preserve">Un formulario de contacto con: Apellido y nombre, teléfono, dirección de mail, y mensaje. Y que al enviar el contacto el cliente reciba en el mail declarado en el campo, una confirmación de </w:t>
+      </w:r>
+      <w:proofErr w:type="spellStart"/>
+      <w:r>
+        <w:rPr>
+          <w:b/>
+          <w:lang w:val="es-ES"/>
+        </w:rPr>
+        <w:t>envio</w:t>
+      </w:r>
+      <w:proofErr w:type="spellEnd"/>
+      <w:r>
+        <w:rPr>
+          <w:b/>
+          <w:lang w:val="es-ES"/>
+        </w:rPr>
+        <w:t xml:space="preserve"> del </w:t>
+      </w:r>
+      <w:proofErr w:type="spellStart"/>
+      <w:r>
+        <w:rPr>
+          <w:b/>
+          <w:lang w:val="es-ES"/>
+        </w:rPr>
+        <w:t>msj</w:t>
+      </w:r>
+      <w:proofErr w:type="spellEnd"/>
+      <w:r>
+        <w:rPr>
+          <w:b/>
+          <w:lang w:val="es-ES"/>
+        </w:rPr>
+        <w:t xml:space="preserve"> para contacto. Y el</w:t>
+      </w:r>
+      <w:r>
+        <w:rPr>
+          <w:b/>
+          <w:lang w:val="es-ES"/>
+        </w:rPr>
+        <w:t xml:space="preserve"> </w:t>
+      </w:r>
+      <w:proofErr w:type="spellStart"/>
+      <w:r>
+        <w:rPr>
+          <w:b/>
+          <w:lang w:val="es-ES"/>
+        </w:rPr>
+        <w:t>Login</w:t>
+      </w:r>
       <w:proofErr w:type="gramStart"/>
       <w:r>
         <w:rPr>
           <w:b/>
           <w:lang w:val="es-ES"/>
         </w:rPr>
-        <w:t>paypal</w:t>
+        <w:t>,</w:t>
+      </w:r>
+      <w:r>
+        <w:rPr>
+          <w:b/>
+          <w:lang w:val="es-ES"/>
+        </w:rPr>
+        <w:t>que</w:t>
       </w:r>
       <w:proofErr w:type="spellEnd"/>
       <w:proofErr w:type="gramEnd"/>
@@ -8891,481 +9122,684 @@
           <w:b/>
           <w:lang w:val="es-ES"/>
         </w:rPr>
+        <w:t xml:space="preserve"> esta opción enlace la </w:t>
+      </w:r>
+      <w:proofErr w:type="spellStart"/>
+      <w:r>
+        <w:rPr>
+          <w:b/>
+          <w:lang w:val="es-ES"/>
+        </w:rPr>
+        <w:t>landing</w:t>
+      </w:r>
+      <w:proofErr w:type="spellEnd"/>
+      <w:r>
+        <w:rPr>
+          <w:b/>
+          <w:lang w:val="es-ES"/>
+        </w:rPr>
+        <w:t xml:space="preserve"> con el </w:t>
+      </w:r>
+      <w:proofErr w:type="spellStart"/>
+      <w:r>
+        <w:rPr>
+          <w:b/>
+          <w:lang w:val="es-ES"/>
+        </w:rPr>
+        <w:t>login</w:t>
+      </w:r>
+      <w:proofErr w:type="spellEnd"/>
+      <w:r>
+        <w:rPr>
+          <w:b/>
+          <w:lang w:val="es-ES"/>
+        </w:rPr>
+        <w:t xml:space="preserve"> de sistema, ya seas </w:t>
+      </w:r>
+      <w:proofErr w:type="spellStart"/>
+      <w:r>
+        <w:rPr>
+          <w:b/>
+          <w:lang w:val="es-ES"/>
+        </w:rPr>
+        <w:t>admin</w:t>
+      </w:r>
+      <w:proofErr w:type="spellEnd"/>
+      <w:r>
+        <w:rPr>
+          <w:b/>
+          <w:lang w:val="es-ES"/>
+        </w:rPr>
+        <w:t xml:space="preserve">, </w:t>
+      </w:r>
+      <w:proofErr w:type="spellStart"/>
+      <w:r>
+        <w:rPr>
+          <w:b/>
+          <w:lang w:val="es-ES"/>
+        </w:rPr>
+        <w:t>super</w:t>
+      </w:r>
+      <w:proofErr w:type="spellEnd"/>
+      <w:r>
+        <w:rPr>
+          <w:b/>
+          <w:lang w:val="es-ES"/>
+        </w:rPr>
+        <w:t xml:space="preserve"> </w:t>
+      </w:r>
+      <w:proofErr w:type="spellStart"/>
+      <w:r>
+        <w:rPr>
+          <w:b/>
+          <w:lang w:val="es-ES"/>
+        </w:rPr>
+        <w:t>admin</w:t>
+      </w:r>
+      <w:proofErr w:type="spellEnd"/>
+      <w:r>
+        <w:rPr>
+          <w:b/>
+          <w:lang w:val="es-ES"/>
+        </w:rPr>
+        <w:t xml:space="preserve"> o docente. Desde el menú </w:t>
+      </w:r>
+      <w:proofErr w:type="spellStart"/>
+      <w:r>
+        <w:rPr>
+          <w:b/>
+          <w:lang w:val="es-ES"/>
+        </w:rPr>
+        <w:t>Producto,la</w:t>
+      </w:r>
+      <w:proofErr w:type="spellEnd"/>
+      <w:r>
+        <w:rPr>
+          <w:b/>
+          <w:lang w:val="es-ES"/>
+        </w:rPr>
+        <w:t xml:space="preserve"> </w:t>
+      </w:r>
+      <w:r>
+        <w:rPr>
+          <w:b/>
+          <w:lang w:val="es-ES"/>
+        </w:rPr>
+        <w:t xml:space="preserve">posibilidad de adquirir </w:t>
+      </w:r>
+      <w:r>
+        <w:rPr>
+          <w:b/>
+          <w:lang w:val="es-ES"/>
+        </w:rPr>
+        <w:t xml:space="preserve">(Suscribirse) a </w:t>
+      </w:r>
+      <w:r>
+        <w:rPr>
+          <w:b/>
+          <w:lang w:val="es-ES"/>
+        </w:rPr>
+        <w:t xml:space="preserve">el </w:t>
+      </w:r>
+      <w:r>
+        <w:rPr>
+          <w:b/>
+          <w:lang w:val="es-ES"/>
+        </w:rPr>
+        <w:t>servicio</w:t>
+      </w:r>
+      <w:r>
+        <w:rPr>
+          <w:b/>
+          <w:lang w:val="es-ES"/>
+        </w:rPr>
+        <w:t xml:space="preserve">, que al ingresar a la opción, me muestre la clásica vista donde me permite elegir entre las tres opciones de abono registradas </w:t>
+      </w:r>
+      <w:r>
+        <w:rPr>
+          <w:b/>
+          <w:lang w:val="es-ES"/>
+        </w:rPr>
+        <w:t xml:space="preserve">(las que ya están en planes) </w:t>
+      </w:r>
+      <w:r>
+        <w:rPr>
+          <w:b/>
+          <w:lang w:val="es-ES"/>
+        </w:rPr>
+        <w:t>en el sistema, tomando los datos de los planes desde el sistema, y que al seleccionar alguna de las tres opciones me mande directamente a un formulario de registro que me registre (si se puede</w:t>
+      </w:r>
+      <w:r>
+        <w:rPr>
+          <w:b/>
+          <w:lang w:val="es-ES"/>
+        </w:rPr>
+        <w:t>,</w:t>
+      </w:r>
+      <w:r>
+        <w:rPr>
+          <w:b/>
+          <w:lang w:val="es-ES"/>
+        </w:rPr>
+        <w:t xml:space="preserve"> reutilizar el de registro de usuario), que me complete los datos automáticamente del plan elegido, y al aceptar, me muestre un </w:t>
+      </w:r>
+      <w:r>
+        <w:rPr>
+          <w:b/>
+          <w:lang w:val="es-ES"/>
+        </w:rPr>
+        <w:t xml:space="preserve">modal con la </w:t>
+      </w:r>
+      <w:proofErr w:type="spellStart"/>
+      <w:r>
+        <w:rPr>
+          <w:b/>
+          <w:lang w:val="es-ES"/>
+        </w:rPr>
+        <w:t>info</w:t>
+      </w:r>
+      <w:proofErr w:type="spellEnd"/>
+      <w:r>
+        <w:rPr>
+          <w:b/>
+          <w:lang w:val="es-ES"/>
+        </w:rPr>
+        <w:t xml:space="preserve"> resumida de</w:t>
+      </w:r>
+      <w:r>
+        <w:rPr>
+          <w:b/>
+          <w:lang w:val="es-ES"/>
+        </w:rPr>
+        <w:t xml:space="preserve"> la transacción que </w:t>
+      </w:r>
+      <w:proofErr w:type="spellStart"/>
+      <w:r>
+        <w:rPr>
+          <w:b/>
+          <w:lang w:val="es-ES"/>
+        </w:rPr>
+        <w:t>esta</w:t>
+      </w:r>
+      <w:proofErr w:type="spellEnd"/>
+      <w:r>
+        <w:rPr>
+          <w:b/>
+          <w:lang w:val="es-ES"/>
+        </w:rPr>
+        <w:t xml:space="preserve"> a punto de confirmar, y que al aceptarla me mande un mail, con los datos del registro, y un link de activación de la cuenta, con las instrucciones de activación, y que al ir al link, se le </w:t>
+      </w:r>
+      <w:proofErr w:type="spellStart"/>
+      <w:r>
+        <w:rPr>
+          <w:b/>
+          <w:lang w:val="es-ES"/>
+        </w:rPr>
+        <w:t>envie</w:t>
+      </w:r>
+      <w:proofErr w:type="spellEnd"/>
+      <w:r>
+        <w:rPr>
+          <w:b/>
+          <w:lang w:val="es-ES"/>
+        </w:rPr>
+        <w:t xml:space="preserve"> al cliente un mail con la confirmación de la cuenta, y quede activada la misma para su utilización.</w:t>
+      </w:r>
+    </w:p>
+    <w:p>
+      <w:pPr>
+        <w:tabs>
+          <w:tab w:val="left" w:pos="1792"/>
+        </w:tabs>
+        <w:rPr>
+          <w:lang w:val="es-ES"/>
+        </w:rPr>
+      </w:pPr>
+      <w:bookmarkStart w:id="0" w:name="_GoBack"/>
+      <w:r>
+        <w:rPr>
+          <w:lang w:val="es-ES"/>
+        </w:rPr>
+        <w:t>Necesito me generes en el menú a administración, en el apartado horarios una ítem que se llame Designaciones, en el debo acceder a un crud que me permita cargar las designaciones docentes, con los s</w:t>
+      </w:r>
+      <w:r>
+        <w:rPr>
+          <w:lang w:val="es-ES"/>
+        </w:rPr>
+        <w:t xml:space="preserve">iguientes datos, Distrito, </w:t>
+      </w:r>
+      <w:proofErr w:type="spellStart"/>
+      <w:r>
+        <w:rPr>
+          <w:lang w:val="es-ES"/>
+        </w:rPr>
+        <w:t>Tipo</w:t>
+      </w:r>
+      <w:r>
+        <w:rPr>
+          <w:lang w:val="es-ES"/>
+        </w:rPr>
+        <w:t>Establecimiento</w:t>
+      </w:r>
+      <w:proofErr w:type="spellEnd"/>
+      <w:r>
+        <w:rPr>
+          <w:lang w:val="es-ES"/>
+        </w:rPr>
+        <w:t xml:space="preserve">, </w:t>
+      </w:r>
+      <w:proofErr w:type="spellStart"/>
+      <w:r>
+        <w:rPr>
+          <w:lang w:val="es-ES"/>
+        </w:rPr>
+        <w:t>NumeroEscuela</w:t>
+      </w:r>
+      <w:proofErr w:type="spellEnd"/>
+      <w:r>
+        <w:rPr>
+          <w:lang w:val="es-ES"/>
+        </w:rPr>
+        <w:t>,</w:t>
+      </w:r>
+      <w:r>
+        <w:rPr>
+          <w:lang w:val="es-ES"/>
+        </w:rPr>
+        <w:t xml:space="preserve"> </w:t>
+      </w:r>
+      <w:proofErr w:type="spellStart"/>
+      <w:r>
+        <w:rPr>
+          <w:lang w:val="es-ES"/>
+        </w:rPr>
+        <w:t>NombreEstablecimiento</w:t>
+      </w:r>
+      <w:proofErr w:type="spellEnd"/>
+      <w:r>
+        <w:rPr>
+          <w:lang w:val="es-ES"/>
+        </w:rPr>
+        <w:t>,</w:t>
+      </w:r>
+      <w:r>
+        <w:rPr>
+          <w:lang w:val="es-ES"/>
+        </w:rPr>
+        <w:t xml:space="preserve"> Secuencia(opcional), desde un </w:t>
+      </w:r>
+      <w:proofErr w:type="spellStart"/>
+      <w:r>
+        <w:rPr>
+          <w:lang w:val="es-ES"/>
+        </w:rPr>
+        <w:t>select</w:t>
+      </w:r>
+      <w:proofErr w:type="spellEnd"/>
+      <w:r>
+        <w:rPr>
+          <w:lang w:val="es-ES"/>
+        </w:rPr>
+        <w:t xml:space="preserve">, si es oficial o </w:t>
+      </w:r>
+      <w:proofErr w:type="spellStart"/>
+      <w:r>
+        <w:rPr>
+          <w:lang w:val="es-ES"/>
+        </w:rPr>
+        <w:t>Di.Pre.Gep</w:t>
+      </w:r>
+      <w:proofErr w:type="spellEnd"/>
+      <w:r>
+        <w:rPr>
+          <w:lang w:val="es-ES"/>
+        </w:rPr>
+        <w:t xml:space="preserve">, el </w:t>
+      </w:r>
+      <w:proofErr w:type="spellStart"/>
+      <w:r>
+        <w:rPr>
+          <w:lang w:val="es-ES"/>
+        </w:rPr>
+        <w:t>RegimenEstatutario</w:t>
+      </w:r>
+      <w:proofErr w:type="spellEnd"/>
+      <w:r>
+        <w:rPr>
+          <w:lang w:val="es-ES"/>
+        </w:rPr>
+        <w:t xml:space="preserve">, </w:t>
+      </w:r>
+      <w:proofErr w:type="spellStart"/>
+      <w:r>
+        <w:rPr>
+          <w:lang w:val="es-ES"/>
+        </w:rPr>
+        <w:t>CaracterDeRevista</w:t>
+      </w:r>
+      <w:proofErr w:type="spellEnd"/>
+      <w:r>
+        <w:rPr>
+          <w:lang w:val="es-ES"/>
+        </w:rPr>
+        <w:t>,</w:t>
+      </w:r>
+      <w:r>
+        <w:rPr>
+          <w:lang w:val="es-ES"/>
+        </w:rPr>
+        <w:t xml:space="preserve"> </w:t>
+      </w:r>
+      <w:r>
+        <w:rPr>
+          <w:lang w:val="es-ES"/>
+        </w:rPr>
+        <w:t xml:space="preserve">de un </w:t>
+      </w:r>
+      <w:proofErr w:type="spellStart"/>
+      <w:r>
+        <w:rPr>
+          <w:lang w:val="es-ES"/>
+        </w:rPr>
+        <w:t>select</w:t>
+      </w:r>
+      <w:proofErr w:type="spellEnd"/>
+      <w:r>
+        <w:rPr>
+          <w:lang w:val="es-ES"/>
+        </w:rPr>
+        <w:t xml:space="preserve"> si son </w:t>
+      </w:r>
+      <w:proofErr w:type="spellStart"/>
+      <w:r>
+        <w:rPr>
+          <w:lang w:val="es-ES"/>
+        </w:rPr>
+        <w:t>Modulos</w:t>
+      </w:r>
+      <w:proofErr w:type="spellEnd"/>
+      <w:r>
+        <w:rPr>
+          <w:lang w:val="es-ES"/>
+        </w:rPr>
+        <w:t xml:space="preserve"> u Horas, el </w:t>
+      </w:r>
+      <w:proofErr w:type="spellStart"/>
+      <w:r>
+        <w:rPr>
+          <w:lang w:val="es-ES"/>
+        </w:rPr>
+        <w:t>Cupof</w:t>
+      </w:r>
+      <w:proofErr w:type="spellEnd"/>
+      <w:r>
+        <w:rPr>
+          <w:lang w:val="es-ES"/>
+        </w:rPr>
+        <w:t xml:space="preserve">, Dependencia, </w:t>
+      </w:r>
+      <w:proofErr w:type="spellStart"/>
+      <w:r>
+        <w:rPr>
+          <w:lang w:val="es-ES"/>
+        </w:rPr>
+        <w:t>Turno</w:t>
+      </w:r>
+      <w:r>
+        <w:rPr>
+          <w:lang w:val="es-ES"/>
+        </w:rPr>
+        <w:t>Desempeño</w:t>
+      </w:r>
+      <w:proofErr w:type="spellEnd"/>
+      <w:r>
+        <w:rPr>
+          <w:lang w:val="es-ES"/>
+        </w:rPr>
+        <w:t xml:space="preserve">, </w:t>
+      </w:r>
+      <w:proofErr w:type="spellStart"/>
+      <w:r>
+        <w:rPr>
+          <w:lang w:val="es-ES"/>
+        </w:rPr>
+        <w:t>FechaDesde</w:t>
+      </w:r>
+      <w:proofErr w:type="spellEnd"/>
+      <w:r>
+        <w:rPr>
+          <w:lang w:val="es-ES"/>
+        </w:rPr>
+        <w:t xml:space="preserve">, </w:t>
+      </w:r>
+      <w:proofErr w:type="spellStart"/>
+      <w:r>
+        <w:rPr>
+          <w:lang w:val="es-ES"/>
+        </w:rPr>
+        <w:t>FechaHasta</w:t>
+      </w:r>
+      <w:proofErr w:type="spellEnd"/>
+      <w:r>
+        <w:rPr>
+          <w:lang w:val="es-ES"/>
+        </w:rPr>
+        <w:t xml:space="preserve">, </w:t>
+      </w:r>
+      <w:proofErr w:type="spellStart"/>
+      <w:r>
+        <w:rPr>
+          <w:lang w:val="es-ES"/>
+        </w:rPr>
+        <w:t>AñoDesignado</w:t>
+      </w:r>
+      <w:proofErr w:type="spellEnd"/>
+      <w:r>
+        <w:rPr>
+          <w:lang w:val="es-ES"/>
+        </w:rPr>
+        <w:t xml:space="preserve">, </w:t>
+      </w:r>
+      <w:proofErr w:type="spellStart"/>
+      <w:r>
+        <w:rPr>
+          <w:lang w:val="es-ES"/>
+        </w:rPr>
+        <w:t>DivisionDesignada</w:t>
+      </w:r>
+      <w:proofErr w:type="spellEnd"/>
+      <w:r>
+        <w:rPr>
+          <w:lang w:val="es-ES"/>
+        </w:rPr>
+        <w:t xml:space="preserve">, </w:t>
+      </w:r>
+      <w:proofErr w:type="spellStart"/>
+      <w:r>
+        <w:rPr>
+          <w:lang w:val="es-ES"/>
+        </w:rPr>
+        <w:t>FechaDesignacion</w:t>
+      </w:r>
+      <w:proofErr w:type="spellEnd"/>
+      <w:r>
+        <w:rPr>
+          <w:lang w:val="es-ES"/>
+        </w:rPr>
+        <w:t xml:space="preserve">, </w:t>
+      </w:r>
+      <w:r>
+        <w:rPr>
+          <w:lang w:val="es-ES"/>
+        </w:rPr>
+        <w:t xml:space="preserve">la </w:t>
+      </w:r>
+      <w:proofErr w:type="spellStart"/>
+      <w:r>
+        <w:rPr>
+          <w:lang w:val="es-ES"/>
+        </w:rPr>
+        <w:t>FechaTomaPosecion</w:t>
+      </w:r>
+      <w:proofErr w:type="spellEnd"/>
+      <w:r>
+        <w:rPr>
+          <w:lang w:val="es-ES"/>
+        </w:rPr>
+        <w:t>,</w:t>
+      </w:r>
+      <w:r>
+        <w:rPr>
+          <w:lang w:val="es-ES"/>
+        </w:rPr>
+        <w:t xml:space="preserve"> </w:t>
+      </w:r>
+      <w:proofErr w:type="spellStart"/>
+      <w:r>
+        <w:rPr>
+          <w:lang w:val="es-ES"/>
+        </w:rPr>
+        <w:t>NombreMateria</w:t>
+      </w:r>
+      <w:proofErr w:type="spellEnd"/>
+      <w:r>
+        <w:rPr>
+          <w:lang w:val="es-ES"/>
+        </w:rPr>
+        <w:t xml:space="preserve">, </w:t>
+      </w:r>
+      <w:proofErr w:type="spellStart"/>
+      <w:r>
+        <w:rPr>
+          <w:lang w:val="es-ES"/>
+        </w:rPr>
+        <w:t>HoraEntrada</w:t>
+      </w:r>
+      <w:proofErr w:type="spellEnd"/>
+      <w:r>
+        <w:rPr>
+          <w:lang w:val="es-ES"/>
+        </w:rPr>
+        <w:t xml:space="preserve">, </w:t>
+      </w:r>
+      <w:proofErr w:type="spellStart"/>
+      <w:r>
+        <w:rPr>
+          <w:lang w:val="es-ES"/>
+        </w:rPr>
+        <w:t>HoraSalida</w:t>
+      </w:r>
+      <w:proofErr w:type="spellEnd"/>
+      <w:r>
+        <w:rPr>
+          <w:lang w:val="es-ES"/>
+        </w:rPr>
+        <w:t xml:space="preserve">, </w:t>
+      </w:r>
+      <w:proofErr w:type="spellStart"/>
+      <w:r>
+        <w:rPr>
+          <w:lang w:val="es-ES"/>
+        </w:rPr>
+        <w:t>DiaDeLaSemana</w:t>
+      </w:r>
+      <w:proofErr w:type="spellEnd"/>
+      <w:r>
+        <w:rPr>
+          <w:lang w:val="es-ES"/>
+        </w:rPr>
         <w:t>.</w:t>
       </w:r>
-    </w:p>
-    <w:p>
-      <w:pPr>
-        <w:tabs>
-          <w:tab w:val="left" w:pos="1792"/>
-        </w:tabs>
-        <w:rPr>
-          <w:lang w:val="es-ES"/>
-        </w:rPr>
-      </w:pPr>
-      <w:r>
-        <w:rPr>
-          <w:lang w:val="es-ES"/>
-        </w:rPr>
-        <w:t xml:space="preserve">Necesito que el sistema le mande automáticamente al cliente , un mail , si el abono se renueva automáticamente , en la fecha de </w:t>
+      <w:r>
+        <w:rPr>
+          <w:lang w:val="es-ES"/>
+        </w:rPr>
+        <w:t xml:space="preserve"> </w:t>
+      </w:r>
+      <w:r>
+        <w:rPr>
+          <w:lang w:val="es-ES"/>
+        </w:rPr>
+        <w:t xml:space="preserve">Una vez terminado eso, necesito que me modifiques la carga de </w:t>
+      </w:r>
+      <w:r>
+        <w:rPr>
+          <w:lang w:val="es-ES"/>
+        </w:rPr>
+        <w:t xml:space="preserve">nuevo horario, que al apretar el botón de Agregar Horario, que los datos los tome , se relacione, con la tabla Designaciones, usando, Establecimiento, Año, </w:t>
       </w:r>
       <w:proofErr w:type="spellStart"/>
       <w:r>
         <w:rPr>
           <w:lang w:val="es-ES"/>
         </w:rPr>
-        <w:t>debito</w:t>
+        <w:t>Division</w:t>
       </w:r>
       <w:proofErr w:type="spellEnd"/>
       <w:r>
         <w:rPr>
           <w:lang w:val="es-ES"/>
         </w:rPr>
-        <w:t xml:space="preserve"> </w:t>
+        <w:t xml:space="preserve">, </w:t>
       </w:r>
       <w:proofErr w:type="spellStart"/>
       <w:r>
         <w:rPr>
           <w:lang w:val="es-ES"/>
         </w:rPr>
-        <w:t>automatico</w:t>
+        <w:t>NombreMateria</w:t>
       </w:r>
       <w:proofErr w:type="spellEnd"/>
       <w:r>
         <w:rPr>
           <w:lang w:val="es-ES"/>
         </w:rPr>
-        <w:t xml:space="preserve">,  del abono desde la cuenta de mercado pago, o </w:t>
+        <w:t xml:space="preserve">, </w:t>
       </w:r>
       <w:proofErr w:type="spellStart"/>
       <w:r>
         <w:rPr>
           <w:lang w:val="es-ES"/>
         </w:rPr>
-        <w:t>paypal</w:t>
+        <w:t>DiaSemana</w:t>
       </w:r>
       <w:proofErr w:type="spellEnd"/>
       <w:r>
         <w:rPr>
           <w:lang w:val="es-ES"/>
         </w:rPr>
-        <w:t xml:space="preserve">,  si el cliente no hace debito </w:t>
+        <w:t xml:space="preserve">, Turno, </w:t>
       </w:r>
       <w:proofErr w:type="spellStart"/>
       <w:r>
         <w:rPr>
           <w:lang w:val="es-ES"/>
         </w:rPr>
-        <w:t>automatico</w:t>
+        <w:t>HoraEntrada</w:t>
       </w:r>
       <w:proofErr w:type="spellEnd"/>
       <w:r>
         <w:rPr>
           <w:lang w:val="es-ES"/>
         </w:rPr>
-        <w:t xml:space="preserve">, 7 </w:t>
+        <w:t xml:space="preserve">, </w:t>
       </w:r>
       <w:proofErr w:type="spellStart"/>
       <w:r>
         <w:rPr>
           <w:lang w:val="es-ES"/>
         </w:rPr>
-        <w:t>dias</w:t>
+        <w:t>HoraSalida</w:t>
       </w:r>
       <w:proofErr w:type="spellEnd"/>
       <w:r>
         <w:rPr>
           <w:lang w:val="es-ES"/>
         </w:rPr>
-        <w:t xml:space="preserve"> antes un mail recordándole la fecha de vencimiento del abono, y un mail, una vez acreditado el pago, o una vez que el cliente pague el abono con la billetera de mercado pago o </w:t>
-      </w:r>
-      <w:proofErr w:type="spellStart"/>
-      <w:r>
-        <w:rPr>
-          <w:lang w:val="es-ES"/>
-        </w:rPr>
-        <w:t>paypal</w:t>
-      </w:r>
-      <w:proofErr w:type="spellEnd"/>
-      <w:r>
-        <w:rPr>
-          <w:lang w:val="es-ES"/>
-        </w:rPr>
-        <w:t>, en cada caso el mail debe contener la información de la transacción, y los datos del próximo vencimiento, teniendo en cuenta que el abono puede ser mensual, semestral o anual.</w:t>
-      </w:r>
-    </w:p>
-    <w:p>
-      <w:pPr>
-        <w:tabs>
-          <w:tab w:val="left" w:pos="1792"/>
-        </w:tabs>
-        <w:rPr>
-          <w:lang w:val="es-ES"/>
-        </w:rPr>
-      </w:pPr>
-      <w:r>
-        <w:rPr>
-          <w:lang w:val="es-ES"/>
-        </w:rPr>
-        <w:t xml:space="preserve">Necesito me desarrolles una </w:t>
-      </w:r>
-      <w:proofErr w:type="spellStart"/>
-      <w:r>
-        <w:rPr>
-          <w:lang w:val="es-ES"/>
-        </w:rPr>
-        <w:t>landing</w:t>
-      </w:r>
-      <w:proofErr w:type="spellEnd"/>
-      <w:r>
-        <w:rPr>
-          <w:lang w:val="es-ES"/>
-        </w:rPr>
-        <w:t xml:space="preserve"> page con diseño moderno, para explicar las bondades y </w:t>
-      </w:r>
-      <w:proofErr w:type="spellStart"/>
-      <w:r>
-        <w:rPr>
-          <w:lang w:val="es-ES"/>
-        </w:rPr>
-        <w:t>caracterisitcas</w:t>
-      </w:r>
-      <w:proofErr w:type="spellEnd"/>
-      <w:r>
-        <w:rPr>
-          <w:lang w:val="es-ES"/>
-        </w:rPr>
-        <w:t xml:space="preserve"> del software que estamos desarrollando, que tenga las opciones de Inicio, </w:t>
-      </w:r>
-      <w:r>
-        <w:rPr>
-          <w:lang w:val="es-ES"/>
-        </w:rPr>
-        <w:t xml:space="preserve">Producto, </w:t>
-      </w:r>
-      <w:r>
-        <w:rPr>
-          <w:lang w:val="es-ES"/>
-        </w:rPr>
-        <w:t xml:space="preserve">Contacto  </w:t>
-      </w:r>
-      <w:r>
-        <w:rPr>
-          <w:lang w:val="es-ES"/>
-        </w:rPr>
-        <w:t xml:space="preserve">Un formulario de contacto con: Apellido y nombre, teléfono, dirección de mail, y mensaje. Y que al enviar el contacto el cliente reciba en el mail declarado en el campo, una confirmación de </w:t>
-      </w:r>
-      <w:proofErr w:type="spellStart"/>
-      <w:r>
-        <w:rPr>
-          <w:lang w:val="es-ES"/>
-        </w:rPr>
-        <w:t>envio</w:t>
-      </w:r>
-      <w:proofErr w:type="spellEnd"/>
-      <w:r>
-        <w:rPr>
-          <w:lang w:val="es-ES"/>
-        </w:rPr>
-        <w:t xml:space="preserve"> del </w:t>
-      </w:r>
-      <w:proofErr w:type="spellStart"/>
-      <w:r>
-        <w:rPr>
-          <w:lang w:val="es-ES"/>
-        </w:rPr>
-        <w:t>msj</w:t>
-      </w:r>
-      <w:proofErr w:type="spellEnd"/>
-      <w:r>
-        <w:rPr>
-          <w:lang w:val="es-ES"/>
-        </w:rPr>
-        <w:t xml:space="preserve"> para contacto. Y el</w:t>
-      </w:r>
-      <w:r>
-        <w:rPr>
-          <w:lang w:val="es-ES"/>
-        </w:rPr>
-        <w:t xml:space="preserve"> </w:t>
-      </w:r>
-      <w:proofErr w:type="spellStart"/>
-      <w:r>
-        <w:rPr>
-          <w:lang w:val="es-ES"/>
-        </w:rPr>
-        <w:t>Login</w:t>
-      </w:r>
-      <w:proofErr w:type="gramStart"/>
-      <w:r>
-        <w:rPr>
-          <w:lang w:val="es-ES"/>
-        </w:rPr>
-        <w:t>,</w:t>
-      </w:r>
-      <w:r>
-        <w:rPr>
-          <w:lang w:val="es-ES"/>
-        </w:rPr>
-        <w:t>que</w:t>
-      </w:r>
-      <w:proofErr w:type="spellEnd"/>
-      <w:proofErr w:type="gramEnd"/>
-      <w:r>
-        <w:rPr>
-          <w:lang w:val="es-ES"/>
-        </w:rPr>
-        <w:t xml:space="preserve"> esta opción enlace la </w:t>
-      </w:r>
-      <w:proofErr w:type="spellStart"/>
-      <w:r>
-        <w:rPr>
-          <w:lang w:val="es-ES"/>
-        </w:rPr>
-        <w:t>landing</w:t>
-      </w:r>
-      <w:proofErr w:type="spellEnd"/>
-      <w:r>
-        <w:rPr>
-          <w:lang w:val="es-ES"/>
-        </w:rPr>
-        <w:t xml:space="preserve"> con el </w:t>
-      </w:r>
-      <w:proofErr w:type="spellStart"/>
-      <w:r>
-        <w:rPr>
-          <w:lang w:val="es-ES"/>
-        </w:rPr>
-        <w:t>login</w:t>
-      </w:r>
-      <w:proofErr w:type="spellEnd"/>
-      <w:r>
-        <w:rPr>
-          <w:lang w:val="es-ES"/>
-        </w:rPr>
-        <w:t xml:space="preserve"> de sistema, ya seas </w:t>
-      </w:r>
-      <w:proofErr w:type="spellStart"/>
-      <w:r>
-        <w:rPr>
-          <w:lang w:val="es-ES"/>
-        </w:rPr>
-        <w:t>admin</w:t>
-      </w:r>
-      <w:proofErr w:type="spellEnd"/>
-      <w:r>
-        <w:rPr>
-          <w:lang w:val="es-ES"/>
-        </w:rPr>
-        <w:t xml:space="preserve">, </w:t>
-      </w:r>
-      <w:proofErr w:type="spellStart"/>
-      <w:r>
-        <w:rPr>
-          <w:lang w:val="es-ES"/>
-        </w:rPr>
-        <w:t>super</w:t>
-      </w:r>
-      <w:proofErr w:type="spellEnd"/>
-      <w:r>
-        <w:rPr>
-          <w:lang w:val="es-ES"/>
-        </w:rPr>
-        <w:t xml:space="preserve"> </w:t>
-      </w:r>
-      <w:proofErr w:type="spellStart"/>
-      <w:r>
-        <w:rPr>
-          <w:lang w:val="es-ES"/>
-        </w:rPr>
-        <w:t>admin</w:t>
-      </w:r>
-      <w:proofErr w:type="spellEnd"/>
-      <w:r>
-        <w:rPr>
-          <w:lang w:val="es-ES"/>
-        </w:rPr>
-        <w:t xml:space="preserve"> o docente. Desde el menú </w:t>
-      </w:r>
-      <w:proofErr w:type="spellStart"/>
-      <w:r>
-        <w:rPr>
-          <w:lang w:val="es-ES"/>
-        </w:rPr>
-        <w:t>Producto,la</w:t>
-      </w:r>
-      <w:proofErr w:type="spellEnd"/>
-      <w:r>
-        <w:rPr>
-          <w:lang w:val="es-ES"/>
-        </w:rPr>
-        <w:t xml:space="preserve"> </w:t>
-      </w:r>
-      <w:r>
-        <w:rPr>
-          <w:lang w:val="es-ES"/>
-        </w:rPr>
-        <w:t xml:space="preserve">posibilidad de adquirir </w:t>
-      </w:r>
-      <w:r>
-        <w:rPr>
-          <w:lang w:val="es-ES"/>
-        </w:rPr>
-        <w:t xml:space="preserve">(Suscribirse) a </w:t>
-      </w:r>
-      <w:r>
-        <w:rPr>
-          <w:lang w:val="es-ES"/>
-        </w:rPr>
-        <w:t xml:space="preserve">el </w:t>
-      </w:r>
-      <w:r>
-        <w:rPr>
-          <w:lang w:val="es-ES"/>
-        </w:rPr>
-        <w:t>servicio</w:t>
-      </w:r>
-      <w:r>
-        <w:rPr>
-          <w:lang w:val="es-ES"/>
-        </w:rPr>
-        <w:t xml:space="preserve">, que al ingresar a la opción, me muestre la clásica vista donde me permite elegir entre las tres opciones de abono registradas </w:t>
-      </w:r>
-      <w:r>
-        <w:rPr>
-          <w:lang w:val="es-ES"/>
-        </w:rPr>
-        <w:t xml:space="preserve">(las que ya están en planes) </w:t>
-      </w:r>
-      <w:r>
-        <w:rPr>
-          <w:lang w:val="es-ES"/>
-        </w:rPr>
-        <w:t>en el sistema, tomando los datos de los planes desde el sistema, y que al seleccionar alguna de las tres opciones me mande directamente a un formulario de registro que me registre (si se puede</w:t>
-      </w:r>
-      <w:r>
-        <w:rPr>
-          <w:lang w:val="es-ES"/>
-        </w:rPr>
-        <w:t>,</w:t>
-      </w:r>
-      <w:r>
-        <w:rPr>
-          <w:lang w:val="es-ES"/>
-        </w:rPr>
-        <w:t xml:space="preserve"> reutilizar el de registro de usuario), que me complete los datos automáticamente del plan elegido, y al aceptar, me muestre un </w:t>
-      </w:r>
-      <w:r>
-        <w:rPr>
-          <w:lang w:val="es-ES"/>
-        </w:rPr>
-        <w:t xml:space="preserve">modal con la </w:t>
-      </w:r>
-      <w:proofErr w:type="spellStart"/>
-      <w:r>
-        <w:rPr>
-          <w:lang w:val="es-ES"/>
-        </w:rPr>
-        <w:t>info</w:t>
-      </w:r>
-      <w:proofErr w:type="spellEnd"/>
-      <w:r>
-        <w:rPr>
-          <w:lang w:val="es-ES"/>
-        </w:rPr>
-        <w:t xml:space="preserve"> resumida de</w:t>
-      </w:r>
-      <w:r>
-        <w:rPr>
-          <w:lang w:val="es-ES"/>
-        </w:rPr>
-        <w:t xml:space="preserve"> la transacción que </w:t>
-      </w:r>
-      <w:proofErr w:type="spellStart"/>
-      <w:r>
-        <w:rPr>
-          <w:lang w:val="es-ES"/>
-        </w:rPr>
-        <w:t>esta</w:t>
-      </w:r>
-      <w:proofErr w:type="spellEnd"/>
-      <w:r>
-        <w:rPr>
-          <w:lang w:val="es-ES"/>
-        </w:rPr>
-        <w:t xml:space="preserve"> a punto de confirmar, y que al aceptarla me mande un mail, con los datos del registro, y un link de activación de la cuenta, con las instrucciones de activación, y que al ir al link, se le </w:t>
-      </w:r>
-      <w:proofErr w:type="spellStart"/>
-      <w:r>
-        <w:rPr>
-          <w:lang w:val="es-ES"/>
-        </w:rPr>
-        <w:t>envie</w:t>
-      </w:r>
-      <w:proofErr w:type="spellEnd"/>
-      <w:r>
-        <w:rPr>
-          <w:lang w:val="es-ES"/>
-        </w:rPr>
-        <w:t xml:space="preserve"> al cliente un mail con la confirmación de la cuenta, y quede activada la misma para su utilización.</w:t>
-      </w:r>
-    </w:p>
-    <w:p>
-      <w:pPr>
-        <w:tabs>
-          <w:tab w:val="left" w:pos="1792"/>
-        </w:tabs>
-        <w:rPr>
-          <w:lang w:val="es-ES"/>
-        </w:rPr>
-      </w:pPr>
-    </w:p>
-    <w:p>
-      <w:pPr>
-        <w:tabs>
-          <w:tab w:val="left" w:pos="1792"/>
-        </w:tabs>
-        <w:rPr>
-          <w:lang w:val="es-ES"/>
-        </w:rPr>
-      </w:pPr>
-      <w:proofErr w:type="gramStart"/>
-      <w:r>
-        <w:rPr>
-          <w:lang w:val="es-ES"/>
-        </w:rPr>
-        <w:t>con</w:t>
-      </w:r>
-      <w:proofErr w:type="gramEnd"/>
-      <w:r>
-        <w:rPr>
-          <w:lang w:val="es-ES"/>
-        </w:rPr>
-        <w:t xml:space="preserve"> un recordatorio 10 </w:t>
-      </w:r>
-      <w:proofErr w:type="spellStart"/>
-      <w:r>
-        <w:rPr>
-          <w:lang w:val="es-ES"/>
-        </w:rPr>
-        <w:t>dias</w:t>
-      </w:r>
-      <w:proofErr w:type="spellEnd"/>
-      <w:r>
-        <w:rPr>
-          <w:lang w:val="es-ES"/>
-        </w:rPr>
-        <w:t xml:space="preserve"> antes del vencimiento del abono para que este renueve el abono, si el abono se renueva </w:t>
-      </w:r>
-      <w:proofErr w:type="spellStart"/>
-      <w:r>
-        <w:rPr>
-          <w:lang w:val="es-ES"/>
-        </w:rPr>
-        <w:t>automaticament</w:t>
-      </w:r>
-      <w:proofErr w:type="spellEnd"/>
-    </w:p>
+        <w:t xml:space="preserve"> .</w:t>
+      </w:r>
+    </w:p>
+    <w:bookmarkEnd w:id="0"/>
     <w:p>
       <w:pPr>
         <w:rPr>
@@ -13276,7 +13710,7 @@
 </file>
 
 <file path=customXml/itemProps1.xml><?xml version="1.0" encoding="utf-8"?>
-<ds:datastoreItem xmlns:ds="http://schemas.openxmlformats.org/officeDocument/2006/customXml" ds:itemID="{13471C47-1E86-41C6-A037-3B51DE3C1CE4}">
+<ds:datastoreItem xmlns:ds="http://schemas.openxmlformats.org/officeDocument/2006/customXml" ds:itemID="{9A4FABD3-63F0-4B77-9C99-487C313E92B0}">
   <ds:schemaRefs>
     <ds:schemaRef ds:uri="http://schemas.openxmlformats.org/officeDocument/2006/bibliography"/>
   </ds:schemaRefs>

</xml_diff>

<commit_message>
se agrega al crud de Designaciones, el dato IGE y CantModulos/Horas, y un selector de horario unificado/dividido, si es dividido, que permite cargar, para cada dia, el dia, la cantidad de modulos/hs del dia y el horario de entrada y el horario de salida de cada dia y a la vista designaciones le agregue el numero de secuencia entre el IGE y la materia
</commit_message>
<xml_diff>
--- a/requerimientos.docx
+++ b/requerimientos.docx
@@ -9352,454 +9352,764 @@
           <w:tab w:val="left" w:pos="1792"/>
         </w:tabs>
         <w:rPr>
-          <w:lang w:val="es-ES"/>
-        </w:rPr>
-      </w:pPr>
+          <w:b/>
+          <w:lang w:val="es-ES"/>
+        </w:rPr>
+      </w:pPr>
+      <w:r>
+        <w:rPr>
+          <w:b/>
+          <w:lang w:val="es-ES"/>
+        </w:rPr>
+        <w:t>Necesito me generes en el menú a administración, en el apartado horarios una ítem que se llame Designaciones, en el debo acceder a un crud que me permita cargar las designaciones docentes, con los s</w:t>
+      </w:r>
+      <w:r>
+        <w:rPr>
+          <w:b/>
+          <w:lang w:val="es-ES"/>
+        </w:rPr>
+        <w:t xml:space="preserve">iguientes datos, Distrito, </w:t>
+      </w:r>
+      <w:proofErr w:type="spellStart"/>
+      <w:r>
+        <w:rPr>
+          <w:b/>
+          <w:lang w:val="es-ES"/>
+        </w:rPr>
+        <w:t>Tipo</w:t>
+      </w:r>
+      <w:r>
+        <w:rPr>
+          <w:b/>
+          <w:lang w:val="es-ES"/>
+        </w:rPr>
+        <w:t>Establecimiento</w:t>
+      </w:r>
+      <w:proofErr w:type="spellEnd"/>
+      <w:r>
+        <w:rPr>
+          <w:b/>
+          <w:lang w:val="es-ES"/>
+        </w:rPr>
+        <w:t xml:space="preserve">, </w:t>
+      </w:r>
+      <w:proofErr w:type="spellStart"/>
+      <w:r>
+        <w:rPr>
+          <w:b/>
+          <w:lang w:val="es-ES"/>
+        </w:rPr>
+        <w:t>NumeroEscuela</w:t>
+      </w:r>
+      <w:proofErr w:type="spellEnd"/>
+      <w:r>
+        <w:rPr>
+          <w:b/>
+          <w:lang w:val="es-ES"/>
+        </w:rPr>
+        <w:t>,</w:t>
+      </w:r>
+      <w:r>
+        <w:rPr>
+          <w:b/>
+          <w:lang w:val="es-ES"/>
+        </w:rPr>
+        <w:t xml:space="preserve"> </w:t>
+      </w:r>
+      <w:proofErr w:type="spellStart"/>
+      <w:r>
+        <w:rPr>
+          <w:b/>
+          <w:lang w:val="es-ES"/>
+        </w:rPr>
+        <w:t>NombreEstablecimiento</w:t>
+      </w:r>
+      <w:proofErr w:type="spellEnd"/>
+      <w:r>
+        <w:rPr>
+          <w:b/>
+          <w:lang w:val="es-ES"/>
+        </w:rPr>
+        <w:t>,</w:t>
+      </w:r>
+      <w:r>
+        <w:rPr>
+          <w:b/>
+          <w:lang w:val="es-ES"/>
+        </w:rPr>
+        <w:t xml:space="preserve"> Secuencia(opcional), desde un </w:t>
+      </w:r>
+      <w:proofErr w:type="spellStart"/>
+      <w:r>
+        <w:rPr>
+          <w:b/>
+          <w:lang w:val="es-ES"/>
+        </w:rPr>
+        <w:t>select</w:t>
+      </w:r>
+      <w:proofErr w:type="spellEnd"/>
+      <w:r>
+        <w:rPr>
+          <w:b/>
+          <w:lang w:val="es-ES"/>
+        </w:rPr>
+        <w:t xml:space="preserve">, si es oficial o </w:t>
+      </w:r>
+      <w:proofErr w:type="spellStart"/>
+      <w:r>
+        <w:rPr>
+          <w:b/>
+          <w:lang w:val="es-ES"/>
+        </w:rPr>
+        <w:t>Di.Pre.Gep</w:t>
+      </w:r>
+      <w:proofErr w:type="spellEnd"/>
+      <w:r>
+        <w:rPr>
+          <w:b/>
+          <w:lang w:val="es-ES"/>
+        </w:rPr>
+        <w:t xml:space="preserve">, el </w:t>
+      </w:r>
+      <w:proofErr w:type="spellStart"/>
+      <w:r>
+        <w:rPr>
+          <w:b/>
+          <w:lang w:val="es-ES"/>
+        </w:rPr>
+        <w:t>RegimenEstatutario</w:t>
+      </w:r>
+      <w:proofErr w:type="spellEnd"/>
+      <w:r>
+        <w:rPr>
+          <w:b/>
+          <w:lang w:val="es-ES"/>
+        </w:rPr>
+        <w:t xml:space="preserve">, </w:t>
+      </w:r>
+      <w:proofErr w:type="spellStart"/>
+      <w:r>
+        <w:rPr>
+          <w:b/>
+          <w:lang w:val="es-ES"/>
+        </w:rPr>
+        <w:t>CaracterDeRevista</w:t>
+      </w:r>
+      <w:proofErr w:type="spellEnd"/>
+      <w:r>
+        <w:rPr>
+          <w:b/>
+          <w:lang w:val="es-ES"/>
+        </w:rPr>
+        <w:t>,</w:t>
+      </w:r>
+      <w:r>
+        <w:rPr>
+          <w:b/>
+          <w:lang w:val="es-ES"/>
+        </w:rPr>
+        <w:t xml:space="preserve"> </w:t>
+      </w:r>
+      <w:r>
+        <w:rPr>
+          <w:b/>
+          <w:lang w:val="es-ES"/>
+        </w:rPr>
+        <w:t xml:space="preserve">de un </w:t>
+      </w:r>
+      <w:proofErr w:type="spellStart"/>
+      <w:r>
+        <w:rPr>
+          <w:b/>
+          <w:lang w:val="es-ES"/>
+        </w:rPr>
+        <w:t>select</w:t>
+      </w:r>
+      <w:proofErr w:type="spellEnd"/>
+      <w:r>
+        <w:rPr>
+          <w:b/>
+          <w:lang w:val="es-ES"/>
+        </w:rPr>
+        <w:t xml:space="preserve"> si son </w:t>
+      </w:r>
+      <w:proofErr w:type="spellStart"/>
+      <w:r>
+        <w:rPr>
+          <w:b/>
+          <w:lang w:val="es-ES"/>
+        </w:rPr>
+        <w:t>Modulos</w:t>
+      </w:r>
+      <w:proofErr w:type="spellEnd"/>
+      <w:r>
+        <w:rPr>
+          <w:b/>
+          <w:lang w:val="es-ES"/>
+        </w:rPr>
+        <w:t xml:space="preserve"> u Horas, el </w:t>
+      </w:r>
+      <w:proofErr w:type="spellStart"/>
+      <w:r>
+        <w:rPr>
+          <w:b/>
+          <w:lang w:val="es-ES"/>
+        </w:rPr>
+        <w:t>Cupof</w:t>
+      </w:r>
+      <w:proofErr w:type="spellEnd"/>
+      <w:r>
+        <w:rPr>
+          <w:b/>
+          <w:lang w:val="es-ES"/>
+        </w:rPr>
+        <w:t xml:space="preserve">, Dependencia, </w:t>
+      </w:r>
+      <w:proofErr w:type="spellStart"/>
+      <w:r>
+        <w:rPr>
+          <w:b/>
+          <w:lang w:val="es-ES"/>
+        </w:rPr>
+        <w:t>Turno</w:t>
+      </w:r>
+      <w:r>
+        <w:rPr>
+          <w:b/>
+          <w:lang w:val="es-ES"/>
+        </w:rPr>
+        <w:t>Desempeño</w:t>
+      </w:r>
+      <w:proofErr w:type="spellEnd"/>
+      <w:r>
+        <w:rPr>
+          <w:b/>
+          <w:lang w:val="es-ES"/>
+        </w:rPr>
+        <w:t xml:space="preserve">, </w:t>
+      </w:r>
+      <w:proofErr w:type="spellStart"/>
+      <w:r>
+        <w:rPr>
+          <w:b/>
+          <w:lang w:val="es-ES"/>
+        </w:rPr>
+        <w:t>FechaDesde</w:t>
+      </w:r>
+      <w:proofErr w:type="spellEnd"/>
+      <w:r>
+        <w:rPr>
+          <w:b/>
+          <w:lang w:val="es-ES"/>
+        </w:rPr>
+        <w:t xml:space="preserve">, </w:t>
+      </w:r>
+      <w:proofErr w:type="spellStart"/>
+      <w:r>
+        <w:rPr>
+          <w:b/>
+          <w:lang w:val="es-ES"/>
+        </w:rPr>
+        <w:t>FechaHasta</w:t>
+      </w:r>
+      <w:proofErr w:type="spellEnd"/>
+      <w:r>
+        <w:rPr>
+          <w:b/>
+          <w:lang w:val="es-ES"/>
+        </w:rPr>
+        <w:t xml:space="preserve">, </w:t>
+      </w:r>
+      <w:proofErr w:type="spellStart"/>
+      <w:r>
+        <w:rPr>
+          <w:b/>
+          <w:lang w:val="es-ES"/>
+        </w:rPr>
+        <w:t>AñoDesignado</w:t>
+      </w:r>
+      <w:proofErr w:type="spellEnd"/>
+      <w:r>
+        <w:rPr>
+          <w:b/>
+          <w:lang w:val="es-ES"/>
+        </w:rPr>
+        <w:t xml:space="preserve">, </w:t>
+      </w:r>
+      <w:proofErr w:type="spellStart"/>
+      <w:r>
+        <w:rPr>
+          <w:b/>
+          <w:lang w:val="es-ES"/>
+        </w:rPr>
+        <w:t>DivisionDesignada</w:t>
+      </w:r>
+      <w:proofErr w:type="spellEnd"/>
+      <w:r>
+        <w:rPr>
+          <w:b/>
+          <w:lang w:val="es-ES"/>
+        </w:rPr>
+        <w:t xml:space="preserve">, </w:t>
+      </w:r>
+      <w:proofErr w:type="spellStart"/>
+      <w:r>
+        <w:rPr>
+          <w:b/>
+          <w:lang w:val="es-ES"/>
+        </w:rPr>
+        <w:t>FechaDesignacion</w:t>
+      </w:r>
+      <w:proofErr w:type="spellEnd"/>
+      <w:r>
+        <w:rPr>
+          <w:b/>
+          <w:lang w:val="es-ES"/>
+        </w:rPr>
+        <w:t xml:space="preserve">, la </w:t>
+      </w:r>
+      <w:proofErr w:type="spellStart"/>
+      <w:r>
+        <w:rPr>
+          <w:b/>
+          <w:lang w:val="es-ES"/>
+        </w:rPr>
+        <w:t>FechaTomaPosecion</w:t>
+      </w:r>
+      <w:proofErr w:type="spellEnd"/>
+      <w:r>
+        <w:rPr>
+          <w:b/>
+          <w:lang w:val="es-ES"/>
+        </w:rPr>
+        <w:t xml:space="preserve">, </w:t>
+      </w:r>
+      <w:proofErr w:type="spellStart"/>
+      <w:r>
+        <w:rPr>
+          <w:b/>
+          <w:lang w:val="es-ES"/>
+        </w:rPr>
+        <w:t>NombreMateria</w:t>
+      </w:r>
+      <w:proofErr w:type="spellEnd"/>
+      <w:r>
+        <w:rPr>
+          <w:b/>
+          <w:lang w:val="es-ES"/>
+        </w:rPr>
+        <w:t xml:space="preserve">, </w:t>
+      </w:r>
+      <w:proofErr w:type="spellStart"/>
+      <w:r>
+        <w:rPr>
+          <w:b/>
+          <w:lang w:val="es-ES"/>
+        </w:rPr>
+        <w:t>HoraEntrada</w:t>
+      </w:r>
+      <w:proofErr w:type="spellEnd"/>
+      <w:r>
+        <w:rPr>
+          <w:b/>
+          <w:lang w:val="es-ES"/>
+        </w:rPr>
+        <w:t xml:space="preserve">, </w:t>
+      </w:r>
+      <w:proofErr w:type="spellStart"/>
+      <w:r>
+        <w:rPr>
+          <w:b/>
+          <w:lang w:val="es-ES"/>
+        </w:rPr>
+        <w:t>HoraSalida</w:t>
+      </w:r>
+      <w:proofErr w:type="spellEnd"/>
+      <w:r>
+        <w:rPr>
+          <w:b/>
+          <w:lang w:val="es-ES"/>
+        </w:rPr>
+        <w:t xml:space="preserve">, </w:t>
+      </w:r>
+      <w:proofErr w:type="spellStart"/>
+      <w:r>
+        <w:rPr>
+          <w:b/>
+          <w:lang w:val="es-ES"/>
+        </w:rPr>
+        <w:t>DiaDeLaSemana</w:t>
+      </w:r>
+      <w:proofErr w:type="spellEnd"/>
+      <w:r>
+        <w:rPr>
+          <w:b/>
+          <w:lang w:val="es-ES"/>
+        </w:rPr>
+        <w:t>.</w:t>
+      </w:r>
+      <w:r>
+        <w:rPr>
+          <w:b/>
+          <w:lang w:val="es-ES"/>
+        </w:rPr>
+        <w:t xml:space="preserve"> </w:t>
+      </w:r>
+      <w:r>
+        <w:rPr>
+          <w:b/>
+          <w:lang w:val="es-ES"/>
+        </w:rPr>
+        <w:t xml:space="preserve">Una vez terminado eso, necesito que me modifiques la carga de </w:t>
+      </w:r>
+      <w:r>
+        <w:rPr>
+          <w:b/>
+          <w:lang w:val="es-ES"/>
+        </w:rPr>
+        <w:t xml:space="preserve">nuevo horario, que al apretar el botón de Agregar Horario, que los datos los tome , se relacione, con la tabla Designaciones, usando, Establecimiento, Año, </w:t>
+      </w:r>
+      <w:proofErr w:type="spellStart"/>
+      <w:r>
+        <w:rPr>
+          <w:b/>
+          <w:lang w:val="es-ES"/>
+        </w:rPr>
+        <w:t>Division</w:t>
+      </w:r>
+      <w:proofErr w:type="spellEnd"/>
+      <w:r>
+        <w:rPr>
+          <w:b/>
+          <w:lang w:val="es-ES"/>
+        </w:rPr>
+        <w:t xml:space="preserve">, </w:t>
+      </w:r>
+      <w:proofErr w:type="spellStart"/>
+      <w:r>
+        <w:rPr>
+          <w:b/>
+          <w:lang w:val="es-ES"/>
+        </w:rPr>
+        <w:t>NombreMateria</w:t>
+      </w:r>
+      <w:proofErr w:type="spellEnd"/>
+      <w:r>
+        <w:rPr>
+          <w:b/>
+          <w:lang w:val="es-ES"/>
+        </w:rPr>
+        <w:t xml:space="preserve">, </w:t>
+      </w:r>
+      <w:proofErr w:type="spellStart"/>
+      <w:r>
+        <w:rPr>
+          <w:b/>
+          <w:lang w:val="es-ES"/>
+        </w:rPr>
+        <w:t>DiaSemana</w:t>
+      </w:r>
+      <w:proofErr w:type="spellEnd"/>
+      <w:r>
+        <w:rPr>
+          <w:b/>
+          <w:lang w:val="es-ES"/>
+        </w:rPr>
+        <w:t xml:space="preserve">, Turno, </w:t>
+      </w:r>
+      <w:proofErr w:type="spellStart"/>
+      <w:r>
+        <w:rPr>
+          <w:b/>
+          <w:lang w:val="es-ES"/>
+        </w:rPr>
+        <w:t>HoraEntrada</w:t>
+      </w:r>
+      <w:proofErr w:type="spellEnd"/>
+      <w:r>
+        <w:rPr>
+          <w:b/>
+          <w:lang w:val="es-ES"/>
+        </w:rPr>
+        <w:t xml:space="preserve">, </w:t>
+      </w:r>
+      <w:proofErr w:type="spellStart"/>
+      <w:r>
+        <w:rPr>
+          <w:b/>
+          <w:lang w:val="es-ES"/>
+        </w:rPr>
+        <w:t>HoraSalida</w:t>
+      </w:r>
+      <w:proofErr w:type="spellEnd"/>
+      <w:r>
+        <w:rPr>
+          <w:b/>
+          <w:lang w:val="es-ES"/>
+        </w:rPr>
+        <w:t xml:space="preserve"> .</w:t>
+      </w:r>
+    </w:p>
+    <w:p>
+      <w:pPr>
+        <w:tabs>
+          <w:tab w:val="left" w:pos="1792"/>
+        </w:tabs>
+        <w:rPr>
+          <w:lang w:val="es-ES"/>
+        </w:rPr>
+      </w:pPr>
+      <w:r>
+        <w:rPr>
+          <w:lang w:val="es-ES"/>
+        </w:rPr>
+        <w:t>Necesito</w:t>
+      </w:r>
+      <w:r>
+        <w:rPr>
+          <w:lang w:val="es-ES"/>
+        </w:rPr>
+        <w:t xml:space="preserve"> que me agregues al crud de Designaciones, el dato IGE y </w:t>
+      </w:r>
+      <w:proofErr w:type="spellStart"/>
+      <w:r>
+        <w:rPr>
+          <w:lang w:val="es-ES"/>
+        </w:rPr>
+        <w:t>CantModulos</w:t>
+      </w:r>
+      <w:proofErr w:type="spellEnd"/>
+      <w:r>
+        <w:rPr>
+          <w:lang w:val="es-ES"/>
+        </w:rPr>
+        <w:t xml:space="preserve">/Horas, y un selector de horario </w:t>
+      </w:r>
+      <w:proofErr w:type="spellStart"/>
+      <w:r>
+        <w:rPr>
+          <w:lang w:val="es-ES"/>
+        </w:rPr>
+        <w:t>univicado</w:t>
+      </w:r>
+      <w:proofErr w:type="spellEnd"/>
+      <w:r>
+        <w:rPr>
+          <w:lang w:val="es-ES"/>
+        </w:rPr>
+        <w:t xml:space="preserve">/dividido, si es unificado que permita cargar el intervalo horario y </w:t>
+      </w:r>
+      <w:r>
+        <w:rPr>
+          <w:lang w:val="es-ES"/>
+        </w:rPr>
+        <w:lastRenderedPageBreak/>
+        <w:t xml:space="preserve">el </w:t>
+      </w:r>
+      <w:proofErr w:type="spellStart"/>
+      <w:r>
+        <w:rPr>
+          <w:lang w:val="es-ES"/>
+        </w:rPr>
+        <w:t>dia</w:t>
+      </w:r>
+      <w:proofErr w:type="spellEnd"/>
+      <w:r>
+        <w:rPr>
+          <w:lang w:val="es-ES"/>
+        </w:rPr>
+        <w:t xml:space="preserve"> de la materia como ahora, y si es dividido, que te permita cargar, para cada </w:t>
+      </w:r>
+      <w:proofErr w:type="spellStart"/>
+      <w:r>
+        <w:rPr>
+          <w:lang w:val="es-ES"/>
+        </w:rPr>
+        <w:t>dia</w:t>
+      </w:r>
+      <w:proofErr w:type="spellEnd"/>
+      <w:r>
+        <w:rPr>
+          <w:lang w:val="es-ES"/>
+        </w:rPr>
+        <w:t xml:space="preserve">, el </w:t>
+      </w:r>
+      <w:proofErr w:type="spellStart"/>
+      <w:r>
+        <w:rPr>
+          <w:lang w:val="es-ES"/>
+        </w:rPr>
+        <w:t>dia</w:t>
+      </w:r>
+      <w:proofErr w:type="spellEnd"/>
+      <w:r>
+        <w:rPr>
+          <w:lang w:val="es-ES"/>
+        </w:rPr>
+        <w:t xml:space="preserve">, la cantidad de </w:t>
+      </w:r>
+      <w:proofErr w:type="spellStart"/>
+      <w:r>
+        <w:rPr>
+          <w:lang w:val="es-ES"/>
+        </w:rPr>
+        <w:t>modulos</w:t>
+      </w:r>
+      <w:proofErr w:type="spellEnd"/>
+      <w:r>
+        <w:rPr>
+          <w:lang w:val="es-ES"/>
+        </w:rPr>
+        <w:t>/</w:t>
+      </w:r>
+      <w:proofErr w:type="spellStart"/>
+      <w:r>
+        <w:rPr>
+          <w:lang w:val="es-ES"/>
+        </w:rPr>
+        <w:t>hs</w:t>
+      </w:r>
+      <w:proofErr w:type="spellEnd"/>
+      <w:r>
+        <w:rPr>
+          <w:lang w:val="es-ES"/>
+        </w:rPr>
+        <w:t xml:space="preserve"> del </w:t>
+      </w:r>
+      <w:proofErr w:type="spellStart"/>
+      <w:r>
+        <w:rPr>
+          <w:lang w:val="es-ES"/>
+        </w:rPr>
+        <w:t>dia</w:t>
+      </w:r>
+      <w:proofErr w:type="spellEnd"/>
+      <w:r>
+        <w:rPr>
+          <w:lang w:val="es-ES"/>
+        </w:rPr>
+        <w:t xml:space="preserve"> y el horario de entrada y el horario de salida de cada </w:t>
+      </w:r>
+      <w:proofErr w:type="spellStart"/>
+      <w:r>
+        <w:rPr>
+          <w:lang w:val="es-ES"/>
+        </w:rPr>
+        <w:t>dia</w:t>
+      </w:r>
+      <w:proofErr w:type="spellEnd"/>
+      <w:r>
+        <w:rPr>
+          <w:lang w:val="es-ES"/>
+        </w:rPr>
+        <w:t xml:space="preserve"> </w:t>
+      </w:r>
+    </w:p>
+    <w:p>
+      <w:pPr>
+        <w:tabs>
+          <w:tab w:val="left" w:pos="1792"/>
+        </w:tabs>
+      </w:pPr>
+      <w:proofErr w:type="gramStart"/>
+      <w:r>
+        <w:t>nec</w:t>
+      </w:r>
+      <w:r>
+        <w:t>e</w:t>
+      </w:r>
       <w:bookmarkStart w:id="0" w:name="_GoBack"/>
-      <w:r>
-        <w:rPr>
-          <w:lang w:val="es-ES"/>
-        </w:rPr>
-        <w:t>Necesito me generes en el menú a administración, en el apartado horarios una ítem que se llame Designaciones, en el debo acceder a un crud que me permita cargar las designaciones docentes, con los s</w:t>
-      </w:r>
-      <w:r>
-        <w:rPr>
-          <w:lang w:val="es-ES"/>
-        </w:rPr>
-        <w:t xml:space="preserve">iguientes datos, Distrito, </w:t>
-      </w:r>
-      <w:proofErr w:type="spellStart"/>
-      <w:r>
-        <w:rPr>
-          <w:lang w:val="es-ES"/>
-        </w:rPr>
-        <w:t>Tipo</w:t>
-      </w:r>
-      <w:r>
-        <w:rPr>
-          <w:lang w:val="es-ES"/>
-        </w:rPr>
-        <w:t>Establecimiento</w:t>
-      </w:r>
-      <w:proofErr w:type="spellEnd"/>
-      <w:r>
-        <w:rPr>
-          <w:lang w:val="es-ES"/>
-        </w:rPr>
-        <w:t xml:space="preserve">, </w:t>
-      </w:r>
-      <w:proofErr w:type="spellStart"/>
-      <w:r>
-        <w:rPr>
-          <w:lang w:val="es-ES"/>
-        </w:rPr>
-        <w:t>NumeroEscuela</w:t>
-      </w:r>
-      <w:proofErr w:type="spellEnd"/>
-      <w:r>
-        <w:rPr>
-          <w:lang w:val="es-ES"/>
-        </w:rPr>
-        <w:t>,</w:t>
-      </w:r>
-      <w:r>
-        <w:rPr>
-          <w:lang w:val="es-ES"/>
-        </w:rPr>
-        <w:t xml:space="preserve"> </w:t>
-      </w:r>
-      <w:proofErr w:type="spellStart"/>
-      <w:r>
-        <w:rPr>
-          <w:lang w:val="es-ES"/>
-        </w:rPr>
-        <w:t>NombreEstablecimiento</w:t>
-      </w:r>
-      <w:proofErr w:type="spellEnd"/>
-      <w:r>
-        <w:rPr>
-          <w:lang w:val="es-ES"/>
-        </w:rPr>
-        <w:t>,</w:t>
-      </w:r>
-      <w:r>
-        <w:rPr>
-          <w:lang w:val="es-ES"/>
-        </w:rPr>
-        <w:t xml:space="preserve"> Secuencia(opcional), desde un </w:t>
-      </w:r>
-      <w:proofErr w:type="spellStart"/>
-      <w:r>
-        <w:rPr>
-          <w:lang w:val="es-ES"/>
-        </w:rPr>
-        <w:t>select</w:t>
-      </w:r>
-      <w:proofErr w:type="spellEnd"/>
-      <w:r>
-        <w:rPr>
-          <w:lang w:val="es-ES"/>
-        </w:rPr>
-        <w:t xml:space="preserve">, si es oficial o </w:t>
-      </w:r>
-      <w:proofErr w:type="spellStart"/>
-      <w:r>
-        <w:rPr>
-          <w:lang w:val="es-ES"/>
-        </w:rPr>
-        <w:t>Di.Pre.Gep</w:t>
-      </w:r>
-      <w:proofErr w:type="spellEnd"/>
-      <w:r>
-        <w:rPr>
-          <w:lang w:val="es-ES"/>
-        </w:rPr>
-        <w:t xml:space="preserve">, el </w:t>
-      </w:r>
-      <w:proofErr w:type="spellStart"/>
-      <w:r>
-        <w:rPr>
-          <w:lang w:val="es-ES"/>
-        </w:rPr>
-        <w:t>RegimenEstatutario</w:t>
-      </w:r>
-      <w:proofErr w:type="spellEnd"/>
-      <w:r>
-        <w:rPr>
-          <w:lang w:val="es-ES"/>
-        </w:rPr>
-        <w:t xml:space="preserve">, </w:t>
-      </w:r>
-      <w:proofErr w:type="spellStart"/>
-      <w:r>
-        <w:rPr>
-          <w:lang w:val="es-ES"/>
-        </w:rPr>
-        <w:t>CaracterDeRevista</w:t>
-      </w:r>
-      <w:proofErr w:type="spellEnd"/>
-      <w:r>
-        <w:rPr>
-          <w:lang w:val="es-ES"/>
-        </w:rPr>
-        <w:t>,</w:t>
-      </w:r>
-      <w:r>
-        <w:rPr>
-          <w:lang w:val="es-ES"/>
-        </w:rPr>
-        <w:t xml:space="preserve"> </w:t>
-      </w:r>
-      <w:r>
-        <w:rPr>
-          <w:lang w:val="es-ES"/>
-        </w:rPr>
-        <w:t xml:space="preserve">de un </w:t>
-      </w:r>
-      <w:proofErr w:type="spellStart"/>
-      <w:r>
-        <w:rPr>
-          <w:lang w:val="es-ES"/>
-        </w:rPr>
-        <w:t>select</w:t>
-      </w:r>
-      <w:proofErr w:type="spellEnd"/>
-      <w:r>
-        <w:rPr>
-          <w:lang w:val="es-ES"/>
-        </w:rPr>
-        <w:t xml:space="preserve"> si son </w:t>
-      </w:r>
-      <w:proofErr w:type="spellStart"/>
-      <w:r>
-        <w:rPr>
-          <w:lang w:val="es-ES"/>
-        </w:rPr>
-        <w:t>Modulos</w:t>
-      </w:r>
-      <w:proofErr w:type="spellEnd"/>
-      <w:r>
-        <w:rPr>
-          <w:lang w:val="es-ES"/>
-        </w:rPr>
-        <w:t xml:space="preserve"> u Horas, el </w:t>
-      </w:r>
-      <w:proofErr w:type="spellStart"/>
-      <w:r>
-        <w:rPr>
-          <w:lang w:val="es-ES"/>
-        </w:rPr>
-        <w:t>Cupof</w:t>
-      </w:r>
-      <w:proofErr w:type="spellEnd"/>
-      <w:r>
-        <w:rPr>
-          <w:lang w:val="es-ES"/>
-        </w:rPr>
-        <w:t xml:space="preserve">, Dependencia, </w:t>
-      </w:r>
-      <w:proofErr w:type="spellStart"/>
-      <w:r>
-        <w:rPr>
-          <w:lang w:val="es-ES"/>
-        </w:rPr>
-        <w:t>Turno</w:t>
-      </w:r>
-      <w:r>
-        <w:rPr>
-          <w:lang w:val="es-ES"/>
-        </w:rPr>
-        <w:t>Desempeño</w:t>
-      </w:r>
-      <w:proofErr w:type="spellEnd"/>
-      <w:r>
-        <w:rPr>
-          <w:lang w:val="es-ES"/>
-        </w:rPr>
-        <w:t xml:space="preserve">, </w:t>
-      </w:r>
-      <w:proofErr w:type="spellStart"/>
-      <w:r>
-        <w:rPr>
-          <w:lang w:val="es-ES"/>
-        </w:rPr>
-        <w:t>FechaDesde</w:t>
-      </w:r>
-      <w:proofErr w:type="spellEnd"/>
-      <w:r>
-        <w:rPr>
-          <w:lang w:val="es-ES"/>
-        </w:rPr>
-        <w:t xml:space="preserve">, </w:t>
-      </w:r>
-      <w:proofErr w:type="spellStart"/>
-      <w:r>
-        <w:rPr>
-          <w:lang w:val="es-ES"/>
-        </w:rPr>
-        <w:t>FechaHasta</w:t>
-      </w:r>
-      <w:proofErr w:type="spellEnd"/>
-      <w:r>
-        <w:rPr>
-          <w:lang w:val="es-ES"/>
-        </w:rPr>
-        <w:t xml:space="preserve">, </w:t>
-      </w:r>
-      <w:proofErr w:type="spellStart"/>
-      <w:r>
-        <w:rPr>
-          <w:lang w:val="es-ES"/>
-        </w:rPr>
-        <w:t>AñoDesignado</w:t>
-      </w:r>
-      <w:proofErr w:type="spellEnd"/>
-      <w:r>
-        <w:rPr>
-          <w:lang w:val="es-ES"/>
-        </w:rPr>
-        <w:t xml:space="preserve">, </w:t>
-      </w:r>
-      <w:proofErr w:type="spellStart"/>
-      <w:r>
-        <w:rPr>
-          <w:lang w:val="es-ES"/>
-        </w:rPr>
-        <w:t>DivisionDesignada</w:t>
-      </w:r>
-      <w:proofErr w:type="spellEnd"/>
-      <w:r>
-        <w:rPr>
-          <w:lang w:val="es-ES"/>
-        </w:rPr>
-        <w:t xml:space="preserve">, </w:t>
-      </w:r>
-      <w:proofErr w:type="spellStart"/>
-      <w:r>
-        <w:rPr>
-          <w:lang w:val="es-ES"/>
-        </w:rPr>
-        <w:t>FechaDesignacion</w:t>
-      </w:r>
-      <w:proofErr w:type="spellEnd"/>
-      <w:r>
-        <w:rPr>
-          <w:lang w:val="es-ES"/>
-        </w:rPr>
-        <w:t xml:space="preserve">, </w:t>
-      </w:r>
-      <w:r>
-        <w:rPr>
-          <w:lang w:val="es-ES"/>
-        </w:rPr>
-        <w:t xml:space="preserve">la </w:t>
-      </w:r>
-      <w:proofErr w:type="spellStart"/>
-      <w:r>
-        <w:rPr>
-          <w:lang w:val="es-ES"/>
-        </w:rPr>
-        <w:t>FechaTomaPosecion</w:t>
-      </w:r>
-      <w:proofErr w:type="spellEnd"/>
-      <w:r>
-        <w:rPr>
-          <w:lang w:val="es-ES"/>
-        </w:rPr>
-        <w:t>,</w:t>
-      </w:r>
-      <w:r>
-        <w:rPr>
-          <w:lang w:val="es-ES"/>
-        </w:rPr>
-        <w:t xml:space="preserve"> </w:t>
-      </w:r>
-      <w:proofErr w:type="spellStart"/>
-      <w:r>
-        <w:rPr>
-          <w:lang w:val="es-ES"/>
-        </w:rPr>
-        <w:t>NombreMateria</w:t>
-      </w:r>
-      <w:proofErr w:type="spellEnd"/>
-      <w:r>
-        <w:rPr>
-          <w:lang w:val="es-ES"/>
-        </w:rPr>
-        <w:t xml:space="preserve">, </w:t>
-      </w:r>
-      <w:proofErr w:type="spellStart"/>
-      <w:r>
-        <w:rPr>
-          <w:lang w:val="es-ES"/>
-        </w:rPr>
-        <w:t>HoraEntrada</w:t>
-      </w:r>
-      <w:proofErr w:type="spellEnd"/>
-      <w:r>
-        <w:rPr>
-          <w:lang w:val="es-ES"/>
-        </w:rPr>
-        <w:t xml:space="preserve">, </w:t>
-      </w:r>
-      <w:proofErr w:type="spellStart"/>
-      <w:r>
-        <w:rPr>
-          <w:lang w:val="es-ES"/>
-        </w:rPr>
-        <w:t>HoraSalida</w:t>
-      </w:r>
-      <w:proofErr w:type="spellEnd"/>
-      <w:r>
-        <w:rPr>
-          <w:lang w:val="es-ES"/>
-        </w:rPr>
-        <w:t xml:space="preserve">, </w:t>
-      </w:r>
-      <w:proofErr w:type="spellStart"/>
-      <w:r>
-        <w:rPr>
-          <w:lang w:val="es-ES"/>
-        </w:rPr>
-        <w:t>DiaDeLaSemana</w:t>
-      </w:r>
-      <w:proofErr w:type="spellEnd"/>
-      <w:r>
-        <w:rPr>
-          <w:lang w:val="es-ES"/>
-        </w:rPr>
-        <w:t>.</w:t>
-      </w:r>
-      <w:r>
-        <w:rPr>
-          <w:lang w:val="es-ES"/>
-        </w:rPr>
-        <w:t xml:space="preserve"> </w:t>
-      </w:r>
-      <w:r>
-        <w:rPr>
-          <w:lang w:val="es-ES"/>
-        </w:rPr>
-        <w:t xml:space="preserve">Una vez terminado eso, necesito que me modifiques la carga de </w:t>
-      </w:r>
-      <w:r>
-        <w:rPr>
-          <w:lang w:val="es-ES"/>
-        </w:rPr>
-        <w:t xml:space="preserve">nuevo horario, que al apretar el botón de Agregar Horario, que los datos los tome , se relacione, con la tabla Designaciones, usando, Establecimiento, Año, </w:t>
-      </w:r>
-      <w:proofErr w:type="spellStart"/>
-      <w:r>
-        <w:rPr>
-          <w:lang w:val="es-ES"/>
-        </w:rPr>
-        <w:t>Division</w:t>
-      </w:r>
-      <w:proofErr w:type="spellEnd"/>
-      <w:r>
-        <w:rPr>
-          <w:lang w:val="es-ES"/>
-        </w:rPr>
-        <w:t xml:space="preserve">, </w:t>
-      </w:r>
-      <w:proofErr w:type="spellStart"/>
-      <w:r>
-        <w:rPr>
-          <w:lang w:val="es-ES"/>
-        </w:rPr>
-        <w:t>NombreMateria</w:t>
-      </w:r>
-      <w:proofErr w:type="spellEnd"/>
-      <w:r>
-        <w:rPr>
-          <w:lang w:val="es-ES"/>
-        </w:rPr>
-        <w:t xml:space="preserve">, </w:t>
-      </w:r>
-      <w:proofErr w:type="spellStart"/>
-      <w:r>
-        <w:rPr>
-          <w:lang w:val="es-ES"/>
-        </w:rPr>
-        <w:t>DiaSemana</w:t>
-      </w:r>
-      <w:proofErr w:type="spellEnd"/>
-      <w:r>
-        <w:rPr>
-          <w:lang w:val="es-ES"/>
-        </w:rPr>
-        <w:t xml:space="preserve">, Turno, </w:t>
-      </w:r>
-      <w:proofErr w:type="spellStart"/>
-      <w:r>
-        <w:rPr>
-          <w:lang w:val="es-ES"/>
-        </w:rPr>
-        <w:t>HoraEntrada</w:t>
-      </w:r>
-      <w:proofErr w:type="spellEnd"/>
-      <w:r>
-        <w:rPr>
-          <w:lang w:val="es-ES"/>
-        </w:rPr>
-        <w:t xml:space="preserve">, </w:t>
-      </w:r>
-      <w:proofErr w:type="spellStart"/>
-      <w:r>
-        <w:rPr>
-          <w:lang w:val="es-ES"/>
-        </w:rPr>
-        <w:t>HoraSalida</w:t>
-      </w:r>
-      <w:proofErr w:type="spellEnd"/>
-      <w:r>
-        <w:rPr>
-          <w:lang w:val="es-ES"/>
-        </w:rPr>
-        <w:t xml:space="preserve"> .</w:t>
-      </w:r>
-    </w:p>
-    <w:bookmarkEnd w:id="0"/>
+      <w:bookmarkEnd w:id="0"/>
+      <w:r>
+        <w:t>sito</w:t>
+      </w:r>
+      <w:proofErr w:type="gramEnd"/>
+      <w:r>
+        <w:t xml:space="preserve"> que a la vista designaciones le agregues el </w:t>
+      </w:r>
+      <w:proofErr w:type="spellStart"/>
+      <w:r>
+        <w:t>numero</w:t>
+      </w:r>
+      <w:proofErr w:type="spellEnd"/>
+      <w:r>
+        <w:t xml:space="preserve"> de secuencia entre el IGE y la materia</w:t>
+      </w:r>
+    </w:p>
+    <w:p>
+      <w:pPr>
+        <w:tabs>
+          <w:tab w:val="left" w:pos="1792"/>
+        </w:tabs>
+        <w:rPr>
+          <w:lang w:val="es-ES"/>
+        </w:rPr>
+      </w:pPr>
+      <w:r>
+        <w:t xml:space="preserve">Necesito que los valores de la secuencia, el año y </w:t>
+      </w:r>
+      <w:proofErr w:type="spellStart"/>
+      <w:r>
+        <w:t>division</w:t>
+      </w:r>
+      <w:proofErr w:type="spellEnd"/>
+      <w:r>
+        <w:t xml:space="preserve">, la </w:t>
+      </w:r>
+      <w:proofErr w:type="spellStart"/>
+      <w:r>
+        <w:t>cant</w:t>
+      </w:r>
+      <w:proofErr w:type="spellEnd"/>
+      <w:r>
+        <w:t xml:space="preserve"> de </w:t>
+      </w:r>
+      <w:proofErr w:type="spellStart"/>
+      <w:r>
+        <w:t>modulos</w:t>
+      </w:r>
+      <w:proofErr w:type="spellEnd"/>
+      <w:r>
+        <w:t>/</w:t>
+      </w:r>
+      <w:proofErr w:type="spellStart"/>
+      <w:r>
+        <w:t>hs</w:t>
+      </w:r>
+      <w:proofErr w:type="spellEnd"/>
+      <w:r>
+        <w:t xml:space="preserve">, el turno, centrados en su correspondiente columna y que los </w:t>
+      </w:r>
+      <w:proofErr w:type="spellStart"/>
+      <w:r>
+        <w:t>votones</w:t>
+      </w:r>
+      <w:proofErr w:type="spellEnd"/>
+      <w:r>
+        <w:t xml:space="preserve"> de editar y eliminar se muestren rellenos y con el icono en </w:t>
+      </w:r>
+      <w:proofErr w:type="spellStart"/>
+      <w:r>
+        <w:t>linea</w:t>
+      </w:r>
+      <w:proofErr w:type="spellEnd"/>
+      <w:r>
+        <w:t xml:space="preserve"> blanca, en una misma </w:t>
+      </w:r>
+      <w:proofErr w:type="spellStart"/>
+      <w:r>
+        <w:t>linea</w:t>
+      </w:r>
+      <w:proofErr w:type="spellEnd"/>
+      <w:r>
+        <w:t xml:space="preserve"> y no </w:t>
+      </w:r>
+      <w:proofErr w:type="spellStart"/>
+      <w:r>
+        <w:t>ensimados</w:t>
+      </w:r>
+      <w:proofErr w:type="spellEnd"/>
+    </w:p>
     <w:p>
       <w:pPr>
         <w:rPr>
@@ -13159,7 +13469,6 @@
   <w:style w:type="character" w:default="1" w:styleId="Fuentedeprrafopredeter">
     <w:name w:val="Default Paragraph Font"/>
     <w:uiPriority w:val="1"/>
-    <w:semiHidden/>
     <w:unhideWhenUsed/>
   </w:style>
   <w:style w:type="table" w:default="1" w:styleId="Tablanormal">
@@ -13371,7 +13680,6 @@
   <w:style w:type="character" w:default="1" w:styleId="Fuentedeprrafopredeter">
     <w:name w:val="Default Paragraph Font"/>
     <w:uiPriority w:val="1"/>
-    <w:semiHidden/>
     <w:unhideWhenUsed/>
   </w:style>
   <w:style w:type="table" w:default="1" w:styleId="Tablanormal">
@@ -13710,7 +14018,7 @@
 </file>
 
 <file path=customXml/itemProps1.xml><?xml version="1.0" encoding="utf-8"?>
-<ds:datastoreItem xmlns:ds="http://schemas.openxmlformats.org/officeDocument/2006/customXml" ds:itemID="{9A4FABD3-63F0-4B77-9C99-487C313E92B0}">
+<ds:datastoreItem xmlns:ds="http://schemas.openxmlformats.org/officeDocument/2006/customXml" ds:itemID="{0E6E61C3-676A-4804-8083-998BFF33C46C}">
   <ds:schemaRefs>
     <ds:schemaRef ds:uri="http://schemas.openxmlformats.org/officeDocument/2006/bibliography"/>
   </ds:schemaRefs>

</xml_diff>

<commit_message>
se modifican errores de carga de materia, y se corrige error 50 en carga de nuevo horario
</commit_message>
<xml_diff>
--- a/requerimientos.docx
+++ b/requerimientos.docx
@@ -9856,24 +9856,21 @@
           <w:tab w:val="left" w:pos="1792"/>
         </w:tabs>
         <w:rPr>
-          <w:lang w:val="es-ES"/>
-        </w:rPr>
-      </w:pPr>
-      <w:r>
-        <w:rPr>
-          <w:lang w:val="es-ES"/>
-        </w:rPr>
-        <w:t>Necesito</w:t>
-      </w:r>
-      <w:r>
-        <w:rPr>
-          <w:lang w:val="es-ES"/>
-        </w:rPr>
-        <w:t xml:space="preserve"> que me agregues al crud de Designaciones, el dato IGE y </w:t>
-      </w:r>
-      <w:proofErr w:type="spellStart"/>
-      <w:r>
-        <w:rPr>
+          <w:b/>
+          <w:lang w:val="es-ES"/>
+        </w:rPr>
+      </w:pPr>
+      <w:r>
+        <w:rPr>
+          <w:b/>
+          <w:lang w:val="es-ES"/>
+        </w:rPr>
+        <w:t xml:space="preserve">Necesito que me agregues al crud de Designaciones, el dato IGE y </w:t>
+      </w:r>
+      <w:proofErr w:type="spellStart"/>
+      <w:r>
+        <w:rPr>
+          <w:b/>
           <w:lang w:val="es-ES"/>
         </w:rPr>
         <w:t>CantModulos</w:t>
@@ -9881,6 +9878,7 @@
       <w:proofErr w:type="spellEnd"/>
       <w:r>
         <w:rPr>
+          <w:b/>
           <w:lang w:val="es-ES"/>
         </w:rPr>
         <w:t xml:space="preserve">/Horas, y un selector de horario </w:t>
@@ -9888,6 +9886,7 @@
       <w:proofErr w:type="spellStart"/>
       <w:r>
         <w:rPr>
+          <w:b/>
           <w:lang w:val="es-ES"/>
         </w:rPr>
         <w:t>univicado</w:t>
@@ -9895,20 +9894,23 @@
       <w:proofErr w:type="spellEnd"/>
       <w:r>
         <w:rPr>
-          <w:lang w:val="es-ES"/>
-        </w:rPr>
-        <w:t xml:space="preserve">/dividido, si es unificado que permita cargar el intervalo horario y </w:t>
-      </w:r>
-      <w:r>
-        <w:rPr>
+          <w:b/>
+          <w:lang w:val="es-ES"/>
+        </w:rPr>
+        <w:t xml:space="preserve">/dividido, si es unificado que permita cargar el intervalo horario </w:t>
+      </w:r>
+      <w:r>
+        <w:rPr>
+          <w:b/>
           <w:lang w:val="es-ES"/>
         </w:rPr>
         <w:lastRenderedPageBreak/>
-        <w:t xml:space="preserve">el </w:t>
-      </w:r>
-      <w:proofErr w:type="spellStart"/>
-      <w:r>
-        <w:rPr>
+        <w:t xml:space="preserve">y el </w:t>
+      </w:r>
+      <w:proofErr w:type="spellStart"/>
+      <w:r>
+        <w:rPr>
+          <w:b/>
           <w:lang w:val="es-ES"/>
         </w:rPr>
         <w:t>dia</w:t>
@@ -9916,6 +9918,7 @@
       <w:proofErr w:type="spellEnd"/>
       <w:r>
         <w:rPr>
+          <w:b/>
           <w:lang w:val="es-ES"/>
         </w:rPr>
         <w:t xml:space="preserve"> de la materia como ahora, y si es dividido, que te permita cargar, para cada </w:t>
@@ -9923,6 +9926,7 @@
       <w:proofErr w:type="spellStart"/>
       <w:r>
         <w:rPr>
+          <w:b/>
           <w:lang w:val="es-ES"/>
         </w:rPr>
         <w:t>dia</w:t>
@@ -9930,6 +9934,7 @@
       <w:proofErr w:type="spellEnd"/>
       <w:r>
         <w:rPr>
+          <w:b/>
           <w:lang w:val="es-ES"/>
         </w:rPr>
         <w:t xml:space="preserve">, el </w:t>
@@ -9937,6 +9942,7 @@
       <w:proofErr w:type="spellStart"/>
       <w:r>
         <w:rPr>
+          <w:b/>
           <w:lang w:val="es-ES"/>
         </w:rPr>
         <w:t>dia</w:t>
@@ -9944,6 +9950,7 @@
       <w:proofErr w:type="spellEnd"/>
       <w:r>
         <w:rPr>
+          <w:b/>
           <w:lang w:val="es-ES"/>
         </w:rPr>
         <w:t xml:space="preserve">, la cantidad de </w:t>
@@ -9951,6 +9958,7 @@
       <w:proofErr w:type="spellStart"/>
       <w:r>
         <w:rPr>
+          <w:b/>
           <w:lang w:val="es-ES"/>
         </w:rPr>
         <w:t>modulos</w:t>
@@ -9958,6 +9966,7 @@
       <w:proofErr w:type="spellEnd"/>
       <w:r>
         <w:rPr>
+          <w:b/>
           <w:lang w:val="es-ES"/>
         </w:rPr>
         <w:t>/</w:t>
@@ -9965,6 +9974,7 @@
       <w:proofErr w:type="spellStart"/>
       <w:r>
         <w:rPr>
+          <w:b/>
           <w:lang w:val="es-ES"/>
         </w:rPr>
         <w:t>hs</w:t>
@@ -9972,6 +9982,7 @@
       <w:proofErr w:type="spellEnd"/>
       <w:r>
         <w:rPr>
+          <w:b/>
           <w:lang w:val="es-ES"/>
         </w:rPr>
         <w:t xml:space="preserve"> del </w:t>
@@ -9979,6 +9990,7 @@
       <w:proofErr w:type="spellStart"/>
       <w:r>
         <w:rPr>
+          <w:b/>
           <w:lang w:val="es-ES"/>
         </w:rPr>
         <w:t>dia</w:t>
@@ -9986,6 +9998,7 @@
       <w:proofErr w:type="spellEnd"/>
       <w:r>
         <w:rPr>
+          <w:b/>
           <w:lang w:val="es-ES"/>
         </w:rPr>
         <w:t xml:space="preserve"> y el horario de entrada y el horario de salida de cada </w:t>
@@ -9993,6 +10006,7 @@
       <w:proofErr w:type="spellStart"/>
       <w:r>
         <w:rPr>
+          <w:b/>
           <w:lang w:val="es-ES"/>
         </w:rPr>
         <w:t>dia</w:t>
@@ -10000,6 +10014,7 @@
       <w:proofErr w:type="spellEnd"/>
       <w:r>
         <w:rPr>
+          <w:b/>
           <w:lang w:val="es-ES"/>
         </w:rPr>
         <w:t xml:space="preserve"> </w:t>
@@ -10013,103 +10028,246 @@
       </w:pPr>
       <w:proofErr w:type="gramStart"/>
       <w:r>
-        <w:t>nec</w:t>
-      </w:r>
-      <w:r>
-        <w:t>e</w:t>
-      </w:r>
+        <w:rPr>
+          <w:b/>
+        </w:rPr>
+        <w:t>necesito</w:t>
+      </w:r>
+      <w:proofErr w:type="gramEnd"/>
+      <w:r>
+        <w:rPr>
+          <w:b/>
+        </w:rPr>
+        <w:t xml:space="preserve"> que a la vista designaciones le agregues el </w:t>
+      </w:r>
+      <w:proofErr w:type="spellStart"/>
+      <w:r>
+        <w:rPr>
+          <w:b/>
+        </w:rPr>
+        <w:t>numero</w:t>
+      </w:r>
+      <w:proofErr w:type="spellEnd"/>
+      <w:r>
+        <w:rPr>
+          <w:b/>
+        </w:rPr>
+        <w:t xml:space="preserve"> de secuencia entre el IGE y la materia</w:t>
+      </w:r>
+    </w:p>
+    <w:p>
+      <w:pPr>
+        <w:tabs>
+          <w:tab w:val="left" w:pos="1792"/>
+        </w:tabs>
+        <w:rPr>
+          <w:b/>
+        </w:rPr>
+      </w:pPr>
+      <w:r>
+        <w:rPr>
+          <w:b/>
+        </w:rPr>
+        <w:t xml:space="preserve">Necesito que los valores de la secuencia, el año y </w:t>
+      </w:r>
+      <w:proofErr w:type="spellStart"/>
+      <w:r>
+        <w:rPr>
+          <w:b/>
+        </w:rPr>
+        <w:t>division</w:t>
+      </w:r>
+      <w:proofErr w:type="spellEnd"/>
+      <w:r>
+        <w:rPr>
+          <w:b/>
+        </w:rPr>
+        <w:t xml:space="preserve">, la </w:t>
+      </w:r>
+      <w:proofErr w:type="spellStart"/>
+      <w:r>
+        <w:rPr>
+          <w:b/>
+        </w:rPr>
+        <w:t>cant</w:t>
+      </w:r>
+      <w:proofErr w:type="spellEnd"/>
+      <w:r>
+        <w:rPr>
+          <w:b/>
+        </w:rPr>
+        <w:t xml:space="preserve"> de </w:t>
+      </w:r>
+      <w:proofErr w:type="spellStart"/>
+      <w:r>
+        <w:rPr>
+          <w:b/>
+        </w:rPr>
+        <w:t>modulos</w:t>
+      </w:r>
+      <w:proofErr w:type="spellEnd"/>
+      <w:r>
+        <w:rPr>
+          <w:b/>
+        </w:rPr>
+        <w:t>/</w:t>
+      </w:r>
+      <w:proofErr w:type="spellStart"/>
+      <w:r>
+        <w:rPr>
+          <w:b/>
+        </w:rPr>
+        <w:t>hs</w:t>
+      </w:r>
+      <w:proofErr w:type="spellEnd"/>
+      <w:r>
+        <w:rPr>
+          <w:b/>
+        </w:rPr>
+        <w:t xml:space="preserve">, el turno, centrados en su correspondiente columna y que los </w:t>
+      </w:r>
+      <w:proofErr w:type="spellStart"/>
+      <w:r>
+        <w:rPr>
+          <w:b/>
+        </w:rPr>
+        <w:t>votones</w:t>
+      </w:r>
+      <w:proofErr w:type="spellEnd"/>
+      <w:r>
+        <w:rPr>
+          <w:b/>
+        </w:rPr>
+        <w:t xml:space="preserve"> de editar y eliminar se muestren rellenos y con el icono en </w:t>
+      </w:r>
+      <w:proofErr w:type="spellStart"/>
+      <w:r>
+        <w:rPr>
+          <w:b/>
+        </w:rPr>
+        <w:t>linea</w:t>
+      </w:r>
+      <w:proofErr w:type="spellEnd"/>
+      <w:r>
+        <w:rPr>
+          <w:b/>
+        </w:rPr>
+        <w:t xml:space="preserve"> blanca, en una misma </w:t>
+      </w:r>
+      <w:proofErr w:type="spellStart"/>
+      <w:r>
+        <w:rPr>
+          <w:b/>
+        </w:rPr>
+        <w:t>linea</w:t>
+      </w:r>
+      <w:proofErr w:type="spellEnd"/>
+      <w:r>
+        <w:rPr>
+          <w:b/>
+        </w:rPr>
+        <w:t xml:space="preserve"> y no </w:t>
+      </w:r>
+      <w:proofErr w:type="spellStart"/>
+      <w:r>
+        <w:rPr>
+          <w:b/>
+        </w:rPr>
+        <w:t>ensimados</w:t>
+      </w:r>
+      <w:proofErr w:type="spellEnd"/>
+    </w:p>
+    <w:p>
+      <w:pPr>
+        <w:tabs>
+          <w:tab w:val="left" w:pos="1792"/>
+        </w:tabs>
+        <w:rPr>
+          <w:b/>
+          <w:lang w:val="es-ES"/>
+        </w:rPr>
+      </w:pPr>
       <w:bookmarkStart w:id="0" w:name="_GoBack"/>
-      <w:bookmarkEnd w:id="0"/>
-      <w:r>
-        <w:t>sito</w:t>
+      <w:proofErr w:type="gramStart"/>
+      <w:r>
+        <w:rPr>
+          <w:b/>
+        </w:rPr>
+        <w:t>necesito</w:t>
       </w:r>
       <w:proofErr w:type="gramEnd"/>
       <w:r>
-        <w:t xml:space="preserve"> que a la vista designaciones le agregues el </w:t>
-      </w:r>
-      <w:proofErr w:type="spellStart"/>
-      <w:r>
-        <w:t>numero</w:t>
-      </w:r>
-      <w:proofErr w:type="spellEnd"/>
-      <w:r>
-        <w:t xml:space="preserve"> de secuencia entre el IGE y la materia</w:t>
-      </w:r>
-    </w:p>
-    <w:p>
-      <w:pPr>
-        <w:tabs>
-          <w:tab w:val="left" w:pos="1792"/>
-        </w:tabs>
-        <w:rPr>
-          <w:lang w:val="es-ES"/>
-        </w:rPr>
-      </w:pPr>
-      <w:r>
-        <w:t xml:space="preserve">Necesito que los valores de la secuencia, el año y </w:t>
-      </w:r>
-      <w:proofErr w:type="spellStart"/>
-      <w:r>
-        <w:t>division</w:t>
-      </w:r>
-      <w:proofErr w:type="spellEnd"/>
-      <w:r>
-        <w:t xml:space="preserve">, la </w:t>
-      </w:r>
-      <w:proofErr w:type="spellStart"/>
-      <w:r>
-        <w:t>cant</w:t>
-      </w:r>
-      <w:proofErr w:type="spellEnd"/>
-      <w:r>
-        <w:t xml:space="preserve"> de </w:t>
-      </w:r>
-      <w:proofErr w:type="spellStart"/>
-      <w:r>
-        <w:t>modulos</w:t>
-      </w:r>
-      <w:proofErr w:type="spellEnd"/>
-      <w:r>
-        <w:t>/</w:t>
-      </w:r>
-      <w:proofErr w:type="spellStart"/>
-      <w:r>
-        <w:t>hs</w:t>
-      </w:r>
-      <w:proofErr w:type="spellEnd"/>
-      <w:r>
-        <w:t xml:space="preserve">, el turno, centrados en su correspondiente columna y que los </w:t>
-      </w:r>
-      <w:proofErr w:type="spellStart"/>
-      <w:r>
-        <w:t>votones</w:t>
-      </w:r>
-      <w:proofErr w:type="spellEnd"/>
-      <w:r>
-        <w:t xml:space="preserve"> de editar y eliminar se muestren rellenos y con el icono en </w:t>
-      </w:r>
-      <w:proofErr w:type="spellStart"/>
-      <w:r>
-        <w:t>linea</w:t>
-      </w:r>
-      <w:proofErr w:type="spellEnd"/>
-      <w:r>
-        <w:t xml:space="preserve"> blanca, en una misma </w:t>
-      </w:r>
-      <w:proofErr w:type="spellStart"/>
-      <w:r>
-        <w:t>linea</w:t>
-      </w:r>
-      <w:proofErr w:type="spellEnd"/>
-      <w:r>
-        <w:t xml:space="preserve"> y no </w:t>
-      </w:r>
-      <w:proofErr w:type="spellStart"/>
-      <w:r>
-        <w:t>ensimados</w:t>
-      </w:r>
-      <w:proofErr w:type="spellEnd"/>
-    </w:p>
+        <w:rPr>
+          <w:b/>
+        </w:rPr>
+        <w:t xml:space="preserve"> que </w:t>
+      </w:r>
+      <w:proofErr w:type="spellStart"/>
+      <w:r>
+        <w:rPr>
+          <w:b/>
+        </w:rPr>
+        <w:t>aca</w:t>
+      </w:r>
+      <w:proofErr w:type="spellEnd"/>
+      <w:r>
+        <w:rPr>
+          <w:b/>
+        </w:rPr>
+        <w:t xml:space="preserve"> </w:t>
+      </w:r>
+      <w:proofErr w:type="spellStart"/>
+      <w:r>
+        <w:rPr>
+          <w:b/>
+        </w:rPr>
+        <w:t>tambien</w:t>
+      </w:r>
+      <w:proofErr w:type="spellEnd"/>
+      <w:r>
+        <w:rPr>
+          <w:b/>
+        </w:rPr>
+        <w:t xml:space="preserve"> me ponga al final del </w:t>
+      </w:r>
+      <w:proofErr w:type="spellStart"/>
+      <w:r>
+        <w:rPr>
+          <w:b/>
+        </w:rPr>
+        <w:t>item</w:t>
+      </w:r>
+      <w:proofErr w:type="spellEnd"/>
+      <w:r>
+        <w:rPr>
+          <w:b/>
+        </w:rPr>
+        <w:t xml:space="preserve"> del </w:t>
+      </w:r>
+      <w:proofErr w:type="spellStart"/>
+      <w:r>
+        <w:rPr>
+          <w:b/>
+        </w:rPr>
+        <w:t>select</w:t>
+      </w:r>
+      <w:proofErr w:type="spellEnd"/>
+      <w:r>
+        <w:rPr>
+          <w:b/>
+        </w:rPr>
+        <w:t xml:space="preserve"> ,el curso al cual corresponde la </w:t>
+      </w:r>
+      <w:proofErr w:type="spellStart"/>
+      <w:r>
+        <w:rPr>
+          <w:b/>
+        </w:rPr>
+        <w:t>designacion</w:t>
+      </w:r>
+      <w:proofErr w:type="spellEnd"/>
+    </w:p>
+    <w:bookmarkEnd w:id="0"/>
     <w:p>
       <w:pPr>
         <w:rPr>
@@ -14018,7 +14176,7 @@
 </file>
 
 <file path=customXml/itemProps1.xml><?xml version="1.0" encoding="utf-8"?>
-<ds:datastoreItem xmlns:ds="http://schemas.openxmlformats.org/officeDocument/2006/customXml" ds:itemID="{0E6E61C3-676A-4804-8083-998BFF33C46C}">
+<ds:datastoreItem xmlns:ds="http://schemas.openxmlformats.org/officeDocument/2006/customXml" ds:itemID="{C1BC03D1-DEDE-47F3-9925-0811CB065791}">
   <ds:schemaRefs>
     <ds:schemaRef ds:uri="http://schemas.openxmlformats.org/officeDocument/2006/bibliography"/>
   </ds:schemaRefs>

</xml_diff>

<commit_message>
Se actualiza funcionalidad de creacion de contenidos
</commit_message>
<xml_diff>
--- a/requerimientos.docx
+++ b/requerimientos.docx
@@ -10184,90 +10184,285 @@
         </w:tabs>
         <w:rPr>
           <w:b/>
-          <w:lang w:val="es-ES"/>
+        </w:rPr>
+      </w:pPr>
+      <w:proofErr w:type="gramStart"/>
+      <w:r>
+        <w:rPr>
+          <w:b/>
+        </w:rPr>
+        <w:t>necesito</w:t>
+      </w:r>
+      <w:proofErr w:type="gramEnd"/>
+      <w:r>
+        <w:rPr>
+          <w:b/>
+        </w:rPr>
+        <w:t xml:space="preserve"> que </w:t>
+      </w:r>
+      <w:proofErr w:type="spellStart"/>
+      <w:r>
+        <w:rPr>
+          <w:b/>
+        </w:rPr>
+        <w:t>aca</w:t>
+      </w:r>
+      <w:proofErr w:type="spellEnd"/>
+      <w:r>
+        <w:rPr>
+          <w:b/>
+        </w:rPr>
+        <w:t xml:space="preserve"> </w:t>
+      </w:r>
+      <w:proofErr w:type="spellStart"/>
+      <w:r>
+        <w:rPr>
+          <w:b/>
+        </w:rPr>
+        <w:t>tambien</w:t>
+      </w:r>
+      <w:proofErr w:type="spellEnd"/>
+      <w:r>
+        <w:rPr>
+          <w:b/>
+        </w:rPr>
+        <w:t xml:space="preserve"> me ponga al final del </w:t>
+      </w:r>
+      <w:proofErr w:type="spellStart"/>
+      <w:r>
+        <w:rPr>
+          <w:b/>
+        </w:rPr>
+        <w:t>item</w:t>
+      </w:r>
+      <w:proofErr w:type="spellEnd"/>
+      <w:r>
+        <w:rPr>
+          <w:b/>
+        </w:rPr>
+        <w:t xml:space="preserve"> del </w:t>
+      </w:r>
+      <w:proofErr w:type="spellStart"/>
+      <w:r>
+        <w:rPr>
+          <w:b/>
+        </w:rPr>
+        <w:t>select</w:t>
+      </w:r>
+      <w:proofErr w:type="spellEnd"/>
+      <w:r>
+        <w:rPr>
+          <w:b/>
+        </w:rPr>
+        <w:t xml:space="preserve"> ,el curso al cual corresponde la </w:t>
+      </w:r>
+      <w:r>
+        <w:rPr>
+          <w:b/>
+        </w:rPr>
+        <w:t>designación.</w:t>
+      </w:r>
+    </w:p>
+    <w:p>
+      <w:pPr>
+        <w:tabs>
+          <w:tab w:val="left" w:pos="1792"/>
+        </w:tabs>
+        <w:rPr>
+          <w:b/>
         </w:rPr>
       </w:pPr>
       <w:bookmarkStart w:id="0" w:name="_GoBack"/>
+      <w:r>
+        <w:rPr>
+          <w:b/>
+        </w:rPr>
+        <w:t>Necesito que me agregues la posibilidad de editar las declaraciones juradas que no hayan sido presentadas, es decir en estado borrador, y que luego de presentarlas que se mantenga la imposibilidad de modificarlas y se deba generar una nueva como hasta ahora</w:t>
+      </w:r>
+      <w:r>
+        <w:rPr>
+          <w:b/>
+        </w:rPr>
+        <w:t>.</w:t>
+      </w:r>
+    </w:p>
+    <w:p>
+      <w:pPr>
+        <w:tabs>
+          <w:tab w:val="left" w:pos="1792"/>
+        </w:tabs>
+        <w:rPr>
+          <w:b/>
+        </w:rPr>
+      </w:pPr>
+      <w:r>
+        <w:rPr>
+          <w:b/>
+        </w:rPr>
+        <w:t xml:space="preserve">Necesito que me modifiques el alta de contenidos, la materia y el </w:t>
+      </w:r>
+      <w:proofErr w:type="spellStart"/>
+      <w:r>
+        <w:rPr>
+          <w:b/>
+        </w:rPr>
+        <w:t>numero</w:t>
+      </w:r>
+      <w:proofErr w:type="spellEnd"/>
+      <w:r>
+        <w:rPr>
+          <w:b/>
+        </w:rPr>
+        <w:t xml:space="preserve"> de unidad como están, pero que me permita agregar un tema, y a su vez agregar de a uno los subtemas, una </w:t>
+      </w:r>
+      <w:proofErr w:type="spellStart"/>
+      <w:r>
+        <w:rPr>
+          <w:b/>
+        </w:rPr>
+        <w:t>ves</w:t>
+      </w:r>
+      <w:proofErr w:type="spellEnd"/>
+      <w:r>
+        <w:rPr>
+          <w:b/>
+        </w:rPr>
+        <w:t xml:space="preserve"> completados los subtemas, que me permita incorporar a continuación otro tema y los subtemas correspondientes, hasta que con el botón guardar se cierre la unidad y se guarde. Y también la posibilidad de visualizar las unidades y también la posibilidad de modificarles sus datos. Y que en la vista </w:t>
+      </w:r>
+      <w:proofErr w:type="spellStart"/>
+      <w:r>
+        <w:rPr>
+          <w:b/>
+        </w:rPr>
+        <w:t>index</w:t>
+      </w:r>
+      <w:proofErr w:type="spellEnd"/>
+      <w:r>
+        <w:rPr>
+          <w:b/>
+        </w:rPr>
+        <w:t>,</w:t>
+      </w:r>
+      <w:r>
+        <w:rPr>
+          <w:b/>
+        </w:rPr>
+        <w:t xml:space="preserve"> de los contenidos, cada unidad use el método </w:t>
+      </w:r>
+      <w:proofErr w:type="spellStart"/>
+      <w:r>
+        <w:rPr>
+          <w:b/>
+        </w:rPr>
+        <w:t>acordeon</w:t>
+      </w:r>
+      <w:proofErr w:type="spellEnd"/>
+      <w:r>
+        <w:rPr>
+          <w:b/>
+        </w:rPr>
+        <w:t xml:space="preserve"> y se despliegue mostrando los temas y a su vez los subtemas.</w:t>
+      </w:r>
+    </w:p>
+    <w:bookmarkEnd w:id="0"/>
+    <w:p>
+      <w:pPr>
+        <w:tabs>
+          <w:tab w:val="left" w:pos="1792"/>
+        </w:tabs>
+      </w:pPr>
+      <w:r>
+        <w:t xml:space="preserve">Necesito que al agregar un nuevo tema a una unidad, desde el botón que aparece al desplegar el </w:t>
+      </w:r>
+      <w:proofErr w:type="spellStart"/>
+      <w:r>
+        <w:t>acordeon</w:t>
+      </w:r>
+      <w:proofErr w:type="spellEnd"/>
+      <w:r>
+        <w:t xml:space="preserve"> de</w:t>
+      </w:r>
+      <w:r>
+        <w:t xml:space="preserve"> la unidad</w:t>
+      </w:r>
+      <w:r>
+        <w:t>, me muestre los temas anteriores</w:t>
+      </w:r>
+      <w:r>
+        <w:t xml:space="preserve"> ya cargados en esa unidad</w:t>
+      </w:r>
+      <w:r>
+        <w:t>, pero sin la posibilidad de editar</w:t>
+      </w:r>
+      <w:r>
+        <w:t xml:space="preserve">los en ese </w:t>
+      </w:r>
+      <w:r>
+        <w:t>momento,</w:t>
+      </w:r>
+      <w:r>
+        <w:t xml:space="preserve"> que solo lo muestre, pero que al presionar el botón de</w:t>
+      </w:r>
+      <w:r>
+        <w:t xml:space="preserve"> </w:t>
+      </w:r>
+      <w:r>
+        <w:t xml:space="preserve">agregar temas a esta unidad, si me registre los datos del nuevo tema y sus subtemas, también </w:t>
+      </w:r>
+      <w:r>
+        <w:t xml:space="preserve">que cuando presione en el </w:t>
+      </w:r>
+      <w:proofErr w:type="spellStart"/>
+      <w:r>
+        <w:t>la</w:t>
+      </w:r>
+      <w:r>
+        <w:t>p</w:t>
+      </w:r>
+      <w:r>
+        <w:t>iz</w:t>
+      </w:r>
+      <w:proofErr w:type="spellEnd"/>
+      <w:r>
+        <w:t xml:space="preserve"> de edición de una unidad, me traiga la </w:t>
+      </w:r>
+      <w:proofErr w:type="spellStart"/>
+      <w:r>
+        <w:t>info</w:t>
+      </w:r>
+      <w:r>
+        <w:t>rmacion</w:t>
+      </w:r>
+      <w:proofErr w:type="spellEnd"/>
+      <w:r>
+        <w:t xml:space="preserve"> de </w:t>
+      </w:r>
       <w:proofErr w:type="gramStart"/>
       <w:r>
-        <w:rPr>
-          <w:b/>
-        </w:rPr>
-        <w:t>necesito</w:t>
+        <w:t>la</w:t>
       </w:r>
       <w:proofErr w:type="gramEnd"/>
       <w:r>
-        <w:rPr>
-          <w:b/>
-        </w:rPr>
-        <w:t xml:space="preserve"> que </w:t>
-      </w:r>
-      <w:proofErr w:type="spellStart"/>
-      <w:r>
-        <w:rPr>
-          <w:b/>
-        </w:rPr>
-        <w:t>aca</w:t>
-      </w:r>
-      <w:proofErr w:type="spellEnd"/>
-      <w:r>
-        <w:rPr>
-          <w:b/>
-        </w:rPr>
-        <w:t xml:space="preserve"> </w:t>
-      </w:r>
-      <w:proofErr w:type="spellStart"/>
-      <w:r>
-        <w:rPr>
-          <w:b/>
-        </w:rPr>
-        <w:t>tambien</w:t>
-      </w:r>
-      <w:proofErr w:type="spellEnd"/>
-      <w:r>
-        <w:rPr>
-          <w:b/>
-        </w:rPr>
-        <w:t xml:space="preserve"> me ponga al final del </w:t>
-      </w:r>
-      <w:proofErr w:type="spellStart"/>
-      <w:r>
-        <w:rPr>
-          <w:b/>
-        </w:rPr>
-        <w:t>item</w:t>
-      </w:r>
-      <w:proofErr w:type="spellEnd"/>
-      <w:r>
-        <w:rPr>
-          <w:b/>
-        </w:rPr>
-        <w:t xml:space="preserve"> del </w:t>
-      </w:r>
-      <w:proofErr w:type="spellStart"/>
-      <w:r>
-        <w:rPr>
-          <w:b/>
-        </w:rPr>
-        <w:t>select</w:t>
-      </w:r>
-      <w:proofErr w:type="spellEnd"/>
-      <w:r>
-        <w:rPr>
-          <w:b/>
-        </w:rPr>
-        <w:t xml:space="preserve"> ,el curso al cual corresponde la </w:t>
-      </w:r>
-      <w:proofErr w:type="spellStart"/>
-      <w:r>
-        <w:rPr>
-          <w:b/>
-        </w:rPr>
-        <w:t>designacion</w:t>
-      </w:r>
-      <w:proofErr w:type="spellEnd"/>
-    </w:p>
-    <w:bookmarkEnd w:id="0"/>
+        <w:t xml:space="preserve"> unidad </w:t>
+      </w:r>
+      <w:r>
+        <w:t xml:space="preserve">para editarla, </w:t>
+      </w:r>
+      <w:r>
+        <w:t xml:space="preserve">ya que por el momento no me la muestra, para realizar modificaciones. </w:t>
+      </w:r>
+    </w:p>
+    <w:p>
+      <w:pPr>
+        <w:tabs>
+          <w:tab w:val="left" w:pos="1792"/>
+        </w:tabs>
+        <w:rPr>
+          <w:b/>
+          <w:lang w:val="es-ES"/>
+        </w:rPr>
+      </w:pPr>
+    </w:p>
     <w:p>
       <w:pPr>
         <w:rPr>
@@ -13627,6 +13822,7 @@
   <w:style w:type="character" w:default="1" w:styleId="Fuentedeprrafopredeter">
     <w:name w:val="Default Paragraph Font"/>
     <w:uiPriority w:val="1"/>
+    <w:semiHidden/>
     <w:unhideWhenUsed/>
   </w:style>
   <w:style w:type="table" w:default="1" w:styleId="Tablanormal">
@@ -13838,6 +14034,7 @@
   <w:style w:type="character" w:default="1" w:styleId="Fuentedeprrafopredeter">
     <w:name w:val="Default Paragraph Font"/>
     <w:uiPriority w:val="1"/>
+    <w:semiHidden/>
     <w:unhideWhenUsed/>
   </w:style>
   <w:style w:type="table" w:default="1" w:styleId="Tablanormal">
@@ -14176,7 +14373,7 @@
 </file>
 
 <file path=customXml/itemProps1.xml><?xml version="1.0" encoding="utf-8"?>
-<ds:datastoreItem xmlns:ds="http://schemas.openxmlformats.org/officeDocument/2006/customXml" ds:itemID="{C1BC03D1-DEDE-47F3-9925-0811CB065791}">
+<ds:datastoreItem xmlns:ds="http://schemas.openxmlformats.org/officeDocument/2006/customXml" ds:itemID="{FBD52047-2BFC-4555-BF17-161DEEDF36A5}">
   <ds:schemaRefs>
     <ds:schemaRef ds:uri="http://schemas.openxmlformats.org/officeDocument/2006/bibliography"/>
   </ds:schemaRefs>

</xml_diff>

<commit_message>
se corrigen encabezados de columnas de temas y contenidos
</commit_message>
<xml_diff>
--- a/requerimientos.docx
+++ b/requerimientos.docx
@@ -10272,221 +10272,2771 @@
           <w:b/>
         </w:rPr>
       </w:pPr>
+      <w:r>
+        <w:rPr>
+          <w:b/>
+        </w:rPr>
+        <w:t>Necesito que me agregues la posibilidad de editar las declaraciones juradas que no hayan sido presentadas, es decir en estado borrador, y que luego de presentarlas que se mantenga la imposibilidad de modificarlas y se deba generar una nueva como hasta ahora</w:t>
+      </w:r>
+      <w:r>
+        <w:rPr>
+          <w:b/>
+        </w:rPr>
+        <w:t>.</w:t>
+      </w:r>
+    </w:p>
+    <w:p>
+      <w:pPr>
+        <w:tabs>
+          <w:tab w:val="left" w:pos="1792"/>
+        </w:tabs>
+        <w:rPr>
+          <w:b/>
+        </w:rPr>
+      </w:pPr>
+      <w:r>
+        <w:rPr>
+          <w:b/>
+        </w:rPr>
+        <w:t xml:space="preserve">Necesito que me modifiques el alta de contenidos, la materia y el </w:t>
+      </w:r>
+      <w:proofErr w:type="spellStart"/>
+      <w:r>
+        <w:rPr>
+          <w:b/>
+        </w:rPr>
+        <w:t>numero</w:t>
+      </w:r>
+      <w:proofErr w:type="spellEnd"/>
+      <w:r>
+        <w:rPr>
+          <w:b/>
+        </w:rPr>
+        <w:t xml:space="preserve"> de unidad como están, pero que me permita agregar un tema, y a su vez agregar de a uno los subtemas, una </w:t>
+      </w:r>
+      <w:proofErr w:type="spellStart"/>
+      <w:r>
+        <w:rPr>
+          <w:b/>
+        </w:rPr>
+        <w:t>ves</w:t>
+      </w:r>
+      <w:proofErr w:type="spellEnd"/>
+      <w:r>
+        <w:rPr>
+          <w:b/>
+        </w:rPr>
+        <w:t xml:space="preserve"> completados los subtemas, que me permita incorporar a continuación otro tema y los subtemas correspondientes, hasta que con el botón guardar se cierre la unidad y se guarde. Y también la posibilidad de visualizar las unidades y también la posibilidad de modificarles sus datos. Y que en la vista </w:t>
+      </w:r>
+      <w:proofErr w:type="spellStart"/>
+      <w:r>
+        <w:rPr>
+          <w:b/>
+        </w:rPr>
+        <w:t>index</w:t>
+      </w:r>
+      <w:proofErr w:type="spellEnd"/>
+      <w:r>
+        <w:rPr>
+          <w:b/>
+        </w:rPr>
+        <w:t>,</w:t>
+      </w:r>
+      <w:r>
+        <w:rPr>
+          <w:b/>
+        </w:rPr>
+        <w:t xml:space="preserve"> de los contenidos, cada unidad use el método </w:t>
+      </w:r>
+      <w:proofErr w:type="spellStart"/>
+      <w:r>
+        <w:rPr>
+          <w:b/>
+        </w:rPr>
+        <w:t>acordeon</w:t>
+      </w:r>
+      <w:proofErr w:type="spellEnd"/>
+      <w:r>
+        <w:rPr>
+          <w:b/>
+        </w:rPr>
+        <w:t xml:space="preserve"> y se despliegue mostrando los temas y a su vez los subtemas.</w:t>
+      </w:r>
+    </w:p>
+    <w:p>
+      <w:pPr>
+        <w:tabs>
+          <w:tab w:val="left" w:pos="1792"/>
+        </w:tabs>
+      </w:pPr>
+      <w:r>
+        <w:rPr>
+          <w:b/>
+        </w:rPr>
+        <w:t xml:space="preserve">Necesito que al agregar un nuevo tema a una unidad, desde el botón que aparece al desplegar el </w:t>
+      </w:r>
+      <w:proofErr w:type="spellStart"/>
+      <w:r>
+        <w:rPr>
+          <w:b/>
+        </w:rPr>
+        <w:t>acordeon</w:t>
+      </w:r>
+      <w:proofErr w:type="spellEnd"/>
+      <w:r>
+        <w:rPr>
+          <w:b/>
+        </w:rPr>
+        <w:t xml:space="preserve"> de</w:t>
+      </w:r>
+      <w:r>
+        <w:rPr>
+          <w:b/>
+        </w:rPr>
+        <w:t xml:space="preserve"> la unidad</w:t>
+      </w:r>
+      <w:r>
+        <w:rPr>
+          <w:b/>
+        </w:rPr>
+        <w:t>, me muestre los temas anteriores</w:t>
+      </w:r>
+      <w:r>
+        <w:rPr>
+          <w:b/>
+        </w:rPr>
+        <w:t xml:space="preserve"> ya cargados en esa unidad</w:t>
+      </w:r>
+      <w:r>
+        <w:rPr>
+          <w:b/>
+        </w:rPr>
+        <w:t>, pero sin la posibilidad de editar</w:t>
+      </w:r>
+      <w:r>
+        <w:rPr>
+          <w:b/>
+        </w:rPr>
+        <w:t xml:space="preserve">los en ese </w:t>
+      </w:r>
+      <w:r>
+        <w:rPr>
+          <w:b/>
+        </w:rPr>
+        <w:t>momento,</w:t>
+      </w:r>
+      <w:r>
+        <w:rPr>
+          <w:b/>
+        </w:rPr>
+        <w:t xml:space="preserve"> que solo lo muestre, pero que al presionar el botón de</w:t>
+      </w:r>
+      <w:r>
+        <w:rPr>
+          <w:b/>
+        </w:rPr>
+        <w:t xml:space="preserve"> </w:t>
+      </w:r>
+      <w:r>
+        <w:rPr>
+          <w:b/>
+        </w:rPr>
+        <w:t xml:space="preserve">agregar temas a esta unidad, si me registre los datos del nuevo tema y sus subtemas, también </w:t>
+      </w:r>
+      <w:r>
+        <w:rPr>
+          <w:b/>
+        </w:rPr>
+        <w:t xml:space="preserve">que cuando presione en el </w:t>
+      </w:r>
+      <w:proofErr w:type="spellStart"/>
+      <w:r>
+        <w:rPr>
+          <w:b/>
+        </w:rPr>
+        <w:t>la</w:t>
+      </w:r>
+      <w:r>
+        <w:rPr>
+          <w:b/>
+        </w:rPr>
+        <w:t>p</w:t>
+      </w:r>
+      <w:r>
+        <w:rPr>
+          <w:b/>
+        </w:rPr>
+        <w:t>iz</w:t>
+      </w:r>
+      <w:proofErr w:type="spellEnd"/>
+      <w:r>
+        <w:rPr>
+          <w:b/>
+        </w:rPr>
+        <w:t xml:space="preserve"> de edición de una unidad, me traiga la </w:t>
+      </w:r>
+      <w:proofErr w:type="spellStart"/>
+      <w:r>
+        <w:rPr>
+          <w:b/>
+        </w:rPr>
+        <w:t>info</w:t>
+      </w:r>
+      <w:r>
+        <w:rPr>
+          <w:b/>
+        </w:rPr>
+        <w:t>rmacion</w:t>
+      </w:r>
+      <w:proofErr w:type="spellEnd"/>
+      <w:r>
+        <w:rPr>
+          <w:b/>
+        </w:rPr>
+        <w:t xml:space="preserve"> de la unidad </w:t>
+      </w:r>
+      <w:r>
+        <w:rPr>
+          <w:b/>
+        </w:rPr>
+        <w:t xml:space="preserve">para editarla, </w:t>
+      </w:r>
+      <w:r>
+        <w:rPr>
+          <w:b/>
+        </w:rPr>
+        <w:t>ya que por el momento no me la muestra, para realizar modificaciones</w:t>
+      </w:r>
+      <w:r>
+        <w:t xml:space="preserve">. </w:t>
+      </w:r>
+    </w:p>
+    <w:p>
+      <w:pPr>
+        <w:tabs>
+          <w:tab w:val="left" w:pos="1792"/>
+        </w:tabs>
+        <w:rPr>
+          <w:lang w:val="es-ES"/>
+        </w:rPr>
+      </w:pPr>
+      <w:r>
+        <w:rPr>
+          <w:b/>
+          <w:lang w:val="es-ES"/>
+        </w:rPr>
+        <w:t xml:space="preserve">Necesito que cuando le hago </w:t>
+      </w:r>
+      <w:proofErr w:type="spellStart"/>
+      <w:r>
+        <w:rPr>
+          <w:b/>
+          <w:lang w:val="es-ES"/>
+        </w:rPr>
+        <w:t>click</w:t>
+      </w:r>
+      <w:proofErr w:type="spellEnd"/>
+      <w:r>
+        <w:rPr>
+          <w:b/>
+          <w:lang w:val="es-ES"/>
+        </w:rPr>
+        <w:t xml:space="preserve"> al menú </w:t>
+      </w:r>
+      <w:r>
+        <w:rPr>
+          <w:b/>
+          <w:lang w:val="es-ES"/>
+        </w:rPr>
+        <w:t xml:space="preserve">actividad </w:t>
+      </w:r>
+      <w:proofErr w:type="spellStart"/>
+      <w:r>
+        <w:rPr>
+          <w:b/>
+          <w:lang w:val="es-ES"/>
+        </w:rPr>
+        <w:t>aulica</w:t>
+      </w:r>
+      <w:proofErr w:type="spellEnd"/>
+      <w:r>
+        <w:rPr>
+          <w:b/>
+          <w:lang w:val="es-ES"/>
+        </w:rPr>
+        <w:t xml:space="preserve">, </w:t>
+      </w:r>
+      <w:r>
+        <w:rPr>
+          <w:b/>
+          <w:lang w:val="es-ES"/>
+        </w:rPr>
+        <w:t>y a la opción asistencia, la vista asistencia,</w:t>
+      </w:r>
+      <w:r>
+        <w:rPr>
+          <w:b/>
+          <w:lang w:val="es-ES"/>
+        </w:rPr>
+        <w:t xml:space="preserve"> me muestre en los </w:t>
+      </w:r>
+      <w:proofErr w:type="spellStart"/>
+      <w:r>
+        <w:rPr>
+          <w:b/>
+          <w:lang w:val="es-ES"/>
+        </w:rPr>
+        <w:t>select</w:t>
+      </w:r>
+      <w:proofErr w:type="spellEnd"/>
+      <w:r>
+        <w:rPr>
+          <w:b/>
+          <w:lang w:val="es-ES"/>
+        </w:rPr>
+        <w:t xml:space="preserve"> ya la materia y el curso, que </w:t>
+      </w:r>
+      <w:r>
+        <w:rPr>
+          <w:b/>
+          <w:lang w:val="es-ES"/>
+        </w:rPr>
+        <w:t xml:space="preserve">corresponden al horario </w:t>
+      </w:r>
+      <w:proofErr w:type="gramStart"/>
+      <w:r>
+        <w:rPr>
+          <w:b/>
+          <w:lang w:val="es-ES"/>
+        </w:rPr>
+        <w:t>activo ,</w:t>
+      </w:r>
+      <w:proofErr w:type="gramEnd"/>
+      <w:r>
+        <w:rPr>
+          <w:b/>
+          <w:lang w:val="es-ES"/>
+        </w:rPr>
+        <w:t xml:space="preserve"> </w:t>
+      </w:r>
+      <w:r>
+        <w:rPr>
+          <w:b/>
+          <w:lang w:val="es-ES"/>
+        </w:rPr>
+        <w:t xml:space="preserve">igualmente que me permita poder seleccionar algo distinto en cada </w:t>
+      </w:r>
+      <w:proofErr w:type="spellStart"/>
+      <w:r>
+        <w:rPr>
+          <w:b/>
+          <w:lang w:val="es-ES"/>
+        </w:rPr>
+        <w:t>select</w:t>
+      </w:r>
+      <w:proofErr w:type="spellEnd"/>
+      <w:r>
+        <w:rPr>
+          <w:b/>
+          <w:lang w:val="es-ES"/>
+        </w:rPr>
+        <w:t xml:space="preserve"> si yo quisiera otro</w:t>
+      </w:r>
+      <w:r>
+        <w:rPr>
+          <w:b/>
+          <w:lang w:val="es-ES"/>
+        </w:rPr>
+        <w:t xml:space="preserve">, pero si no selecciono nada que se base en lo que muestra al abrir la vista asistencias, el curso y año según el horario actual, y al presionar siguiente que </w:t>
+      </w:r>
+      <w:proofErr w:type="spellStart"/>
+      <w:r>
+        <w:rPr>
+          <w:b/>
+          <w:lang w:val="es-ES"/>
+        </w:rPr>
+        <w:t>continue</w:t>
+      </w:r>
+      <w:proofErr w:type="spellEnd"/>
+      <w:r>
+        <w:rPr>
+          <w:b/>
+          <w:lang w:val="es-ES"/>
+        </w:rPr>
+        <w:t xml:space="preserve"> como hasta ahora</w:t>
+      </w:r>
+      <w:r>
+        <w:rPr>
+          <w:lang w:val="es-ES"/>
+        </w:rPr>
+        <w:t>.</w:t>
+      </w:r>
+    </w:p>
+    <w:p>
+      <w:pPr>
+        <w:tabs>
+          <w:tab w:val="left" w:pos="1792"/>
+        </w:tabs>
+        <w:rPr>
+          <w:b/>
+          <w:lang w:val="es-ES"/>
+        </w:rPr>
+      </w:pPr>
+      <w:r>
+        <w:rPr>
+          <w:b/>
+          <w:lang w:val="es-ES"/>
+        </w:rPr>
+        <w:t xml:space="preserve">Necesito que en contenidos en el </w:t>
+      </w:r>
+      <w:proofErr w:type="spellStart"/>
+      <w:r>
+        <w:rPr>
+          <w:b/>
+          <w:lang w:val="es-ES"/>
+        </w:rPr>
+        <w:t>index</w:t>
+      </w:r>
+      <w:proofErr w:type="spellEnd"/>
+      <w:r>
+        <w:rPr>
+          <w:b/>
+          <w:lang w:val="es-ES"/>
+        </w:rPr>
+        <w:t xml:space="preserve">, </w:t>
+      </w:r>
+      <w:proofErr w:type="spellStart"/>
+      <w:r>
+        <w:rPr>
+          <w:b/>
+          <w:lang w:val="es-ES"/>
+        </w:rPr>
+        <w:t>ma</w:t>
+      </w:r>
+      <w:proofErr w:type="spellEnd"/>
+      <w:r>
+        <w:rPr>
+          <w:b/>
+          <w:lang w:val="es-ES"/>
+        </w:rPr>
+        <w:t xml:space="preserve"> aparezca seleccionada la materia en el horario actual, y que me coloques en la vista , entre el filtro y los botones de contraer todo y expandir todo nombre de la columna arriba del </w:t>
+      </w:r>
+      <w:proofErr w:type="spellStart"/>
+      <w:r>
+        <w:rPr>
+          <w:b/>
+          <w:lang w:val="es-ES"/>
+        </w:rPr>
+        <w:t>numero</w:t>
+      </w:r>
+      <w:proofErr w:type="spellEnd"/>
+      <w:r>
+        <w:rPr>
+          <w:b/>
+          <w:lang w:val="es-ES"/>
+        </w:rPr>
+        <w:t xml:space="preserve"> de unidad, la materia, y el tema de la unidad</w:t>
+      </w:r>
+    </w:p>
+    <w:p>
+      <w:pPr>
+        <w:tabs>
+          <w:tab w:val="left" w:pos="1792"/>
+        </w:tabs>
+        <w:rPr>
+          <w:lang w:val="es-ES"/>
+        </w:rPr>
+      </w:pPr>
+      <w:r>
+        <w:rPr>
+          <w:lang w:val="es-ES"/>
+        </w:rPr>
+        <w:t xml:space="preserve">Necesito que al registrar asistencia, verifique en el calendario escolar si corresponde a una fecha marcada como feriado, y de ser </w:t>
+      </w:r>
+      <w:proofErr w:type="spellStart"/>
+      <w:r>
+        <w:rPr>
+          <w:lang w:val="es-ES"/>
+        </w:rPr>
+        <w:t>asi</w:t>
+      </w:r>
+      <w:proofErr w:type="spellEnd"/>
+      <w:r>
+        <w:rPr>
+          <w:lang w:val="es-ES"/>
+        </w:rPr>
+        <w:t xml:space="preserve"> que me coloque en las observaciones feriado</w:t>
+      </w:r>
+    </w:p>
+    <w:p>
+      <w:pPr>
+        <w:tabs>
+          <w:tab w:val="left" w:pos="1792"/>
+        </w:tabs>
+        <w:rPr>
+          <w:b/>
+          <w:lang w:val="es-ES"/>
+        </w:rPr>
+      </w:pPr>
+      <w:r>
+        <w:rPr>
+          <w:b/>
+          <w:lang w:val="es-ES"/>
+        </w:rPr>
+        <w:lastRenderedPageBreak/>
+        <w:t>Necesito que al entrar al historial de asistencias, tome del horario el curso y materia y me muestre los datos</w:t>
+      </w:r>
+    </w:p>
+    <w:p>
+      <w:pPr>
+        <w:tabs>
+          <w:tab w:val="left" w:pos="1792"/>
+        </w:tabs>
+        <w:rPr>
+          <w:lang w:val="es-ES"/>
+        </w:rPr>
+      </w:pPr>
+      <w:r>
+        <w:rPr>
+          <w:lang w:val="es-ES"/>
+        </w:rPr>
+        <w:t>Necesito que me modifiques la tabla materias y me saques el campo establecimiento ya que no quiero registrar en esa tabla ese dato</w:t>
+      </w:r>
       <w:bookmarkStart w:id="0" w:name="_GoBack"/>
-      <w:r>
-        <w:rPr>
-          <w:b/>
-        </w:rPr>
-        <w:t>Necesito que me agregues la posibilidad de editar las declaraciones juradas que no hayan sido presentadas, es decir en estado borrador, y que luego de presentarlas que se mantenga la imposibilidad de modificarlas y se deba generar una nueva como hasta ahora</w:t>
-      </w:r>
-      <w:r>
-        <w:rPr>
-          <w:b/>
-        </w:rPr>
+      <w:bookmarkEnd w:id="0"/>
+    </w:p>
+    <w:p>
+      <w:pPr>
+        <w:rPr>
+          <w:lang w:val="es-ES"/>
+        </w:rPr>
+      </w:pPr>
+      <w:r>
+        <w:rPr>
+          <w:lang w:val="es-ES"/>
+        </w:rPr>
+        <w:t>Necesito Realizar cie</w:t>
+      </w:r>
+      <w:r>
+        <w:rPr>
+          <w:lang w:val="es-ES"/>
+        </w:rPr>
+        <w:t>r</w:t>
+      </w:r>
+      <w:r>
+        <w:rPr>
+          <w:lang w:val="es-ES"/>
+        </w:rPr>
+        <w:t>re de cuatrimestre</w:t>
+      </w:r>
+    </w:p>
+    <w:p>
+      <w:pPr>
+        <w:rPr>
+          <w:lang w:val="es-ES"/>
+        </w:rPr>
+      </w:pPr>
+    </w:p>
+    <w:p>
+      <w:pPr>
+        <w:rPr>
+          <w:lang w:val="es-ES"/>
+        </w:rPr>
+      </w:pPr>
+    </w:p>
+    <w:p>
+      <w:pPr>
+        <w:rPr>
+          <w:lang w:val="es-ES"/>
+        </w:rPr>
+      </w:pPr>
+    </w:p>
+    <w:p>
+      <w:pPr>
+        <w:rPr>
+          <w:lang w:val="es-ES"/>
+        </w:rPr>
+      </w:pPr>
+    </w:p>
+    <w:p>
+      <w:pPr>
+        <w:rPr>
+          <w:lang w:val="es-ES"/>
+        </w:rPr>
+      </w:pPr>
+    </w:p>
+    <w:p>
+      <w:pPr>
+        <w:rPr>
+          <w:lang w:val="es-ES"/>
+        </w:rPr>
+      </w:pPr>
+    </w:p>
+    <w:p>
+      <w:pPr>
+        <w:rPr>
+          <w:lang w:val="es-ES"/>
+        </w:rPr>
+      </w:pPr>
+    </w:p>
+    <w:p>
+      <w:pPr>
+        <w:rPr>
+          <w:lang w:val="es-ES"/>
+        </w:rPr>
+      </w:pPr>
+    </w:p>
+    <w:p>
+      <w:pPr>
+        <w:rPr>
+          <w:lang w:val="es-ES"/>
+        </w:rPr>
+      </w:pPr>
+    </w:p>
+    <w:p>
+      <w:pPr>
+        <w:rPr>
+          <w:lang w:val="es-ES"/>
+        </w:rPr>
+      </w:pPr>
+    </w:p>
+    <w:p>
+      <w:pPr>
+        <w:rPr>
+          <w:lang w:val="es-ES"/>
+        </w:rPr>
+      </w:pPr>
+    </w:p>
+    <w:p>
+      <w:pPr>
+        <w:rPr>
+          <w:lang w:val="es-ES"/>
+        </w:rPr>
+      </w:pPr>
+    </w:p>
+    <w:p>
+      <w:pPr>
+        <w:rPr>
+          <w:lang w:val="es-ES"/>
+        </w:rPr>
+      </w:pPr>
+    </w:p>
+    <w:p>
+      <w:pPr>
+        <w:rPr>
+          <w:lang w:val="es-ES"/>
+        </w:rPr>
+      </w:pPr>
+    </w:p>
+    <w:p>
+      <w:pPr>
+        <w:rPr>
+          <w:lang w:val="es-ES"/>
+        </w:rPr>
+      </w:pPr>
+    </w:p>
+    <w:p>
+      <w:pPr>
+        <w:rPr>
+          <w:lang w:val="es-ES"/>
+        </w:rPr>
+      </w:pPr>
+    </w:p>
+    <w:p>
+      <w:pPr>
+        <w:rPr>
+          <w:lang w:val="es-ES"/>
+        </w:rPr>
+      </w:pPr>
+    </w:p>
+    <w:p>
+      <w:pPr>
+        <w:rPr>
+          <w:lang w:val="es-ES"/>
+        </w:rPr>
+      </w:pPr>
+    </w:p>
+    <w:p>
+      <w:pPr>
+        <w:rPr>
+          <w:lang w:val="es-ES"/>
+        </w:rPr>
+      </w:pPr>
+    </w:p>
+    <w:p>
+      <w:pPr>
+        <w:rPr>
+          <w:lang w:val="es-ES"/>
+        </w:rPr>
+      </w:pPr>
+    </w:p>
+    <w:p>
+      <w:pPr>
+        <w:rPr>
+          <w:lang w:val="es-ES"/>
+        </w:rPr>
+      </w:pPr>
+    </w:p>
+    <w:p>
+      <w:pPr>
+        <w:rPr>
+          <w:lang w:val="es-ES"/>
+        </w:rPr>
+      </w:pPr>
+    </w:p>
+    <w:p>
+      <w:pPr>
+        <w:rPr>
+          <w:lang w:val="es-ES"/>
+        </w:rPr>
+      </w:pPr>
+    </w:p>
+    <w:p>
+      <w:pPr>
+        <w:rPr>
+          <w:lang w:val="es-ES"/>
+        </w:rPr>
+      </w:pPr>
+    </w:p>
+    <w:p>
+      <w:pPr>
+        <w:rPr>
+          <w:lang w:val="es-ES"/>
+        </w:rPr>
+      </w:pPr>
+    </w:p>
+    <w:p>
+      <w:pPr>
+        <w:jc w:val="center"/>
+      </w:pPr>
+      <w:r>
+        <w:rPr>
+          <w:b/>
+          <w:bCs/>
+        </w:rPr>
+        <w:t>Aplicación Web Progresiva (PWA)</w:t>
+      </w:r>
+    </w:p>
+    <w:p>
+      <w:r>
+        <w:t xml:space="preserve">Para convertir una aplicación web existente en una </w:t>
+      </w:r>
+      <w:r>
+        <w:rPr>
+          <w:b/>
+          <w:bCs/>
+        </w:rPr>
+        <w:t>Aplicación Web Progresiva (PWA)</w:t>
+      </w:r>
+      <w:r>
+        <w:t xml:space="preserve"> y permitir que los usuarios la instalen en su computadora o celular como si fuera una </w:t>
+      </w:r>
+      <w:proofErr w:type="spellStart"/>
+      <w:r>
+        <w:t>app</w:t>
+      </w:r>
+      <w:proofErr w:type="spellEnd"/>
+      <w:r>
+        <w:t xml:space="preserve"> nativa, necesitas implementar </w:t>
+      </w:r>
+      <w:r>
+        <w:rPr>
+          <w:b/>
+          <w:bCs/>
+        </w:rPr>
+        <w:t>3 componentes obligatorios</w:t>
+      </w:r>
+      <w:r>
         <w:t>.</w:t>
       </w:r>
     </w:p>
     <w:p>
-      <w:pPr>
-        <w:tabs>
-          <w:tab w:val="left" w:pos="1792"/>
-        </w:tabs>
-        <w:rPr>
-          <w:b/>
-        </w:rPr>
-      </w:pPr>
-      <w:r>
-        <w:rPr>
-          <w:b/>
-        </w:rPr>
-        <w:t xml:space="preserve">Necesito que me modifiques el alta de contenidos, la materia y el </w:t>
-      </w:r>
-      <w:proofErr w:type="spellStart"/>
-      <w:r>
-        <w:rPr>
-          <w:b/>
-        </w:rPr>
-        <w:t>numero</w:t>
-      </w:r>
-      <w:proofErr w:type="spellEnd"/>
-      <w:r>
-        <w:rPr>
-          <w:b/>
-        </w:rPr>
-        <w:t xml:space="preserve"> de unidad como están, pero que me permita agregar un tema, y a su vez agregar de a uno los subtemas, una </w:t>
-      </w:r>
-      <w:proofErr w:type="spellStart"/>
-      <w:r>
-        <w:rPr>
-          <w:b/>
-        </w:rPr>
-        <w:t>ves</w:t>
-      </w:r>
-      <w:proofErr w:type="spellEnd"/>
-      <w:r>
-        <w:rPr>
-          <w:b/>
-        </w:rPr>
-        <w:t xml:space="preserve"> completados los subtemas, que me permita incorporar a continuación otro tema y los subtemas correspondientes, hasta que con el botón guardar se cierre la unidad y se guarde. Y también la posibilidad de visualizar las unidades y también la posibilidad de modificarles sus datos. Y que en la vista </w:t>
-      </w:r>
-      <w:proofErr w:type="spellStart"/>
-      <w:r>
-        <w:rPr>
-          <w:b/>
-        </w:rPr>
-        <w:t>index</w:t>
-      </w:r>
-      <w:proofErr w:type="spellEnd"/>
-      <w:r>
-        <w:rPr>
-          <w:b/>
-        </w:rPr>
-        <w:t>,</w:t>
-      </w:r>
-      <w:r>
-        <w:rPr>
-          <w:b/>
-        </w:rPr>
-        <w:t xml:space="preserve"> de los contenidos, cada unidad use el método </w:t>
-      </w:r>
-      <w:proofErr w:type="spellStart"/>
-      <w:r>
-        <w:rPr>
-          <w:b/>
-        </w:rPr>
-        <w:t>acordeon</w:t>
-      </w:r>
-      <w:proofErr w:type="spellEnd"/>
-      <w:r>
-        <w:rPr>
-          <w:b/>
-        </w:rPr>
-        <w:t xml:space="preserve"> y se despliegue mostrando los temas y a su vez los subtemas.</w:t>
-      </w:r>
-    </w:p>
-    <w:bookmarkEnd w:id="0"/>
-    <w:p>
-      <w:pPr>
-        <w:tabs>
-          <w:tab w:val="left" w:pos="1792"/>
-        </w:tabs>
-      </w:pPr>
-      <w:r>
-        <w:t xml:space="preserve">Necesito que al agregar un nuevo tema a una unidad, desde el botón que aparece al desplegar el </w:t>
-      </w:r>
-      <w:proofErr w:type="spellStart"/>
-      <w:r>
-        <w:t>acordeon</w:t>
-      </w:r>
-      <w:proofErr w:type="spellEnd"/>
-      <w:r>
-        <w:t xml:space="preserve"> de</w:t>
-      </w:r>
-      <w:r>
-        <w:t xml:space="preserve"> la unidad</w:t>
-      </w:r>
-      <w:r>
-        <w:t>, me muestre los temas anteriores</w:t>
-      </w:r>
-      <w:r>
-        <w:t xml:space="preserve"> ya cargados en esa unidad</w:t>
-      </w:r>
-      <w:r>
-        <w:t>, pero sin la posibilidad de editar</w:t>
-      </w:r>
-      <w:r>
-        <w:t xml:space="preserve">los en ese </w:t>
-      </w:r>
-      <w:r>
-        <w:t>momento,</w:t>
-      </w:r>
-      <w:r>
-        <w:t xml:space="preserve"> que solo lo muestre, pero que al presionar el botón de</w:t>
-      </w:r>
-      <w:r>
+      <w:r>
+        <w:t>Aquí tienes el paso a paso técnico para lograrlo:</w:t>
+      </w:r>
+    </w:p>
+    <w:p>
+      <w:pPr>
+        <w:rPr>
+          <w:b/>
+          <w:bCs/>
+        </w:rPr>
+      </w:pPr>
+      <w:r>
+        <w:rPr>
+          <w:b/>
+          <w:bCs/>
+        </w:rPr>
+        <w:t>Los 3 Requisitos Clave de una PWA</w:t>
+      </w:r>
+    </w:p>
+    <w:p>
+      <w:r>
+        <w:t xml:space="preserve">Para que un navegador (como </w:t>
+      </w:r>
+      <w:proofErr w:type="spellStart"/>
+      <w:r>
+        <w:t>Chrome</w:t>
+      </w:r>
+      <w:proofErr w:type="spellEnd"/>
+      <w:r>
+        <w:t xml:space="preserve"> o </w:t>
+      </w:r>
+      <w:proofErr w:type="spellStart"/>
+      <w:r>
+        <w:t>Edge</w:t>
+      </w:r>
+      <w:proofErr w:type="spellEnd"/>
+      <w:r>
+        <w:t>) reconozca tu web como una PWA y muestre el botón de "Instalar", necesitas:</w:t>
+      </w:r>
+    </w:p>
+    <w:p>
+      <w:pPr>
+        <w:numPr>
+          <w:ilvl w:val="0"/>
+          <w:numId w:val="25"/>
+        </w:numPr>
+      </w:pPr>
+      <w:r>
+        <w:rPr>
+          <w:b/>
+          <w:bCs/>
+        </w:rPr>
+        <w:t>HTTPS:</w:t>
+      </w:r>
+      <w:r>
+        <w:t xml:space="preserve"> La web debe servirse de forma segura (para desarrollo local puedes usar </w:t>
+      </w:r>
+      <w:proofErr w:type="spellStart"/>
+      <w:r>
+        <w:t>localhost</w:t>
+      </w:r>
+      <w:proofErr w:type="spellEnd"/>
+      <w:r>
+        <w:t>).</w:t>
+      </w:r>
+    </w:p>
+    <w:p>
+      <w:pPr>
+        <w:numPr>
+          <w:ilvl w:val="0"/>
+          <w:numId w:val="25"/>
+        </w:numPr>
+      </w:pPr>
+      <w:r>
+        <w:rPr>
+          <w:b/>
+          <w:bCs/>
+        </w:rPr>
+        <w:t xml:space="preserve">Un Archivo </w:t>
+      </w:r>
+      <w:proofErr w:type="spellStart"/>
+      <w:r>
+        <w:rPr>
+          <w:b/>
+          <w:bCs/>
+        </w:rPr>
+        <w:t>Manifest</w:t>
+      </w:r>
+      <w:proofErr w:type="spellEnd"/>
+      <w:r>
+        <w:rPr>
+          <w:b/>
+          <w:bCs/>
+        </w:rPr>
+        <w:t xml:space="preserve"> (</w:t>
+      </w:r>
+      <w:proofErr w:type="spellStart"/>
+      <w:r>
+        <w:rPr>
+          <w:b/>
+          <w:bCs/>
+        </w:rPr>
+        <w:t>manifest.json</w:t>
+      </w:r>
+      <w:proofErr w:type="spellEnd"/>
+      <w:r>
+        <w:rPr>
+          <w:b/>
+          <w:bCs/>
+        </w:rPr>
+        <w:t>):</w:t>
+      </w:r>
+      <w:r>
+        <w:t xml:space="preserve"> Un archivo de configuración que le dice al sistema operativo cómo debe lucir tu </w:t>
+      </w:r>
+      <w:proofErr w:type="spellStart"/>
+      <w:r>
+        <w:t>app</w:t>
+      </w:r>
+      <w:proofErr w:type="spellEnd"/>
+      <w:r>
+        <w:t xml:space="preserve"> (icono, nombre, colores).</w:t>
+      </w:r>
+    </w:p>
+    <w:p>
+      <w:pPr>
+        <w:numPr>
+          <w:ilvl w:val="0"/>
+          <w:numId w:val="25"/>
+        </w:numPr>
+      </w:pPr>
+      <w:r>
+        <w:rPr>
+          <w:b/>
+          <w:bCs/>
+        </w:rPr>
+        <w:t xml:space="preserve">Un </w:t>
+      </w:r>
+      <w:proofErr w:type="spellStart"/>
+      <w:r>
+        <w:rPr>
+          <w:b/>
+          <w:bCs/>
+        </w:rPr>
+        <w:t>Service</w:t>
+      </w:r>
+      <w:proofErr w:type="spellEnd"/>
+      <w:r>
+        <w:rPr>
+          <w:b/>
+          <w:bCs/>
+        </w:rPr>
         <w:t xml:space="preserve"> </w:t>
       </w:r>
-      <w:r>
-        <w:t xml:space="preserve">agregar temas a esta unidad, si me registre los datos del nuevo tema y sus subtemas, también </w:t>
-      </w:r>
-      <w:r>
-        <w:t xml:space="preserve">que cuando presione en el </w:t>
-      </w:r>
-      <w:proofErr w:type="spellStart"/>
-      <w:r>
-        <w:t>la</w:t>
-      </w:r>
-      <w:r>
-        <w:t>p</w:t>
-      </w:r>
-      <w:r>
-        <w:t>iz</w:t>
-      </w:r>
-      <w:proofErr w:type="spellEnd"/>
-      <w:r>
-        <w:t xml:space="preserve"> de edición de una unidad, me traiga la </w:t>
-      </w:r>
-      <w:proofErr w:type="spellStart"/>
-      <w:r>
-        <w:t>info</w:t>
-      </w:r>
-      <w:r>
-        <w:t>rmacion</w:t>
-      </w:r>
-      <w:proofErr w:type="spellEnd"/>
-      <w:r>
-        <w:t xml:space="preserve"> de </w:t>
-      </w:r>
+      <w:proofErr w:type="spellStart"/>
+      <w:r>
+        <w:rPr>
+          <w:b/>
+          <w:bCs/>
+        </w:rPr>
+        <w:t>Worker</w:t>
+      </w:r>
+      <w:proofErr w:type="spellEnd"/>
+      <w:r>
+        <w:rPr>
+          <w:b/>
+          <w:bCs/>
+        </w:rPr>
+        <w:t>:</w:t>
+      </w:r>
+      <w:r>
+        <w:t xml:space="preserve"> Un script en JavaScript que corre en segundo plano y permite que la </w:t>
+      </w:r>
+      <w:proofErr w:type="spellStart"/>
+      <w:r>
+        <w:t>app</w:t>
+      </w:r>
+      <w:proofErr w:type="spellEnd"/>
+      <w:r>
+        <w:t xml:space="preserve"> funcione sin internet (offline).</w:t>
+      </w:r>
+    </w:p>
+    <w:p>
+      <w:pPr>
+        <w:rPr>
+          <w:b/>
+          <w:bCs/>
+        </w:rPr>
+      </w:pPr>
+      <w:r>
+        <w:rPr>
+          <w:b/>
+          <w:bCs/>
+        </w:rPr>
+        <w:t>Paso a Paso: Implementación Código a Código</w:t>
+      </w:r>
+    </w:p>
+    <w:p>
+      <w:pPr>
+        <w:spacing w:after="0"/>
+        <w:rPr>
+          <w:b/>
+          <w:bCs/>
+        </w:rPr>
+      </w:pPr>
+      <w:r>
+        <w:rPr>
+          <w:b/>
+          <w:bCs/>
+        </w:rPr>
+        <w:t xml:space="preserve">Paso 1: Crear el archivo </w:t>
+      </w:r>
+      <w:proofErr w:type="spellStart"/>
+      <w:r>
+        <w:rPr>
+          <w:b/>
+          <w:bCs/>
+        </w:rPr>
+        <w:t>manifest.json</w:t>
+      </w:r>
+      <w:proofErr w:type="spellEnd"/>
+    </w:p>
+    <w:p>
+      <w:pPr>
+        <w:spacing w:after="0"/>
+      </w:pPr>
+      <w:r>
+        <w:t>Crea este archivo en la raíz de tu proyecto. Es el documento de identidad de tu aplicación.</w:t>
+      </w:r>
+    </w:p>
+    <w:p>
+      <w:pPr>
+        <w:spacing w:after="0"/>
+      </w:pPr>
+      <w:r>
+        <w:t>JSON</w:t>
+      </w:r>
+    </w:p>
+    <w:p>
+      <w:pPr>
+        <w:spacing w:after="0"/>
+      </w:pPr>
+      <w:r>
+        <w:t>{</w:t>
+      </w:r>
+    </w:p>
+    <w:p>
+      <w:pPr>
+        <w:spacing w:after="0"/>
+      </w:pPr>
+      <w:r>
+        <w:t xml:space="preserve">  "</w:t>
+      </w:r>
+      <w:proofErr w:type="spellStart"/>
+      <w:r>
+        <w:t>short_name</w:t>
+      </w:r>
+      <w:proofErr w:type="spellEnd"/>
+      <w:r>
+        <w:t>": "</w:t>
+      </w:r>
+      <w:proofErr w:type="spellStart"/>
+      <w:r>
+        <w:t>MiApp</w:t>
+      </w:r>
+      <w:proofErr w:type="spellEnd"/>
+      <w:r>
+        <w:t>",</w:t>
+      </w:r>
+    </w:p>
+    <w:p>
+      <w:pPr>
+        <w:spacing w:after="0"/>
+      </w:pPr>
+      <w:r>
+        <w:t xml:space="preserve">  "</w:t>
+      </w:r>
+      <w:proofErr w:type="spellStart"/>
+      <w:r>
+        <w:t>name</w:t>
+      </w:r>
+      <w:proofErr w:type="spellEnd"/>
+      <w:r>
+        <w:t>": "Mi Aplicación de Escritorio",</w:t>
+      </w:r>
+    </w:p>
+    <w:p>
+      <w:pPr>
+        <w:spacing w:after="0"/>
+      </w:pPr>
+      <w:r>
+        <w:t xml:space="preserve">  "</w:t>
+      </w:r>
+      <w:proofErr w:type="spellStart"/>
+      <w:r>
+        <w:t>icons</w:t>
+      </w:r>
+      <w:proofErr w:type="spellEnd"/>
+      <w:r>
+        <w:t>": [</w:t>
+      </w:r>
+    </w:p>
+    <w:p>
+      <w:pPr>
+        <w:spacing w:after="0"/>
+      </w:pPr>
+      <w:r>
+        <w:t xml:space="preserve">    {</w:t>
+      </w:r>
+    </w:p>
+    <w:p>
+      <w:pPr>
+        <w:spacing w:after="0"/>
+      </w:pPr>
+      <w:r>
+        <w:t xml:space="preserve">      "</w:t>
+      </w:r>
+      <w:proofErr w:type="spellStart"/>
+      <w:r>
+        <w:t>src</w:t>
+      </w:r>
+      <w:proofErr w:type="spellEnd"/>
+      <w:r>
+        <w:t>": "icon-192.png",</w:t>
+      </w:r>
+    </w:p>
+    <w:p>
+      <w:pPr>
+        <w:spacing w:after="0"/>
+      </w:pPr>
+      <w:r>
+        <w:t xml:space="preserve">      "</w:t>
+      </w:r>
+      <w:proofErr w:type="spellStart"/>
+      <w:r>
+        <w:t>type</w:t>
+      </w:r>
+      <w:proofErr w:type="spellEnd"/>
+      <w:r>
+        <w:t>": "</w:t>
+      </w:r>
+      <w:proofErr w:type="spellStart"/>
+      <w:r>
+        <w:t>image</w:t>
+      </w:r>
+      <w:proofErr w:type="spellEnd"/>
+      <w:r>
+        <w:t>/</w:t>
+      </w:r>
+      <w:proofErr w:type="spellStart"/>
+      <w:r>
+        <w:t>png</w:t>
+      </w:r>
+      <w:proofErr w:type="spellEnd"/>
+      <w:r>
+        <w:t>",</w:t>
+      </w:r>
+    </w:p>
+    <w:p>
+      <w:pPr>
+        <w:spacing w:after="0"/>
+      </w:pPr>
+      <w:r>
+        <w:t xml:space="preserve">      "</w:t>
+      </w:r>
+      <w:proofErr w:type="spellStart"/>
+      <w:r>
+        <w:t>sizes</w:t>
+      </w:r>
+      <w:proofErr w:type="spellEnd"/>
+      <w:r>
+        <w:t>": "192x192"</w:t>
+      </w:r>
+    </w:p>
+    <w:p>
+      <w:pPr>
+        <w:spacing w:after="0"/>
+      </w:pPr>
+      <w:r>
+        <w:t xml:space="preserve">    },</w:t>
+      </w:r>
+    </w:p>
+    <w:p>
+      <w:pPr>
+        <w:spacing w:after="0"/>
+      </w:pPr>
+      <w:r>
+        <w:t xml:space="preserve">    {</w:t>
+      </w:r>
+    </w:p>
+    <w:p>
+      <w:pPr>
+        <w:spacing w:after="0"/>
+      </w:pPr>
+      <w:r>
+        <w:t xml:space="preserve">      "</w:t>
+      </w:r>
+      <w:proofErr w:type="spellStart"/>
+      <w:r>
+        <w:t>src</w:t>
+      </w:r>
+      <w:proofErr w:type="spellEnd"/>
+      <w:r>
+        <w:t>": "icon-512.png",</w:t>
+      </w:r>
+    </w:p>
+    <w:p>
+      <w:pPr>
+        <w:spacing w:after="0"/>
+      </w:pPr>
+      <w:r>
+        <w:t xml:space="preserve">      "</w:t>
+      </w:r>
+      <w:proofErr w:type="spellStart"/>
+      <w:r>
+        <w:t>type</w:t>
+      </w:r>
+      <w:proofErr w:type="spellEnd"/>
+      <w:r>
+        <w:t>": "</w:t>
+      </w:r>
+      <w:proofErr w:type="spellStart"/>
+      <w:r>
+        <w:t>image</w:t>
+      </w:r>
+      <w:proofErr w:type="spellEnd"/>
+      <w:r>
+        <w:t>/</w:t>
+      </w:r>
+      <w:proofErr w:type="spellStart"/>
+      <w:r>
+        <w:t>png</w:t>
+      </w:r>
+      <w:proofErr w:type="spellEnd"/>
+      <w:r>
+        <w:t>",</w:t>
+      </w:r>
+    </w:p>
+    <w:p>
+      <w:pPr>
+        <w:spacing w:after="0"/>
+      </w:pPr>
+      <w:r>
+        <w:t xml:space="preserve">      "</w:t>
+      </w:r>
+      <w:proofErr w:type="spellStart"/>
+      <w:r>
+        <w:t>sizes</w:t>
+      </w:r>
+      <w:proofErr w:type="spellEnd"/>
+      <w:r>
+        <w:t>": "512x512"</w:t>
+      </w:r>
+    </w:p>
+    <w:p>
+      <w:pPr>
+        <w:spacing w:after="0"/>
+      </w:pPr>
+      <w:r>
+        <w:t xml:space="preserve">    }</w:t>
+      </w:r>
+    </w:p>
+    <w:p>
+      <w:pPr>
+        <w:spacing w:after="0"/>
+      </w:pPr>
+      <w:r>
+        <w:t xml:space="preserve">  ],</w:t>
+      </w:r>
+    </w:p>
+    <w:p>
+      <w:pPr>
+        <w:spacing w:after="0"/>
+      </w:pPr>
+      <w:r>
+        <w:t xml:space="preserve">  "</w:t>
+      </w:r>
+      <w:proofErr w:type="spellStart"/>
+      <w:r>
+        <w:t>start_url</w:t>
+      </w:r>
+      <w:proofErr w:type="spellEnd"/>
+      <w:r>
+        <w:t>": "/index.html",</w:t>
+      </w:r>
+    </w:p>
+    <w:p>
+      <w:pPr>
+        <w:spacing w:after="0"/>
+      </w:pPr>
+      <w:r>
+        <w:t xml:space="preserve">  "</w:t>
+      </w:r>
+      <w:proofErr w:type="spellStart"/>
+      <w:r>
+        <w:t>background_color</w:t>
+      </w:r>
+      <w:proofErr w:type="spellEnd"/>
+      <w:r>
+        <w:t>": "#</w:t>
+      </w:r>
+      <w:proofErr w:type="spellStart"/>
+      <w:r>
+        <w:t>ffffff</w:t>
+      </w:r>
+      <w:proofErr w:type="spellEnd"/>
+      <w:r>
+        <w:t>",</w:t>
+      </w:r>
+    </w:p>
+    <w:p>
+      <w:pPr>
+        <w:spacing w:after="0"/>
+      </w:pPr>
+      <w:r>
+        <w:t xml:space="preserve">  "</w:t>
+      </w:r>
+      <w:proofErr w:type="spellStart"/>
+      <w:r>
+        <w:t>theme_color</w:t>
+      </w:r>
+      <w:proofErr w:type="spellEnd"/>
+      <w:r>
+        <w:t>": "#0078d4",</w:t>
+      </w:r>
+    </w:p>
+    <w:p>
+      <w:pPr>
+        <w:spacing w:after="0"/>
+      </w:pPr>
+      <w:r>
+        <w:lastRenderedPageBreak/>
+        <w:t xml:space="preserve">  "</w:t>
+      </w:r>
+      <w:proofErr w:type="spellStart"/>
+      <w:r>
+        <w:t>display</w:t>
+      </w:r>
+      <w:proofErr w:type="spellEnd"/>
+      <w:r>
+        <w:t>": "</w:t>
+      </w:r>
+      <w:proofErr w:type="spellStart"/>
+      <w:r>
+        <w:t>standalone</w:t>
+      </w:r>
+      <w:proofErr w:type="spellEnd"/>
+      <w:r>
+        <w:t>",</w:t>
+      </w:r>
+    </w:p>
+    <w:p>
+      <w:pPr>
+        <w:spacing w:after="0"/>
+      </w:pPr>
+      <w:r>
+        <w:t xml:space="preserve">  "</w:t>
+      </w:r>
+      <w:proofErr w:type="spellStart"/>
+      <w:r>
+        <w:t>orientation</w:t>
+      </w:r>
+      <w:proofErr w:type="spellEnd"/>
+      <w:r>
+        <w:t>": "</w:t>
+      </w:r>
+      <w:proofErr w:type="spellStart"/>
+      <w:r>
+        <w:t>portrait</w:t>
+      </w:r>
+      <w:proofErr w:type="spellEnd"/>
+      <w:r>
+        <w:t>"</w:t>
+      </w:r>
+    </w:p>
+    <w:p>
+      <w:pPr>
+        <w:spacing w:after="0"/>
+      </w:pPr>
+      <w:r>
+        <w:t>}</w:t>
+      </w:r>
+    </w:p>
+    <w:p>
+      <w:r>
+        <w:rPr>
+          <w:b/>
+          <w:bCs/>
+        </w:rPr>
+        <w:t>Nota clave:</w:t>
+      </w:r>
+      <w:r>
+        <w:t xml:space="preserve"> La propiedad "</w:t>
+      </w:r>
+      <w:proofErr w:type="spellStart"/>
+      <w:r>
+        <w:t>display</w:t>
+      </w:r>
+      <w:proofErr w:type="spellEnd"/>
+      <w:r>
+        <w:t>": "</w:t>
+      </w:r>
+      <w:proofErr w:type="spellStart"/>
+      <w:r>
+        <w:t>standalone</w:t>
+      </w:r>
+      <w:proofErr w:type="spellEnd"/>
+      <w:r>
+        <w:t xml:space="preserve">" es la que hace que la aplicación se abra en su propia ventana oculta, eliminando la barra de direcciones del navegador para que parezca una </w:t>
+      </w:r>
+      <w:proofErr w:type="spellStart"/>
+      <w:r>
+        <w:t>app</w:t>
+      </w:r>
+      <w:proofErr w:type="spellEnd"/>
+      <w:r>
+        <w:t xml:space="preserve"> de escritorio nativa.</w:t>
+      </w:r>
+    </w:p>
+    <w:p>
+      <w:pPr>
+        <w:rPr>
+          <w:b/>
+          <w:bCs/>
+        </w:rPr>
+      </w:pPr>
+      <w:r>
+        <w:rPr>
+          <w:b/>
+          <w:bCs/>
+        </w:rPr>
+        <w:t xml:space="preserve">Paso 2: Vincular el </w:t>
+      </w:r>
+      <w:proofErr w:type="spellStart"/>
+      <w:r>
+        <w:rPr>
+          <w:b/>
+          <w:bCs/>
+        </w:rPr>
+        <w:t>Manifest</w:t>
+      </w:r>
+      <w:proofErr w:type="spellEnd"/>
+      <w:r>
+        <w:rPr>
+          <w:b/>
+          <w:bCs/>
+        </w:rPr>
+        <w:t xml:space="preserve"> en tu HTML</w:t>
+      </w:r>
+    </w:p>
+    <w:p>
+      <w:r>
+        <w:t>En el &lt;head&gt; de tu archivo index.html, debes enlazar el archivo que acabas de crear:</w:t>
+      </w:r>
+    </w:p>
+    <w:p>
+      <w:r>
+        <w:t>HTML</w:t>
+      </w:r>
+    </w:p>
+    <w:p>
+      <w:r>
+        <w:t xml:space="preserve">&lt;link </w:t>
+      </w:r>
+      <w:proofErr w:type="spellStart"/>
+      <w:r>
+        <w:t>rel</w:t>
+      </w:r>
+      <w:proofErr w:type="spellEnd"/>
+      <w:r>
+        <w:t>="</w:t>
+      </w:r>
+      <w:proofErr w:type="spellStart"/>
+      <w:r>
+        <w:t>manifest</w:t>
+      </w:r>
+      <w:proofErr w:type="spellEnd"/>
+      <w:r>
+        <w:t xml:space="preserve">" </w:t>
+      </w:r>
+      <w:proofErr w:type="spellStart"/>
+      <w:r>
+        <w:t>href</w:t>
+      </w:r>
+      <w:proofErr w:type="spellEnd"/>
+      <w:r>
+        <w:t>="/</w:t>
+      </w:r>
+      <w:proofErr w:type="spellStart"/>
+      <w:r>
+        <w:t>manifest.json</w:t>
+      </w:r>
+      <w:proofErr w:type="spellEnd"/>
+      <w:r>
+        <w:t>"&gt;</w:t>
+      </w:r>
+    </w:p>
+    <w:p>
+      <w:r>
+        <w:t xml:space="preserve">&lt;meta </w:t>
+      </w:r>
+      <w:proofErr w:type="spellStart"/>
+      <w:r>
+        <w:t>name</w:t>
+      </w:r>
+      <w:proofErr w:type="spellEnd"/>
+      <w:r>
+        <w:t>="</w:t>
+      </w:r>
+      <w:proofErr w:type="spellStart"/>
+      <w:r>
+        <w:t>theme</w:t>
+      </w:r>
+      <w:proofErr w:type="spellEnd"/>
+      <w:r>
+        <w:t xml:space="preserve">-color" </w:t>
+      </w:r>
+      <w:proofErr w:type="spellStart"/>
+      <w:r>
+        <w:t>content</w:t>
+      </w:r>
+      <w:proofErr w:type="spellEnd"/>
+      <w:r>
+        <w:t>="#0078d4"&gt;</w:t>
+      </w:r>
+    </w:p>
+    <w:p>
+      <w:pPr>
+        <w:rPr>
+          <w:b/>
+          <w:bCs/>
+        </w:rPr>
+      </w:pPr>
+      <w:r>
+        <w:rPr>
+          <w:b/>
+          <w:bCs/>
+        </w:rPr>
+        <w:t xml:space="preserve">Paso 3: Crear el </w:t>
+      </w:r>
+      <w:proofErr w:type="spellStart"/>
+      <w:r>
+        <w:rPr>
+          <w:b/>
+          <w:bCs/>
+        </w:rPr>
+        <w:t>Service</w:t>
+      </w:r>
+      <w:proofErr w:type="spellEnd"/>
+      <w:r>
+        <w:rPr>
+          <w:b/>
+          <w:bCs/>
+        </w:rPr>
+        <w:t xml:space="preserve"> </w:t>
+      </w:r>
+      <w:proofErr w:type="spellStart"/>
+      <w:r>
+        <w:rPr>
+          <w:b/>
+          <w:bCs/>
+        </w:rPr>
+        <w:t>Worker</w:t>
+      </w:r>
+      <w:proofErr w:type="spellEnd"/>
+      <w:r>
+        <w:rPr>
+          <w:b/>
+          <w:bCs/>
+        </w:rPr>
+        <w:t xml:space="preserve"> (sw.js)</w:t>
+      </w:r>
+    </w:p>
+    <w:p>
+      <w:r>
+        <w:t xml:space="preserve">El </w:t>
+      </w:r>
+      <w:proofErr w:type="spellStart"/>
+      <w:r>
+        <w:t>Service</w:t>
+      </w:r>
+      <w:proofErr w:type="spellEnd"/>
+      <w:r>
+        <w:t xml:space="preserve"> </w:t>
+      </w:r>
+      <w:proofErr w:type="spellStart"/>
+      <w:r>
+        <w:t>Worker</w:t>
+      </w:r>
+      <w:proofErr w:type="spellEnd"/>
+      <w:r>
+        <w:t xml:space="preserve"> es el motor que gestiona la caché y permite que la </w:t>
+      </w:r>
+      <w:proofErr w:type="spellStart"/>
+      <w:r>
+        <w:t>app</w:t>
+      </w:r>
+      <w:proofErr w:type="spellEnd"/>
+      <w:r>
+        <w:t xml:space="preserve"> cargue instantáneamente. Crea un archivo llamado sw.js en la raíz de tu proyecto con este código básico de almacenamiento en caché:</w:t>
+      </w:r>
+    </w:p>
+    <w:p>
+      <w:pPr>
+        <w:spacing w:after="0"/>
+      </w:pPr>
+      <w:r>
+        <w:t>JavaScript</w:t>
+      </w:r>
+    </w:p>
+    <w:p>
+      <w:pPr>
+        <w:spacing w:after="0"/>
+      </w:pPr>
+      <w:proofErr w:type="spellStart"/>
       <w:proofErr w:type="gramStart"/>
       <w:r>
-        <w:t>la</w:t>
-      </w:r>
+        <w:t>const</w:t>
+      </w:r>
+      <w:proofErr w:type="spellEnd"/>
       <w:proofErr w:type="gramEnd"/>
       <w:r>
-        <w:t xml:space="preserve"> unidad </w:t>
-      </w:r>
-      <w:r>
-        <w:t xml:space="preserve">para editarla, </w:t>
-      </w:r>
-      <w:r>
-        <w:t xml:space="preserve">ya que por el momento no me la muestra, para realizar modificaciones. </w:t>
-      </w:r>
-    </w:p>
-    <w:p>
-      <w:pPr>
-        <w:tabs>
-          <w:tab w:val="left" w:pos="1792"/>
-        </w:tabs>
-        <w:rPr>
-          <w:b/>
-          <w:lang w:val="es-ES"/>
-        </w:rPr>
-      </w:pPr>
-    </w:p>
-    <w:p>
-      <w:pPr>
-        <w:rPr>
-          <w:lang w:val="es-ES"/>
-        </w:rPr>
-      </w:pPr>
-      <w:r>
-        <w:rPr>
-          <w:lang w:val="es-ES"/>
-        </w:rPr>
-        <w:t>Necesito Realizar cie</w:t>
-      </w:r>
-      <w:r>
-        <w:rPr>
-          <w:lang w:val="es-ES"/>
-        </w:rPr>
-        <w:t>r</w:t>
-      </w:r>
-      <w:r>
-        <w:rPr>
-          <w:lang w:val="es-ES"/>
-        </w:rPr>
-        <w:t>re de cuatrimestre</w:t>
-      </w:r>
+        <w:t xml:space="preserve"> CACHE_NAME = 'v1_cache_miapp';</w:t>
+      </w:r>
+    </w:p>
+    <w:p>
+      <w:pPr>
+        <w:spacing w:after="0"/>
+      </w:pPr>
+      <w:r>
+        <w:t>// Archivos esenciales que quieres que funcionen incluso sin internet</w:t>
+      </w:r>
+    </w:p>
+    <w:p>
+      <w:pPr>
+        <w:spacing w:after="0"/>
+      </w:pPr>
+      <w:proofErr w:type="spellStart"/>
+      <w:proofErr w:type="gramStart"/>
+      <w:r>
+        <w:t>const</w:t>
+      </w:r>
+      <w:proofErr w:type="spellEnd"/>
+      <w:proofErr w:type="gramEnd"/>
+      <w:r>
+        <w:t xml:space="preserve"> </w:t>
+      </w:r>
+      <w:proofErr w:type="spellStart"/>
+      <w:r>
+        <w:t>urlsToCache</w:t>
+      </w:r>
+      <w:proofErr w:type="spellEnd"/>
+      <w:r>
+        <w:t xml:space="preserve"> = [</w:t>
+      </w:r>
+    </w:p>
+    <w:p>
+      <w:pPr>
+        <w:spacing w:after="0"/>
+      </w:pPr>
+      <w:r>
+        <w:t xml:space="preserve">  '/',</w:t>
+      </w:r>
+    </w:p>
+    <w:p>
+      <w:pPr>
+        <w:spacing w:after="0"/>
+      </w:pPr>
+      <w:r>
+        <w:t xml:space="preserve">  '/index.html',</w:t>
+      </w:r>
+    </w:p>
+    <w:p>
+      <w:pPr>
+        <w:spacing w:after="0"/>
+      </w:pPr>
+      <w:r>
+        <w:t xml:space="preserve">  '/styles.css',</w:t>
+      </w:r>
+    </w:p>
+    <w:p>
+      <w:pPr>
+        <w:spacing w:after="0"/>
+      </w:pPr>
+      <w:r>
+        <w:t xml:space="preserve">  '/script.js',</w:t>
+      </w:r>
+    </w:p>
+    <w:p>
+      <w:pPr>
+        <w:spacing w:after="0"/>
+      </w:pPr>
+      <w:r>
+        <w:t xml:space="preserve">  '/icon-192.png'</w:t>
+      </w:r>
+    </w:p>
+    <w:p>
+      <w:pPr>
+        <w:spacing w:after="0"/>
+      </w:pPr>
+      <w:r>
+        <w:t>];</w:t>
+      </w:r>
+    </w:p>
+    <w:p>
+      <w:pPr>
+        <w:spacing w:after="0"/>
+      </w:pPr>
+    </w:p>
+    <w:p>
+      <w:pPr>
+        <w:spacing w:after="0"/>
+      </w:pPr>
+      <w:r>
+        <w:t>// Evento de instalación: Guarda los archivos en la caché del navegador</w:t>
+      </w:r>
+    </w:p>
+    <w:p>
+      <w:pPr>
+        <w:spacing w:after="0"/>
+      </w:pPr>
+      <w:proofErr w:type="spellStart"/>
+      <w:proofErr w:type="gramStart"/>
+      <w:r>
+        <w:t>self.addEventListener</w:t>
+      </w:r>
+      <w:proofErr w:type="spellEnd"/>
+      <w:r>
+        <w:t>(</w:t>
+      </w:r>
+      <w:proofErr w:type="gramEnd"/>
+      <w:r>
+        <w:t>'</w:t>
+      </w:r>
+      <w:proofErr w:type="spellStart"/>
+      <w:r>
+        <w:t>install</w:t>
+      </w:r>
+      <w:proofErr w:type="spellEnd"/>
+      <w:r>
+        <w:t>', e =&gt; {</w:t>
+      </w:r>
+    </w:p>
+    <w:p>
+      <w:pPr>
+        <w:spacing w:after="0"/>
+      </w:pPr>
+      <w:r>
+        <w:t xml:space="preserve">  </w:t>
+      </w:r>
+      <w:proofErr w:type="spellStart"/>
+      <w:proofErr w:type="gramStart"/>
+      <w:r>
+        <w:t>e.waitUntil</w:t>
+      </w:r>
+      <w:proofErr w:type="spellEnd"/>
+      <w:r>
+        <w:t>(</w:t>
+      </w:r>
+      <w:proofErr w:type="gramEnd"/>
+    </w:p>
+    <w:p>
+      <w:pPr>
+        <w:spacing w:after="0"/>
+      </w:pPr>
+      <w:r>
+        <w:t xml:space="preserve">    </w:t>
+      </w:r>
+      <w:proofErr w:type="spellStart"/>
+      <w:proofErr w:type="gramStart"/>
+      <w:r>
+        <w:t>caches.open</w:t>
+      </w:r>
+      <w:proofErr w:type="spellEnd"/>
+      <w:r>
+        <w:t>(</w:t>
+      </w:r>
+      <w:proofErr w:type="gramEnd"/>
+      <w:r>
+        <w:t>CACHE_NAME)</w:t>
+      </w:r>
+    </w:p>
+    <w:p>
+      <w:pPr>
+        <w:spacing w:after="0"/>
+      </w:pPr>
+      <w:r>
+        <w:t xml:space="preserve">      .</w:t>
+      </w:r>
+      <w:proofErr w:type="spellStart"/>
+      <w:proofErr w:type="gramStart"/>
+      <w:r>
+        <w:t>then</w:t>
+      </w:r>
+      <w:proofErr w:type="spellEnd"/>
+      <w:r>
+        <w:t>(</w:t>
+      </w:r>
+      <w:proofErr w:type="gramEnd"/>
+      <w:r>
+        <w:t>cache =&gt; {</w:t>
+      </w:r>
+    </w:p>
+    <w:p>
+      <w:pPr>
+        <w:spacing w:after="0"/>
+      </w:pPr>
+      <w:r>
+        <w:t xml:space="preserve">        </w:t>
+      </w:r>
+      <w:proofErr w:type="spellStart"/>
+      <w:proofErr w:type="gramStart"/>
+      <w:r>
+        <w:t>return</w:t>
+      </w:r>
+      <w:proofErr w:type="spellEnd"/>
+      <w:proofErr w:type="gramEnd"/>
+      <w:r>
+        <w:t xml:space="preserve"> </w:t>
+      </w:r>
+      <w:proofErr w:type="spellStart"/>
+      <w:r>
+        <w:t>cache.addAll</w:t>
+      </w:r>
+      <w:proofErr w:type="spellEnd"/>
+      <w:r>
+        <w:t>(</w:t>
+      </w:r>
+      <w:proofErr w:type="spellStart"/>
+      <w:r>
+        <w:t>urlsToCache</w:t>
+      </w:r>
+      <w:proofErr w:type="spellEnd"/>
+      <w:r>
+        <w:t>);</w:t>
+      </w:r>
+    </w:p>
+    <w:p>
+      <w:pPr>
+        <w:spacing w:after="0"/>
+      </w:pPr>
+      <w:r>
+        <w:t xml:space="preserve">      })</w:t>
+      </w:r>
+    </w:p>
+    <w:p>
+      <w:pPr>
+        <w:spacing w:after="0"/>
+      </w:pPr>
+      <w:r>
+        <w:t xml:space="preserve">      .</w:t>
+      </w:r>
+      <w:proofErr w:type="spellStart"/>
+      <w:proofErr w:type="gramStart"/>
+      <w:r>
+        <w:t>then</w:t>
+      </w:r>
+      <w:proofErr w:type="spellEnd"/>
+      <w:r>
+        <w:t>(</w:t>
+      </w:r>
+      <w:proofErr w:type="gramEnd"/>
+      <w:r>
+        <w:t xml:space="preserve">() =&gt; </w:t>
+      </w:r>
+      <w:proofErr w:type="spellStart"/>
+      <w:r>
+        <w:t>self.skipWaiting</w:t>
+      </w:r>
+      <w:proofErr w:type="spellEnd"/>
+      <w:r>
+        <w:t>())</w:t>
+      </w:r>
+    </w:p>
+    <w:p>
+      <w:pPr>
+        <w:spacing w:after="0"/>
+      </w:pPr>
+      <w:r>
+        <w:t xml:space="preserve">  );</w:t>
+      </w:r>
+    </w:p>
+    <w:p>
+      <w:pPr>
+        <w:spacing w:after="0"/>
+      </w:pPr>
+      <w:r>
+        <w:t>});</w:t>
+      </w:r>
+    </w:p>
+    <w:p>
+      <w:pPr>
+        <w:spacing w:after="0"/>
+      </w:pPr>
+    </w:p>
+    <w:p>
+      <w:pPr>
+        <w:spacing w:after="0"/>
+      </w:pPr>
+      <w:r>
+        <w:t>// Evento de activación: Limpia cachés antiguas</w:t>
+      </w:r>
+    </w:p>
+    <w:p>
+      <w:pPr>
+        <w:spacing w:after="0"/>
+      </w:pPr>
+      <w:proofErr w:type="spellStart"/>
+      <w:proofErr w:type="gramStart"/>
+      <w:r>
+        <w:t>self.addEventListener</w:t>
+      </w:r>
+      <w:proofErr w:type="spellEnd"/>
+      <w:r>
+        <w:t>(</w:t>
+      </w:r>
+      <w:proofErr w:type="gramEnd"/>
+      <w:r>
+        <w:t>'</w:t>
+      </w:r>
+      <w:proofErr w:type="spellStart"/>
+      <w:r>
+        <w:t>activate</w:t>
+      </w:r>
+      <w:proofErr w:type="spellEnd"/>
+      <w:r>
+        <w:t>', e =&gt; {</w:t>
+      </w:r>
+    </w:p>
+    <w:p>
+      <w:pPr>
+        <w:spacing w:after="0"/>
+      </w:pPr>
+      <w:r>
+        <w:t xml:space="preserve">  </w:t>
+      </w:r>
+      <w:proofErr w:type="spellStart"/>
+      <w:proofErr w:type="gramStart"/>
+      <w:r>
+        <w:t>e.waitUntil</w:t>
+      </w:r>
+      <w:proofErr w:type="spellEnd"/>
+      <w:r>
+        <w:t>(</w:t>
+      </w:r>
+      <w:proofErr w:type="gramEnd"/>
+    </w:p>
+    <w:p>
+      <w:pPr>
+        <w:spacing w:after="0"/>
+      </w:pPr>
+      <w:r>
+        <w:lastRenderedPageBreak/>
+        <w:t xml:space="preserve">    </w:t>
+      </w:r>
+      <w:proofErr w:type="spellStart"/>
+      <w:proofErr w:type="gramStart"/>
+      <w:r>
+        <w:t>caches.keys</w:t>
+      </w:r>
+      <w:proofErr w:type="spellEnd"/>
+      <w:r>
+        <w:t>(</w:t>
+      </w:r>
+      <w:proofErr w:type="gramEnd"/>
+      <w:r>
+        <w:t>).</w:t>
+      </w:r>
+      <w:proofErr w:type="spellStart"/>
+      <w:r>
+        <w:t>then</w:t>
+      </w:r>
+      <w:proofErr w:type="spellEnd"/>
+      <w:r>
+        <w:t>(</w:t>
+      </w:r>
+      <w:proofErr w:type="spellStart"/>
+      <w:r>
+        <w:t>cacheNames</w:t>
+      </w:r>
+      <w:proofErr w:type="spellEnd"/>
+      <w:r>
+        <w:t xml:space="preserve"> =&gt; {</w:t>
+      </w:r>
+    </w:p>
+    <w:p>
+      <w:pPr>
+        <w:spacing w:after="0"/>
+      </w:pPr>
+      <w:r>
+        <w:t xml:space="preserve">      </w:t>
+      </w:r>
+      <w:proofErr w:type="spellStart"/>
+      <w:proofErr w:type="gramStart"/>
+      <w:r>
+        <w:t>return</w:t>
+      </w:r>
+      <w:proofErr w:type="spellEnd"/>
+      <w:proofErr w:type="gramEnd"/>
+      <w:r>
+        <w:t xml:space="preserve"> </w:t>
+      </w:r>
+      <w:proofErr w:type="spellStart"/>
+      <w:r>
+        <w:t>Promise.all</w:t>
+      </w:r>
+      <w:proofErr w:type="spellEnd"/>
+      <w:r>
+        <w:t>(</w:t>
+      </w:r>
+    </w:p>
+    <w:p>
+      <w:pPr>
+        <w:spacing w:after="0"/>
+      </w:pPr>
+      <w:r>
+        <w:t xml:space="preserve">        </w:t>
+      </w:r>
+      <w:proofErr w:type="spellStart"/>
+      <w:proofErr w:type="gramStart"/>
+      <w:r>
+        <w:t>cacheNames.map</w:t>
+      </w:r>
+      <w:proofErr w:type="spellEnd"/>
+      <w:r>
+        <w:t>(</w:t>
+      </w:r>
+      <w:proofErr w:type="gramEnd"/>
+      <w:r>
+        <w:t>cache =&gt; {</w:t>
+      </w:r>
+    </w:p>
+    <w:p>
+      <w:pPr>
+        <w:spacing w:after="0"/>
+      </w:pPr>
+      <w:r>
+        <w:t xml:space="preserve">          </w:t>
+      </w:r>
+      <w:proofErr w:type="spellStart"/>
+      <w:proofErr w:type="gramStart"/>
+      <w:r>
+        <w:t>if</w:t>
+      </w:r>
+      <w:proofErr w:type="spellEnd"/>
+      <w:proofErr w:type="gramEnd"/>
+      <w:r>
+        <w:t xml:space="preserve"> (cache !== CACHE_NAME) {</w:t>
+      </w:r>
+    </w:p>
+    <w:p>
+      <w:pPr>
+        <w:spacing w:after="0"/>
+      </w:pPr>
+      <w:r>
+        <w:t xml:space="preserve">            </w:t>
+      </w:r>
+      <w:proofErr w:type="spellStart"/>
+      <w:proofErr w:type="gramStart"/>
+      <w:r>
+        <w:t>return</w:t>
+      </w:r>
+      <w:proofErr w:type="spellEnd"/>
+      <w:proofErr w:type="gramEnd"/>
+      <w:r>
+        <w:t xml:space="preserve"> </w:t>
+      </w:r>
+      <w:proofErr w:type="spellStart"/>
+      <w:r>
+        <w:t>caches.delete</w:t>
+      </w:r>
+      <w:proofErr w:type="spellEnd"/>
+      <w:r>
+        <w:t>(cache);</w:t>
+      </w:r>
+    </w:p>
+    <w:p>
+      <w:pPr>
+        <w:spacing w:after="0"/>
+      </w:pPr>
+      <w:r>
+        <w:t xml:space="preserve">          }</w:t>
+      </w:r>
+    </w:p>
+    <w:p>
+      <w:pPr>
+        <w:spacing w:after="0"/>
+      </w:pPr>
+      <w:r>
+        <w:t xml:space="preserve">        })</w:t>
+      </w:r>
+    </w:p>
+    <w:p>
+      <w:pPr>
+        <w:spacing w:after="0"/>
+      </w:pPr>
+      <w:r>
+        <w:t xml:space="preserve">      );</w:t>
+      </w:r>
+    </w:p>
+    <w:p>
+      <w:pPr>
+        <w:spacing w:after="0"/>
+      </w:pPr>
+      <w:r>
+        <w:t xml:space="preserve">    })</w:t>
+      </w:r>
+    </w:p>
+    <w:p>
+      <w:pPr>
+        <w:spacing w:after="0"/>
+      </w:pPr>
+      <w:r>
+        <w:t xml:space="preserve">  );</w:t>
+      </w:r>
+    </w:p>
+    <w:p>
+      <w:pPr>
+        <w:spacing w:after="0"/>
+      </w:pPr>
+      <w:r>
+        <w:t>});</w:t>
+      </w:r>
+    </w:p>
+    <w:p>
+      <w:pPr>
+        <w:spacing w:after="0"/>
+      </w:pPr>
+    </w:p>
+    <w:p>
+      <w:pPr>
+        <w:spacing w:after="0"/>
+      </w:pPr>
+      <w:r>
+        <w:t xml:space="preserve">// Evento </w:t>
+      </w:r>
+      <w:proofErr w:type="spellStart"/>
+      <w:r>
+        <w:t>fetch</w:t>
+      </w:r>
+      <w:proofErr w:type="spellEnd"/>
+      <w:r>
+        <w:t>: Sirve el contenido desde la caché si no hay internet</w:t>
+      </w:r>
+    </w:p>
+    <w:p>
+      <w:pPr>
+        <w:spacing w:after="0"/>
+      </w:pPr>
+      <w:proofErr w:type="spellStart"/>
+      <w:proofErr w:type="gramStart"/>
+      <w:r>
+        <w:t>self.addEventListener</w:t>
+      </w:r>
+      <w:proofErr w:type="spellEnd"/>
+      <w:r>
+        <w:t>(</w:t>
+      </w:r>
+      <w:proofErr w:type="gramEnd"/>
+      <w:r>
+        <w:t>'</w:t>
+      </w:r>
+      <w:proofErr w:type="spellStart"/>
+      <w:r>
+        <w:t>fetch</w:t>
+      </w:r>
+      <w:proofErr w:type="spellEnd"/>
+      <w:r>
+        <w:t>', e =&gt; {</w:t>
+      </w:r>
+    </w:p>
+    <w:p>
+      <w:pPr>
+        <w:spacing w:after="0"/>
+      </w:pPr>
+      <w:r>
+        <w:t xml:space="preserve">  </w:t>
+      </w:r>
+      <w:proofErr w:type="spellStart"/>
+      <w:proofErr w:type="gramStart"/>
+      <w:r>
+        <w:t>e.respondWith</w:t>
+      </w:r>
+      <w:proofErr w:type="spellEnd"/>
+      <w:r>
+        <w:t>(</w:t>
+      </w:r>
+      <w:proofErr w:type="gramEnd"/>
+    </w:p>
+    <w:p>
+      <w:pPr>
+        <w:spacing w:after="0"/>
+      </w:pPr>
+      <w:r>
+        <w:t xml:space="preserve">    </w:t>
+      </w:r>
+      <w:proofErr w:type="spellStart"/>
+      <w:proofErr w:type="gramStart"/>
+      <w:r>
+        <w:t>caches.match</w:t>
+      </w:r>
+      <w:proofErr w:type="spellEnd"/>
+      <w:r>
+        <w:t>(</w:t>
+      </w:r>
+      <w:proofErr w:type="spellStart"/>
+      <w:proofErr w:type="gramEnd"/>
+      <w:r>
+        <w:t>e.request</w:t>
+      </w:r>
+      <w:proofErr w:type="spellEnd"/>
+      <w:r>
+        <w:t>)</w:t>
+      </w:r>
+    </w:p>
+    <w:p>
+      <w:pPr>
+        <w:spacing w:after="0"/>
+      </w:pPr>
+      <w:r>
+        <w:t xml:space="preserve">      .</w:t>
+      </w:r>
+      <w:proofErr w:type="spellStart"/>
+      <w:proofErr w:type="gramStart"/>
+      <w:r>
+        <w:t>then</w:t>
+      </w:r>
+      <w:proofErr w:type="spellEnd"/>
+      <w:r>
+        <w:t>(</w:t>
+      </w:r>
+      <w:proofErr w:type="gramEnd"/>
+      <w:r>
+        <w:t>res =&gt; {</w:t>
+      </w:r>
+    </w:p>
+    <w:p>
+      <w:pPr>
+        <w:spacing w:after="0"/>
+      </w:pPr>
+      <w:r>
+        <w:t xml:space="preserve">        </w:t>
+      </w:r>
+      <w:proofErr w:type="spellStart"/>
+      <w:proofErr w:type="gramStart"/>
+      <w:r>
+        <w:t>if</w:t>
+      </w:r>
+      <w:proofErr w:type="spellEnd"/>
+      <w:proofErr w:type="gramEnd"/>
+      <w:r>
+        <w:t xml:space="preserve"> (res) {</w:t>
+      </w:r>
+    </w:p>
+    <w:p>
+      <w:pPr>
+        <w:spacing w:after="0"/>
+      </w:pPr>
+      <w:r>
+        <w:t xml:space="preserve">          </w:t>
+      </w:r>
+      <w:proofErr w:type="spellStart"/>
+      <w:proofErr w:type="gramStart"/>
+      <w:r>
+        <w:t>return</w:t>
+      </w:r>
+      <w:proofErr w:type="spellEnd"/>
+      <w:proofErr w:type="gramEnd"/>
+      <w:r>
+        <w:t xml:space="preserve"> res; // Devuelve lo que está en caché</w:t>
+      </w:r>
+    </w:p>
+    <w:p>
+      <w:pPr>
+        <w:spacing w:after="0"/>
+      </w:pPr>
+      <w:r>
+        <w:t xml:space="preserve">        }</w:t>
+      </w:r>
+    </w:p>
+    <w:p>
+      <w:pPr>
+        <w:spacing w:after="0"/>
+      </w:pPr>
+      <w:r>
+        <w:t xml:space="preserve">        </w:t>
+      </w:r>
+      <w:proofErr w:type="spellStart"/>
+      <w:proofErr w:type="gramStart"/>
+      <w:r>
+        <w:t>return</w:t>
+      </w:r>
+      <w:proofErr w:type="spellEnd"/>
+      <w:proofErr w:type="gramEnd"/>
+      <w:r>
+        <w:t xml:space="preserve"> </w:t>
+      </w:r>
+      <w:proofErr w:type="spellStart"/>
+      <w:r>
+        <w:t>fetch</w:t>
+      </w:r>
+      <w:proofErr w:type="spellEnd"/>
+      <w:r>
+        <w:t>(</w:t>
+      </w:r>
+      <w:proofErr w:type="spellStart"/>
+      <w:r>
+        <w:t>e.request</w:t>
+      </w:r>
+      <w:proofErr w:type="spellEnd"/>
+      <w:r>
+        <w:t>); // Si no está en caché, va a internet</w:t>
+      </w:r>
+    </w:p>
+    <w:p>
+      <w:pPr>
+        <w:spacing w:after="0"/>
+      </w:pPr>
+      <w:r>
+        <w:t xml:space="preserve">      })</w:t>
+      </w:r>
+    </w:p>
+    <w:p>
+      <w:pPr>
+        <w:spacing w:after="0"/>
+      </w:pPr>
+      <w:r>
+        <w:t xml:space="preserve">  );</w:t>
+      </w:r>
+    </w:p>
+    <w:p>
+      <w:pPr>
+        <w:spacing w:after="0"/>
+      </w:pPr>
+      <w:r>
+        <w:t>});</w:t>
+      </w:r>
+    </w:p>
+    <w:p>
+      <w:pPr>
+        <w:rPr>
+          <w:b/>
+          <w:bCs/>
+        </w:rPr>
+      </w:pPr>
+      <w:r>
+        <w:rPr>
+          <w:b/>
+          <w:bCs/>
+        </w:rPr>
+        <w:t xml:space="preserve">Paso 4: Registrar el </w:t>
+      </w:r>
+      <w:proofErr w:type="spellStart"/>
+      <w:r>
+        <w:rPr>
+          <w:b/>
+          <w:bCs/>
+        </w:rPr>
+        <w:t>Service</w:t>
+      </w:r>
+      <w:proofErr w:type="spellEnd"/>
+      <w:r>
+        <w:rPr>
+          <w:b/>
+          <w:bCs/>
+        </w:rPr>
+        <w:t xml:space="preserve"> </w:t>
+      </w:r>
+      <w:proofErr w:type="spellStart"/>
+      <w:r>
+        <w:rPr>
+          <w:b/>
+          <w:bCs/>
+        </w:rPr>
+        <w:t>Worker</w:t>
+      </w:r>
+      <w:proofErr w:type="spellEnd"/>
+      <w:r>
+        <w:rPr>
+          <w:b/>
+          <w:bCs/>
+        </w:rPr>
+        <w:t xml:space="preserve"> en tu HTML/JS</w:t>
+      </w:r>
+    </w:p>
+    <w:p>
+      <w:r>
+        <w:t xml:space="preserve">Por último, necesitas decirle a tu aplicación web que active ese </w:t>
+      </w:r>
+      <w:proofErr w:type="spellStart"/>
+      <w:r>
+        <w:t>Service</w:t>
+      </w:r>
+      <w:proofErr w:type="spellEnd"/>
+      <w:r>
+        <w:t xml:space="preserve"> </w:t>
+      </w:r>
+      <w:proofErr w:type="spellStart"/>
+      <w:r>
+        <w:t>Worker</w:t>
+      </w:r>
+      <w:proofErr w:type="spellEnd"/>
+      <w:r>
+        <w:t>. Añade este fragmento de código al final de tu archivo index.html o en tu archivo principal de JavaScript (script.js):</w:t>
+      </w:r>
+    </w:p>
+    <w:p>
+      <w:r>
+        <w:t>JavaScript</w:t>
+      </w:r>
+    </w:p>
+    <w:p>
+      <w:proofErr w:type="spellStart"/>
+      <w:proofErr w:type="gramStart"/>
+      <w:r>
+        <w:t>if</w:t>
+      </w:r>
+      <w:proofErr w:type="spellEnd"/>
+      <w:proofErr w:type="gramEnd"/>
+      <w:r>
+        <w:t xml:space="preserve"> ('</w:t>
+      </w:r>
+      <w:proofErr w:type="spellStart"/>
+      <w:r>
+        <w:t>serviceWorker</w:t>
+      </w:r>
+      <w:proofErr w:type="spellEnd"/>
+      <w:r>
+        <w:t xml:space="preserve">' in </w:t>
+      </w:r>
+      <w:proofErr w:type="spellStart"/>
+      <w:r>
+        <w:t>navigator</w:t>
+      </w:r>
+      <w:proofErr w:type="spellEnd"/>
+      <w:r>
+        <w:t>) {</w:t>
+      </w:r>
+    </w:p>
+    <w:p>
+      <w:r>
+        <w:t xml:space="preserve">  </w:t>
+      </w:r>
+      <w:proofErr w:type="spellStart"/>
+      <w:proofErr w:type="gramStart"/>
+      <w:r>
+        <w:t>window.addEventListener</w:t>
+      </w:r>
+      <w:proofErr w:type="spellEnd"/>
+      <w:r>
+        <w:t>(</w:t>
+      </w:r>
+      <w:proofErr w:type="gramEnd"/>
+      <w:r>
+        <w:t>'load', () =&gt; {</w:t>
+      </w:r>
+    </w:p>
+    <w:p>
+      <w:r>
+        <w:t xml:space="preserve">    </w:t>
+      </w:r>
+      <w:proofErr w:type="spellStart"/>
+      <w:proofErr w:type="gramStart"/>
+      <w:r>
+        <w:t>navigator.serviceWorker.register</w:t>
+      </w:r>
+      <w:proofErr w:type="spellEnd"/>
+      <w:r>
+        <w:t>(</w:t>
+      </w:r>
+      <w:proofErr w:type="gramEnd"/>
+      <w:r>
+        <w:t>'/sw.js')</w:t>
+      </w:r>
+    </w:p>
+    <w:p>
+      <w:r>
+        <w:t xml:space="preserve">      .</w:t>
+      </w:r>
+      <w:proofErr w:type="spellStart"/>
+      <w:proofErr w:type="gramStart"/>
+      <w:r>
+        <w:t>then</w:t>
+      </w:r>
+      <w:proofErr w:type="spellEnd"/>
+      <w:r>
+        <w:t>(</w:t>
+      </w:r>
+      <w:proofErr w:type="spellStart"/>
+      <w:proofErr w:type="gramEnd"/>
+      <w:r>
+        <w:t>reg</w:t>
+      </w:r>
+      <w:proofErr w:type="spellEnd"/>
+      <w:r>
+        <w:t xml:space="preserve"> =&gt; console.log('</w:t>
+      </w:r>
+      <w:proofErr w:type="spellStart"/>
+      <w:r>
+        <w:t>Service</w:t>
+      </w:r>
+      <w:proofErr w:type="spellEnd"/>
+      <w:r>
+        <w:t xml:space="preserve"> </w:t>
+      </w:r>
+      <w:proofErr w:type="spellStart"/>
+      <w:r>
+        <w:t>Worker</w:t>
+      </w:r>
+      <w:proofErr w:type="spellEnd"/>
+      <w:r>
+        <w:t xml:space="preserve"> registrado con éxito', </w:t>
+      </w:r>
+      <w:proofErr w:type="spellStart"/>
+      <w:r>
+        <w:t>reg</w:t>
+      </w:r>
+      <w:proofErr w:type="spellEnd"/>
+      <w:r>
+        <w:t>))</w:t>
+      </w:r>
+    </w:p>
+    <w:p>
+      <w:r>
+        <w:t xml:space="preserve">      .</w:t>
+      </w:r>
+      <w:proofErr w:type="gramStart"/>
+      <w:r>
+        <w:t>catch(</w:t>
+      </w:r>
+      <w:proofErr w:type="spellStart"/>
+      <w:proofErr w:type="gramEnd"/>
+      <w:r>
+        <w:t>err</w:t>
+      </w:r>
+      <w:proofErr w:type="spellEnd"/>
+      <w:r>
+        <w:t xml:space="preserve"> =&gt; </w:t>
+      </w:r>
+      <w:proofErr w:type="spellStart"/>
+      <w:r>
+        <w:t>console.warn</w:t>
+      </w:r>
+      <w:proofErr w:type="spellEnd"/>
+      <w:r>
+        <w:t xml:space="preserve">('Error al registrar el </w:t>
+      </w:r>
+      <w:proofErr w:type="spellStart"/>
+      <w:r>
+        <w:t>Service</w:t>
+      </w:r>
+      <w:proofErr w:type="spellEnd"/>
+      <w:r>
+        <w:t xml:space="preserve"> </w:t>
+      </w:r>
+      <w:proofErr w:type="spellStart"/>
+      <w:r>
+        <w:t>Worker</w:t>
+      </w:r>
+      <w:proofErr w:type="spellEnd"/>
+      <w:r>
+        <w:t xml:space="preserve">', </w:t>
+      </w:r>
+      <w:proofErr w:type="spellStart"/>
+      <w:r>
+        <w:t>err</w:t>
+      </w:r>
+      <w:proofErr w:type="spellEnd"/>
+      <w:r>
+        <w:t>));</w:t>
+      </w:r>
+    </w:p>
+    <w:p>
+      <w:r>
+        <w:t xml:space="preserve">  });</w:t>
+      </w:r>
+    </w:p>
+    <w:p>
+      <w:r>
+        <w:t>}</w:t>
+      </w:r>
+    </w:p>
+    <w:p>
+      <w:pPr>
+        <w:rPr>
+          <w:b/>
+          <w:bCs/>
+        </w:rPr>
+      </w:pPr>
+      <w:r>
+        <w:rPr>
+          <w:b/>
+          <w:bCs/>
+        </w:rPr>
+        <w:t>Cómo probar que tu PWA funciona</w:t>
+      </w:r>
+    </w:p>
+    <w:p>
+      <w:pPr>
+        <w:numPr>
+          <w:ilvl w:val="0"/>
+          <w:numId w:val="26"/>
+        </w:numPr>
+      </w:pPr>
+      <w:r>
+        <w:rPr>
+          <w:b/>
+          <w:bCs/>
+        </w:rPr>
+        <w:lastRenderedPageBreak/>
+        <w:t>Ejecuta un servidor local:</w:t>
+      </w:r>
+      <w:r>
+        <w:t xml:space="preserve"> No abras el archivo index.html directamente haciendo doble clic (eso usaría el protocolo file:// y las PWA no funcionan ahí). Usa una extensión como </w:t>
+      </w:r>
+      <w:r>
+        <w:rPr>
+          <w:i/>
+          <w:iCs/>
+        </w:rPr>
+        <w:t>Live Server</w:t>
+      </w:r>
+      <w:r>
+        <w:t xml:space="preserve"> en VS </w:t>
+      </w:r>
+      <w:proofErr w:type="spellStart"/>
+      <w:r>
+        <w:t>Code</w:t>
+      </w:r>
+      <w:proofErr w:type="spellEnd"/>
+      <w:r>
+        <w:t xml:space="preserve"> o un comando como </w:t>
+      </w:r>
+      <w:proofErr w:type="spellStart"/>
+      <w:r>
+        <w:t>npx</w:t>
+      </w:r>
+      <w:proofErr w:type="spellEnd"/>
+      <w:r>
+        <w:t xml:space="preserve"> </w:t>
+      </w:r>
+      <w:proofErr w:type="spellStart"/>
+      <w:r>
+        <w:t>serve</w:t>
+      </w:r>
+      <w:proofErr w:type="spellEnd"/>
+      <w:r>
+        <w:t xml:space="preserve"> para correr la web en http://localhost:3000.</w:t>
+      </w:r>
+    </w:p>
+    <w:p>
+      <w:pPr>
+        <w:numPr>
+          <w:ilvl w:val="0"/>
+          <w:numId w:val="26"/>
+        </w:numPr>
+      </w:pPr>
+      <w:r>
+        <w:rPr>
+          <w:b/>
+          <w:bCs/>
+        </w:rPr>
+        <w:t>Usa las Herramientas de Desarrollador (F12):</w:t>
+      </w:r>
+      <w:r>
+        <w:t xml:space="preserve"> * Ve a la pestaña </w:t>
+      </w:r>
+      <w:proofErr w:type="spellStart"/>
+      <w:r>
+        <w:rPr>
+          <w:b/>
+          <w:bCs/>
+        </w:rPr>
+        <w:t>Application</w:t>
+      </w:r>
+      <w:proofErr w:type="spellEnd"/>
+      <w:r>
+        <w:t xml:space="preserve"> (Aplicación) en </w:t>
+      </w:r>
+      <w:proofErr w:type="spellStart"/>
+      <w:r>
+        <w:t>Chrome</w:t>
+      </w:r>
+      <w:proofErr w:type="spellEnd"/>
+      <w:r>
+        <w:t>/</w:t>
+      </w:r>
+      <w:proofErr w:type="spellStart"/>
+      <w:r>
+        <w:t>Edge</w:t>
+      </w:r>
+      <w:proofErr w:type="spellEnd"/>
+      <w:r>
+        <w:t>.</w:t>
+      </w:r>
+    </w:p>
+    <w:p>
+      <w:pPr>
+        <w:numPr>
+          <w:ilvl w:val="1"/>
+          <w:numId w:val="26"/>
+        </w:numPr>
+      </w:pPr>
+      <w:r>
+        <w:t xml:space="preserve">En el menú izquierdo verás las secciones </w:t>
+      </w:r>
+      <w:proofErr w:type="spellStart"/>
+      <w:r>
+        <w:rPr>
+          <w:b/>
+          <w:bCs/>
+        </w:rPr>
+        <w:t>Manifest</w:t>
+      </w:r>
+      <w:proofErr w:type="spellEnd"/>
+      <w:r>
+        <w:t xml:space="preserve"> y </w:t>
+      </w:r>
+      <w:proofErr w:type="spellStart"/>
+      <w:r>
+        <w:rPr>
+          <w:b/>
+          <w:bCs/>
+        </w:rPr>
+        <w:t>Service</w:t>
+      </w:r>
+      <w:proofErr w:type="spellEnd"/>
+      <w:r>
+        <w:rPr>
+          <w:b/>
+          <w:bCs/>
+        </w:rPr>
+        <w:t xml:space="preserve"> </w:t>
+      </w:r>
+      <w:proofErr w:type="spellStart"/>
+      <w:r>
+        <w:rPr>
+          <w:b/>
+          <w:bCs/>
+        </w:rPr>
+        <w:t>Workers</w:t>
+      </w:r>
+      <w:proofErr w:type="spellEnd"/>
+      <w:r>
+        <w:t>. Ahí podrás verificar si el navegador los detectó correctamente y si no hay errores en las rutas de tus iconos.</w:t>
+      </w:r>
+    </w:p>
+    <w:p>
+      <w:pPr>
+        <w:numPr>
+          <w:ilvl w:val="0"/>
+          <w:numId w:val="26"/>
+        </w:numPr>
+      </w:pPr>
+      <w:r>
+        <w:rPr>
+          <w:b/>
+          <w:bCs/>
+        </w:rPr>
+        <w:t>¡Instálala!</w:t>
+      </w:r>
+      <w:r>
+        <w:t xml:space="preserve"> Si todo está en orden, verás aparecer un icono con forma de monitor/pantalla en la barra de direcciones del navegador listo para instalar tu </w:t>
+      </w:r>
+      <w:proofErr w:type="spellStart"/>
+      <w:r>
+        <w:t>app</w:t>
+      </w:r>
+      <w:proofErr w:type="spellEnd"/>
+      <w:r>
+        <w:t xml:space="preserve"> en el escritorio.</w:t>
+      </w:r>
+    </w:p>
+    <w:p>
+      <w:pPr>
+        <w:rPr>
+          <w:lang w:val="es-ES"/>
+        </w:rPr>
+      </w:pPr>
+    </w:p>
+    <w:p>
+      <w:pPr>
+        <w:rPr>
+          <w:lang w:val="es-ES"/>
+        </w:rPr>
+      </w:pPr>
     </w:p>
     <w:sectPr>
       <w:pgSz w:w="11906" w:h="16838"/>
@@ -12799,6 +15349,123 @@
     </w:lvl>
   </w:abstractNum>
   <w:abstractNum w:abstractNumId="18">
+    <w:nsid w:val="5BE47FE4"/>
+    <w:multiLevelType w:val="multilevel"/>
+    <w:tmpl w:val="4E989FA8"/>
+    <w:lvl w:ilvl="0">
+      <w:start w:val="1"/>
+      <w:numFmt w:val="decimal"/>
+      <w:lvlText w:val="%1."/>
+      <w:lvlJc w:val="left"/>
+      <w:pPr>
+        <w:tabs>
+          <w:tab w:val="num" w:pos="720"/>
+        </w:tabs>
+        <w:ind w:left="720" w:hanging="360"/>
+      </w:pPr>
+    </w:lvl>
+    <w:lvl w:ilvl="1">
+      <w:start w:val="1"/>
+      <w:numFmt w:val="bullet"/>
+      <w:lvlText w:val="o"/>
+      <w:lvlJc w:val="left"/>
+      <w:pPr>
+        <w:tabs>
+          <w:tab w:val="num" w:pos="1440"/>
+        </w:tabs>
+        <w:ind w:left="1440" w:hanging="360"/>
+      </w:pPr>
+      <w:rPr>
+        <w:rFonts w:ascii="Courier New" w:hAnsi="Courier New" w:hint="default"/>
+        <w:sz w:val="20"/>
+      </w:rPr>
+    </w:lvl>
+    <w:lvl w:ilvl="2" w:tentative="1">
+      <w:start w:val="1"/>
+      <w:numFmt w:val="decimal"/>
+      <w:lvlText w:val="%3."/>
+      <w:lvlJc w:val="left"/>
+      <w:pPr>
+        <w:tabs>
+          <w:tab w:val="num" w:pos="2160"/>
+        </w:tabs>
+        <w:ind w:left="2160" w:hanging="360"/>
+      </w:pPr>
+    </w:lvl>
+    <w:lvl w:ilvl="3" w:tentative="1">
+      <w:start w:val="1"/>
+      <w:numFmt w:val="decimal"/>
+      <w:lvlText w:val="%4."/>
+      <w:lvlJc w:val="left"/>
+      <w:pPr>
+        <w:tabs>
+          <w:tab w:val="num" w:pos="2880"/>
+        </w:tabs>
+        <w:ind w:left="2880" w:hanging="360"/>
+      </w:pPr>
+    </w:lvl>
+    <w:lvl w:ilvl="4" w:tentative="1">
+      <w:start w:val="1"/>
+      <w:numFmt w:val="decimal"/>
+      <w:lvlText w:val="%5."/>
+      <w:lvlJc w:val="left"/>
+      <w:pPr>
+        <w:tabs>
+          <w:tab w:val="num" w:pos="3600"/>
+        </w:tabs>
+        <w:ind w:left="3600" w:hanging="360"/>
+      </w:pPr>
+    </w:lvl>
+    <w:lvl w:ilvl="5" w:tentative="1">
+      <w:start w:val="1"/>
+      <w:numFmt w:val="decimal"/>
+      <w:lvlText w:val="%6."/>
+      <w:lvlJc w:val="left"/>
+      <w:pPr>
+        <w:tabs>
+          <w:tab w:val="num" w:pos="4320"/>
+        </w:tabs>
+        <w:ind w:left="4320" w:hanging="360"/>
+      </w:pPr>
+    </w:lvl>
+    <w:lvl w:ilvl="6" w:tentative="1">
+      <w:start w:val="1"/>
+      <w:numFmt w:val="decimal"/>
+      <w:lvlText w:val="%7."/>
+      <w:lvlJc w:val="left"/>
+      <w:pPr>
+        <w:tabs>
+          <w:tab w:val="num" w:pos="5040"/>
+        </w:tabs>
+        <w:ind w:left="5040" w:hanging="360"/>
+      </w:pPr>
+    </w:lvl>
+    <w:lvl w:ilvl="7" w:tentative="1">
+      <w:start w:val="1"/>
+      <w:numFmt w:val="decimal"/>
+      <w:lvlText w:val="%8."/>
+      <w:lvlJc w:val="left"/>
+      <w:pPr>
+        <w:tabs>
+          <w:tab w:val="num" w:pos="5760"/>
+        </w:tabs>
+        <w:ind w:left="5760" w:hanging="360"/>
+      </w:pPr>
+    </w:lvl>
+    <w:lvl w:ilvl="8" w:tentative="1">
+      <w:start w:val="1"/>
+      <w:numFmt w:val="decimal"/>
+      <w:lvlText w:val="%9."/>
+      <w:lvlJc w:val="left"/>
+      <w:pPr>
+        <w:tabs>
+          <w:tab w:val="num" w:pos="6480"/>
+        </w:tabs>
+        <w:ind w:left="6480" w:hanging="360"/>
+      </w:pPr>
+    </w:lvl>
+  </w:abstractNum>
+  <w:abstractNum w:abstractNumId="19">
     <w:nsid w:val="5FA91F10"/>
     <w:multiLevelType w:val="multilevel"/>
     <w:tmpl w:val="A23C6B5A"/>
@@ -12947,7 +15614,7 @@
       </w:rPr>
     </w:lvl>
   </w:abstractNum>
-  <w:abstractNum w:abstractNumId="19">
+  <w:abstractNum w:abstractNumId="20">
     <w:nsid w:val="638A62B1"/>
     <w:multiLevelType w:val="multilevel"/>
     <w:tmpl w:val="E94C9282"/>
@@ -13060,7 +15727,7 @@
       </w:pPr>
     </w:lvl>
   </w:abstractNum>
-  <w:abstractNum w:abstractNumId="20">
+  <w:abstractNum w:abstractNumId="21">
     <w:nsid w:val="64124E0F"/>
     <w:multiLevelType w:val="multilevel"/>
     <w:tmpl w:val="A156FAD2"/>
@@ -13173,7 +15840,7 @@
       </w:pPr>
     </w:lvl>
   </w:abstractNum>
-  <w:abstractNum w:abstractNumId="21">
+  <w:abstractNum w:abstractNumId="22">
     <w:nsid w:val="64171F31"/>
     <w:multiLevelType w:val="multilevel"/>
     <w:tmpl w:val="BEA68070"/>
@@ -13286,7 +15953,7 @@
       </w:pPr>
     </w:lvl>
   </w:abstractNum>
-  <w:abstractNum w:abstractNumId="22">
+  <w:abstractNum w:abstractNumId="23">
     <w:nsid w:val="6A102DC0"/>
     <w:multiLevelType w:val="multilevel"/>
     <w:tmpl w:val="9088182E"/>
@@ -13435,7 +16102,120 @@
       </w:rPr>
     </w:lvl>
   </w:abstractNum>
-  <w:abstractNum w:abstractNumId="23">
+  <w:abstractNum w:abstractNumId="24">
+    <w:nsid w:val="6C391A9D"/>
+    <w:multiLevelType w:val="multilevel"/>
+    <w:tmpl w:val="568EE860"/>
+    <w:lvl w:ilvl="0">
+      <w:start w:val="1"/>
+      <w:numFmt w:val="decimal"/>
+      <w:lvlText w:val="%1."/>
+      <w:lvlJc w:val="left"/>
+      <w:pPr>
+        <w:tabs>
+          <w:tab w:val="num" w:pos="720"/>
+        </w:tabs>
+        <w:ind w:left="720" w:hanging="360"/>
+      </w:pPr>
+    </w:lvl>
+    <w:lvl w:ilvl="1" w:tentative="1">
+      <w:start w:val="1"/>
+      <w:numFmt w:val="decimal"/>
+      <w:lvlText w:val="%2."/>
+      <w:lvlJc w:val="left"/>
+      <w:pPr>
+        <w:tabs>
+          <w:tab w:val="num" w:pos="1440"/>
+        </w:tabs>
+        <w:ind w:left="1440" w:hanging="360"/>
+      </w:pPr>
+    </w:lvl>
+    <w:lvl w:ilvl="2" w:tentative="1">
+      <w:start w:val="1"/>
+      <w:numFmt w:val="decimal"/>
+      <w:lvlText w:val="%3."/>
+      <w:lvlJc w:val="left"/>
+      <w:pPr>
+        <w:tabs>
+          <w:tab w:val="num" w:pos="2160"/>
+        </w:tabs>
+        <w:ind w:left="2160" w:hanging="360"/>
+      </w:pPr>
+    </w:lvl>
+    <w:lvl w:ilvl="3" w:tentative="1">
+      <w:start w:val="1"/>
+      <w:numFmt w:val="decimal"/>
+      <w:lvlText w:val="%4."/>
+      <w:lvlJc w:val="left"/>
+      <w:pPr>
+        <w:tabs>
+          <w:tab w:val="num" w:pos="2880"/>
+        </w:tabs>
+        <w:ind w:left="2880" w:hanging="360"/>
+      </w:pPr>
+    </w:lvl>
+    <w:lvl w:ilvl="4" w:tentative="1">
+      <w:start w:val="1"/>
+      <w:numFmt w:val="decimal"/>
+      <w:lvlText w:val="%5."/>
+      <w:lvlJc w:val="left"/>
+      <w:pPr>
+        <w:tabs>
+          <w:tab w:val="num" w:pos="3600"/>
+        </w:tabs>
+        <w:ind w:left="3600" w:hanging="360"/>
+      </w:pPr>
+    </w:lvl>
+    <w:lvl w:ilvl="5" w:tentative="1">
+      <w:start w:val="1"/>
+      <w:numFmt w:val="decimal"/>
+      <w:lvlText w:val="%6."/>
+      <w:lvlJc w:val="left"/>
+      <w:pPr>
+        <w:tabs>
+          <w:tab w:val="num" w:pos="4320"/>
+        </w:tabs>
+        <w:ind w:left="4320" w:hanging="360"/>
+      </w:pPr>
+    </w:lvl>
+    <w:lvl w:ilvl="6" w:tentative="1">
+      <w:start w:val="1"/>
+      <w:numFmt w:val="decimal"/>
+      <w:lvlText w:val="%7."/>
+      <w:lvlJc w:val="left"/>
+      <w:pPr>
+        <w:tabs>
+          <w:tab w:val="num" w:pos="5040"/>
+        </w:tabs>
+        <w:ind w:left="5040" w:hanging="360"/>
+      </w:pPr>
+    </w:lvl>
+    <w:lvl w:ilvl="7" w:tentative="1">
+      <w:start w:val="1"/>
+      <w:numFmt w:val="decimal"/>
+      <w:lvlText w:val="%8."/>
+      <w:lvlJc w:val="left"/>
+      <w:pPr>
+        <w:tabs>
+          <w:tab w:val="num" w:pos="5760"/>
+        </w:tabs>
+        <w:ind w:left="5760" w:hanging="360"/>
+      </w:pPr>
+    </w:lvl>
+    <w:lvl w:ilvl="8" w:tentative="1">
+      <w:start w:val="1"/>
+      <w:numFmt w:val="decimal"/>
+      <w:lvlText w:val="%9."/>
+      <w:lvlJc w:val="left"/>
+      <w:pPr>
+        <w:tabs>
+          <w:tab w:val="num" w:pos="6480"/>
+        </w:tabs>
+        <w:ind w:left="6480" w:hanging="360"/>
+      </w:pPr>
+    </w:lvl>
+  </w:abstractNum>
+  <w:abstractNum w:abstractNumId="25">
     <w:nsid w:val="6E336510"/>
     <w:multiLevelType w:val="multilevel"/>
     <w:tmpl w:val="B8263DBC"/>
@@ -13609,16 +16389,16 @@
     <w:abstractNumId w:val="12"/>
   </w:num>
   <w:num w:numId="9">
-    <w:abstractNumId w:val="21"/>
+    <w:abstractNumId w:val="22"/>
   </w:num>
   <w:num w:numId="10">
-    <w:abstractNumId w:val="23"/>
+    <w:abstractNumId w:val="25"/>
   </w:num>
   <w:num w:numId="11">
-    <w:abstractNumId w:val="18"/>
+    <w:abstractNumId w:val="19"/>
   </w:num>
   <w:num w:numId="12">
-    <w:abstractNumId w:val="20"/>
+    <w:abstractNumId w:val="21"/>
   </w:num>
   <w:num w:numId="13">
     <w:abstractNumId w:val="3"/>
@@ -13633,7 +16413,7 @@
     <w:abstractNumId w:val="9"/>
   </w:num>
   <w:num w:numId="17">
-    <w:abstractNumId w:val="19"/>
+    <w:abstractNumId w:val="20"/>
   </w:num>
   <w:num w:numId="18">
     <w:abstractNumId w:val="1"/>
@@ -13651,10 +16431,16 @@
     <w:abstractNumId w:val="0"/>
   </w:num>
   <w:num w:numId="23">
-    <w:abstractNumId w:val="22"/>
+    <w:abstractNumId w:val="23"/>
   </w:num>
   <w:num w:numId="24">
     <w:abstractNumId w:val="14"/>
+  </w:num>
+  <w:num w:numId="25">
+    <w:abstractNumId w:val="24"/>
+  </w:num>
+  <w:num w:numId="26">
+    <w:abstractNumId w:val="18"/>
   </w:num>
 </w:numbering>
 </file>
@@ -14373,7 +17159,7 @@
 </file>
 
 <file path=customXml/itemProps1.xml><?xml version="1.0" encoding="utf-8"?>
-<ds:datastoreItem xmlns:ds="http://schemas.openxmlformats.org/officeDocument/2006/customXml" ds:itemID="{FBD52047-2BFC-4555-BF17-161DEEDF36A5}">
+<ds:datastoreItem xmlns:ds="http://schemas.openxmlformats.org/officeDocument/2006/customXml" ds:itemID="{0A2CC7B0-2F45-4B67-B4C9-990DAF91002A}">
   <ds:schemaRefs>
     <ds:schemaRef ds:uri="http://schemas.openxmlformats.org/officeDocument/2006/bibliography"/>
   </ds:schemaRefs>

</xml_diff>

<commit_message>
Se incorpora la funcionalidad de cierre de notas por periodo y la funcionalidad de ciclo lectivo
</commit_message>
<xml_diff>
--- a/requerimientos.docx
+++ b/requerimientos.docx
@@ -10026,19 +10026,17 @@
           <w:tab w:val="left" w:pos="1792"/>
         </w:tabs>
       </w:pPr>
-      <w:proofErr w:type="gramStart"/>
-      <w:r>
-        <w:rPr>
-          <w:b/>
-        </w:rPr>
-        <w:t>necesito</w:t>
-      </w:r>
-      <w:proofErr w:type="gramEnd"/>
-      <w:r>
-        <w:rPr>
-          <w:b/>
-        </w:rPr>
-        <w:t xml:space="preserve"> que a la vista designaciones le agregues el </w:t>
+      <w:r>
+        <w:rPr>
+          <w:b/>
+        </w:rPr>
+        <w:t>N</w:t>
+      </w:r>
+      <w:r>
+        <w:rPr>
+          <w:b/>
+        </w:rPr>
+        <w:t xml:space="preserve">ecesito que a la vista designaciones le agregues el </w:t>
       </w:r>
       <w:proofErr w:type="spellStart"/>
       <w:r>
@@ -10793,56 +10791,409 @@
           <w:tab w:val="left" w:pos="1792"/>
         </w:tabs>
         <w:rPr>
-          <w:lang w:val="es-ES"/>
-        </w:rPr>
-      </w:pPr>
-      <w:r>
-        <w:rPr>
+          <w:b/>
+          <w:lang w:val="es-ES"/>
+        </w:rPr>
+      </w:pPr>
+      <w:r>
+        <w:rPr>
+          <w:b/>
           <w:lang w:val="es-ES"/>
         </w:rPr>
         <w:t>Necesito que me modifiques la tabla materias y me saques el campo establecimiento ya que no quiero registrar en esa tabla ese dato</w:t>
       </w:r>
+      <w:r>
+        <w:rPr>
+          <w:b/>
+          <w:lang w:val="es-ES"/>
+        </w:rPr>
+        <w:t>, también sacarlo de las vistas de materias</w:t>
+      </w:r>
+    </w:p>
+    <w:p>
+      <w:pPr>
+        <w:tabs>
+          <w:tab w:val="left" w:pos="1792"/>
+        </w:tabs>
+        <w:rPr>
+          <w:b/>
+          <w:lang w:val="es-ES"/>
+        </w:rPr>
+      </w:pPr>
+      <w:r>
+        <w:rPr>
+          <w:b/>
+          <w:lang w:val="es-ES"/>
+        </w:rPr>
+        <w:t>Necesito</w:t>
+      </w:r>
+      <w:r>
+        <w:rPr>
+          <w:b/>
+          <w:lang w:val="es-ES"/>
+        </w:rPr>
+        <w:t xml:space="preserve"> que al entrar al menú Material pedagógico, opción Actividades, ya aparezca seleccionada la materia activa, igual que en asistencias, en la vista Actividades, solo si </w:t>
+      </w:r>
+      <w:proofErr w:type="spellStart"/>
+      <w:r>
+        <w:rPr>
+          <w:b/>
+          <w:lang w:val="es-ES"/>
+        </w:rPr>
+        <w:t>esta</w:t>
+      </w:r>
+      <w:proofErr w:type="spellEnd"/>
+      <w:r>
+        <w:rPr>
+          <w:b/>
+          <w:lang w:val="es-ES"/>
+        </w:rPr>
+        <w:t xml:space="preserve"> el horario activo, sino que permita seleccionarlo</w:t>
+      </w:r>
+      <w:r>
+        <w:rPr>
+          <w:b/>
+          <w:lang w:val="es-ES"/>
+        </w:rPr>
+        <w:t>, que al presionar Nueva Actividad, se acuerde, y al volver luego de guardar los datos se acuerde la materia activa.</w:t>
+      </w:r>
+    </w:p>
+    <w:p>
+      <w:pPr>
+        <w:rPr>
+          <w:b/>
+          <w:lang w:val="es-ES"/>
+        </w:rPr>
+      </w:pPr>
+      <w:r>
+        <w:rPr>
+          <w:b/>
+          <w:lang w:val="es-ES"/>
+        </w:rPr>
+        <w:t>Necesito Realizar cie</w:t>
+      </w:r>
+      <w:r>
+        <w:rPr>
+          <w:b/>
+          <w:lang w:val="es-ES"/>
+        </w:rPr>
+        <w:t>r</w:t>
+      </w:r>
+      <w:r>
+        <w:rPr>
+          <w:b/>
+          <w:lang w:val="es-ES"/>
+        </w:rPr>
+        <w:t xml:space="preserve">re </w:t>
+      </w:r>
+      <w:r>
+        <w:rPr>
+          <w:b/>
+          <w:lang w:val="es-ES"/>
+        </w:rPr>
+        <w:t xml:space="preserve">de notas </w:t>
+      </w:r>
+      <w:r>
+        <w:rPr>
+          <w:b/>
+          <w:lang w:val="es-ES"/>
+        </w:rPr>
+        <w:t>de</w:t>
+      </w:r>
+      <w:r>
+        <w:rPr>
+          <w:b/>
+          <w:lang w:val="es-ES"/>
+        </w:rPr>
+        <w:t>l</w:t>
+      </w:r>
+      <w:r>
+        <w:rPr>
+          <w:b/>
+          <w:lang w:val="es-ES"/>
+        </w:rPr>
+        <w:t xml:space="preserve"> cuatrimestre</w:t>
+      </w:r>
+      <w:r>
+        <w:rPr>
+          <w:b/>
+          <w:lang w:val="es-ES"/>
+        </w:rPr>
+        <w:t>, n</w:t>
+      </w:r>
+      <w:r>
+        <w:rPr>
+          <w:b/>
+          <w:lang w:val="es-ES"/>
+        </w:rPr>
+        <w:t xml:space="preserve">ecesito que me hagas el cierre de notas del cuatrimestre, las notas deben ser un promedio de las notas asignadas a todas las actividades que tenga asignadas y calificadas un alumno, así como las calificaciones que se le hayan ido cargando por el menú calificaciones, </w:t>
+      </w:r>
+      <w:r>
+        <w:rPr>
+          <w:b/>
+          <w:lang w:val="es-ES"/>
+        </w:rPr>
+        <w:t xml:space="preserve">no deben entrar en el cierre los valores de las prenotas, </w:t>
+      </w:r>
+      <w:r>
+        <w:rPr>
+          <w:b/>
+          <w:lang w:val="es-ES"/>
+        </w:rPr>
+        <w:t xml:space="preserve">eso me va a dar una nota promedio, el promedio me lo tiene que hacer en función de los registros de calificaciones del alumno, las calificaciones de las actividades y la cantidad de registros de ese alumno. También las asistencias deben ser tenidas en cuenta, si el estudiante tiene más del porcentaje mínimo registrado la nota será 7 en asistencia, si tiene menos del porcentaje debe ser 6 y si tiene más del 90% debe ser 10. Una vez calculada la calificación numérica se la debe comparar con los valores almacenados en la tabla </w:t>
+      </w:r>
+      <w:proofErr w:type="spellStart"/>
+      <w:r>
+        <w:rPr>
+          <w:b/>
+          <w:lang w:val="es-ES"/>
+        </w:rPr>
+        <w:t>tipovaloraciones</w:t>
+      </w:r>
+      <w:proofErr w:type="spellEnd"/>
+      <w:r>
+        <w:rPr>
+          <w:b/>
+          <w:lang w:val="es-ES"/>
+        </w:rPr>
+        <w:t xml:space="preserve">, con la columna </w:t>
+      </w:r>
+      <w:proofErr w:type="spellStart"/>
+      <w:r>
+        <w:rPr>
+          <w:b/>
+          <w:lang w:val="es-ES"/>
+        </w:rPr>
+        <w:t>notainferior</w:t>
+      </w:r>
+      <w:proofErr w:type="spellEnd"/>
+      <w:r>
+        <w:rPr>
+          <w:b/>
+          <w:lang w:val="es-ES"/>
+        </w:rPr>
+        <w:t xml:space="preserve"> y la columna </w:t>
+      </w:r>
+      <w:proofErr w:type="spellStart"/>
+      <w:r>
+        <w:rPr>
+          <w:b/>
+          <w:lang w:val="es-ES"/>
+        </w:rPr>
+        <w:t>notasuperior</w:t>
+      </w:r>
+      <w:proofErr w:type="spellEnd"/>
+      <w:r>
+        <w:rPr>
+          <w:b/>
+          <w:lang w:val="es-ES"/>
+        </w:rPr>
+        <w:t xml:space="preserve">  y me debe devolver en 3 columnas o más las denominaciones con las que encuadra la nota, por ejemplo si la nota es 4, me tiene que devolver TEP y Regular en dos columnas claramente visibles, y </w:t>
+      </w:r>
+      <w:proofErr w:type="spellStart"/>
+      <w:r>
+        <w:rPr>
+          <w:b/>
+          <w:lang w:val="es-ES"/>
+        </w:rPr>
+        <w:t>asi</w:t>
+      </w:r>
+      <w:proofErr w:type="spellEnd"/>
+      <w:r>
+        <w:rPr>
+          <w:b/>
+          <w:lang w:val="es-ES"/>
+        </w:rPr>
+        <w:t xml:space="preserve"> con cada estudiante, al final de la vista un botón de Guardar las Calificaciones, en una tabla de cierres de notas, donde se debe almacenar el alumno, tipo de cierre , la nota valorativa, y la nota numérica correspondiente, obviamente con la fecha de registro de esos datos que debe ser la indicada por la fecha del sistema(actual).</w:t>
+      </w:r>
+    </w:p>
+    <w:p>
+      <w:pPr>
+        <w:rPr>
+          <w:b/>
+          <w:lang w:val="es-ES"/>
+        </w:rPr>
+      </w:pPr>
       <w:bookmarkStart w:id="0" w:name="_GoBack"/>
-      <w:bookmarkEnd w:id="0"/>
-    </w:p>
-    <w:p>
-      <w:pPr>
-        <w:rPr>
-          <w:lang w:val="es-ES"/>
-        </w:rPr>
-      </w:pPr>
-      <w:r>
-        <w:rPr>
-          <w:lang w:val="es-ES"/>
-        </w:rPr>
-        <w:t>Necesito Realizar cie</w:t>
-      </w:r>
-      <w:r>
-        <w:rPr>
-          <w:lang w:val="es-ES"/>
-        </w:rPr>
-        <w:t>r</w:t>
-      </w:r>
-      <w:r>
-        <w:rPr>
-          <w:lang w:val="es-ES"/>
-        </w:rPr>
-        <w:t>re de cuatrimestre</w:t>
-      </w:r>
-    </w:p>
-    <w:p>
-      <w:pPr>
-        <w:rPr>
-          <w:lang w:val="es-ES"/>
-        </w:rPr>
-      </w:pPr>
-    </w:p>
-    <w:p>
-      <w:pPr>
-        <w:rPr>
-          <w:lang w:val="es-ES"/>
-        </w:rPr>
-      </w:pPr>
+      <w:r>
+        <w:rPr>
+          <w:b/>
+          <w:lang w:val="es-ES"/>
+        </w:rPr>
+        <w:t xml:space="preserve">Necesito agregar al sistema lo siguiente, en el menú </w:t>
+      </w:r>
+      <w:proofErr w:type="spellStart"/>
+      <w:r>
+        <w:rPr>
+          <w:b/>
+          <w:lang w:val="es-ES"/>
+        </w:rPr>
+        <w:t>Administracion</w:t>
+      </w:r>
+      <w:proofErr w:type="spellEnd"/>
+      <w:r>
+        <w:rPr>
+          <w:b/>
+          <w:lang w:val="es-ES"/>
+        </w:rPr>
+        <w:t xml:space="preserve">, la opción Ciclos lectivos, allí me debe permitir mediante un crud armar el ciclo lectivo correspondiente al año en curso, </w:t>
+      </w:r>
+      <w:r>
+        <w:rPr>
+          <w:b/>
+          <w:lang w:val="es-ES"/>
+        </w:rPr>
+        <w:t xml:space="preserve">se toma un ciclo lectivo por año, </w:t>
+      </w:r>
+      <w:r>
+        <w:rPr>
+          <w:b/>
+          <w:lang w:val="es-ES"/>
+        </w:rPr>
+        <w:t xml:space="preserve">del ciclo lectivo necesito almacenar, </w:t>
+      </w:r>
+      <w:proofErr w:type="spellStart"/>
+      <w:r>
+        <w:rPr>
+          <w:b/>
+          <w:lang w:val="es-ES"/>
+        </w:rPr>
+        <w:t>fechadeinicio</w:t>
+      </w:r>
+      <w:proofErr w:type="spellEnd"/>
+      <w:r>
+        <w:rPr>
+          <w:b/>
+          <w:lang w:val="es-ES"/>
+        </w:rPr>
+        <w:t xml:space="preserve">, </w:t>
+      </w:r>
+      <w:proofErr w:type="spellStart"/>
+      <w:r>
+        <w:rPr>
+          <w:b/>
+          <w:lang w:val="es-ES"/>
+        </w:rPr>
+        <w:t>fechadefinalizacion</w:t>
+      </w:r>
+      <w:proofErr w:type="spellEnd"/>
+      <w:r>
+        <w:rPr>
+          <w:b/>
+          <w:lang w:val="es-ES"/>
+        </w:rPr>
+        <w:t>, año, y necesito enlazar</w:t>
+      </w:r>
+      <w:r>
+        <w:rPr>
+          <w:b/>
+          <w:lang w:val="es-ES"/>
+        </w:rPr>
+        <w:t>(agregar) a todos los registros donde corresponda(tablas) la correspondiente relación al ciclo lectivo,</w:t>
+      </w:r>
+      <w:r>
+        <w:rPr>
+          <w:b/>
+          <w:lang w:val="es-ES"/>
+        </w:rPr>
+        <w:t xml:space="preserve"> en la base de datos al ciclo lectivo, </w:t>
+      </w:r>
+      <w:proofErr w:type="spellStart"/>
+      <w:r>
+        <w:rPr>
+          <w:b/>
+          <w:lang w:val="es-ES"/>
+        </w:rPr>
+        <w:t>asi</w:t>
+      </w:r>
+      <w:proofErr w:type="spellEnd"/>
+      <w:r>
+        <w:rPr>
+          <w:b/>
+          <w:lang w:val="es-ES"/>
+        </w:rPr>
+        <w:t xml:space="preserve"> cuando finaliza el ciclo lectivo en curso, me pida si quiero </w:t>
+      </w:r>
+      <w:r>
+        <w:rPr>
+          <w:b/>
+          <w:lang w:val="es-ES"/>
+        </w:rPr>
+        <w:t xml:space="preserve">generar un nuevo ciclo lectivo, y los datos que se carguen en el siguiente ciclo lectivo ya se enlacen con el nuevo ciclo </w:t>
+      </w:r>
+      <w:proofErr w:type="spellStart"/>
+      <w:r>
+        <w:rPr>
+          <w:b/>
+          <w:lang w:val="es-ES"/>
+        </w:rPr>
+        <w:t>lectivo,</w:t>
+      </w:r>
+      <w:r>
+        <w:rPr>
+          <w:b/>
+          <w:lang w:val="es-ES"/>
+        </w:rPr>
+        <w:t>cuando</w:t>
+      </w:r>
+      <w:proofErr w:type="spellEnd"/>
+      <w:r>
+        <w:rPr>
+          <w:b/>
+          <w:lang w:val="es-ES"/>
+        </w:rPr>
+        <w:t xml:space="preserve"> un usuario nuevo se registra, se debe crear</w:t>
+      </w:r>
+      <w:r>
+        <w:rPr>
+          <w:b/>
+          <w:lang w:val="es-ES"/>
+        </w:rPr>
+        <w:t xml:space="preserve"> el ciclo lectivo</w:t>
+      </w:r>
+    </w:p>
+    <w:bookmarkEnd w:id="0"/>
+    <w:p>
+      <w:pPr>
+        <w:rPr>
+          <w:lang w:val="es-ES"/>
+        </w:rPr>
+      </w:pPr>
+      <w:r>
+        <w:t xml:space="preserve">La columna </w:t>
+      </w:r>
+      <w:proofErr w:type="spellStart"/>
+      <w:r>
+        <w:t>ciclo_lectivo_id</w:t>
+      </w:r>
+      <w:proofErr w:type="spellEnd"/>
+      <w:r>
+        <w:t xml:space="preserve"> (</w:t>
+      </w:r>
+      <w:proofErr w:type="spellStart"/>
+      <w:r>
+        <w:t>nullable</w:t>
+      </w:r>
+      <w:proofErr w:type="spellEnd"/>
+      <w:r>
+        <w:t xml:space="preserve">) quedó agregada en asistencias, calificaciones, actividades, contenidos, </w:t>
+      </w:r>
+      <w:proofErr w:type="spellStart"/>
+      <w:r>
+        <w:t>cierrenotas</w:t>
+      </w:r>
+      <w:proofErr w:type="spellEnd"/>
+      <w:r>
+        <w:t xml:space="preserve">, declaraciones y horarios. En la próxima etapa podemos actualizar los </w:t>
+      </w:r>
+      <w:proofErr w:type="spellStart"/>
+      <w:r>
+        <w:t>controllers</w:t>
+      </w:r>
+      <w:proofErr w:type="spellEnd"/>
+      <w:r>
+        <w:t xml:space="preserve"> para que al guardar datos los asocien automáticamente al ciclo activo</w:t>
+      </w:r>
     </w:p>
     <w:p>
       <w:pPr>
@@ -11103,6 +11454,7 @@
           <w:b/>
           <w:bCs/>
         </w:rPr>
+        <w:lastRenderedPageBreak/>
         <w:t>HTTPS:</w:t>
       </w:r>
       <w:r>
@@ -11582,24 +11934,275 @@
         <w:spacing w:after="0"/>
       </w:pPr>
       <w:r>
+        <w:t xml:space="preserve">  "</w:t>
+      </w:r>
+      <w:proofErr w:type="spellStart"/>
+      <w:r>
+        <w:t>display</w:t>
+      </w:r>
+      <w:proofErr w:type="spellEnd"/>
+      <w:r>
+        <w:t>": "</w:t>
+      </w:r>
+      <w:proofErr w:type="spellStart"/>
+      <w:r>
+        <w:t>standalone</w:t>
+      </w:r>
+      <w:proofErr w:type="spellEnd"/>
+      <w:r>
+        <w:t>",</w:t>
+      </w:r>
+    </w:p>
+    <w:p>
+      <w:pPr>
+        <w:spacing w:after="0"/>
+      </w:pPr>
+      <w:r>
+        <w:t xml:space="preserve">  "</w:t>
+      </w:r>
+      <w:proofErr w:type="spellStart"/>
+      <w:r>
+        <w:t>orientation</w:t>
+      </w:r>
+      <w:proofErr w:type="spellEnd"/>
+      <w:r>
+        <w:t>": "</w:t>
+      </w:r>
+      <w:proofErr w:type="spellStart"/>
+      <w:r>
+        <w:t>portrait</w:t>
+      </w:r>
+      <w:proofErr w:type="spellEnd"/>
+      <w:r>
+        <w:t>"</w:t>
+      </w:r>
+    </w:p>
+    <w:p>
+      <w:pPr>
+        <w:spacing w:after="0"/>
+      </w:pPr>
+      <w:r>
+        <w:t>}</w:t>
+      </w:r>
+    </w:p>
+    <w:p>
+      <w:r>
+        <w:rPr>
+          <w:b/>
+          <w:bCs/>
+        </w:rPr>
+        <w:t>Nota clave:</w:t>
+      </w:r>
+      <w:r>
+        <w:t xml:space="preserve"> La propiedad "</w:t>
+      </w:r>
+      <w:proofErr w:type="spellStart"/>
+      <w:r>
+        <w:t>display</w:t>
+      </w:r>
+      <w:proofErr w:type="spellEnd"/>
+      <w:r>
+        <w:t>": "</w:t>
+      </w:r>
+      <w:proofErr w:type="spellStart"/>
+      <w:r>
+        <w:t>standalone</w:t>
+      </w:r>
+      <w:proofErr w:type="spellEnd"/>
+      <w:r>
+        <w:t xml:space="preserve">" es la que hace que la aplicación se abra en su propia ventana oculta, eliminando la barra de direcciones del navegador para que parezca una </w:t>
+      </w:r>
+      <w:proofErr w:type="spellStart"/>
+      <w:r>
+        <w:t>app</w:t>
+      </w:r>
+      <w:proofErr w:type="spellEnd"/>
+      <w:r>
+        <w:t xml:space="preserve"> de escritorio nativa.</w:t>
+      </w:r>
+    </w:p>
+    <w:p>
+      <w:pPr>
+        <w:rPr>
+          <w:b/>
+          <w:bCs/>
+        </w:rPr>
+      </w:pPr>
+      <w:r>
+        <w:rPr>
+          <w:b/>
+          <w:bCs/>
+        </w:rPr>
+        <w:t xml:space="preserve">Paso 2: Vincular el </w:t>
+      </w:r>
+      <w:proofErr w:type="spellStart"/>
+      <w:r>
+        <w:rPr>
+          <w:b/>
+          <w:bCs/>
+        </w:rPr>
+        <w:t>Manifest</w:t>
+      </w:r>
+      <w:proofErr w:type="spellEnd"/>
+      <w:r>
+        <w:rPr>
+          <w:b/>
+          <w:bCs/>
+        </w:rPr>
+        <w:t xml:space="preserve"> en tu HTML</w:t>
+      </w:r>
+    </w:p>
+    <w:p>
+      <w:r>
+        <w:t>En el &lt;head&gt; de tu archivo index.html, debes enlazar el archivo que acabas de crear:</w:t>
+      </w:r>
+    </w:p>
+    <w:p>
+      <w:r>
+        <w:t>HTML</w:t>
+      </w:r>
+    </w:p>
+    <w:p>
+      <w:r>
+        <w:t xml:space="preserve">&lt;link </w:t>
+      </w:r>
+      <w:proofErr w:type="spellStart"/>
+      <w:r>
+        <w:t>rel</w:t>
+      </w:r>
+      <w:proofErr w:type="spellEnd"/>
+      <w:r>
+        <w:t>="</w:t>
+      </w:r>
+      <w:proofErr w:type="spellStart"/>
+      <w:r>
+        <w:t>manifest</w:t>
+      </w:r>
+      <w:proofErr w:type="spellEnd"/>
+      <w:r>
+        <w:t xml:space="preserve">" </w:t>
+      </w:r>
+      <w:proofErr w:type="spellStart"/>
+      <w:r>
+        <w:t>href</w:t>
+      </w:r>
+      <w:proofErr w:type="spellEnd"/>
+      <w:r>
+        <w:t>="/</w:t>
+      </w:r>
+      <w:proofErr w:type="spellStart"/>
+      <w:r>
+        <w:t>manifest.json</w:t>
+      </w:r>
+      <w:proofErr w:type="spellEnd"/>
+      <w:r>
+        <w:t>"&gt;</w:t>
+      </w:r>
+    </w:p>
+    <w:p>
+      <w:r>
+        <w:t xml:space="preserve">&lt;meta </w:t>
+      </w:r>
+      <w:proofErr w:type="spellStart"/>
+      <w:r>
+        <w:t>name</w:t>
+      </w:r>
+      <w:proofErr w:type="spellEnd"/>
+      <w:r>
+        <w:t>="</w:t>
+      </w:r>
+      <w:proofErr w:type="spellStart"/>
+      <w:r>
+        <w:t>theme</w:t>
+      </w:r>
+      <w:proofErr w:type="spellEnd"/>
+      <w:r>
+        <w:t xml:space="preserve">-color" </w:t>
+      </w:r>
+      <w:proofErr w:type="spellStart"/>
+      <w:r>
+        <w:t>content</w:t>
+      </w:r>
+      <w:proofErr w:type="spellEnd"/>
+      <w:r>
+        <w:t>="#0078d4"&gt;</w:t>
+      </w:r>
+    </w:p>
+    <w:p>
+      <w:pPr>
+        <w:rPr>
+          <w:b/>
+          <w:bCs/>
+        </w:rPr>
+      </w:pPr>
+      <w:r>
+        <w:rPr>
+          <w:b/>
+          <w:bCs/>
+        </w:rPr>
         <w:lastRenderedPageBreak/>
-        <w:t xml:space="preserve">  "</w:t>
-      </w:r>
-      <w:proofErr w:type="spellStart"/>
-      <w:r>
-        <w:t>display</w:t>
-      </w:r>
-      <w:proofErr w:type="spellEnd"/>
-      <w:r>
-        <w:t>": "</w:t>
-      </w:r>
-      <w:proofErr w:type="spellStart"/>
-      <w:r>
-        <w:t>standalone</w:t>
-      </w:r>
-      <w:proofErr w:type="spellEnd"/>
-      <w:r>
-        <w:t>",</w:t>
+        <w:t xml:space="preserve">Paso 3: Crear el </w:t>
+      </w:r>
+      <w:proofErr w:type="spellStart"/>
+      <w:r>
+        <w:rPr>
+          <w:b/>
+          <w:bCs/>
+        </w:rPr>
+        <w:t>Service</w:t>
+      </w:r>
+      <w:proofErr w:type="spellEnd"/>
+      <w:r>
+        <w:rPr>
+          <w:b/>
+          <w:bCs/>
+        </w:rPr>
+        <w:t xml:space="preserve"> </w:t>
+      </w:r>
+      <w:proofErr w:type="spellStart"/>
+      <w:r>
+        <w:rPr>
+          <w:b/>
+          <w:bCs/>
+        </w:rPr>
+        <w:t>Worker</w:t>
+      </w:r>
+      <w:proofErr w:type="spellEnd"/>
+      <w:r>
+        <w:rPr>
+          <w:b/>
+          <w:bCs/>
+        </w:rPr>
+        <w:t xml:space="preserve"> (sw.js)</w:t>
+      </w:r>
+    </w:p>
+    <w:p>
+      <w:r>
+        <w:t xml:space="preserve">El </w:t>
+      </w:r>
+      <w:proofErr w:type="spellStart"/>
+      <w:r>
+        <w:t>Service</w:t>
+      </w:r>
+      <w:proofErr w:type="spellEnd"/>
+      <w:r>
+        <w:t xml:space="preserve"> </w:t>
+      </w:r>
+      <w:proofErr w:type="spellStart"/>
+      <w:r>
+        <w:t>Worker</w:t>
+      </w:r>
+      <w:proofErr w:type="spellEnd"/>
+      <w:r>
+        <w:t xml:space="preserve"> es el motor que gestiona la caché y permite que la </w:t>
+      </w:r>
+      <w:proofErr w:type="spellStart"/>
+      <w:r>
+        <w:t>app</w:t>
+      </w:r>
+      <w:proofErr w:type="spellEnd"/>
+      <w:r>
+        <w:t xml:space="preserve"> cargue instantáneamente. Crea un archivo llamado sw.js en la raíz de tu proyecto con este código básico de almacenamiento en caché:</w:t>
       </w:r>
     </w:p>
     <w:p>
@@ -11607,250 +12210,234 @@
         <w:spacing w:after="0"/>
       </w:pPr>
       <w:r>
-        <w:t xml:space="preserve">  "</w:t>
-      </w:r>
-      <w:proofErr w:type="spellStart"/>
-      <w:r>
-        <w:t>orientation</w:t>
-      </w:r>
-      <w:proofErr w:type="spellEnd"/>
-      <w:r>
-        <w:t>": "</w:t>
-      </w:r>
-      <w:proofErr w:type="spellStart"/>
-      <w:r>
-        <w:t>portrait</w:t>
-      </w:r>
-      <w:proofErr w:type="spellEnd"/>
-      <w:r>
-        <w:t>"</w:t>
+        <w:t>JavaScript</w:t>
       </w:r>
     </w:p>
     <w:p>
       <w:pPr>
         <w:spacing w:after="0"/>
       </w:pPr>
-      <w:r>
-        <w:t>}</w:t>
-      </w:r>
-    </w:p>
-    <w:p>
-      <w:r>
-        <w:rPr>
-          <w:b/>
-          <w:bCs/>
-        </w:rPr>
-        <w:t>Nota clave:</w:t>
-      </w:r>
-      <w:r>
-        <w:t xml:space="preserve"> La propiedad "</w:t>
-      </w:r>
-      <w:proofErr w:type="spellStart"/>
-      <w:r>
-        <w:t>display</w:t>
-      </w:r>
-      <w:proofErr w:type="spellEnd"/>
-      <w:r>
-        <w:t>": "</w:t>
-      </w:r>
-      <w:proofErr w:type="spellStart"/>
-      <w:r>
-        <w:t>standalone</w:t>
-      </w:r>
-      <w:proofErr w:type="spellEnd"/>
-      <w:r>
-        <w:t xml:space="preserve">" es la que hace que la aplicación se abra en su propia ventana oculta, eliminando la barra de direcciones del navegador para que parezca una </w:t>
-      </w:r>
-      <w:proofErr w:type="spellStart"/>
-      <w:r>
-        <w:t>app</w:t>
-      </w:r>
-      <w:proofErr w:type="spellEnd"/>
-      <w:r>
-        <w:t xml:space="preserve"> de escritorio nativa.</w:t>
-      </w:r>
-    </w:p>
-    <w:p>
-      <w:pPr>
-        <w:rPr>
-          <w:b/>
-          <w:bCs/>
-        </w:rPr>
-      </w:pPr>
-      <w:r>
-        <w:rPr>
-          <w:b/>
-          <w:bCs/>
-        </w:rPr>
-        <w:t xml:space="preserve">Paso 2: Vincular el </w:t>
-      </w:r>
-      <w:proofErr w:type="spellStart"/>
-      <w:r>
-        <w:rPr>
-          <w:b/>
-          <w:bCs/>
-        </w:rPr>
-        <w:t>Manifest</w:t>
-      </w:r>
-      <w:proofErr w:type="spellEnd"/>
-      <w:r>
-        <w:rPr>
-          <w:b/>
-          <w:bCs/>
-        </w:rPr>
-        <w:t xml:space="preserve"> en tu HTML</w:t>
-      </w:r>
-    </w:p>
-    <w:p>
-      <w:r>
-        <w:t>En el &lt;head&gt; de tu archivo index.html, debes enlazar el archivo que acabas de crear:</w:t>
-      </w:r>
-    </w:p>
-    <w:p>
-      <w:r>
-        <w:t>HTML</w:t>
-      </w:r>
-    </w:p>
-    <w:p>
-      <w:r>
-        <w:t xml:space="preserve">&lt;link </w:t>
-      </w:r>
-      <w:proofErr w:type="spellStart"/>
-      <w:r>
-        <w:t>rel</w:t>
-      </w:r>
-      <w:proofErr w:type="spellEnd"/>
-      <w:r>
-        <w:t>="</w:t>
-      </w:r>
-      <w:proofErr w:type="spellStart"/>
-      <w:r>
-        <w:t>manifest</w:t>
-      </w:r>
-      <w:proofErr w:type="spellEnd"/>
-      <w:r>
-        <w:t xml:space="preserve">" </w:t>
-      </w:r>
-      <w:proofErr w:type="spellStart"/>
-      <w:r>
-        <w:t>href</w:t>
-      </w:r>
-      <w:proofErr w:type="spellEnd"/>
-      <w:r>
-        <w:t>="/</w:t>
-      </w:r>
-      <w:proofErr w:type="spellStart"/>
-      <w:r>
-        <w:t>manifest.json</w:t>
-      </w:r>
-      <w:proofErr w:type="spellEnd"/>
-      <w:r>
-        <w:t>"&gt;</w:t>
-      </w:r>
-    </w:p>
-    <w:p>
-      <w:r>
-        <w:t xml:space="preserve">&lt;meta </w:t>
-      </w:r>
-      <w:proofErr w:type="spellStart"/>
-      <w:r>
-        <w:t>name</w:t>
-      </w:r>
-      <w:proofErr w:type="spellEnd"/>
-      <w:r>
-        <w:t>="</w:t>
-      </w:r>
-      <w:proofErr w:type="spellStart"/>
-      <w:r>
-        <w:t>theme</w:t>
-      </w:r>
-      <w:proofErr w:type="spellEnd"/>
-      <w:r>
-        <w:t xml:space="preserve">-color" </w:t>
-      </w:r>
-      <w:proofErr w:type="spellStart"/>
-      <w:r>
-        <w:t>content</w:t>
-      </w:r>
-      <w:proofErr w:type="spellEnd"/>
-      <w:r>
-        <w:t>="#0078d4"&gt;</w:t>
-      </w:r>
-    </w:p>
-    <w:p>
-      <w:pPr>
-        <w:rPr>
-          <w:b/>
-          <w:bCs/>
-        </w:rPr>
-      </w:pPr>
-      <w:r>
-        <w:rPr>
-          <w:b/>
-          <w:bCs/>
-        </w:rPr>
-        <w:t xml:space="preserve">Paso 3: Crear el </w:t>
-      </w:r>
-      <w:proofErr w:type="spellStart"/>
-      <w:r>
-        <w:rPr>
-          <w:b/>
-          <w:bCs/>
-        </w:rPr>
-        <w:t>Service</w:t>
-      </w:r>
-      <w:proofErr w:type="spellEnd"/>
-      <w:r>
-        <w:rPr>
-          <w:b/>
-          <w:bCs/>
-        </w:rPr>
+      <w:proofErr w:type="spellStart"/>
+      <w:proofErr w:type="gramStart"/>
+      <w:r>
+        <w:t>const</w:t>
+      </w:r>
+      <w:proofErr w:type="spellEnd"/>
+      <w:proofErr w:type="gramEnd"/>
+      <w:r>
+        <w:t xml:space="preserve"> CACHE_NAME = 'v1_cache_miapp';</w:t>
+      </w:r>
+    </w:p>
+    <w:p>
+      <w:pPr>
+        <w:spacing w:after="0"/>
+      </w:pPr>
+      <w:r>
+        <w:t>// Archivos esenciales que quieres que funcionen incluso sin internet</w:t>
+      </w:r>
+    </w:p>
+    <w:p>
+      <w:pPr>
+        <w:spacing w:after="0"/>
+      </w:pPr>
+      <w:proofErr w:type="spellStart"/>
+      <w:proofErr w:type="gramStart"/>
+      <w:r>
+        <w:t>const</w:t>
+      </w:r>
+      <w:proofErr w:type="spellEnd"/>
+      <w:proofErr w:type="gramEnd"/>
+      <w:r>
         <w:t xml:space="preserve"> </w:t>
       </w:r>
       <w:proofErr w:type="spellStart"/>
       <w:r>
-        <w:rPr>
-          <w:b/>
-          <w:bCs/>
-        </w:rPr>
-        <w:t>Worker</w:t>
-      </w:r>
-      <w:proofErr w:type="spellEnd"/>
-      <w:r>
-        <w:rPr>
-          <w:b/>
-          <w:bCs/>
-        </w:rPr>
-        <w:t xml:space="preserve"> (sw.js)</w:t>
-      </w:r>
-    </w:p>
-    <w:p>
-      <w:r>
-        <w:t xml:space="preserve">El </w:t>
-      </w:r>
-      <w:proofErr w:type="spellStart"/>
-      <w:r>
-        <w:t>Service</w:t>
-      </w:r>
-      <w:proofErr w:type="spellEnd"/>
+        <w:t>urlsToCache</w:t>
+      </w:r>
+      <w:proofErr w:type="spellEnd"/>
+      <w:r>
+        <w:t xml:space="preserve"> = [</w:t>
+      </w:r>
+    </w:p>
+    <w:p>
+      <w:pPr>
+        <w:spacing w:after="0"/>
+      </w:pPr>
+      <w:r>
+        <w:t xml:space="preserve">  '/',</w:t>
+      </w:r>
+    </w:p>
+    <w:p>
+      <w:pPr>
+        <w:spacing w:after="0"/>
+      </w:pPr>
+      <w:r>
+        <w:t xml:space="preserve">  '/index.html',</w:t>
+      </w:r>
+    </w:p>
+    <w:p>
+      <w:pPr>
+        <w:spacing w:after="0"/>
+      </w:pPr>
+      <w:r>
+        <w:t xml:space="preserve">  '/styles.css',</w:t>
+      </w:r>
+    </w:p>
+    <w:p>
+      <w:pPr>
+        <w:spacing w:after="0"/>
+      </w:pPr>
+      <w:r>
+        <w:t xml:space="preserve">  '/script.js',</w:t>
+      </w:r>
+    </w:p>
+    <w:p>
+      <w:pPr>
+        <w:spacing w:after="0"/>
+      </w:pPr>
+      <w:r>
+        <w:t xml:space="preserve">  '/icon-192.png'</w:t>
+      </w:r>
+    </w:p>
+    <w:p>
+      <w:pPr>
+        <w:spacing w:after="0"/>
+      </w:pPr>
+      <w:r>
+        <w:t>];</w:t>
+      </w:r>
+    </w:p>
+    <w:p>
+      <w:pPr>
+        <w:spacing w:after="0"/>
+      </w:pPr>
+    </w:p>
+    <w:p>
+      <w:pPr>
+        <w:spacing w:after="0"/>
+      </w:pPr>
+      <w:r>
+        <w:t>// Evento de instalación: Guarda los archivos en la caché del navegador</w:t>
+      </w:r>
+    </w:p>
+    <w:p>
+      <w:pPr>
+        <w:spacing w:after="0"/>
+      </w:pPr>
+      <w:proofErr w:type="spellStart"/>
+      <w:proofErr w:type="gramStart"/>
+      <w:r>
+        <w:t>self.addEventListener</w:t>
+      </w:r>
+      <w:proofErr w:type="spellEnd"/>
+      <w:r>
+        <w:t>(</w:t>
+      </w:r>
+      <w:proofErr w:type="gramEnd"/>
+      <w:r>
+        <w:t>'</w:t>
+      </w:r>
+      <w:proofErr w:type="spellStart"/>
+      <w:r>
+        <w:t>install</w:t>
+      </w:r>
+      <w:proofErr w:type="spellEnd"/>
+      <w:r>
+        <w:t>', e =&gt; {</w:t>
+      </w:r>
+    </w:p>
+    <w:p>
+      <w:pPr>
+        <w:spacing w:after="0"/>
+      </w:pPr>
+      <w:r>
+        <w:t xml:space="preserve">  </w:t>
+      </w:r>
+      <w:proofErr w:type="spellStart"/>
+      <w:proofErr w:type="gramStart"/>
+      <w:r>
+        <w:t>e.waitUntil</w:t>
+      </w:r>
+      <w:proofErr w:type="spellEnd"/>
+      <w:r>
+        <w:t>(</w:t>
+      </w:r>
+      <w:proofErr w:type="gramEnd"/>
+    </w:p>
+    <w:p>
+      <w:pPr>
+        <w:spacing w:after="0"/>
+      </w:pPr>
+      <w:r>
+        <w:t xml:space="preserve">    </w:t>
+      </w:r>
+      <w:proofErr w:type="spellStart"/>
+      <w:proofErr w:type="gramStart"/>
+      <w:r>
+        <w:t>caches.open</w:t>
+      </w:r>
+      <w:proofErr w:type="spellEnd"/>
+      <w:r>
+        <w:t>(</w:t>
+      </w:r>
+      <w:proofErr w:type="gramEnd"/>
+      <w:r>
+        <w:t>CACHE_NAME)</w:t>
+      </w:r>
+    </w:p>
+    <w:p>
+      <w:pPr>
+        <w:spacing w:after="0"/>
+      </w:pPr>
+      <w:r>
+        <w:t xml:space="preserve">      .</w:t>
+      </w:r>
+      <w:proofErr w:type="spellStart"/>
+      <w:proofErr w:type="gramStart"/>
+      <w:r>
+        <w:t>then</w:t>
+      </w:r>
+      <w:proofErr w:type="spellEnd"/>
+      <w:r>
+        <w:t>(</w:t>
+      </w:r>
+      <w:proofErr w:type="gramEnd"/>
+      <w:r>
+        <w:t>cache =&gt; {</w:t>
+      </w:r>
+    </w:p>
+    <w:p>
+      <w:pPr>
+        <w:spacing w:after="0"/>
+      </w:pPr>
+      <w:r>
+        <w:t xml:space="preserve">        </w:t>
+      </w:r>
+      <w:proofErr w:type="spellStart"/>
+      <w:proofErr w:type="gramStart"/>
+      <w:r>
+        <w:t>return</w:t>
+      </w:r>
+      <w:proofErr w:type="spellEnd"/>
+      <w:proofErr w:type="gramEnd"/>
       <w:r>
         <w:t xml:space="preserve"> </w:t>
       </w:r>
       <w:proofErr w:type="spellStart"/>
       <w:r>
-        <w:t>Worker</w:t>
-      </w:r>
-      <w:proofErr w:type="spellEnd"/>
-      <w:r>
-        <w:t xml:space="preserve"> es el motor que gestiona la caché y permite que la </w:t>
-      </w:r>
-      <w:proofErr w:type="spellStart"/>
-      <w:r>
-        <w:t>app</w:t>
-      </w:r>
-      <w:proofErr w:type="spellEnd"/>
-      <w:r>
-        <w:t xml:space="preserve"> cargue instantáneamente. Crea un archivo llamado sw.js en la raíz de tu proyecto con este código básico de almacenamiento en caché:</w:t>
+        <w:t>cache.addAll</w:t>
+      </w:r>
+      <w:proofErr w:type="spellEnd"/>
+      <w:r>
+        <w:t>(</w:t>
+      </w:r>
+      <w:proofErr w:type="spellStart"/>
+      <w:r>
+        <w:t>urlsToCache</w:t>
+      </w:r>
+      <w:proofErr w:type="spellEnd"/>
+      <w:r>
+        <w:t>);</w:t>
       </w:r>
     </w:p>
     <w:p>
@@ -11858,22 +12445,36 @@
         <w:spacing w:after="0"/>
       </w:pPr>
       <w:r>
-        <w:t>JavaScript</w:t>
+        <w:t xml:space="preserve">      })</w:t>
       </w:r>
     </w:p>
     <w:p>
       <w:pPr>
         <w:spacing w:after="0"/>
       </w:pPr>
+      <w:r>
+        <w:t xml:space="preserve">      .</w:t>
+      </w:r>
       <w:proofErr w:type="spellStart"/>
       <w:proofErr w:type="gramStart"/>
       <w:r>
-        <w:t>const</w:t>
-      </w:r>
-      <w:proofErr w:type="spellEnd"/>
+        <w:t>then</w:t>
+      </w:r>
+      <w:proofErr w:type="spellEnd"/>
+      <w:r>
+        <w:t>(</w:t>
+      </w:r>
       <w:proofErr w:type="gramEnd"/>
       <w:r>
-        <w:t xml:space="preserve"> CACHE_NAME = 'v1_cache_miapp';</w:t>
+        <w:t xml:space="preserve">() =&gt; </w:t>
+      </w:r>
+      <w:proofErr w:type="spellStart"/>
+      <w:r>
+        <w:t>self.skipWaiting</w:t>
+      </w:r>
+      <w:proofErr w:type="spellEnd"/>
+      <w:r>
+        <w:t>())</w:t>
       </w:r>
     </w:p>
     <w:p>
@@ -11881,30 +12482,135 @@
         <w:spacing w:after="0"/>
       </w:pPr>
       <w:r>
-        <w:t>// Archivos esenciales que quieres que funcionen incluso sin internet</w:t>
+        <w:t xml:space="preserve">  );</w:t>
       </w:r>
     </w:p>
     <w:p>
       <w:pPr>
         <w:spacing w:after="0"/>
       </w:pPr>
+      <w:r>
+        <w:t>});</w:t>
+      </w:r>
+    </w:p>
+    <w:p>
+      <w:pPr>
+        <w:spacing w:after="0"/>
+      </w:pPr>
+    </w:p>
+    <w:p>
+      <w:pPr>
+        <w:spacing w:after="0"/>
+      </w:pPr>
+      <w:r>
+        <w:t>// Evento de activación: Limpia cachés antiguas</w:t>
+      </w:r>
+    </w:p>
+    <w:p>
+      <w:pPr>
+        <w:spacing w:after="0"/>
+      </w:pPr>
       <w:proofErr w:type="spellStart"/>
       <w:proofErr w:type="gramStart"/>
       <w:r>
-        <w:t>const</w:t>
-      </w:r>
-      <w:proofErr w:type="spellEnd"/>
+        <w:t>self.addEventListener</w:t>
+      </w:r>
+      <w:proofErr w:type="spellEnd"/>
+      <w:r>
+        <w:t>(</w:t>
+      </w:r>
       <w:proofErr w:type="gramEnd"/>
       <w:r>
+        <w:t>'</w:t>
+      </w:r>
+      <w:proofErr w:type="spellStart"/>
+      <w:r>
+        <w:t>activate</w:t>
+      </w:r>
+      <w:proofErr w:type="spellEnd"/>
+      <w:r>
+        <w:t>', e =&gt; {</w:t>
+      </w:r>
+    </w:p>
+    <w:p>
+      <w:pPr>
+        <w:spacing w:after="0"/>
+      </w:pPr>
+      <w:r>
+        <w:t xml:space="preserve">  </w:t>
+      </w:r>
+      <w:proofErr w:type="spellStart"/>
+      <w:proofErr w:type="gramStart"/>
+      <w:r>
+        <w:t>e.waitUntil</w:t>
+      </w:r>
+      <w:proofErr w:type="spellEnd"/>
+      <w:r>
+        <w:t>(</w:t>
+      </w:r>
+      <w:proofErr w:type="gramEnd"/>
+    </w:p>
+    <w:p>
+      <w:pPr>
+        <w:spacing w:after="0"/>
+      </w:pPr>
+      <w:r>
+        <w:t xml:space="preserve">    </w:t>
+      </w:r>
+      <w:proofErr w:type="spellStart"/>
+      <w:proofErr w:type="gramStart"/>
+      <w:r>
+        <w:t>caches.keys</w:t>
+      </w:r>
+      <w:proofErr w:type="spellEnd"/>
+      <w:r>
+        <w:t>(</w:t>
+      </w:r>
+      <w:proofErr w:type="gramEnd"/>
+      <w:r>
+        <w:t>).</w:t>
+      </w:r>
+      <w:proofErr w:type="spellStart"/>
+      <w:r>
+        <w:t>then</w:t>
+      </w:r>
+      <w:proofErr w:type="spellEnd"/>
+      <w:r>
+        <w:t>(</w:t>
+      </w:r>
+      <w:proofErr w:type="spellStart"/>
+      <w:r>
+        <w:t>cacheNames</w:t>
+      </w:r>
+      <w:proofErr w:type="spellEnd"/>
+      <w:r>
+        <w:t xml:space="preserve"> =&gt; {</w:t>
+      </w:r>
+    </w:p>
+    <w:p>
+      <w:pPr>
+        <w:spacing w:after="0"/>
+      </w:pPr>
+      <w:r>
+        <w:t xml:space="preserve">      </w:t>
+      </w:r>
+      <w:proofErr w:type="spellStart"/>
+      <w:proofErr w:type="gramStart"/>
+      <w:r>
+        <w:t>return</w:t>
+      </w:r>
+      <w:proofErr w:type="spellEnd"/>
+      <w:proofErr w:type="gramEnd"/>
+      <w:r>
         <w:t xml:space="preserve"> </w:t>
       </w:r>
       <w:proofErr w:type="spellStart"/>
       <w:r>
-        <w:t>urlsToCache</w:t>
-      </w:r>
-      <w:proofErr w:type="spellEnd"/>
-      <w:r>
-        <w:t xml:space="preserve"> = [</w:t>
+        <w:t>Promise.all</w:t>
+      </w:r>
+      <w:proofErr w:type="spellEnd"/>
+      <w:r>
+        <w:t>(</w:t>
       </w:r>
     </w:p>
     <w:p>
@@ -11912,7 +12618,20 @@
         <w:spacing w:after="0"/>
       </w:pPr>
       <w:r>
-        <w:t xml:space="preserve">  '/',</w:t>
+        <w:t xml:space="preserve">        </w:t>
+      </w:r>
+      <w:proofErr w:type="spellStart"/>
+      <w:proofErr w:type="gramStart"/>
+      <w:r>
+        <w:t>cacheNames.map</w:t>
+      </w:r>
+      <w:proofErr w:type="spellEnd"/>
+      <w:r>
+        <w:t>(</w:t>
+      </w:r>
+      <w:proofErr w:type="gramEnd"/>
+      <w:r>
+        <w:t>cache =&gt; {</w:t>
       </w:r>
     </w:p>
     <w:p>
@@ -11920,7 +12639,17 @@
         <w:spacing w:after="0"/>
       </w:pPr>
       <w:r>
-        <w:t xml:space="preserve">  '/index.html',</w:t>
+        <w:t xml:space="preserve">          </w:t>
+      </w:r>
+      <w:proofErr w:type="spellStart"/>
+      <w:proofErr w:type="gramStart"/>
+      <w:r>
+        <w:t>if</w:t>
+      </w:r>
+      <w:proofErr w:type="spellEnd"/>
+      <w:proofErr w:type="gramEnd"/>
+      <w:r>
+        <w:t xml:space="preserve"> (cache !== CACHE_NAME) {</w:t>
       </w:r>
     </w:p>
     <w:p>
@@ -11928,7 +12657,25 @@
         <w:spacing w:after="0"/>
       </w:pPr>
       <w:r>
-        <w:t xml:space="preserve">  '/styles.css',</w:t>
+        <w:t xml:space="preserve">            </w:t>
+      </w:r>
+      <w:proofErr w:type="spellStart"/>
+      <w:proofErr w:type="gramStart"/>
+      <w:r>
+        <w:t>return</w:t>
+      </w:r>
+      <w:proofErr w:type="spellEnd"/>
+      <w:proofErr w:type="gramEnd"/>
+      <w:r>
+        <w:t xml:space="preserve"> </w:t>
+      </w:r>
+      <w:proofErr w:type="spellStart"/>
+      <w:r>
+        <w:t>caches.delete</w:t>
+      </w:r>
+      <w:proofErr w:type="spellEnd"/>
+      <w:r>
+        <w:t>(cache);</w:t>
       </w:r>
     </w:p>
     <w:p>
@@ -11936,7 +12683,7 @@
         <w:spacing w:after="0"/>
       </w:pPr>
       <w:r>
-        <w:t xml:space="preserve">  '/script.js',</w:t>
+        <w:t xml:space="preserve">          }</w:t>
       </w:r>
     </w:p>
     <w:p>
@@ -11944,7 +12691,7 @@
         <w:spacing w:after="0"/>
       </w:pPr>
       <w:r>
-        <w:t xml:space="preserve">  '/icon-192.png'</w:t>
+        <w:t xml:space="preserve">        })</w:t>
       </w:r>
     </w:p>
     <w:p>
@@ -11952,26 +12699,58 @@
         <w:spacing w:after="0"/>
       </w:pPr>
       <w:r>
-        <w:t>];</w:t>
+        <w:t xml:space="preserve">      );</w:t>
       </w:r>
     </w:p>
     <w:p>
       <w:pPr>
         <w:spacing w:after="0"/>
       </w:pPr>
+      <w:r>
+        <w:t xml:space="preserve">    })</w:t>
+      </w:r>
     </w:p>
     <w:p>
       <w:pPr>
         <w:spacing w:after="0"/>
       </w:pPr>
       <w:r>
-        <w:t>// Evento de instalación: Guarda los archivos en la caché del navegador</w:t>
+        <w:t xml:space="preserve">  );</w:t>
       </w:r>
     </w:p>
     <w:p>
       <w:pPr>
         <w:spacing w:after="0"/>
       </w:pPr>
+      <w:r>
+        <w:t>});</w:t>
+      </w:r>
+    </w:p>
+    <w:p>
+      <w:pPr>
+        <w:spacing w:after="0"/>
+      </w:pPr>
+    </w:p>
+    <w:p>
+      <w:pPr>
+        <w:spacing w:after="0"/>
+      </w:pPr>
+      <w:r>
+        <w:t xml:space="preserve">// Evento </w:t>
+      </w:r>
+      <w:proofErr w:type="spellStart"/>
+      <w:r>
+        <w:t>fetch</w:t>
+      </w:r>
+      <w:proofErr w:type="spellEnd"/>
+      <w:r>
+        <w:t>: Sirve el contenido desde la caché si no hay internet</w:t>
+      </w:r>
+    </w:p>
+    <w:p>
+      <w:pPr>
+        <w:spacing w:after="0"/>
+      </w:pPr>
       <w:proofErr w:type="spellStart"/>
       <w:proofErr w:type="gramStart"/>
       <w:r>
@@ -11987,7 +12766,7 @@
       </w:r>
       <w:proofErr w:type="spellStart"/>
       <w:r>
-        <w:t>install</w:t>
+        <w:t>fetch</w:t>
       </w:r>
       <w:proofErr w:type="spellEnd"/>
       <w:r>
@@ -12004,7 +12783,7 @@
       <w:proofErr w:type="spellStart"/>
       <w:proofErr w:type="gramStart"/>
       <w:r>
-        <w:t>e.waitUntil</w:t>
+        <w:t>e.respondWith</w:t>
       </w:r>
       <w:proofErr w:type="spellEnd"/>
       <w:r>
@@ -12017,434 +12796,7 @@
         <w:spacing w:after="0"/>
       </w:pPr>
       <w:r>
-        <w:t xml:space="preserve">    </w:t>
-      </w:r>
-      <w:proofErr w:type="spellStart"/>
-      <w:proofErr w:type="gramStart"/>
-      <w:r>
-        <w:t>caches.open</w:t>
-      </w:r>
-      <w:proofErr w:type="spellEnd"/>
-      <w:r>
-        <w:t>(</w:t>
-      </w:r>
-      <w:proofErr w:type="gramEnd"/>
-      <w:r>
-        <w:t>CACHE_NAME)</w:t>
-      </w:r>
-    </w:p>
-    <w:p>
-      <w:pPr>
-        <w:spacing w:after="0"/>
-      </w:pPr>
-      <w:r>
-        <w:t xml:space="preserve">      .</w:t>
-      </w:r>
-      <w:proofErr w:type="spellStart"/>
-      <w:proofErr w:type="gramStart"/>
-      <w:r>
-        <w:t>then</w:t>
-      </w:r>
-      <w:proofErr w:type="spellEnd"/>
-      <w:r>
-        <w:t>(</w:t>
-      </w:r>
-      <w:proofErr w:type="gramEnd"/>
-      <w:r>
-        <w:t>cache =&gt; {</w:t>
-      </w:r>
-    </w:p>
-    <w:p>
-      <w:pPr>
-        <w:spacing w:after="0"/>
-      </w:pPr>
-      <w:r>
-        <w:t xml:space="preserve">        </w:t>
-      </w:r>
-      <w:proofErr w:type="spellStart"/>
-      <w:proofErr w:type="gramStart"/>
-      <w:r>
-        <w:t>return</w:t>
-      </w:r>
-      <w:proofErr w:type="spellEnd"/>
-      <w:proofErr w:type="gramEnd"/>
-      <w:r>
-        <w:t xml:space="preserve"> </w:t>
-      </w:r>
-      <w:proofErr w:type="spellStart"/>
-      <w:r>
-        <w:t>cache.addAll</w:t>
-      </w:r>
-      <w:proofErr w:type="spellEnd"/>
-      <w:r>
-        <w:t>(</w:t>
-      </w:r>
-      <w:proofErr w:type="spellStart"/>
-      <w:r>
-        <w:t>urlsToCache</w:t>
-      </w:r>
-      <w:proofErr w:type="spellEnd"/>
-      <w:r>
-        <w:t>);</w:t>
-      </w:r>
-    </w:p>
-    <w:p>
-      <w:pPr>
-        <w:spacing w:after="0"/>
-      </w:pPr>
-      <w:r>
-        <w:t xml:space="preserve">      })</w:t>
-      </w:r>
-    </w:p>
-    <w:p>
-      <w:pPr>
-        <w:spacing w:after="0"/>
-      </w:pPr>
-      <w:r>
-        <w:t xml:space="preserve">      .</w:t>
-      </w:r>
-      <w:proofErr w:type="spellStart"/>
-      <w:proofErr w:type="gramStart"/>
-      <w:r>
-        <w:t>then</w:t>
-      </w:r>
-      <w:proofErr w:type="spellEnd"/>
-      <w:r>
-        <w:t>(</w:t>
-      </w:r>
-      <w:proofErr w:type="gramEnd"/>
-      <w:r>
-        <w:t xml:space="preserve">() =&gt; </w:t>
-      </w:r>
-      <w:proofErr w:type="spellStart"/>
-      <w:r>
-        <w:t>self.skipWaiting</w:t>
-      </w:r>
-      <w:proofErr w:type="spellEnd"/>
-      <w:r>
-        <w:t>())</w:t>
-      </w:r>
-    </w:p>
-    <w:p>
-      <w:pPr>
-        <w:spacing w:after="0"/>
-      </w:pPr>
-      <w:r>
-        <w:t xml:space="preserve">  );</w:t>
-      </w:r>
-    </w:p>
-    <w:p>
-      <w:pPr>
-        <w:spacing w:after="0"/>
-      </w:pPr>
-      <w:r>
-        <w:t>});</w:t>
-      </w:r>
-    </w:p>
-    <w:p>
-      <w:pPr>
-        <w:spacing w:after="0"/>
-      </w:pPr>
-    </w:p>
-    <w:p>
-      <w:pPr>
-        <w:spacing w:after="0"/>
-      </w:pPr>
-      <w:r>
-        <w:t>// Evento de activación: Limpia cachés antiguas</w:t>
-      </w:r>
-    </w:p>
-    <w:p>
-      <w:pPr>
-        <w:spacing w:after="0"/>
-      </w:pPr>
-      <w:proofErr w:type="spellStart"/>
-      <w:proofErr w:type="gramStart"/>
-      <w:r>
-        <w:t>self.addEventListener</w:t>
-      </w:r>
-      <w:proofErr w:type="spellEnd"/>
-      <w:r>
-        <w:t>(</w:t>
-      </w:r>
-      <w:proofErr w:type="gramEnd"/>
-      <w:r>
-        <w:t>'</w:t>
-      </w:r>
-      <w:proofErr w:type="spellStart"/>
-      <w:r>
-        <w:t>activate</w:t>
-      </w:r>
-      <w:proofErr w:type="spellEnd"/>
-      <w:r>
-        <w:t>', e =&gt; {</w:t>
-      </w:r>
-    </w:p>
-    <w:p>
-      <w:pPr>
-        <w:spacing w:after="0"/>
-      </w:pPr>
-      <w:r>
-        <w:t xml:space="preserve">  </w:t>
-      </w:r>
-      <w:proofErr w:type="spellStart"/>
-      <w:proofErr w:type="gramStart"/>
-      <w:r>
-        <w:t>e.waitUntil</w:t>
-      </w:r>
-      <w:proofErr w:type="spellEnd"/>
-      <w:r>
-        <w:t>(</w:t>
-      </w:r>
-      <w:proofErr w:type="gramEnd"/>
-    </w:p>
-    <w:p>
-      <w:pPr>
-        <w:spacing w:after="0"/>
-      </w:pPr>
-      <w:r>
         <w:lastRenderedPageBreak/>
-        <w:t xml:space="preserve">    </w:t>
-      </w:r>
-      <w:proofErr w:type="spellStart"/>
-      <w:proofErr w:type="gramStart"/>
-      <w:r>
-        <w:t>caches.keys</w:t>
-      </w:r>
-      <w:proofErr w:type="spellEnd"/>
-      <w:r>
-        <w:t>(</w:t>
-      </w:r>
-      <w:proofErr w:type="gramEnd"/>
-      <w:r>
-        <w:t>).</w:t>
-      </w:r>
-      <w:proofErr w:type="spellStart"/>
-      <w:r>
-        <w:t>then</w:t>
-      </w:r>
-      <w:proofErr w:type="spellEnd"/>
-      <w:r>
-        <w:t>(</w:t>
-      </w:r>
-      <w:proofErr w:type="spellStart"/>
-      <w:r>
-        <w:t>cacheNames</w:t>
-      </w:r>
-      <w:proofErr w:type="spellEnd"/>
-      <w:r>
-        <w:t xml:space="preserve"> =&gt; {</w:t>
-      </w:r>
-    </w:p>
-    <w:p>
-      <w:pPr>
-        <w:spacing w:after="0"/>
-      </w:pPr>
-      <w:r>
-        <w:t xml:space="preserve">      </w:t>
-      </w:r>
-      <w:proofErr w:type="spellStart"/>
-      <w:proofErr w:type="gramStart"/>
-      <w:r>
-        <w:t>return</w:t>
-      </w:r>
-      <w:proofErr w:type="spellEnd"/>
-      <w:proofErr w:type="gramEnd"/>
-      <w:r>
-        <w:t xml:space="preserve"> </w:t>
-      </w:r>
-      <w:proofErr w:type="spellStart"/>
-      <w:r>
-        <w:t>Promise.all</w:t>
-      </w:r>
-      <w:proofErr w:type="spellEnd"/>
-      <w:r>
-        <w:t>(</w:t>
-      </w:r>
-    </w:p>
-    <w:p>
-      <w:pPr>
-        <w:spacing w:after="0"/>
-      </w:pPr>
-      <w:r>
-        <w:t xml:space="preserve">        </w:t>
-      </w:r>
-      <w:proofErr w:type="spellStart"/>
-      <w:proofErr w:type="gramStart"/>
-      <w:r>
-        <w:t>cacheNames.map</w:t>
-      </w:r>
-      <w:proofErr w:type="spellEnd"/>
-      <w:r>
-        <w:t>(</w:t>
-      </w:r>
-      <w:proofErr w:type="gramEnd"/>
-      <w:r>
-        <w:t>cache =&gt; {</w:t>
-      </w:r>
-    </w:p>
-    <w:p>
-      <w:pPr>
-        <w:spacing w:after="0"/>
-      </w:pPr>
-      <w:r>
-        <w:t xml:space="preserve">          </w:t>
-      </w:r>
-      <w:proofErr w:type="spellStart"/>
-      <w:proofErr w:type="gramStart"/>
-      <w:r>
-        <w:t>if</w:t>
-      </w:r>
-      <w:proofErr w:type="spellEnd"/>
-      <w:proofErr w:type="gramEnd"/>
-      <w:r>
-        <w:t xml:space="preserve"> (cache !== CACHE_NAME) {</w:t>
-      </w:r>
-    </w:p>
-    <w:p>
-      <w:pPr>
-        <w:spacing w:after="0"/>
-      </w:pPr>
-      <w:r>
-        <w:t xml:space="preserve">            </w:t>
-      </w:r>
-      <w:proofErr w:type="spellStart"/>
-      <w:proofErr w:type="gramStart"/>
-      <w:r>
-        <w:t>return</w:t>
-      </w:r>
-      <w:proofErr w:type="spellEnd"/>
-      <w:proofErr w:type="gramEnd"/>
-      <w:r>
-        <w:t xml:space="preserve"> </w:t>
-      </w:r>
-      <w:proofErr w:type="spellStart"/>
-      <w:r>
-        <w:t>caches.delete</w:t>
-      </w:r>
-      <w:proofErr w:type="spellEnd"/>
-      <w:r>
-        <w:t>(cache);</w:t>
-      </w:r>
-    </w:p>
-    <w:p>
-      <w:pPr>
-        <w:spacing w:after="0"/>
-      </w:pPr>
-      <w:r>
-        <w:t xml:space="preserve">          }</w:t>
-      </w:r>
-    </w:p>
-    <w:p>
-      <w:pPr>
-        <w:spacing w:after="0"/>
-      </w:pPr>
-      <w:r>
-        <w:t xml:space="preserve">        })</w:t>
-      </w:r>
-    </w:p>
-    <w:p>
-      <w:pPr>
-        <w:spacing w:after="0"/>
-      </w:pPr>
-      <w:r>
-        <w:t xml:space="preserve">      );</w:t>
-      </w:r>
-    </w:p>
-    <w:p>
-      <w:pPr>
-        <w:spacing w:after="0"/>
-      </w:pPr>
-      <w:r>
-        <w:t xml:space="preserve">    })</w:t>
-      </w:r>
-    </w:p>
-    <w:p>
-      <w:pPr>
-        <w:spacing w:after="0"/>
-      </w:pPr>
-      <w:r>
-        <w:t xml:space="preserve">  );</w:t>
-      </w:r>
-    </w:p>
-    <w:p>
-      <w:pPr>
-        <w:spacing w:after="0"/>
-      </w:pPr>
-      <w:r>
-        <w:t>});</w:t>
-      </w:r>
-    </w:p>
-    <w:p>
-      <w:pPr>
-        <w:spacing w:after="0"/>
-      </w:pPr>
-    </w:p>
-    <w:p>
-      <w:pPr>
-        <w:spacing w:after="0"/>
-      </w:pPr>
-      <w:r>
-        <w:t xml:space="preserve">// Evento </w:t>
-      </w:r>
-      <w:proofErr w:type="spellStart"/>
-      <w:r>
-        <w:t>fetch</w:t>
-      </w:r>
-      <w:proofErr w:type="spellEnd"/>
-      <w:r>
-        <w:t>: Sirve el contenido desde la caché si no hay internet</w:t>
-      </w:r>
-    </w:p>
-    <w:p>
-      <w:pPr>
-        <w:spacing w:after="0"/>
-      </w:pPr>
-      <w:proofErr w:type="spellStart"/>
-      <w:proofErr w:type="gramStart"/>
-      <w:r>
-        <w:t>self.addEventListener</w:t>
-      </w:r>
-      <w:proofErr w:type="spellEnd"/>
-      <w:r>
-        <w:t>(</w:t>
-      </w:r>
-      <w:proofErr w:type="gramEnd"/>
-      <w:r>
-        <w:t>'</w:t>
-      </w:r>
-      <w:proofErr w:type="spellStart"/>
-      <w:r>
-        <w:t>fetch</w:t>
-      </w:r>
-      <w:proofErr w:type="spellEnd"/>
-      <w:r>
-        <w:t>', e =&gt; {</w:t>
-      </w:r>
-    </w:p>
-    <w:p>
-      <w:pPr>
-        <w:spacing w:after="0"/>
-      </w:pPr>
-      <w:r>
-        <w:t xml:space="preserve">  </w:t>
-      </w:r>
-      <w:proofErr w:type="spellStart"/>
-      <w:proofErr w:type="gramStart"/>
-      <w:r>
-        <w:t>e.respondWith</w:t>
-      </w:r>
-      <w:proofErr w:type="spellEnd"/>
-      <w:r>
-        <w:t>(</w:t>
-      </w:r>
-      <w:proofErr w:type="gramEnd"/>
-    </w:p>
-    <w:p>
-      <w:pPr>
-        <w:spacing w:after="0"/>
-      </w:pPr>
-      <w:r>
         <w:t xml:space="preserve">    </w:t>
       </w:r>
       <w:proofErr w:type="spellStart"/>
@@ -12860,7 +13212,6 @@
           <w:b/>
           <w:bCs/>
         </w:rPr>
-        <w:lastRenderedPageBreak/>
         <w:t>Ejecuta un servidor local:</w:t>
       </w:r>
       <w:r>
@@ -16608,7 +16959,6 @@
   <w:style w:type="character" w:default="1" w:styleId="Fuentedeprrafopredeter">
     <w:name w:val="Default Paragraph Font"/>
     <w:uiPriority w:val="1"/>
-    <w:semiHidden/>
     <w:unhideWhenUsed/>
   </w:style>
   <w:style w:type="table" w:default="1" w:styleId="Tablanormal">
@@ -16820,7 +17170,6 @@
   <w:style w:type="character" w:default="1" w:styleId="Fuentedeprrafopredeter">
     <w:name w:val="Default Paragraph Font"/>
     <w:uiPriority w:val="1"/>
-    <w:semiHidden/>
     <w:unhideWhenUsed/>
   </w:style>
   <w:style w:type="table" w:default="1" w:styleId="Tablanormal">
@@ -17159,7 +17508,7 @@
 </file>
 
 <file path=customXml/itemProps1.xml><?xml version="1.0" encoding="utf-8"?>
-<ds:datastoreItem xmlns:ds="http://schemas.openxmlformats.org/officeDocument/2006/customXml" ds:itemID="{0A2CC7B0-2F45-4B67-B4C9-990DAF91002A}">
+<ds:datastoreItem xmlns:ds="http://schemas.openxmlformats.org/officeDocument/2006/customXml" ds:itemID="{D78F291F-79EA-4232-BDAB-FEB323AB55A6}">
   <ds:schemaRefs>
     <ds:schemaRef ds:uri="http://schemas.openxmlformats.org/officeDocument/2006/bibliography"/>
   </ds:schemaRefs>

</xml_diff>

<commit_message>
realizo correcciones al dasboard del sistema y al encabezado del modulo de cierre de notas
</commit_message>
<xml_diff>
--- a/requerimientos.docx
+++ b/requerimientos.docx
@@ -11014,187 +11014,215 @@
           <w:lang w:val="es-ES"/>
         </w:rPr>
       </w:pPr>
+      <w:r>
+        <w:rPr>
+          <w:b/>
+          <w:lang w:val="es-ES"/>
+        </w:rPr>
+        <w:t xml:space="preserve">Necesito agregar al sistema lo siguiente, en el menú </w:t>
+      </w:r>
+      <w:proofErr w:type="spellStart"/>
+      <w:r>
+        <w:rPr>
+          <w:b/>
+          <w:lang w:val="es-ES"/>
+        </w:rPr>
+        <w:t>Administracion</w:t>
+      </w:r>
+      <w:proofErr w:type="spellEnd"/>
+      <w:r>
+        <w:rPr>
+          <w:b/>
+          <w:lang w:val="es-ES"/>
+        </w:rPr>
+        <w:t xml:space="preserve">, la opción Ciclos lectivos, allí me debe permitir mediante un crud armar el ciclo lectivo correspondiente al año en curso, </w:t>
+      </w:r>
+      <w:r>
+        <w:rPr>
+          <w:b/>
+          <w:lang w:val="es-ES"/>
+        </w:rPr>
+        <w:t xml:space="preserve">se toma un ciclo lectivo por año, </w:t>
+      </w:r>
+      <w:r>
+        <w:rPr>
+          <w:b/>
+          <w:lang w:val="es-ES"/>
+        </w:rPr>
+        <w:t xml:space="preserve">del ciclo lectivo necesito almacenar, </w:t>
+      </w:r>
+      <w:proofErr w:type="spellStart"/>
+      <w:r>
+        <w:rPr>
+          <w:b/>
+          <w:lang w:val="es-ES"/>
+        </w:rPr>
+        <w:t>fechadeinicio</w:t>
+      </w:r>
+      <w:proofErr w:type="spellEnd"/>
+      <w:r>
+        <w:rPr>
+          <w:b/>
+          <w:lang w:val="es-ES"/>
+        </w:rPr>
+        <w:t xml:space="preserve">, </w:t>
+      </w:r>
+      <w:proofErr w:type="spellStart"/>
+      <w:r>
+        <w:rPr>
+          <w:b/>
+          <w:lang w:val="es-ES"/>
+        </w:rPr>
+        <w:t>fechadefinalizacion</w:t>
+      </w:r>
+      <w:proofErr w:type="spellEnd"/>
+      <w:r>
+        <w:rPr>
+          <w:b/>
+          <w:lang w:val="es-ES"/>
+        </w:rPr>
+        <w:t>, año, y necesito enlazar</w:t>
+      </w:r>
+      <w:r>
+        <w:rPr>
+          <w:b/>
+          <w:lang w:val="es-ES"/>
+        </w:rPr>
+        <w:t>(agregar) a todos los registros donde corresponda(tablas) la correspondiente relación al ciclo lectivo,</w:t>
+      </w:r>
+      <w:r>
+        <w:rPr>
+          <w:b/>
+          <w:lang w:val="es-ES"/>
+        </w:rPr>
+        <w:t xml:space="preserve"> en la base de datos al ciclo lectivo, </w:t>
+      </w:r>
+      <w:proofErr w:type="spellStart"/>
+      <w:r>
+        <w:rPr>
+          <w:b/>
+          <w:lang w:val="es-ES"/>
+        </w:rPr>
+        <w:t>asi</w:t>
+      </w:r>
+      <w:proofErr w:type="spellEnd"/>
+      <w:r>
+        <w:rPr>
+          <w:b/>
+          <w:lang w:val="es-ES"/>
+        </w:rPr>
+        <w:t xml:space="preserve"> cuando finaliza el ciclo lectivo en curso, me pida si quiero </w:t>
+      </w:r>
+      <w:r>
+        <w:rPr>
+          <w:b/>
+          <w:lang w:val="es-ES"/>
+        </w:rPr>
+        <w:t xml:space="preserve">generar un nuevo ciclo lectivo, y los datos que se carguen en el siguiente ciclo lectivo ya se enlacen con el nuevo ciclo </w:t>
+      </w:r>
+      <w:proofErr w:type="spellStart"/>
+      <w:r>
+        <w:rPr>
+          <w:b/>
+          <w:lang w:val="es-ES"/>
+        </w:rPr>
+        <w:t>lectivo,</w:t>
+      </w:r>
+      <w:r>
+        <w:rPr>
+          <w:b/>
+          <w:lang w:val="es-ES"/>
+        </w:rPr>
+        <w:t>cuando</w:t>
+      </w:r>
+      <w:proofErr w:type="spellEnd"/>
+      <w:r>
+        <w:rPr>
+          <w:b/>
+          <w:lang w:val="es-ES"/>
+        </w:rPr>
+        <w:t xml:space="preserve"> un usuario nuevo se registra, se debe crear</w:t>
+      </w:r>
+      <w:r>
+        <w:rPr>
+          <w:b/>
+          <w:lang w:val="es-ES"/>
+        </w:rPr>
+        <w:t xml:space="preserve"> el ciclo lectivo</w:t>
+      </w:r>
+    </w:p>
+    <w:p>
+      <w:pPr>
+        <w:rPr>
+          <w:b/>
+          <w:lang w:val="es-ES"/>
+        </w:rPr>
+      </w:pPr>
       <w:bookmarkStart w:id="0" w:name="_GoBack"/>
       <w:r>
         <w:rPr>
           <w:b/>
-          <w:lang w:val="es-ES"/>
-        </w:rPr>
-        <w:t xml:space="preserve">Necesito agregar al sistema lo siguiente, en el menú </w:t>
-      </w:r>
-      <w:proofErr w:type="spellStart"/>
-      <w:r>
-        <w:rPr>
-          <w:b/>
-          <w:lang w:val="es-ES"/>
-        </w:rPr>
-        <w:t>Administracion</w:t>
-      </w:r>
-      <w:proofErr w:type="spellEnd"/>
-      <w:r>
-        <w:rPr>
-          <w:b/>
-          <w:lang w:val="es-ES"/>
-        </w:rPr>
-        <w:t xml:space="preserve">, la opción Ciclos lectivos, allí me debe permitir mediante un crud armar el ciclo lectivo correspondiente al año en curso, </w:t>
-      </w:r>
-      <w:r>
-        <w:rPr>
-          <w:b/>
-          <w:lang w:val="es-ES"/>
-        </w:rPr>
-        <w:t xml:space="preserve">se toma un ciclo lectivo por año, </w:t>
-      </w:r>
-      <w:r>
-        <w:rPr>
-          <w:b/>
-          <w:lang w:val="es-ES"/>
-        </w:rPr>
-        <w:t xml:space="preserve">del ciclo lectivo necesito almacenar, </w:t>
-      </w:r>
-      <w:proofErr w:type="spellStart"/>
-      <w:r>
-        <w:rPr>
-          <w:b/>
-          <w:lang w:val="es-ES"/>
-        </w:rPr>
-        <w:t>fechadeinicio</w:t>
-      </w:r>
-      <w:proofErr w:type="spellEnd"/>
-      <w:r>
-        <w:rPr>
-          <w:b/>
-          <w:lang w:val="es-ES"/>
-        </w:rPr>
-        <w:t xml:space="preserve">, </w:t>
-      </w:r>
-      <w:proofErr w:type="spellStart"/>
-      <w:r>
-        <w:rPr>
-          <w:b/>
-          <w:lang w:val="es-ES"/>
-        </w:rPr>
-        <w:t>fechadefinalizacion</w:t>
-      </w:r>
-      <w:proofErr w:type="spellEnd"/>
-      <w:r>
-        <w:rPr>
-          <w:b/>
-          <w:lang w:val="es-ES"/>
-        </w:rPr>
-        <w:t>, año, y necesito enlazar</w:t>
-      </w:r>
-      <w:r>
-        <w:rPr>
-          <w:b/>
-          <w:lang w:val="es-ES"/>
-        </w:rPr>
-        <w:t>(agregar) a todos los registros donde corresponda(tablas) la correspondiente relación al ciclo lectivo,</w:t>
-      </w:r>
-      <w:r>
-        <w:rPr>
-          <w:b/>
-          <w:lang w:val="es-ES"/>
-        </w:rPr>
-        <w:t xml:space="preserve"> en la base de datos al ciclo lectivo, </w:t>
-      </w:r>
-      <w:proofErr w:type="spellStart"/>
-      <w:r>
-        <w:rPr>
-          <w:b/>
-          <w:lang w:val="es-ES"/>
-        </w:rPr>
-        <w:t>asi</w:t>
-      </w:r>
-      <w:proofErr w:type="spellEnd"/>
-      <w:r>
-        <w:rPr>
-          <w:b/>
-          <w:lang w:val="es-ES"/>
-        </w:rPr>
-        <w:t xml:space="preserve"> cuando finaliza el ciclo lectivo en curso, me pida si quiero </w:t>
-      </w:r>
-      <w:r>
-        <w:rPr>
-          <w:b/>
-          <w:lang w:val="es-ES"/>
-        </w:rPr>
-        <w:t xml:space="preserve">generar un nuevo ciclo lectivo, y los datos que se carguen en el siguiente ciclo lectivo ya se enlacen con el nuevo ciclo </w:t>
-      </w:r>
-      <w:proofErr w:type="spellStart"/>
-      <w:r>
-        <w:rPr>
-          <w:b/>
-          <w:lang w:val="es-ES"/>
-        </w:rPr>
-        <w:t>lectivo,</w:t>
-      </w:r>
-      <w:r>
-        <w:rPr>
-          <w:b/>
-          <w:lang w:val="es-ES"/>
-        </w:rPr>
-        <w:t>cuando</w:t>
-      </w:r>
-      <w:proofErr w:type="spellEnd"/>
-      <w:r>
-        <w:rPr>
-          <w:b/>
-          <w:lang w:val="es-ES"/>
-        </w:rPr>
-        <w:t xml:space="preserve"> un usuario nuevo se registra, se debe crear</w:t>
-      </w:r>
-      <w:r>
-        <w:rPr>
-          <w:b/>
-          <w:lang w:val="es-ES"/>
-        </w:rPr>
-        <w:t xml:space="preserve"> el ciclo lectivo</w:t>
+        </w:rPr>
+        <w:t xml:space="preserve">La columna </w:t>
+      </w:r>
+      <w:proofErr w:type="spellStart"/>
+      <w:r>
+        <w:rPr>
+          <w:b/>
+        </w:rPr>
+        <w:t>ciclo_lectivo_id</w:t>
+      </w:r>
+      <w:proofErr w:type="spellEnd"/>
+      <w:r>
+        <w:rPr>
+          <w:b/>
+        </w:rPr>
+        <w:t xml:space="preserve"> (</w:t>
+      </w:r>
+      <w:proofErr w:type="spellStart"/>
+      <w:r>
+        <w:rPr>
+          <w:b/>
+        </w:rPr>
+        <w:t>nullable</w:t>
+      </w:r>
+      <w:proofErr w:type="spellEnd"/>
+      <w:r>
+        <w:rPr>
+          <w:b/>
+        </w:rPr>
+        <w:t xml:space="preserve">) quedó agregada en asistencias, calificaciones, actividades, contenidos, </w:t>
+      </w:r>
+      <w:proofErr w:type="spellStart"/>
+      <w:r>
+        <w:rPr>
+          <w:b/>
+        </w:rPr>
+        <w:t>cierrenotas</w:t>
+      </w:r>
+      <w:proofErr w:type="spellEnd"/>
+      <w:r>
+        <w:rPr>
+          <w:b/>
+        </w:rPr>
+        <w:t xml:space="preserve">, declaraciones y horarios. En la próxima etapa podemos actualizar los </w:t>
+      </w:r>
+      <w:proofErr w:type="spellStart"/>
+      <w:r>
+        <w:rPr>
+          <w:b/>
+        </w:rPr>
+        <w:t>controllers</w:t>
+      </w:r>
+      <w:proofErr w:type="spellEnd"/>
+      <w:r>
+        <w:rPr>
+          <w:b/>
+        </w:rPr>
+        <w:t xml:space="preserve"> para que al guardar datos los asocien automáticamente al ciclo activo</w:t>
       </w:r>
     </w:p>
     <w:bookmarkEnd w:id="0"/>
-    <w:p>
-      <w:pPr>
-        <w:rPr>
-          <w:lang w:val="es-ES"/>
-        </w:rPr>
-      </w:pPr>
-      <w:r>
-        <w:t xml:space="preserve">La columna </w:t>
-      </w:r>
-      <w:proofErr w:type="spellStart"/>
-      <w:r>
-        <w:t>ciclo_lectivo_id</w:t>
-      </w:r>
-      <w:proofErr w:type="spellEnd"/>
-      <w:r>
-        <w:t xml:space="preserve"> (</w:t>
-      </w:r>
-      <w:proofErr w:type="spellStart"/>
-      <w:r>
-        <w:t>nullable</w:t>
-      </w:r>
-      <w:proofErr w:type="spellEnd"/>
-      <w:r>
-        <w:t xml:space="preserve">) quedó agregada en asistencias, calificaciones, actividades, contenidos, </w:t>
-      </w:r>
-      <w:proofErr w:type="spellStart"/>
-      <w:r>
-        <w:t>cierrenotas</w:t>
-      </w:r>
-      <w:proofErr w:type="spellEnd"/>
-      <w:r>
-        <w:t xml:space="preserve">, declaraciones y horarios. En la próxima etapa podemos actualizar los </w:t>
-      </w:r>
-      <w:proofErr w:type="spellStart"/>
-      <w:r>
-        <w:t>controllers</w:t>
-      </w:r>
-      <w:proofErr w:type="spellEnd"/>
-      <w:r>
-        <w:t xml:space="preserve"> para que al guardar datos los asocien automáticamente al ciclo activo</w:t>
-      </w:r>
-    </w:p>
     <w:p>
       <w:pPr>
         <w:rPr>
@@ -17508,7 +17536,7 @@
 </file>
 
 <file path=customXml/itemProps1.xml><?xml version="1.0" encoding="utf-8"?>
-<ds:datastoreItem xmlns:ds="http://schemas.openxmlformats.org/officeDocument/2006/customXml" ds:itemID="{D78F291F-79EA-4232-BDAB-FEB323AB55A6}">
+<ds:datastoreItem xmlns:ds="http://schemas.openxmlformats.org/officeDocument/2006/customXml" ds:itemID="{699DDB69-00CD-4B50-A052-148A349D986E}">
   <ds:schemaRefs>
     <ds:schemaRef ds:uri="http://schemas.openxmlformats.org/officeDocument/2006/bibliography"/>
   </ds:schemaRefs>

</xml_diff>

<commit_message>
Se agrega al proyecto la opcion de softwre PDA, para ejecutar desde android, mac o pc, y la opcion de ofline con actualizacion posterior al recibir conectividad
</commit_message>
<xml_diff>
--- a/requerimientos.docx
+++ b/requerimientos.docx
@@ -11155,74 +11155,224 @@
       <w:pPr>
         <w:rPr>
           <w:b/>
-          <w:lang w:val="es-ES"/>
-        </w:rPr>
-      </w:pPr>
+        </w:rPr>
+      </w:pPr>
+      <w:r>
+        <w:rPr>
+          <w:b/>
+        </w:rPr>
+        <w:t xml:space="preserve">La columna </w:t>
+      </w:r>
+      <w:proofErr w:type="spellStart"/>
+      <w:r>
+        <w:rPr>
+          <w:b/>
+        </w:rPr>
+        <w:t>ciclo_lectivo_id</w:t>
+      </w:r>
+      <w:proofErr w:type="spellEnd"/>
+      <w:r>
+        <w:rPr>
+          <w:b/>
+        </w:rPr>
+        <w:t xml:space="preserve"> (</w:t>
+      </w:r>
+      <w:proofErr w:type="spellStart"/>
+      <w:r>
+        <w:rPr>
+          <w:b/>
+        </w:rPr>
+        <w:t>nullable</w:t>
+      </w:r>
+      <w:proofErr w:type="spellEnd"/>
+      <w:r>
+        <w:rPr>
+          <w:b/>
+        </w:rPr>
+        <w:t xml:space="preserve">) quedó agregada en asistencias, calificaciones, actividades, contenidos, </w:t>
+      </w:r>
+      <w:proofErr w:type="spellStart"/>
+      <w:r>
+        <w:rPr>
+          <w:b/>
+        </w:rPr>
+        <w:t>cierrenotas</w:t>
+      </w:r>
+      <w:proofErr w:type="spellEnd"/>
+      <w:r>
+        <w:rPr>
+          <w:b/>
+        </w:rPr>
+        <w:t xml:space="preserve">, declaraciones y horarios. En la próxima etapa podemos actualizar los </w:t>
+      </w:r>
+      <w:proofErr w:type="spellStart"/>
+      <w:r>
+        <w:rPr>
+          <w:b/>
+        </w:rPr>
+        <w:t>controllers</w:t>
+      </w:r>
+      <w:proofErr w:type="spellEnd"/>
+      <w:r>
+        <w:rPr>
+          <w:b/>
+        </w:rPr>
+        <w:t xml:space="preserve"> para que al guardar datos los asocien automáticamente al ciclo activo</w:t>
+      </w:r>
       <w:bookmarkStart w:id="0" w:name="_GoBack"/>
-      <w:r>
-        <w:rPr>
-          <w:b/>
-        </w:rPr>
-        <w:t xml:space="preserve">La columna </w:t>
-      </w:r>
-      <w:proofErr w:type="spellStart"/>
-      <w:r>
-        <w:rPr>
-          <w:b/>
-        </w:rPr>
-        <w:t>ciclo_lectivo_id</w:t>
-      </w:r>
-      <w:proofErr w:type="spellEnd"/>
-      <w:r>
-        <w:rPr>
-          <w:b/>
-        </w:rPr>
-        <w:t xml:space="preserve"> (</w:t>
-      </w:r>
-      <w:proofErr w:type="spellStart"/>
-      <w:r>
-        <w:rPr>
-          <w:b/>
-        </w:rPr>
-        <w:t>nullable</w:t>
-      </w:r>
-      <w:proofErr w:type="spellEnd"/>
-      <w:r>
-        <w:rPr>
-          <w:b/>
-        </w:rPr>
-        <w:t xml:space="preserve">) quedó agregada en asistencias, calificaciones, actividades, contenidos, </w:t>
-      </w:r>
-      <w:proofErr w:type="spellStart"/>
-      <w:r>
-        <w:rPr>
-          <w:b/>
-        </w:rPr>
-        <w:t>cierrenotas</w:t>
-      </w:r>
-      <w:proofErr w:type="spellEnd"/>
-      <w:r>
-        <w:rPr>
-          <w:b/>
-        </w:rPr>
-        <w:t xml:space="preserve">, declaraciones y horarios. En la próxima etapa podemos actualizar los </w:t>
-      </w:r>
-      <w:proofErr w:type="spellStart"/>
-      <w:r>
-        <w:rPr>
-          <w:b/>
-        </w:rPr>
-        <w:t>controllers</w:t>
-      </w:r>
-      <w:proofErr w:type="spellEnd"/>
-      <w:r>
-        <w:rPr>
-          <w:b/>
-        </w:rPr>
-        <w:t xml:space="preserve"> para que al guardar datos los asocien automáticamente al ciclo activo</w:t>
-      </w:r>
-    </w:p>
-    <w:bookmarkEnd w:id="0"/>
+      <w:bookmarkEnd w:id="0"/>
+    </w:p>
+    <w:p>
+      <w:pPr>
+        <w:rPr>
+          <w:b/>
+        </w:rPr>
+      </w:pPr>
+      <w:r>
+        <w:rPr>
+          <w:b/>
+        </w:rPr>
+        <w:t>E</w:t>
+      </w:r>
+      <w:r>
+        <w:rPr>
+          <w:b/>
+        </w:rPr>
+        <w:t xml:space="preserve">n cuanto a </w:t>
+      </w:r>
+      <w:proofErr w:type="spellStart"/>
+      <w:r>
+        <w:rPr>
+          <w:b/>
+        </w:rPr>
+        <w:t>excel</w:t>
+      </w:r>
+      <w:proofErr w:type="spellEnd"/>
+      <w:r>
+        <w:rPr>
+          <w:b/>
+        </w:rPr>
+        <w:t xml:space="preserve"> me da error al intentar abrir el </w:t>
+      </w:r>
+      <w:proofErr w:type="gramStart"/>
+      <w:r>
+        <w:rPr>
+          <w:b/>
+        </w:rPr>
+        <w:t>archivo ,</w:t>
+      </w:r>
+      <w:proofErr w:type="gramEnd"/>
+      <w:r>
+        <w:rPr>
+          <w:b/>
+        </w:rPr>
+        <w:t xml:space="preserve"> necesito que sea compatible desde el 97 en adelante, y por otro lado necesito que me pida la </w:t>
+      </w:r>
+      <w:proofErr w:type="spellStart"/>
+      <w:r>
+        <w:rPr>
+          <w:b/>
+        </w:rPr>
+        <w:t>opcion</w:t>
+      </w:r>
+      <w:proofErr w:type="spellEnd"/>
+      <w:r>
+        <w:rPr>
+          <w:b/>
+        </w:rPr>
+        <w:t xml:space="preserve"> de abrir en google </w:t>
+      </w:r>
+      <w:proofErr w:type="spellStart"/>
+      <w:r>
+        <w:rPr>
+          <w:b/>
+        </w:rPr>
+        <w:t>direactamente</w:t>
+      </w:r>
+      <w:proofErr w:type="spellEnd"/>
+      <w:r>
+        <w:rPr>
+          <w:b/>
+        </w:rPr>
+        <w:t xml:space="preserve"> o descargar a la pc</w:t>
+      </w:r>
+      <w:r>
+        <w:rPr>
+          <w:b/>
+        </w:rPr>
+        <w:t xml:space="preserve">, para mejorar la </w:t>
+      </w:r>
+      <w:proofErr w:type="spellStart"/>
+      <w:r>
+        <w:rPr>
+          <w:b/>
+        </w:rPr>
+        <w:t>compatbilidad</w:t>
+      </w:r>
+      <w:proofErr w:type="spellEnd"/>
+    </w:p>
+    <w:p>
+      <w:r>
+        <w:lastRenderedPageBreak/>
+        <w:t xml:space="preserve">Necesito </w:t>
+      </w:r>
+      <w:r>
+        <w:t xml:space="preserve">convertir </w:t>
+      </w:r>
+      <w:r>
+        <w:t>mi sistema (</w:t>
+      </w:r>
+      <w:r>
+        <w:t>aplicación web</w:t>
+      </w:r>
+      <w:r>
+        <w:t>) gestión de aula en la que estamos trabajando</w:t>
+      </w:r>
+      <w:r>
+        <w:t xml:space="preserve">  en una </w:t>
+      </w:r>
+      <w:r>
+        <w:rPr>
+          <w:b/>
+          <w:bCs/>
+        </w:rPr>
+        <w:t>Aplicación Web Progresiva (PWA)</w:t>
+      </w:r>
+      <w:r>
+        <w:t xml:space="preserve"> y permitir que los usuarios la instalen en su computadora o celular como si fuera una </w:t>
+      </w:r>
+      <w:proofErr w:type="spellStart"/>
+      <w:r>
+        <w:t>app</w:t>
+      </w:r>
+      <w:proofErr w:type="spellEnd"/>
+      <w:r>
+        <w:t xml:space="preserve"> nativa, </w:t>
+      </w:r>
+      <w:r>
+        <w:t xml:space="preserve">y </w:t>
+      </w:r>
+      <w:r>
+        <w:t xml:space="preserve">agregar a la </w:t>
+      </w:r>
+      <w:proofErr w:type="spellStart"/>
+      <w:r>
+        <w:t>landing</w:t>
+      </w:r>
+      <w:proofErr w:type="spellEnd"/>
+      <w:r>
+        <w:t xml:space="preserve"> page una opción para descargar la versión de escritorio del software de gestión de aula.</w:t>
+      </w:r>
+    </w:p>
+    <w:p/>
+    <w:p>
+      <w:pPr>
+        <w:rPr>
+          <w:b/>
+          <w:lang w:val="es-ES"/>
+        </w:rPr>
+      </w:pPr>
+    </w:p>
     <w:p>
       <w:pPr>
         <w:rPr>
@@ -11393,6 +11543,7 @@
           <w:b/>
           <w:bCs/>
         </w:rPr>
+        <w:lastRenderedPageBreak/>
         <w:t>Aplicación Web Progresiva (PWA)</w:t>
       </w:r>
     </w:p>
@@ -11482,7 +11633,6 @@
           <w:b/>
           <w:bCs/>
         </w:rPr>
-        <w:lastRenderedPageBreak/>
         <w:t>HTTPS:</w:t>
       </w:r>
       <w:r>
@@ -12019,6 +12169,7 @@
           <w:b/>
           <w:bCs/>
         </w:rPr>
+        <w:lastRenderedPageBreak/>
         <w:t>Nota clave:</w:t>
       </w:r>
       <w:r>
@@ -12168,69 +12319,542 @@
           <w:b/>
           <w:bCs/>
         </w:rPr>
+        <w:t xml:space="preserve">Paso 3: Crear el </w:t>
+      </w:r>
+      <w:proofErr w:type="spellStart"/>
+      <w:r>
+        <w:rPr>
+          <w:b/>
+          <w:bCs/>
+        </w:rPr>
+        <w:t>Service</w:t>
+      </w:r>
+      <w:proofErr w:type="spellEnd"/>
+      <w:r>
+        <w:rPr>
+          <w:b/>
+          <w:bCs/>
+        </w:rPr>
+        <w:t xml:space="preserve"> </w:t>
+      </w:r>
+      <w:proofErr w:type="spellStart"/>
+      <w:r>
+        <w:rPr>
+          <w:b/>
+          <w:bCs/>
+        </w:rPr>
+        <w:t>Worker</w:t>
+      </w:r>
+      <w:proofErr w:type="spellEnd"/>
+      <w:r>
+        <w:rPr>
+          <w:b/>
+          <w:bCs/>
+        </w:rPr>
+        <w:t xml:space="preserve"> (sw.js)</w:t>
+      </w:r>
+    </w:p>
+    <w:p>
+      <w:r>
+        <w:t xml:space="preserve">El </w:t>
+      </w:r>
+      <w:proofErr w:type="spellStart"/>
+      <w:r>
+        <w:t>Service</w:t>
+      </w:r>
+      <w:proofErr w:type="spellEnd"/>
+      <w:r>
+        <w:t xml:space="preserve"> </w:t>
+      </w:r>
+      <w:proofErr w:type="spellStart"/>
+      <w:r>
+        <w:t>Worker</w:t>
+      </w:r>
+      <w:proofErr w:type="spellEnd"/>
+      <w:r>
+        <w:t xml:space="preserve"> es el motor que gestiona la caché y permite que la </w:t>
+      </w:r>
+      <w:proofErr w:type="spellStart"/>
+      <w:r>
+        <w:t>app</w:t>
+      </w:r>
+      <w:proofErr w:type="spellEnd"/>
+      <w:r>
+        <w:t xml:space="preserve"> cargue instantáneamente. Crea un archivo llamado sw.js en la raíz de tu proyecto con este código básico de almacenamiento en caché:</w:t>
+      </w:r>
+    </w:p>
+    <w:p>
+      <w:pPr>
+        <w:spacing w:after="0"/>
+      </w:pPr>
+      <w:r>
+        <w:t>JavaScript</w:t>
+      </w:r>
+    </w:p>
+    <w:p>
+      <w:pPr>
+        <w:spacing w:after="0"/>
+      </w:pPr>
+      <w:proofErr w:type="spellStart"/>
+      <w:proofErr w:type="gramStart"/>
+      <w:r>
+        <w:t>const</w:t>
+      </w:r>
+      <w:proofErr w:type="spellEnd"/>
+      <w:proofErr w:type="gramEnd"/>
+      <w:r>
+        <w:t xml:space="preserve"> CACHE_NAME = 'v1_cache_miapp';</w:t>
+      </w:r>
+    </w:p>
+    <w:p>
+      <w:pPr>
+        <w:spacing w:after="0"/>
+      </w:pPr>
+      <w:r>
+        <w:t>// Archivos esenciales que quieres que funcionen incluso sin internet</w:t>
+      </w:r>
+    </w:p>
+    <w:p>
+      <w:pPr>
+        <w:spacing w:after="0"/>
+      </w:pPr>
+      <w:proofErr w:type="spellStart"/>
+      <w:proofErr w:type="gramStart"/>
+      <w:r>
+        <w:t>const</w:t>
+      </w:r>
+      <w:proofErr w:type="spellEnd"/>
+      <w:proofErr w:type="gramEnd"/>
+      <w:r>
+        <w:t xml:space="preserve"> </w:t>
+      </w:r>
+      <w:proofErr w:type="spellStart"/>
+      <w:r>
+        <w:t>urlsToCache</w:t>
+      </w:r>
+      <w:proofErr w:type="spellEnd"/>
+      <w:r>
+        <w:t xml:space="preserve"> = [</w:t>
+      </w:r>
+    </w:p>
+    <w:p>
+      <w:pPr>
+        <w:spacing w:after="0"/>
+      </w:pPr>
+      <w:r>
+        <w:t xml:space="preserve">  '/',</w:t>
+      </w:r>
+    </w:p>
+    <w:p>
+      <w:pPr>
+        <w:spacing w:after="0"/>
+      </w:pPr>
+      <w:r>
+        <w:t xml:space="preserve">  '/index.html',</w:t>
+      </w:r>
+    </w:p>
+    <w:p>
+      <w:pPr>
+        <w:spacing w:after="0"/>
+      </w:pPr>
+      <w:r>
+        <w:t xml:space="preserve">  '/styles.css',</w:t>
+      </w:r>
+    </w:p>
+    <w:p>
+      <w:pPr>
+        <w:spacing w:after="0"/>
+      </w:pPr>
+      <w:r>
+        <w:t xml:space="preserve">  '/script.js',</w:t>
+      </w:r>
+    </w:p>
+    <w:p>
+      <w:pPr>
+        <w:spacing w:after="0"/>
+      </w:pPr>
+      <w:r>
+        <w:t xml:space="preserve">  '/icon-192.png'</w:t>
+      </w:r>
+    </w:p>
+    <w:p>
+      <w:pPr>
+        <w:spacing w:after="0"/>
+      </w:pPr>
+      <w:r>
+        <w:t>];</w:t>
+      </w:r>
+    </w:p>
+    <w:p>
+      <w:pPr>
+        <w:spacing w:after="0"/>
+      </w:pPr>
+    </w:p>
+    <w:p>
+      <w:pPr>
+        <w:spacing w:after="0"/>
+      </w:pPr>
+      <w:r>
+        <w:t>// Evento de instalación: Guarda los archivos en la caché del navegador</w:t>
+      </w:r>
+    </w:p>
+    <w:p>
+      <w:pPr>
+        <w:spacing w:after="0"/>
+      </w:pPr>
+      <w:proofErr w:type="spellStart"/>
+      <w:proofErr w:type="gramStart"/>
+      <w:r>
+        <w:t>self.addEventListener</w:t>
+      </w:r>
+      <w:proofErr w:type="spellEnd"/>
+      <w:r>
+        <w:t>(</w:t>
+      </w:r>
+      <w:proofErr w:type="gramEnd"/>
+      <w:r>
+        <w:t>'</w:t>
+      </w:r>
+      <w:proofErr w:type="spellStart"/>
+      <w:r>
+        <w:t>install</w:t>
+      </w:r>
+      <w:proofErr w:type="spellEnd"/>
+      <w:r>
+        <w:t>', e =&gt; {</w:t>
+      </w:r>
+    </w:p>
+    <w:p>
+      <w:pPr>
+        <w:spacing w:after="0"/>
+      </w:pPr>
+      <w:r>
+        <w:t xml:space="preserve">  </w:t>
+      </w:r>
+      <w:proofErr w:type="spellStart"/>
+      <w:proofErr w:type="gramStart"/>
+      <w:r>
+        <w:t>e.waitUntil</w:t>
+      </w:r>
+      <w:proofErr w:type="spellEnd"/>
+      <w:r>
+        <w:t>(</w:t>
+      </w:r>
+      <w:proofErr w:type="gramEnd"/>
+    </w:p>
+    <w:p>
+      <w:pPr>
+        <w:spacing w:after="0"/>
+      </w:pPr>
+      <w:r>
+        <w:t xml:space="preserve">    </w:t>
+      </w:r>
+      <w:proofErr w:type="spellStart"/>
+      <w:proofErr w:type="gramStart"/>
+      <w:r>
+        <w:t>caches.open</w:t>
+      </w:r>
+      <w:proofErr w:type="spellEnd"/>
+      <w:r>
+        <w:t>(</w:t>
+      </w:r>
+      <w:proofErr w:type="gramEnd"/>
+      <w:r>
+        <w:t>CACHE_NAME)</w:t>
+      </w:r>
+    </w:p>
+    <w:p>
+      <w:pPr>
+        <w:spacing w:after="0"/>
+      </w:pPr>
+      <w:r>
+        <w:t xml:space="preserve">      .</w:t>
+      </w:r>
+      <w:proofErr w:type="spellStart"/>
+      <w:proofErr w:type="gramStart"/>
+      <w:r>
+        <w:t>then</w:t>
+      </w:r>
+      <w:proofErr w:type="spellEnd"/>
+      <w:r>
+        <w:t>(</w:t>
+      </w:r>
+      <w:proofErr w:type="gramEnd"/>
+      <w:r>
+        <w:t>cache =&gt; {</w:t>
+      </w:r>
+    </w:p>
+    <w:p>
+      <w:pPr>
+        <w:spacing w:after="0"/>
+      </w:pPr>
+      <w:r>
+        <w:t xml:space="preserve">        </w:t>
+      </w:r>
+      <w:proofErr w:type="spellStart"/>
+      <w:proofErr w:type="gramStart"/>
+      <w:r>
+        <w:t>return</w:t>
+      </w:r>
+      <w:proofErr w:type="spellEnd"/>
+      <w:proofErr w:type="gramEnd"/>
+      <w:r>
+        <w:t xml:space="preserve"> </w:t>
+      </w:r>
+      <w:proofErr w:type="spellStart"/>
+      <w:r>
+        <w:t>cache.addAll</w:t>
+      </w:r>
+      <w:proofErr w:type="spellEnd"/>
+      <w:r>
+        <w:t>(</w:t>
+      </w:r>
+      <w:proofErr w:type="spellStart"/>
+      <w:r>
+        <w:t>urlsToCache</w:t>
+      </w:r>
+      <w:proofErr w:type="spellEnd"/>
+      <w:r>
+        <w:t>);</w:t>
+      </w:r>
+    </w:p>
+    <w:p>
+      <w:pPr>
+        <w:spacing w:after="0"/>
+      </w:pPr>
+      <w:r>
+        <w:t xml:space="preserve">      })</w:t>
+      </w:r>
+    </w:p>
+    <w:p>
+      <w:pPr>
+        <w:spacing w:after="0"/>
+      </w:pPr>
+      <w:r>
+        <w:t xml:space="preserve">      .</w:t>
+      </w:r>
+      <w:proofErr w:type="spellStart"/>
+      <w:proofErr w:type="gramStart"/>
+      <w:r>
+        <w:t>then</w:t>
+      </w:r>
+      <w:proofErr w:type="spellEnd"/>
+      <w:r>
+        <w:t>(</w:t>
+      </w:r>
+      <w:proofErr w:type="gramEnd"/>
+      <w:r>
+        <w:t xml:space="preserve">() =&gt; </w:t>
+      </w:r>
+      <w:proofErr w:type="spellStart"/>
+      <w:r>
+        <w:t>self.skipWaiting</w:t>
+      </w:r>
+      <w:proofErr w:type="spellEnd"/>
+      <w:r>
+        <w:t>())</w:t>
+      </w:r>
+    </w:p>
+    <w:p>
+      <w:pPr>
+        <w:spacing w:after="0"/>
+      </w:pPr>
+      <w:r>
+        <w:t xml:space="preserve">  );</w:t>
+      </w:r>
+    </w:p>
+    <w:p>
+      <w:pPr>
+        <w:spacing w:after="0"/>
+      </w:pPr>
+      <w:r>
+        <w:t>});</w:t>
+      </w:r>
+    </w:p>
+    <w:p>
+      <w:pPr>
+        <w:spacing w:after="0"/>
+      </w:pPr>
+    </w:p>
+    <w:p>
+      <w:pPr>
+        <w:spacing w:after="0"/>
+      </w:pPr>
+      <w:r>
+        <w:t>// Evento de activación: Limpia cachés antiguas</w:t>
+      </w:r>
+    </w:p>
+    <w:p>
+      <w:pPr>
+        <w:spacing w:after="0"/>
+      </w:pPr>
+      <w:proofErr w:type="spellStart"/>
+      <w:proofErr w:type="gramStart"/>
+      <w:r>
+        <w:t>self.addEventListener</w:t>
+      </w:r>
+      <w:proofErr w:type="spellEnd"/>
+      <w:r>
+        <w:t>(</w:t>
+      </w:r>
+      <w:proofErr w:type="gramEnd"/>
+      <w:r>
+        <w:t>'</w:t>
+      </w:r>
+      <w:proofErr w:type="spellStart"/>
+      <w:r>
+        <w:t>activate</w:t>
+      </w:r>
+      <w:proofErr w:type="spellEnd"/>
+      <w:r>
+        <w:t>', e =&gt; {</w:t>
+      </w:r>
+    </w:p>
+    <w:p>
+      <w:pPr>
+        <w:spacing w:after="0"/>
+      </w:pPr>
+      <w:r>
+        <w:t xml:space="preserve">  </w:t>
+      </w:r>
+      <w:proofErr w:type="spellStart"/>
+      <w:proofErr w:type="gramStart"/>
+      <w:r>
+        <w:t>e.waitUntil</w:t>
+      </w:r>
+      <w:proofErr w:type="spellEnd"/>
+      <w:r>
+        <w:t>(</w:t>
+      </w:r>
+      <w:proofErr w:type="gramEnd"/>
+    </w:p>
+    <w:p>
+      <w:pPr>
+        <w:spacing w:after="0"/>
+      </w:pPr>
+      <w:r>
+        <w:t xml:space="preserve">    </w:t>
+      </w:r>
+      <w:proofErr w:type="spellStart"/>
+      <w:proofErr w:type="gramStart"/>
+      <w:r>
+        <w:t>caches.keys</w:t>
+      </w:r>
+      <w:proofErr w:type="spellEnd"/>
+      <w:r>
+        <w:t>(</w:t>
+      </w:r>
+      <w:proofErr w:type="gramEnd"/>
+      <w:r>
+        <w:t>).</w:t>
+      </w:r>
+      <w:proofErr w:type="spellStart"/>
+      <w:r>
+        <w:t>then</w:t>
+      </w:r>
+      <w:proofErr w:type="spellEnd"/>
+      <w:r>
+        <w:t>(</w:t>
+      </w:r>
+      <w:proofErr w:type="spellStart"/>
+      <w:r>
+        <w:t>cacheNames</w:t>
+      </w:r>
+      <w:proofErr w:type="spellEnd"/>
+      <w:r>
+        <w:t xml:space="preserve"> =&gt; {</w:t>
+      </w:r>
+    </w:p>
+    <w:p>
+      <w:pPr>
+        <w:spacing w:after="0"/>
+      </w:pPr>
+      <w:r>
+        <w:t xml:space="preserve">      </w:t>
+      </w:r>
+      <w:proofErr w:type="spellStart"/>
+      <w:proofErr w:type="gramStart"/>
+      <w:r>
+        <w:t>return</w:t>
+      </w:r>
+      <w:proofErr w:type="spellEnd"/>
+      <w:proofErr w:type="gramEnd"/>
+      <w:r>
+        <w:t xml:space="preserve"> </w:t>
+      </w:r>
+      <w:proofErr w:type="spellStart"/>
+      <w:r>
+        <w:t>Promise.all</w:t>
+      </w:r>
+      <w:proofErr w:type="spellEnd"/>
+      <w:r>
+        <w:t>(</w:t>
+      </w:r>
+    </w:p>
+    <w:p>
+      <w:pPr>
+        <w:spacing w:after="0"/>
+      </w:pPr>
+      <w:r>
+        <w:t xml:space="preserve">        </w:t>
+      </w:r>
+      <w:proofErr w:type="spellStart"/>
+      <w:proofErr w:type="gramStart"/>
+      <w:r>
+        <w:t>cacheNames.map</w:t>
+      </w:r>
+      <w:proofErr w:type="spellEnd"/>
+      <w:r>
+        <w:t>(</w:t>
+      </w:r>
+      <w:proofErr w:type="gramEnd"/>
+      <w:r>
+        <w:t>cache =&gt; {</w:t>
+      </w:r>
+    </w:p>
+    <w:p>
+      <w:pPr>
+        <w:spacing w:after="0"/>
+      </w:pPr>
+      <w:r>
         <w:lastRenderedPageBreak/>
-        <w:t xml:space="preserve">Paso 3: Crear el </w:t>
-      </w:r>
-      <w:proofErr w:type="spellStart"/>
-      <w:r>
-        <w:rPr>
-          <w:b/>
-          <w:bCs/>
-        </w:rPr>
-        <w:t>Service</w:t>
-      </w:r>
-      <w:proofErr w:type="spellEnd"/>
-      <w:r>
-        <w:rPr>
-          <w:b/>
-          <w:bCs/>
-        </w:rPr>
+        <w:t xml:space="preserve">          </w:t>
+      </w:r>
+      <w:proofErr w:type="spellStart"/>
+      <w:proofErr w:type="gramStart"/>
+      <w:r>
+        <w:t>if</w:t>
+      </w:r>
+      <w:proofErr w:type="spellEnd"/>
+      <w:proofErr w:type="gramEnd"/>
+      <w:r>
+        <w:t xml:space="preserve"> (cache !== CACHE_NAME) {</w:t>
+      </w:r>
+    </w:p>
+    <w:p>
+      <w:pPr>
+        <w:spacing w:after="0"/>
+      </w:pPr>
+      <w:r>
+        <w:t xml:space="preserve">            </w:t>
+      </w:r>
+      <w:proofErr w:type="spellStart"/>
+      <w:proofErr w:type="gramStart"/>
+      <w:r>
+        <w:t>return</w:t>
+      </w:r>
+      <w:proofErr w:type="spellEnd"/>
+      <w:proofErr w:type="gramEnd"/>
+      <w:r>
         <w:t xml:space="preserve"> </w:t>
       </w:r>
       <w:proofErr w:type="spellStart"/>
       <w:r>
-        <w:rPr>
-          <w:b/>
-          <w:bCs/>
-        </w:rPr>
-        <w:t>Worker</w:t>
-      </w:r>
-      <w:proofErr w:type="spellEnd"/>
-      <w:r>
-        <w:rPr>
-          <w:b/>
-          <w:bCs/>
-        </w:rPr>
-        <w:t xml:space="preserve"> (sw.js)</w:t>
-      </w:r>
-    </w:p>
-    <w:p>
-      <w:r>
-        <w:t xml:space="preserve">El </w:t>
-      </w:r>
-      <w:proofErr w:type="spellStart"/>
-      <w:r>
-        <w:t>Service</w:t>
-      </w:r>
-      <w:proofErr w:type="spellEnd"/>
-      <w:r>
-        <w:t xml:space="preserve"> </w:t>
-      </w:r>
-      <w:proofErr w:type="spellStart"/>
-      <w:r>
-        <w:t>Worker</w:t>
-      </w:r>
-      <w:proofErr w:type="spellEnd"/>
-      <w:r>
-        <w:t xml:space="preserve"> es el motor que gestiona la caché y permite que la </w:t>
-      </w:r>
-      <w:proofErr w:type="spellStart"/>
-      <w:r>
-        <w:t>app</w:t>
-      </w:r>
-      <w:proofErr w:type="spellEnd"/>
-      <w:r>
-        <w:t xml:space="preserve"> cargue instantáneamente. Crea un archivo llamado sw.js en la raíz de tu proyecto con este código básico de almacenamiento en caché:</w:t>
+        <w:t>caches.delete</w:t>
+      </w:r>
+      <w:proofErr w:type="spellEnd"/>
+      <w:r>
+        <w:t>(cache);</w:t>
       </w:r>
     </w:p>
     <w:p>
@@ -12238,22 +12862,94 @@
         <w:spacing w:after="0"/>
       </w:pPr>
       <w:r>
-        <w:t>JavaScript</w:t>
+        <w:t xml:space="preserve">          }</w:t>
       </w:r>
     </w:p>
     <w:p>
       <w:pPr>
         <w:spacing w:after="0"/>
       </w:pPr>
+      <w:r>
+        <w:t xml:space="preserve">        })</w:t>
+      </w:r>
+    </w:p>
+    <w:p>
+      <w:pPr>
+        <w:spacing w:after="0"/>
+      </w:pPr>
+      <w:r>
+        <w:t xml:space="preserve">      );</w:t>
+      </w:r>
+    </w:p>
+    <w:p>
+      <w:pPr>
+        <w:spacing w:after="0"/>
+      </w:pPr>
+      <w:r>
+        <w:t xml:space="preserve">    })</w:t>
+      </w:r>
+    </w:p>
+    <w:p>
+      <w:pPr>
+        <w:spacing w:after="0"/>
+      </w:pPr>
+      <w:r>
+        <w:t xml:space="preserve">  );</w:t>
+      </w:r>
+    </w:p>
+    <w:p>
+      <w:pPr>
+        <w:spacing w:after="0"/>
+      </w:pPr>
+      <w:r>
+        <w:t>});</w:t>
+      </w:r>
+    </w:p>
+    <w:p>
+      <w:pPr>
+        <w:spacing w:after="0"/>
+      </w:pPr>
+    </w:p>
+    <w:p>
+      <w:pPr>
+        <w:spacing w:after="0"/>
+      </w:pPr>
+      <w:r>
+        <w:t xml:space="preserve">// Evento </w:t>
+      </w:r>
+      <w:proofErr w:type="spellStart"/>
+      <w:r>
+        <w:t>fetch</w:t>
+      </w:r>
+      <w:proofErr w:type="spellEnd"/>
+      <w:r>
+        <w:t>: Sirve el contenido desde la caché si no hay internet</w:t>
+      </w:r>
+    </w:p>
+    <w:p>
+      <w:pPr>
+        <w:spacing w:after="0"/>
+      </w:pPr>
       <w:proofErr w:type="spellStart"/>
       <w:proofErr w:type="gramStart"/>
       <w:r>
-        <w:t>const</w:t>
-      </w:r>
-      <w:proofErr w:type="spellEnd"/>
+        <w:t>self.addEventListener</w:t>
+      </w:r>
+      <w:proofErr w:type="spellEnd"/>
+      <w:r>
+        <w:t>(</w:t>
+      </w:r>
       <w:proofErr w:type="gramEnd"/>
       <w:r>
-        <w:t xml:space="preserve"> CACHE_NAME = 'v1_cache_miapp';</w:t>
+        <w:t>'</w:t>
+      </w:r>
+      <w:proofErr w:type="spellStart"/>
+      <w:r>
+        <w:t>fetch</w:t>
+      </w:r>
+      <w:proofErr w:type="spellEnd"/>
+      <w:r>
+        <w:t>', e =&gt; {</w:t>
       </w:r>
     </w:p>
     <w:p>
@@ -12261,570 +12957,24 @@
         <w:spacing w:after="0"/>
       </w:pPr>
       <w:r>
-        <w:t>// Archivos esenciales que quieres que funcionen incluso sin internet</w:t>
-      </w:r>
+        <w:t xml:space="preserve">  </w:t>
+      </w:r>
+      <w:proofErr w:type="spellStart"/>
+      <w:proofErr w:type="gramStart"/>
+      <w:r>
+        <w:t>e.respondWith</w:t>
+      </w:r>
+      <w:proofErr w:type="spellEnd"/>
+      <w:r>
+        <w:t>(</w:t>
+      </w:r>
+      <w:proofErr w:type="gramEnd"/>
     </w:p>
     <w:p>
       <w:pPr>
         <w:spacing w:after="0"/>
       </w:pPr>
-      <w:proofErr w:type="spellStart"/>
-      <w:proofErr w:type="gramStart"/>
-      <w:r>
-        <w:t>const</w:t>
-      </w:r>
-      <w:proofErr w:type="spellEnd"/>
-      <w:proofErr w:type="gramEnd"/>
-      <w:r>
-        <w:t xml:space="preserve"> </w:t>
-      </w:r>
-      <w:proofErr w:type="spellStart"/>
-      <w:r>
-        <w:t>urlsToCache</w:t>
-      </w:r>
-      <w:proofErr w:type="spellEnd"/>
-      <w:r>
-        <w:t xml:space="preserve"> = [</w:t>
-      </w:r>
-    </w:p>
-    <w:p>
-      <w:pPr>
-        <w:spacing w:after="0"/>
-      </w:pPr>
-      <w:r>
-        <w:t xml:space="preserve">  '/',</w:t>
-      </w:r>
-    </w:p>
-    <w:p>
-      <w:pPr>
-        <w:spacing w:after="0"/>
-      </w:pPr>
-      <w:r>
-        <w:t xml:space="preserve">  '/index.html',</w:t>
-      </w:r>
-    </w:p>
-    <w:p>
-      <w:pPr>
-        <w:spacing w:after="0"/>
-      </w:pPr>
-      <w:r>
-        <w:t xml:space="preserve">  '/styles.css',</w:t>
-      </w:r>
-    </w:p>
-    <w:p>
-      <w:pPr>
-        <w:spacing w:after="0"/>
-      </w:pPr>
-      <w:r>
-        <w:t xml:space="preserve">  '/script.js',</w:t>
-      </w:r>
-    </w:p>
-    <w:p>
-      <w:pPr>
-        <w:spacing w:after="0"/>
-      </w:pPr>
-      <w:r>
-        <w:t xml:space="preserve">  '/icon-192.png'</w:t>
-      </w:r>
-    </w:p>
-    <w:p>
-      <w:pPr>
-        <w:spacing w:after="0"/>
-      </w:pPr>
-      <w:r>
-        <w:t>];</w:t>
-      </w:r>
-    </w:p>
-    <w:p>
-      <w:pPr>
-        <w:spacing w:after="0"/>
-      </w:pPr>
-    </w:p>
-    <w:p>
-      <w:pPr>
-        <w:spacing w:after="0"/>
-      </w:pPr>
-      <w:r>
-        <w:t>// Evento de instalación: Guarda los archivos en la caché del navegador</w:t>
-      </w:r>
-    </w:p>
-    <w:p>
-      <w:pPr>
-        <w:spacing w:after="0"/>
-      </w:pPr>
-      <w:proofErr w:type="spellStart"/>
-      <w:proofErr w:type="gramStart"/>
-      <w:r>
-        <w:t>self.addEventListener</w:t>
-      </w:r>
-      <w:proofErr w:type="spellEnd"/>
-      <w:r>
-        <w:t>(</w:t>
-      </w:r>
-      <w:proofErr w:type="gramEnd"/>
-      <w:r>
-        <w:t>'</w:t>
-      </w:r>
-      <w:proofErr w:type="spellStart"/>
-      <w:r>
-        <w:t>install</w:t>
-      </w:r>
-      <w:proofErr w:type="spellEnd"/>
-      <w:r>
-        <w:t>', e =&gt; {</w:t>
-      </w:r>
-    </w:p>
-    <w:p>
-      <w:pPr>
-        <w:spacing w:after="0"/>
-      </w:pPr>
-      <w:r>
-        <w:t xml:space="preserve">  </w:t>
-      </w:r>
-      <w:proofErr w:type="spellStart"/>
-      <w:proofErr w:type="gramStart"/>
-      <w:r>
-        <w:t>e.waitUntil</w:t>
-      </w:r>
-      <w:proofErr w:type="spellEnd"/>
-      <w:r>
-        <w:t>(</w:t>
-      </w:r>
-      <w:proofErr w:type="gramEnd"/>
-    </w:p>
-    <w:p>
-      <w:pPr>
-        <w:spacing w:after="0"/>
-      </w:pPr>
-      <w:r>
-        <w:t xml:space="preserve">    </w:t>
-      </w:r>
-      <w:proofErr w:type="spellStart"/>
-      <w:proofErr w:type="gramStart"/>
-      <w:r>
-        <w:t>caches.open</w:t>
-      </w:r>
-      <w:proofErr w:type="spellEnd"/>
-      <w:r>
-        <w:t>(</w:t>
-      </w:r>
-      <w:proofErr w:type="gramEnd"/>
-      <w:r>
-        <w:t>CACHE_NAME)</w:t>
-      </w:r>
-    </w:p>
-    <w:p>
-      <w:pPr>
-        <w:spacing w:after="0"/>
-      </w:pPr>
-      <w:r>
-        <w:t xml:space="preserve">      .</w:t>
-      </w:r>
-      <w:proofErr w:type="spellStart"/>
-      <w:proofErr w:type="gramStart"/>
-      <w:r>
-        <w:t>then</w:t>
-      </w:r>
-      <w:proofErr w:type="spellEnd"/>
-      <w:r>
-        <w:t>(</w:t>
-      </w:r>
-      <w:proofErr w:type="gramEnd"/>
-      <w:r>
-        <w:t>cache =&gt; {</w:t>
-      </w:r>
-    </w:p>
-    <w:p>
-      <w:pPr>
-        <w:spacing w:after="0"/>
-      </w:pPr>
-      <w:r>
-        <w:t xml:space="preserve">        </w:t>
-      </w:r>
-      <w:proofErr w:type="spellStart"/>
-      <w:proofErr w:type="gramStart"/>
-      <w:r>
-        <w:t>return</w:t>
-      </w:r>
-      <w:proofErr w:type="spellEnd"/>
-      <w:proofErr w:type="gramEnd"/>
-      <w:r>
-        <w:t xml:space="preserve"> </w:t>
-      </w:r>
-      <w:proofErr w:type="spellStart"/>
-      <w:r>
-        <w:t>cache.addAll</w:t>
-      </w:r>
-      <w:proofErr w:type="spellEnd"/>
-      <w:r>
-        <w:t>(</w:t>
-      </w:r>
-      <w:proofErr w:type="spellStart"/>
-      <w:r>
-        <w:t>urlsToCache</w:t>
-      </w:r>
-      <w:proofErr w:type="spellEnd"/>
-      <w:r>
-        <w:t>);</w:t>
-      </w:r>
-    </w:p>
-    <w:p>
-      <w:pPr>
-        <w:spacing w:after="0"/>
-      </w:pPr>
-      <w:r>
-        <w:t xml:space="preserve">      })</w:t>
-      </w:r>
-    </w:p>
-    <w:p>
-      <w:pPr>
-        <w:spacing w:after="0"/>
-      </w:pPr>
-      <w:r>
-        <w:t xml:space="preserve">      .</w:t>
-      </w:r>
-      <w:proofErr w:type="spellStart"/>
-      <w:proofErr w:type="gramStart"/>
-      <w:r>
-        <w:t>then</w:t>
-      </w:r>
-      <w:proofErr w:type="spellEnd"/>
-      <w:r>
-        <w:t>(</w:t>
-      </w:r>
-      <w:proofErr w:type="gramEnd"/>
-      <w:r>
-        <w:t xml:space="preserve">() =&gt; </w:t>
-      </w:r>
-      <w:proofErr w:type="spellStart"/>
-      <w:r>
-        <w:t>self.skipWaiting</w:t>
-      </w:r>
-      <w:proofErr w:type="spellEnd"/>
-      <w:r>
-        <w:t>())</w:t>
-      </w:r>
-    </w:p>
-    <w:p>
-      <w:pPr>
-        <w:spacing w:after="0"/>
-      </w:pPr>
-      <w:r>
-        <w:t xml:space="preserve">  );</w:t>
-      </w:r>
-    </w:p>
-    <w:p>
-      <w:pPr>
-        <w:spacing w:after="0"/>
-      </w:pPr>
-      <w:r>
-        <w:t>});</w:t>
-      </w:r>
-    </w:p>
-    <w:p>
-      <w:pPr>
-        <w:spacing w:after="0"/>
-      </w:pPr>
-    </w:p>
-    <w:p>
-      <w:pPr>
-        <w:spacing w:after="0"/>
-      </w:pPr>
-      <w:r>
-        <w:t>// Evento de activación: Limpia cachés antiguas</w:t>
-      </w:r>
-    </w:p>
-    <w:p>
-      <w:pPr>
-        <w:spacing w:after="0"/>
-      </w:pPr>
-      <w:proofErr w:type="spellStart"/>
-      <w:proofErr w:type="gramStart"/>
-      <w:r>
-        <w:t>self.addEventListener</w:t>
-      </w:r>
-      <w:proofErr w:type="spellEnd"/>
-      <w:r>
-        <w:t>(</w:t>
-      </w:r>
-      <w:proofErr w:type="gramEnd"/>
-      <w:r>
-        <w:t>'</w:t>
-      </w:r>
-      <w:proofErr w:type="spellStart"/>
-      <w:r>
-        <w:t>activate</w:t>
-      </w:r>
-      <w:proofErr w:type="spellEnd"/>
-      <w:r>
-        <w:t>', e =&gt; {</w:t>
-      </w:r>
-    </w:p>
-    <w:p>
-      <w:pPr>
-        <w:spacing w:after="0"/>
-      </w:pPr>
-      <w:r>
-        <w:t xml:space="preserve">  </w:t>
-      </w:r>
-      <w:proofErr w:type="spellStart"/>
-      <w:proofErr w:type="gramStart"/>
-      <w:r>
-        <w:t>e.waitUntil</w:t>
-      </w:r>
-      <w:proofErr w:type="spellEnd"/>
-      <w:r>
-        <w:t>(</w:t>
-      </w:r>
-      <w:proofErr w:type="gramEnd"/>
-    </w:p>
-    <w:p>
-      <w:pPr>
-        <w:spacing w:after="0"/>
-      </w:pPr>
-      <w:r>
-        <w:t xml:space="preserve">    </w:t>
-      </w:r>
-      <w:proofErr w:type="spellStart"/>
-      <w:proofErr w:type="gramStart"/>
-      <w:r>
-        <w:t>caches.keys</w:t>
-      </w:r>
-      <w:proofErr w:type="spellEnd"/>
-      <w:r>
-        <w:t>(</w:t>
-      </w:r>
-      <w:proofErr w:type="gramEnd"/>
-      <w:r>
-        <w:t>).</w:t>
-      </w:r>
-      <w:proofErr w:type="spellStart"/>
-      <w:r>
-        <w:t>then</w:t>
-      </w:r>
-      <w:proofErr w:type="spellEnd"/>
-      <w:r>
-        <w:t>(</w:t>
-      </w:r>
-      <w:proofErr w:type="spellStart"/>
-      <w:r>
-        <w:t>cacheNames</w:t>
-      </w:r>
-      <w:proofErr w:type="spellEnd"/>
-      <w:r>
-        <w:t xml:space="preserve"> =&gt; {</w:t>
-      </w:r>
-    </w:p>
-    <w:p>
-      <w:pPr>
-        <w:spacing w:after="0"/>
-      </w:pPr>
-      <w:r>
-        <w:t xml:space="preserve">      </w:t>
-      </w:r>
-      <w:proofErr w:type="spellStart"/>
-      <w:proofErr w:type="gramStart"/>
-      <w:r>
-        <w:t>return</w:t>
-      </w:r>
-      <w:proofErr w:type="spellEnd"/>
-      <w:proofErr w:type="gramEnd"/>
-      <w:r>
-        <w:t xml:space="preserve"> </w:t>
-      </w:r>
-      <w:proofErr w:type="spellStart"/>
-      <w:r>
-        <w:t>Promise.all</w:t>
-      </w:r>
-      <w:proofErr w:type="spellEnd"/>
-      <w:r>
-        <w:t>(</w:t>
-      </w:r>
-    </w:p>
-    <w:p>
-      <w:pPr>
-        <w:spacing w:after="0"/>
-      </w:pPr>
-      <w:r>
-        <w:t xml:space="preserve">        </w:t>
-      </w:r>
-      <w:proofErr w:type="spellStart"/>
-      <w:proofErr w:type="gramStart"/>
-      <w:r>
-        <w:t>cacheNames.map</w:t>
-      </w:r>
-      <w:proofErr w:type="spellEnd"/>
-      <w:r>
-        <w:t>(</w:t>
-      </w:r>
-      <w:proofErr w:type="gramEnd"/>
-      <w:r>
-        <w:t>cache =&gt; {</w:t>
-      </w:r>
-    </w:p>
-    <w:p>
-      <w:pPr>
-        <w:spacing w:after="0"/>
-      </w:pPr>
-      <w:r>
-        <w:t xml:space="preserve">          </w:t>
-      </w:r>
-      <w:proofErr w:type="spellStart"/>
-      <w:proofErr w:type="gramStart"/>
-      <w:r>
-        <w:t>if</w:t>
-      </w:r>
-      <w:proofErr w:type="spellEnd"/>
-      <w:proofErr w:type="gramEnd"/>
-      <w:r>
-        <w:t xml:space="preserve"> (cache !== CACHE_NAME) {</w:t>
-      </w:r>
-    </w:p>
-    <w:p>
-      <w:pPr>
-        <w:spacing w:after="0"/>
-      </w:pPr>
-      <w:r>
-        <w:t xml:space="preserve">            </w:t>
-      </w:r>
-      <w:proofErr w:type="spellStart"/>
-      <w:proofErr w:type="gramStart"/>
-      <w:r>
-        <w:t>return</w:t>
-      </w:r>
-      <w:proofErr w:type="spellEnd"/>
-      <w:proofErr w:type="gramEnd"/>
-      <w:r>
-        <w:t xml:space="preserve"> </w:t>
-      </w:r>
-      <w:proofErr w:type="spellStart"/>
-      <w:r>
-        <w:t>caches.delete</w:t>
-      </w:r>
-      <w:proofErr w:type="spellEnd"/>
-      <w:r>
-        <w:t>(cache);</w:t>
-      </w:r>
-    </w:p>
-    <w:p>
-      <w:pPr>
-        <w:spacing w:after="0"/>
-      </w:pPr>
-      <w:r>
-        <w:t xml:space="preserve">          }</w:t>
-      </w:r>
-    </w:p>
-    <w:p>
-      <w:pPr>
-        <w:spacing w:after="0"/>
-      </w:pPr>
-      <w:r>
-        <w:t xml:space="preserve">        })</w:t>
-      </w:r>
-    </w:p>
-    <w:p>
-      <w:pPr>
-        <w:spacing w:after="0"/>
-      </w:pPr>
-      <w:r>
-        <w:t xml:space="preserve">      );</w:t>
-      </w:r>
-    </w:p>
-    <w:p>
-      <w:pPr>
-        <w:spacing w:after="0"/>
-      </w:pPr>
-      <w:r>
-        <w:t xml:space="preserve">    })</w:t>
-      </w:r>
-    </w:p>
-    <w:p>
-      <w:pPr>
-        <w:spacing w:after="0"/>
-      </w:pPr>
-      <w:r>
-        <w:t xml:space="preserve">  );</w:t>
-      </w:r>
-    </w:p>
-    <w:p>
-      <w:pPr>
-        <w:spacing w:after="0"/>
-      </w:pPr>
-      <w:r>
-        <w:t>});</w:t>
-      </w:r>
-    </w:p>
-    <w:p>
-      <w:pPr>
-        <w:spacing w:after="0"/>
-      </w:pPr>
-    </w:p>
-    <w:p>
-      <w:pPr>
-        <w:spacing w:after="0"/>
-      </w:pPr>
-      <w:r>
-        <w:t xml:space="preserve">// Evento </w:t>
-      </w:r>
-      <w:proofErr w:type="spellStart"/>
-      <w:r>
-        <w:t>fetch</w:t>
-      </w:r>
-      <w:proofErr w:type="spellEnd"/>
-      <w:r>
-        <w:t>: Sirve el contenido desde la caché si no hay internet</w:t>
-      </w:r>
-    </w:p>
-    <w:p>
-      <w:pPr>
-        <w:spacing w:after="0"/>
-      </w:pPr>
-      <w:proofErr w:type="spellStart"/>
-      <w:proofErr w:type="gramStart"/>
-      <w:r>
-        <w:t>self.addEventListener</w:t>
-      </w:r>
-      <w:proofErr w:type="spellEnd"/>
-      <w:r>
-        <w:t>(</w:t>
-      </w:r>
-      <w:proofErr w:type="gramEnd"/>
-      <w:r>
-        <w:t>'</w:t>
-      </w:r>
-      <w:proofErr w:type="spellStart"/>
-      <w:r>
-        <w:t>fetch</w:t>
-      </w:r>
-      <w:proofErr w:type="spellEnd"/>
-      <w:r>
-        <w:t>', e =&gt; {</w:t>
-      </w:r>
-    </w:p>
-    <w:p>
-      <w:pPr>
-        <w:spacing w:after="0"/>
-      </w:pPr>
-      <w:r>
-        <w:t xml:space="preserve">  </w:t>
-      </w:r>
-      <w:proofErr w:type="spellStart"/>
-      <w:proofErr w:type="gramStart"/>
-      <w:r>
-        <w:t>e.respondWith</w:t>
-      </w:r>
-      <w:proofErr w:type="spellEnd"/>
-      <w:r>
-        <w:t>(</w:t>
-      </w:r>
-      <w:proofErr w:type="gramEnd"/>
-    </w:p>
-    <w:p>
-      <w:pPr>
-        <w:spacing w:after="0"/>
-      </w:pPr>
-      <w:r>
-        <w:lastRenderedPageBreak/>
+      <w:r>
         <w:t xml:space="preserve">    </w:t>
       </w:r>
       <w:proofErr w:type="spellStart"/>
@@ -13292,6 +13442,7 @@
           <w:b/>
           <w:bCs/>
         </w:rPr>
+        <w:lastRenderedPageBreak/>
         <w:t>Usa las Herramientas de Desarrollador (F12):</w:t>
       </w:r>
       <w:r>
@@ -16987,6 +17138,7 @@
   <w:style w:type="character" w:default="1" w:styleId="Fuentedeprrafopredeter">
     <w:name w:val="Default Paragraph Font"/>
     <w:uiPriority w:val="1"/>
+    <w:semiHidden/>
     <w:unhideWhenUsed/>
   </w:style>
   <w:style w:type="table" w:default="1" w:styleId="Tablanormal">
@@ -17198,6 +17350,7 @@
   <w:style w:type="character" w:default="1" w:styleId="Fuentedeprrafopredeter">
     <w:name w:val="Default Paragraph Font"/>
     <w:uiPriority w:val="1"/>
+    <w:semiHidden/>
     <w:unhideWhenUsed/>
   </w:style>
   <w:style w:type="table" w:default="1" w:styleId="Tablanormal">
@@ -17536,7 +17689,7 @@
 </file>
 
 <file path=customXml/itemProps1.xml><?xml version="1.0" encoding="utf-8"?>
-<ds:datastoreItem xmlns:ds="http://schemas.openxmlformats.org/officeDocument/2006/customXml" ds:itemID="{699DDB69-00CD-4B50-A052-148A349D986E}">
+<ds:datastoreItem xmlns:ds="http://schemas.openxmlformats.org/officeDocument/2006/customXml" ds:itemID="{BD96E53C-DCE3-4574-B499-E13A83814850}">
   <ds:schemaRefs>
     <ds:schemaRef ds:uri="http://schemas.openxmlformats.org/officeDocument/2006/bibliography"/>
   </ds:schemaRefs>

</xml_diff>

<commit_message>
se corrige error de app
</commit_message>
<xml_diff>
--- a/requerimientos.docx
+++ b/requerimientos.docx
@@ -11219,6 +11219,211 @@
         </w:rPr>
         <w:t xml:space="preserve"> para que al guardar datos los asocien automáticamente al ciclo activo</w:t>
       </w:r>
+    </w:p>
+    <w:p>
+      <w:pPr>
+        <w:rPr>
+          <w:b/>
+        </w:rPr>
+      </w:pPr>
+      <w:r>
+        <w:rPr>
+          <w:b/>
+        </w:rPr>
+        <w:t>E</w:t>
+      </w:r>
+      <w:r>
+        <w:rPr>
+          <w:b/>
+        </w:rPr>
+        <w:t xml:space="preserve">n cuanto a </w:t>
+      </w:r>
+      <w:proofErr w:type="spellStart"/>
+      <w:r>
+        <w:rPr>
+          <w:b/>
+        </w:rPr>
+        <w:t>excel</w:t>
+      </w:r>
+      <w:proofErr w:type="spellEnd"/>
+      <w:r>
+        <w:rPr>
+          <w:b/>
+        </w:rPr>
+        <w:t xml:space="preserve"> me da error al intentar abrir el </w:t>
+      </w:r>
+      <w:proofErr w:type="gramStart"/>
+      <w:r>
+        <w:rPr>
+          <w:b/>
+        </w:rPr>
+        <w:t>archivo ,</w:t>
+      </w:r>
+      <w:proofErr w:type="gramEnd"/>
+      <w:r>
+        <w:rPr>
+          <w:b/>
+        </w:rPr>
+        <w:t xml:space="preserve"> necesito que sea compatible desde el 97 en adelante, y por otro lado necesito que me pida la </w:t>
+      </w:r>
+      <w:proofErr w:type="spellStart"/>
+      <w:r>
+        <w:rPr>
+          <w:b/>
+        </w:rPr>
+        <w:t>opcion</w:t>
+      </w:r>
+      <w:proofErr w:type="spellEnd"/>
+      <w:r>
+        <w:rPr>
+          <w:b/>
+        </w:rPr>
+        <w:t xml:space="preserve"> de abrir en google </w:t>
+      </w:r>
+      <w:proofErr w:type="spellStart"/>
+      <w:r>
+        <w:rPr>
+          <w:b/>
+        </w:rPr>
+        <w:t>direactamente</w:t>
+      </w:r>
+      <w:proofErr w:type="spellEnd"/>
+      <w:r>
+        <w:rPr>
+          <w:b/>
+        </w:rPr>
+        <w:t xml:space="preserve"> o descargar a la pc</w:t>
+      </w:r>
+      <w:r>
+        <w:rPr>
+          <w:b/>
+        </w:rPr>
+        <w:t xml:space="preserve">, para mejorar la </w:t>
+      </w:r>
+      <w:proofErr w:type="spellStart"/>
+      <w:r>
+        <w:rPr>
+          <w:b/>
+        </w:rPr>
+        <w:t>compatbilidad</w:t>
+      </w:r>
+      <w:proofErr w:type="spellEnd"/>
+    </w:p>
+    <w:p>
+      <w:r>
+        <w:lastRenderedPageBreak/>
+        <w:t xml:space="preserve">Necesito </w:t>
+      </w:r>
+      <w:r>
+        <w:t xml:space="preserve">convertir </w:t>
+      </w:r>
+      <w:r>
+        <w:t>mi sistema (</w:t>
+      </w:r>
+      <w:r>
+        <w:t>aplicación web</w:t>
+      </w:r>
+      <w:r>
+        <w:t>) gestión de aula en la que estamos trabajando</w:t>
+      </w:r>
+      <w:r>
+        <w:t xml:space="preserve">  en una </w:t>
+      </w:r>
+      <w:r>
+        <w:rPr>
+          <w:b/>
+          <w:bCs/>
+        </w:rPr>
+        <w:t>Aplicación Web Progresiva (PWA)</w:t>
+      </w:r>
+      <w:r>
+        <w:t xml:space="preserve"> y permitir que los usuarios la instalen en su computadora o celular como si fuera una </w:t>
+      </w:r>
+      <w:proofErr w:type="spellStart"/>
+      <w:r>
+        <w:t>app</w:t>
+      </w:r>
+      <w:proofErr w:type="spellEnd"/>
+      <w:r>
+        <w:t xml:space="preserve"> nativa, </w:t>
+      </w:r>
+      <w:r>
+        <w:t xml:space="preserve">y </w:t>
+      </w:r>
+      <w:r>
+        <w:t xml:space="preserve">agregar a la </w:t>
+      </w:r>
+      <w:proofErr w:type="spellStart"/>
+      <w:r>
+        <w:t>landing</w:t>
+      </w:r>
+      <w:proofErr w:type="spellEnd"/>
+      <w:r>
+        <w:t xml:space="preserve"> page una opción para descargar la versión de escritorio del software de gestión de aula.</w:t>
+      </w:r>
+    </w:p>
+    <w:p>
+      <w:r>
+        <w:t xml:space="preserve">Cuando le hago </w:t>
+      </w:r>
+      <w:proofErr w:type="spellStart"/>
+      <w:r>
+        <w:t>click</w:t>
+      </w:r>
+      <w:proofErr w:type="spellEnd"/>
+      <w:r>
+        <w:t xml:space="preserve"> a instalar </w:t>
+      </w:r>
+      <w:proofErr w:type="spellStart"/>
+      <w:r>
+        <w:t>app</w:t>
+      </w:r>
+      <w:proofErr w:type="spellEnd"/>
+      <w:r>
+        <w:t xml:space="preserve"> me lleva a la parte de la vista con las tres opciones y no hace nada </w:t>
+      </w:r>
+      <w:proofErr w:type="spellStart"/>
+      <w:r>
+        <w:t>mas</w:t>
+      </w:r>
+      <w:proofErr w:type="spellEnd"/>
+      <w:r>
+        <w:t xml:space="preserve">, necesito que se instalen el de </w:t>
+      </w:r>
+      <w:proofErr w:type="spellStart"/>
+      <w:r>
+        <w:t>android</w:t>
+      </w:r>
+      <w:proofErr w:type="spellEnd"/>
+      <w:r>
+        <w:t xml:space="preserve"> y el de pc, o que me generes el software para pc de escritorio, que a su vez me permita trabajar sin </w:t>
+      </w:r>
+      <w:proofErr w:type="spellStart"/>
+      <w:r>
+        <w:t>conexion</w:t>
+      </w:r>
+      <w:proofErr w:type="spellEnd"/>
+      <w:r>
+        <w:t xml:space="preserve"> y luego cuando hay </w:t>
+      </w:r>
+      <w:proofErr w:type="spellStart"/>
+      <w:r>
+        <w:t>conexion</w:t>
+      </w:r>
+      <w:proofErr w:type="spellEnd"/>
+      <w:r>
+        <w:t xml:space="preserve"> que </w:t>
+      </w:r>
+      <w:proofErr w:type="spellStart"/>
+      <w:r>
+        <w:t>actualize</w:t>
+      </w:r>
+      <w:proofErr w:type="spellEnd"/>
+      <w:r>
+        <w:t xml:space="preserve"> los datos</w:t>
+      </w:r>
+    </w:p>
+    <w:p>
       <w:bookmarkStart w:id="0" w:name="_GoBack"/>
       <w:bookmarkEnd w:id="0"/>
     </w:p>
@@ -11226,149 +11431,6 @@
       <w:pPr>
         <w:rPr>
           <w:b/>
-        </w:rPr>
-      </w:pPr>
-      <w:r>
-        <w:rPr>
-          <w:b/>
-        </w:rPr>
-        <w:t>E</w:t>
-      </w:r>
-      <w:r>
-        <w:rPr>
-          <w:b/>
-        </w:rPr>
-        <w:t xml:space="preserve">n cuanto a </w:t>
-      </w:r>
-      <w:proofErr w:type="spellStart"/>
-      <w:r>
-        <w:rPr>
-          <w:b/>
-        </w:rPr>
-        <w:t>excel</w:t>
-      </w:r>
-      <w:proofErr w:type="spellEnd"/>
-      <w:r>
-        <w:rPr>
-          <w:b/>
-        </w:rPr>
-        <w:t xml:space="preserve"> me da error al intentar abrir el </w:t>
-      </w:r>
-      <w:proofErr w:type="gramStart"/>
-      <w:r>
-        <w:rPr>
-          <w:b/>
-        </w:rPr>
-        <w:t>archivo ,</w:t>
-      </w:r>
-      <w:proofErr w:type="gramEnd"/>
-      <w:r>
-        <w:rPr>
-          <w:b/>
-        </w:rPr>
-        <w:t xml:space="preserve"> necesito que sea compatible desde el 97 en adelante, y por otro lado necesito que me pida la </w:t>
-      </w:r>
-      <w:proofErr w:type="spellStart"/>
-      <w:r>
-        <w:rPr>
-          <w:b/>
-        </w:rPr>
-        <w:t>opcion</w:t>
-      </w:r>
-      <w:proofErr w:type="spellEnd"/>
-      <w:r>
-        <w:rPr>
-          <w:b/>
-        </w:rPr>
-        <w:t xml:space="preserve"> de abrir en google </w:t>
-      </w:r>
-      <w:proofErr w:type="spellStart"/>
-      <w:r>
-        <w:rPr>
-          <w:b/>
-        </w:rPr>
-        <w:t>direactamente</w:t>
-      </w:r>
-      <w:proofErr w:type="spellEnd"/>
-      <w:r>
-        <w:rPr>
-          <w:b/>
-        </w:rPr>
-        <w:t xml:space="preserve"> o descargar a la pc</w:t>
-      </w:r>
-      <w:r>
-        <w:rPr>
-          <w:b/>
-        </w:rPr>
-        <w:t xml:space="preserve">, para mejorar la </w:t>
-      </w:r>
-      <w:proofErr w:type="spellStart"/>
-      <w:r>
-        <w:rPr>
-          <w:b/>
-        </w:rPr>
-        <w:t>compatbilidad</w:t>
-      </w:r>
-      <w:proofErr w:type="spellEnd"/>
-    </w:p>
-    <w:p>
-      <w:r>
-        <w:lastRenderedPageBreak/>
-        <w:t xml:space="preserve">Necesito </w:t>
-      </w:r>
-      <w:r>
-        <w:t xml:space="preserve">convertir </w:t>
-      </w:r>
-      <w:r>
-        <w:t>mi sistema (</w:t>
-      </w:r>
-      <w:r>
-        <w:t>aplicación web</w:t>
-      </w:r>
-      <w:r>
-        <w:t>) gestión de aula en la que estamos trabajando</w:t>
-      </w:r>
-      <w:r>
-        <w:t xml:space="preserve">  en una </w:t>
-      </w:r>
-      <w:r>
-        <w:rPr>
-          <w:b/>
-          <w:bCs/>
-        </w:rPr>
-        <w:t>Aplicación Web Progresiva (PWA)</w:t>
-      </w:r>
-      <w:r>
-        <w:t xml:space="preserve"> y permitir que los usuarios la instalen en su computadora o celular como si fuera una </w:t>
-      </w:r>
-      <w:proofErr w:type="spellStart"/>
-      <w:r>
-        <w:t>app</w:t>
-      </w:r>
-      <w:proofErr w:type="spellEnd"/>
-      <w:r>
-        <w:t xml:space="preserve"> nativa, </w:t>
-      </w:r>
-      <w:r>
-        <w:t xml:space="preserve">y </w:t>
-      </w:r>
-      <w:r>
-        <w:t xml:space="preserve">agregar a la </w:t>
-      </w:r>
-      <w:proofErr w:type="spellStart"/>
-      <w:r>
-        <w:t>landing</w:t>
-      </w:r>
-      <w:proofErr w:type="spellEnd"/>
-      <w:r>
-        <w:t xml:space="preserve"> page una opción para descargar la versión de escritorio del software de gestión de aula.</w:t>
-      </w:r>
-    </w:p>
-    <w:p/>
-    <w:p>
-      <w:pPr>
-        <w:rPr>
-          <w:b/>
           <w:lang w:val="es-ES"/>
         </w:rPr>
       </w:pPr>
@@ -11543,7 +11605,6 @@
           <w:b/>
           <w:bCs/>
         </w:rPr>
-        <w:lastRenderedPageBreak/>
         <w:t>Aplicación Web Progresiva (PWA)</w:t>
       </w:r>
     </w:p>
@@ -12072,6 +12133,7 @@
         <w:spacing w:after="0"/>
       </w:pPr>
       <w:r>
+        <w:lastRenderedPageBreak/>
         <w:t xml:space="preserve">  "</w:t>
       </w:r>
       <w:proofErr w:type="spellStart"/>
@@ -12169,157 +12231,968 @@
           <w:b/>
           <w:bCs/>
         </w:rPr>
+        <w:t>Nota clave:</w:t>
+      </w:r>
+      <w:r>
+        <w:t xml:space="preserve"> La propiedad "</w:t>
+      </w:r>
+      <w:proofErr w:type="spellStart"/>
+      <w:r>
+        <w:t>display</w:t>
+      </w:r>
+      <w:proofErr w:type="spellEnd"/>
+      <w:r>
+        <w:t>": "</w:t>
+      </w:r>
+      <w:proofErr w:type="spellStart"/>
+      <w:r>
+        <w:t>standalone</w:t>
+      </w:r>
+      <w:proofErr w:type="spellEnd"/>
+      <w:r>
+        <w:t xml:space="preserve">" es la que hace que la aplicación se abra en su propia ventana oculta, eliminando la barra de direcciones del navegador para que parezca una </w:t>
+      </w:r>
+      <w:proofErr w:type="spellStart"/>
+      <w:r>
+        <w:t>app</w:t>
+      </w:r>
+      <w:proofErr w:type="spellEnd"/>
+      <w:r>
+        <w:t xml:space="preserve"> de escritorio nativa.</w:t>
+      </w:r>
+    </w:p>
+    <w:p>
+      <w:pPr>
+        <w:rPr>
+          <w:b/>
+          <w:bCs/>
+        </w:rPr>
+      </w:pPr>
+      <w:r>
+        <w:rPr>
+          <w:b/>
+          <w:bCs/>
+        </w:rPr>
+        <w:t xml:space="preserve">Paso 2: Vincular el </w:t>
+      </w:r>
+      <w:proofErr w:type="spellStart"/>
+      <w:r>
+        <w:rPr>
+          <w:b/>
+          <w:bCs/>
+        </w:rPr>
+        <w:t>Manifest</w:t>
+      </w:r>
+      <w:proofErr w:type="spellEnd"/>
+      <w:r>
+        <w:rPr>
+          <w:b/>
+          <w:bCs/>
+        </w:rPr>
+        <w:t xml:space="preserve"> en tu HTML</w:t>
+      </w:r>
+    </w:p>
+    <w:p>
+      <w:r>
+        <w:t>En el &lt;head&gt; de tu archivo index.html, debes enlazar el archivo que acabas de crear:</w:t>
+      </w:r>
+    </w:p>
+    <w:p>
+      <w:r>
+        <w:t>HTML</w:t>
+      </w:r>
+    </w:p>
+    <w:p>
+      <w:r>
+        <w:t xml:space="preserve">&lt;link </w:t>
+      </w:r>
+      <w:proofErr w:type="spellStart"/>
+      <w:r>
+        <w:t>rel</w:t>
+      </w:r>
+      <w:proofErr w:type="spellEnd"/>
+      <w:r>
+        <w:t>="</w:t>
+      </w:r>
+      <w:proofErr w:type="spellStart"/>
+      <w:r>
+        <w:t>manifest</w:t>
+      </w:r>
+      <w:proofErr w:type="spellEnd"/>
+      <w:r>
+        <w:t xml:space="preserve">" </w:t>
+      </w:r>
+      <w:proofErr w:type="spellStart"/>
+      <w:r>
+        <w:t>href</w:t>
+      </w:r>
+      <w:proofErr w:type="spellEnd"/>
+      <w:r>
+        <w:t>="/</w:t>
+      </w:r>
+      <w:proofErr w:type="spellStart"/>
+      <w:r>
+        <w:t>manifest.json</w:t>
+      </w:r>
+      <w:proofErr w:type="spellEnd"/>
+      <w:r>
+        <w:t>"&gt;</w:t>
+      </w:r>
+    </w:p>
+    <w:p>
+      <w:r>
+        <w:t xml:space="preserve">&lt;meta </w:t>
+      </w:r>
+      <w:proofErr w:type="spellStart"/>
+      <w:r>
+        <w:t>name</w:t>
+      </w:r>
+      <w:proofErr w:type="spellEnd"/>
+      <w:r>
+        <w:t>="</w:t>
+      </w:r>
+      <w:proofErr w:type="spellStart"/>
+      <w:r>
+        <w:t>theme</w:t>
+      </w:r>
+      <w:proofErr w:type="spellEnd"/>
+      <w:r>
+        <w:t xml:space="preserve">-color" </w:t>
+      </w:r>
+      <w:proofErr w:type="spellStart"/>
+      <w:r>
+        <w:t>content</w:t>
+      </w:r>
+      <w:proofErr w:type="spellEnd"/>
+      <w:r>
+        <w:t>="#0078d4"&gt;</w:t>
+      </w:r>
+    </w:p>
+    <w:p>
+      <w:pPr>
+        <w:rPr>
+          <w:b/>
+          <w:bCs/>
+        </w:rPr>
+      </w:pPr>
+      <w:r>
+        <w:rPr>
+          <w:b/>
+          <w:bCs/>
+        </w:rPr>
+        <w:t xml:space="preserve">Paso 3: Crear el </w:t>
+      </w:r>
+      <w:proofErr w:type="spellStart"/>
+      <w:r>
+        <w:rPr>
+          <w:b/>
+          <w:bCs/>
+        </w:rPr>
+        <w:t>Service</w:t>
+      </w:r>
+      <w:proofErr w:type="spellEnd"/>
+      <w:r>
+        <w:rPr>
+          <w:b/>
+          <w:bCs/>
+        </w:rPr>
+        <w:t xml:space="preserve"> </w:t>
+      </w:r>
+      <w:proofErr w:type="spellStart"/>
+      <w:r>
+        <w:rPr>
+          <w:b/>
+          <w:bCs/>
+        </w:rPr>
+        <w:t>Worker</w:t>
+      </w:r>
+      <w:proofErr w:type="spellEnd"/>
+      <w:r>
+        <w:rPr>
+          <w:b/>
+          <w:bCs/>
+        </w:rPr>
+        <w:t xml:space="preserve"> (sw.js)</w:t>
+      </w:r>
+    </w:p>
+    <w:p>
+      <w:r>
+        <w:t xml:space="preserve">El </w:t>
+      </w:r>
+      <w:proofErr w:type="spellStart"/>
+      <w:r>
+        <w:t>Service</w:t>
+      </w:r>
+      <w:proofErr w:type="spellEnd"/>
+      <w:r>
+        <w:t xml:space="preserve"> </w:t>
+      </w:r>
+      <w:proofErr w:type="spellStart"/>
+      <w:r>
+        <w:t>Worker</w:t>
+      </w:r>
+      <w:proofErr w:type="spellEnd"/>
+      <w:r>
+        <w:t xml:space="preserve"> es el motor que gestiona la caché y permite que la </w:t>
+      </w:r>
+      <w:proofErr w:type="spellStart"/>
+      <w:r>
+        <w:t>app</w:t>
+      </w:r>
+      <w:proofErr w:type="spellEnd"/>
+      <w:r>
+        <w:t xml:space="preserve"> cargue instantáneamente. Crea un archivo llamado sw.js en la raíz de tu proyecto con este código básico de almacenamiento en caché:</w:t>
+      </w:r>
+    </w:p>
+    <w:p>
+      <w:pPr>
+        <w:spacing w:after="0"/>
+      </w:pPr>
+      <w:r>
+        <w:t>JavaScript</w:t>
+      </w:r>
+    </w:p>
+    <w:p>
+      <w:pPr>
+        <w:spacing w:after="0"/>
+      </w:pPr>
+      <w:proofErr w:type="spellStart"/>
+      <w:proofErr w:type="gramStart"/>
+      <w:r>
+        <w:t>const</w:t>
+      </w:r>
+      <w:proofErr w:type="spellEnd"/>
+      <w:proofErr w:type="gramEnd"/>
+      <w:r>
+        <w:t xml:space="preserve"> CACHE_NAME = 'v1_cache_miapp';</w:t>
+      </w:r>
+    </w:p>
+    <w:p>
+      <w:pPr>
+        <w:spacing w:after="0"/>
+      </w:pPr>
+      <w:r>
+        <w:t>// Archivos esenciales que quieres que funcionen incluso sin internet</w:t>
+      </w:r>
+    </w:p>
+    <w:p>
+      <w:pPr>
+        <w:spacing w:after="0"/>
+      </w:pPr>
+      <w:proofErr w:type="spellStart"/>
+      <w:proofErr w:type="gramStart"/>
+      <w:r>
+        <w:t>const</w:t>
+      </w:r>
+      <w:proofErr w:type="spellEnd"/>
+      <w:proofErr w:type="gramEnd"/>
+      <w:r>
+        <w:t xml:space="preserve"> </w:t>
+      </w:r>
+      <w:proofErr w:type="spellStart"/>
+      <w:r>
+        <w:t>urlsToCache</w:t>
+      </w:r>
+      <w:proofErr w:type="spellEnd"/>
+      <w:r>
+        <w:t xml:space="preserve"> = [</w:t>
+      </w:r>
+    </w:p>
+    <w:p>
+      <w:pPr>
+        <w:spacing w:after="0"/>
+      </w:pPr>
+      <w:r>
+        <w:t xml:space="preserve">  '/',</w:t>
+      </w:r>
+    </w:p>
+    <w:p>
+      <w:pPr>
+        <w:spacing w:after="0"/>
+      </w:pPr>
+      <w:r>
+        <w:t xml:space="preserve">  '/index.html',</w:t>
+      </w:r>
+    </w:p>
+    <w:p>
+      <w:pPr>
+        <w:spacing w:after="0"/>
+      </w:pPr>
+      <w:r>
+        <w:t xml:space="preserve">  '/styles.css',</w:t>
+      </w:r>
+    </w:p>
+    <w:p>
+      <w:pPr>
+        <w:spacing w:after="0"/>
+      </w:pPr>
+      <w:r>
+        <w:t xml:space="preserve">  '/script.js',</w:t>
+      </w:r>
+    </w:p>
+    <w:p>
+      <w:pPr>
+        <w:spacing w:after="0"/>
+      </w:pPr>
+      <w:r>
+        <w:t xml:space="preserve">  '/icon-192.png'</w:t>
+      </w:r>
+    </w:p>
+    <w:p>
+      <w:pPr>
+        <w:spacing w:after="0"/>
+      </w:pPr>
+      <w:r>
+        <w:t>];</w:t>
+      </w:r>
+    </w:p>
+    <w:p>
+      <w:pPr>
+        <w:spacing w:after="0"/>
+      </w:pPr>
+    </w:p>
+    <w:p>
+      <w:pPr>
+        <w:spacing w:after="0"/>
+      </w:pPr>
+      <w:r>
+        <w:t>// Evento de instalación: Guarda los archivos en la caché del navegador</w:t>
+      </w:r>
+    </w:p>
+    <w:p>
+      <w:pPr>
+        <w:spacing w:after="0"/>
+      </w:pPr>
+      <w:proofErr w:type="spellStart"/>
+      <w:proofErr w:type="gramStart"/>
+      <w:r>
+        <w:t>self.addEventListener</w:t>
+      </w:r>
+      <w:proofErr w:type="spellEnd"/>
+      <w:r>
+        <w:t>(</w:t>
+      </w:r>
+      <w:proofErr w:type="gramEnd"/>
+      <w:r>
+        <w:t>'</w:t>
+      </w:r>
+      <w:proofErr w:type="spellStart"/>
+      <w:r>
+        <w:t>install</w:t>
+      </w:r>
+      <w:proofErr w:type="spellEnd"/>
+      <w:r>
+        <w:t>', e =&gt; {</w:t>
+      </w:r>
+    </w:p>
+    <w:p>
+      <w:pPr>
+        <w:spacing w:after="0"/>
+      </w:pPr>
+      <w:r>
+        <w:t xml:space="preserve">  </w:t>
+      </w:r>
+      <w:proofErr w:type="spellStart"/>
+      <w:proofErr w:type="gramStart"/>
+      <w:r>
+        <w:t>e.waitUntil</w:t>
+      </w:r>
+      <w:proofErr w:type="spellEnd"/>
+      <w:r>
+        <w:t>(</w:t>
+      </w:r>
+      <w:proofErr w:type="gramEnd"/>
+    </w:p>
+    <w:p>
+      <w:pPr>
+        <w:spacing w:after="0"/>
+      </w:pPr>
+      <w:r>
+        <w:t xml:space="preserve">    </w:t>
+      </w:r>
+      <w:proofErr w:type="spellStart"/>
+      <w:proofErr w:type="gramStart"/>
+      <w:r>
+        <w:t>caches.open</w:t>
+      </w:r>
+      <w:proofErr w:type="spellEnd"/>
+      <w:r>
+        <w:t>(</w:t>
+      </w:r>
+      <w:proofErr w:type="gramEnd"/>
+      <w:r>
+        <w:t>CACHE_NAME)</w:t>
+      </w:r>
+    </w:p>
+    <w:p>
+      <w:pPr>
+        <w:spacing w:after="0"/>
+      </w:pPr>
+      <w:r>
+        <w:t xml:space="preserve">      .</w:t>
+      </w:r>
+      <w:proofErr w:type="spellStart"/>
+      <w:proofErr w:type="gramStart"/>
+      <w:r>
+        <w:t>then</w:t>
+      </w:r>
+      <w:proofErr w:type="spellEnd"/>
+      <w:r>
+        <w:t>(</w:t>
+      </w:r>
+      <w:proofErr w:type="gramEnd"/>
+      <w:r>
+        <w:t>cache =&gt; {</w:t>
+      </w:r>
+    </w:p>
+    <w:p>
+      <w:pPr>
+        <w:spacing w:after="0"/>
+      </w:pPr>
+      <w:r>
+        <w:t xml:space="preserve">        </w:t>
+      </w:r>
+      <w:proofErr w:type="spellStart"/>
+      <w:proofErr w:type="gramStart"/>
+      <w:r>
+        <w:t>return</w:t>
+      </w:r>
+      <w:proofErr w:type="spellEnd"/>
+      <w:proofErr w:type="gramEnd"/>
+      <w:r>
+        <w:t xml:space="preserve"> </w:t>
+      </w:r>
+      <w:proofErr w:type="spellStart"/>
+      <w:r>
+        <w:t>cache.addAll</w:t>
+      </w:r>
+      <w:proofErr w:type="spellEnd"/>
+      <w:r>
+        <w:t>(</w:t>
+      </w:r>
+      <w:proofErr w:type="spellStart"/>
+      <w:r>
+        <w:t>urlsToCache</w:t>
+      </w:r>
+      <w:proofErr w:type="spellEnd"/>
+      <w:r>
+        <w:t>);</w:t>
+      </w:r>
+    </w:p>
+    <w:p>
+      <w:pPr>
+        <w:spacing w:after="0"/>
+      </w:pPr>
+      <w:r>
+        <w:t xml:space="preserve">      })</w:t>
+      </w:r>
+    </w:p>
+    <w:p>
+      <w:pPr>
+        <w:spacing w:after="0"/>
+      </w:pPr>
+      <w:r>
+        <w:t xml:space="preserve">      .</w:t>
+      </w:r>
+      <w:proofErr w:type="spellStart"/>
+      <w:proofErr w:type="gramStart"/>
+      <w:r>
+        <w:t>then</w:t>
+      </w:r>
+      <w:proofErr w:type="spellEnd"/>
+      <w:r>
+        <w:t>(</w:t>
+      </w:r>
+      <w:proofErr w:type="gramEnd"/>
+      <w:r>
+        <w:t xml:space="preserve">() =&gt; </w:t>
+      </w:r>
+      <w:proofErr w:type="spellStart"/>
+      <w:r>
+        <w:t>self.skipWaiting</w:t>
+      </w:r>
+      <w:proofErr w:type="spellEnd"/>
+      <w:r>
+        <w:t>())</w:t>
+      </w:r>
+    </w:p>
+    <w:p>
+      <w:pPr>
+        <w:spacing w:after="0"/>
+      </w:pPr>
+      <w:r>
+        <w:t xml:space="preserve">  );</w:t>
+      </w:r>
+    </w:p>
+    <w:p>
+      <w:pPr>
+        <w:spacing w:after="0"/>
+      </w:pPr>
+      <w:r>
+        <w:t>});</w:t>
+      </w:r>
+    </w:p>
+    <w:p>
+      <w:pPr>
+        <w:spacing w:after="0"/>
+      </w:pPr>
+    </w:p>
+    <w:p>
+      <w:pPr>
+        <w:spacing w:after="0"/>
+      </w:pPr>
+      <w:r>
+        <w:t>// Evento de activación: Limpia cachés antiguas</w:t>
+      </w:r>
+    </w:p>
+    <w:p>
+      <w:pPr>
+        <w:spacing w:after="0"/>
+      </w:pPr>
+      <w:proofErr w:type="spellStart"/>
+      <w:proofErr w:type="gramStart"/>
+      <w:r>
         <w:lastRenderedPageBreak/>
-        <w:t>Nota clave:</w:t>
-      </w:r>
-      <w:r>
-        <w:t xml:space="preserve"> La propiedad "</w:t>
-      </w:r>
-      <w:proofErr w:type="spellStart"/>
-      <w:r>
-        <w:t>display</w:t>
-      </w:r>
-      <w:proofErr w:type="spellEnd"/>
-      <w:r>
-        <w:t>": "</w:t>
-      </w:r>
-      <w:proofErr w:type="spellStart"/>
-      <w:r>
-        <w:t>standalone</w:t>
-      </w:r>
-      <w:proofErr w:type="spellEnd"/>
-      <w:r>
-        <w:t xml:space="preserve">" es la que hace que la aplicación se abra en su propia ventana oculta, eliminando la barra de direcciones del navegador para que parezca una </w:t>
-      </w:r>
-      <w:proofErr w:type="spellStart"/>
-      <w:r>
-        <w:t>app</w:t>
-      </w:r>
-      <w:proofErr w:type="spellEnd"/>
-      <w:r>
-        <w:t xml:space="preserve"> de escritorio nativa.</w:t>
-      </w:r>
-    </w:p>
-    <w:p>
-      <w:pPr>
-        <w:rPr>
-          <w:b/>
-          <w:bCs/>
-        </w:rPr>
-      </w:pPr>
-      <w:r>
-        <w:rPr>
-          <w:b/>
-          <w:bCs/>
-        </w:rPr>
-        <w:t xml:space="preserve">Paso 2: Vincular el </w:t>
-      </w:r>
-      <w:proofErr w:type="spellStart"/>
-      <w:r>
-        <w:rPr>
-          <w:b/>
-          <w:bCs/>
-        </w:rPr>
-        <w:t>Manifest</w:t>
-      </w:r>
-      <w:proofErr w:type="spellEnd"/>
-      <w:r>
-        <w:rPr>
-          <w:b/>
-          <w:bCs/>
-        </w:rPr>
-        <w:t xml:space="preserve"> en tu HTML</w:t>
-      </w:r>
-    </w:p>
-    <w:p>
-      <w:r>
-        <w:t>En el &lt;head&gt; de tu archivo index.html, debes enlazar el archivo que acabas de crear:</w:t>
-      </w:r>
-    </w:p>
-    <w:p>
-      <w:r>
-        <w:t>HTML</w:t>
-      </w:r>
-    </w:p>
-    <w:p>
-      <w:r>
-        <w:t xml:space="preserve">&lt;link </w:t>
-      </w:r>
-      <w:proofErr w:type="spellStart"/>
-      <w:r>
-        <w:t>rel</w:t>
-      </w:r>
-      <w:proofErr w:type="spellEnd"/>
-      <w:r>
-        <w:t>="</w:t>
-      </w:r>
-      <w:proofErr w:type="spellStart"/>
-      <w:r>
-        <w:t>manifest</w:t>
-      </w:r>
-      <w:proofErr w:type="spellEnd"/>
-      <w:r>
-        <w:t xml:space="preserve">" </w:t>
-      </w:r>
-      <w:proofErr w:type="spellStart"/>
-      <w:r>
-        <w:t>href</w:t>
-      </w:r>
-      <w:proofErr w:type="spellEnd"/>
-      <w:r>
-        <w:t>="/</w:t>
-      </w:r>
-      <w:proofErr w:type="spellStart"/>
-      <w:r>
-        <w:t>manifest.json</w:t>
-      </w:r>
-      <w:proofErr w:type="spellEnd"/>
-      <w:r>
-        <w:t>"&gt;</w:t>
-      </w:r>
-    </w:p>
-    <w:p>
-      <w:r>
-        <w:t xml:space="preserve">&lt;meta </w:t>
-      </w:r>
-      <w:proofErr w:type="spellStart"/>
-      <w:r>
-        <w:t>name</w:t>
-      </w:r>
-      <w:proofErr w:type="spellEnd"/>
-      <w:r>
-        <w:t>="</w:t>
-      </w:r>
-      <w:proofErr w:type="spellStart"/>
-      <w:r>
-        <w:t>theme</w:t>
-      </w:r>
-      <w:proofErr w:type="spellEnd"/>
-      <w:r>
-        <w:t xml:space="preserve">-color" </w:t>
-      </w:r>
-      <w:proofErr w:type="spellStart"/>
-      <w:r>
-        <w:t>content</w:t>
-      </w:r>
-      <w:proofErr w:type="spellEnd"/>
-      <w:r>
-        <w:t>="#0078d4"&gt;</w:t>
-      </w:r>
-    </w:p>
-    <w:p>
-      <w:pPr>
-        <w:rPr>
-          <w:b/>
-          <w:bCs/>
-        </w:rPr>
-      </w:pPr>
-      <w:r>
-        <w:rPr>
-          <w:b/>
-          <w:bCs/>
-        </w:rPr>
-        <w:t xml:space="preserve">Paso 3: Crear el </w:t>
+        <w:t>self.addEventListener</w:t>
+      </w:r>
+      <w:proofErr w:type="spellEnd"/>
+      <w:r>
+        <w:t>(</w:t>
+      </w:r>
+      <w:proofErr w:type="gramEnd"/>
+      <w:r>
+        <w:t>'</w:t>
+      </w:r>
+      <w:proofErr w:type="spellStart"/>
+      <w:r>
+        <w:t>activate</w:t>
+      </w:r>
+      <w:proofErr w:type="spellEnd"/>
+      <w:r>
+        <w:t>', e =&gt; {</w:t>
+      </w:r>
+    </w:p>
+    <w:p>
+      <w:pPr>
+        <w:spacing w:after="0"/>
+      </w:pPr>
+      <w:r>
+        <w:t xml:space="preserve">  </w:t>
+      </w:r>
+      <w:proofErr w:type="spellStart"/>
+      <w:proofErr w:type="gramStart"/>
+      <w:r>
+        <w:t>e.waitUntil</w:t>
+      </w:r>
+      <w:proofErr w:type="spellEnd"/>
+      <w:r>
+        <w:t>(</w:t>
+      </w:r>
+      <w:proofErr w:type="gramEnd"/>
+    </w:p>
+    <w:p>
+      <w:pPr>
+        <w:spacing w:after="0"/>
+      </w:pPr>
+      <w:r>
+        <w:t xml:space="preserve">    </w:t>
+      </w:r>
+      <w:proofErr w:type="spellStart"/>
+      <w:proofErr w:type="gramStart"/>
+      <w:r>
+        <w:t>caches.keys</w:t>
+      </w:r>
+      <w:proofErr w:type="spellEnd"/>
+      <w:r>
+        <w:t>(</w:t>
+      </w:r>
+      <w:proofErr w:type="gramEnd"/>
+      <w:r>
+        <w:t>).</w:t>
+      </w:r>
+      <w:proofErr w:type="spellStart"/>
+      <w:r>
+        <w:t>then</w:t>
+      </w:r>
+      <w:proofErr w:type="spellEnd"/>
+      <w:r>
+        <w:t>(</w:t>
+      </w:r>
+      <w:proofErr w:type="spellStart"/>
+      <w:r>
+        <w:t>cacheNames</w:t>
+      </w:r>
+      <w:proofErr w:type="spellEnd"/>
+      <w:r>
+        <w:t xml:space="preserve"> =&gt; {</w:t>
+      </w:r>
+    </w:p>
+    <w:p>
+      <w:pPr>
+        <w:spacing w:after="0"/>
+      </w:pPr>
+      <w:r>
+        <w:t xml:space="preserve">      </w:t>
+      </w:r>
+      <w:proofErr w:type="spellStart"/>
+      <w:proofErr w:type="gramStart"/>
+      <w:r>
+        <w:t>return</w:t>
+      </w:r>
+      <w:proofErr w:type="spellEnd"/>
+      <w:proofErr w:type="gramEnd"/>
+      <w:r>
+        <w:t xml:space="preserve"> </w:t>
+      </w:r>
+      <w:proofErr w:type="spellStart"/>
+      <w:r>
+        <w:t>Promise.all</w:t>
+      </w:r>
+      <w:proofErr w:type="spellEnd"/>
+      <w:r>
+        <w:t>(</w:t>
+      </w:r>
+    </w:p>
+    <w:p>
+      <w:pPr>
+        <w:spacing w:after="0"/>
+      </w:pPr>
+      <w:r>
+        <w:t xml:space="preserve">        </w:t>
+      </w:r>
+      <w:proofErr w:type="spellStart"/>
+      <w:proofErr w:type="gramStart"/>
+      <w:r>
+        <w:t>cacheNames.map</w:t>
+      </w:r>
+      <w:proofErr w:type="spellEnd"/>
+      <w:r>
+        <w:t>(</w:t>
+      </w:r>
+      <w:proofErr w:type="gramEnd"/>
+      <w:r>
+        <w:t>cache =&gt; {</w:t>
+      </w:r>
+    </w:p>
+    <w:p>
+      <w:pPr>
+        <w:spacing w:after="0"/>
+      </w:pPr>
+      <w:r>
+        <w:t xml:space="preserve">          </w:t>
+      </w:r>
+      <w:proofErr w:type="spellStart"/>
+      <w:proofErr w:type="gramStart"/>
+      <w:r>
+        <w:t>if</w:t>
+      </w:r>
+      <w:proofErr w:type="spellEnd"/>
+      <w:proofErr w:type="gramEnd"/>
+      <w:r>
+        <w:t xml:space="preserve"> (cache !== CACHE_NAME) {</w:t>
+      </w:r>
+    </w:p>
+    <w:p>
+      <w:pPr>
+        <w:spacing w:after="0"/>
+      </w:pPr>
+      <w:r>
+        <w:t xml:space="preserve">            </w:t>
+      </w:r>
+      <w:proofErr w:type="spellStart"/>
+      <w:proofErr w:type="gramStart"/>
+      <w:r>
+        <w:t>return</w:t>
+      </w:r>
+      <w:proofErr w:type="spellEnd"/>
+      <w:proofErr w:type="gramEnd"/>
+      <w:r>
+        <w:t xml:space="preserve"> </w:t>
+      </w:r>
+      <w:proofErr w:type="spellStart"/>
+      <w:r>
+        <w:t>caches.delete</w:t>
+      </w:r>
+      <w:proofErr w:type="spellEnd"/>
+      <w:r>
+        <w:t>(cache);</w:t>
+      </w:r>
+    </w:p>
+    <w:p>
+      <w:pPr>
+        <w:spacing w:after="0"/>
+      </w:pPr>
+      <w:r>
+        <w:t xml:space="preserve">          }</w:t>
+      </w:r>
+    </w:p>
+    <w:p>
+      <w:pPr>
+        <w:spacing w:after="0"/>
+      </w:pPr>
+      <w:r>
+        <w:t xml:space="preserve">        })</w:t>
+      </w:r>
+    </w:p>
+    <w:p>
+      <w:pPr>
+        <w:spacing w:after="0"/>
+      </w:pPr>
+      <w:r>
+        <w:t xml:space="preserve">      );</w:t>
+      </w:r>
+    </w:p>
+    <w:p>
+      <w:pPr>
+        <w:spacing w:after="0"/>
+      </w:pPr>
+      <w:r>
+        <w:t xml:space="preserve">    })</w:t>
+      </w:r>
+    </w:p>
+    <w:p>
+      <w:pPr>
+        <w:spacing w:after="0"/>
+      </w:pPr>
+      <w:r>
+        <w:t xml:space="preserve">  );</w:t>
+      </w:r>
+    </w:p>
+    <w:p>
+      <w:pPr>
+        <w:spacing w:after="0"/>
+      </w:pPr>
+      <w:r>
+        <w:t>});</w:t>
+      </w:r>
+    </w:p>
+    <w:p>
+      <w:pPr>
+        <w:spacing w:after="0"/>
+      </w:pPr>
+    </w:p>
+    <w:p>
+      <w:pPr>
+        <w:spacing w:after="0"/>
+      </w:pPr>
+      <w:r>
+        <w:t xml:space="preserve">// Evento </w:t>
+      </w:r>
+      <w:proofErr w:type="spellStart"/>
+      <w:r>
+        <w:t>fetch</w:t>
+      </w:r>
+      <w:proofErr w:type="spellEnd"/>
+      <w:r>
+        <w:t>: Sirve el contenido desde la caché si no hay internet</w:t>
+      </w:r>
+    </w:p>
+    <w:p>
+      <w:pPr>
+        <w:spacing w:after="0"/>
+      </w:pPr>
+      <w:proofErr w:type="spellStart"/>
+      <w:proofErr w:type="gramStart"/>
+      <w:r>
+        <w:t>self.addEventListener</w:t>
+      </w:r>
+      <w:proofErr w:type="spellEnd"/>
+      <w:r>
+        <w:t>(</w:t>
+      </w:r>
+      <w:proofErr w:type="gramEnd"/>
+      <w:r>
+        <w:t>'</w:t>
+      </w:r>
+      <w:proofErr w:type="spellStart"/>
+      <w:r>
+        <w:t>fetch</w:t>
+      </w:r>
+      <w:proofErr w:type="spellEnd"/>
+      <w:r>
+        <w:t>', e =&gt; {</w:t>
+      </w:r>
+    </w:p>
+    <w:p>
+      <w:pPr>
+        <w:spacing w:after="0"/>
+      </w:pPr>
+      <w:r>
+        <w:t xml:space="preserve">  </w:t>
+      </w:r>
+      <w:proofErr w:type="spellStart"/>
+      <w:proofErr w:type="gramStart"/>
+      <w:r>
+        <w:t>e.respondWith</w:t>
+      </w:r>
+      <w:proofErr w:type="spellEnd"/>
+      <w:r>
+        <w:t>(</w:t>
+      </w:r>
+      <w:proofErr w:type="gramEnd"/>
+    </w:p>
+    <w:p>
+      <w:pPr>
+        <w:spacing w:after="0"/>
+      </w:pPr>
+      <w:r>
+        <w:t xml:space="preserve">    </w:t>
+      </w:r>
+      <w:proofErr w:type="spellStart"/>
+      <w:proofErr w:type="gramStart"/>
+      <w:r>
+        <w:t>caches.match</w:t>
+      </w:r>
+      <w:proofErr w:type="spellEnd"/>
+      <w:r>
+        <w:t>(</w:t>
+      </w:r>
+      <w:proofErr w:type="spellStart"/>
+      <w:proofErr w:type="gramEnd"/>
+      <w:r>
+        <w:t>e.request</w:t>
+      </w:r>
+      <w:proofErr w:type="spellEnd"/>
+      <w:r>
+        <w:t>)</w:t>
+      </w:r>
+    </w:p>
+    <w:p>
+      <w:pPr>
+        <w:spacing w:after="0"/>
+      </w:pPr>
+      <w:r>
+        <w:t xml:space="preserve">      .</w:t>
+      </w:r>
+      <w:proofErr w:type="spellStart"/>
+      <w:proofErr w:type="gramStart"/>
+      <w:r>
+        <w:t>then</w:t>
+      </w:r>
+      <w:proofErr w:type="spellEnd"/>
+      <w:r>
+        <w:t>(</w:t>
+      </w:r>
+      <w:proofErr w:type="gramEnd"/>
+      <w:r>
+        <w:t>res =&gt; {</w:t>
+      </w:r>
+    </w:p>
+    <w:p>
+      <w:pPr>
+        <w:spacing w:after="0"/>
+      </w:pPr>
+      <w:r>
+        <w:t xml:space="preserve">        </w:t>
+      </w:r>
+      <w:proofErr w:type="spellStart"/>
+      <w:proofErr w:type="gramStart"/>
+      <w:r>
+        <w:t>if</w:t>
+      </w:r>
+      <w:proofErr w:type="spellEnd"/>
+      <w:proofErr w:type="gramEnd"/>
+      <w:r>
+        <w:t xml:space="preserve"> (res) {</w:t>
+      </w:r>
+    </w:p>
+    <w:p>
+      <w:pPr>
+        <w:spacing w:after="0"/>
+      </w:pPr>
+      <w:r>
+        <w:t xml:space="preserve">          </w:t>
+      </w:r>
+      <w:proofErr w:type="spellStart"/>
+      <w:proofErr w:type="gramStart"/>
+      <w:r>
+        <w:t>return</w:t>
+      </w:r>
+      <w:proofErr w:type="spellEnd"/>
+      <w:proofErr w:type="gramEnd"/>
+      <w:r>
+        <w:t xml:space="preserve"> res; // Devuelve lo que está en caché</w:t>
+      </w:r>
+    </w:p>
+    <w:p>
+      <w:pPr>
+        <w:spacing w:after="0"/>
+      </w:pPr>
+      <w:r>
+        <w:t xml:space="preserve">        }</w:t>
+      </w:r>
+    </w:p>
+    <w:p>
+      <w:pPr>
+        <w:spacing w:after="0"/>
+      </w:pPr>
+      <w:r>
+        <w:t xml:space="preserve">        </w:t>
+      </w:r>
+      <w:proofErr w:type="spellStart"/>
+      <w:proofErr w:type="gramStart"/>
+      <w:r>
+        <w:t>return</w:t>
+      </w:r>
+      <w:proofErr w:type="spellEnd"/>
+      <w:proofErr w:type="gramEnd"/>
+      <w:r>
+        <w:t xml:space="preserve"> </w:t>
+      </w:r>
+      <w:proofErr w:type="spellStart"/>
+      <w:r>
+        <w:t>fetch</w:t>
+      </w:r>
+      <w:proofErr w:type="spellEnd"/>
+      <w:r>
+        <w:t>(</w:t>
+      </w:r>
+      <w:proofErr w:type="spellStart"/>
+      <w:r>
+        <w:t>e.request</w:t>
+      </w:r>
+      <w:proofErr w:type="spellEnd"/>
+      <w:r>
+        <w:t>); // Si no está en caché, va a internet</w:t>
+      </w:r>
+    </w:p>
+    <w:p>
+      <w:pPr>
+        <w:spacing w:after="0"/>
+      </w:pPr>
+      <w:r>
+        <w:t xml:space="preserve">      })</w:t>
+      </w:r>
+    </w:p>
+    <w:p>
+      <w:pPr>
+        <w:spacing w:after="0"/>
+      </w:pPr>
+      <w:r>
+        <w:t xml:space="preserve">  );</w:t>
+      </w:r>
+    </w:p>
+    <w:p>
+      <w:pPr>
+        <w:spacing w:after="0"/>
+      </w:pPr>
+      <w:r>
+        <w:t>});</w:t>
+      </w:r>
+    </w:p>
+    <w:p>
+      <w:pPr>
+        <w:rPr>
+          <w:b/>
+          <w:bCs/>
+        </w:rPr>
+      </w:pPr>
+      <w:r>
+        <w:rPr>
+          <w:b/>
+          <w:bCs/>
+        </w:rPr>
+        <w:t xml:space="preserve">Paso 4: Registrar el </w:t>
       </w:r>
       <w:proofErr w:type="spellStart"/>
       <w:r>
@@ -12351,12 +13224,12 @@
           <w:b/>
           <w:bCs/>
         </w:rPr>
-        <w:t xml:space="preserve"> (sw.js)</w:t>
-      </w:r>
-    </w:p>
-    <w:p>
-      <w:r>
-        <w:t xml:space="preserve">El </w:t>
+        <w:t xml:space="preserve"> en tu HTML/JS</w:t>
+      </w:r>
+    </w:p>
+    <w:p>
+      <w:r>
+        <w:t xml:space="preserve">Por último, necesitas decirle a tu aplicación web que active ese </w:t>
       </w:r>
       <w:proofErr w:type="spellStart"/>
       <w:r>
@@ -12372,1009 +13245,198 @@
       </w:r>
       <w:proofErr w:type="spellEnd"/>
       <w:r>
-        <w:t xml:space="preserve"> es el motor que gestiona la caché y permite que la </w:t>
-      </w:r>
-      <w:proofErr w:type="spellStart"/>
-      <w:r>
-        <w:t>app</w:t>
-      </w:r>
-      <w:proofErr w:type="spellEnd"/>
-      <w:r>
-        <w:t xml:space="preserve"> cargue instantáneamente. Crea un archivo llamado sw.js en la raíz de tu proyecto con este código básico de almacenamiento en caché:</w:t>
-      </w:r>
-    </w:p>
-    <w:p>
-      <w:pPr>
-        <w:spacing w:after="0"/>
-      </w:pPr>
+        <w:t>. Añade este fragmento de código al final de tu archivo index.html o en tu archivo principal de JavaScript (script.js):</w:t>
+      </w:r>
+    </w:p>
+    <w:p>
       <w:r>
         <w:t>JavaScript</w:t>
       </w:r>
     </w:p>
     <w:p>
-      <w:pPr>
-        <w:spacing w:after="0"/>
-      </w:pPr>
       <w:proofErr w:type="spellStart"/>
       <w:proofErr w:type="gramStart"/>
       <w:r>
-        <w:t>const</w:t>
+        <w:t>if</w:t>
       </w:r>
       <w:proofErr w:type="spellEnd"/>
       <w:proofErr w:type="gramEnd"/>
       <w:r>
-        <w:t xml:space="preserve"> CACHE_NAME = 'v1_cache_miapp';</w:t>
-      </w:r>
-    </w:p>
-    <w:p>
-      <w:pPr>
-        <w:spacing w:after="0"/>
-      </w:pPr>
-      <w:r>
-        <w:t>// Archivos esenciales que quieres que funcionen incluso sin internet</w:t>
-      </w:r>
-    </w:p>
-    <w:p>
-      <w:pPr>
-        <w:spacing w:after="0"/>
-      </w:pPr>
+        <w:t xml:space="preserve"> ('</w:t>
+      </w:r>
+      <w:proofErr w:type="spellStart"/>
+      <w:r>
+        <w:t>serviceWorker</w:t>
+      </w:r>
+      <w:proofErr w:type="spellEnd"/>
+      <w:r>
+        <w:t xml:space="preserve">' in </w:t>
+      </w:r>
+      <w:proofErr w:type="spellStart"/>
+      <w:r>
+        <w:t>navigator</w:t>
+      </w:r>
+      <w:proofErr w:type="spellEnd"/>
+      <w:r>
+        <w:t>) {</w:t>
+      </w:r>
+    </w:p>
+    <w:p>
+      <w:r>
+        <w:t xml:space="preserve">  </w:t>
+      </w:r>
       <w:proofErr w:type="spellStart"/>
       <w:proofErr w:type="gramStart"/>
       <w:r>
-        <w:t>const</w:t>
-      </w:r>
-      <w:proofErr w:type="spellEnd"/>
+        <w:t>window.addEventListener</w:t>
+      </w:r>
+      <w:proofErr w:type="spellEnd"/>
+      <w:r>
+        <w:t>(</w:t>
+      </w:r>
       <w:proofErr w:type="gramEnd"/>
       <w:r>
+        <w:t>'load', () =&gt; {</w:t>
+      </w:r>
+    </w:p>
+    <w:p>
+      <w:r>
+        <w:t xml:space="preserve">    </w:t>
+      </w:r>
+      <w:proofErr w:type="spellStart"/>
+      <w:proofErr w:type="gramStart"/>
+      <w:r>
+        <w:t>navigator.serviceWorker.register</w:t>
+      </w:r>
+      <w:proofErr w:type="spellEnd"/>
+      <w:r>
+        <w:t>(</w:t>
+      </w:r>
+      <w:proofErr w:type="gramEnd"/>
+      <w:r>
+        <w:t>'/sw.js')</w:t>
+      </w:r>
+    </w:p>
+    <w:p>
+      <w:r>
+        <w:t xml:space="preserve">      .</w:t>
+      </w:r>
+      <w:proofErr w:type="spellStart"/>
+      <w:proofErr w:type="gramStart"/>
+      <w:r>
+        <w:t>then</w:t>
+      </w:r>
+      <w:proofErr w:type="spellEnd"/>
+      <w:r>
+        <w:t>(</w:t>
+      </w:r>
+      <w:proofErr w:type="spellStart"/>
+      <w:proofErr w:type="gramEnd"/>
+      <w:r>
+        <w:t>reg</w:t>
+      </w:r>
+      <w:proofErr w:type="spellEnd"/>
+      <w:r>
+        <w:t xml:space="preserve"> =&gt; console.log('</w:t>
+      </w:r>
+      <w:proofErr w:type="spellStart"/>
+      <w:r>
+        <w:t>Service</w:t>
+      </w:r>
+      <w:proofErr w:type="spellEnd"/>
+      <w:r>
         <w:t xml:space="preserve"> </w:t>
       </w:r>
       <w:proofErr w:type="spellStart"/>
       <w:r>
-        <w:t>urlsToCache</w:t>
-      </w:r>
-      <w:proofErr w:type="spellEnd"/>
-      <w:r>
-        <w:t xml:space="preserve"> = [</w:t>
-      </w:r>
-    </w:p>
-    <w:p>
-      <w:pPr>
-        <w:spacing w:after="0"/>
-      </w:pPr>
-      <w:r>
-        <w:t xml:space="preserve">  '/',</w:t>
-      </w:r>
-    </w:p>
-    <w:p>
-      <w:pPr>
-        <w:spacing w:after="0"/>
-      </w:pPr>
-      <w:r>
-        <w:t xml:space="preserve">  '/index.html',</w:t>
-      </w:r>
-    </w:p>
-    <w:p>
-      <w:pPr>
-        <w:spacing w:after="0"/>
-      </w:pPr>
-      <w:r>
-        <w:t xml:space="preserve">  '/styles.css',</w:t>
-      </w:r>
-    </w:p>
-    <w:p>
-      <w:pPr>
-        <w:spacing w:after="0"/>
-      </w:pPr>
-      <w:r>
-        <w:t xml:space="preserve">  '/script.js',</w:t>
-      </w:r>
-    </w:p>
-    <w:p>
-      <w:pPr>
-        <w:spacing w:after="0"/>
-      </w:pPr>
-      <w:r>
-        <w:t xml:space="preserve">  '/icon-192.png'</w:t>
-      </w:r>
-    </w:p>
-    <w:p>
-      <w:pPr>
-        <w:spacing w:after="0"/>
-      </w:pPr>
-      <w:r>
-        <w:t>];</w:t>
-      </w:r>
-    </w:p>
-    <w:p>
-      <w:pPr>
-        <w:spacing w:after="0"/>
-      </w:pPr>
-    </w:p>
-    <w:p>
-      <w:pPr>
-        <w:spacing w:after="0"/>
-      </w:pPr>
-      <w:r>
-        <w:t>// Evento de instalación: Guarda los archivos en la caché del navegador</w:t>
-      </w:r>
-    </w:p>
-    <w:p>
-      <w:pPr>
-        <w:spacing w:after="0"/>
-      </w:pPr>
-      <w:proofErr w:type="spellStart"/>
+        <w:t>Worker</w:t>
+      </w:r>
+      <w:proofErr w:type="spellEnd"/>
+      <w:r>
+        <w:t xml:space="preserve"> registrado con éxito', </w:t>
+      </w:r>
+      <w:proofErr w:type="spellStart"/>
+      <w:r>
+        <w:t>reg</w:t>
+      </w:r>
+      <w:proofErr w:type="spellEnd"/>
+      <w:r>
+        <w:t>))</w:t>
+      </w:r>
+    </w:p>
+    <w:p>
+      <w:r>
+        <w:t xml:space="preserve">      .</w:t>
+      </w:r>
       <w:proofErr w:type="gramStart"/>
       <w:r>
-        <w:t>self.addEventListener</w:t>
-      </w:r>
-      <w:proofErr w:type="spellEnd"/>
-      <w:r>
-        <w:t>(</w:t>
-      </w:r>
+        <w:t>catch(</w:t>
+      </w:r>
+      <w:proofErr w:type="spellStart"/>
       <w:proofErr w:type="gramEnd"/>
       <w:r>
-        <w:t>'</w:t>
-      </w:r>
-      <w:proofErr w:type="spellStart"/>
-      <w:r>
-        <w:t>install</w:t>
-      </w:r>
-      <w:proofErr w:type="spellEnd"/>
-      <w:r>
-        <w:t>', e =&gt; {</w:t>
-      </w:r>
-    </w:p>
-    <w:p>
-      <w:pPr>
-        <w:spacing w:after="0"/>
-      </w:pPr>
-      <w:r>
-        <w:t xml:space="preserve">  </w:t>
-      </w:r>
-      <w:proofErr w:type="spellStart"/>
-      <w:proofErr w:type="gramStart"/>
-      <w:r>
-        <w:t>e.waitUntil</w:t>
-      </w:r>
-      <w:proofErr w:type="spellEnd"/>
-      <w:r>
-        <w:t>(</w:t>
-      </w:r>
-      <w:proofErr w:type="gramEnd"/>
-    </w:p>
-    <w:p>
-      <w:pPr>
-        <w:spacing w:after="0"/>
-      </w:pPr>
-      <w:r>
-        <w:t xml:space="preserve">    </w:t>
-      </w:r>
-      <w:proofErr w:type="spellStart"/>
-      <w:proofErr w:type="gramStart"/>
-      <w:r>
-        <w:t>caches.open</w:t>
-      </w:r>
-      <w:proofErr w:type="spellEnd"/>
-      <w:r>
-        <w:t>(</w:t>
-      </w:r>
-      <w:proofErr w:type="gramEnd"/>
-      <w:r>
-        <w:t>CACHE_NAME)</w:t>
-      </w:r>
-    </w:p>
-    <w:p>
-      <w:pPr>
-        <w:spacing w:after="0"/>
-      </w:pPr>
-      <w:r>
-        <w:t xml:space="preserve">      .</w:t>
-      </w:r>
-      <w:proofErr w:type="spellStart"/>
-      <w:proofErr w:type="gramStart"/>
-      <w:r>
-        <w:t>then</w:t>
-      </w:r>
-      <w:proofErr w:type="spellEnd"/>
-      <w:r>
-        <w:t>(</w:t>
-      </w:r>
-      <w:proofErr w:type="gramEnd"/>
-      <w:r>
-        <w:t>cache =&gt; {</w:t>
-      </w:r>
-    </w:p>
-    <w:p>
-      <w:pPr>
-        <w:spacing w:after="0"/>
-      </w:pPr>
-      <w:r>
-        <w:t xml:space="preserve">        </w:t>
-      </w:r>
-      <w:proofErr w:type="spellStart"/>
-      <w:proofErr w:type="gramStart"/>
-      <w:r>
-        <w:t>return</w:t>
-      </w:r>
-      <w:proofErr w:type="spellEnd"/>
-      <w:proofErr w:type="gramEnd"/>
+        <w:t>err</w:t>
+      </w:r>
+      <w:proofErr w:type="spellEnd"/>
+      <w:r>
+        <w:t xml:space="preserve"> =&gt; </w:t>
+      </w:r>
+      <w:proofErr w:type="spellStart"/>
+      <w:r>
+        <w:t>console.warn</w:t>
+      </w:r>
+      <w:proofErr w:type="spellEnd"/>
+      <w:r>
+        <w:t xml:space="preserve">('Error al registrar el </w:t>
+      </w:r>
+      <w:proofErr w:type="spellStart"/>
+      <w:r>
+        <w:t>Service</w:t>
+      </w:r>
+      <w:proofErr w:type="spellEnd"/>
       <w:r>
         <w:t xml:space="preserve"> </w:t>
       </w:r>
       <w:proofErr w:type="spellStart"/>
       <w:r>
-        <w:t>cache.addAll</w:t>
-      </w:r>
-      <w:proofErr w:type="spellEnd"/>
-      <w:r>
-        <w:t>(</w:t>
-      </w:r>
-      <w:proofErr w:type="spellStart"/>
-      <w:r>
-        <w:t>urlsToCache</w:t>
-      </w:r>
-      <w:proofErr w:type="spellEnd"/>
-      <w:r>
-        <w:t>);</w:t>
-      </w:r>
-    </w:p>
-    <w:p>
-      <w:pPr>
-        <w:spacing w:after="0"/>
-      </w:pPr>
-      <w:r>
-        <w:t xml:space="preserve">      })</w:t>
-      </w:r>
-    </w:p>
-    <w:p>
-      <w:pPr>
-        <w:spacing w:after="0"/>
-      </w:pPr>
-      <w:r>
-        <w:t xml:space="preserve">      .</w:t>
-      </w:r>
-      <w:proofErr w:type="spellStart"/>
-      <w:proofErr w:type="gramStart"/>
-      <w:r>
-        <w:t>then</w:t>
-      </w:r>
-      <w:proofErr w:type="spellEnd"/>
-      <w:r>
-        <w:t>(</w:t>
-      </w:r>
-      <w:proofErr w:type="gramEnd"/>
-      <w:r>
-        <w:t xml:space="preserve">() =&gt; </w:t>
-      </w:r>
-      <w:proofErr w:type="spellStart"/>
-      <w:r>
-        <w:t>self.skipWaiting</w:t>
-      </w:r>
-      <w:proofErr w:type="spellEnd"/>
-      <w:r>
-        <w:t>())</w:t>
-      </w:r>
-    </w:p>
-    <w:p>
-      <w:pPr>
-        <w:spacing w:after="0"/>
-      </w:pPr>
-      <w:r>
-        <w:t xml:space="preserve">  );</w:t>
-      </w:r>
-    </w:p>
-    <w:p>
-      <w:pPr>
-        <w:spacing w:after="0"/>
-      </w:pPr>
-      <w:r>
-        <w:t>});</w:t>
-      </w:r>
-    </w:p>
-    <w:p>
-      <w:pPr>
-        <w:spacing w:after="0"/>
-      </w:pPr>
-    </w:p>
-    <w:p>
-      <w:pPr>
-        <w:spacing w:after="0"/>
-      </w:pPr>
-      <w:r>
-        <w:t>// Evento de activación: Limpia cachés antiguas</w:t>
-      </w:r>
-    </w:p>
-    <w:p>
-      <w:pPr>
-        <w:spacing w:after="0"/>
-      </w:pPr>
-      <w:proofErr w:type="spellStart"/>
-      <w:proofErr w:type="gramStart"/>
-      <w:r>
-        <w:t>self.addEventListener</w:t>
-      </w:r>
-      <w:proofErr w:type="spellEnd"/>
-      <w:r>
-        <w:t>(</w:t>
-      </w:r>
-      <w:proofErr w:type="gramEnd"/>
-      <w:r>
-        <w:t>'</w:t>
-      </w:r>
-      <w:proofErr w:type="spellStart"/>
-      <w:r>
-        <w:t>activate</w:t>
-      </w:r>
-      <w:proofErr w:type="spellEnd"/>
-      <w:r>
-        <w:t>', e =&gt; {</w:t>
-      </w:r>
-    </w:p>
-    <w:p>
-      <w:pPr>
-        <w:spacing w:after="0"/>
-      </w:pPr>
-      <w:r>
-        <w:t xml:space="preserve">  </w:t>
-      </w:r>
-      <w:proofErr w:type="spellStart"/>
-      <w:proofErr w:type="gramStart"/>
-      <w:r>
-        <w:t>e.waitUntil</w:t>
-      </w:r>
-      <w:proofErr w:type="spellEnd"/>
-      <w:r>
-        <w:t>(</w:t>
-      </w:r>
-      <w:proofErr w:type="gramEnd"/>
-    </w:p>
-    <w:p>
-      <w:pPr>
-        <w:spacing w:after="0"/>
-      </w:pPr>
-      <w:r>
-        <w:t xml:space="preserve">    </w:t>
-      </w:r>
-      <w:proofErr w:type="spellStart"/>
-      <w:proofErr w:type="gramStart"/>
-      <w:r>
-        <w:t>caches.keys</w:t>
-      </w:r>
-      <w:proofErr w:type="spellEnd"/>
-      <w:r>
-        <w:t>(</w:t>
-      </w:r>
-      <w:proofErr w:type="gramEnd"/>
-      <w:r>
-        <w:t>).</w:t>
-      </w:r>
-      <w:proofErr w:type="spellStart"/>
-      <w:r>
-        <w:t>then</w:t>
-      </w:r>
-      <w:proofErr w:type="spellEnd"/>
-      <w:r>
-        <w:t>(</w:t>
-      </w:r>
-      <w:proofErr w:type="spellStart"/>
-      <w:r>
-        <w:t>cacheNames</w:t>
-      </w:r>
-      <w:proofErr w:type="spellEnd"/>
-      <w:r>
-        <w:t xml:space="preserve"> =&gt; {</w:t>
-      </w:r>
-    </w:p>
-    <w:p>
-      <w:pPr>
-        <w:spacing w:after="0"/>
-      </w:pPr>
-      <w:r>
-        <w:t xml:space="preserve">      </w:t>
-      </w:r>
-      <w:proofErr w:type="spellStart"/>
-      <w:proofErr w:type="gramStart"/>
-      <w:r>
-        <w:t>return</w:t>
-      </w:r>
-      <w:proofErr w:type="spellEnd"/>
-      <w:proofErr w:type="gramEnd"/>
-      <w:r>
-        <w:t xml:space="preserve"> </w:t>
-      </w:r>
-      <w:proofErr w:type="spellStart"/>
-      <w:r>
-        <w:t>Promise.all</w:t>
-      </w:r>
-      <w:proofErr w:type="spellEnd"/>
-      <w:r>
-        <w:t>(</w:t>
-      </w:r>
-    </w:p>
-    <w:p>
-      <w:pPr>
-        <w:spacing w:after="0"/>
-      </w:pPr>
-      <w:r>
-        <w:t xml:space="preserve">        </w:t>
-      </w:r>
-      <w:proofErr w:type="spellStart"/>
-      <w:proofErr w:type="gramStart"/>
-      <w:r>
-        <w:t>cacheNames.map</w:t>
-      </w:r>
-      <w:proofErr w:type="spellEnd"/>
-      <w:r>
-        <w:t>(</w:t>
-      </w:r>
-      <w:proofErr w:type="gramEnd"/>
-      <w:r>
-        <w:t>cache =&gt; {</w:t>
-      </w:r>
-    </w:p>
-    <w:p>
-      <w:pPr>
-        <w:spacing w:after="0"/>
-      </w:pPr>
-      <w:r>
+        <w:t>Worker</w:t>
+      </w:r>
+      <w:proofErr w:type="spellEnd"/>
+      <w:r>
+        <w:t xml:space="preserve">', </w:t>
+      </w:r>
+      <w:proofErr w:type="spellStart"/>
+      <w:r>
+        <w:t>err</w:t>
+      </w:r>
+      <w:proofErr w:type="spellEnd"/>
+      <w:r>
+        <w:t>));</w:t>
+      </w:r>
+    </w:p>
+    <w:p>
+      <w:r>
+        <w:t xml:space="preserve">  });</w:t>
+      </w:r>
+    </w:p>
+    <w:p>
+      <w:r>
+        <w:t>}</w:t>
+      </w:r>
+    </w:p>
+    <w:p>
+      <w:pPr>
+        <w:rPr>
+          <w:b/>
+          <w:bCs/>
+        </w:rPr>
+      </w:pPr>
+      <w:r>
+        <w:rPr>
+          <w:b/>
+          <w:bCs/>
+        </w:rPr>
         <w:lastRenderedPageBreak/>
-        <w:t xml:space="preserve">          </w:t>
-      </w:r>
-      <w:proofErr w:type="spellStart"/>
-      <w:proofErr w:type="gramStart"/>
-      <w:r>
-        <w:t>if</w:t>
-      </w:r>
-      <w:proofErr w:type="spellEnd"/>
-      <w:proofErr w:type="gramEnd"/>
-      <w:r>
-        <w:t xml:space="preserve"> (cache !== CACHE_NAME) {</w:t>
-      </w:r>
-    </w:p>
-    <w:p>
-      <w:pPr>
-        <w:spacing w:after="0"/>
-      </w:pPr>
-      <w:r>
-        <w:t xml:space="preserve">            </w:t>
-      </w:r>
-      <w:proofErr w:type="spellStart"/>
-      <w:proofErr w:type="gramStart"/>
-      <w:r>
-        <w:t>return</w:t>
-      </w:r>
-      <w:proofErr w:type="spellEnd"/>
-      <w:proofErr w:type="gramEnd"/>
-      <w:r>
-        <w:t xml:space="preserve"> </w:t>
-      </w:r>
-      <w:proofErr w:type="spellStart"/>
-      <w:r>
-        <w:t>caches.delete</w:t>
-      </w:r>
-      <w:proofErr w:type="spellEnd"/>
-      <w:r>
-        <w:t>(cache);</w:t>
-      </w:r>
-    </w:p>
-    <w:p>
-      <w:pPr>
-        <w:spacing w:after="0"/>
-      </w:pPr>
-      <w:r>
-        <w:t xml:space="preserve">          }</w:t>
-      </w:r>
-    </w:p>
-    <w:p>
-      <w:pPr>
-        <w:spacing w:after="0"/>
-      </w:pPr>
-      <w:r>
-        <w:t xml:space="preserve">        })</w:t>
-      </w:r>
-    </w:p>
-    <w:p>
-      <w:pPr>
-        <w:spacing w:after="0"/>
-      </w:pPr>
-      <w:r>
-        <w:t xml:space="preserve">      );</w:t>
-      </w:r>
-    </w:p>
-    <w:p>
-      <w:pPr>
-        <w:spacing w:after="0"/>
-      </w:pPr>
-      <w:r>
-        <w:t xml:space="preserve">    })</w:t>
-      </w:r>
-    </w:p>
-    <w:p>
-      <w:pPr>
-        <w:spacing w:after="0"/>
-      </w:pPr>
-      <w:r>
-        <w:t xml:space="preserve">  );</w:t>
-      </w:r>
-    </w:p>
-    <w:p>
-      <w:pPr>
-        <w:spacing w:after="0"/>
-      </w:pPr>
-      <w:r>
-        <w:t>});</w:t>
-      </w:r>
-    </w:p>
-    <w:p>
-      <w:pPr>
-        <w:spacing w:after="0"/>
-      </w:pPr>
-    </w:p>
-    <w:p>
-      <w:pPr>
-        <w:spacing w:after="0"/>
-      </w:pPr>
-      <w:r>
-        <w:t xml:space="preserve">// Evento </w:t>
-      </w:r>
-      <w:proofErr w:type="spellStart"/>
-      <w:r>
-        <w:t>fetch</w:t>
-      </w:r>
-      <w:proofErr w:type="spellEnd"/>
-      <w:r>
-        <w:t>: Sirve el contenido desde la caché si no hay internet</w:t>
-      </w:r>
-    </w:p>
-    <w:p>
-      <w:pPr>
-        <w:spacing w:after="0"/>
-      </w:pPr>
-      <w:proofErr w:type="spellStart"/>
-      <w:proofErr w:type="gramStart"/>
-      <w:r>
-        <w:t>self.addEventListener</w:t>
-      </w:r>
-      <w:proofErr w:type="spellEnd"/>
-      <w:r>
-        <w:t>(</w:t>
-      </w:r>
-      <w:proofErr w:type="gramEnd"/>
-      <w:r>
-        <w:t>'</w:t>
-      </w:r>
-      <w:proofErr w:type="spellStart"/>
-      <w:r>
-        <w:t>fetch</w:t>
-      </w:r>
-      <w:proofErr w:type="spellEnd"/>
-      <w:r>
-        <w:t>', e =&gt; {</w:t>
-      </w:r>
-    </w:p>
-    <w:p>
-      <w:pPr>
-        <w:spacing w:after="0"/>
-      </w:pPr>
-      <w:r>
-        <w:t xml:space="preserve">  </w:t>
-      </w:r>
-      <w:proofErr w:type="spellStart"/>
-      <w:proofErr w:type="gramStart"/>
-      <w:r>
-        <w:t>e.respondWith</w:t>
-      </w:r>
-      <w:proofErr w:type="spellEnd"/>
-      <w:r>
-        <w:t>(</w:t>
-      </w:r>
-      <w:proofErr w:type="gramEnd"/>
-    </w:p>
-    <w:p>
-      <w:pPr>
-        <w:spacing w:after="0"/>
-      </w:pPr>
-      <w:r>
-        <w:t xml:space="preserve">    </w:t>
-      </w:r>
-      <w:proofErr w:type="spellStart"/>
-      <w:proofErr w:type="gramStart"/>
-      <w:r>
-        <w:t>caches.match</w:t>
-      </w:r>
-      <w:proofErr w:type="spellEnd"/>
-      <w:r>
-        <w:t>(</w:t>
-      </w:r>
-      <w:proofErr w:type="spellStart"/>
-      <w:proofErr w:type="gramEnd"/>
-      <w:r>
-        <w:t>e.request</w:t>
-      </w:r>
-      <w:proofErr w:type="spellEnd"/>
-      <w:r>
-        <w:t>)</w:t>
-      </w:r>
-    </w:p>
-    <w:p>
-      <w:pPr>
-        <w:spacing w:after="0"/>
-      </w:pPr>
-      <w:r>
-        <w:t xml:space="preserve">      .</w:t>
-      </w:r>
-      <w:proofErr w:type="spellStart"/>
-      <w:proofErr w:type="gramStart"/>
-      <w:r>
-        <w:t>then</w:t>
-      </w:r>
-      <w:proofErr w:type="spellEnd"/>
-      <w:r>
-        <w:t>(</w:t>
-      </w:r>
-      <w:proofErr w:type="gramEnd"/>
-      <w:r>
-        <w:t>res =&gt; {</w:t>
-      </w:r>
-    </w:p>
-    <w:p>
-      <w:pPr>
-        <w:spacing w:after="0"/>
-      </w:pPr>
-      <w:r>
-        <w:t xml:space="preserve">        </w:t>
-      </w:r>
-      <w:proofErr w:type="spellStart"/>
-      <w:proofErr w:type="gramStart"/>
-      <w:r>
-        <w:t>if</w:t>
-      </w:r>
-      <w:proofErr w:type="spellEnd"/>
-      <w:proofErr w:type="gramEnd"/>
-      <w:r>
-        <w:t xml:space="preserve"> (res) {</w:t>
-      </w:r>
-    </w:p>
-    <w:p>
-      <w:pPr>
-        <w:spacing w:after="0"/>
-      </w:pPr>
-      <w:r>
-        <w:t xml:space="preserve">          </w:t>
-      </w:r>
-      <w:proofErr w:type="spellStart"/>
-      <w:proofErr w:type="gramStart"/>
-      <w:r>
-        <w:t>return</w:t>
-      </w:r>
-      <w:proofErr w:type="spellEnd"/>
-      <w:proofErr w:type="gramEnd"/>
-      <w:r>
-        <w:t xml:space="preserve"> res; // Devuelve lo que está en caché</w:t>
-      </w:r>
-    </w:p>
-    <w:p>
-      <w:pPr>
-        <w:spacing w:after="0"/>
-      </w:pPr>
-      <w:r>
-        <w:t xml:space="preserve">        }</w:t>
-      </w:r>
-    </w:p>
-    <w:p>
-      <w:pPr>
-        <w:spacing w:after="0"/>
-      </w:pPr>
-      <w:r>
-        <w:t xml:space="preserve">        </w:t>
-      </w:r>
-      <w:proofErr w:type="spellStart"/>
-      <w:proofErr w:type="gramStart"/>
-      <w:r>
-        <w:t>return</w:t>
-      </w:r>
-      <w:proofErr w:type="spellEnd"/>
-      <w:proofErr w:type="gramEnd"/>
-      <w:r>
-        <w:t xml:space="preserve"> </w:t>
-      </w:r>
-      <w:proofErr w:type="spellStart"/>
-      <w:r>
-        <w:t>fetch</w:t>
-      </w:r>
-      <w:proofErr w:type="spellEnd"/>
-      <w:r>
-        <w:t>(</w:t>
-      </w:r>
-      <w:proofErr w:type="spellStart"/>
-      <w:r>
-        <w:t>e.request</w:t>
-      </w:r>
-      <w:proofErr w:type="spellEnd"/>
-      <w:r>
-        <w:t>); // Si no está en caché, va a internet</w:t>
-      </w:r>
-    </w:p>
-    <w:p>
-      <w:pPr>
-        <w:spacing w:after="0"/>
-      </w:pPr>
-      <w:r>
-        <w:t xml:space="preserve">      })</w:t>
-      </w:r>
-    </w:p>
-    <w:p>
-      <w:pPr>
-        <w:spacing w:after="0"/>
-      </w:pPr>
-      <w:r>
-        <w:t xml:space="preserve">  );</w:t>
-      </w:r>
-    </w:p>
-    <w:p>
-      <w:pPr>
-        <w:spacing w:after="0"/>
-      </w:pPr>
-      <w:r>
-        <w:t>});</w:t>
-      </w:r>
-    </w:p>
-    <w:p>
-      <w:pPr>
-        <w:rPr>
-          <w:b/>
-          <w:bCs/>
-        </w:rPr>
-      </w:pPr>
-      <w:r>
-        <w:rPr>
-          <w:b/>
-          <w:bCs/>
-        </w:rPr>
-        <w:t xml:space="preserve">Paso 4: Registrar el </w:t>
-      </w:r>
-      <w:proofErr w:type="spellStart"/>
-      <w:r>
-        <w:rPr>
-          <w:b/>
-          <w:bCs/>
-        </w:rPr>
-        <w:t>Service</w:t>
-      </w:r>
-      <w:proofErr w:type="spellEnd"/>
-      <w:r>
-        <w:rPr>
-          <w:b/>
-          <w:bCs/>
-        </w:rPr>
-        <w:t xml:space="preserve"> </w:t>
-      </w:r>
-      <w:proofErr w:type="spellStart"/>
-      <w:r>
-        <w:rPr>
-          <w:b/>
-          <w:bCs/>
-        </w:rPr>
-        <w:t>Worker</w:t>
-      </w:r>
-      <w:proofErr w:type="spellEnd"/>
-      <w:r>
-        <w:rPr>
-          <w:b/>
-          <w:bCs/>
-        </w:rPr>
-        <w:t xml:space="preserve"> en tu HTML/JS</w:t>
-      </w:r>
-    </w:p>
-    <w:p>
-      <w:r>
-        <w:t xml:space="preserve">Por último, necesitas decirle a tu aplicación web que active ese </w:t>
-      </w:r>
-      <w:proofErr w:type="spellStart"/>
-      <w:r>
-        <w:t>Service</w:t>
-      </w:r>
-      <w:proofErr w:type="spellEnd"/>
-      <w:r>
-        <w:t xml:space="preserve"> </w:t>
-      </w:r>
-      <w:proofErr w:type="spellStart"/>
-      <w:r>
-        <w:t>Worker</w:t>
-      </w:r>
-      <w:proofErr w:type="spellEnd"/>
-      <w:r>
-        <w:t>. Añade este fragmento de código al final de tu archivo index.html o en tu archivo principal de JavaScript (script.js):</w:t>
-      </w:r>
-    </w:p>
-    <w:p>
-      <w:r>
-        <w:t>JavaScript</w:t>
-      </w:r>
-    </w:p>
-    <w:p>
-      <w:proofErr w:type="spellStart"/>
-      <w:proofErr w:type="gramStart"/>
-      <w:r>
-        <w:t>if</w:t>
-      </w:r>
-      <w:proofErr w:type="spellEnd"/>
-      <w:proofErr w:type="gramEnd"/>
-      <w:r>
-        <w:t xml:space="preserve"> ('</w:t>
-      </w:r>
-      <w:proofErr w:type="spellStart"/>
-      <w:r>
-        <w:t>serviceWorker</w:t>
-      </w:r>
-      <w:proofErr w:type="spellEnd"/>
-      <w:r>
-        <w:t xml:space="preserve">' in </w:t>
-      </w:r>
-      <w:proofErr w:type="spellStart"/>
-      <w:r>
-        <w:t>navigator</w:t>
-      </w:r>
-      <w:proofErr w:type="spellEnd"/>
-      <w:r>
-        <w:t>) {</w:t>
-      </w:r>
-    </w:p>
-    <w:p>
-      <w:r>
-        <w:t xml:space="preserve">  </w:t>
-      </w:r>
-      <w:proofErr w:type="spellStart"/>
-      <w:proofErr w:type="gramStart"/>
-      <w:r>
-        <w:t>window.addEventListener</w:t>
-      </w:r>
-      <w:proofErr w:type="spellEnd"/>
-      <w:r>
-        <w:t>(</w:t>
-      </w:r>
-      <w:proofErr w:type="gramEnd"/>
-      <w:r>
-        <w:t>'load', () =&gt; {</w:t>
-      </w:r>
-    </w:p>
-    <w:p>
-      <w:r>
-        <w:t xml:space="preserve">    </w:t>
-      </w:r>
-      <w:proofErr w:type="spellStart"/>
-      <w:proofErr w:type="gramStart"/>
-      <w:r>
-        <w:t>navigator.serviceWorker.register</w:t>
-      </w:r>
-      <w:proofErr w:type="spellEnd"/>
-      <w:r>
-        <w:t>(</w:t>
-      </w:r>
-      <w:proofErr w:type="gramEnd"/>
-      <w:r>
-        <w:t>'/sw.js')</w:t>
-      </w:r>
-    </w:p>
-    <w:p>
-      <w:r>
-        <w:t xml:space="preserve">      .</w:t>
-      </w:r>
-      <w:proofErr w:type="spellStart"/>
-      <w:proofErr w:type="gramStart"/>
-      <w:r>
-        <w:t>then</w:t>
-      </w:r>
-      <w:proofErr w:type="spellEnd"/>
-      <w:r>
-        <w:t>(</w:t>
-      </w:r>
-      <w:proofErr w:type="spellStart"/>
-      <w:proofErr w:type="gramEnd"/>
-      <w:r>
-        <w:t>reg</w:t>
-      </w:r>
-      <w:proofErr w:type="spellEnd"/>
-      <w:r>
-        <w:t xml:space="preserve"> =&gt; console.log('</w:t>
-      </w:r>
-      <w:proofErr w:type="spellStart"/>
-      <w:r>
-        <w:t>Service</w:t>
-      </w:r>
-      <w:proofErr w:type="spellEnd"/>
-      <w:r>
-        <w:t xml:space="preserve"> </w:t>
-      </w:r>
-      <w:proofErr w:type="spellStart"/>
-      <w:r>
-        <w:t>Worker</w:t>
-      </w:r>
-      <w:proofErr w:type="spellEnd"/>
-      <w:r>
-        <w:t xml:space="preserve"> registrado con éxito', </w:t>
-      </w:r>
-      <w:proofErr w:type="spellStart"/>
-      <w:r>
-        <w:t>reg</w:t>
-      </w:r>
-      <w:proofErr w:type="spellEnd"/>
-      <w:r>
-        <w:t>))</w:t>
-      </w:r>
-    </w:p>
-    <w:p>
-      <w:r>
-        <w:t xml:space="preserve">      .</w:t>
-      </w:r>
-      <w:proofErr w:type="gramStart"/>
-      <w:r>
-        <w:t>catch(</w:t>
-      </w:r>
-      <w:proofErr w:type="spellStart"/>
-      <w:proofErr w:type="gramEnd"/>
-      <w:r>
-        <w:t>err</w:t>
-      </w:r>
-      <w:proofErr w:type="spellEnd"/>
-      <w:r>
-        <w:t xml:space="preserve"> =&gt; </w:t>
-      </w:r>
-      <w:proofErr w:type="spellStart"/>
-      <w:r>
-        <w:t>console.warn</w:t>
-      </w:r>
-      <w:proofErr w:type="spellEnd"/>
-      <w:r>
-        <w:t xml:space="preserve">('Error al registrar el </w:t>
-      </w:r>
-      <w:proofErr w:type="spellStart"/>
-      <w:r>
-        <w:t>Service</w:t>
-      </w:r>
-      <w:proofErr w:type="spellEnd"/>
-      <w:r>
-        <w:t xml:space="preserve"> </w:t>
-      </w:r>
-      <w:proofErr w:type="spellStart"/>
-      <w:r>
-        <w:t>Worker</w:t>
-      </w:r>
-      <w:proofErr w:type="spellEnd"/>
-      <w:r>
-        <w:t xml:space="preserve">', </w:t>
-      </w:r>
-      <w:proofErr w:type="spellStart"/>
-      <w:r>
-        <w:t>err</w:t>
-      </w:r>
-      <w:proofErr w:type="spellEnd"/>
-      <w:r>
-        <w:t>));</w:t>
-      </w:r>
-    </w:p>
-    <w:p>
-      <w:r>
-        <w:t xml:space="preserve">  });</w:t>
-      </w:r>
-    </w:p>
-    <w:p>
-      <w:r>
-        <w:t>}</w:t>
-      </w:r>
-    </w:p>
-    <w:p>
-      <w:pPr>
-        <w:rPr>
-          <w:b/>
-          <w:bCs/>
-        </w:rPr>
-      </w:pPr>
-      <w:r>
-        <w:rPr>
-          <w:b/>
-          <w:bCs/>
-        </w:rPr>
         <w:t>Cómo probar que tu PWA funciona</w:t>
       </w:r>
     </w:p>
@@ -13442,7 +13504,6 @@
           <w:b/>
           <w:bCs/>
         </w:rPr>
-        <w:lastRenderedPageBreak/>
         <w:t>Usa las Herramientas de Desarrollador (F12):</w:t>
       </w:r>
       <w:r>
@@ -17138,7 +17199,6 @@
   <w:style w:type="character" w:default="1" w:styleId="Fuentedeprrafopredeter">
     <w:name w:val="Default Paragraph Font"/>
     <w:uiPriority w:val="1"/>
-    <w:semiHidden/>
     <w:unhideWhenUsed/>
   </w:style>
   <w:style w:type="table" w:default="1" w:styleId="Tablanormal">
@@ -17350,7 +17410,6 @@
   <w:style w:type="character" w:default="1" w:styleId="Fuentedeprrafopredeter">
     <w:name w:val="Default Paragraph Font"/>
     <w:uiPriority w:val="1"/>
-    <w:semiHidden/>
     <w:unhideWhenUsed/>
   </w:style>
   <w:style w:type="table" w:default="1" w:styleId="Tablanormal">
@@ -17689,7 +17748,7 @@
 </file>
 
 <file path=customXml/itemProps1.xml><?xml version="1.0" encoding="utf-8"?>
-<ds:datastoreItem xmlns:ds="http://schemas.openxmlformats.org/officeDocument/2006/customXml" ds:itemID="{BD96E53C-DCE3-4574-B499-E13A83814850}">
+<ds:datastoreItem xmlns:ds="http://schemas.openxmlformats.org/officeDocument/2006/customXml" ds:itemID="{92001FFF-A78B-4F45-B5CA-EF1429F14F94}">
   <ds:schemaRefs>
     <ds:schemaRef ds:uri="http://schemas.openxmlformats.org/officeDocument/2006/bibliography"/>
   </ds:schemaRefs>

</xml_diff>

<commit_message>
se termina funcionalidad pwa
</commit_message>
<xml_diff>
--- a/requerimientos.docx
+++ b/requerimientos.docx
@@ -3733,8 +3733,6 @@
           <w:b/>
         </w:rPr>
       </w:pPr>
-      <w:bookmarkStart w:id="0" w:name="_GoBack"/>
-      <w:bookmarkEnd w:id="0"/>
     </w:p>
     <w:p>
       <w:pPr>
@@ -11956,23 +11954,22 @@
       <w:proofErr w:type="spellEnd"/>
     </w:p>
     <w:p>
-      <w:r>
+      <w:pPr>
+        <w:rPr>
+          <w:b/>
+        </w:rPr>
+      </w:pPr>
+      <w:r>
+        <w:rPr>
+          <w:b/>
+        </w:rPr>
         <w:t xml:space="preserve">Necesito </w:t>
       </w:r>
       <w:r>
-        <w:t xml:space="preserve">convertir </w:t>
-      </w:r>
-      <w:r>
-        <w:t>mi sistema (</w:t>
-      </w:r>
-      <w:r>
-        <w:t>aplicación web</w:t>
-      </w:r>
-      <w:r>
-        <w:t>) gestión de aula en la que estamos trabajando</w:t>
-      </w:r>
-      <w:r>
-        <w:t xml:space="preserve">  en una </w:t>
+        <w:rPr>
+          <w:b/>
+        </w:rPr>
+        <w:t xml:space="preserve">convertir mi sistema (aplicación web) gestión de aula en la que estamos trabajando  en una </w:t>
       </w:r>
       <w:r>
         <w:rPr>
@@ -11982,42 +11979,256 @@
         <w:t>Aplicación Web Progresiva (PWA)</w:t>
       </w:r>
       <w:r>
+        <w:rPr>
+          <w:b/>
+        </w:rPr>
         <w:t xml:space="preserve"> y permitir que los usuarios la instalen en su computadora o celular como si fuera una </w:t>
       </w:r>
       <w:proofErr w:type="spellStart"/>
       <w:r>
+        <w:rPr>
+          <w:b/>
+        </w:rPr>
         <w:t>app</w:t>
       </w:r>
       <w:proofErr w:type="spellEnd"/>
       <w:r>
-        <w:t xml:space="preserve"> nativa, </w:t>
-      </w:r>
-      <w:r>
-        <w:t xml:space="preserve">y </w:t>
-      </w:r>
-      <w:r>
+        <w:rPr>
+          <w:b/>
+        </w:rPr>
+        <w:t xml:space="preserve"> nativa, y </w:t>
+      </w:r>
+      <w:r>
+        <w:rPr>
+          <w:b/>
+        </w:rPr>
         <w:t xml:space="preserve">agregar a la </w:t>
       </w:r>
       <w:proofErr w:type="spellStart"/>
       <w:r>
+        <w:rPr>
+          <w:b/>
+        </w:rPr>
         <w:t>landing</w:t>
       </w:r>
       <w:proofErr w:type="spellEnd"/>
       <w:r>
+        <w:rPr>
+          <w:b/>
+        </w:rPr>
         <w:t xml:space="preserve"> page una opción para descargar la versión de escritorio del software de gestión de aula.</w:t>
       </w:r>
     </w:p>
     <w:p>
-      <w:r>
-        <w:t xml:space="preserve">Cuando le hago </w:t>
-      </w:r>
-      <w:proofErr w:type="spellStart"/>
-      <w:r>
-        <w:t>click</w:t>
-      </w:r>
-      <w:proofErr w:type="spellEnd"/>
-      <w:r>
-        <w:t xml:space="preserve"> a instalar </w:t>
+      <w:bookmarkStart w:id="0" w:name="_GoBack"/>
+      <w:r>
+        <w:t xml:space="preserve">Necesito me agregues a todos los crud y a cuanta funcionalidad creas necesaria, vamos a ir haciendo archivo por archivo el manejo de </w:t>
+      </w:r>
+      <w:proofErr w:type="spellStart"/>
+      <w:r>
+        <w:t>execepciones</w:t>
+      </w:r>
+      <w:proofErr w:type="spellEnd"/>
+      <w:r>
+        <w:t>, errores con try y catch</w:t>
+      </w:r>
+    </w:p>
+    <w:bookmarkEnd w:id="0"/>
+    <w:p/>
+    <w:p>
+      <w:pPr>
+        <w:rPr>
+          <w:b/>
+          <w:lang w:val="es-ES"/>
+        </w:rPr>
+      </w:pPr>
+    </w:p>
+    <w:p>
+      <w:pPr>
+        <w:rPr>
+          <w:lang w:val="es-ES"/>
+        </w:rPr>
+      </w:pPr>
+    </w:p>
+    <w:p>
+      <w:pPr>
+        <w:rPr>
+          <w:lang w:val="es-ES"/>
+        </w:rPr>
+      </w:pPr>
+    </w:p>
+    <w:p>
+      <w:pPr>
+        <w:rPr>
+          <w:lang w:val="es-ES"/>
+        </w:rPr>
+      </w:pPr>
+    </w:p>
+    <w:p>
+      <w:pPr>
+        <w:rPr>
+          <w:lang w:val="es-ES"/>
+        </w:rPr>
+      </w:pPr>
+    </w:p>
+    <w:p>
+      <w:pPr>
+        <w:rPr>
+          <w:lang w:val="es-ES"/>
+        </w:rPr>
+      </w:pPr>
+    </w:p>
+    <w:p>
+      <w:pPr>
+        <w:rPr>
+          <w:lang w:val="es-ES"/>
+        </w:rPr>
+      </w:pPr>
+    </w:p>
+    <w:p>
+      <w:pPr>
+        <w:rPr>
+          <w:lang w:val="es-ES"/>
+        </w:rPr>
+      </w:pPr>
+    </w:p>
+    <w:p>
+      <w:pPr>
+        <w:rPr>
+          <w:lang w:val="es-ES"/>
+        </w:rPr>
+      </w:pPr>
+    </w:p>
+    <w:p>
+      <w:pPr>
+        <w:rPr>
+          <w:lang w:val="es-ES"/>
+        </w:rPr>
+      </w:pPr>
+    </w:p>
+    <w:p>
+      <w:pPr>
+        <w:rPr>
+          <w:lang w:val="es-ES"/>
+        </w:rPr>
+      </w:pPr>
+    </w:p>
+    <w:p>
+      <w:pPr>
+        <w:rPr>
+          <w:lang w:val="es-ES"/>
+        </w:rPr>
+      </w:pPr>
+    </w:p>
+    <w:p>
+      <w:pPr>
+        <w:rPr>
+          <w:lang w:val="es-ES"/>
+        </w:rPr>
+      </w:pPr>
+    </w:p>
+    <w:p>
+      <w:pPr>
+        <w:rPr>
+          <w:lang w:val="es-ES"/>
+        </w:rPr>
+      </w:pPr>
+    </w:p>
+    <w:p>
+      <w:pPr>
+        <w:rPr>
+          <w:lang w:val="es-ES"/>
+        </w:rPr>
+      </w:pPr>
+    </w:p>
+    <w:p>
+      <w:pPr>
+        <w:rPr>
+          <w:lang w:val="es-ES"/>
+        </w:rPr>
+      </w:pPr>
+    </w:p>
+    <w:p>
+      <w:pPr>
+        <w:rPr>
+          <w:lang w:val="es-ES"/>
+        </w:rPr>
+      </w:pPr>
+    </w:p>
+    <w:p>
+      <w:pPr>
+        <w:rPr>
+          <w:lang w:val="es-ES"/>
+        </w:rPr>
+      </w:pPr>
+    </w:p>
+    <w:p>
+      <w:pPr>
+        <w:rPr>
+          <w:lang w:val="es-ES"/>
+        </w:rPr>
+      </w:pPr>
+    </w:p>
+    <w:p>
+      <w:pPr>
+        <w:rPr>
+          <w:lang w:val="es-ES"/>
+        </w:rPr>
+      </w:pPr>
+    </w:p>
+    <w:p>
+      <w:pPr>
+        <w:rPr>
+          <w:lang w:val="es-ES"/>
+        </w:rPr>
+      </w:pPr>
+    </w:p>
+    <w:p>
+      <w:pPr>
+        <w:rPr>
+          <w:lang w:val="es-ES"/>
+        </w:rPr>
+      </w:pPr>
+    </w:p>
+    <w:p>
+      <w:pPr>
+        <w:rPr>
+          <w:lang w:val="es-ES"/>
+        </w:rPr>
+      </w:pPr>
+    </w:p>
+    <w:p>
+      <w:pPr>
+        <w:rPr>
+          <w:lang w:val="es-ES"/>
+        </w:rPr>
+      </w:pPr>
+    </w:p>
+    <w:p>
+      <w:pPr>
+        <w:jc w:val="center"/>
+      </w:pPr>
+      <w:r>
+        <w:rPr>
+          <w:b/>
+          <w:bCs/>
+        </w:rPr>
+        <w:t>Aplicación Web Progresiva (PWA)</w:t>
+      </w:r>
+    </w:p>
+    <w:p>
+      <w:r>
+        <w:t xml:space="preserve">Para convertir una aplicación web existente en una </w:t>
+      </w:r>
+      <w:r>
+        <w:rPr>
+          <w:b/>
+          <w:bCs/>
+        </w:rPr>
+        <w:t>Aplicación Web Progresiva (PWA)</w:t>
+      </w:r>
+      <w:r>
+        <w:t xml:space="preserve"> y permitir que los usuarios la instalen en su computadora o celular como si fuera una </w:t>
       </w:r>
       <w:proofErr w:type="spellStart"/>
       <w:r>
@@ -12025,251 +12236,6 @@
       </w:r>
       <w:proofErr w:type="spellEnd"/>
       <w:r>
-        <w:t xml:space="preserve"> me lleva a la parte de la vista con las tres opciones y no hace nada </w:t>
-      </w:r>
-      <w:proofErr w:type="spellStart"/>
-      <w:r>
-        <w:t>mas</w:t>
-      </w:r>
-      <w:proofErr w:type="spellEnd"/>
-      <w:r>
-        <w:t xml:space="preserve">, necesito que se instalen el de </w:t>
-      </w:r>
-      <w:proofErr w:type="spellStart"/>
-      <w:r>
-        <w:t>android</w:t>
-      </w:r>
-      <w:proofErr w:type="spellEnd"/>
-      <w:r>
-        <w:t xml:space="preserve"> y el de pc, o que me generes el software para pc de escritorio, que a su vez me permita trabajar sin </w:t>
-      </w:r>
-      <w:proofErr w:type="spellStart"/>
-      <w:r>
-        <w:t>conexion</w:t>
-      </w:r>
-      <w:proofErr w:type="spellEnd"/>
-      <w:r>
-        <w:t xml:space="preserve"> y luego cuando hay </w:t>
-      </w:r>
-      <w:proofErr w:type="spellStart"/>
-      <w:r>
-        <w:t>conexion</w:t>
-      </w:r>
-      <w:proofErr w:type="spellEnd"/>
-      <w:r>
-        <w:t xml:space="preserve"> que </w:t>
-      </w:r>
-      <w:proofErr w:type="spellStart"/>
-      <w:r>
-        <w:t>actualize</w:t>
-      </w:r>
-      <w:proofErr w:type="spellEnd"/>
-      <w:r>
-        <w:t xml:space="preserve"> los datos</w:t>
-      </w:r>
-    </w:p>
-    <w:p/>
-    <w:p>
-      <w:pPr>
-        <w:rPr>
-          <w:b/>
-          <w:lang w:val="es-ES"/>
-        </w:rPr>
-      </w:pPr>
-    </w:p>
-    <w:p>
-      <w:pPr>
-        <w:rPr>
-          <w:lang w:val="es-ES"/>
-        </w:rPr>
-      </w:pPr>
-    </w:p>
-    <w:p>
-      <w:pPr>
-        <w:rPr>
-          <w:lang w:val="es-ES"/>
-        </w:rPr>
-      </w:pPr>
-    </w:p>
-    <w:p>
-      <w:pPr>
-        <w:rPr>
-          <w:lang w:val="es-ES"/>
-        </w:rPr>
-      </w:pPr>
-    </w:p>
-    <w:p>
-      <w:pPr>
-        <w:rPr>
-          <w:lang w:val="es-ES"/>
-        </w:rPr>
-      </w:pPr>
-    </w:p>
-    <w:p>
-      <w:pPr>
-        <w:rPr>
-          <w:lang w:val="es-ES"/>
-        </w:rPr>
-      </w:pPr>
-    </w:p>
-    <w:p>
-      <w:pPr>
-        <w:rPr>
-          <w:lang w:val="es-ES"/>
-        </w:rPr>
-      </w:pPr>
-    </w:p>
-    <w:p>
-      <w:pPr>
-        <w:rPr>
-          <w:lang w:val="es-ES"/>
-        </w:rPr>
-      </w:pPr>
-    </w:p>
-    <w:p>
-      <w:pPr>
-        <w:rPr>
-          <w:lang w:val="es-ES"/>
-        </w:rPr>
-      </w:pPr>
-    </w:p>
-    <w:p>
-      <w:pPr>
-        <w:rPr>
-          <w:lang w:val="es-ES"/>
-        </w:rPr>
-      </w:pPr>
-    </w:p>
-    <w:p>
-      <w:pPr>
-        <w:rPr>
-          <w:lang w:val="es-ES"/>
-        </w:rPr>
-      </w:pPr>
-    </w:p>
-    <w:p>
-      <w:pPr>
-        <w:rPr>
-          <w:lang w:val="es-ES"/>
-        </w:rPr>
-      </w:pPr>
-    </w:p>
-    <w:p>
-      <w:pPr>
-        <w:rPr>
-          <w:lang w:val="es-ES"/>
-        </w:rPr>
-      </w:pPr>
-    </w:p>
-    <w:p>
-      <w:pPr>
-        <w:rPr>
-          <w:lang w:val="es-ES"/>
-        </w:rPr>
-      </w:pPr>
-    </w:p>
-    <w:p>
-      <w:pPr>
-        <w:rPr>
-          <w:lang w:val="es-ES"/>
-        </w:rPr>
-      </w:pPr>
-    </w:p>
-    <w:p>
-      <w:pPr>
-        <w:rPr>
-          <w:lang w:val="es-ES"/>
-        </w:rPr>
-      </w:pPr>
-    </w:p>
-    <w:p>
-      <w:pPr>
-        <w:rPr>
-          <w:lang w:val="es-ES"/>
-        </w:rPr>
-      </w:pPr>
-    </w:p>
-    <w:p>
-      <w:pPr>
-        <w:rPr>
-          <w:lang w:val="es-ES"/>
-        </w:rPr>
-      </w:pPr>
-    </w:p>
-    <w:p>
-      <w:pPr>
-        <w:rPr>
-          <w:lang w:val="es-ES"/>
-        </w:rPr>
-      </w:pPr>
-    </w:p>
-    <w:p>
-      <w:pPr>
-        <w:rPr>
-          <w:lang w:val="es-ES"/>
-        </w:rPr>
-      </w:pPr>
-    </w:p>
-    <w:p>
-      <w:pPr>
-        <w:rPr>
-          <w:lang w:val="es-ES"/>
-        </w:rPr>
-      </w:pPr>
-    </w:p>
-    <w:p>
-      <w:pPr>
-        <w:rPr>
-          <w:lang w:val="es-ES"/>
-        </w:rPr>
-      </w:pPr>
-    </w:p>
-    <w:p>
-      <w:pPr>
-        <w:rPr>
-          <w:lang w:val="es-ES"/>
-        </w:rPr>
-      </w:pPr>
-    </w:p>
-    <w:p>
-      <w:pPr>
-        <w:rPr>
-          <w:lang w:val="es-ES"/>
-        </w:rPr>
-      </w:pPr>
-    </w:p>
-    <w:p>
-      <w:pPr>
-        <w:jc w:val="center"/>
-      </w:pPr>
-      <w:r>
-        <w:rPr>
-          <w:b/>
-          <w:bCs/>
-        </w:rPr>
-        <w:t>Aplicación Web Progresiva (PWA)</w:t>
-      </w:r>
-    </w:p>
-    <w:p>
-      <w:r>
-        <w:t xml:space="preserve">Para convertir una aplicación web existente en una </w:t>
-      </w:r>
-      <w:r>
-        <w:rPr>
-          <w:b/>
-          <w:bCs/>
-        </w:rPr>
-        <w:t>Aplicación Web Progresiva (PWA)</w:t>
-      </w:r>
-      <w:r>
-        <w:t xml:space="preserve"> y permitir que los usuarios la instalen en su computadora o celular como si fuera una </w:t>
-      </w:r>
-      <w:proofErr w:type="spellStart"/>
-      <w:r>
-        <w:t>app</w:t>
-      </w:r>
-      <w:proofErr w:type="spellEnd"/>
-      <w:r>
         <w:t xml:space="preserve"> nativa, necesitas implementar </w:t>
       </w:r>
       <w:r>
@@ -12285,22 +12251,22 @@
     </w:p>
     <w:p>
       <w:r>
+        <w:t>Aquí tienes el paso a paso técnico para lograrlo:</w:t>
+      </w:r>
+    </w:p>
+    <w:p>
+      <w:pPr>
+        <w:rPr>
+          <w:b/>
+          <w:bCs/>
+        </w:rPr>
+      </w:pPr>
+      <w:r>
+        <w:rPr>
+          <w:b/>
+          <w:bCs/>
+        </w:rPr>
         <w:lastRenderedPageBreak/>
-        <w:t>Aquí tienes el paso a paso técnico para lograrlo:</w:t>
-      </w:r>
-    </w:p>
-    <w:p>
-      <w:pPr>
-        <w:rPr>
-          <w:b/>
-          <w:bCs/>
-        </w:rPr>
-      </w:pPr>
-      <w:r>
-        <w:rPr>
-          <w:b/>
-          <w:bCs/>
-        </w:rPr>
         <w:t>Los 3 Requisitos Clave de una PWA</w:t>
       </w:r>
     </w:p>
@@ -12936,12 +12902,12 @@
     </w:p>
     <w:p>
       <w:r>
+        <w:t>En el &lt;head&gt; de tu archivo index.html, debes enlazar el archivo que acabas de crear:</w:t>
+      </w:r>
+    </w:p>
+    <w:p>
+      <w:r>
         <w:lastRenderedPageBreak/>
-        <w:t>En el &lt;head&gt; de tu archivo index.html, debes enlazar el archivo que acabas de crear:</w:t>
-      </w:r>
-    </w:p>
-    <w:p>
-      <w:r>
         <w:t>HTML</w:t>
       </w:r>
     </w:p>
@@ -13589,23 +13555,23 @@
         <w:spacing w:after="0"/>
       </w:pPr>
       <w:r>
+        <w:t xml:space="preserve">    })</w:t>
+      </w:r>
+    </w:p>
+    <w:p>
+      <w:pPr>
+        <w:spacing w:after="0"/>
+      </w:pPr>
+      <w:r>
+        <w:t xml:space="preserve">  );</w:t>
+      </w:r>
+    </w:p>
+    <w:p>
+      <w:pPr>
+        <w:spacing w:after="0"/>
+      </w:pPr>
+      <w:r>
         <w:lastRenderedPageBreak/>
-        <w:t xml:space="preserve">    })</w:t>
-      </w:r>
-    </w:p>
-    <w:p>
-      <w:pPr>
-        <w:spacing w:after="0"/>
-      </w:pPr>
-      <w:r>
-        <w:t xml:space="preserve">  );</w:t>
-      </w:r>
-    </w:p>
-    <w:p>
-      <w:pPr>
-        <w:spacing w:after="0"/>
-      </w:pPr>
-      <w:r>
         <w:t>});</w:t>
       </w:r>
     </w:p>
@@ -14188,7 +14154,6 @@
         </w:numPr>
       </w:pPr>
       <w:r>
-        <w:lastRenderedPageBreak/>
         <w:t xml:space="preserve">En el menú izquierdo verás las secciones </w:t>
       </w:r>
       <w:proofErr w:type="spellStart"/>
@@ -14244,6 +14209,7 @@
           <w:b/>
           <w:bCs/>
         </w:rPr>
+        <w:lastRenderedPageBreak/>
         <w:t>¡Instálala!</w:t>
       </w:r>
       <w:r>
@@ -17842,6 +17808,7 @@
   <w:style w:type="character" w:default="1" w:styleId="Fuentedeprrafopredeter">
     <w:name w:val="Default Paragraph Font"/>
     <w:uiPriority w:val="1"/>
+    <w:semiHidden/>
     <w:unhideWhenUsed/>
   </w:style>
   <w:style w:type="table" w:default="1" w:styleId="Tablanormal">
@@ -18053,6 +18020,7 @@
   <w:style w:type="character" w:default="1" w:styleId="Fuentedeprrafopredeter">
     <w:name w:val="Default Paragraph Font"/>
     <w:uiPriority w:val="1"/>
+    <w:semiHidden/>
     <w:unhideWhenUsed/>
   </w:style>
   <w:style w:type="table" w:default="1" w:styleId="Tablanormal">
@@ -18391,7 +18359,7 @@
 </file>
 
 <file path=customXml/itemProps1.xml><?xml version="1.0" encoding="utf-8"?>
-<ds:datastoreItem xmlns:ds="http://schemas.openxmlformats.org/officeDocument/2006/customXml" ds:itemID="{2C20EFD4-67ED-49E9-AD74-8C39FBCF63A7}">
+<ds:datastoreItem xmlns:ds="http://schemas.openxmlformats.org/officeDocument/2006/customXml" ds:itemID="{5590D474-E08B-416E-94A1-9B11F6E83E35}">
   <ds:schemaRefs>
     <ds:schemaRef ds:uri="http://schemas.openxmlformats.org/officeDocument/2006/bibliography"/>
   </ds:schemaRefs>

</xml_diff>

<commit_message>
se comienzan a aplicar transactions a los metodos de actualizacion de datos
</commit_message>
<xml_diff>
--- a/requerimientos.docx
+++ b/requerimientos.docx
@@ -12020,56 +12020,39 @@
       </w:r>
     </w:p>
     <w:p>
+      <w:r>
+        <w:t xml:space="preserve">Necesito me agregues a todos los crud y a cuanta funcionalidad creas necesaria, vamos a ir haciendo archivo por archivo el manejo de </w:t>
+      </w:r>
+      <w:proofErr w:type="spellStart"/>
+      <w:r>
+        <w:t>execepciones</w:t>
+      </w:r>
+      <w:proofErr w:type="spellEnd"/>
+      <w:r>
+        <w:t>, errores con try y catch</w:t>
+      </w:r>
+    </w:p>
+    <w:p>
+      <w:proofErr w:type="gramStart"/>
+      <w:r>
+        <w:t>ahora</w:t>
+      </w:r>
+      <w:proofErr w:type="gramEnd"/>
+      <w:r>
+        <w:t xml:space="preserve"> necesito implementar en donde corresponda el manejo de transacciones por si se corta la </w:t>
+      </w:r>
+      <w:proofErr w:type="spellStart"/>
+      <w:r>
+        <w:t>comunicacion</w:t>
+      </w:r>
+      <w:proofErr w:type="spellEnd"/>
+      <w:r>
+        <w:t xml:space="preserve"> con la base de datos</w:t>
+      </w:r>
+    </w:p>
+    <w:p>
       <w:bookmarkStart w:id="0" w:name="_GoBack"/>
-      <w:r>
-        <w:t xml:space="preserve">Necesito me agregues a todos los crud y a cuanta funcionalidad creas necesaria, vamos a ir haciendo archivo por archivo el manejo de </w:t>
-      </w:r>
-      <w:proofErr w:type="spellStart"/>
-      <w:r>
-        <w:t>execepciones</w:t>
-      </w:r>
-      <w:proofErr w:type="spellEnd"/>
-      <w:r>
-        <w:t>, errores con try y catch</w:t>
-      </w:r>
-    </w:p>
-    <w:bookmarkEnd w:id="0"/>
-    <w:p/>
-    <w:p>
-      <w:pPr>
-        <w:rPr>
-          <w:b/>
-          <w:lang w:val="es-ES"/>
-        </w:rPr>
-      </w:pPr>
-    </w:p>
-    <w:p>
-      <w:pPr>
-        <w:rPr>
-          <w:lang w:val="es-ES"/>
-        </w:rPr>
-      </w:pPr>
-    </w:p>
-    <w:p>
-      <w:pPr>
-        <w:rPr>
-          <w:lang w:val="es-ES"/>
-        </w:rPr>
-      </w:pPr>
-    </w:p>
-    <w:p>
-      <w:pPr>
-        <w:rPr>
-          <w:lang w:val="es-ES"/>
-        </w:rPr>
-      </w:pPr>
-    </w:p>
-    <w:p>
-      <w:pPr>
-        <w:rPr>
-          <w:lang w:val="es-ES"/>
-        </w:rPr>
-      </w:pPr>
+      <w:bookmarkEnd w:id="0"/>
     </w:p>
     <w:p>
       <w:pPr>
@@ -12266,7 +12249,6 @@
           <w:b/>
           <w:bCs/>
         </w:rPr>
-        <w:lastRenderedPageBreak/>
         <w:t>Los 3 Requisitos Clave de una PWA</w:t>
       </w:r>
     </w:p>
@@ -12303,6 +12285,7 @@
           <w:b/>
           <w:bCs/>
         </w:rPr>
+        <w:lastRenderedPageBreak/>
         <w:t>HTTPS:</w:t>
       </w:r>
       <w:r>
@@ -12907,88 +12890,88 @@
     </w:p>
     <w:p>
       <w:r>
+        <w:t>HTML</w:t>
+      </w:r>
+    </w:p>
+    <w:p>
+      <w:r>
+        <w:t xml:space="preserve">&lt;link </w:t>
+      </w:r>
+      <w:proofErr w:type="spellStart"/>
+      <w:r>
+        <w:t>rel</w:t>
+      </w:r>
+      <w:proofErr w:type="spellEnd"/>
+      <w:r>
+        <w:t>="</w:t>
+      </w:r>
+      <w:proofErr w:type="spellStart"/>
+      <w:r>
+        <w:t>manifest</w:t>
+      </w:r>
+      <w:proofErr w:type="spellEnd"/>
+      <w:r>
+        <w:t xml:space="preserve">" </w:t>
+      </w:r>
+      <w:proofErr w:type="spellStart"/>
+      <w:r>
+        <w:t>href</w:t>
+      </w:r>
+      <w:proofErr w:type="spellEnd"/>
+      <w:r>
+        <w:t>="/</w:t>
+      </w:r>
+      <w:proofErr w:type="spellStart"/>
+      <w:r>
+        <w:t>manifest.json</w:t>
+      </w:r>
+      <w:proofErr w:type="spellEnd"/>
+      <w:r>
+        <w:t>"&gt;</w:t>
+      </w:r>
+    </w:p>
+    <w:p>
+      <w:r>
+        <w:t xml:space="preserve">&lt;meta </w:t>
+      </w:r>
+      <w:proofErr w:type="spellStart"/>
+      <w:r>
+        <w:t>name</w:t>
+      </w:r>
+      <w:proofErr w:type="spellEnd"/>
+      <w:r>
+        <w:t>="</w:t>
+      </w:r>
+      <w:proofErr w:type="spellStart"/>
+      <w:r>
+        <w:t>theme</w:t>
+      </w:r>
+      <w:proofErr w:type="spellEnd"/>
+      <w:r>
+        <w:t xml:space="preserve">-color" </w:t>
+      </w:r>
+      <w:proofErr w:type="spellStart"/>
+      <w:r>
+        <w:t>content</w:t>
+      </w:r>
+      <w:proofErr w:type="spellEnd"/>
+      <w:r>
+        <w:t>="#0078d4"&gt;</w:t>
+      </w:r>
+    </w:p>
+    <w:p>
+      <w:pPr>
+        <w:rPr>
+          <w:b/>
+          <w:bCs/>
+        </w:rPr>
+      </w:pPr>
+      <w:r>
+        <w:rPr>
+          <w:b/>
+          <w:bCs/>
+        </w:rPr>
         <w:lastRenderedPageBreak/>
-        <w:t>HTML</w:t>
-      </w:r>
-    </w:p>
-    <w:p>
-      <w:r>
-        <w:t xml:space="preserve">&lt;link </w:t>
-      </w:r>
-      <w:proofErr w:type="spellStart"/>
-      <w:r>
-        <w:t>rel</w:t>
-      </w:r>
-      <w:proofErr w:type="spellEnd"/>
-      <w:r>
-        <w:t>="</w:t>
-      </w:r>
-      <w:proofErr w:type="spellStart"/>
-      <w:r>
-        <w:t>manifest</w:t>
-      </w:r>
-      <w:proofErr w:type="spellEnd"/>
-      <w:r>
-        <w:t xml:space="preserve">" </w:t>
-      </w:r>
-      <w:proofErr w:type="spellStart"/>
-      <w:r>
-        <w:t>href</w:t>
-      </w:r>
-      <w:proofErr w:type="spellEnd"/>
-      <w:r>
-        <w:t>="/</w:t>
-      </w:r>
-      <w:proofErr w:type="spellStart"/>
-      <w:r>
-        <w:t>manifest.json</w:t>
-      </w:r>
-      <w:proofErr w:type="spellEnd"/>
-      <w:r>
-        <w:t>"&gt;</w:t>
-      </w:r>
-    </w:p>
-    <w:p>
-      <w:r>
-        <w:t xml:space="preserve">&lt;meta </w:t>
-      </w:r>
-      <w:proofErr w:type="spellStart"/>
-      <w:r>
-        <w:t>name</w:t>
-      </w:r>
-      <w:proofErr w:type="spellEnd"/>
-      <w:r>
-        <w:t>="</w:t>
-      </w:r>
-      <w:proofErr w:type="spellStart"/>
-      <w:r>
-        <w:t>theme</w:t>
-      </w:r>
-      <w:proofErr w:type="spellEnd"/>
-      <w:r>
-        <w:t xml:space="preserve">-color" </w:t>
-      </w:r>
-      <w:proofErr w:type="spellStart"/>
-      <w:r>
-        <w:t>content</w:t>
-      </w:r>
-      <w:proofErr w:type="spellEnd"/>
-      <w:r>
-        <w:t>="#0078d4"&gt;</w:t>
-      </w:r>
-    </w:p>
-    <w:p>
-      <w:pPr>
-        <w:rPr>
-          <w:b/>
-          <w:bCs/>
-        </w:rPr>
-      </w:pPr>
-      <w:r>
-        <w:rPr>
-          <w:b/>
-          <w:bCs/>
-        </w:rPr>
         <w:t xml:space="preserve">Paso 3: Crear el </w:t>
       </w:r>
       <w:proofErr w:type="spellStart"/>
@@ -13571,80 +13554,80 @@
         <w:spacing w:after="0"/>
       </w:pPr>
       <w:r>
+        <w:t>});</w:t>
+      </w:r>
+    </w:p>
+    <w:p>
+      <w:pPr>
+        <w:spacing w:after="0"/>
+      </w:pPr>
+    </w:p>
+    <w:p>
+      <w:pPr>
+        <w:spacing w:after="0"/>
+      </w:pPr>
+      <w:r>
+        <w:t xml:space="preserve">// Evento </w:t>
+      </w:r>
+      <w:proofErr w:type="spellStart"/>
+      <w:r>
+        <w:t>fetch</w:t>
+      </w:r>
+      <w:proofErr w:type="spellEnd"/>
+      <w:r>
+        <w:t>: Sirve el contenido desde la caché si no hay internet</w:t>
+      </w:r>
+    </w:p>
+    <w:p>
+      <w:pPr>
+        <w:spacing w:after="0"/>
+      </w:pPr>
+      <w:proofErr w:type="spellStart"/>
+      <w:proofErr w:type="gramStart"/>
+      <w:r>
+        <w:t>self.addEventListener</w:t>
+      </w:r>
+      <w:proofErr w:type="spellEnd"/>
+      <w:r>
+        <w:t>(</w:t>
+      </w:r>
+      <w:proofErr w:type="gramEnd"/>
+      <w:r>
+        <w:t>'</w:t>
+      </w:r>
+      <w:proofErr w:type="spellStart"/>
+      <w:r>
+        <w:t>fetch</w:t>
+      </w:r>
+      <w:proofErr w:type="spellEnd"/>
+      <w:r>
+        <w:t>', e =&gt; {</w:t>
+      </w:r>
+    </w:p>
+    <w:p>
+      <w:pPr>
+        <w:spacing w:after="0"/>
+      </w:pPr>
+      <w:r>
+        <w:t xml:space="preserve">  </w:t>
+      </w:r>
+      <w:proofErr w:type="spellStart"/>
+      <w:proofErr w:type="gramStart"/>
+      <w:r>
+        <w:t>e.respondWith</w:t>
+      </w:r>
+      <w:proofErr w:type="spellEnd"/>
+      <w:r>
+        <w:t>(</w:t>
+      </w:r>
+      <w:proofErr w:type="gramEnd"/>
+    </w:p>
+    <w:p>
+      <w:pPr>
+        <w:spacing w:after="0"/>
+      </w:pPr>
+      <w:r>
         <w:lastRenderedPageBreak/>
-        <w:t>});</w:t>
-      </w:r>
-    </w:p>
-    <w:p>
-      <w:pPr>
-        <w:spacing w:after="0"/>
-      </w:pPr>
-    </w:p>
-    <w:p>
-      <w:pPr>
-        <w:spacing w:after="0"/>
-      </w:pPr>
-      <w:r>
-        <w:t xml:space="preserve">// Evento </w:t>
-      </w:r>
-      <w:proofErr w:type="spellStart"/>
-      <w:r>
-        <w:t>fetch</w:t>
-      </w:r>
-      <w:proofErr w:type="spellEnd"/>
-      <w:r>
-        <w:t>: Sirve el contenido desde la caché si no hay internet</w:t>
-      </w:r>
-    </w:p>
-    <w:p>
-      <w:pPr>
-        <w:spacing w:after="0"/>
-      </w:pPr>
-      <w:proofErr w:type="spellStart"/>
-      <w:proofErr w:type="gramStart"/>
-      <w:r>
-        <w:t>self.addEventListener</w:t>
-      </w:r>
-      <w:proofErr w:type="spellEnd"/>
-      <w:r>
-        <w:t>(</w:t>
-      </w:r>
-      <w:proofErr w:type="gramEnd"/>
-      <w:r>
-        <w:t>'</w:t>
-      </w:r>
-      <w:proofErr w:type="spellStart"/>
-      <w:r>
-        <w:t>fetch</w:t>
-      </w:r>
-      <w:proofErr w:type="spellEnd"/>
-      <w:r>
-        <w:t>', e =&gt; {</w:t>
-      </w:r>
-    </w:p>
-    <w:p>
-      <w:pPr>
-        <w:spacing w:after="0"/>
-      </w:pPr>
-      <w:r>
-        <w:t xml:space="preserve">  </w:t>
-      </w:r>
-      <w:proofErr w:type="spellStart"/>
-      <w:proofErr w:type="gramStart"/>
-      <w:r>
-        <w:t>e.respondWith</w:t>
-      </w:r>
-      <w:proofErr w:type="spellEnd"/>
-      <w:r>
-        <w:t>(</w:t>
-      </w:r>
-      <w:proofErr w:type="gramEnd"/>
-    </w:p>
-    <w:p>
-      <w:pPr>
-        <w:spacing w:after="0"/>
-      </w:pPr>
-      <w:r>
         <w:t xml:space="preserve">    </w:t>
       </w:r>
       <w:proofErr w:type="spellStart"/>
@@ -14209,7 +14192,6 @@
           <w:b/>
           <w:bCs/>
         </w:rPr>
-        <w:lastRenderedPageBreak/>
         <w:t>¡Instálala!</w:t>
       </w:r>
       <w:r>
@@ -17808,7 +17790,6 @@
   <w:style w:type="character" w:default="1" w:styleId="Fuentedeprrafopredeter">
     <w:name w:val="Default Paragraph Font"/>
     <w:uiPriority w:val="1"/>
-    <w:semiHidden/>
     <w:unhideWhenUsed/>
   </w:style>
   <w:style w:type="table" w:default="1" w:styleId="Tablanormal">
@@ -17852,6 +17833,23 @@
     <w:rPr>
       <w:color w:val="0000FF" w:themeColor="hyperlink"/>
       <w:u w:val="single"/>
+    </w:rPr>
+  </w:style>
+  <w:style w:type="paragraph" w:styleId="NormalWeb">
+    <w:name w:val="Normal (Web)"/>
+    <w:basedOn w:val="Normal"/>
+    <w:uiPriority w:val="99"/>
+    <w:semiHidden/>
+    <w:unhideWhenUsed/>
+    <w:rsid w:val="000A2D63"/>
+    <w:pPr>
+      <w:spacing w:before="100" w:beforeAutospacing="1" w:after="100" w:afterAutospacing="1" w:line="240" w:lineRule="auto"/>
+    </w:pPr>
+    <w:rPr>
+      <w:rFonts w:ascii="Times New Roman" w:eastAsia="Times New Roman" w:hAnsi="Times New Roman" w:cs="Times New Roman"/>
+      <w:sz w:val="24"/>
+      <w:szCs w:val="24"/>
+      <w:lang w:eastAsia="es-AR"/>
     </w:rPr>
   </w:style>
 </w:styles>
@@ -18020,7 +18018,6 @@
   <w:style w:type="character" w:default="1" w:styleId="Fuentedeprrafopredeter">
     <w:name w:val="Default Paragraph Font"/>
     <w:uiPriority w:val="1"/>
-    <w:semiHidden/>
     <w:unhideWhenUsed/>
   </w:style>
   <w:style w:type="table" w:default="1" w:styleId="Tablanormal">
@@ -18064,6 +18061,23 @@
     <w:rPr>
       <w:color w:val="0000FF" w:themeColor="hyperlink"/>
       <w:u w:val="single"/>
+    </w:rPr>
+  </w:style>
+  <w:style w:type="paragraph" w:styleId="NormalWeb">
+    <w:name w:val="Normal (Web)"/>
+    <w:basedOn w:val="Normal"/>
+    <w:uiPriority w:val="99"/>
+    <w:semiHidden/>
+    <w:unhideWhenUsed/>
+    <w:rsid w:val="000A2D63"/>
+    <w:pPr>
+      <w:spacing w:before="100" w:beforeAutospacing="1" w:after="100" w:afterAutospacing="1" w:line="240" w:lineRule="auto"/>
+    </w:pPr>
+    <w:rPr>
+      <w:rFonts w:ascii="Times New Roman" w:eastAsia="Times New Roman" w:hAnsi="Times New Roman" w:cs="Times New Roman"/>
+      <w:sz w:val="24"/>
+      <w:szCs w:val="24"/>
+      <w:lang w:eastAsia="es-AR"/>
     </w:rPr>
   </w:style>
 </w:styles>
@@ -18359,7 +18373,7 @@
 </file>
 
 <file path=customXml/itemProps1.xml><?xml version="1.0" encoding="utf-8"?>
-<ds:datastoreItem xmlns:ds="http://schemas.openxmlformats.org/officeDocument/2006/customXml" ds:itemID="{5590D474-E08B-416E-94A1-9B11F6E83E35}">
+<ds:datastoreItem xmlns:ds="http://schemas.openxmlformats.org/officeDocument/2006/customXml" ds:itemID="{433A6AD3-771A-4C33-BF96-0C3610C6ED39}">
   <ds:schemaRefs>
     <ds:schemaRef ds:uri="http://schemas.openxmlformats.org/officeDocument/2006/bibliography"/>
   </ds:schemaRefs>

</xml_diff>